<commit_message>
JORS package v0.2.0 pass: update manuscript to current release, fix cover letter
Manuscript: the browser application section now lists the five tools including uploads
(three session files), the binary join diagram, and the live solver covering any loaded
three-cation file; the reuse section records that the in-browser hull now covers loaded
ternaries (it was listed as future work and has shipped); software location and data
availability bumped to v0.2.0, dated 2026-09-02. Docx and PDF rebuilt from the md.

Cover letter: rebuilt on the Odinzen letterhead template (header block, footer logo), dated
2 September 2026, archive line updated to release v0.2.0 with the Zenodo DOI at submission.
</commit_message>
<xml_diff>
--- a/paper/Bustamante_Hephaestus_JORS_manuscript.docx
+++ b/paper/Bustamante_Hephaestus_JORS_manuscript.docx
@@ -2,7 +2,7 @@
 <file path=word/document.xml><?xml version="1.0" encoding="utf-8"?>
 <w:document xmlns:w="http://schemas.openxmlformats.org/wordprocessingml/2006/main" xmlns:m="http://schemas.openxmlformats.org/officeDocument/2006/math" xmlns:r="http://schemas.openxmlformats.org/officeDocument/2006/relationships" xmlns:o="urn:schemas-microsoft-com:office:office" xmlns:v="urn:schemas-microsoft-com:vml" xmlns:w10="urn:schemas-microsoft-com:office:word" xmlns:a="http://schemas.openxmlformats.org/drawingml/2006/main" xmlns:pic="http://schemas.openxmlformats.org/drawingml/2006/picture" xmlns:wp="http://schemas.openxmlformats.org/drawingml/2006/wordprocessingDrawing">
   <w:body>
-    <w:bookmarkStart w:id="37" w:name="X8d9333365672ef576e8b4652660e7ce735de326"/>
+    <w:bookmarkStart w:id="53" w:name="X8d9333365672ef576e8b4652660e7ce735de326"/>
     <w:p>
       <w:pPr>
         <w:pStyle w:val="Heading1"/>
@@ -123,7 +123,7 @@
         <w:t xml:space="preserve">CALPHAD; molten slag; modified quasichemical model; thermodynamic database; phase diagram; WebAssembly; oxide melts; open data</w:t>
       </w:r>
     </w:p>
-    <w:bookmarkStart w:id="22" w:name="overview"/>
+    <w:bookmarkStart w:id="38" w:name="overview"/>
     <w:p>
       <w:pPr>
         <w:pStyle w:val="Heading2"/>
@@ -132,7 +132,7 @@
         <w:t xml:space="preserve">(1) Overview</w:t>
       </w:r>
     </w:p>
-    <w:bookmarkStart w:id="9" w:name="introduction"/>
+    <w:bookmarkStart w:id="25" w:name="introduction"/>
     <w:p>
       <w:pPr>
         <w:pStyle w:val="Heading3"/>
@@ -157,8 +157,8 @@
         <w:t xml:space="preserve">Hephaestus is a deliberate response to that gap, and it treats the engine and the data as one contribution because neither is useful alone. The engine is small on purpose. Its core is plain C with no dependencies, which makes it easy to embed and lets the identical code compile to WebAssembly, so the full calculator runs in a web browser with nothing installed and no data leaving the user’s machine. The database is open on purpose. Every parameter in it derives from published measurements, each value carries its provenance down to table and page, and the known shortcomings are documented next to the numbers they affect. The present work describes both, their validation against pycalphad and against measured phase equilibria, and the ways they can be reused.</w:t>
       </w:r>
     </w:p>
-    <w:bookmarkEnd w:id="9"/>
-    <w:bookmarkStart w:id="19" w:name="implementation-and-architecture"/>
+    <w:bookmarkEnd w:id="25"/>
+    <w:bookmarkStart w:id="35" w:name="implementation-and-architecture"/>
     <w:p>
       <w:pPr>
         <w:pStyle w:val="Heading3"/>
@@ -184,18 +184,18 @@
           <wp:inline>
             <wp:extent cx="5334000" cy="3497491"/>
             <wp:effectExtent b="0" l="0" r="0" t="0"/>
-            <wp:docPr descr="Figure 1: Architecture of Hephaestus. A single dependency-free C core reads ChemSage-format files and computes all thermodynamics; the same core is used as a native library, from Python through cffi, and compiled to WebAssembly behind the browser application. dbbuild writes new ChemSage files from measured data, and every energy path is validated against pycalphad." title="" id="11" name="Picture"/>
+            <wp:docPr descr="Figure 1: Architecture of Hephaestus. A single dependency-free C core reads ChemSage-format files and computes all thermodynamics; the same core is used as a native library, from Python through cffi, and compiled to WebAssembly behind the browser application. dbbuild writes new ChemSage files from measured data, and every energy path is validated against pycalphad." title="" id="27" name="Picture"/>
             <a:graphic>
               <a:graphicData uri="http://schemas.openxmlformats.org/drawingml/2006/picture">
                 <pic:pic>
                   <pic:nvPicPr>
-                    <pic:cNvPr descr="figures/fig1_architecture.png" id="12" name="Picture"/>
+                    <pic:cNvPr descr="figures/fig1_architecture.png" id="28" name="Picture"/>
                     <pic:cNvPicPr>
                       <a:picLocks noChangeArrowheads="1" noChangeAspect="1"/>
                     </pic:cNvPicPr>
                   </pic:nvPicPr>
                   <pic:blipFill>
-                    <a:blip r:embed="rId10"/>
+                    <a:blip r:embed="rId26"/>
                     <a:stretch>
                       <a:fillRect/>
                     </a:stretch>
@@ -283,7 +283,7 @@
         <w:pStyle w:val="BodyText"/>
       </w:pPr>
       <w:r>
-        <w:t xml:space="preserve">The browser application, hosted at https://odinzen.github.io/hephaestus-mqmqa-public/, exposes four tools: a calculator over any loaded ChemSage file, a viewer for the assessed FeO-MgO-SiO</w:t>
+        <w:t xml:space="preserve">The browser application, hosted at https://odinzen.github.io/hephaestus-mqmqa-public/, exposes five tools: a calculator over any loaded ChemSage file (a user can hold up to three uploaded files per session and switch between them), a binary join phase-diagram tool with tap-to-read point comparison, a viewer for the assessed FeO-MgO-SiO</w:t>
       </w:r>
       <w:r>
         <w:rPr>
@@ -295,7 +295,7 @@
         <w:t xml:space="preserve"> </w:t>
       </w:r>
       <w:r>
-        <w:t xml:space="preserve">diagrams, a live isothermal-section solver that calculates the full phase assemblage at a chosen temperature in about a second (Figure 2), and an interactive eutectic builder for user-entered systems. Everything runs client side. The page holds a strict content security policy, makes no third-party requests, and never transmits a loaded file, which matters to industrial users whose compositions are confidential.</w:t>
+        <w:t xml:space="preserve">diagrams, a live isothermal-section solver that calculates the full phase assemblage at a chosen temperature in about a second, for the shipped ternaries or for any loaded three-cation file (Figure 2), and an interactive eutectic builder whose component names, melting points, and fusion enthalpies pre-fill from the loaded database. Everything runs client side. The page holds a strict content security policy, escapes all file-derived strings, makes no third-party requests, and never transmits a loaded file, which matters to industrial users whose compositions are confidential.</w:t>
       </w:r>
     </w:p>
     <w:p>
@@ -307,18 +307,18 @@
           <wp:inline>
             <wp:extent cx="4754880" cy="3902788"/>
             <wp:effectExtent b="0" l="0" r="0" t="0"/>
-            <wp:docPr descr="Figure 2: The live solver in the browser application. The user loads the shipped database, picks a temperature, and presses Compute; the WebAssembly engine then solves the full FeO-MgO-SiO2 phase assemblage client side (here 1023 composition samples and 512 tie-facets in under half a second) and reports the composition and stable phases under the cursor on hover." title="" id="14" name="Picture"/>
+            <wp:docPr descr="Figure 2: The live solver in the browser application. The user loads the shipped database, picks a temperature, and presses Compute; the WebAssembly engine then solves the full FeO-MgO-SiO2 phase assemblage client side (here 1023 composition samples and 512 tie-facets in under half a second) and reports the composition and stable phases under the cursor on hover." title="" id="30" name="Picture"/>
             <a:graphic>
               <a:graphicData uri="http://schemas.openxmlformats.org/drawingml/2006/picture">
                 <pic:pic>
                   <pic:nvPicPr>
-                    <pic:cNvPr descr="figures/fig2_browser_app.png" id="15" name="Picture"/>
+                    <pic:cNvPr descr="figures/fig2_browser_app.png" id="31" name="Picture"/>
                     <pic:cNvPicPr>
                       <a:picLocks noChangeArrowheads="1" noChangeAspect="1"/>
                     </pic:cNvPicPr>
                   </pic:nvPicPr>
                   <pic:blipFill>
-                    <a:blip r:embed="rId13"/>
+                    <a:blip r:embed="rId29"/>
                     <a:stretch>
                       <a:fillRect/>
                     </a:stretch>
@@ -442,18 +442,18 @@
           <wp:inline>
             <wp:extent cx="5334000" cy="2416336"/>
             <wp:effectExtent b="0" l="0" r="0" t="0"/>
-            <wp:docPr descr="Figure 3: The assessed FeO-MgO-SiO2 system calculated from the shipped database files. (a) Liquidus projection: primary crystallizing phase fields, with liquidus isotherms labeled in °C. (b) Isothermal section at 1600 °C: stable phase assemblages, shaded by the number of solid phases present. Phase labels: L liquid, Crs cristobalite, Ol olivine, Opx orthopyroxene, Per periclase, Wus wustite." title="" id="17" name="Picture"/>
+            <wp:docPr descr="Figure 3: The assessed FeO-MgO-SiO2 system calculated from the shipped database files. (a) Liquidus projection: primary crystallizing phase fields, with liquidus isotherms labeled in °C. (b) Isothermal section at 1600 °C: stable phase assemblages, shaded by the number of solid phases present. Phase labels: L liquid, Crs cristobalite, Ol olivine, Opx orthopyroxene, Per periclase, Wus wustite." title="" id="33" name="Picture"/>
             <a:graphic>
               <a:graphicData uri="http://schemas.openxmlformats.org/drawingml/2006/picture">
                 <pic:pic>
                   <pic:nvPicPr>
-                    <pic:cNvPr descr="figures/fig3_ternary.png" id="18" name="Picture"/>
+                    <pic:cNvPr descr="figures/fig3_ternary.png" id="34" name="Picture"/>
                     <pic:cNvPicPr>
                       <a:picLocks noChangeArrowheads="1" noChangeAspect="1"/>
                     </pic:cNvPicPr>
                   </pic:nvPicPr>
                   <pic:blipFill>
-                    <a:blip r:embed="rId16"/>
+                    <a:blip r:embed="rId32"/>
                     <a:stretch>
                       <a:fillRect/>
                     </a:stretch>
@@ -794,8 +794,8 @@
         <w:t xml:space="preserve">Table 1: The assessed liquids. Full source lists, modeling judgments, and limits are in each system’s provenance file in the repository.</w:t>
       </w:r>
     </w:p>
-    <w:bookmarkEnd w:id="19"/>
-    <w:bookmarkStart w:id="20" w:name="anatomy-of-a-database-file"/>
+    <w:bookmarkEnd w:id="35"/>
+    <w:bookmarkStart w:id="36" w:name="anatomy-of-a-database-file"/>
     <w:p>
       <w:pPr>
         <w:pStyle w:val="Heading3"/>
@@ -828,8 +828,8 @@
         <w:t xml:space="preserve">That asymmetry is the economics of the field in miniature: implementations of the published models are increasingly available, but each fitted parameter condenses dozens of measurements and decisions. Parameter sets rather than codes are therefore the scarce commodity, and an openly licensed, provenance-tracked database is the part of this contribution that cannot be regenerated from the paper alone.</w:t>
       </w:r>
     </w:p>
-    <w:bookmarkEnd w:id="20"/>
-    <w:bookmarkStart w:id="21" w:name="quality-control"/>
+    <w:bookmarkEnd w:id="36"/>
+    <w:bookmarkStart w:id="37" w:name="quality-control"/>
     <w:p>
       <w:pPr>
         <w:pStyle w:val="Heading3"/>
@@ -1136,9 +1136,9 @@
         <w:t xml:space="preserve">invariants sit within about 40 °C, and the ternary liquidus projection reproduces the measured field topology [19]. The suite runs on Windows 11 under CPython 3.11 and 3.12; the browser application is exercised in Chromium- and Gecko-based browsers. A user can confirm a working installation by running pytest against the bundled test databases, or with no installation at all by opening the web application and loading the shipped ternary database.</w:t>
       </w:r>
     </w:p>
-    <w:bookmarkEnd w:id="21"/>
-    <w:bookmarkEnd w:id="22"/>
-    <w:bookmarkStart w:id="30" w:name="availability"/>
+    <w:bookmarkEnd w:id="37"/>
+    <w:bookmarkEnd w:id="38"/>
+    <w:bookmarkStart w:id="46" w:name="availability"/>
     <w:p>
       <w:pPr>
         <w:pStyle w:val="Heading2"/>
@@ -1147,7 +1147,7 @@
         <w:t xml:space="preserve">(2) Availability</w:t>
       </w:r>
     </w:p>
-    <w:bookmarkStart w:id="23" w:name="operating-system"/>
+    <w:bookmarkStart w:id="39" w:name="operating-system"/>
     <w:p>
       <w:pPr>
         <w:pStyle w:val="Heading3"/>
@@ -1164,8 +1164,8 @@
         <w:t xml:space="preserve">Platform independent. The core builds with any C99 compiler; development and testing used Windows 11. The browser application runs in any current browser with WebAssembly support.</w:t>
       </w:r>
     </w:p>
-    <w:bookmarkEnd w:id="23"/>
-    <w:bookmarkStart w:id="24" w:name="programming-language"/>
+    <w:bookmarkEnd w:id="39"/>
+    <w:bookmarkStart w:id="40" w:name="programming-language"/>
     <w:p>
       <w:pPr>
         <w:pStyle w:val="Heading3"/>
@@ -1182,8 +1182,8 @@
         <w:t xml:space="preserve">C (core), Python 3.11 or later (interface and fitting tools), JavaScript (browser application).</w:t>
       </w:r>
     </w:p>
-    <w:bookmarkEnd w:id="24"/>
-    <w:bookmarkStart w:id="25" w:name="additional-system-requirements"/>
+    <w:bookmarkEnd w:id="40"/>
+    <w:bookmarkStart w:id="41" w:name="additional-system-requirements"/>
     <w:p>
       <w:pPr>
         <w:pStyle w:val="Heading3"/>
@@ -1200,8 +1200,8 @@
         <w:t xml:space="preserve">None of note. The engine and database together are a few megabytes.</w:t>
       </w:r>
     </w:p>
-    <w:bookmarkEnd w:id="25"/>
-    <w:bookmarkStart w:id="26" w:name="dependencies"/>
+    <w:bookmarkEnd w:id="41"/>
+    <w:bookmarkStart w:id="42" w:name="dependencies"/>
     <w:p>
       <w:pPr>
         <w:pStyle w:val="Heading3"/>
@@ -1218,8 +1218,8 @@
         <w:t xml:space="preserve">Python interface: cffi, NumPy, SciPy. Validation suite additionally requires pycalphad. WebAssembly build requires emscripten. The C core and the browser application have no dependencies.</w:t>
       </w:r>
     </w:p>
-    <w:bookmarkEnd w:id="26"/>
-    <w:bookmarkStart w:id="27" w:name="list-of-contributors"/>
+    <w:bookmarkEnd w:id="42"/>
+    <w:bookmarkStart w:id="43" w:name="list-of-contributors"/>
     <w:p>
       <w:pPr>
         <w:pStyle w:val="Heading3"/>
@@ -1236,8 +1236,8 @@
         <w:t xml:space="preserve">Michael E. Bustamante (design, implementation, validation, data curation).</w:t>
       </w:r>
     </w:p>
-    <w:bookmarkEnd w:id="27"/>
-    <w:bookmarkStart w:id="28" w:name="software-location"/>
+    <w:bookmarkEnd w:id="43"/>
+    <w:bookmarkStart w:id="44" w:name="software-location"/>
     <w:p>
       <w:pPr>
         <w:pStyle w:val="Heading3"/>
@@ -1279,7 +1279,7 @@
         </w:numPr>
       </w:pPr>
       <w:r>
-        <w:t xml:space="preserve">Persistent identifier: https://github.com/odinzen/hephaestus-mqmqa-public/releases/tag/v0.1.0</w:t>
+        <w:t xml:space="preserve">Persistent identifier: https://github.com/odinzen/hephaestus-mqmqa-public/releases/tag/v0.2.0</w:t>
       </w:r>
     </w:p>
     <w:p>
@@ -1315,7 +1315,7 @@
         </w:numPr>
       </w:pPr>
       <w:r>
-        <w:t xml:space="preserve">Version published: v0.1.0</w:t>
+        <w:t xml:space="preserve">Version published: v0.2.0</w:t>
       </w:r>
     </w:p>
     <w:p>
@@ -1327,7 +1327,7 @@
         </w:numPr>
       </w:pPr>
       <w:r>
-        <w:t xml:space="preserve">Date published: 2026-08-25</w:t>
+        <w:t xml:space="preserve">Date published: 2026-09-02</w:t>
       </w:r>
     </w:p>
     <w:p>
@@ -1387,11 +1387,11 @@
         </w:numPr>
       </w:pPr>
       <w:r>
-        <w:t xml:space="preserve">Date published: 2026-08-25</w:t>
-      </w:r>
-    </w:p>
-    <w:bookmarkEnd w:id="28"/>
-    <w:bookmarkStart w:id="29" w:name="language"/>
+        <w:t xml:space="preserve">Date published: 2026-09-02</w:t>
+      </w:r>
+    </w:p>
+    <w:bookmarkEnd w:id="44"/>
+    <w:bookmarkStart w:id="45" w:name="language"/>
     <w:p>
       <w:pPr>
         <w:pStyle w:val="Heading3"/>
@@ -1408,9 +1408,9 @@
         <w:t xml:space="preserve">English.</w:t>
       </w:r>
     </w:p>
-    <w:bookmarkEnd w:id="29"/>
-    <w:bookmarkEnd w:id="30"/>
-    <w:bookmarkStart w:id="31" w:name="reuse-potential"/>
+    <w:bookmarkEnd w:id="45"/>
+    <w:bookmarkEnd w:id="46"/>
+    <w:bookmarkStart w:id="47" w:name="reuse-potential"/>
     <w:p>
       <w:pPr>
         <w:pStyle w:val="Heading2"/>
@@ -1440,11 +1440,11 @@
         <w:pStyle w:val="BodyText"/>
       </w:pPr>
       <w:r>
-        <w:t xml:space="preserve">The database is a starting point rather than an endpoint, and the file format rewards growth: new components, new phases, and refits against new measurements accumulate in the same database. A system is therefore extended release by release rather than rebuilt, and archived versions keep results calculated against earlier releases reproducible. Because every value carries its source and every judgment is written down, another assessor can reweight the data, swap an endmember, or extend a system without reverse-engineering anything; dbbuild turns a table of measured activities into a loadable file in a few lines. Natural extensions are further oxide systems, the remaining ChemSage solution models, and a C port of the multiphase hull for fully in-browser phase diagrams of arbitrary systems. Contributions and issues are handled through the GitHub repository.</w:t>
-      </w:r>
-    </w:p>
-    <w:bookmarkEnd w:id="31"/>
-    <w:bookmarkStart w:id="32" w:name="data-availability"/>
+        <w:t xml:space="preserve">The database is a starting point rather than an endpoint, and the file format rewards growth: new components, new phases, and refits against new measurements accumulate in the same database. A system is therefore extended release by release rather than rebuilt, and archived versions keep results calculated against earlier releases reproducible. Because every value carries its source and every judgment is written down, another assessor can reweight the data, swap an endmember, or extend a system without reverse-engineering anything; dbbuild turns a table of measured activities into a loadable file in a few lines. The in-browser multiphase hull already covers any loaded three-cation file, so a new system becomes a browser phase diagram the moment its file loads; natural extensions are further oxide systems and the remaining ChemSage solution models. Contributions and issues are handled through the GitHub repository.</w:t>
+      </w:r>
+    </w:p>
+    <w:bookmarkEnd w:id="47"/>
+    <w:bookmarkStart w:id="48" w:name="data-availability"/>
     <w:p>
       <w:pPr>
         <w:pStyle w:val="Heading2"/>
@@ -1458,11 +1458,11 @@
         <w:pStyle w:val="FirstParagraph"/>
       </w:pPr>
       <w:r>
-        <w:t xml:space="preserve">The engine, the database, the browser application, and the validation suite are openly available in the code repository listed above; the version described here is archived as release v0.1.0. The database files and their provenance records are in the repository’s data directory under CC BY 4.0.</w:t>
-      </w:r>
-    </w:p>
-    <w:bookmarkEnd w:id="32"/>
-    <w:bookmarkStart w:id="33" w:name="acknowledgements"/>
+        <w:t xml:space="preserve">The engine, the database, the browser application, and the validation suite are openly available in the code repository listed above; the version described here is archived as release v0.2.0. The database files and their provenance records are in the repository’s data directory under CC BY 4.0.</w:t>
+      </w:r>
+    </w:p>
+    <w:bookmarkEnd w:id="48"/>
+    <w:bookmarkStart w:id="49" w:name="acknowledgements"/>
     <w:p>
       <w:pPr>
         <w:pStyle w:val="Heading2"/>
@@ -1479,8 +1479,8 @@
         <w:t xml:space="preserve">During the development of this software the author used Claude Code (Anthropic) to assist with implementation, validation scripting, and manuscript preparation. This assistance was agentic, not autonomous: it operated under author direction and supervision at every step and was never a closed loop that produced or accepted results without review. Every parameter was traced by the author to its primary source before entering the database, and every reference was verified against its registry record. The author reviewed and approved all output and takes full responsibility for this article.</w:t>
       </w:r>
     </w:p>
-    <w:bookmarkEnd w:id="33"/>
-    <w:bookmarkStart w:id="34" w:name="funding-statement"/>
+    <w:bookmarkEnd w:id="49"/>
+    <w:bookmarkStart w:id="50" w:name="funding-statement"/>
     <w:p>
       <w:pPr>
         <w:pStyle w:val="Heading2"/>
@@ -1497,8 +1497,8 @@
         <w:t xml:space="preserve">The development of this software received no external funding.</w:t>
       </w:r>
     </w:p>
-    <w:bookmarkEnd w:id="34"/>
-    <w:bookmarkStart w:id="35" w:name="competing-interests"/>
+    <w:bookmarkEnd w:id="50"/>
+    <w:bookmarkStart w:id="51" w:name="competing-interests"/>
     <w:p>
       <w:pPr>
         <w:pStyle w:val="Heading2"/>
@@ -1515,8 +1515,8 @@
         <w:t xml:space="preserve">The author founded Odinzen LLC, which provides commercial thermodynamic modeling services, and declares this as a competing interest. The software and database published here are released in full under open licenses, and no proprietary Odinzen assets are included.</w:t>
       </w:r>
     </w:p>
-    <w:bookmarkEnd w:id="35"/>
-    <w:bookmarkStart w:id="36" w:name="references"/>
+    <w:bookmarkEnd w:id="51"/>
+    <w:bookmarkStart w:id="52" w:name="references"/>
     <w:p>
       <w:pPr>
         <w:pStyle w:val="Heading2"/>
@@ -1745,8 +1745,8 @@
         <w:t xml:space="preserve">[26] Wu P, Eriksson G, Pelton AD, Blander M. Prediction of the Thermodynamic Properties and Phase Diagrams of Silicate Systems-Evaluation of the FeO-MgO-SiO2 System. ISIJ International. 1993;33(1):26–35. doi:10.2355/isijinternational.33.26</w:t>
       </w:r>
     </w:p>
-    <w:bookmarkEnd w:id="36"/>
-    <w:bookmarkEnd w:id="37"/>
+    <w:bookmarkEnd w:id="52"/>
+    <w:bookmarkEnd w:id="53"/>
     <w:sectPr>
       <w:footnotePr>
         <w:numRestart w:val="eachSect"/>

</xml_diff>

<commit_message>
Reviewer-audit fixes: test count 40->73, Figure 2 retaken on the current release
Fresh-eyes audit against the live artifacts: pytest reports 73 passed (tests were added
since the sentence was written); Figure 2 showed the pre-restyle v0.1.0 interface, so it is
retaken from the current release (light theme, CDP screenshot of the real solved app, same
1023 samples / 512 tie-facets as the caption) and the caption updated for tap-to-pin.
argus order re-run green on the rebuilt docx; submission zip rebuilt.
</commit_message>
<xml_diff>
--- a/paper/Bustamante_Hephaestus_JORS_manuscript.docx
+++ b/paper/Bustamante_Hephaestus_JORS_manuscript.docx
@@ -2,7 +2,7 @@
 <file path=word/document.xml><?xml version="1.0" encoding="utf-8"?>
 <w:document xmlns:w="http://schemas.openxmlformats.org/wordprocessingml/2006/main" xmlns:m="http://schemas.openxmlformats.org/officeDocument/2006/math" xmlns:r="http://schemas.openxmlformats.org/officeDocument/2006/relationships" xmlns:o="urn:schemas-microsoft-com:office:office" xmlns:v="urn:schemas-microsoft-com:vml" xmlns:w10="urn:schemas-microsoft-com:office:word" xmlns:a="http://schemas.openxmlformats.org/drawingml/2006/main" xmlns:pic="http://schemas.openxmlformats.org/drawingml/2006/picture" xmlns:wp="http://schemas.openxmlformats.org/drawingml/2006/wordprocessingDrawing">
   <w:body>
-    <w:bookmarkStart w:id="53" w:name="X8d9333365672ef576e8b4652660e7ce735de326"/>
+    <w:bookmarkStart w:id="69" w:name="X8d9333365672ef576e8b4652660e7ce735de326"/>
     <w:p>
       <w:pPr>
         <w:pStyle w:val="Heading1"/>
@@ -123,7 +123,7 @@
         <w:t xml:space="preserve">CALPHAD; molten slag; modified quasichemical model; thermodynamic database; phase diagram; WebAssembly; oxide melts; open data</w:t>
       </w:r>
     </w:p>
-    <w:bookmarkStart w:id="38" w:name="overview"/>
+    <w:bookmarkStart w:id="54" w:name="overview"/>
     <w:p>
       <w:pPr>
         <w:pStyle w:val="Heading2"/>
@@ -132,7 +132,7 @@
         <w:t xml:space="preserve">(1) Overview</w:t>
       </w:r>
     </w:p>
-    <w:bookmarkStart w:id="25" w:name="introduction"/>
+    <w:bookmarkStart w:id="41" w:name="introduction"/>
     <w:p>
       <w:pPr>
         <w:pStyle w:val="Heading3"/>
@@ -157,8 +157,8 @@
         <w:t xml:space="preserve">Hephaestus is a deliberate response to that gap, and it treats the engine and the data as one contribution because neither is useful alone. The engine is small on purpose. Its core is plain C with no dependencies, which makes it easy to embed and lets the identical code compile to WebAssembly, so the full calculator runs in a web browser with nothing installed and no data leaving the user’s machine. The database is open on purpose. Every parameter in it derives from published measurements, each value carries its provenance down to table and page, and the known shortcomings are documented next to the numbers they affect. The present work describes both, their validation against pycalphad and against measured phase equilibria, and the ways they can be reused.</w:t>
       </w:r>
     </w:p>
-    <w:bookmarkEnd w:id="25"/>
-    <w:bookmarkStart w:id="35" w:name="implementation-and-architecture"/>
+    <w:bookmarkEnd w:id="41"/>
+    <w:bookmarkStart w:id="51" w:name="implementation-and-architecture"/>
     <w:p>
       <w:pPr>
         <w:pStyle w:val="Heading3"/>
@@ -184,18 +184,18 @@
           <wp:inline>
             <wp:extent cx="5334000" cy="3497491"/>
             <wp:effectExtent b="0" l="0" r="0" t="0"/>
-            <wp:docPr descr="Figure 1: Architecture of Hephaestus. A single dependency-free C core reads ChemSage-format files and computes all thermodynamics; the same core is used as a native library, from Python through cffi, and compiled to WebAssembly behind the browser application. dbbuild writes new ChemSage files from measured data, and every energy path is validated against pycalphad." title="" id="27" name="Picture"/>
+            <wp:docPr descr="Figure 1: Architecture of Hephaestus. A single dependency-free C core reads ChemSage-format files and computes all thermodynamics; the same core is used as a native library, from Python through cffi, and compiled to WebAssembly behind the browser application. dbbuild writes new ChemSage files from measured data, and every energy path is validated against pycalphad." title="" id="43" name="Picture"/>
             <a:graphic>
               <a:graphicData uri="http://schemas.openxmlformats.org/drawingml/2006/picture">
                 <pic:pic>
                   <pic:nvPicPr>
-                    <pic:cNvPr descr="figures/fig1_architecture.png" id="28" name="Picture"/>
+                    <pic:cNvPr descr="figures/fig1_architecture.png" id="44" name="Picture"/>
                     <pic:cNvPicPr>
                       <a:picLocks noChangeArrowheads="1" noChangeAspect="1"/>
                     </pic:cNvPicPr>
                   </pic:nvPicPr>
                   <pic:blipFill>
-                    <a:blip r:embed="rId26"/>
+                    <a:blip r:embed="rId42"/>
                     <a:stretch>
                       <a:fillRect/>
                     </a:stretch>
@@ -305,20 +305,20 @@
       <w:r>
         <w:drawing>
           <wp:inline>
-            <wp:extent cx="4754880" cy="3902788"/>
+            <wp:extent cx="4754880" cy="4464799"/>
             <wp:effectExtent b="0" l="0" r="0" t="0"/>
-            <wp:docPr descr="Figure 2: The live solver in the browser application. The user loads the shipped database, picks a temperature, and presses Compute; the WebAssembly engine then solves the full FeO-MgO-SiO2 phase assemblage client side (here 1023 composition samples and 512 tie-facets in under half a second) and reports the composition and stable phases under the cursor on hover." title="" id="30" name="Picture"/>
+            <wp:docPr descr="Figure 2: The live solver in the browser application (release v0.2.0, light theme). The user loads the shipped database, picks a temperature, and presses Compute; the WebAssembly engine then solves the full FeO-MgO-SiO2 phase assemblage client side (here 1023 composition samples and 512 tie-facets in under half a second). Tapping a composition reads its stable phases and pins it to a comparison list; hovering previews on desktop." title="" id="46" name="Picture"/>
             <a:graphic>
               <a:graphicData uri="http://schemas.openxmlformats.org/drawingml/2006/picture">
                 <pic:pic>
                   <pic:nvPicPr>
-                    <pic:cNvPr descr="figures/fig2_browser_app.png" id="31" name="Picture"/>
+                    <pic:cNvPr descr="figures/fig2_browser_app.png" id="47" name="Picture"/>
                     <pic:cNvPicPr>
                       <a:picLocks noChangeArrowheads="1" noChangeAspect="1"/>
                     </pic:cNvPicPr>
                   </pic:nvPicPr>
                   <pic:blipFill>
-                    <a:blip r:embed="rId29"/>
+                    <a:blip r:embed="rId45"/>
                     <a:stretch>
                       <a:fillRect/>
                     </a:stretch>
@@ -326,7 +326,7 @@
                   <pic:spPr bwMode="auto">
                     <a:xfrm>
                       <a:off x="0" y="0"/>
-                      <a:ext cx="4754880" cy="3902788"/>
+                      <a:ext cx="4754880" cy="4464799"/>
                     </a:xfrm>
                     <a:prstGeom prst="rect">
                       <a:avLst/>
@@ -350,7 +350,7 @@
         <w:pStyle w:val="ImageCaption"/>
       </w:pPr>
       <w:r>
-        <w:t xml:space="preserve">Figure 2: The live solver in the browser application. The user loads the shipped database, picks a temperature, and presses Compute; the WebAssembly engine then solves the full FeO-MgO-SiO</w:t>
+        <w:t xml:space="preserve">Figure 2: The live solver in the browser application (release v0.2.0, light theme). The user loads the shipped database, picks a temperature, and presses Compute; the WebAssembly engine then solves the full FeO-MgO-SiO</w:t>
       </w:r>
       <w:r>
         <w:rPr>
@@ -362,7 +362,7 @@
         <w:t xml:space="preserve"> </w:t>
       </w:r>
       <w:r>
-        <w:t xml:space="preserve">phase assemblage client side (here 1023 composition samples and 512 tie-facets in under half a second) and reports the composition and stable phases under the cursor on hover.</w:t>
+        <w:t xml:space="preserve">phase assemblage client side (here 1023 composition samples and 512 tie-facets in under half a second). Tapping a composition reads its stable phases and pins it to a comparison list; hovering previews on desktop.</w:t>
       </w:r>
     </w:p>
     <w:p>
@@ -442,18 +442,18 @@
           <wp:inline>
             <wp:extent cx="5334000" cy="2416336"/>
             <wp:effectExtent b="0" l="0" r="0" t="0"/>
-            <wp:docPr descr="Figure 3: The assessed FeO-MgO-SiO2 system calculated from the shipped database files. (a) Liquidus projection: primary crystallizing phase fields, with liquidus isotherms labeled in °C. (b) Isothermal section at 1600 °C: stable phase assemblages, shaded by the number of solid phases present. Phase labels: L liquid, Crs cristobalite, Ol olivine, Opx orthopyroxene, Per periclase, Wus wustite." title="" id="33" name="Picture"/>
+            <wp:docPr descr="Figure 3: The assessed FeO-MgO-SiO2 system calculated from the shipped database files. (a) Liquidus projection: primary crystallizing phase fields, with liquidus isotherms labeled in °C. (b) Isothermal section at 1600 °C: stable phase assemblages, shaded by the number of solid phases present. Phase labels: L liquid, Crs cristobalite, Ol olivine, Opx orthopyroxene, Per periclase, Wus wustite." title="" id="49" name="Picture"/>
             <a:graphic>
               <a:graphicData uri="http://schemas.openxmlformats.org/drawingml/2006/picture">
                 <pic:pic>
                   <pic:nvPicPr>
-                    <pic:cNvPr descr="figures/fig3_ternary.png" id="34" name="Picture"/>
+                    <pic:cNvPr descr="figures/fig3_ternary.png" id="50" name="Picture"/>
                     <pic:cNvPicPr>
                       <a:picLocks noChangeArrowheads="1" noChangeAspect="1"/>
                     </pic:cNvPicPr>
                   </pic:nvPicPr>
                   <pic:blipFill>
-                    <a:blip r:embed="rId32"/>
+                    <a:blip r:embed="rId48"/>
                     <a:stretch>
                       <a:fillRect/>
                     </a:stretch>
@@ -794,8 +794,8 @@
         <w:t xml:space="preserve">Table 1: The assessed liquids. Full source lists, modeling judgments, and limits are in each system’s provenance file in the repository.</w:t>
       </w:r>
     </w:p>
-    <w:bookmarkEnd w:id="35"/>
-    <w:bookmarkStart w:id="36" w:name="anatomy-of-a-database-file"/>
+    <w:bookmarkEnd w:id="51"/>
+    <w:bookmarkStart w:id="52" w:name="anatomy-of-a-database-file"/>
     <w:p>
       <w:pPr>
         <w:pStyle w:val="Heading3"/>
@@ -828,8 +828,8 @@
         <w:t xml:space="preserve">That asymmetry is the economics of the field in miniature: implementations of the published models are increasingly available, but each fitted parameter condenses dozens of measurements and decisions. Parameter sets rather than codes are therefore the scarce commodity, and an openly licensed, provenance-tracked database is the part of this contribution that cannot be regenerated from the paper alone.</w:t>
       </w:r>
     </w:p>
-    <w:bookmarkEnd w:id="36"/>
-    <w:bookmarkStart w:id="37" w:name="quality-control"/>
+    <w:bookmarkEnd w:id="52"/>
+    <w:bookmarkStart w:id="53" w:name="quality-control"/>
     <w:p>
       <w:pPr>
         <w:pStyle w:val="Heading3"/>
@@ -843,7 +843,7 @@
         <w:pStyle w:val="FirstParagraph"/>
       </w:pPr>
       <w:r>
-        <w:t xml:space="preserve">pycalphad is the validation oracle throughout, on the principle that nothing is claimed working until it matches an independent implementation; Table 2 lists the checks. The test suite, 40 tests run with pytest, checks every energy contribution against pycalphad on shared parameters to machine precision, near 10</w:t>
+        <w:t xml:space="preserve">pycalphad is the validation oracle throughout, on the principle that nothing is claimed working until it matches an independent implementation; Table 2 lists the checks. The test suite, 73 tests run with pytest, checks every energy contribution against pycalphad on shared parameters to machine precision, near 10</w:t>
       </w:r>
       <w:r>
         <w:rPr>
@@ -1136,9 +1136,9 @@
         <w:t xml:space="preserve">invariants sit within about 40 °C, and the ternary liquidus projection reproduces the measured field topology [19]. The suite runs on Windows 11 under CPython 3.11 and 3.12; the browser application is exercised in Chromium- and Gecko-based browsers. A user can confirm a working installation by running pytest against the bundled test databases, or with no installation at all by opening the web application and loading the shipped ternary database.</w:t>
       </w:r>
     </w:p>
-    <w:bookmarkEnd w:id="37"/>
-    <w:bookmarkEnd w:id="38"/>
-    <w:bookmarkStart w:id="46" w:name="availability"/>
+    <w:bookmarkEnd w:id="53"/>
+    <w:bookmarkEnd w:id="54"/>
+    <w:bookmarkStart w:id="62" w:name="availability"/>
     <w:p>
       <w:pPr>
         <w:pStyle w:val="Heading2"/>
@@ -1147,7 +1147,7 @@
         <w:t xml:space="preserve">(2) Availability</w:t>
       </w:r>
     </w:p>
-    <w:bookmarkStart w:id="39" w:name="operating-system"/>
+    <w:bookmarkStart w:id="55" w:name="operating-system"/>
     <w:p>
       <w:pPr>
         <w:pStyle w:val="Heading3"/>
@@ -1164,8 +1164,8 @@
         <w:t xml:space="preserve">Platform independent. The core builds with any C99 compiler; development and testing used Windows 11. The browser application runs in any current browser with WebAssembly support.</w:t>
       </w:r>
     </w:p>
-    <w:bookmarkEnd w:id="39"/>
-    <w:bookmarkStart w:id="40" w:name="programming-language"/>
+    <w:bookmarkEnd w:id="55"/>
+    <w:bookmarkStart w:id="56" w:name="programming-language"/>
     <w:p>
       <w:pPr>
         <w:pStyle w:val="Heading3"/>
@@ -1182,8 +1182,8 @@
         <w:t xml:space="preserve">C (core), Python 3.11 or later (interface and fitting tools), JavaScript (browser application).</w:t>
       </w:r>
     </w:p>
-    <w:bookmarkEnd w:id="40"/>
-    <w:bookmarkStart w:id="41" w:name="additional-system-requirements"/>
+    <w:bookmarkEnd w:id="56"/>
+    <w:bookmarkStart w:id="57" w:name="additional-system-requirements"/>
     <w:p>
       <w:pPr>
         <w:pStyle w:val="Heading3"/>
@@ -1200,8 +1200,8 @@
         <w:t xml:space="preserve">None of note. The engine and database together are a few megabytes.</w:t>
       </w:r>
     </w:p>
-    <w:bookmarkEnd w:id="41"/>
-    <w:bookmarkStart w:id="42" w:name="dependencies"/>
+    <w:bookmarkEnd w:id="57"/>
+    <w:bookmarkStart w:id="58" w:name="dependencies"/>
     <w:p>
       <w:pPr>
         <w:pStyle w:val="Heading3"/>
@@ -1218,8 +1218,8 @@
         <w:t xml:space="preserve">Python interface: cffi, NumPy, SciPy. Validation suite additionally requires pycalphad. WebAssembly build requires emscripten. The C core and the browser application have no dependencies.</w:t>
       </w:r>
     </w:p>
-    <w:bookmarkEnd w:id="42"/>
-    <w:bookmarkStart w:id="43" w:name="list-of-contributors"/>
+    <w:bookmarkEnd w:id="58"/>
+    <w:bookmarkStart w:id="59" w:name="list-of-contributors"/>
     <w:p>
       <w:pPr>
         <w:pStyle w:val="Heading3"/>
@@ -1236,8 +1236,8 @@
         <w:t xml:space="preserve">Michael E. Bustamante (design, implementation, validation, data curation).</w:t>
       </w:r>
     </w:p>
-    <w:bookmarkEnd w:id="43"/>
-    <w:bookmarkStart w:id="44" w:name="software-location"/>
+    <w:bookmarkEnd w:id="59"/>
+    <w:bookmarkStart w:id="60" w:name="software-location"/>
     <w:p>
       <w:pPr>
         <w:pStyle w:val="Heading3"/>
@@ -1390,8 +1390,8 @@
         <w:t xml:space="preserve">Date published: 2026-09-02</w:t>
       </w:r>
     </w:p>
-    <w:bookmarkEnd w:id="44"/>
-    <w:bookmarkStart w:id="45" w:name="language"/>
+    <w:bookmarkEnd w:id="60"/>
+    <w:bookmarkStart w:id="61" w:name="language"/>
     <w:p>
       <w:pPr>
         <w:pStyle w:val="Heading3"/>
@@ -1408,9 +1408,9 @@
         <w:t xml:space="preserve">English.</w:t>
       </w:r>
     </w:p>
-    <w:bookmarkEnd w:id="45"/>
-    <w:bookmarkEnd w:id="46"/>
-    <w:bookmarkStart w:id="47" w:name="reuse-potential"/>
+    <w:bookmarkEnd w:id="61"/>
+    <w:bookmarkEnd w:id="62"/>
+    <w:bookmarkStart w:id="63" w:name="reuse-potential"/>
     <w:p>
       <w:pPr>
         <w:pStyle w:val="Heading2"/>
@@ -1443,8 +1443,8 @@
         <w:t xml:space="preserve">The database is a starting point rather than an endpoint, and the file format rewards growth: new components, new phases, and refits against new measurements accumulate in the same database. A system is therefore extended release by release rather than rebuilt, and archived versions keep results calculated against earlier releases reproducible. Because every value carries its source and every judgment is written down, another assessor can reweight the data, swap an endmember, or extend a system without reverse-engineering anything; dbbuild turns a table of measured activities into a loadable file in a few lines. The in-browser multiphase hull already covers any loaded three-cation file, so a new system becomes a browser phase diagram the moment its file loads; natural extensions are further oxide systems and the remaining ChemSage solution models. Contributions and issues are handled through the GitHub repository.</w:t>
       </w:r>
     </w:p>
-    <w:bookmarkEnd w:id="47"/>
-    <w:bookmarkStart w:id="48" w:name="data-availability"/>
+    <w:bookmarkEnd w:id="63"/>
+    <w:bookmarkStart w:id="64" w:name="data-availability"/>
     <w:p>
       <w:pPr>
         <w:pStyle w:val="Heading2"/>
@@ -1461,8 +1461,8 @@
         <w:t xml:space="preserve">The engine, the database, the browser application, and the validation suite are openly available in the code repository listed above; the version described here is archived as release v0.2.0. The database files and their provenance records are in the repository’s data directory under CC BY 4.0.</w:t>
       </w:r>
     </w:p>
-    <w:bookmarkEnd w:id="48"/>
-    <w:bookmarkStart w:id="49" w:name="acknowledgements"/>
+    <w:bookmarkEnd w:id="64"/>
+    <w:bookmarkStart w:id="65" w:name="acknowledgements"/>
     <w:p>
       <w:pPr>
         <w:pStyle w:val="Heading2"/>
@@ -1479,8 +1479,8 @@
         <w:t xml:space="preserve">During the development of this software the author used Claude Code (Anthropic) to assist with implementation, validation scripting, and manuscript preparation. This assistance was agentic, not autonomous: it operated under author direction and supervision at every step and was never a closed loop that produced or accepted results without review. Every parameter was traced by the author to its primary source before entering the database, and every reference was verified against its registry record. The author reviewed and approved all output and takes full responsibility for this article.</w:t>
       </w:r>
     </w:p>
-    <w:bookmarkEnd w:id="49"/>
-    <w:bookmarkStart w:id="50" w:name="funding-statement"/>
+    <w:bookmarkEnd w:id="65"/>
+    <w:bookmarkStart w:id="66" w:name="funding-statement"/>
     <w:p>
       <w:pPr>
         <w:pStyle w:val="Heading2"/>
@@ -1497,8 +1497,8 @@
         <w:t xml:space="preserve">The development of this software received no external funding.</w:t>
       </w:r>
     </w:p>
-    <w:bookmarkEnd w:id="50"/>
-    <w:bookmarkStart w:id="51" w:name="competing-interests"/>
+    <w:bookmarkEnd w:id="66"/>
+    <w:bookmarkStart w:id="67" w:name="competing-interests"/>
     <w:p>
       <w:pPr>
         <w:pStyle w:val="Heading2"/>
@@ -1515,8 +1515,8 @@
         <w:t xml:space="preserve">The author founded Odinzen LLC, which provides commercial thermodynamic modeling services, and declares this as a competing interest. The software and database published here are released in full under open licenses, and no proprietary Odinzen assets are included.</w:t>
       </w:r>
     </w:p>
-    <w:bookmarkEnd w:id="51"/>
-    <w:bookmarkStart w:id="52" w:name="references"/>
+    <w:bookmarkEnd w:id="67"/>
+    <w:bookmarkStart w:id="68" w:name="references"/>
     <w:p>
       <w:pPr>
         <w:pStyle w:val="Heading2"/>
@@ -1745,8 +1745,8 @@
         <w:t xml:space="preserve">[26] Wu P, Eriksson G, Pelton AD, Blander M. Prediction of the Thermodynamic Properties and Phase Diagrams of Silicate Systems-Evaluation of the FeO-MgO-SiO2 System. ISIJ International. 1993;33(1):26–35. doi:10.2355/isijinternational.33.26</w:t>
       </w:r>
     </w:p>
-    <w:bookmarkEnd w:id="52"/>
-    <w:bookmarkEnd w:id="53"/>
+    <w:bookmarkEnd w:id="68"/>
+    <w:bookmarkEnd w:id="69"/>
     <w:sectPr>
       <w:footnotePr>
         <w:numRestart w:val="eachSect"/>

</xml_diff>

<commit_message>
Cite the open salt family in the metapaper (refs 27-29, gated)
Add the molten-chloride family (LiCl-KCl, NaCl-KCl + halite, KCl-MgCl2 + KMgCl3,
NaCl-MgCl2, NaCl-KCl-MgCl2) to the database section, citing the sources its provenance
files actually use: Barin 1995 endmember tables, Hersh & Kleppa 1965 mixing calorimetry,
Sangster & Pelton 1987 halide evaluation. All three DOIs registry-verified (argus check
3/3 ok; a conflated first-guess DOI for Hersh & Kleppa was caught by the gate and
corrected). argus order green at 29 in-text / 29 list entries. Zip rebuilt.
</commit_message>
<xml_diff>
--- a/paper/Bustamante_Hephaestus_JORS_manuscript.docx
+++ b/paper/Bustamante_Hephaestus_JORS_manuscript.docx
@@ -2,7 +2,7 @@
 <file path=word/document.xml><?xml version="1.0" encoding="utf-8"?>
 <w:document xmlns:w="http://schemas.openxmlformats.org/wordprocessingml/2006/main" xmlns:m="http://schemas.openxmlformats.org/officeDocument/2006/math" xmlns:r="http://schemas.openxmlformats.org/officeDocument/2006/relationships" xmlns:o="urn:schemas-microsoft-com:office:office" xmlns:v="urn:schemas-microsoft-com:vml" xmlns:w10="urn:schemas-microsoft-com:office:word" xmlns:a="http://schemas.openxmlformats.org/drawingml/2006/main" xmlns:pic="http://schemas.openxmlformats.org/drawingml/2006/picture" xmlns:wp="http://schemas.openxmlformats.org/drawingml/2006/wordprocessingDrawing">
   <w:body>
-    <w:bookmarkStart w:id="69" w:name="X8d9333365672ef576e8b4652660e7ce735de326"/>
+    <w:bookmarkStart w:id="85" w:name="X8d9333365672ef576e8b4652660e7ce735de326"/>
     <w:p>
       <w:pPr>
         <w:pStyle w:val="Heading1"/>
@@ -123,7 +123,7 @@
         <w:t xml:space="preserve">CALPHAD; molten slag; modified quasichemical model; thermodynamic database; phase diagram; WebAssembly; oxide melts; open data</w:t>
       </w:r>
     </w:p>
-    <w:bookmarkStart w:id="54" w:name="overview"/>
+    <w:bookmarkStart w:id="70" w:name="overview"/>
     <w:p>
       <w:pPr>
         <w:pStyle w:val="Heading2"/>
@@ -132,7 +132,7 @@
         <w:t xml:space="preserve">(1) Overview</w:t>
       </w:r>
     </w:p>
-    <w:bookmarkStart w:id="41" w:name="introduction"/>
+    <w:bookmarkStart w:id="57" w:name="introduction"/>
     <w:p>
       <w:pPr>
         <w:pStyle w:val="Heading3"/>
@@ -157,8 +157,8 @@
         <w:t xml:space="preserve">Hephaestus is a deliberate response to that gap, and it treats the engine and the data as one contribution because neither is useful alone. The engine is small on purpose. Its core is plain C with no dependencies, which makes it easy to embed and lets the identical code compile to WebAssembly, so the full calculator runs in a web browser with nothing installed and no data leaving the user’s machine. The database is open on purpose. Every parameter in it derives from published measurements, each value carries its provenance down to table and page, and the known shortcomings are documented next to the numbers they affect. The present work describes both, their validation against pycalphad and against measured phase equilibria, and the ways they can be reused.</w:t>
       </w:r>
     </w:p>
-    <w:bookmarkEnd w:id="41"/>
-    <w:bookmarkStart w:id="51" w:name="implementation-and-architecture"/>
+    <w:bookmarkEnd w:id="57"/>
+    <w:bookmarkStart w:id="67" w:name="implementation-and-architecture"/>
     <w:p>
       <w:pPr>
         <w:pStyle w:val="Heading3"/>
@@ -184,18 +184,18 @@
           <wp:inline>
             <wp:extent cx="5334000" cy="3497491"/>
             <wp:effectExtent b="0" l="0" r="0" t="0"/>
-            <wp:docPr descr="Figure 1: Architecture of Hephaestus. A single dependency-free C core reads ChemSage-format files and computes all thermodynamics; the same core is used as a native library, from Python through cffi, and compiled to WebAssembly behind the browser application. dbbuild writes new ChemSage files from measured data, and every energy path is validated against pycalphad." title="" id="43" name="Picture"/>
+            <wp:docPr descr="Figure 1: Architecture of Hephaestus. A single dependency-free C core reads ChemSage-format files and computes all thermodynamics; the same core is used as a native library, from Python through cffi, and compiled to WebAssembly behind the browser application. dbbuild writes new ChemSage files from measured data, and every energy path is validated against pycalphad." title="" id="59" name="Picture"/>
             <a:graphic>
               <a:graphicData uri="http://schemas.openxmlformats.org/drawingml/2006/picture">
                 <pic:pic>
                   <pic:nvPicPr>
-                    <pic:cNvPr descr="figures/fig1_architecture.png" id="44" name="Picture"/>
+                    <pic:cNvPr descr="figures/fig1_architecture.png" id="60" name="Picture"/>
                     <pic:cNvPicPr>
                       <a:picLocks noChangeArrowheads="1" noChangeAspect="1"/>
                     </pic:cNvPicPr>
                   </pic:nvPicPr>
                   <pic:blipFill>
-                    <a:blip r:embed="rId42"/>
+                    <a:blip r:embed="rId58"/>
                     <a:stretch>
                       <a:fillRect/>
                     </a:stretch>
@@ -307,18 +307,18 @@
           <wp:inline>
             <wp:extent cx="4754880" cy="4464799"/>
             <wp:effectExtent b="0" l="0" r="0" t="0"/>
-            <wp:docPr descr="Figure 2: The live solver in the browser application (release v0.2.0, light theme). The user loads the shipped database, picks a temperature, and presses Compute; the WebAssembly engine then solves the full FeO-MgO-SiO2 phase assemblage client side (here 1023 composition samples and 512 tie-facets in under half a second). Tapping a composition reads its stable phases and pins it to a comparison list; hovering previews on desktop." title="" id="46" name="Picture"/>
+            <wp:docPr descr="Figure 2: The live solver in the browser application (release v0.2.0, light theme). The user loads the shipped database, picks a temperature, and presses Compute; the WebAssembly engine then solves the full FeO-MgO-SiO2 phase assemblage client side (here 1023 composition samples and 512 tie-facets in under half a second). Tapping a composition reads its stable phases and pins it to a comparison list; hovering previews on desktop." title="" id="62" name="Picture"/>
             <a:graphic>
               <a:graphicData uri="http://schemas.openxmlformats.org/drawingml/2006/picture">
                 <pic:pic>
                   <pic:nvPicPr>
-                    <pic:cNvPr descr="figures/fig2_browser_app.png" id="47" name="Picture"/>
+                    <pic:cNvPr descr="figures/fig2_browser_app.png" id="63" name="Picture"/>
                     <pic:cNvPicPr>
                       <a:picLocks noChangeArrowheads="1" noChangeAspect="1"/>
                     </pic:cNvPicPr>
                   </pic:nvPicPr>
                   <pic:blipFill>
-                    <a:blip r:embed="rId45"/>
+                    <a:blip r:embed="rId61"/>
                     <a:stretch>
                       <a:fillRect/>
                     </a:stretch>
@@ -406,7 +406,7 @@
         <w:t xml:space="preserve"> </w:t>
       </w:r>
       <w:r>
-        <w:t xml:space="preserve">liquidus surface [19], with the olivine field quantitative and the known offsets stated. No parameter is taken from any prior assessment or commercial database; published assessments of these systems [26] are used only as method literature. Each system folder carries a provenance file that names every source, every modeling judgment, and every known limit. The largest limit is stated plainly: the CaO-SiO</w:t>
+        <w:t xml:space="preserve">liquidus surface [19], with the olivine field quantitative and the known offsets stated. No parameter is taken from any prior assessment or commercial database; published assessments of these systems [26] are used only as method literature. The same engine and file format also serve molten salts: the repository ships an open chloride family alongside the slags (LiCl-KCl, NaCl-KCl with its continuous halite solid solution, KCl-MgCl</w:t>
       </w:r>
       <w:r>
         <w:rPr>
@@ -418,7 +418,16 @@
         <w:t xml:space="preserve"> </w:t>
       </w:r>
       <w:r>
-        <w:t xml:space="preserve">and MgO-SiO</w:t>
+        <w:t xml:space="preserve">with the double salt KMgCl</w:t>
+      </w:r>
+      <w:r>
+        <w:rPr>
+          <w:vertAlign w:val="subscript"/>
+        </w:rPr>
+        <w:t xml:space="preserve">3</w:t>
+      </w:r>
+      <w:r>
+        <w:t xml:space="preserve">, NaCl-MgCl</w:t>
       </w:r>
       <w:r>
         <w:rPr>
@@ -427,6 +436,39 @@
         <w:t xml:space="preserve">2</w:t>
       </w:r>
       <w:r>
+        <w:t xml:space="preserve">, and the assembled NaCl-KCl-MgCl</w:t>
+      </w:r>
+      <w:r>
+        <w:rPr>
+          <w:vertAlign w:val="subscript"/>
+        </w:rPr>
+        <w:t xml:space="preserve">2</w:t>
+      </w:r>
+      <w:r>
+        <w:t xml:space="preserve"> </w:t>
+      </w:r>
+      <w:r>
+        <w:t xml:space="preserve">ternary), built the same way from evaluated endmember tables [27], measured mixing calorimetry [28], and the measured eutectic, liquidus, and solvus record of the halide literature [29], and loadable in the browser application with one click. Each system folder carries a provenance file that names every source, every modeling judgment, and every known limit. The largest limit is stated plainly: the CaO-SiO</w:t>
+      </w:r>
+      <w:r>
+        <w:rPr>
+          <w:vertAlign w:val="subscript"/>
+        </w:rPr>
+        <w:t xml:space="preserve">2</w:t>
+      </w:r>
+      <w:r>
+        <w:t xml:space="preserve"> </w:t>
+      </w:r>
+      <w:r>
+        <w:t xml:space="preserve">and MgO-SiO</w:t>
+      </w:r>
+      <w:r>
+        <w:rPr>
+          <w:vertAlign w:val="subscript"/>
+        </w:rPr>
+        <w:t xml:space="preserve">2</w:t>
+      </w:r>
+      <w:r>
         <w:t xml:space="preserve"> </w:t>
       </w:r>
       <w:r>
@@ -442,18 +484,18 @@
           <wp:inline>
             <wp:extent cx="5334000" cy="2416336"/>
             <wp:effectExtent b="0" l="0" r="0" t="0"/>
-            <wp:docPr descr="Figure 3: The assessed FeO-MgO-SiO2 system calculated from the shipped database files. (a) Liquidus projection: primary crystallizing phase fields, with liquidus isotherms labeled in °C. (b) Isothermal section at 1600 °C: stable phase assemblages, shaded by the number of solid phases present. Phase labels: L liquid, Crs cristobalite, Ol olivine, Opx orthopyroxene, Per periclase, Wus wustite." title="" id="49" name="Picture"/>
+            <wp:docPr descr="Figure 3: The assessed FeO-MgO-SiO2 system calculated from the shipped database files. (a) Liquidus projection: primary crystallizing phase fields, with liquidus isotherms labeled in °C. (b) Isothermal section at 1600 °C: stable phase assemblages, shaded by the number of solid phases present. Phase labels: L liquid, Crs cristobalite, Ol olivine, Opx orthopyroxene, Per periclase, Wus wustite." title="" id="65" name="Picture"/>
             <a:graphic>
               <a:graphicData uri="http://schemas.openxmlformats.org/drawingml/2006/picture">
                 <pic:pic>
                   <pic:nvPicPr>
-                    <pic:cNvPr descr="figures/fig3_ternary.png" id="50" name="Picture"/>
+                    <pic:cNvPr descr="figures/fig3_ternary.png" id="66" name="Picture"/>
                     <pic:cNvPicPr>
                       <a:picLocks noChangeArrowheads="1" noChangeAspect="1"/>
                     </pic:cNvPicPr>
                   </pic:nvPicPr>
                   <pic:blipFill>
-                    <a:blip r:embed="rId48"/>
+                    <a:blip r:embed="rId64"/>
                     <a:stretch>
                       <a:fillRect/>
                     </a:stretch>
@@ -794,8 +836,8 @@
         <w:t xml:space="preserve">Table 1: The assessed liquids. Full source lists, modeling judgments, and limits are in each system’s provenance file in the repository.</w:t>
       </w:r>
     </w:p>
-    <w:bookmarkEnd w:id="51"/>
-    <w:bookmarkStart w:id="52" w:name="anatomy-of-a-database-file"/>
+    <w:bookmarkEnd w:id="67"/>
+    <w:bookmarkStart w:id="68" w:name="anatomy-of-a-database-file"/>
     <w:p>
       <w:pPr>
         <w:pStyle w:val="Heading3"/>
@@ -828,8 +870,8 @@
         <w:t xml:space="preserve">That asymmetry is the economics of the field in miniature: implementations of the published models are increasingly available, but each fitted parameter condenses dozens of measurements and decisions. Parameter sets rather than codes are therefore the scarce commodity, and an openly licensed, provenance-tracked database is the part of this contribution that cannot be regenerated from the paper alone.</w:t>
       </w:r>
     </w:p>
-    <w:bookmarkEnd w:id="52"/>
-    <w:bookmarkStart w:id="53" w:name="quality-control"/>
+    <w:bookmarkEnd w:id="68"/>
+    <w:bookmarkStart w:id="69" w:name="quality-control"/>
     <w:p>
       <w:pPr>
         <w:pStyle w:val="Heading3"/>
@@ -1136,9 +1178,9 @@
         <w:t xml:space="preserve">invariants sit within about 40 °C, and the ternary liquidus projection reproduces the measured field topology [19]. The suite runs on Windows 11 under CPython 3.11 and 3.12; the browser application is exercised in Chromium- and Gecko-based browsers. A user can confirm a working installation by running pytest against the bundled test databases, or with no installation at all by opening the web application and loading the shipped ternary database.</w:t>
       </w:r>
     </w:p>
-    <w:bookmarkEnd w:id="53"/>
-    <w:bookmarkEnd w:id="54"/>
-    <w:bookmarkStart w:id="62" w:name="availability"/>
+    <w:bookmarkEnd w:id="69"/>
+    <w:bookmarkEnd w:id="70"/>
+    <w:bookmarkStart w:id="78" w:name="availability"/>
     <w:p>
       <w:pPr>
         <w:pStyle w:val="Heading2"/>
@@ -1147,7 +1189,7 @@
         <w:t xml:space="preserve">(2) Availability</w:t>
       </w:r>
     </w:p>
-    <w:bookmarkStart w:id="55" w:name="operating-system"/>
+    <w:bookmarkStart w:id="71" w:name="operating-system"/>
     <w:p>
       <w:pPr>
         <w:pStyle w:val="Heading3"/>
@@ -1164,8 +1206,8 @@
         <w:t xml:space="preserve">Platform independent. The core builds with any C99 compiler; development and testing used Windows 11. The browser application runs in any current browser with WebAssembly support.</w:t>
       </w:r>
     </w:p>
-    <w:bookmarkEnd w:id="55"/>
-    <w:bookmarkStart w:id="56" w:name="programming-language"/>
+    <w:bookmarkEnd w:id="71"/>
+    <w:bookmarkStart w:id="72" w:name="programming-language"/>
     <w:p>
       <w:pPr>
         <w:pStyle w:val="Heading3"/>
@@ -1182,8 +1224,8 @@
         <w:t xml:space="preserve">C (core), Python 3.11 or later (interface and fitting tools), JavaScript (browser application).</w:t>
       </w:r>
     </w:p>
-    <w:bookmarkEnd w:id="56"/>
-    <w:bookmarkStart w:id="57" w:name="additional-system-requirements"/>
+    <w:bookmarkEnd w:id="72"/>
+    <w:bookmarkStart w:id="73" w:name="additional-system-requirements"/>
     <w:p>
       <w:pPr>
         <w:pStyle w:val="Heading3"/>
@@ -1200,8 +1242,8 @@
         <w:t xml:space="preserve">None of note. The engine and database together are a few megabytes.</w:t>
       </w:r>
     </w:p>
-    <w:bookmarkEnd w:id="57"/>
-    <w:bookmarkStart w:id="58" w:name="dependencies"/>
+    <w:bookmarkEnd w:id="73"/>
+    <w:bookmarkStart w:id="74" w:name="dependencies"/>
     <w:p>
       <w:pPr>
         <w:pStyle w:val="Heading3"/>
@@ -1218,8 +1260,8 @@
         <w:t xml:space="preserve">Python interface: cffi, NumPy, SciPy. Validation suite additionally requires pycalphad. WebAssembly build requires emscripten. The C core and the browser application have no dependencies.</w:t>
       </w:r>
     </w:p>
-    <w:bookmarkEnd w:id="58"/>
-    <w:bookmarkStart w:id="59" w:name="list-of-contributors"/>
+    <w:bookmarkEnd w:id="74"/>
+    <w:bookmarkStart w:id="75" w:name="list-of-contributors"/>
     <w:p>
       <w:pPr>
         <w:pStyle w:val="Heading3"/>
@@ -1236,8 +1278,8 @@
         <w:t xml:space="preserve">Michael E. Bustamante (design, implementation, validation, data curation).</w:t>
       </w:r>
     </w:p>
-    <w:bookmarkEnd w:id="59"/>
-    <w:bookmarkStart w:id="60" w:name="software-location"/>
+    <w:bookmarkEnd w:id="75"/>
+    <w:bookmarkStart w:id="76" w:name="software-location"/>
     <w:p>
       <w:pPr>
         <w:pStyle w:val="Heading3"/>
@@ -1390,8 +1432,8 @@
         <w:t xml:space="preserve">Date published: 2026-09-02</w:t>
       </w:r>
     </w:p>
-    <w:bookmarkEnd w:id="60"/>
-    <w:bookmarkStart w:id="61" w:name="language"/>
+    <w:bookmarkEnd w:id="76"/>
+    <w:bookmarkStart w:id="77" w:name="language"/>
     <w:p>
       <w:pPr>
         <w:pStyle w:val="Heading3"/>
@@ -1408,9 +1450,9 @@
         <w:t xml:space="preserve">English.</w:t>
       </w:r>
     </w:p>
-    <w:bookmarkEnd w:id="61"/>
-    <w:bookmarkEnd w:id="62"/>
-    <w:bookmarkStart w:id="63" w:name="reuse-potential"/>
+    <w:bookmarkEnd w:id="77"/>
+    <w:bookmarkEnd w:id="78"/>
+    <w:bookmarkStart w:id="79" w:name="reuse-potential"/>
     <w:p>
       <w:pPr>
         <w:pStyle w:val="Heading2"/>
@@ -1443,8 +1485,8 @@
         <w:t xml:space="preserve">The database is a starting point rather than an endpoint, and the file format rewards growth: new components, new phases, and refits against new measurements accumulate in the same database. A system is therefore extended release by release rather than rebuilt, and archived versions keep results calculated against earlier releases reproducible. Because every value carries its source and every judgment is written down, another assessor can reweight the data, swap an endmember, or extend a system without reverse-engineering anything; dbbuild turns a table of measured activities into a loadable file in a few lines. The in-browser multiphase hull already covers any loaded three-cation file, so a new system becomes a browser phase diagram the moment its file loads; natural extensions are further oxide systems and the remaining ChemSage solution models. Contributions and issues are handled through the GitHub repository.</w:t>
       </w:r>
     </w:p>
-    <w:bookmarkEnd w:id="63"/>
-    <w:bookmarkStart w:id="64" w:name="data-availability"/>
+    <w:bookmarkEnd w:id="79"/>
+    <w:bookmarkStart w:id="80" w:name="data-availability"/>
     <w:p>
       <w:pPr>
         <w:pStyle w:val="Heading2"/>
@@ -1461,8 +1503,8 @@
         <w:t xml:space="preserve">The engine, the database, the browser application, and the validation suite are openly available in the code repository listed above; the version described here is archived as release v0.2.0. The database files and their provenance records are in the repository’s data directory under CC BY 4.0.</w:t>
       </w:r>
     </w:p>
-    <w:bookmarkEnd w:id="64"/>
-    <w:bookmarkStart w:id="65" w:name="acknowledgements"/>
+    <w:bookmarkEnd w:id="80"/>
+    <w:bookmarkStart w:id="81" w:name="acknowledgements"/>
     <w:p>
       <w:pPr>
         <w:pStyle w:val="Heading2"/>
@@ -1479,8 +1521,8 @@
         <w:t xml:space="preserve">During the development of this software the author used Claude Code (Anthropic) to assist with implementation, validation scripting, and manuscript preparation. This assistance was agentic, not autonomous: it operated under author direction and supervision at every step and was never a closed loop that produced or accepted results without review. Every parameter was traced by the author to its primary source before entering the database, and every reference was verified against its registry record. The author reviewed and approved all output and takes full responsibility for this article.</w:t>
       </w:r>
     </w:p>
-    <w:bookmarkEnd w:id="65"/>
-    <w:bookmarkStart w:id="66" w:name="funding-statement"/>
+    <w:bookmarkEnd w:id="81"/>
+    <w:bookmarkStart w:id="82" w:name="funding-statement"/>
     <w:p>
       <w:pPr>
         <w:pStyle w:val="Heading2"/>
@@ -1497,8 +1539,8 @@
         <w:t xml:space="preserve">The development of this software received no external funding.</w:t>
       </w:r>
     </w:p>
-    <w:bookmarkEnd w:id="66"/>
-    <w:bookmarkStart w:id="67" w:name="competing-interests"/>
+    <w:bookmarkEnd w:id="82"/>
+    <w:bookmarkStart w:id="83" w:name="competing-interests"/>
     <w:p>
       <w:pPr>
         <w:pStyle w:val="Heading2"/>
@@ -1515,8 +1557,8 @@
         <w:t xml:space="preserve">The author founded Odinzen LLC, which provides commercial thermodynamic modeling services, and declares this as a competing interest. The software and database published here are released in full under open licenses, and no proprietary Odinzen assets are included.</w:t>
       </w:r>
     </w:p>
-    <w:bookmarkEnd w:id="67"/>
-    <w:bookmarkStart w:id="68" w:name="references"/>
+    <w:bookmarkEnd w:id="83"/>
+    <w:bookmarkStart w:id="84" w:name="references"/>
     <w:p>
       <w:pPr>
         <w:pStyle w:val="Heading2"/>
@@ -1745,8 +1787,32 @@
         <w:t xml:space="preserve">[26] Wu P, Eriksson G, Pelton AD, Blander M. Prediction of the Thermodynamic Properties and Phase Diagrams of Silicate Systems-Evaluation of the FeO-MgO-SiO2 System. ISIJ International. 1993;33(1):26–35. doi:10.2355/isijinternational.33.26</w:t>
       </w:r>
     </w:p>
-    <w:bookmarkEnd w:id="68"/>
-    <w:bookmarkEnd w:id="69"/>
+    <w:p>
+      <w:pPr>
+        <w:pStyle w:val="BodyText"/>
+      </w:pPr>
+      <w:r>
+        <w:t xml:space="preserve">[27] Barin I. Thermochemical Data of Pure Substances. 3rd ed. Weinheim: VCH; 1995. doi:10.1002/9783527619825</w:t>
+      </w:r>
+    </w:p>
+    <w:p>
+      <w:pPr>
+        <w:pStyle w:val="BodyText"/>
+      </w:pPr>
+      <w:r>
+        <w:t xml:space="preserve">[28] Hersh LS, Kleppa OJ. Enthalpies of Mixing in Some Binary Liquid Halide Mixtures. J Chem Phys. 1965;42:1309. doi:10.1063/1.1696115</w:t>
+      </w:r>
+    </w:p>
+    <w:p>
+      <w:pPr>
+        <w:pStyle w:val="BodyText"/>
+      </w:pPr>
+      <w:r>
+        <w:t xml:space="preserve">[29] Sangster J, Pelton AD. Phase Diagrams and Thermodynamic Properties of the 70 Binary Alkali Halide Systems Having Common Ions. J Phys Chem Ref Data. 1987;16:509. doi:10.1063/1.555803</w:t>
+      </w:r>
+    </w:p>
+    <w:bookmarkEnd w:id="84"/>
+    <w:bookmarkEnd w:id="85"/>
     <w:sectPr>
       <w:footnotePr>
         <w:numRestart w:val="eachSect"/>

</xml_diff>

<commit_message>
Title reflects the full scope: in-browser engine and open databases for slags, molten salts, and alloys (was slag-only); carried through the supplement and cover letter
Co-Authored-By: Claude Fable 5 <noreply@anthropic.com>
</commit_message>
<xml_diff>
--- a/paper/Bustamante_Hephaestus_JORS_manuscript.docx
+++ b/paper/Bustamante_Hephaestus_JORS_manuscript.docx
@@ -2,13 +2,13 @@
 <file path=word/document.xml><?xml version="1.0" encoding="utf-8"?>
 <w:document xmlns:w="http://schemas.openxmlformats.org/wordprocessingml/2006/main" xmlns:m="http://schemas.openxmlformats.org/officeDocument/2006/math" xmlns:r="http://schemas.openxmlformats.org/officeDocument/2006/relationships" xmlns:o="urn:schemas-microsoft-com:office:office" xmlns:v="urn:schemas-microsoft-com:vml" xmlns:w10="urn:schemas-microsoft-com:office:word" xmlns:a="http://schemas.openxmlformats.org/drawingml/2006/main" xmlns:pic="http://schemas.openxmlformats.org/drawingml/2006/picture" xmlns:wp="http://schemas.openxmlformats.org/drawingml/2006/wordprocessingDrawing">
   <w:body>
-    <w:bookmarkStart w:id="448" w:name="X8d9333365672ef576e8b4652660e7ce735de326"/>
+    <w:bookmarkStart w:id="482" w:name="X356b170f064e9677b3a5f814002b4c3be46c723"/>
     <w:p>
       <w:pPr>
         <w:pStyle w:val="Heading1"/>
       </w:pPr>
       <w:r>
-        <w:t xml:space="preserve">Hephaestus: an open-source engine and database for the thermodynamics and phase diagrams of molten oxide slags</w:t>
+        <w:t xml:space="preserve">Hephaestus: an in-browser open-source engine and open databases for the thermodynamics and phase diagrams of slags, molten salts, and alloys</w:t>
       </w:r>
     </w:p>
     <w:p>
@@ -123,7 +123,7 @@
         <w:t xml:space="preserve">CALPHAD; molten slag; modified quasichemical model; thermodynamic database; phase diagram; WebAssembly; oxide melts; open data</w:t>
       </w:r>
     </w:p>
-    <w:bookmarkStart w:id="426" w:name="overview"/>
+    <w:bookmarkStart w:id="460" w:name="overview"/>
     <w:p>
       <w:pPr>
         <w:pStyle w:val="Heading2"/>
@@ -132,7 +132,7 @@
         <w:t xml:space="preserve">(1) Overview</w:t>
       </w:r>
     </w:p>
-    <w:bookmarkStart w:id="413" w:name="introduction"/>
+    <w:bookmarkStart w:id="447" w:name="introduction"/>
     <w:p>
       <w:pPr>
         <w:pStyle w:val="Heading3"/>
@@ -454,8 +454,8 @@
         <w:t xml:space="preserve">Hephaestus is a deliberate response to that gap, and it treats the engine and the data as one contribution because neither is useful alone. The engine is small on purpose. Its core is plain C with no dependencies, which makes it easy to embed and lets the identical code compile to WebAssembly, so the full calculator runs in a web browser with nothing installed and no data leaving the user’s machine. The database is open on purpose. Every parameter in it derives from published measurements, each value carries its provenance down to table and page, and the known shortcomings are documented next to the numbers they affect. The present work describes both, their validation against pycalphad and against measured phase equilibria, and the ways they can be reused. None of it asks the reader to program. For the experimentalist who never writes code, the browser application is the entire product, a page to open, a database to click, and a diagram to read; the sections that follow describe the machinery underneath for those who want it, and Supplementary Material S1 is a plain-language primer provided so that the non-programmer can learn enough to use the tool, starting at what a database file even is and ending at a first calculation and how to read it. Its closing section teaches what an assessment is built from, so a reader who wants to learn the craft and contribute data for open publication, or to arrive prepared to a first conversation about a commissioned file, knows beforehand exactly what is needed.</w:t>
       </w:r>
     </w:p>
-    <w:bookmarkEnd w:id="413"/>
-    <w:bookmarkStart w:id="423" w:name="implementation-and-architecture"/>
+    <w:bookmarkEnd w:id="447"/>
+    <w:bookmarkStart w:id="457" w:name="implementation-and-architecture"/>
     <w:p>
       <w:pPr>
         <w:pStyle w:val="Heading3"/>
@@ -481,18 +481,18 @@
           <wp:inline>
             <wp:extent cx="5334000" cy="3497491"/>
             <wp:effectExtent b="0" l="0" r="0" t="0"/>
-            <wp:docPr descr="Figure 1: Architecture of Hephaestus. A single dependency-free C core reads ChemSage-format files and computes all thermodynamics; the same core is used as a native library, from Python through cffi, and compiled to WebAssembly behind the browser application. dbbuild writes new ChemSage files from measured data, and every energy path is validated against pycalphad." title="" id="415" name="Picture"/>
+            <wp:docPr descr="Figure 1: Architecture of Hephaestus. A single dependency-free C core reads ChemSage-format files and computes all thermodynamics; the same core is used as a native library, from Python through cffi, and compiled to WebAssembly behind the browser application. dbbuild writes new ChemSage files from measured data, and every energy path is validated against pycalphad." title="" id="449" name="Picture"/>
             <a:graphic>
               <a:graphicData uri="http://schemas.openxmlformats.org/drawingml/2006/picture">
                 <pic:pic>
                   <pic:nvPicPr>
-                    <pic:cNvPr descr="figures/fig1_architecture.png" id="416" name="Picture"/>
+                    <pic:cNvPr descr="figures/fig1_architecture.png" id="450" name="Picture"/>
                     <pic:cNvPicPr>
                       <a:picLocks noChangeArrowheads="1" noChangeAspect="1"/>
                     </pic:cNvPicPr>
                   </pic:nvPicPr>
                   <pic:blipFill>
-                    <a:blip r:embed="rId414"/>
+                    <a:blip r:embed="rId448"/>
                     <a:stretch>
                       <a:fillRect/>
                     </a:stretch>
@@ -679,18 +679,18 @@
           <wp:inline>
             <wp:extent cx="4754880" cy="4464799"/>
             <wp:effectExtent b="0" l="0" r="0" t="0"/>
-            <wp:docPr descr="Figure 2: The live solver in the browser application (release v0.2.0, light theme). The user loads the shipped database, picks a temperature, and presses Compute; the WebAssembly engine then solves the full FeO-MgO-SiO2 phase assemblage client side (here 1023 composition samples and 512 tie-facets in under half a second). Tapping a composition reads its stable phases and pins it to a comparison list; hovering previews on desktop." title="" id="418" name="Picture"/>
+            <wp:docPr descr="Figure 2: The live solver in the browser application (release v0.2.0, light theme). The user loads the shipped database, picks a temperature, and presses Compute; the WebAssembly engine then solves the full FeO-MgO-SiO2 phase assemblage client side (here 1023 composition samples and 512 tie-facets in under half a second). Tapping a composition reads its stable phases and pins it to a comparison list; hovering previews on desktop." title="" id="452" name="Picture"/>
             <a:graphic>
               <a:graphicData uri="http://schemas.openxmlformats.org/drawingml/2006/picture">
                 <pic:pic>
                   <pic:nvPicPr>
-                    <pic:cNvPr descr="figures/fig2_browser_app.png" id="419" name="Picture"/>
+                    <pic:cNvPr descr="figures/fig2_browser_app.png" id="453" name="Picture"/>
                     <pic:cNvPicPr>
                       <a:picLocks noChangeArrowheads="1" noChangeAspect="1"/>
                     </pic:cNvPicPr>
                   </pic:nvPicPr>
                   <pic:blipFill>
-                    <a:blip r:embed="rId417"/>
+                    <a:blip r:embed="rId451"/>
                     <a:stretch>
                       <a:fillRect/>
                     </a:stretch>
@@ -856,18 +856,18 @@
           <wp:inline>
             <wp:extent cx="5334000" cy="2416336"/>
             <wp:effectExtent b="0" l="0" r="0" t="0"/>
-            <wp:docPr descr="Figure 3: The assessed FeO-MgO-SiO2 system calculated from the shipped database files. (a) Liquidus projection: primary crystallizing phase fields, with liquidus isotherms labeled in °C. (b) Isothermal section at 1600 °C: stable phase assemblages, shaded by the number of solid phases present. Phase labels: L liquid, Crs cristobalite, Ol olivine, Opx orthopyroxene, Per periclase, Wus wustite." title="" id="421" name="Picture"/>
+            <wp:docPr descr="Figure 3: The assessed FeO-MgO-SiO2 system calculated from the shipped database files. (a) Liquidus projection: primary crystallizing phase fields, with liquidus isotherms labeled in °C. (b) Isothermal section at 1600 °C: stable phase assemblages, shaded by the number of solid phases present. Phase labels: L liquid, Crs cristobalite, Ol olivine, Opx orthopyroxene, Per periclase, Wus wustite." title="" id="455" name="Picture"/>
             <a:graphic>
               <a:graphicData uri="http://schemas.openxmlformats.org/drawingml/2006/picture">
                 <pic:pic>
                   <pic:nvPicPr>
-                    <pic:cNvPr descr="figures/fig3_ternary.png" id="422" name="Picture"/>
+                    <pic:cNvPr descr="figures/fig3_ternary.png" id="456" name="Picture"/>
                     <pic:cNvPicPr>
                       <a:picLocks noChangeArrowheads="1" noChangeAspect="1"/>
                     </pic:cNvPicPr>
                   </pic:nvPicPr>
                   <pic:blipFill>
-                    <a:blip r:embed="rId420"/>
+                    <a:blip r:embed="rId454"/>
                     <a:stretch>
                       <a:fillRect/>
                     </a:stretch>
@@ -1208,8 +1208,8 @@
         <w:t xml:space="preserve">Table 2: The assessed liquids. Full source lists, modeling judgments, and limits are in each system’s provenance file in the repository.</w:t>
       </w:r>
     </w:p>
-    <w:bookmarkEnd w:id="423"/>
-    <w:bookmarkStart w:id="424" w:name="anatomy-of-a-database-file"/>
+    <w:bookmarkEnd w:id="457"/>
+    <w:bookmarkStart w:id="458" w:name="anatomy-of-a-database-file"/>
     <w:p>
       <w:pPr>
         <w:pStyle w:val="Heading3"/>
@@ -1242,8 +1242,8 @@
         <w:t xml:space="preserve">That asymmetry is the economics of the field in miniature: implementations of the published models are increasingly available, but each fitted parameter condenses dozens of measurements and decisions. Parameter sets rather than codes are therefore the scarce commodity, and an openly licensed, provenance-tracked database is the part of this contribution that cannot be regenerated from the paper alone.</w:t>
       </w:r>
     </w:p>
-    <w:bookmarkEnd w:id="424"/>
-    <w:bookmarkStart w:id="425" w:name="quality-control"/>
+    <w:bookmarkEnd w:id="458"/>
+    <w:bookmarkStart w:id="459" w:name="quality-control"/>
     <w:p>
       <w:pPr>
         <w:pStyle w:val="Heading3"/>
@@ -1688,9 +1688,9 @@
         <w:t xml:space="preserve">invariants sit within about 40 °C, and the ternary liquidus projection reproduces the measured field topology [23]. Development practice is plain: the repository is version controlled with tagged releases (v0.1.0 through the v0.3.0 described here), the full suite runs before every release, and a fixed bug lands together with the regression test that would have caught it. The suite runs on Windows 11 under CPython 3.11 and 3.12; the browser application is exercised in Chromium- and Gecko-based browsers. A user can confirm a working installation by running pytest against the bundled test databases, or with no installation at all by opening the web application and loading the shipped ternary database.</w:t>
       </w:r>
     </w:p>
-    <w:bookmarkEnd w:id="425"/>
-    <w:bookmarkEnd w:id="426"/>
-    <w:bookmarkStart w:id="434" w:name="availability"/>
+    <w:bookmarkEnd w:id="459"/>
+    <w:bookmarkEnd w:id="460"/>
+    <w:bookmarkStart w:id="468" w:name="availability"/>
     <w:p>
       <w:pPr>
         <w:pStyle w:val="Heading2"/>
@@ -1699,7 +1699,7 @@
         <w:t xml:space="preserve">(2) Availability</w:t>
       </w:r>
     </w:p>
-    <w:bookmarkStart w:id="427" w:name="operating-system"/>
+    <w:bookmarkStart w:id="461" w:name="operating-system"/>
     <w:p>
       <w:pPr>
         <w:pStyle w:val="Heading3"/>
@@ -1716,8 +1716,8 @@
         <w:t xml:space="preserve">Platform independent. The core builds with any C99 compiler; development and testing used Windows 11. The browser application runs in any current browser with WebAssembly support.</w:t>
       </w:r>
     </w:p>
-    <w:bookmarkEnd w:id="427"/>
-    <w:bookmarkStart w:id="428" w:name="programming-language"/>
+    <w:bookmarkEnd w:id="461"/>
+    <w:bookmarkStart w:id="462" w:name="programming-language"/>
     <w:p>
       <w:pPr>
         <w:pStyle w:val="Heading3"/>
@@ -1734,8 +1734,8 @@
         <w:t xml:space="preserve">C (core), Python 3.11 or later (interface and fitting tools), JavaScript (browser application).</w:t>
       </w:r>
     </w:p>
-    <w:bookmarkEnd w:id="428"/>
-    <w:bookmarkStart w:id="429" w:name="additional-system-requirements"/>
+    <w:bookmarkEnd w:id="462"/>
+    <w:bookmarkStart w:id="463" w:name="additional-system-requirements"/>
     <w:p>
       <w:pPr>
         <w:pStyle w:val="Heading3"/>
@@ -1752,8 +1752,8 @@
         <w:t xml:space="preserve">None of note. The engine and database together are a few megabytes.</w:t>
       </w:r>
     </w:p>
-    <w:bookmarkEnd w:id="429"/>
-    <w:bookmarkStart w:id="430" w:name="dependencies"/>
+    <w:bookmarkEnd w:id="463"/>
+    <w:bookmarkStart w:id="464" w:name="dependencies"/>
     <w:p>
       <w:pPr>
         <w:pStyle w:val="Heading3"/>
@@ -1770,8 +1770,8 @@
         <w:t xml:space="preserve">Python interface: cffi, NumPy, SciPy. Validation suite additionally requires pycalphad. WebAssembly build requires emscripten. The C core and the browser application have no dependencies.</w:t>
       </w:r>
     </w:p>
-    <w:bookmarkEnd w:id="430"/>
-    <w:bookmarkStart w:id="431" w:name="list-of-contributors"/>
+    <w:bookmarkEnd w:id="464"/>
+    <w:bookmarkStart w:id="465" w:name="list-of-contributors"/>
     <w:p>
       <w:pPr>
         <w:pStyle w:val="Heading3"/>
@@ -1788,8 +1788,8 @@
         <w:t xml:space="preserve">Michael E. Bustamante (design, implementation, validation, data curation).</w:t>
       </w:r>
     </w:p>
-    <w:bookmarkEnd w:id="431"/>
-    <w:bookmarkStart w:id="432" w:name="software-location"/>
+    <w:bookmarkEnd w:id="465"/>
+    <w:bookmarkStart w:id="466" w:name="software-location"/>
     <w:p>
       <w:pPr>
         <w:pStyle w:val="Heading3"/>
@@ -1942,8 +1942,8 @@
         <w:t xml:space="preserve">Date published: 2026-09-02</w:t>
       </w:r>
     </w:p>
-    <w:bookmarkEnd w:id="432"/>
-    <w:bookmarkStart w:id="433" w:name="language"/>
+    <w:bookmarkEnd w:id="466"/>
+    <w:bookmarkStart w:id="467" w:name="language"/>
     <w:p>
       <w:pPr>
         <w:pStyle w:val="Heading3"/>
@@ -1960,9 +1960,9 @@
         <w:t xml:space="preserve">English.</w:t>
       </w:r>
     </w:p>
-    <w:bookmarkEnd w:id="433"/>
-    <w:bookmarkEnd w:id="434"/>
-    <w:bookmarkStart w:id="442" w:name="reuse-potential"/>
+    <w:bookmarkEnd w:id="467"/>
+    <w:bookmarkEnd w:id="468"/>
+    <w:bookmarkStart w:id="476" w:name="reuse-potential"/>
     <w:p>
       <w:pPr>
         <w:pStyle w:val="Heading2"/>
@@ -1987,7 +1987,7 @@
         <w:t xml:space="preserve">The browser application makes the lowest barrier the default. A lecture on slag thermodynamics, a plant metallurgist screening a composition, or a reviewer checking a claimed equilibrium can load the database and calculate in seconds, with confidential inputs never leaving the machine. The same property makes it a practical template for other groups who want to publish a model as a zero-install tool.</w:t>
       </w:r>
     </w:p>
-    <w:bookmarkStart w:id="441" w:name="worked-examples"/>
+    <w:bookmarkStart w:id="475" w:name="worked-examples"/>
     <w:p>
       <w:pPr>
         <w:pStyle w:val="Heading3"/>
@@ -2179,18 +2179,18 @@
           <wp:inline>
             <wp:extent cx="4206240" cy="3108960"/>
             <wp:effectExtent b="0" l="0" r="0" t="0"/>
-            <wp:docPr descr="Figure 4: The LiCl-KCl phase diagram computed by the salt listing from the shipped open database, on the listing’s own grid. Light to dark: liquid, two-phase, and subsolidus fields. The dot is the computed eutectic on this grid (0.400, 640 K); the star is the measured eutectic (0.415, 626 K)." title="" id="436" name="Picture"/>
+            <wp:docPr descr="Figure 4: The LiCl-KCl phase diagram computed by the salt listing from the shipped open database, on the listing’s own grid. Light to dark: liquid, two-phase, and subsolidus fields. The dot is the computed eutectic on this grid (0.400, 640 K); the star is the measured eutectic (0.415, 626 K)." title="" id="470" name="Picture"/>
             <a:graphic>
               <a:graphicData uri="http://schemas.openxmlformats.org/drawingml/2006/picture">
                 <pic:pic>
                   <pic:nvPicPr>
-                    <pic:cNvPr descr="figures/fig4_salt_example.png" id="437" name="Picture"/>
+                    <pic:cNvPr descr="figures/fig4_salt_example.png" id="471" name="Picture"/>
                     <pic:cNvPicPr>
                       <a:picLocks noChangeArrowheads="1" noChangeAspect="1"/>
                     </pic:cNvPicPr>
                   </pic:nvPicPr>
                   <pic:blipFill>
-                    <a:blip r:embed="rId435"/>
+                    <a:blip r:embed="rId469"/>
                     <a:stretch>
                       <a:fillRect/>
                     </a:stretch>
@@ -2396,18 +2396,18 @@
           <wp:inline>
             <wp:extent cx="4206240" cy="3108960"/>
             <wp:effectExtent b="0" l="0" r="0" t="0"/>
-            <wp:docPr descr="Figure 5: The Al-Zn phase diagram computed by the alloy listing from the shipped open TDB. Light to dark: liquid, liquid plus solid, and solid fields. The dot is the computed eutectic (0.890, 660 K); the star is the assessed eutectic (0.885, 654 K)." title="" id="439" name="Picture"/>
+            <wp:docPr descr="Figure 5: The Al-Zn phase diagram computed by the alloy listing from the shipped open TDB. Light to dark: liquid, liquid plus solid, and solid fields. The dot is the computed eutectic (0.890, 660 K); the star is the assessed eutectic (0.885, 654 K)." title="" id="473" name="Picture"/>
             <a:graphic>
               <a:graphicData uri="http://schemas.openxmlformats.org/drawingml/2006/picture">
                 <pic:pic>
                   <pic:nvPicPr>
-                    <pic:cNvPr descr="figures/fig5_alloy_example.png" id="440" name="Picture"/>
+                    <pic:cNvPr descr="figures/fig5_alloy_example.png" id="474" name="Picture"/>
                     <pic:cNvPicPr>
                       <a:picLocks noChangeArrowheads="1" noChangeAspect="1"/>
                     </pic:cNvPicPr>
                   </pic:nvPicPr>
                   <pic:blipFill>
-                    <a:blip r:embed="rId438"/>
+                    <a:blip r:embed="rId472"/>
                     <a:stretch>
                       <a:fillRect/>
                     </a:stretch>
@@ -2450,9 +2450,9 @@
         <w:t xml:space="preserve">The database is a starting point rather than an endpoint, and the file format rewards growth: new components, new phases, and refits against new measurements accumulate in the same database. A system is therefore extended release by release rather than rebuilt, and archived versions keep results calculated against earlier releases reproducible. Because every value carries its source and every judgment is written down, another assessor can reweight the data, swap an endmember, or extend a system without reverse-engineering anything; dbbuild turns a table of measured activities into a loadable file in a few lines. The in-browser multiphase hull already covers any loaded three-cation file and any loaded alloy TDB join, so a new system becomes a browser phase diagram the moment its file loads. Natural extensions are further oxide systems, the remaining ChemSage solution models, the ionic-liquid TDB model, and multicomponent Scheil on the same hull machinery. The repository also publishes an openly specified unified dialect (uTDB) that carries the MQMQA statements inside TDB grammar, with two shipped demonstration files chosen to be processes rather than curiosities: an aluminum-recycling database holding the Al-Zn alloy with its NaCl-KCl-MgCl2 salt flux, and a steelmaking database holding a basic Fe-C steel, magnetic phases included, with the FeO-MgO-SiO2 slag and its silicate solid solutions. Round-trip tests assert both reproduce their source-file physics at machine precision. Relative to the XML road of XTDB [15] (Table 1), uTDB is the on-ramp from the installed base, extending files as they are and running in this engine today, with mechanical conversion to XTDB elements the natural bridge once that schema settles. Making the calculator multilingual across the field’s file dialects is the direction of travel. Contributions and issues are handled through the GitHub repository.</w:t>
       </w:r>
     </w:p>
-    <w:bookmarkEnd w:id="441"/>
-    <w:bookmarkEnd w:id="442"/>
-    <w:bookmarkStart w:id="443" w:name="data-availability"/>
+    <w:bookmarkEnd w:id="475"/>
+    <w:bookmarkEnd w:id="476"/>
+    <w:bookmarkStart w:id="477" w:name="data-availability"/>
     <w:p>
       <w:pPr>
         <w:pStyle w:val="Heading2"/>
@@ -2469,8 +2469,8 @@
         <w:t xml:space="preserve">The engine, the database, the browser application, and the validation suite are openly available in the code repository listed above; the version described here is archived as release v0.3.0. The database files and their provenance records are in the repository’s data directory under CC BY 4.0.</w:t>
       </w:r>
     </w:p>
-    <w:bookmarkEnd w:id="443"/>
-    <w:bookmarkStart w:id="444" w:name="acknowledgements"/>
+    <w:bookmarkEnd w:id="477"/>
+    <w:bookmarkStart w:id="478" w:name="acknowledgements"/>
     <w:p>
       <w:pPr>
         <w:pStyle w:val="Heading2"/>
@@ -2487,8 +2487,8 @@
         <w:t xml:space="preserve">During the development of this software the author used Claude Code (Anthropic) to assist with implementation, validation scripting, and manuscript preparation. This assistance was agentic, not autonomous: it operated under author direction and supervision at every step and was never a closed loop that produced or accepted results without review. Every parameter was traced by the author to its primary source before entering the database, and every reference was verified against its registry record. The author reviewed and approved all output and takes full responsibility for this article.</w:t>
       </w:r>
     </w:p>
-    <w:bookmarkEnd w:id="444"/>
-    <w:bookmarkStart w:id="445" w:name="funding-statement"/>
+    <w:bookmarkEnd w:id="478"/>
+    <w:bookmarkStart w:id="479" w:name="funding-statement"/>
     <w:p>
       <w:pPr>
         <w:pStyle w:val="Heading2"/>
@@ -2505,8 +2505,8 @@
         <w:t xml:space="preserve">The development of this software received no external funding.</w:t>
       </w:r>
     </w:p>
-    <w:bookmarkEnd w:id="445"/>
-    <w:bookmarkStart w:id="446" w:name="competing-interests"/>
+    <w:bookmarkEnd w:id="479"/>
+    <w:bookmarkStart w:id="480" w:name="competing-interests"/>
     <w:p>
       <w:pPr>
         <w:pStyle w:val="Heading2"/>
@@ -2523,8 +2523,8 @@
         <w:t xml:space="preserve">The author founded Odinzen LLC, which provides commercial thermodynamic modeling services, and declares this as a competing interest. The software and database published here are released in full under open licenses, and no proprietary Odinzen assets are included.</w:t>
       </w:r>
     </w:p>
-    <w:bookmarkEnd w:id="446"/>
-    <w:bookmarkStart w:id="447" w:name="references"/>
+    <w:bookmarkEnd w:id="480"/>
+    <w:bookmarkStart w:id="481" w:name="references"/>
     <w:p>
       <w:pPr>
         <w:pStyle w:val="Heading2"/>
@@ -2825,8 +2825,8 @@
         <w:t xml:space="preserve">[35] Dinsdale AT. SGTE data for pure elements. Calphad. 1991 Oct;15(4):317-425. doi:10.1016/0364-5916(91)90030-N</w:t>
       </w:r>
     </w:p>
-    <w:bookmarkEnd w:id="447"/>
-    <w:bookmarkEnd w:id="448"/>
+    <w:bookmarkEnd w:id="481"/>
+    <w:bookmarkEnd w:id="482"/>
     <w:sectPr>
       <w:footnotePr>
         <w:numRestart w:val="eachSect"/>

</xml_diff>

<commit_message>
Abstract carries the full scope: three dialects with uTDB named, the magnetic model and its pure-iron validation, the chloride salt family alongside the slags
Co-Authored-By: Claude Fable 5 <noreply@anthropic.com>
</commit_message>
<xml_diff>
--- a/paper/Bustamante_Hephaestus_JORS_manuscript.docx
+++ b/paper/Bustamante_Hephaestus_JORS_manuscript.docx
@@ -2,7 +2,7 @@
 <file path=word/document.xml><?xml version="1.0" encoding="utf-8"?>
 <w:document xmlns:w="http://schemas.openxmlformats.org/wordprocessingml/2006/main" xmlns:m="http://schemas.openxmlformats.org/officeDocument/2006/math" xmlns:r="http://schemas.openxmlformats.org/officeDocument/2006/relationships" xmlns:o="urn:schemas-microsoft-com:office:office" xmlns:v="urn:schemas-microsoft-com:vml" xmlns:w10="urn:schemas-microsoft-com:office:word" xmlns:a="http://schemas.openxmlformats.org/drawingml/2006/main" xmlns:pic="http://schemas.openxmlformats.org/drawingml/2006/picture" xmlns:wp="http://schemas.openxmlformats.org/drawingml/2006/wordprocessingDrawing">
   <w:body>
-    <w:bookmarkStart w:id="482" w:name="X356b170f064e9677b3a5f814002b4c3be46c723"/>
+    <w:bookmarkStart w:id="516" w:name="X356b170f064e9677b3a5f814002b4c3be46c723"/>
     <w:p>
       <w:pPr>
         <w:pStyle w:val="Heading1"/>
@@ -60,7 +60,7 @@
         <w:pStyle w:val="BodyText"/>
       </w:pPr>
       <w:r>
-        <w:t xml:space="preserve">The Modified Quasichemical Model in the Quadruplet Approximation (MQMQA) is the standard thermodynamic description of short-range-ordered ionic melts, and it underpins the commercial databases used throughout pyrometallurgy. Open implementations exist inside larger frameworks, but no free oxide slag database exists at all, so every practical slag calculation still depends on closed data. Hephaestus addresses the model and the data together. The engine is a small dependency-free C core with a Python interface and a WebAssembly build, so the same code runs embedded, scripted, or in a browser with nothing installed. It reads ChemSage-format files directly, covering MQMQA liquids, compound energy formalism solid solutions, and stoichiometric compounds, and it also reads the Thermo-Calc TDB dialect for alloy systems, so one zero-install page calculates across both of the field’s file families. It computes phase equilibria up to full ternary isothermal sections and liquidus projections, and Scheil-Gulliver solidification paths on any binary join. Every energy path is validated to machine precision against pycalphad. The companion database covers the CaO-SiO</w:t>
+        <w:t xml:space="preserve">The Modified Quasichemical Model in the Quadruplet Approximation (MQMQA) is the standard thermodynamic description of short-range-ordered ionic melts, and it underpins the commercial databases used throughout pyrometallurgy. Open implementations exist inside larger frameworks, but no free oxide slag database exists at all, so every practical slag calculation still depends on closed data. Hephaestus addresses the model and the data together. The engine is a small dependency-free C core with a Python interface and a WebAssembly build, so the same code runs embedded, scripted, or in a browser with nothing installed. It reads ChemSage-format files directly, covering MQMQA liquids, compound energy formalism solid solutions, and stoichiometric compounds; it reads the Thermo-Calc TDB dialect for alloys, including the Inden magnetic contribution real steel files require; and it defines uTDB, an openly specified extension carrying the MQMQA statements inside TDB grammar, so one file can hold an alloy together with its slag or salt and one zero-install page calculates across all three containers. It computes phase equilibria up to full ternary isothermal sections and liquidus projections, and Scheil-Gulliver solidification paths on any binary join. Every energy path is validated to machine precision against pycalphad, and the magnetic model additionally against the measured pure-iron transition temperatures. The companion databases cover the CaO-SiO</w:t>
       </w:r>
       <w:r>
         <w:rPr>
@@ -102,7 +102,19 @@
         <w:t xml:space="preserve"> </w:t>
       </w:r>
       <w:r>
-        <w:t xml:space="preserve">ternary with olivine and orthopyroxene solid solutions, assembled solely from published measurements with per-value provenance and documented limits. The code is MIT licensed and the database is CC BY 4.0.</w:t>
+        <w:t xml:space="preserve">ternary with olivine and orthopyroxene solid solutions, together with an open chloride molten-salt family from LiCl-KCl to the NaCl-KCl-MgCl</w:t>
+      </w:r>
+      <w:r>
+        <w:rPr>
+          <w:vertAlign w:val="subscript"/>
+        </w:rPr>
+        <w:t xml:space="preserve">2</w:t>
+      </w:r>
+      <w:r>
+        <w:t xml:space="preserve"> </w:t>
+      </w:r>
+      <w:r>
+        <w:t xml:space="preserve">ternary, assembled solely from published measurements with per-value provenance and documented limits. The code is MIT licensed and the databases are CC BY 4.0.</w:t>
       </w:r>
     </w:p>
     <w:p>
@@ -120,10 +132,10 @@
         <w:t xml:space="preserve"> </w:t>
       </w:r>
       <w:r>
-        <w:t xml:space="preserve">CALPHAD; molten slag; modified quasichemical model; thermodynamic database; phase diagram; WebAssembly; oxide melts; open data</w:t>
-      </w:r>
-    </w:p>
-    <w:bookmarkStart w:id="460" w:name="overview"/>
+        <w:t xml:space="preserve">CALPHAD; molten slag; molten salt; modified quasichemical model; thermodynamic database; phase diagram; WebAssembly; open data</w:t>
+      </w:r>
+    </w:p>
+    <w:bookmarkStart w:id="494" w:name="overview"/>
     <w:p>
       <w:pPr>
         <w:pStyle w:val="Heading2"/>
@@ -132,7 +144,7 @@
         <w:t xml:space="preserve">(1) Overview</w:t>
       </w:r>
     </w:p>
-    <w:bookmarkStart w:id="447" w:name="introduction"/>
+    <w:bookmarkStart w:id="481" w:name="introduction"/>
     <w:p>
       <w:pPr>
         <w:pStyle w:val="Heading3"/>
@@ -454,8 +466,8 @@
         <w:t xml:space="preserve">Hephaestus is a deliberate response to that gap, and it treats the engine and the data as one contribution because neither is useful alone. The engine is small on purpose. Its core is plain C with no dependencies, which makes it easy to embed and lets the identical code compile to WebAssembly, so the full calculator runs in a web browser with nothing installed and no data leaving the user’s machine. The database is open on purpose. Every parameter in it derives from published measurements, each value carries its provenance down to table and page, and the known shortcomings are documented next to the numbers they affect. The present work describes both, their validation against pycalphad and against measured phase equilibria, and the ways they can be reused. None of it asks the reader to program. For the experimentalist who never writes code, the browser application is the entire product, a page to open, a database to click, and a diagram to read; the sections that follow describe the machinery underneath for those who want it, and Supplementary Material S1 is a plain-language primer provided so that the non-programmer can learn enough to use the tool, starting at what a database file even is and ending at a first calculation and how to read it. Its closing section teaches what an assessment is built from, so a reader who wants to learn the craft and contribute data for open publication, or to arrive prepared to a first conversation about a commissioned file, knows beforehand exactly what is needed.</w:t>
       </w:r>
     </w:p>
-    <w:bookmarkEnd w:id="447"/>
-    <w:bookmarkStart w:id="457" w:name="implementation-and-architecture"/>
+    <w:bookmarkEnd w:id="481"/>
+    <w:bookmarkStart w:id="491" w:name="implementation-and-architecture"/>
     <w:p>
       <w:pPr>
         <w:pStyle w:val="Heading3"/>
@@ -481,18 +493,18 @@
           <wp:inline>
             <wp:extent cx="5334000" cy="3497491"/>
             <wp:effectExtent b="0" l="0" r="0" t="0"/>
-            <wp:docPr descr="Figure 1: Architecture of Hephaestus. A single dependency-free C core reads ChemSage-format files and computes all thermodynamics; the same core is used as a native library, from Python through cffi, and compiled to WebAssembly behind the browser application. dbbuild writes new ChemSage files from measured data, and every energy path is validated against pycalphad." title="" id="449" name="Picture"/>
+            <wp:docPr descr="Figure 1: Architecture of Hephaestus. A single dependency-free C core reads ChemSage-format files and computes all thermodynamics; the same core is used as a native library, from Python through cffi, and compiled to WebAssembly behind the browser application. dbbuild writes new ChemSage files from measured data, and every energy path is validated against pycalphad." title="" id="483" name="Picture"/>
             <a:graphic>
               <a:graphicData uri="http://schemas.openxmlformats.org/drawingml/2006/picture">
                 <pic:pic>
                   <pic:nvPicPr>
-                    <pic:cNvPr descr="figures/fig1_architecture.png" id="450" name="Picture"/>
+                    <pic:cNvPr descr="figures/fig1_architecture.png" id="484" name="Picture"/>
                     <pic:cNvPicPr>
                       <a:picLocks noChangeArrowheads="1" noChangeAspect="1"/>
                     </pic:cNvPicPr>
                   </pic:nvPicPr>
                   <pic:blipFill>
-                    <a:blip r:embed="rId448"/>
+                    <a:blip r:embed="rId482"/>
                     <a:stretch>
                       <a:fillRect/>
                     </a:stretch>
@@ -679,18 +691,18 @@
           <wp:inline>
             <wp:extent cx="4754880" cy="4464799"/>
             <wp:effectExtent b="0" l="0" r="0" t="0"/>
-            <wp:docPr descr="Figure 2: The live solver in the browser application (release v0.2.0, light theme). The user loads the shipped database, picks a temperature, and presses Compute; the WebAssembly engine then solves the full FeO-MgO-SiO2 phase assemblage client side (here 1023 composition samples and 512 tie-facets in under half a second). Tapping a composition reads its stable phases and pins it to a comparison list; hovering previews on desktop." title="" id="452" name="Picture"/>
+            <wp:docPr descr="Figure 2: The live solver in the browser application (release v0.2.0, light theme). The user loads the shipped database, picks a temperature, and presses Compute; the WebAssembly engine then solves the full FeO-MgO-SiO2 phase assemblage client side (here 1023 composition samples and 512 tie-facets in under half a second). Tapping a composition reads its stable phases and pins it to a comparison list; hovering previews on desktop." title="" id="486" name="Picture"/>
             <a:graphic>
               <a:graphicData uri="http://schemas.openxmlformats.org/drawingml/2006/picture">
                 <pic:pic>
                   <pic:nvPicPr>
-                    <pic:cNvPr descr="figures/fig2_browser_app.png" id="453" name="Picture"/>
+                    <pic:cNvPr descr="figures/fig2_browser_app.png" id="487" name="Picture"/>
                     <pic:cNvPicPr>
                       <a:picLocks noChangeArrowheads="1" noChangeAspect="1"/>
                     </pic:cNvPicPr>
                   </pic:nvPicPr>
                   <pic:blipFill>
-                    <a:blip r:embed="rId451"/>
+                    <a:blip r:embed="rId485"/>
                     <a:stretch>
                       <a:fillRect/>
                     </a:stretch>
@@ -856,18 +868,18 @@
           <wp:inline>
             <wp:extent cx="5334000" cy="2416336"/>
             <wp:effectExtent b="0" l="0" r="0" t="0"/>
-            <wp:docPr descr="Figure 3: The assessed FeO-MgO-SiO2 system calculated from the shipped database files. (a) Liquidus projection: primary crystallizing phase fields, with liquidus isotherms labeled in °C. (b) Isothermal section at 1600 °C: stable phase assemblages, shaded by the number of solid phases present. Phase labels: L liquid, Crs cristobalite, Ol olivine, Opx orthopyroxene, Per periclase, Wus wustite." title="" id="455" name="Picture"/>
+            <wp:docPr descr="Figure 3: The assessed FeO-MgO-SiO2 system calculated from the shipped database files. (a) Liquidus projection: primary crystallizing phase fields, with liquidus isotherms labeled in °C. (b) Isothermal section at 1600 °C: stable phase assemblages, shaded by the number of solid phases present. Phase labels: L liquid, Crs cristobalite, Ol olivine, Opx orthopyroxene, Per periclase, Wus wustite." title="" id="489" name="Picture"/>
             <a:graphic>
               <a:graphicData uri="http://schemas.openxmlformats.org/drawingml/2006/picture">
                 <pic:pic>
                   <pic:nvPicPr>
-                    <pic:cNvPr descr="figures/fig3_ternary.png" id="456" name="Picture"/>
+                    <pic:cNvPr descr="figures/fig3_ternary.png" id="490" name="Picture"/>
                     <pic:cNvPicPr>
                       <a:picLocks noChangeArrowheads="1" noChangeAspect="1"/>
                     </pic:cNvPicPr>
                   </pic:nvPicPr>
                   <pic:blipFill>
-                    <a:blip r:embed="rId454"/>
+                    <a:blip r:embed="rId488"/>
                     <a:stretch>
                       <a:fillRect/>
                     </a:stretch>
@@ -1208,8 +1220,8 @@
         <w:t xml:space="preserve">Table 2: The assessed liquids. Full source lists, modeling judgments, and limits are in each system’s provenance file in the repository.</w:t>
       </w:r>
     </w:p>
-    <w:bookmarkEnd w:id="457"/>
-    <w:bookmarkStart w:id="458" w:name="anatomy-of-a-database-file"/>
+    <w:bookmarkEnd w:id="491"/>
+    <w:bookmarkStart w:id="492" w:name="anatomy-of-a-database-file"/>
     <w:p>
       <w:pPr>
         <w:pStyle w:val="Heading3"/>
@@ -1242,8 +1254,8 @@
         <w:t xml:space="preserve">That asymmetry is the economics of the field in miniature: implementations of the published models are increasingly available, but each fitted parameter condenses dozens of measurements and decisions. Parameter sets rather than codes are therefore the scarce commodity, and an openly licensed, provenance-tracked database is the part of this contribution that cannot be regenerated from the paper alone.</w:t>
       </w:r>
     </w:p>
-    <w:bookmarkEnd w:id="458"/>
-    <w:bookmarkStart w:id="459" w:name="quality-control"/>
+    <w:bookmarkEnd w:id="492"/>
+    <w:bookmarkStart w:id="493" w:name="quality-control"/>
     <w:p>
       <w:pPr>
         <w:pStyle w:val="Heading3"/>
@@ -1688,9 +1700,9 @@
         <w:t xml:space="preserve">invariants sit within about 40 °C, and the ternary liquidus projection reproduces the measured field topology [23]. Development practice is plain: the repository is version controlled with tagged releases (v0.1.0 through the v0.3.0 described here), the full suite runs before every release, and a fixed bug lands together with the regression test that would have caught it. The suite runs on Windows 11 under CPython 3.11 and 3.12; the browser application is exercised in Chromium- and Gecko-based browsers. A user can confirm a working installation by running pytest against the bundled test databases, or with no installation at all by opening the web application and loading the shipped ternary database.</w:t>
       </w:r>
     </w:p>
-    <w:bookmarkEnd w:id="459"/>
-    <w:bookmarkEnd w:id="460"/>
-    <w:bookmarkStart w:id="468" w:name="availability"/>
+    <w:bookmarkEnd w:id="493"/>
+    <w:bookmarkEnd w:id="494"/>
+    <w:bookmarkStart w:id="502" w:name="availability"/>
     <w:p>
       <w:pPr>
         <w:pStyle w:val="Heading2"/>
@@ -1699,7 +1711,7 @@
         <w:t xml:space="preserve">(2) Availability</w:t>
       </w:r>
     </w:p>
-    <w:bookmarkStart w:id="461" w:name="operating-system"/>
+    <w:bookmarkStart w:id="495" w:name="operating-system"/>
     <w:p>
       <w:pPr>
         <w:pStyle w:val="Heading3"/>
@@ -1716,8 +1728,8 @@
         <w:t xml:space="preserve">Platform independent. The core builds with any C99 compiler; development and testing used Windows 11. The browser application runs in any current browser with WebAssembly support.</w:t>
       </w:r>
     </w:p>
-    <w:bookmarkEnd w:id="461"/>
-    <w:bookmarkStart w:id="462" w:name="programming-language"/>
+    <w:bookmarkEnd w:id="495"/>
+    <w:bookmarkStart w:id="496" w:name="programming-language"/>
     <w:p>
       <w:pPr>
         <w:pStyle w:val="Heading3"/>
@@ -1734,8 +1746,8 @@
         <w:t xml:space="preserve">C (core), Python 3.11 or later (interface and fitting tools), JavaScript (browser application).</w:t>
       </w:r>
     </w:p>
-    <w:bookmarkEnd w:id="462"/>
-    <w:bookmarkStart w:id="463" w:name="additional-system-requirements"/>
+    <w:bookmarkEnd w:id="496"/>
+    <w:bookmarkStart w:id="497" w:name="additional-system-requirements"/>
     <w:p>
       <w:pPr>
         <w:pStyle w:val="Heading3"/>
@@ -1752,8 +1764,8 @@
         <w:t xml:space="preserve">None of note. The engine and database together are a few megabytes.</w:t>
       </w:r>
     </w:p>
-    <w:bookmarkEnd w:id="463"/>
-    <w:bookmarkStart w:id="464" w:name="dependencies"/>
+    <w:bookmarkEnd w:id="497"/>
+    <w:bookmarkStart w:id="498" w:name="dependencies"/>
     <w:p>
       <w:pPr>
         <w:pStyle w:val="Heading3"/>
@@ -1770,8 +1782,8 @@
         <w:t xml:space="preserve">Python interface: cffi, NumPy, SciPy. Validation suite additionally requires pycalphad. WebAssembly build requires emscripten. The C core and the browser application have no dependencies.</w:t>
       </w:r>
     </w:p>
-    <w:bookmarkEnd w:id="464"/>
-    <w:bookmarkStart w:id="465" w:name="list-of-contributors"/>
+    <w:bookmarkEnd w:id="498"/>
+    <w:bookmarkStart w:id="499" w:name="list-of-contributors"/>
     <w:p>
       <w:pPr>
         <w:pStyle w:val="Heading3"/>
@@ -1788,8 +1800,8 @@
         <w:t xml:space="preserve">Michael E. Bustamante (design, implementation, validation, data curation).</w:t>
       </w:r>
     </w:p>
-    <w:bookmarkEnd w:id="465"/>
-    <w:bookmarkStart w:id="466" w:name="software-location"/>
+    <w:bookmarkEnd w:id="499"/>
+    <w:bookmarkStart w:id="500" w:name="software-location"/>
     <w:p>
       <w:pPr>
         <w:pStyle w:val="Heading3"/>
@@ -1942,8 +1954,8 @@
         <w:t xml:space="preserve">Date published: 2026-09-02</w:t>
       </w:r>
     </w:p>
-    <w:bookmarkEnd w:id="466"/>
-    <w:bookmarkStart w:id="467" w:name="language"/>
+    <w:bookmarkEnd w:id="500"/>
+    <w:bookmarkStart w:id="501" w:name="language"/>
     <w:p>
       <w:pPr>
         <w:pStyle w:val="Heading3"/>
@@ -1960,9 +1972,9 @@
         <w:t xml:space="preserve">English.</w:t>
       </w:r>
     </w:p>
-    <w:bookmarkEnd w:id="467"/>
-    <w:bookmarkEnd w:id="468"/>
-    <w:bookmarkStart w:id="476" w:name="reuse-potential"/>
+    <w:bookmarkEnd w:id="501"/>
+    <w:bookmarkEnd w:id="502"/>
+    <w:bookmarkStart w:id="510" w:name="reuse-potential"/>
     <w:p>
       <w:pPr>
         <w:pStyle w:val="Heading2"/>
@@ -1987,7 +1999,7 @@
         <w:t xml:space="preserve">The browser application makes the lowest barrier the default. A lecture on slag thermodynamics, a plant metallurgist screening a composition, or a reviewer checking a claimed equilibrium can load the database and calculate in seconds, with confidential inputs never leaving the machine. The same property makes it a practical template for other groups who want to publish a model as a zero-install tool.</w:t>
       </w:r>
     </w:p>
-    <w:bookmarkStart w:id="475" w:name="worked-examples"/>
+    <w:bookmarkStart w:id="509" w:name="worked-examples"/>
     <w:p>
       <w:pPr>
         <w:pStyle w:val="Heading3"/>
@@ -2179,18 +2191,18 @@
           <wp:inline>
             <wp:extent cx="4206240" cy="3108960"/>
             <wp:effectExtent b="0" l="0" r="0" t="0"/>
-            <wp:docPr descr="Figure 4: The LiCl-KCl phase diagram computed by the salt listing from the shipped open database, on the listing’s own grid. Light to dark: liquid, two-phase, and subsolidus fields. The dot is the computed eutectic on this grid (0.400, 640 K); the star is the measured eutectic (0.415, 626 K)." title="" id="470" name="Picture"/>
+            <wp:docPr descr="Figure 4: The LiCl-KCl phase diagram computed by the salt listing from the shipped open database, on the listing’s own grid. Light to dark: liquid, two-phase, and subsolidus fields. The dot is the computed eutectic on this grid (0.400, 640 K); the star is the measured eutectic (0.415, 626 K)." title="" id="504" name="Picture"/>
             <a:graphic>
               <a:graphicData uri="http://schemas.openxmlformats.org/drawingml/2006/picture">
                 <pic:pic>
                   <pic:nvPicPr>
-                    <pic:cNvPr descr="figures/fig4_salt_example.png" id="471" name="Picture"/>
+                    <pic:cNvPr descr="figures/fig4_salt_example.png" id="505" name="Picture"/>
                     <pic:cNvPicPr>
                       <a:picLocks noChangeArrowheads="1" noChangeAspect="1"/>
                     </pic:cNvPicPr>
                   </pic:nvPicPr>
                   <pic:blipFill>
-                    <a:blip r:embed="rId469"/>
+                    <a:blip r:embed="rId503"/>
                     <a:stretch>
                       <a:fillRect/>
                     </a:stretch>
@@ -2396,18 +2408,18 @@
           <wp:inline>
             <wp:extent cx="4206240" cy="3108960"/>
             <wp:effectExtent b="0" l="0" r="0" t="0"/>
-            <wp:docPr descr="Figure 5: The Al-Zn phase diagram computed by the alloy listing from the shipped open TDB. Light to dark: liquid, liquid plus solid, and solid fields. The dot is the computed eutectic (0.890, 660 K); the star is the assessed eutectic (0.885, 654 K)." title="" id="473" name="Picture"/>
+            <wp:docPr descr="Figure 5: The Al-Zn phase diagram computed by the alloy listing from the shipped open TDB. Light to dark: liquid, liquid plus solid, and solid fields. The dot is the computed eutectic (0.890, 660 K); the star is the assessed eutectic (0.885, 654 K)." title="" id="507" name="Picture"/>
             <a:graphic>
               <a:graphicData uri="http://schemas.openxmlformats.org/drawingml/2006/picture">
                 <pic:pic>
                   <pic:nvPicPr>
-                    <pic:cNvPr descr="figures/fig5_alloy_example.png" id="474" name="Picture"/>
+                    <pic:cNvPr descr="figures/fig5_alloy_example.png" id="508" name="Picture"/>
                     <pic:cNvPicPr>
                       <a:picLocks noChangeArrowheads="1" noChangeAspect="1"/>
                     </pic:cNvPicPr>
                   </pic:nvPicPr>
                   <pic:blipFill>
-                    <a:blip r:embed="rId472"/>
+                    <a:blip r:embed="rId506"/>
                     <a:stretch>
                       <a:fillRect/>
                     </a:stretch>
@@ -2450,9 +2462,9 @@
         <w:t xml:space="preserve">The database is a starting point rather than an endpoint, and the file format rewards growth: new components, new phases, and refits against new measurements accumulate in the same database. A system is therefore extended release by release rather than rebuilt, and archived versions keep results calculated against earlier releases reproducible. Because every value carries its source and every judgment is written down, another assessor can reweight the data, swap an endmember, or extend a system without reverse-engineering anything; dbbuild turns a table of measured activities into a loadable file in a few lines. The in-browser multiphase hull already covers any loaded three-cation file and any loaded alloy TDB join, so a new system becomes a browser phase diagram the moment its file loads. Natural extensions are further oxide systems, the remaining ChemSage solution models, the ionic-liquid TDB model, and multicomponent Scheil on the same hull machinery. The repository also publishes an openly specified unified dialect (uTDB) that carries the MQMQA statements inside TDB grammar, with two shipped demonstration files chosen to be processes rather than curiosities: an aluminum-recycling database holding the Al-Zn alloy with its NaCl-KCl-MgCl2 salt flux, and a steelmaking database holding a basic Fe-C steel, magnetic phases included, with the FeO-MgO-SiO2 slag and its silicate solid solutions. Round-trip tests assert both reproduce their source-file physics at machine precision. Relative to the XML road of XTDB [15] (Table 1), uTDB is the on-ramp from the installed base, extending files as they are and running in this engine today, with mechanical conversion to XTDB elements the natural bridge once that schema settles. Making the calculator multilingual across the field’s file dialects is the direction of travel. Contributions and issues are handled through the GitHub repository.</w:t>
       </w:r>
     </w:p>
-    <w:bookmarkEnd w:id="475"/>
-    <w:bookmarkEnd w:id="476"/>
-    <w:bookmarkStart w:id="477" w:name="data-availability"/>
+    <w:bookmarkEnd w:id="509"/>
+    <w:bookmarkEnd w:id="510"/>
+    <w:bookmarkStart w:id="511" w:name="data-availability"/>
     <w:p>
       <w:pPr>
         <w:pStyle w:val="Heading2"/>
@@ -2469,8 +2481,8 @@
         <w:t xml:space="preserve">The engine, the database, the browser application, and the validation suite are openly available in the code repository listed above; the version described here is archived as release v0.3.0. The database files and their provenance records are in the repository’s data directory under CC BY 4.0.</w:t>
       </w:r>
     </w:p>
-    <w:bookmarkEnd w:id="477"/>
-    <w:bookmarkStart w:id="478" w:name="acknowledgements"/>
+    <w:bookmarkEnd w:id="511"/>
+    <w:bookmarkStart w:id="512" w:name="acknowledgements"/>
     <w:p>
       <w:pPr>
         <w:pStyle w:val="Heading2"/>
@@ -2487,8 +2499,8 @@
         <w:t xml:space="preserve">During the development of this software the author used Claude Code (Anthropic) to assist with implementation, validation scripting, and manuscript preparation. This assistance was agentic, not autonomous: it operated under author direction and supervision at every step and was never a closed loop that produced or accepted results without review. Every parameter was traced by the author to its primary source before entering the database, and every reference was verified against its registry record. The author reviewed and approved all output and takes full responsibility for this article.</w:t>
       </w:r>
     </w:p>
-    <w:bookmarkEnd w:id="478"/>
-    <w:bookmarkStart w:id="479" w:name="funding-statement"/>
+    <w:bookmarkEnd w:id="512"/>
+    <w:bookmarkStart w:id="513" w:name="funding-statement"/>
     <w:p>
       <w:pPr>
         <w:pStyle w:val="Heading2"/>
@@ -2505,8 +2517,8 @@
         <w:t xml:space="preserve">The development of this software received no external funding.</w:t>
       </w:r>
     </w:p>
-    <w:bookmarkEnd w:id="479"/>
-    <w:bookmarkStart w:id="480" w:name="competing-interests"/>
+    <w:bookmarkEnd w:id="513"/>
+    <w:bookmarkStart w:id="514" w:name="competing-interests"/>
     <w:p>
       <w:pPr>
         <w:pStyle w:val="Heading2"/>
@@ -2523,8 +2535,8 @@
         <w:t xml:space="preserve">The author founded Odinzen LLC, which provides commercial thermodynamic modeling services, and declares this as a competing interest. The software and database published here are released in full under open licenses, and no proprietary Odinzen assets are included.</w:t>
       </w:r>
     </w:p>
-    <w:bookmarkEnd w:id="480"/>
-    <w:bookmarkStart w:id="481" w:name="references"/>
+    <w:bookmarkEnd w:id="514"/>
+    <w:bookmarkStart w:id="515" w:name="references"/>
     <w:p>
       <w:pPr>
         <w:pStyle w:val="Heading2"/>
@@ -2825,8 +2837,8 @@
         <w:t xml:space="preserve">[35] Dinsdale AT. SGTE data for pure elements. Calphad. 1991 Oct;15(4):317-425. doi:10.1016/0364-5916(91)90030-N</w:t>
       </w:r>
     </w:p>
-    <w:bookmarkEnd w:id="481"/>
-    <w:bookmarkEnd w:id="482"/>
+    <w:bookmarkEnd w:id="515"/>
+    <w:bookmarkEnd w:id="516"/>
     <w:sectPr>
       <w:footnotePr>
         <w:numRestart w:val="eachSect"/>

</xml_diff>

<commit_message>
Audit pass: version claims to v0.4.0 everywhere, cover letter re-dated, figure 2 caption drops its stale release tag, S1 button coverage current, checklist fifth-pass entry
Co-Authored-By: Claude Fable 5 <noreply@anthropic.com>
</commit_message>
<xml_diff>
--- a/paper/Bustamante_Hephaestus_JORS_manuscript.docx
+++ b/paper/Bustamante_Hephaestus_JORS_manuscript.docx
@@ -2,7 +2,7 @@
 <file path=word/document.xml><?xml version="1.0" encoding="utf-8"?>
 <w:document xmlns:w="http://schemas.openxmlformats.org/wordprocessingml/2006/main" xmlns:m="http://schemas.openxmlformats.org/officeDocument/2006/math" xmlns:r="http://schemas.openxmlformats.org/officeDocument/2006/relationships" xmlns:o="urn:schemas-microsoft-com:office:office" xmlns:v="urn:schemas-microsoft-com:vml" xmlns:w10="urn:schemas-microsoft-com:office:word" xmlns:a="http://schemas.openxmlformats.org/drawingml/2006/main" xmlns:pic="http://schemas.openxmlformats.org/drawingml/2006/picture" xmlns:wp="http://schemas.openxmlformats.org/drawingml/2006/wordprocessingDrawing">
   <w:body>
-    <w:bookmarkStart w:id="516" w:name="X356b170f064e9677b3a5f814002b4c3be46c723"/>
+    <w:bookmarkStart w:id="550" w:name="X356b170f064e9677b3a5f814002b4c3be46c723"/>
     <w:p>
       <w:pPr>
         <w:pStyle w:val="Heading1"/>
@@ -135,7 +135,7 @@
         <w:t xml:space="preserve">CALPHAD; molten slag; molten salt; modified quasichemical model; thermodynamic database; phase diagram; WebAssembly; open data</w:t>
       </w:r>
     </w:p>
-    <w:bookmarkStart w:id="494" w:name="overview"/>
+    <w:bookmarkStart w:id="528" w:name="overview"/>
     <w:p>
       <w:pPr>
         <w:pStyle w:val="Heading2"/>
@@ -144,7 +144,7 @@
         <w:t xml:space="preserve">(1) Overview</w:t>
       </w:r>
     </w:p>
-    <w:bookmarkStart w:id="481" w:name="introduction"/>
+    <w:bookmarkStart w:id="515" w:name="introduction"/>
     <w:p>
       <w:pPr>
         <w:pStyle w:val="Heading3"/>
@@ -466,8 +466,8 @@
         <w:t xml:space="preserve">Hephaestus is a deliberate response to that gap, and it treats the engine and the data as one contribution because neither is useful alone. The engine is small on purpose. Its core is plain C with no dependencies, which makes it easy to embed and lets the identical code compile to WebAssembly, so the full calculator runs in a web browser with nothing installed and no data leaving the user’s machine. The database is open on purpose. Every parameter in it derives from published measurements, each value carries its provenance down to table and page, and the known shortcomings are documented next to the numbers they affect. The present work describes both, their validation against pycalphad and against measured phase equilibria, and the ways they can be reused. None of it asks the reader to program. For the experimentalist who never writes code, the browser application is the entire product, a page to open, a database to click, and a diagram to read; the sections that follow describe the machinery underneath for those who want it, and Supplementary Material S1 is a plain-language primer provided so that the non-programmer can learn enough to use the tool, starting at what a database file even is and ending at a first calculation and how to read it. Its closing section teaches what an assessment is built from, so a reader who wants to learn the craft and contribute data for open publication, or to arrive prepared to a first conversation about a commissioned file, knows beforehand exactly what is needed.</w:t>
       </w:r>
     </w:p>
-    <w:bookmarkEnd w:id="481"/>
-    <w:bookmarkStart w:id="491" w:name="implementation-and-architecture"/>
+    <w:bookmarkEnd w:id="515"/>
+    <w:bookmarkStart w:id="525" w:name="implementation-and-architecture"/>
     <w:p>
       <w:pPr>
         <w:pStyle w:val="Heading3"/>
@@ -493,18 +493,18 @@
           <wp:inline>
             <wp:extent cx="5334000" cy="3497491"/>
             <wp:effectExtent b="0" l="0" r="0" t="0"/>
-            <wp:docPr descr="Figure 1: Architecture of Hephaestus. A single dependency-free C core reads ChemSage-format files and computes all thermodynamics; the same core is used as a native library, from Python through cffi, and compiled to WebAssembly behind the browser application. dbbuild writes new ChemSage files from measured data, and every energy path is validated against pycalphad." title="" id="483" name="Picture"/>
+            <wp:docPr descr="Figure 1: Architecture of Hephaestus. A single dependency-free C core reads ChemSage-format files and computes all thermodynamics; the same core is used as a native library, from Python through cffi, and compiled to WebAssembly behind the browser application. dbbuild writes new ChemSage files from measured data, and every energy path is validated against pycalphad." title="" id="517" name="Picture"/>
             <a:graphic>
               <a:graphicData uri="http://schemas.openxmlformats.org/drawingml/2006/picture">
                 <pic:pic>
                   <pic:nvPicPr>
-                    <pic:cNvPr descr="figures/fig1_architecture.png" id="484" name="Picture"/>
+                    <pic:cNvPr descr="figures/fig1_architecture.png" id="518" name="Picture"/>
                     <pic:cNvPicPr>
                       <a:picLocks noChangeArrowheads="1" noChangeAspect="1"/>
                     </pic:cNvPicPr>
                   </pic:nvPicPr>
                   <pic:blipFill>
-                    <a:blip r:embed="rId482"/>
+                    <a:blip r:embed="rId516"/>
                     <a:stretch>
                       <a:fillRect/>
                     </a:stretch>
@@ -691,18 +691,18 @@
           <wp:inline>
             <wp:extent cx="4754880" cy="4464799"/>
             <wp:effectExtent b="0" l="0" r="0" t="0"/>
-            <wp:docPr descr="Figure 2: The live solver in the browser application (release v0.2.0, light theme). The user loads the shipped database, picks a temperature, and presses Compute; the WebAssembly engine then solves the full FeO-MgO-SiO2 phase assemblage client side (here 1023 composition samples and 512 tie-facets in under half a second). Tapping a composition reads its stable phases and pins it to a comparison list; hovering previews on desktop." title="" id="486" name="Picture"/>
+            <wp:docPr descr="Figure 2: The live solver in the browser application (light theme). The user loads the shipped database, picks a temperature, and presses Compute; the WebAssembly engine then solves the full FeO-MgO-SiO2 phase assemblage client side (here 1023 composition samples and 512 tie-facets in under half a second). Tapping a composition reads its stable phases and pins it to a comparison list; hovering previews on desktop." title="" id="520" name="Picture"/>
             <a:graphic>
               <a:graphicData uri="http://schemas.openxmlformats.org/drawingml/2006/picture">
                 <pic:pic>
                   <pic:nvPicPr>
-                    <pic:cNvPr descr="figures/fig2_browser_app.png" id="487" name="Picture"/>
+                    <pic:cNvPr descr="figures/fig2_browser_app.png" id="521" name="Picture"/>
                     <pic:cNvPicPr>
                       <a:picLocks noChangeArrowheads="1" noChangeAspect="1"/>
                     </pic:cNvPicPr>
                   </pic:nvPicPr>
                   <pic:blipFill>
-                    <a:blip r:embed="rId485"/>
+                    <a:blip r:embed="rId519"/>
                     <a:stretch>
                       <a:fillRect/>
                     </a:stretch>
@@ -734,7 +734,7 @@
         <w:pStyle w:val="ImageCaption"/>
       </w:pPr>
       <w:r>
-        <w:t xml:space="preserve">Figure 2: The live solver in the browser application (release v0.2.0, light theme). The user loads the shipped database, picks a temperature, and presses Compute; the WebAssembly engine then solves the full FeO-MgO-SiO</w:t>
+        <w:t xml:space="preserve">Figure 2: The live solver in the browser application (light theme). The user loads the shipped database, picks a temperature, and presses Compute; the WebAssembly engine then solves the full FeO-MgO-SiO</w:t>
       </w:r>
       <w:r>
         <w:rPr>
@@ -868,18 +868,18 @@
           <wp:inline>
             <wp:extent cx="5334000" cy="2416336"/>
             <wp:effectExtent b="0" l="0" r="0" t="0"/>
-            <wp:docPr descr="Figure 3: The assessed FeO-MgO-SiO2 system calculated from the shipped database files. (a) Liquidus projection: primary crystallizing phase fields, with liquidus isotherms labeled in °C. (b) Isothermal section at 1600 °C: stable phase assemblages, shaded by the number of solid phases present. Phase labels: L liquid, Crs cristobalite, Ol olivine, Opx orthopyroxene, Per periclase, Wus wustite." title="" id="489" name="Picture"/>
+            <wp:docPr descr="Figure 3: The assessed FeO-MgO-SiO2 system calculated from the shipped database files. (a) Liquidus projection: primary crystallizing phase fields, with liquidus isotherms labeled in °C. (b) Isothermal section at 1600 °C: stable phase assemblages, shaded by the number of solid phases present. Phase labels: L liquid, Crs cristobalite, Ol olivine, Opx orthopyroxene, Per periclase, Wus wustite." title="" id="523" name="Picture"/>
             <a:graphic>
               <a:graphicData uri="http://schemas.openxmlformats.org/drawingml/2006/picture">
                 <pic:pic>
                   <pic:nvPicPr>
-                    <pic:cNvPr descr="figures/fig3_ternary.png" id="490" name="Picture"/>
+                    <pic:cNvPr descr="figures/fig3_ternary.png" id="524" name="Picture"/>
                     <pic:cNvPicPr>
                       <a:picLocks noChangeArrowheads="1" noChangeAspect="1"/>
                     </pic:cNvPicPr>
                   </pic:nvPicPr>
                   <pic:blipFill>
-                    <a:blip r:embed="rId488"/>
+                    <a:blip r:embed="rId522"/>
                     <a:stretch>
                       <a:fillRect/>
                     </a:stretch>
@@ -1220,8 +1220,8 @@
         <w:t xml:space="preserve">Table 2: The assessed liquids. Full source lists, modeling judgments, and limits are in each system’s provenance file in the repository.</w:t>
       </w:r>
     </w:p>
-    <w:bookmarkEnd w:id="491"/>
-    <w:bookmarkStart w:id="492" w:name="anatomy-of-a-database-file"/>
+    <w:bookmarkEnd w:id="525"/>
+    <w:bookmarkStart w:id="526" w:name="anatomy-of-a-database-file"/>
     <w:p>
       <w:pPr>
         <w:pStyle w:val="Heading3"/>
@@ -1254,8 +1254,8 @@
         <w:t xml:space="preserve">That asymmetry is the economics of the field in miniature: implementations of the published models are increasingly available, but each fitted parameter condenses dozens of measurements and decisions. Parameter sets rather than codes are therefore the scarce commodity, and an openly licensed, provenance-tracked database is the part of this contribution that cannot be regenerated from the paper alone.</w:t>
       </w:r>
     </w:p>
-    <w:bookmarkEnd w:id="492"/>
-    <w:bookmarkStart w:id="493" w:name="quality-control"/>
+    <w:bookmarkEnd w:id="526"/>
+    <w:bookmarkStart w:id="527" w:name="quality-control"/>
     <w:p>
       <w:pPr>
         <w:pStyle w:val="Heading3"/>
@@ -1697,12 +1697,12 @@
         <w:t xml:space="preserve"> </w:t>
       </w:r>
       <w:r>
-        <w:t xml:space="preserve">invariants sit within about 40 °C, and the ternary liquidus projection reproduces the measured field topology [23]. Development practice is plain: the repository is version controlled with tagged releases (v0.1.0 through the v0.3.0 described here), the full suite runs before every release, and a fixed bug lands together with the regression test that would have caught it. The suite runs on Windows 11 under CPython 3.11 and 3.12; the browser application is exercised in Chromium- and Gecko-based browsers. A user can confirm a working installation by running pytest against the bundled test databases, or with no installation at all by opening the web application and loading the shipped ternary database.</w:t>
-      </w:r>
-    </w:p>
-    <w:bookmarkEnd w:id="493"/>
-    <w:bookmarkEnd w:id="494"/>
-    <w:bookmarkStart w:id="502" w:name="availability"/>
+        <w:t xml:space="preserve">invariants sit within about 40 °C, and the ternary liquidus projection reproduces the measured field topology [23]. Development practice is plain: the repository is version controlled with tagged releases (v0.1.0 through the v0.4.0 described here), the full suite runs before every release, and a fixed bug lands together with the regression test that would have caught it. The suite runs on Windows 11 under CPython 3.11 and 3.12; the browser application is exercised in Chromium- and Gecko-based browsers. A user can confirm a working installation by running pytest against the bundled test databases, or with no installation at all by opening the web application and loading the shipped ternary database.</w:t>
+      </w:r>
+    </w:p>
+    <w:bookmarkEnd w:id="527"/>
+    <w:bookmarkEnd w:id="528"/>
+    <w:bookmarkStart w:id="536" w:name="availability"/>
     <w:p>
       <w:pPr>
         <w:pStyle w:val="Heading2"/>
@@ -1711,7 +1711,7 @@
         <w:t xml:space="preserve">(2) Availability</w:t>
       </w:r>
     </w:p>
-    <w:bookmarkStart w:id="495" w:name="operating-system"/>
+    <w:bookmarkStart w:id="529" w:name="operating-system"/>
     <w:p>
       <w:pPr>
         <w:pStyle w:val="Heading3"/>
@@ -1728,8 +1728,8 @@
         <w:t xml:space="preserve">Platform independent. The core builds with any C99 compiler; development and testing used Windows 11. The browser application runs in any current browser with WebAssembly support.</w:t>
       </w:r>
     </w:p>
-    <w:bookmarkEnd w:id="495"/>
-    <w:bookmarkStart w:id="496" w:name="programming-language"/>
+    <w:bookmarkEnd w:id="529"/>
+    <w:bookmarkStart w:id="530" w:name="programming-language"/>
     <w:p>
       <w:pPr>
         <w:pStyle w:val="Heading3"/>
@@ -1746,8 +1746,8 @@
         <w:t xml:space="preserve">C (core), Python 3.11 or later (interface and fitting tools), JavaScript (browser application).</w:t>
       </w:r>
     </w:p>
-    <w:bookmarkEnd w:id="496"/>
-    <w:bookmarkStart w:id="497" w:name="additional-system-requirements"/>
+    <w:bookmarkEnd w:id="530"/>
+    <w:bookmarkStart w:id="531" w:name="additional-system-requirements"/>
     <w:p>
       <w:pPr>
         <w:pStyle w:val="Heading3"/>
@@ -1764,8 +1764,8 @@
         <w:t xml:space="preserve">None of note. The engine and database together are a few megabytes.</w:t>
       </w:r>
     </w:p>
-    <w:bookmarkEnd w:id="497"/>
-    <w:bookmarkStart w:id="498" w:name="dependencies"/>
+    <w:bookmarkEnd w:id="531"/>
+    <w:bookmarkStart w:id="532" w:name="dependencies"/>
     <w:p>
       <w:pPr>
         <w:pStyle w:val="Heading3"/>
@@ -1782,8 +1782,8 @@
         <w:t xml:space="preserve">Python interface: cffi, NumPy, SciPy. Validation suite additionally requires pycalphad. WebAssembly build requires emscripten. The C core and the browser application have no dependencies.</w:t>
       </w:r>
     </w:p>
-    <w:bookmarkEnd w:id="498"/>
-    <w:bookmarkStart w:id="499" w:name="list-of-contributors"/>
+    <w:bookmarkEnd w:id="532"/>
+    <w:bookmarkStart w:id="533" w:name="list-of-contributors"/>
     <w:p>
       <w:pPr>
         <w:pStyle w:val="Heading3"/>
@@ -1800,8 +1800,8 @@
         <w:t xml:space="preserve">Michael E. Bustamante (design, implementation, validation, data curation).</w:t>
       </w:r>
     </w:p>
-    <w:bookmarkEnd w:id="499"/>
-    <w:bookmarkStart w:id="500" w:name="software-location"/>
+    <w:bookmarkEnd w:id="533"/>
+    <w:bookmarkStart w:id="534" w:name="software-location"/>
     <w:p>
       <w:pPr>
         <w:pStyle w:val="Heading3"/>
@@ -1843,7 +1843,7 @@
         </w:numPr>
       </w:pPr>
       <w:r>
-        <w:t xml:space="preserve">Persistent identifier: https://github.com/odinzen/hephaestus-mqmqa-public/releases/tag/v0.3.0</w:t>
+        <w:t xml:space="preserve">Persistent identifier: https://github.com/odinzen/hephaestus-mqmqa-public/releases/tag/v0.4.0</w:t>
       </w:r>
     </w:p>
     <w:p>
@@ -1879,7 +1879,7 @@
         </w:numPr>
       </w:pPr>
       <w:r>
-        <w:t xml:space="preserve">Version published: v0.3.0</w:t>
+        <w:t xml:space="preserve">Version published: v0.4.0</w:t>
       </w:r>
     </w:p>
     <w:p>
@@ -1954,8 +1954,8 @@
         <w:t xml:space="preserve">Date published: 2026-09-02</w:t>
       </w:r>
     </w:p>
-    <w:bookmarkEnd w:id="500"/>
-    <w:bookmarkStart w:id="501" w:name="language"/>
+    <w:bookmarkEnd w:id="534"/>
+    <w:bookmarkStart w:id="535" w:name="language"/>
     <w:p>
       <w:pPr>
         <w:pStyle w:val="Heading3"/>
@@ -1972,9 +1972,9 @@
         <w:t xml:space="preserve">English.</w:t>
       </w:r>
     </w:p>
-    <w:bookmarkEnd w:id="501"/>
-    <w:bookmarkEnd w:id="502"/>
-    <w:bookmarkStart w:id="510" w:name="reuse-potential"/>
+    <w:bookmarkEnd w:id="535"/>
+    <w:bookmarkEnd w:id="536"/>
+    <w:bookmarkStart w:id="544" w:name="reuse-potential"/>
     <w:p>
       <w:pPr>
         <w:pStyle w:val="Heading2"/>
@@ -1999,7 +1999,7 @@
         <w:t xml:space="preserve">The browser application makes the lowest barrier the default. A lecture on slag thermodynamics, a plant metallurgist screening a composition, or a reviewer checking a claimed equilibrium can load the database and calculate in seconds, with confidential inputs never leaving the machine. The same property makes it a practical template for other groups who want to publish a model as a zero-install tool.</w:t>
       </w:r>
     </w:p>
-    <w:bookmarkStart w:id="509" w:name="worked-examples"/>
+    <w:bookmarkStart w:id="543" w:name="worked-examples"/>
     <w:p>
       <w:pPr>
         <w:pStyle w:val="Heading3"/>
@@ -2191,18 +2191,18 @@
           <wp:inline>
             <wp:extent cx="4206240" cy="3108960"/>
             <wp:effectExtent b="0" l="0" r="0" t="0"/>
-            <wp:docPr descr="Figure 4: The LiCl-KCl phase diagram computed by the salt listing from the shipped open database, on the listing’s own grid. Light to dark: liquid, two-phase, and subsolidus fields. The dot is the computed eutectic on this grid (0.400, 640 K); the star is the measured eutectic (0.415, 626 K)." title="" id="504" name="Picture"/>
+            <wp:docPr descr="Figure 4: The LiCl-KCl phase diagram computed by the salt listing from the shipped open database, on the listing’s own grid. Light to dark: liquid, two-phase, and subsolidus fields. The dot is the computed eutectic on this grid (0.400, 640 K); the star is the measured eutectic (0.415, 626 K)." title="" id="538" name="Picture"/>
             <a:graphic>
               <a:graphicData uri="http://schemas.openxmlformats.org/drawingml/2006/picture">
                 <pic:pic>
                   <pic:nvPicPr>
-                    <pic:cNvPr descr="figures/fig4_salt_example.png" id="505" name="Picture"/>
+                    <pic:cNvPr descr="figures/fig4_salt_example.png" id="539" name="Picture"/>
                     <pic:cNvPicPr>
                       <a:picLocks noChangeArrowheads="1" noChangeAspect="1"/>
                     </pic:cNvPicPr>
                   </pic:nvPicPr>
                   <pic:blipFill>
-                    <a:blip r:embed="rId503"/>
+                    <a:blip r:embed="rId537"/>
                     <a:stretch>
                       <a:fillRect/>
                     </a:stretch>
@@ -2408,18 +2408,18 @@
           <wp:inline>
             <wp:extent cx="4206240" cy="3108960"/>
             <wp:effectExtent b="0" l="0" r="0" t="0"/>
-            <wp:docPr descr="Figure 5: The Al-Zn phase diagram computed by the alloy listing from the shipped open TDB. Light to dark: liquid, liquid plus solid, and solid fields. The dot is the computed eutectic (0.890, 660 K); the star is the assessed eutectic (0.885, 654 K)." title="" id="507" name="Picture"/>
+            <wp:docPr descr="Figure 5: The Al-Zn phase diagram computed by the alloy listing from the shipped open TDB. Light to dark: liquid, liquid plus solid, and solid fields. The dot is the computed eutectic (0.890, 660 K); the star is the assessed eutectic (0.885, 654 K)." title="" id="541" name="Picture"/>
             <a:graphic>
               <a:graphicData uri="http://schemas.openxmlformats.org/drawingml/2006/picture">
                 <pic:pic>
                   <pic:nvPicPr>
-                    <pic:cNvPr descr="figures/fig5_alloy_example.png" id="508" name="Picture"/>
+                    <pic:cNvPr descr="figures/fig5_alloy_example.png" id="542" name="Picture"/>
                     <pic:cNvPicPr>
                       <a:picLocks noChangeArrowheads="1" noChangeAspect="1"/>
                     </pic:cNvPicPr>
                   </pic:nvPicPr>
                   <pic:blipFill>
-                    <a:blip r:embed="rId506"/>
+                    <a:blip r:embed="rId540"/>
                     <a:stretch>
                       <a:fillRect/>
                     </a:stretch>
@@ -2462,9 +2462,9 @@
         <w:t xml:space="preserve">The database is a starting point rather than an endpoint, and the file format rewards growth: new components, new phases, and refits against new measurements accumulate in the same database. A system is therefore extended release by release rather than rebuilt, and archived versions keep results calculated against earlier releases reproducible. Because every value carries its source and every judgment is written down, another assessor can reweight the data, swap an endmember, or extend a system without reverse-engineering anything; dbbuild turns a table of measured activities into a loadable file in a few lines. The in-browser multiphase hull already covers any loaded three-cation file and any loaded alloy TDB join, so a new system becomes a browser phase diagram the moment its file loads. Natural extensions are further oxide systems, the remaining ChemSage solution models, the ionic-liquid TDB model, and multicomponent Scheil on the same hull machinery. The repository also publishes an openly specified unified dialect (uTDB) that carries the MQMQA statements inside TDB grammar, with two shipped demonstration files chosen to be processes rather than curiosities: an aluminum-recycling database holding the Al-Zn alloy with its NaCl-KCl-MgCl2 salt flux, and a steelmaking database holding a basic Fe-C steel, magnetic phases included, with the FeO-MgO-SiO2 slag and its silicate solid solutions. Round-trip tests assert both reproduce their source-file physics at machine precision. Relative to the XML road of XTDB [15] (Table 1), uTDB is the on-ramp from the installed base, extending files as they are and running in this engine today, with mechanical conversion to XTDB elements the natural bridge once that schema settles. Making the calculator multilingual across the field’s file dialects is the direction of travel. Contributions and issues are handled through the GitHub repository.</w:t>
       </w:r>
     </w:p>
-    <w:bookmarkEnd w:id="509"/>
-    <w:bookmarkEnd w:id="510"/>
-    <w:bookmarkStart w:id="511" w:name="data-availability"/>
+    <w:bookmarkEnd w:id="543"/>
+    <w:bookmarkEnd w:id="544"/>
+    <w:bookmarkStart w:id="545" w:name="data-availability"/>
     <w:p>
       <w:pPr>
         <w:pStyle w:val="Heading2"/>
@@ -2478,11 +2478,11 @@
         <w:pStyle w:val="FirstParagraph"/>
       </w:pPr>
       <w:r>
-        <w:t xml:space="preserve">The engine, the database, the browser application, and the validation suite are openly available in the code repository listed above; the version described here is archived as release v0.3.0. The database files and their provenance records are in the repository’s data directory under CC BY 4.0.</w:t>
-      </w:r>
-    </w:p>
-    <w:bookmarkEnd w:id="511"/>
-    <w:bookmarkStart w:id="512" w:name="acknowledgements"/>
+        <w:t xml:space="preserve">The engine, the database, the browser application, and the validation suite are openly available in the code repository listed above; the version described here is archived as release v0.4.0. The database files and their provenance records are in the repository’s data directory under CC BY 4.0.</w:t>
+      </w:r>
+    </w:p>
+    <w:bookmarkEnd w:id="545"/>
+    <w:bookmarkStart w:id="546" w:name="acknowledgements"/>
     <w:p>
       <w:pPr>
         <w:pStyle w:val="Heading2"/>
@@ -2499,8 +2499,8 @@
         <w:t xml:space="preserve">During the development of this software the author used Claude Code (Anthropic) to assist with implementation, validation scripting, and manuscript preparation. This assistance was agentic, not autonomous: it operated under author direction and supervision at every step and was never a closed loop that produced or accepted results without review. Every parameter was traced by the author to its primary source before entering the database, and every reference was verified against its registry record. The author reviewed and approved all output and takes full responsibility for this article.</w:t>
       </w:r>
     </w:p>
-    <w:bookmarkEnd w:id="512"/>
-    <w:bookmarkStart w:id="513" w:name="funding-statement"/>
+    <w:bookmarkEnd w:id="546"/>
+    <w:bookmarkStart w:id="547" w:name="funding-statement"/>
     <w:p>
       <w:pPr>
         <w:pStyle w:val="Heading2"/>
@@ -2517,8 +2517,8 @@
         <w:t xml:space="preserve">The development of this software received no external funding.</w:t>
       </w:r>
     </w:p>
-    <w:bookmarkEnd w:id="513"/>
-    <w:bookmarkStart w:id="514" w:name="competing-interests"/>
+    <w:bookmarkEnd w:id="547"/>
+    <w:bookmarkStart w:id="548" w:name="competing-interests"/>
     <w:p>
       <w:pPr>
         <w:pStyle w:val="Heading2"/>
@@ -2535,8 +2535,8 @@
         <w:t xml:space="preserve">The author founded Odinzen LLC, which provides commercial thermodynamic modeling services, and declares this as a competing interest. The software and database published here are released in full under open licenses, and no proprietary Odinzen assets are included.</w:t>
       </w:r>
     </w:p>
-    <w:bookmarkEnd w:id="514"/>
-    <w:bookmarkStart w:id="515" w:name="references"/>
+    <w:bookmarkEnd w:id="548"/>
+    <w:bookmarkStart w:id="549" w:name="references"/>
     <w:p>
       <w:pPr>
         <w:pStyle w:val="Heading2"/>
@@ -2837,8 +2837,8 @@
         <w:t xml:space="preserve">[35] Dinsdale AT. SGTE data for pure elements. Calphad. 1991 Oct;15(4):317-425. doi:10.1016/0364-5916(91)90030-N</w:t>
       </w:r>
     </w:p>
-    <w:bookmarkEnd w:id="515"/>
-    <w:bookmarkEnd w:id="516"/>
+    <w:bookmarkEnd w:id="549"/>
+    <w:bookmarkEnd w:id="550"/>
     <w:sectPr>
       <w:footnotePr>
         <w:numRestart w:val="eachSect"/>

</xml_diff>

<commit_message>
Spot-check pass: the two themed demos named in the abstract, cover letter, README, site note, and uTDB spec; README scope current (three dialects, magnetic model, salt family)
Co-Authored-By: Claude Fable 5 <noreply@anthropic.com>
</commit_message>
<xml_diff>
--- a/paper/Bustamante_Hephaestus_JORS_manuscript.docx
+++ b/paper/Bustamante_Hephaestus_JORS_manuscript.docx
@@ -2,7 +2,7 @@
 <file path=word/document.xml><?xml version="1.0" encoding="utf-8"?>
 <w:document xmlns:w="http://schemas.openxmlformats.org/wordprocessingml/2006/main" xmlns:m="http://schemas.openxmlformats.org/officeDocument/2006/math" xmlns:r="http://schemas.openxmlformats.org/officeDocument/2006/relationships" xmlns:o="urn:schemas-microsoft-com:office:office" xmlns:v="urn:schemas-microsoft-com:vml" xmlns:w10="urn:schemas-microsoft-com:office:word" xmlns:a="http://schemas.openxmlformats.org/drawingml/2006/main" xmlns:pic="http://schemas.openxmlformats.org/drawingml/2006/picture" xmlns:wp="http://schemas.openxmlformats.org/drawingml/2006/wordprocessingDrawing">
   <w:body>
-    <w:bookmarkStart w:id="550" w:name="X356b170f064e9677b3a5f814002b4c3be46c723"/>
+    <w:bookmarkStart w:id="584" w:name="X356b170f064e9677b3a5f814002b4c3be46c723"/>
     <w:p>
       <w:pPr>
         <w:pStyle w:val="Heading1"/>
@@ -60,7 +60,31 @@
         <w:pStyle w:val="BodyText"/>
       </w:pPr>
       <w:r>
-        <w:t xml:space="preserve">The Modified Quasichemical Model in the Quadruplet Approximation (MQMQA) is the standard thermodynamic description of short-range-ordered ionic melts, and it underpins the commercial databases used throughout pyrometallurgy. Open implementations exist inside larger frameworks, but no free oxide slag database exists at all, so every practical slag calculation still depends on closed data. Hephaestus addresses the model and the data together. The engine is a small dependency-free C core with a Python interface and a WebAssembly build, so the same code runs embedded, scripted, or in a browser with nothing installed. It reads ChemSage-format files directly, covering MQMQA liquids, compound energy formalism solid solutions, and stoichiometric compounds; it reads the Thermo-Calc TDB dialect for alloys, including the Inden magnetic contribution real steel files require; and it defines uTDB, an openly specified extension carrying the MQMQA statements inside TDB grammar, so one file can hold an alloy together with its slag or salt and one zero-install page calculates across all three containers. It computes phase equilibria up to full ternary isothermal sections and liquidus projections, and Scheil-Gulliver solidification paths on any binary join. Every energy path is validated to machine precision against pycalphad, and the magnetic model additionally against the measured pure-iron transition temperatures. The companion databases cover the CaO-SiO</w:t>
+        <w:t xml:space="preserve">The Modified Quasichemical Model in the Quadruplet Approximation (MQMQA) is the standard thermodynamic description of short-range-ordered ionic melts, and it underpins the commercial databases used throughout pyrometallurgy. Open implementations exist inside larger frameworks, but no free oxide slag database exists at all, so every practical slag calculation still depends on closed data. Hephaestus addresses the model and the data together. The engine is a small dependency-free C core with a Python interface and a WebAssembly build, so the same code runs embedded, scripted, or in a browser with nothing installed. It reads ChemSage-format files directly, covering MQMQA liquids, compound energy formalism solid solutions, and stoichiometric compounds; it reads the Thermo-Calc TDB dialect for alloys, including the Inden magnetic contribution real steel files require; and it defines uTDB, an openly specified extension carrying the MQMQA statements inside TDB grammar, demonstrated by shipped aluminum-recycling (Al-Zn alloy with its NaCl-KCl-MgCl</w:t>
+      </w:r>
+      <w:r>
+        <w:rPr>
+          <w:vertAlign w:val="subscript"/>
+        </w:rPr>
+        <w:t xml:space="preserve">2</w:t>
+      </w:r>
+      <w:r>
+        <w:t xml:space="preserve"> </w:t>
+      </w:r>
+      <w:r>
+        <w:t xml:space="preserve">salt flux) and steelmaking (Fe-C steel with its FeO-MgO-SiO</w:t>
+      </w:r>
+      <w:r>
+        <w:rPr>
+          <w:vertAlign w:val="subscript"/>
+        </w:rPr>
+        <w:t xml:space="preserve">2</w:t>
+      </w:r>
+      <w:r>
+        <w:t xml:space="preserve"> </w:t>
+      </w:r>
+      <w:r>
+        <w:t xml:space="preserve">slag) databases; one zero-install page calculates across all three containers. It computes phase equilibria up to full ternary isothermal sections and liquidus projections, and Scheil-Gulliver solidification paths on any binary join. Every energy path is validated to machine precision against pycalphad, and the magnetic model additionally against the measured pure-iron transition temperatures. The companion databases cover the CaO-SiO</w:t>
       </w:r>
       <w:r>
         <w:rPr>
@@ -135,7 +159,7 @@
         <w:t xml:space="preserve">CALPHAD; molten slag; molten salt; modified quasichemical model; thermodynamic database; phase diagram; WebAssembly; open data</w:t>
       </w:r>
     </w:p>
-    <w:bookmarkStart w:id="528" w:name="overview"/>
+    <w:bookmarkStart w:id="562" w:name="overview"/>
     <w:p>
       <w:pPr>
         <w:pStyle w:val="Heading2"/>
@@ -144,7 +168,7 @@
         <w:t xml:space="preserve">(1) Overview</w:t>
       </w:r>
     </w:p>
-    <w:bookmarkStart w:id="515" w:name="introduction"/>
+    <w:bookmarkStart w:id="549" w:name="introduction"/>
     <w:p>
       <w:pPr>
         <w:pStyle w:val="Heading3"/>
@@ -466,8 +490,8 @@
         <w:t xml:space="preserve">Hephaestus is a deliberate response to that gap, and it treats the engine and the data as one contribution because neither is useful alone. The engine is small on purpose. Its core is plain C with no dependencies, which makes it easy to embed and lets the identical code compile to WebAssembly, so the full calculator runs in a web browser with nothing installed and no data leaving the user’s machine. The database is open on purpose. Every parameter in it derives from published measurements, each value carries its provenance down to table and page, and the known shortcomings are documented next to the numbers they affect. The present work describes both, their validation against pycalphad and against measured phase equilibria, and the ways they can be reused. None of it asks the reader to program. For the experimentalist who never writes code, the browser application is the entire product, a page to open, a database to click, and a diagram to read; the sections that follow describe the machinery underneath for those who want it, and Supplementary Material S1 is a plain-language primer provided so that the non-programmer can learn enough to use the tool, starting at what a database file even is and ending at a first calculation and how to read it. Its closing section teaches what an assessment is built from, so a reader who wants to learn the craft and contribute data for open publication, or to arrive prepared to a first conversation about a commissioned file, knows beforehand exactly what is needed.</w:t>
       </w:r>
     </w:p>
-    <w:bookmarkEnd w:id="515"/>
-    <w:bookmarkStart w:id="525" w:name="implementation-and-architecture"/>
+    <w:bookmarkEnd w:id="549"/>
+    <w:bookmarkStart w:id="559" w:name="implementation-and-architecture"/>
     <w:p>
       <w:pPr>
         <w:pStyle w:val="Heading3"/>
@@ -493,18 +517,18 @@
           <wp:inline>
             <wp:extent cx="5334000" cy="3497491"/>
             <wp:effectExtent b="0" l="0" r="0" t="0"/>
-            <wp:docPr descr="Figure 1: Architecture of Hephaestus. A single dependency-free C core reads ChemSage-format files and computes all thermodynamics; the same core is used as a native library, from Python through cffi, and compiled to WebAssembly behind the browser application. dbbuild writes new ChemSage files from measured data, and every energy path is validated against pycalphad." title="" id="517" name="Picture"/>
+            <wp:docPr descr="Figure 1: Architecture of Hephaestus. A single dependency-free C core reads ChemSage-format files and computes all thermodynamics; the same core is used as a native library, from Python through cffi, and compiled to WebAssembly behind the browser application. dbbuild writes new ChemSage files from measured data, and every energy path is validated against pycalphad." title="" id="551" name="Picture"/>
             <a:graphic>
               <a:graphicData uri="http://schemas.openxmlformats.org/drawingml/2006/picture">
                 <pic:pic>
                   <pic:nvPicPr>
-                    <pic:cNvPr descr="figures/fig1_architecture.png" id="518" name="Picture"/>
+                    <pic:cNvPr descr="figures/fig1_architecture.png" id="552" name="Picture"/>
                     <pic:cNvPicPr>
                       <a:picLocks noChangeArrowheads="1" noChangeAspect="1"/>
                     </pic:cNvPicPr>
                   </pic:nvPicPr>
                   <pic:blipFill>
-                    <a:blip r:embed="rId516"/>
+                    <a:blip r:embed="rId550"/>
                     <a:stretch>
                       <a:fillRect/>
                     </a:stretch>
@@ -691,18 +715,18 @@
           <wp:inline>
             <wp:extent cx="4754880" cy="4464799"/>
             <wp:effectExtent b="0" l="0" r="0" t="0"/>
-            <wp:docPr descr="Figure 2: The live solver in the browser application (light theme). The user loads the shipped database, picks a temperature, and presses Compute; the WebAssembly engine then solves the full FeO-MgO-SiO2 phase assemblage client side (here 1023 composition samples and 512 tie-facets in under half a second). Tapping a composition reads its stable phases and pins it to a comparison list; hovering previews on desktop." title="" id="520" name="Picture"/>
+            <wp:docPr descr="Figure 2: The live solver in the browser application (light theme). The user loads the shipped database, picks a temperature, and presses Compute; the WebAssembly engine then solves the full FeO-MgO-SiO2 phase assemblage client side (here 1023 composition samples and 512 tie-facets in under half a second). Tapping a composition reads its stable phases and pins it to a comparison list; hovering previews on desktop." title="" id="554" name="Picture"/>
             <a:graphic>
               <a:graphicData uri="http://schemas.openxmlformats.org/drawingml/2006/picture">
                 <pic:pic>
                   <pic:nvPicPr>
-                    <pic:cNvPr descr="figures/fig2_browser_app.png" id="521" name="Picture"/>
+                    <pic:cNvPr descr="figures/fig2_browser_app.png" id="555" name="Picture"/>
                     <pic:cNvPicPr>
                       <a:picLocks noChangeArrowheads="1" noChangeAspect="1"/>
                     </pic:cNvPicPr>
                   </pic:nvPicPr>
                   <pic:blipFill>
-                    <a:blip r:embed="rId519"/>
+                    <a:blip r:embed="rId553"/>
                     <a:stretch>
                       <a:fillRect/>
                     </a:stretch>
@@ -868,18 +892,18 @@
           <wp:inline>
             <wp:extent cx="5334000" cy="2416336"/>
             <wp:effectExtent b="0" l="0" r="0" t="0"/>
-            <wp:docPr descr="Figure 3: The assessed FeO-MgO-SiO2 system calculated from the shipped database files. (a) Liquidus projection: primary crystallizing phase fields, with liquidus isotherms labeled in °C. (b) Isothermal section at 1600 °C: stable phase assemblages, shaded by the number of solid phases present. Phase labels: L liquid, Crs cristobalite, Ol olivine, Opx orthopyroxene, Per periclase, Wus wustite." title="" id="523" name="Picture"/>
+            <wp:docPr descr="Figure 3: The assessed FeO-MgO-SiO2 system calculated from the shipped database files. (a) Liquidus projection: primary crystallizing phase fields, with liquidus isotherms labeled in °C. (b) Isothermal section at 1600 °C: stable phase assemblages, shaded by the number of solid phases present. Phase labels: L liquid, Crs cristobalite, Ol olivine, Opx orthopyroxene, Per periclase, Wus wustite." title="" id="557" name="Picture"/>
             <a:graphic>
               <a:graphicData uri="http://schemas.openxmlformats.org/drawingml/2006/picture">
                 <pic:pic>
                   <pic:nvPicPr>
-                    <pic:cNvPr descr="figures/fig3_ternary.png" id="524" name="Picture"/>
+                    <pic:cNvPr descr="figures/fig3_ternary.png" id="558" name="Picture"/>
                     <pic:cNvPicPr>
                       <a:picLocks noChangeArrowheads="1" noChangeAspect="1"/>
                     </pic:cNvPicPr>
                   </pic:nvPicPr>
                   <pic:blipFill>
-                    <a:blip r:embed="rId522"/>
+                    <a:blip r:embed="rId556"/>
                     <a:stretch>
                       <a:fillRect/>
                     </a:stretch>
@@ -1220,8 +1244,8 @@
         <w:t xml:space="preserve">Table 2: The assessed liquids. Full source lists, modeling judgments, and limits are in each system’s provenance file in the repository.</w:t>
       </w:r>
     </w:p>
-    <w:bookmarkEnd w:id="525"/>
-    <w:bookmarkStart w:id="526" w:name="anatomy-of-a-database-file"/>
+    <w:bookmarkEnd w:id="559"/>
+    <w:bookmarkStart w:id="560" w:name="anatomy-of-a-database-file"/>
     <w:p>
       <w:pPr>
         <w:pStyle w:val="Heading3"/>
@@ -1254,8 +1278,8 @@
         <w:t xml:space="preserve">That asymmetry is the economics of the field in miniature: implementations of the published models are increasingly available, but each fitted parameter condenses dozens of measurements and decisions. Parameter sets rather than codes are therefore the scarce commodity, and an openly licensed, provenance-tracked database is the part of this contribution that cannot be regenerated from the paper alone.</w:t>
       </w:r>
     </w:p>
-    <w:bookmarkEnd w:id="526"/>
-    <w:bookmarkStart w:id="527" w:name="quality-control"/>
+    <w:bookmarkEnd w:id="560"/>
+    <w:bookmarkStart w:id="561" w:name="quality-control"/>
     <w:p>
       <w:pPr>
         <w:pStyle w:val="Heading3"/>
@@ -1700,9 +1724,9 @@
         <w:t xml:space="preserve">invariants sit within about 40 °C, and the ternary liquidus projection reproduces the measured field topology [23]. Development practice is plain: the repository is version controlled with tagged releases (v0.1.0 through the v0.4.0 described here), the full suite runs before every release, and a fixed bug lands together with the regression test that would have caught it. The suite runs on Windows 11 under CPython 3.11 and 3.12; the browser application is exercised in Chromium- and Gecko-based browsers. A user can confirm a working installation by running pytest against the bundled test databases, or with no installation at all by opening the web application and loading the shipped ternary database.</w:t>
       </w:r>
     </w:p>
-    <w:bookmarkEnd w:id="527"/>
-    <w:bookmarkEnd w:id="528"/>
-    <w:bookmarkStart w:id="536" w:name="availability"/>
+    <w:bookmarkEnd w:id="561"/>
+    <w:bookmarkEnd w:id="562"/>
+    <w:bookmarkStart w:id="570" w:name="availability"/>
     <w:p>
       <w:pPr>
         <w:pStyle w:val="Heading2"/>
@@ -1711,7 +1735,7 @@
         <w:t xml:space="preserve">(2) Availability</w:t>
       </w:r>
     </w:p>
-    <w:bookmarkStart w:id="529" w:name="operating-system"/>
+    <w:bookmarkStart w:id="563" w:name="operating-system"/>
     <w:p>
       <w:pPr>
         <w:pStyle w:val="Heading3"/>
@@ -1728,8 +1752,8 @@
         <w:t xml:space="preserve">Platform independent. The core builds with any C99 compiler; development and testing used Windows 11. The browser application runs in any current browser with WebAssembly support.</w:t>
       </w:r>
     </w:p>
-    <w:bookmarkEnd w:id="529"/>
-    <w:bookmarkStart w:id="530" w:name="programming-language"/>
+    <w:bookmarkEnd w:id="563"/>
+    <w:bookmarkStart w:id="564" w:name="programming-language"/>
     <w:p>
       <w:pPr>
         <w:pStyle w:val="Heading3"/>
@@ -1746,8 +1770,8 @@
         <w:t xml:space="preserve">C (core), Python 3.11 or later (interface and fitting tools), JavaScript (browser application).</w:t>
       </w:r>
     </w:p>
-    <w:bookmarkEnd w:id="530"/>
-    <w:bookmarkStart w:id="531" w:name="additional-system-requirements"/>
+    <w:bookmarkEnd w:id="564"/>
+    <w:bookmarkStart w:id="565" w:name="additional-system-requirements"/>
     <w:p>
       <w:pPr>
         <w:pStyle w:val="Heading3"/>
@@ -1764,8 +1788,8 @@
         <w:t xml:space="preserve">None of note. The engine and database together are a few megabytes.</w:t>
       </w:r>
     </w:p>
-    <w:bookmarkEnd w:id="531"/>
-    <w:bookmarkStart w:id="532" w:name="dependencies"/>
+    <w:bookmarkEnd w:id="565"/>
+    <w:bookmarkStart w:id="566" w:name="dependencies"/>
     <w:p>
       <w:pPr>
         <w:pStyle w:val="Heading3"/>
@@ -1782,8 +1806,8 @@
         <w:t xml:space="preserve">Python interface: cffi, NumPy, SciPy. Validation suite additionally requires pycalphad. WebAssembly build requires emscripten. The C core and the browser application have no dependencies.</w:t>
       </w:r>
     </w:p>
-    <w:bookmarkEnd w:id="532"/>
-    <w:bookmarkStart w:id="533" w:name="list-of-contributors"/>
+    <w:bookmarkEnd w:id="566"/>
+    <w:bookmarkStart w:id="567" w:name="list-of-contributors"/>
     <w:p>
       <w:pPr>
         <w:pStyle w:val="Heading3"/>
@@ -1800,8 +1824,8 @@
         <w:t xml:space="preserve">Michael E. Bustamante (design, implementation, validation, data curation).</w:t>
       </w:r>
     </w:p>
-    <w:bookmarkEnd w:id="533"/>
-    <w:bookmarkStart w:id="534" w:name="software-location"/>
+    <w:bookmarkEnd w:id="567"/>
+    <w:bookmarkStart w:id="568" w:name="software-location"/>
     <w:p>
       <w:pPr>
         <w:pStyle w:val="Heading3"/>
@@ -1954,8 +1978,8 @@
         <w:t xml:space="preserve">Date published: 2026-09-02</w:t>
       </w:r>
     </w:p>
-    <w:bookmarkEnd w:id="534"/>
-    <w:bookmarkStart w:id="535" w:name="language"/>
+    <w:bookmarkEnd w:id="568"/>
+    <w:bookmarkStart w:id="569" w:name="language"/>
     <w:p>
       <w:pPr>
         <w:pStyle w:val="Heading3"/>
@@ -1972,9 +1996,9 @@
         <w:t xml:space="preserve">English.</w:t>
       </w:r>
     </w:p>
-    <w:bookmarkEnd w:id="535"/>
-    <w:bookmarkEnd w:id="536"/>
-    <w:bookmarkStart w:id="544" w:name="reuse-potential"/>
+    <w:bookmarkEnd w:id="569"/>
+    <w:bookmarkEnd w:id="570"/>
+    <w:bookmarkStart w:id="578" w:name="reuse-potential"/>
     <w:p>
       <w:pPr>
         <w:pStyle w:val="Heading2"/>
@@ -1999,7 +2023,7 @@
         <w:t xml:space="preserve">The browser application makes the lowest barrier the default. A lecture on slag thermodynamics, a plant metallurgist screening a composition, or a reviewer checking a claimed equilibrium can load the database and calculate in seconds, with confidential inputs never leaving the machine. The same property makes it a practical template for other groups who want to publish a model as a zero-install tool.</w:t>
       </w:r>
     </w:p>
-    <w:bookmarkStart w:id="543" w:name="worked-examples"/>
+    <w:bookmarkStart w:id="577" w:name="worked-examples"/>
     <w:p>
       <w:pPr>
         <w:pStyle w:val="Heading3"/>
@@ -2191,18 +2215,18 @@
           <wp:inline>
             <wp:extent cx="4206240" cy="3108960"/>
             <wp:effectExtent b="0" l="0" r="0" t="0"/>
-            <wp:docPr descr="Figure 4: The LiCl-KCl phase diagram computed by the salt listing from the shipped open database, on the listing’s own grid. Light to dark: liquid, two-phase, and subsolidus fields. The dot is the computed eutectic on this grid (0.400, 640 K); the star is the measured eutectic (0.415, 626 K)." title="" id="538" name="Picture"/>
+            <wp:docPr descr="Figure 4: The LiCl-KCl phase diagram computed by the salt listing from the shipped open database, on the listing’s own grid. Light to dark: liquid, two-phase, and subsolidus fields. The dot is the computed eutectic on this grid (0.400, 640 K); the star is the measured eutectic (0.415, 626 K)." title="" id="572" name="Picture"/>
             <a:graphic>
               <a:graphicData uri="http://schemas.openxmlformats.org/drawingml/2006/picture">
                 <pic:pic>
                   <pic:nvPicPr>
-                    <pic:cNvPr descr="figures/fig4_salt_example.png" id="539" name="Picture"/>
+                    <pic:cNvPr descr="figures/fig4_salt_example.png" id="573" name="Picture"/>
                     <pic:cNvPicPr>
                       <a:picLocks noChangeArrowheads="1" noChangeAspect="1"/>
                     </pic:cNvPicPr>
                   </pic:nvPicPr>
                   <pic:blipFill>
-                    <a:blip r:embed="rId537"/>
+                    <a:blip r:embed="rId571"/>
                     <a:stretch>
                       <a:fillRect/>
                     </a:stretch>
@@ -2408,18 +2432,18 @@
           <wp:inline>
             <wp:extent cx="4206240" cy="3108960"/>
             <wp:effectExtent b="0" l="0" r="0" t="0"/>
-            <wp:docPr descr="Figure 5: The Al-Zn phase diagram computed by the alloy listing from the shipped open TDB. Light to dark: liquid, liquid plus solid, and solid fields. The dot is the computed eutectic (0.890, 660 K); the star is the assessed eutectic (0.885, 654 K)." title="" id="541" name="Picture"/>
+            <wp:docPr descr="Figure 5: The Al-Zn phase diagram computed by the alloy listing from the shipped open TDB. Light to dark: liquid, liquid plus solid, and solid fields. The dot is the computed eutectic (0.890, 660 K); the star is the assessed eutectic (0.885, 654 K)." title="" id="575" name="Picture"/>
             <a:graphic>
               <a:graphicData uri="http://schemas.openxmlformats.org/drawingml/2006/picture">
                 <pic:pic>
                   <pic:nvPicPr>
-                    <pic:cNvPr descr="figures/fig5_alloy_example.png" id="542" name="Picture"/>
+                    <pic:cNvPr descr="figures/fig5_alloy_example.png" id="576" name="Picture"/>
                     <pic:cNvPicPr>
                       <a:picLocks noChangeArrowheads="1" noChangeAspect="1"/>
                     </pic:cNvPicPr>
                   </pic:nvPicPr>
                   <pic:blipFill>
-                    <a:blip r:embed="rId540"/>
+                    <a:blip r:embed="rId574"/>
                     <a:stretch>
                       <a:fillRect/>
                     </a:stretch>
@@ -2462,9 +2486,9 @@
         <w:t xml:space="preserve">The database is a starting point rather than an endpoint, and the file format rewards growth: new components, new phases, and refits against new measurements accumulate in the same database. A system is therefore extended release by release rather than rebuilt, and archived versions keep results calculated against earlier releases reproducible. Because every value carries its source and every judgment is written down, another assessor can reweight the data, swap an endmember, or extend a system without reverse-engineering anything; dbbuild turns a table of measured activities into a loadable file in a few lines. The in-browser multiphase hull already covers any loaded three-cation file and any loaded alloy TDB join, so a new system becomes a browser phase diagram the moment its file loads. Natural extensions are further oxide systems, the remaining ChemSage solution models, the ionic-liquid TDB model, and multicomponent Scheil on the same hull machinery. The repository also publishes an openly specified unified dialect (uTDB) that carries the MQMQA statements inside TDB grammar, with two shipped demonstration files chosen to be processes rather than curiosities: an aluminum-recycling database holding the Al-Zn alloy with its NaCl-KCl-MgCl2 salt flux, and a steelmaking database holding a basic Fe-C steel, magnetic phases included, with the FeO-MgO-SiO2 slag and its silicate solid solutions. Round-trip tests assert both reproduce their source-file physics at machine precision. Relative to the XML road of XTDB [15] (Table 1), uTDB is the on-ramp from the installed base, extending files as they are and running in this engine today, with mechanical conversion to XTDB elements the natural bridge once that schema settles. Making the calculator multilingual across the field’s file dialects is the direction of travel. Contributions and issues are handled through the GitHub repository.</w:t>
       </w:r>
     </w:p>
-    <w:bookmarkEnd w:id="543"/>
-    <w:bookmarkEnd w:id="544"/>
-    <w:bookmarkStart w:id="545" w:name="data-availability"/>
+    <w:bookmarkEnd w:id="577"/>
+    <w:bookmarkEnd w:id="578"/>
+    <w:bookmarkStart w:id="579" w:name="data-availability"/>
     <w:p>
       <w:pPr>
         <w:pStyle w:val="Heading2"/>
@@ -2481,8 +2505,8 @@
         <w:t xml:space="preserve">The engine, the database, the browser application, and the validation suite are openly available in the code repository listed above; the version described here is archived as release v0.4.0. The database files and their provenance records are in the repository’s data directory under CC BY 4.0.</w:t>
       </w:r>
     </w:p>
-    <w:bookmarkEnd w:id="545"/>
-    <w:bookmarkStart w:id="546" w:name="acknowledgements"/>
+    <w:bookmarkEnd w:id="579"/>
+    <w:bookmarkStart w:id="580" w:name="acknowledgements"/>
     <w:p>
       <w:pPr>
         <w:pStyle w:val="Heading2"/>
@@ -2499,8 +2523,8 @@
         <w:t xml:space="preserve">During the development of this software the author used Claude Code (Anthropic) to assist with implementation, validation scripting, and manuscript preparation. This assistance was agentic, not autonomous: it operated under author direction and supervision at every step and was never a closed loop that produced or accepted results without review. Every parameter was traced by the author to its primary source before entering the database, and every reference was verified against its registry record. The author reviewed and approved all output and takes full responsibility for this article.</w:t>
       </w:r>
     </w:p>
-    <w:bookmarkEnd w:id="546"/>
-    <w:bookmarkStart w:id="547" w:name="funding-statement"/>
+    <w:bookmarkEnd w:id="580"/>
+    <w:bookmarkStart w:id="581" w:name="funding-statement"/>
     <w:p>
       <w:pPr>
         <w:pStyle w:val="Heading2"/>
@@ -2517,8 +2541,8 @@
         <w:t xml:space="preserve">The development of this software received no external funding.</w:t>
       </w:r>
     </w:p>
-    <w:bookmarkEnd w:id="547"/>
-    <w:bookmarkStart w:id="548" w:name="competing-interests"/>
+    <w:bookmarkEnd w:id="581"/>
+    <w:bookmarkStart w:id="582" w:name="competing-interests"/>
     <w:p>
       <w:pPr>
         <w:pStyle w:val="Heading2"/>
@@ -2535,8 +2559,8 @@
         <w:t xml:space="preserve">The author founded Odinzen LLC, which provides commercial thermodynamic modeling services, and declares this as a competing interest. The software and database published here are released in full under open licenses, and no proprietary Odinzen assets are included.</w:t>
       </w:r>
     </w:p>
-    <w:bookmarkEnd w:id="548"/>
-    <w:bookmarkStart w:id="549" w:name="references"/>
+    <w:bookmarkEnd w:id="582"/>
+    <w:bookmarkStart w:id="583" w:name="references"/>
     <w:p>
       <w:pPr>
         <w:pStyle w:val="Heading2"/>
@@ -2837,8 +2861,8 @@
         <w:t xml:space="preserve">[35] Dinsdale AT. SGTE data for pure elements. Calphad. 1991 Oct;15(4):317-425. doi:10.1016/0364-5916(91)90030-N</w:t>
       </w:r>
     </w:p>
-    <w:bookmarkEnd w:id="549"/>
-    <w:bookmarkEnd w:id="550"/>
+    <w:bookmarkEnd w:id="583"/>
+    <w:bookmarkEnd w:id="584"/>
     <w:sectPr>
       <w:footnotePr>
         <w:numRestart w:val="eachSect"/>

</xml_diff>

<commit_message>
Title: drop the redundant second open
Co-Authored-By: Claude Fable 5 <noreply@anthropic.com>
</commit_message>
<xml_diff>
--- a/paper/Bustamante_Hephaestus_JORS_manuscript.docx
+++ b/paper/Bustamante_Hephaestus_JORS_manuscript.docx
@@ -2,13 +2,13 @@
 <file path=word/document.xml><?xml version="1.0" encoding="utf-8"?>
 <w:document xmlns:w="http://schemas.openxmlformats.org/wordprocessingml/2006/main" xmlns:m="http://schemas.openxmlformats.org/officeDocument/2006/math" xmlns:r="http://schemas.openxmlformats.org/officeDocument/2006/relationships" xmlns:o="urn:schemas-microsoft-com:office:office" xmlns:v="urn:schemas-microsoft-com:vml" xmlns:w10="urn:schemas-microsoft-com:office:word" xmlns:a="http://schemas.openxmlformats.org/drawingml/2006/main" xmlns:pic="http://schemas.openxmlformats.org/drawingml/2006/picture" xmlns:wp="http://schemas.openxmlformats.org/drawingml/2006/wordprocessingDrawing">
   <w:body>
-    <w:bookmarkStart w:id="584" w:name="X356b170f064e9677b3a5f814002b4c3be46c723"/>
+    <w:bookmarkStart w:id="618" w:name="X4855b1162e70238fd839d871e0792397dc58430"/>
     <w:p>
       <w:pPr>
         <w:pStyle w:val="Heading1"/>
       </w:pPr>
       <w:r>
-        <w:t xml:space="preserve">Hephaestus: an in-browser open-source engine and open databases for the thermodynamics and phase diagrams of slags, molten salts, and alloys</w:t>
+        <w:t xml:space="preserve">Hephaestus: an in-browser open-source engine and databases for the thermodynamics and phase diagrams of slags, molten salts, and alloys</w:t>
       </w:r>
     </w:p>
     <w:p>
@@ -159,7 +159,7 @@
         <w:t xml:space="preserve">CALPHAD; molten slag; molten salt; modified quasichemical model; thermodynamic database; phase diagram; WebAssembly; open data</w:t>
       </w:r>
     </w:p>
-    <w:bookmarkStart w:id="562" w:name="overview"/>
+    <w:bookmarkStart w:id="596" w:name="overview"/>
     <w:p>
       <w:pPr>
         <w:pStyle w:val="Heading2"/>
@@ -168,7 +168,7 @@
         <w:t xml:space="preserve">(1) Overview</w:t>
       </w:r>
     </w:p>
-    <w:bookmarkStart w:id="549" w:name="introduction"/>
+    <w:bookmarkStart w:id="583" w:name="introduction"/>
     <w:p>
       <w:pPr>
         <w:pStyle w:val="Heading3"/>
@@ -490,8 +490,8 @@
         <w:t xml:space="preserve">Hephaestus is a deliberate response to that gap, and it treats the engine and the data as one contribution because neither is useful alone. The engine is small on purpose. Its core is plain C with no dependencies, which makes it easy to embed and lets the identical code compile to WebAssembly, so the full calculator runs in a web browser with nothing installed and no data leaving the user’s machine. The database is open on purpose. Every parameter in it derives from published measurements, each value carries its provenance down to table and page, and the known shortcomings are documented next to the numbers they affect. The present work describes both, their validation against pycalphad and against measured phase equilibria, and the ways they can be reused. None of it asks the reader to program. For the experimentalist who never writes code, the browser application is the entire product, a page to open, a database to click, and a diagram to read; the sections that follow describe the machinery underneath for those who want it, and Supplementary Material S1 is a plain-language primer provided so that the non-programmer can learn enough to use the tool, starting at what a database file even is and ending at a first calculation and how to read it. Its closing section teaches what an assessment is built from, so a reader who wants to learn the craft and contribute data for open publication, or to arrive prepared to a first conversation about a commissioned file, knows beforehand exactly what is needed.</w:t>
       </w:r>
     </w:p>
-    <w:bookmarkEnd w:id="549"/>
-    <w:bookmarkStart w:id="559" w:name="implementation-and-architecture"/>
+    <w:bookmarkEnd w:id="583"/>
+    <w:bookmarkStart w:id="593" w:name="implementation-and-architecture"/>
     <w:p>
       <w:pPr>
         <w:pStyle w:val="Heading3"/>
@@ -517,18 +517,18 @@
           <wp:inline>
             <wp:extent cx="5334000" cy="3497491"/>
             <wp:effectExtent b="0" l="0" r="0" t="0"/>
-            <wp:docPr descr="Figure 1: Architecture of Hephaestus. A single dependency-free C core reads ChemSage-format files and computes all thermodynamics; the same core is used as a native library, from Python through cffi, and compiled to WebAssembly behind the browser application. dbbuild writes new ChemSage files from measured data, and every energy path is validated against pycalphad." title="" id="551" name="Picture"/>
+            <wp:docPr descr="Figure 1: Architecture of Hephaestus. A single dependency-free C core reads ChemSage-format files and computes all thermodynamics; the same core is used as a native library, from Python through cffi, and compiled to WebAssembly behind the browser application. dbbuild writes new ChemSage files from measured data, and every energy path is validated against pycalphad." title="" id="585" name="Picture"/>
             <a:graphic>
               <a:graphicData uri="http://schemas.openxmlformats.org/drawingml/2006/picture">
                 <pic:pic>
                   <pic:nvPicPr>
-                    <pic:cNvPr descr="figures/fig1_architecture.png" id="552" name="Picture"/>
+                    <pic:cNvPr descr="figures/fig1_architecture.png" id="586" name="Picture"/>
                     <pic:cNvPicPr>
                       <a:picLocks noChangeArrowheads="1" noChangeAspect="1"/>
                     </pic:cNvPicPr>
                   </pic:nvPicPr>
                   <pic:blipFill>
-                    <a:blip r:embed="rId550"/>
+                    <a:blip r:embed="rId584"/>
                     <a:stretch>
                       <a:fillRect/>
                     </a:stretch>
@@ -715,18 +715,18 @@
           <wp:inline>
             <wp:extent cx="4754880" cy="4464799"/>
             <wp:effectExtent b="0" l="0" r="0" t="0"/>
-            <wp:docPr descr="Figure 2: The live solver in the browser application (light theme). The user loads the shipped database, picks a temperature, and presses Compute; the WebAssembly engine then solves the full FeO-MgO-SiO2 phase assemblage client side (here 1023 composition samples and 512 tie-facets in under half a second). Tapping a composition reads its stable phases and pins it to a comparison list; hovering previews on desktop." title="" id="554" name="Picture"/>
+            <wp:docPr descr="Figure 2: The live solver in the browser application (light theme). The user loads the shipped database, picks a temperature, and presses Compute; the WebAssembly engine then solves the full FeO-MgO-SiO2 phase assemblage client side (here 1023 composition samples and 512 tie-facets in under half a second). Tapping a composition reads its stable phases and pins it to a comparison list; hovering previews on desktop." title="" id="588" name="Picture"/>
             <a:graphic>
               <a:graphicData uri="http://schemas.openxmlformats.org/drawingml/2006/picture">
                 <pic:pic>
                   <pic:nvPicPr>
-                    <pic:cNvPr descr="figures/fig2_browser_app.png" id="555" name="Picture"/>
+                    <pic:cNvPr descr="figures/fig2_browser_app.png" id="589" name="Picture"/>
                     <pic:cNvPicPr>
                       <a:picLocks noChangeArrowheads="1" noChangeAspect="1"/>
                     </pic:cNvPicPr>
                   </pic:nvPicPr>
                   <pic:blipFill>
-                    <a:blip r:embed="rId553"/>
+                    <a:blip r:embed="rId587"/>
                     <a:stretch>
                       <a:fillRect/>
                     </a:stretch>
@@ -892,18 +892,18 @@
           <wp:inline>
             <wp:extent cx="5334000" cy="2416336"/>
             <wp:effectExtent b="0" l="0" r="0" t="0"/>
-            <wp:docPr descr="Figure 3: The assessed FeO-MgO-SiO2 system calculated from the shipped database files. (a) Liquidus projection: primary crystallizing phase fields, with liquidus isotherms labeled in °C. (b) Isothermal section at 1600 °C: stable phase assemblages, shaded by the number of solid phases present. Phase labels: L liquid, Crs cristobalite, Ol olivine, Opx orthopyroxene, Per periclase, Wus wustite." title="" id="557" name="Picture"/>
+            <wp:docPr descr="Figure 3: The assessed FeO-MgO-SiO2 system calculated from the shipped database files. (a) Liquidus projection: primary crystallizing phase fields, with liquidus isotherms labeled in °C. (b) Isothermal section at 1600 °C: stable phase assemblages, shaded by the number of solid phases present. Phase labels: L liquid, Crs cristobalite, Ol olivine, Opx orthopyroxene, Per periclase, Wus wustite." title="" id="591" name="Picture"/>
             <a:graphic>
               <a:graphicData uri="http://schemas.openxmlformats.org/drawingml/2006/picture">
                 <pic:pic>
                   <pic:nvPicPr>
-                    <pic:cNvPr descr="figures/fig3_ternary.png" id="558" name="Picture"/>
+                    <pic:cNvPr descr="figures/fig3_ternary.png" id="592" name="Picture"/>
                     <pic:cNvPicPr>
                       <a:picLocks noChangeArrowheads="1" noChangeAspect="1"/>
                     </pic:cNvPicPr>
                   </pic:nvPicPr>
                   <pic:blipFill>
-                    <a:blip r:embed="rId556"/>
+                    <a:blip r:embed="rId590"/>
                     <a:stretch>
                       <a:fillRect/>
                     </a:stretch>
@@ -1244,8 +1244,8 @@
         <w:t xml:space="preserve">Table 2: The assessed liquids. Full source lists, modeling judgments, and limits are in each system’s provenance file in the repository.</w:t>
       </w:r>
     </w:p>
-    <w:bookmarkEnd w:id="559"/>
-    <w:bookmarkStart w:id="560" w:name="anatomy-of-a-database-file"/>
+    <w:bookmarkEnd w:id="593"/>
+    <w:bookmarkStart w:id="594" w:name="anatomy-of-a-database-file"/>
     <w:p>
       <w:pPr>
         <w:pStyle w:val="Heading3"/>
@@ -1278,8 +1278,8 @@
         <w:t xml:space="preserve">That asymmetry is the economics of the field in miniature: implementations of the published models are increasingly available, but each fitted parameter condenses dozens of measurements and decisions. Parameter sets rather than codes are therefore the scarce commodity, and an openly licensed, provenance-tracked database is the part of this contribution that cannot be regenerated from the paper alone.</w:t>
       </w:r>
     </w:p>
-    <w:bookmarkEnd w:id="560"/>
-    <w:bookmarkStart w:id="561" w:name="quality-control"/>
+    <w:bookmarkEnd w:id="594"/>
+    <w:bookmarkStart w:id="595" w:name="quality-control"/>
     <w:p>
       <w:pPr>
         <w:pStyle w:val="Heading3"/>
@@ -1724,9 +1724,9 @@
         <w:t xml:space="preserve">invariants sit within about 40 °C, and the ternary liquidus projection reproduces the measured field topology [23]. Development practice is plain: the repository is version controlled with tagged releases (v0.1.0 through the v0.4.0 described here), the full suite runs before every release, and a fixed bug lands together with the regression test that would have caught it. The suite runs on Windows 11 under CPython 3.11 and 3.12; the browser application is exercised in Chromium- and Gecko-based browsers. A user can confirm a working installation by running pytest against the bundled test databases, or with no installation at all by opening the web application and loading the shipped ternary database.</w:t>
       </w:r>
     </w:p>
-    <w:bookmarkEnd w:id="561"/>
-    <w:bookmarkEnd w:id="562"/>
-    <w:bookmarkStart w:id="570" w:name="availability"/>
+    <w:bookmarkEnd w:id="595"/>
+    <w:bookmarkEnd w:id="596"/>
+    <w:bookmarkStart w:id="604" w:name="availability"/>
     <w:p>
       <w:pPr>
         <w:pStyle w:val="Heading2"/>
@@ -1735,7 +1735,7 @@
         <w:t xml:space="preserve">(2) Availability</w:t>
       </w:r>
     </w:p>
-    <w:bookmarkStart w:id="563" w:name="operating-system"/>
+    <w:bookmarkStart w:id="597" w:name="operating-system"/>
     <w:p>
       <w:pPr>
         <w:pStyle w:val="Heading3"/>
@@ -1752,8 +1752,8 @@
         <w:t xml:space="preserve">Platform independent. The core builds with any C99 compiler; development and testing used Windows 11. The browser application runs in any current browser with WebAssembly support.</w:t>
       </w:r>
     </w:p>
-    <w:bookmarkEnd w:id="563"/>
-    <w:bookmarkStart w:id="564" w:name="programming-language"/>
+    <w:bookmarkEnd w:id="597"/>
+    <w:bookmarkStart w:id="598" w:name="programming-language"/>
     <w:p>
       <w:pPr>
         <w:pStyle w:val="Heading3"/>
@@ -1770,8 +1770,8 @@
         <w:t xml:space="preserve">C (core), Python 3.11 or later (interface and fitting tools), JavaScript (browser application).</w:t>
       </w:r>
     </w:p>
-    <w:bookmarkEnd w:id="564"/>
-    <w:bookmarkStart w:id="565" w:name="additional-system-requirements"/>
+    <w:bookmarkEnd w:id="598"/>
+    <w:bookmarkStart w:id="599" w:name="additional-system-requirements"/>
     <w:p>
       <w:pPr>
         <w:pStyle w:val="Heading3"/>
@@ -1788,8 +1788,8 @@
         <w:t xml:space="preserve">None of note. The engine and database together are a few megabytes.</w:t>
       </w:r>
     </w:p>
-    <w:bookmarkEnd w:id="565"/>
-    <w:bookmarkStart w:id="566" w:name="dependencies"/>
+    <w:bookmarkEnd w:id="599"/>
+    <w:bookmarkStart w:id="600" w:name="dependencies"/>
     <w:p>
       <w:pPr>
         <w:pStyle w:val="Heading3"/>
@@ -1806,8 +1806,8 @@
         <w:t xml:space="preserve">Python interface: cffi, NumPy, SciPy. Validation suite additionally requires pycalphad. WebAssembly build requires emscripten. The C core and the browser application have no dependencies.</w:t>
       </w:r>
     </w:p>
-    <w:bookmarkEnd w:id="566"/>
-    <w:bookmarkStart w:id="567" w:name="list-of-contributors"/>
+    <w:bookmarkEnd w:id="600"/>
+    <w:bookmarkStart w:id="601" w:name="list-of-contributors"/>
     <w:p>
       <w:pPr>
         <w:pStyle w:val="Heading3"/>
@@ -1824,8 +1824,8 @@
         <w:t xml:space="preserve">Michael E. Bustamante (design, implementation, validation, data curation).</w:t>
       </w:r>
     </w:p>
-    <w:bookmarkEnd w:id="567"/>
-    <w:bookmarkStart w:id="568" w:name="software-location"/>
+    <w:bookmarkEnd w:id="601"/>
+    <w:bookmarkStart w:id="602" w:name="software-location"/>
     <w:p>
       <w:pPr>
         <w:pStyle w:val="Heading3"/>
@@ -1978,8 +1978,8 @@
         <w:t xml:space="preserve">Date published: 2026-09-02</w:t>
       </w:r>
     </w:p>
-    <w:bookmarkEnd w:id="568"/>
-    <w:bookmarkStart w:id="569" w:name="language"/>
+    <w:bookmarkEnd w:id="602"/>
+    <w:bookmarkStart w:id="603" w:name="language"/>
     <w:p>
       <w:pPr>
         <w:pStyle w:val="Heading3"/>
@@ -1996,9 +1996,9 @@
         <w:t xml:space="preserve">English.</w:t>
       </w:r>
     </w:p>
-    <w:bookmarkEnd w:id="569"/>
-    <w:bookmarkEnd w:id="570"/>
-    <w:bookmarkStart w:id="578" w:name="reuse-potential"/>
+    <w:bookmarkEnd w:id="603"/>
+    <w:bookmarkEnd w:id="604"/>
+    <w:bookmarkStart w:id="612" w:name="reuse-potential"/>
     <w:p>
       <w:pPr>
         <w:pStyle w:val="Heading2"/>
@@ -2023,7 +2023,7 @@
         <w:t xml:space="preserve">The browser application makes the lowest barrier the default. A lecture on slag thermodynamics, a plant metallurgist screening a composition, or a reviewer checking a claimed equilibrium can load the database and calculate in seconds, with confidential inputs never leaving the machine. The same property makes it a practical template for other groups who want to publish a model as a zero-install tool.</w:t>
       </w:r>
     </w:p>
-    <w:bookmarkStart w:id="577" w:name="worked-examples"/>
+    <w:bookmarkStart w:id="611" w:name="worked-examples"/>
     <w:p>
       <w:pPr>
         <w:pStyle w:val="Heading3"/>
@@ -2215,18 +2215,18 @@
           <wp:inline>
             <wp:extent cx="4206240" cy="3108960"/>
             <wp:effectExtent b="0" l="0" r="0" t="0"/>
-            <wp:docPr descr="Figure 4: The LiCl-KCl phase diagram computed by the salt listing from the shipped open database, on the listing’s own grid. Light to dark: liquid, two-phase, and subsolidus fields. The dot is the computed eutectic on this grid (0.400, 640 K); the star is the measured eutectic (0.415, 626 K)." title="" id="572" name="Picture"/>
+            <wp:docPr descr="Figure 4: The LiCl-KCl phase diagram computed by the salt listing from the shipped open database, on the listing’s own grid. Light to dark: liquid, two-phase, and subsolidus fields. The dot is the computed eutectic on this grid (0.400, 640 K); the star is the measured eutectic (0.415, 626 K)." title="" id="606" name="Picture"/>
             <a:graphic>
               <a:graphicData uri="http://schemas.openxmlformats.org/drawingml/2006/picture">
                 <pic:pic>
                   <pic:nvPicPr>
-                    <pic:cNvPr descr="figures/fig4_salt_example.png" id="573" name="Picture"/>
+                    <pic:cNvPr descr="figures/fig4_salt_example.png" id="607" name="Picture"/>
                     <pic:cNvPicPr>
                       <a:picLocks noChangeArrowheads="1" noChangeAspect="1"/>
                     </pic:cNvPicPr>
                   </pic:nvPicPr>
                   <pic:blipFill>
-                    <a:blip r:embed="rId571"/>
+                    <a:blip r:embed="rId605"/>
                     <a:stretch>
                       <a:fillRect/>
                     </a:stretch>
@@ -2432,18 +2432,18 @@
           <wp:inline>
             <wp:extent cx="4206240" cy="3108960"/>
             <wp:effectExtent b="0" l="0" r="0" t="0"/>
-            <wp:docPr descr="Figure 5: The Al-Zn phase diagram computed by the alloy listing from the shipped open TDB. Light to dark: liquid, liquid plus solid, and solid fields. The dot is the computed eutectic (0.890, 660 K); the star is the assessed eutectic (0.885, 654 K)." title="" id="575" name="Picture"/>
+            <wp:docPr descr="Figure 5: The Al-Zn phase diagram computed by the alloy listing from the shipped open TDB. Light to dark: liquid, liquid plus solid, and solid fields. The dot is the computed eutectic (0.890, 660 K); the star is the assessed eutectic (0.885, 654 K)." title="" id="609" name="Picture"/>
             <a:graphic>
               <a:graphicData uri="http://schemas.openxmlformats.org/drawingml/2006/picture">
                 <pic:pic>
                   <pic:nvPicPr>
-                    <pic:cNvPr descr="figures/fig5_alloy_example.png" id="576" name="Picture"/>
+                    <pic:cNvPr descr="figures/fig5_alloy_example.png" id="610" name="Picture"/>
                     <pic:cNvPicPr>
                       <a:picLocks noChangeArrowheads="1" noChangeAspect="1"/>
                     </pic:cNvPicPr>
                   </pic:nvPicPr>
                   <pic:blipFill>
-                    <a:blip r:embed="rId574"/>
+                    <a:blip r:embed="rId608"/>
                     <a:stretch>
                       <a:fillRect/>
                     </a:stretch>
@@ -2486,9 +2486,9 @@
         <w:t xml:space="preserve">The database is a starting point rather than an endpoint, and the file format rewards growth: new components, new phases, and refits against new measurements accumulate in the same database. A system is therefore extended release by release rather than rebuilt, and archived versions keep results calculated against earlier releases reproducible. Because every value carries its source and every judgment is written down, another assessor can reweight the data, swap an endmember, or extend a system without reverse-engineering anything; dbbuild turns a table of measured activities into a loadable file in a few lines. The in-browser multiphase hull already covers any loaded three-cation file and any loaded alloy TDB join, so a new system becomes a browser phase diagram the moment its file loads. Natural extensions are further oxide systems, the remaining ChemSage solution models, the ionic-liquid TDB model, and multicomponent Scheil on the same hull machinery. The repository also publishes an openly specified unified dialect (uTDB) that carries the MQMQA statements inside TDB grammar, with two shipped demonstration files chosen to be processes rather than curiosities: an aluminum-recycling database holding the Al-Zn alloy with its NaCl-KCl-MgCl2 salt flux, and a steelmaking database holding a basic Fe-C steel, magnetic phases included, with the FeO-MgO-SiO2 slag and its silicate solid solutions. Round-trip tests assert both reproduce their source-file physics at machine precision. Relative to the XML road of XTDB [15] (Table 1), uTDB is the on-ramp from the installed base, extending files as they are and running in this engine today, with mechanical conversion to XTDB elements the natural bridge once that schema settles. Making the calculator multilingual across the field’s file dialects is the direction of travel. Contributions and issues are handled through the GitHub repository.</w:t>
       </w:r>
     </w:p>
-    <w:bookmarkEnd w:id="577"/>
-    <w:bookmarkEnd w:id="578"/>
-    <w:bookmarkStart w:id="579" w:name="data-availability"/>
+    <w:bookmarkEnd w:id="611"/>
+    <w:bookmarkEnd w:id="612"/>
+    <w:bookmarkStart w:id="613" w:name="data-availability"/>
     <w:p>
       <w:pPr>
         <w:pStyle w:val="Heading2"/>
@@ -2505,8 +2505,8 @@
         <w:t xml:space="preserve">The engine, the database, the browser application, and the validation suite are openly available in the code repository listed above; the version described here is archived as release v0.4.0. The database files and their provenance records are in the repository’s data directory under CC BY 4.0.</w:t>
       </w:r>
     </w:p>
-    <w:bookmarkEnd w:id="579"/>
-    <w:bookmarkStart w:id="580" w:name="acknowledgements"/>
+    <w:bookmarkEnd w:id="613"/>
+    <w:bookmarkStart w:id="614" w:name="acknowledgements"/>
     <w:p>
       <w:pPr>
         <w:pStyle w:val="Heading2"/>
@@ -2523,8 +2523,8 @@
         <w:t xml:space="preserve">During the development of this software the author used Claude Code (Anthropic) to assist with implementation, validation scripting, and manuscript preparation. This assistance was agentic, not autonomous: it operated under author direction and supervision at every step and was never a closed loop that produced or accepted results without review. Every parameter was traced by the author to its primary source before entering the database, and every reference was verified against its registry record. The author reviewed and approved all output and takes full responsibility for this article.</w:t>
       </w:r>
     </w:p>
-    <w:bookmarkEnd w:id="580"/>
-    <w:bookmarkStart w:id="581" w:name="funding-statement"/>
+    <w:bookmarkEnd w:id="614"/>
+    <w:bookmarkStart w:id="615" w:name="funding-statement"/>
     <w:p>
       <w:pPr>
         <w:pStyle w:val="Heading2"/>
@@ -2541,8 +2541,8 @@
         <w:t xml:space="preserve">The development of this software received no external funding.</w:t>
       </w:r>
     </w:p>
-    <w:bookmarkEnd w:id="581"/>
-    <w:bookmarkStart w:id="582" w:name="competing-interests"/>
+    <w:bookmarkEnd w:id="615"/>
+    <w:bookmarkStart w:id="616" w:name="competing-interests"/>
     <w:p>
       <w:pPr>
         <w:pStyle w:val="Heading2"/>
@@ -2559,8 +2559,8 @@
         <w:t xml:space="preserve">The author founded Odinzen LLC, which provides commercial thermodynamic modeling services, and declares this as a competing interest. The software and database published here are released in full under open licenses, and no proprietary Odinzen assets are included.</w:t>
       </w:r>
     </w:p>
-    <w:bookmarkEnd w:id="582"/>
-    <w:bookmarkStart w:id="583" w:name="references"/>
+    <w:bookmarkEnd w:id="616"/>
+    <w:bookmarkStart w:id="617" w:name="references"/>
     <w:p>
       <w:pPr>
         <w:pStyle w:val="Heading2"/>
@@ -2861,8 +2861,8 @@
         <w:t xml:space="preserve">[35] Dinsdale AT. SGTE data for pure elements. Calphad. 1991 Oct;15(4):317-425. doi:10.1016/0364-5916(91)90030-N</w:t>
       </w:r>
     </w:p>
-    <w:bookmarkEnd w:id="583"/>
-    <w:bookmarkEnd w:id="584"/>
+    <w:bookmarkEnd w:id="617"/>
+    <w:bookmarkEnd w:id="618"/>
     <w:sectPr>
       <w:footnotePr>
         <w:numRestart w:val="eachSect"/>

</xml_diff>

<commit_message>
Neutral tone toward the commercial suites (credit their curation, drop the closed-data and vendor-request edges) and keep tables whole on one page via a reusable docx post-build step
Co-Authored-By: Claude Fable 5 <noreply@anthropic.com>
</commit_message>
<xml_diff>
--- a/paper/Bustamante_Hephaestus_JORS_manuscript.docx
+++ b/paper/Bustamante_Hephaestus_JORS_manuscript.docx
@@ -2,7 +2,7 @@
 <file path=word/document.xml><?xml version="1.0" encoding="utf-8"?>
 <w:document xmlns:w="http://schemas.openxmlformats.org/wordprocessingml/2006/main" xmlns:m="http://schemas.openxmlformats.org/officeDocument/2006/math" xmlns:r="http://schemas.openxmlformats.org/officeDocument/2006/relationships" xmlns:o="urn:schemas-microsoft-com:office:office" xmlns:v="urn:schemas-microsoft-com:vml" xmlns:w10="urn:schemas-microsoft-com:office:word" xmlns:a="http://schemas.openxmlformats.org/drawingml/2006/main" xmlns:pic="http://schemas.openxmlformats.org/drawingml/2006/picture" xmlns:wp="http://schemas.openxmlformats.org/drawingml/2006/wordprocessingDrawing">
   <w:body>
-    <w:bookmarkStart w:id="618" w:name="X4855b1162e70238fd839d871e0792397dc58430"/>
+    <w:bookmarkStart w:id="652" w:name="X4855b1162e70238fd839d871e0792397dc58430"/>
     <w:p>
       <w:pPr>
         <w:pStyle w:val="Heading1"/>
@@ -60,7 +60,7 @@
         <w:pStyle w:val="BodyText"/>
       </w:pPr>
       <w:r>
-        <w:t xml:space="preserve">The Modified Quasichemical Model in the Quadruplet Approximation (MQMQA) is the standard thermodynamic description of short-range-ordered ionic melts, and it underpins the commercial databases used throughout pyrometallurgy. Open implementations exist inside larger frameworks, but no free oxide slag database exists at all, so every practical slag calculation still depends on closed data. Hephaestus addresses the model and the data together. The engine is a small dependency-free C core with a Python interface and a WebAssembly build, so the same code runs embedded, scripted, or in a browser with nothing installed. It reads ChemSage-format files directly, covering MQMQA liquids, compound energy formalism solid solutions, and stoichiometric compounds; it reads the Thermo-Calc TDB dialect for alloys, including the Inden magnetic contribution real steel files require; and it defines uTDB, an openly specified extension carrying the MQMQA statements inside TDB grammar, demonstrated by shipped aluminum-recycling (Al-Zn alloy with its NaCl-KCl-MgCl</w:t>
+        <w:t xml:space="preserve">The Modified Quasichemical Model in the Quadruplet Approximation (MQMQA) is the standard thermodynamic description of short-range-ordered ionic melts, and it underpins the commercial databases used throughout pyrometallurgy. Open implementations exist inside larger frameworks, but no freely licensed oxide slag database has been available, so users of open tools have had the model without parameters to run through it. Hephaestus addresses the model and the data together. The engine is a small dependency-free C core with a Python interface and a WebAssembly build, so the same code runs embedded, scripted, or in a browser with nothing installed. It reads ChemSage-format files directly, covering MQMQA liquids, compound energy formalism solid solutions, and stoichiometric compounds; it reads the Thermo-Calc TDB dialect for alloys, including the Inden magnetic contribution real steel files require; and it defines uTDB, an openly specified extension carrying the MQMQA statements inside TDB grammar, demonstrated by shipped aluminum-recycling (Al-Zn alloy with its NaCl-KCl-MgCl</w:t>
       </w:r>
       <w:r>
         <w:rPr>
@@ -159,7 +159,7 @@
         <w:t xml:space="preserve">CALPHAD; molten slag; molten salt; modified quasichemical model; thermodynamic database; phase diagram; WebAssembly; open data</w:t>
       </w:r>
     </w:p>
-    <w:bookmarkStart w:id="596" w:name="overview"/>
+    <w:bookmarkStart w:id="630" w:name="overview"/>
     <w:p>
       <w:pPr>
         <w:pStyle w:val="Heading2"/>
@@ -168,7 +168,7 @@
         <w:t xml:space="preserve">(1) Overview</w:t>
       </w:r>
     </w:p>
-    <w:bookmarkStart w:id="583" w:name="introduction"/>
+    <w:bookmarkStart w:id="617" w:name="introduction"/>
     <w:p>
       <w:pPr>
         <w:pStyle w:val="Heading3"/>
@@ -182,15 +182,15 @@
         <w:pStyle w:val="FirstParagraph"/>
       </w:pPr>
       <w:r>
-        <w:t xml:space="preserve">Molten oxide slags and molten salts are dominated by short-range ordering, which the Modified Quasichemical Model in the Quadruplet Approximation describes through the distribution of cation-anion quadruplets [1]. The quadruplet formalism is the current form of the modified quasichemical family, which grew from the pair-approximation treatment of binary liquids [2] and its application to silicate slags [3]. The model is published in full, and it is the basis of the oxide and salt databases in FactSage, the software that carries most industrial slag work [4]; databases of this kind are embedded in everyday steelmaking practice, from slag design through virtual process simulation [5,6]. What separates a published model from a usable calculation is an implementation and a parameter set. On the implementation side the situation has improved. OpenCalphad brought a free general equilibrium code [7]; pycalphad, itself published in this journal [8], gained an MQMQA model with uncertainty quantification [9] and a companion parameter-fitting framework [10]; Thermochimica calculates MQMQA molten salts inside a nuclear fuel framework [11]. Both MQMQA implementations live inside larger frameworks with correspondingly large dependency stacks. On the data side the situation has not improved at all. The community has argued for years that phase-based data need open infrastructure [12], yet there is no free MQMQA oxide slag database. A student, a startup, or a plant engineer who wants to calculate a slag equilibrium with open tools has the model, possibly an implementation, and no parameters to run through it.</w:t>
-      </w:r>
-    </w:p>
-    <w:p>
-      <w:pPr>
-        <w:pStyle w:val="BodyText"/>
-      </w:pPr>
-      <w:r>
-        <w:t xml:space="preserve">The workflows behind these tools also shape who can use them. FactSage [4] and Thermo-Calc [13] are mature commercial suites, module GUIs over licensed closed databases, powerful in expert hands and licensed for institutions, and other commercial packages follow the same shape. OpenCalphad [7] and pycalphad [8] are free engines for the code-comfortable: command files or Python sessions over TDB databases, with no graphical calculator attached. CemGEMS [14] showed a third way for cement chemistry, a free web front end whose users install nothing, though its calculations still run on a project server; the GEMS ecosystem behind it runs its own container formats entirely, so the fragmentation extends beyond CALPHAD’s two dialects. What none of them offers is a calculator that is zero-install, fully client-side, and open-data at once: a page anyone can open, load a database in either of the field’s file dialects, and calculate against, with nothing transmitted anywhere. Hephaestus takes that seat deliberately as a complement rather than a competitor. It does not chase FactSage’s breadth or Thermo-Calc’s alloy depth; it is the low-barrier door into the same published models, with open parameters behind it and a fitting loop short enough that refitting an excess term against new measurements is an interactive step rather than a vendor request.</w:t>
+        <w:t xml:space="preserve">Molten oxide slags and molten salts are dominated by short-range ordering, which the Modified Quasichemical Model in the Quadruplet Approximation describes through the distribution of cation-anion quadruplets [1]. The quadruplet formalism is the current form of the modified quasichemical family, which grew from the pair-approximation treatment of binary liquids [2] and its application to silicate slags [3]. The model is published in full, and it is the basis of the oxide and salt databases in FactSage, the software that carries most industrial slag work [4]; databases of this kind are embedded in everyday steelmaking practice, from slag design through virtual process simulation [5,6]. What separates a published model from a usable calculation is an implementation and a parameter set. On the implementation side the situation has improved. OpenCalphad brought a free general equilibrium code [7]; pycalphad, itself published in this journal [8], gained an MQMQA model with uncertainty quantification [9] and a companion parameter-fitting framework [10]; Thermochimica calculates MQMQA molten salts inside a nuclear fuel framework [11]. Both MQMQA implementations live inside larger frameworks with correspondingly large dependency stacks. On the data side, open infrastructure has been slower to arrive. The community has argued for years that phase-based data need open infrastructure [12], yet there is no free MQMQA oxide slag database. A student, a startup, or a plant engineer who wants to calculate a slag equilibrium with open tools has the model, possibly an implementation, and no parameters to run through it.</w:t>
+      </w:r>
+    </w:p>
+    <w:p>
+      <w:pPr>
+        <w:pStyle w:val="BodyText"/>
+      </w:pPr>
+      <w:r>
+        <w:t xml:space="preserve">The workflows behind these tools also shape who can use them. FactSage [4] and Thermo-Calc [13] are mature commercial suites whose module interfaces and expertly curated databases serve licensed users well, and other commercial packages follow the same shape. OpenCalphad [7] and pycalphad [8] are free engines for the code-comfortable: command files or Python sessions over TDB databases, with no graphical calculator attached. CemGEMS [14] showed a third way for cement chemistry, a free web front end whose users install nothing, though its calculations still run on a project server; the GEMS ecosystem behind it runs its own container formats entirely, so the fragmentation extends beyond CALPHAD’s two dialects. What none of them offers is a calculator that is zero-install, fully client-side, and open-data at once: a page anyone can open, load a database in either of the field’s file dialects, and calculate against, with nothing transmitted anywhere. Hephaestus takes that seat deliberately as a complement rather than a competitor. It does not chase FactSage’s breadth or Thermo-Calc’s alloy depth; it is the low-barrier door into the same published models, with open parameters behind it and a fitting loop short enough that refitting an excess term against new measurements is an interactive step.</w:t>
       </w:r>
     </w:p>
     <w:p>
@@ -227,12 +227,14 @@
       </w:tblGrid>
       <w:tr>
         <w:trPr>
+          <w:cantSplit/>
           <w:tblHeader w:val="on"/>
         </w:trPr>
         <w:tc>
           <w:tcPr/>
           <w:p>
             <w:pPr>
+              <w:keepNext/>
               <w:pStyle w:val="Compact"/>
             </w:pPr>
             <w:r>
@@ -244,6 +246,7 @@
           <w:tcPr/>
           <w:p>
             <w:pPr>
+              <w:keepNext/>
               <w:pStyle w:val="Compact"/>
             </w:pPr>
             <w:r>
@@ -255,6 +258,7 @@
           <w:tcPr/>
           <w:p>
             <w:pPr>
+              <w:keepNext/>
               <w:pStyle w:val="Compact"/>
             </w:pPr>
             <w:r>
@@ -264,10 +268,14 @@
         </w:tc>
       </w:tr>
       <w:tr>
-        <w:tc>
-          <w:tcPr/>
-          <w:p>
-            <w:pPr>
+        <w:trPr>
+          <w:cantSplit/>
+        </w:trPr>
+        <w:tc>
+          <w:tcPr/>
+          <w:p>
+            <w:pPr>
+              <w:keepNext/>
               <w:pStyle w:val="Compact"/>
             </w:pPr>
             <w:r>
@@ -279,6 +287,7 @@
           <w:tcPr/>
           <w:p>
             <w:pPr>
+              <w:keepNext/>
               <w:pStyle w:val="Compact"/>
             </w:pPr>
             <w:r>
@@ -290,6 +299,7 @@
           <w:tcPr/>
           <w:p>
             <w:pPr>
+              <w:keepNext/>
               <w:pStyle w:val="Compact"/>
             </w:pPr>
             <w:r>
@@ -299,10 +309,14 @@
         </w:tc>
       </w:tr>
       <w:tr>
-        <w:tc>
-          <w:tcPr/>
-          <w:p>
-            <w:pPr>
+        <w:trPr>
+          <w:cantSplit/>
+        </w:trPr>
+        <w:tc>
+          <w:tcPr/>
+          <w:p>
+            <w:pPr>
+              <w:keepNext/>
               <w:pStyle w:val="Compact"/>
             </w:pPr>
             <w:r>
@@ -314,6 +328,7 @@
           <w:tcPr/>
           <w:p>
             <w:pPr>
+              <w:keepNext/>
               <w:pStyle w:val="Compact"/>
             </w:pPr>
             <w:r>
@@ -325,6 +340,7 @@
           <w:tcPr/>
           <w:p>
             <w:pPr>
+              <w:keepNext/>
               <w:pStyle w:val="Compact"/>
             </w:pPr>
             <w:r>
@@ -334,10 +350,14 @@
         </w:tc>
       </w:tr>
       <w:tr>
-        <w:tc>
-          <w:tcPr/>
-          <w:p>
-            <w:pPr>
+        <w:trPr>
+          <w:cantSplit/>
+        </w:trPr>
+        <w:tc>
+          <w:tcPr/>
+          <w:p>
+            <w:pPr>
+              <w:keepNext/>
               <w:pStyle w:val="Compact"/>
             </w:pPr>
             <w:r>
@@ -349,6 +369,7 @@
           <w:tcPr/>
           <w:p>
             <w:pPr>
+              <w:keepNext/>
               <w:pStyle w:val="Compact"/>
             </w:pPr>
             <w:r>
@@ -360,6 +381,7 @@
           <w:tcPr/>
           <w:p>
             <w:pPr>
+              <w:keepNext/>
               <w:pStyle w:val="Compact"/>
             </w:pPr>
             <w:r>
@@ -369,10 +391,14 @@
         </w:tc>
       </w:tr>
       <w:tr>
-        <w:tc>
-          <w:tcPr/>
-          <w:p>
-            <w:pPr>
+        <w:trPr>
+          <w:cantSplit/>
+        </w:trPr>
+        <w:tc>
+          <w:tcPr/>
+          <w:p>
+            <w:pPr>
+              <w:keepNext/>
               <w:pStyle w:val="Compact"/>
             </w:pPr>
             <w:r>
@@ -384,6 +410,7 @@
           <w:tcPr/>
           <w:p>
             <w:pPr>
+              <w:keepNext/>
               <w:pStyle w:val="Compact"/>
             </w:pPr>
             <w:r>
@@ -395,6 +422,7 @@
           <w:tcPr/>
           <w:p>
             <w:pPr>
+              <w:keepNext/>
               <w:pStyle w:val="Compact"/>
             </w:pPr>
             <w:r>
@@ -404,10 +432,14 @@
         </w:tc>
       </w:tr>
       <w:tr>
-        <w:tc>
-          <w:tcPr/>
-          <w:p>
-            <w:pPr>
+        <w:trPr>
+          <w:cantSplit/>
+        </w:trPr>
+        <w:tc>
+          <w:tcPr/>
+          <w:p>
+            <w:pPr>
+              <w:keepNext/>
               <w:pStyle w:val="Compact"/>
             </w:pPr>
             <w:r>
@@ -419,6 +451,7 @@
           <w:tcPr/>
           <w:p>
             <w:pPr>
+              <w:keepNext/>
               <w:pStyle w:val="Compact"/>
             </w:pPr>
             <w:r>
@@ -430,6 +463,7 @@
           <w:tcPr/>
           <w:p>
             <w:pPr>
+              <w:keepNext/>
               <w:pStyle w:val="Compact"/>
             </w:pPr>
             <w:r>
@@ -439,6 +473,9 @@
         </w:tc>
       </w:tr>
       <w:tr>
+        <w:trPr>
+          <w:cantSplit/>
+        </w:trPr>
         <w:tc>
           <w:tcPr/>
           <w:p>
@@ -490,8 +527,8 @@
         <w:t xml:space="preserve">Hephaestus is a deliberate response to that gap, and it treats the engine and the data as one contribution because neither is useful alone. The engine is small on purpose. Its core is plain C with no dependencies, which makes it easy to embed and lets the identical code compile to WebAssembly, so the full calculator runs in a web browser with nothing installed and no data leaving the user’s machine. The database is open on purpose. Every parameter in it derives from published measurements, each value carries its provenance down to table and page, and the known shortcomings are documented next to the numbers they affect. The present work describes both, their validation against pycalphad and against measured phase equilibria, and the ways they can be reused. None of it asks the reader to program. For the experimentalist who never writes code, the browser application is the entire product, a page to open, a database to click, and a diagram to read; the sections that follow describe the machinery underneath for those who want it, and Supplementary Material S1 is a plain-language primer provided so that the non-programmer can learn enough to use the tool, starting at what a database file even is and ending at a first calculation and how to read it. Its closing section teaches what an assessment is built from, so a reader who wants to learn the craft and contribute data for open publication, or to arrive prepared to a first conversation about a commissioned file, knows beforehand exactly what is needed.</w:t>
       </w:r>
     </w:p>
-    <w:bookmarkEnd w:id="583"/>
-    <w:bookmarkStart w:id="593" w:name="implementation-and-architecture"/>
+    <w:bookmarkEnd w:id="617"/>
+    <w:bookmarkStart w:id="627" w:name="implementation-and-architecture"/>
     <w:p>
       <w:pPr>
         <w:pStyle w:val="Heading3"/>
@@ -517,18 +554,18 @@
           <wp:inline>
             <wp:extent cx="5334000" cy="3497491"/>
             <wp:effectExtent b="0" l="0" r="0" t="0"/>
-            <wp:docPr descr="Figure 1: Architecture of Hephaestus. A single dependency-free C core reads ChemSage-format files and computes all thermodynamics; the same core is used as a native library, from Python through cffi, and compiled to WebAssembly behind the browser application. dbbuild writes new ChemSage files from measured data, and every energy path is validated against pycalphad." title="" id="585" name="Picture"/>
+            <wp:docPr descr="Figure 1: Architecture of Hephaestus. A single dependency-free C core reads ChemSage-format files and computes all thermodynamics; the same core is used as a native library, from Python through cffi, and compiled to WebAssembly behind the browser application. dbbuild writes new ChemSage files from measured data, and every energy path is validated against pycalphad." title="" id="619" name="Picture"/>
             <a:graphic>
               <a:graphicData uri="http://schemas.openxmlformats.org/drawingml/2006/picture">
                 <pic:pic>
                   <pic:nvPicPr>
-                    <pic:cNvPr descr="figures/fig1_architecture.png" id="586" name="Picture"/>
+                    <pic:cNvPr descr="figures/fig1_architecture.png" id="620" name="Picture"/>
                     <pic:cNvPicPr>
                       <a:picLocks noChangeArrowheads="1" noChangeAspect="1"/>
                     </pic:cNvPicPr>
                   </pic:nvPicPr>
                   <pic:blipFill>
-                    <a:blip r:embed="rId584"/>
+                    <a:blip r:embed="rId618"/>
                     <a:stretch>
                       <a:fillRect/>
                     </a:stretch>
@@ -715,18 +752,18 @@
           <wp:inline>
             <wp:extent cx="4754880" cy="4464799"/>
             <wp:effectExtent b="0" l="0" r="0" t="0"/>
-            <wp:docPr descr="Figure 2: The live solver in the browser application (light theme). The user loads the shipped database, picks a temperature, and presses Compute; the WebAssembly engine then solves the full FeO-MgO-SiO2 phase assemblage client side (here 1023 composition samples and 512 tie-facets in under half a second). Tapping a composition reads its stable phases and pins it to a comparison list; hovering previews on desktop." title="" id="588" name="Picture"/>
+            <wp:docPr descr="Figure 2: The live solver in the browser application (light theme). The user loads the shipped database, picks a temperature, and presses Compute; the WebAssembly engine then solves the full FeO-MgO-SiO2 phase assemblage client side (here 1023 composition samples and 512 tie-facets in under half a second). Tapping a composition reads its stable phases and pins it to a comparison list; hovering previews on desktop." title="" id="622" name="Picture"/>
             <a:graphic>
               <a:graphicData uri="http://schemas.openxmlformats.org/drawingml/2006/picture">
                 <pic:pic>
                   <pic:nvPicPr>
-                    <pic:cNvPr descr="figures/fig2_browser_app.png" id="589" name="Picture"/>
+                    <pic:cNvPr descr="figures/fig2_browser_app.png" id="623" name="Picture"/>
                     <pic:cNvPicPr>
                       <a:picLocks noChangeArrowheads="1" noChangeAspect="1"/>
                     </pic:cNvPicPr>
                   </pic:nvPicPr>
                   <pic:blipFill>
-                    <a:blip r:embed="rId587"/>
+                    <a:blip r:embed="rId621"/>
                     <a:stretch>
                       <a:fillRect/>
                     </a:stretch>
@@ -892,18 +929,18 @@
           <wp:inline>
             <wp:extent cx="5334000" cy="2416336"/>
             <wp:effectExtent b="0" l="0" r="0" t="0"/>
-            <wp:docPr descr="Figure 3: The assessed FeO-MgO-SiO2 system calculated from the shipped database files. (a) Liquidus projection: primary crystallizing phase fields, with liquidus isotherms labeled in °C. (b) Isothermal section at 1600 °C: stable phase assemblages, shaded by the number of solid phases present. Phase labels: L liquid, Crs cristobalite, Ol olivine, Opx orthopyroxene, Per periclase, Wus wustite." title="" id="591" name="Picture"/>
+            <wp:docPr descr="Figure 3: The assessed FeO-MgO-SiO2 system calculated from the shipped database files. (a) Liquidus projection: primary crystallizing phase fields, with liquidus isotherms labeled in °C. (b) Isothermal section at 1600 °C: stable phase assemblages, shaded by the number of solid phases present. Phase labels: L liquid, Crs cristobalite, Ol olivine, Opx orthopyroxene, Per periclase, Wus wustite." title="" id="625" name="Picture"/>
             <a:graphic>
               <a:graphicData uri="http://schemas.openxmlformats.org/drawingml/2006/picture">
                 <pic:pic>
                   <pic:nvPicPr>
-                    <pic:cNvPr descr="figures/fig3_ternary.png" id="592" name="Picture"/>
+                    <pic:cNvPr descr="figures/fig3_ternary.png" id="626" name="Picture"/>
                     <pic:cNvPicPr>
                       <a:picLocks noChangeArrowheads="1" noChangeAspect="1"/>
                     </pic:cNvPicPr>
                   </pic:nvPicPr>
                   <pic:blipFill>
-                    <a:blip r:embed="rId590"/>
+                    <a:blip r:embed="rId624"/>
                     <a:stretch>
                       <a:fillRect/>
                     </a:stretch>
@@ -965,12 +1002,14 @@
       </w:tblGrid>
       <w:tr>
         <w:trPr>
+          <w:cantSplit/>
           <w:tblHeader w:val="on"/>
         </w:trPr>
         <w:tc>
           <w:tcPr/>
           <w:p>
             <w:pPr>
+              <w:keepNext/>
               <w:pStyle w:val="Compact"/>
             </w:pPr>
             <w:r>
@@ -982,6 +1021,7 @@
           <w:tcPr/>
           <w:p>
             <w:pPr>
+              <w:keepNext/>
               <w:pStyle w:val="Compact"/>
             </w:pPr>
             <w:r>
@@ -993,6 +1033,7 @@
           <w:tcPr/>
           <w:p>
             <w:pPr>
+              <w:keepNext/>
               <w:pStyle w:val="Compact"/>
             </w:pPr>
             <w:r>
@@ -1004,6 +1045,7 @@
           <w:tcPr/>
           <w:p>
             <w:pPr>
+              <w:keepNext/>
               <w:pStyle w:val="Compact"/>
             </w:pPr>
             <w:r>
@@ -1013,10 +1055,14 @@
         </w:tc>
       </w:tr>
       <w:tr>
-        <w:tc>
-          <w:tcPr/>
-          <w:p>
-            <w:pPr>
+        <w:trPr>
+          <w:cantSplit/>
+        </w:trPr>
+        <w:tc>
+          <w:tcPr/>
+          <w:p>
+            <w:pPr>
+              <w:keepNext/>
               <w:pStyle w:val="Compact"/>
             </w:pPr>
             <w:r>
@@ -1034,6 +1080,7 @@
           <w:tcPr/>
           <w:p>
             <w:pPr>
+              <w:keepNext/>
               <w:pStyle w:val="Compact"/>
             </w:pPr>
             <w:r>
@@ -1051,6 +1098,7 @@
           <w:tcPr/>
           <w:p>
             <w:pPr>
+              <w:keepNext/>
               <w:pStyle w:val="Compact"/>
             </w:pPr>
             <w:r>
@@ -1062,6 +1110,7 @@
           <w:tcPr/>
           <w:p>
             <w:pPr>
+              <w:keepNext/>
               <w:pStyle w:val="Compact"/>
             </w:pPr>
             <w:r>
@@ -1071,10 +1120,14 @@
         </w:tc>
       </w:tr>
       <w:tr>
-        <w:tc>
-          <w:tcPr/>
-          <w:p>
-            <w:pPr>
+        <w:trPr>
+          <w:cantSplit/>
+        </w:trPr>
+        <w:tc>
+          <w:tcPr/>
+          <w:p>
+            <w:pPr>
+              <w:keepNext/>
               <w:pStyle w:val="Compact"/>
             </w:pPr>
             <w:r>
@@ -1092,6 +1145,7 @@
           <w:tcPr/>
           <w:p>
             <w:pPr>
+              <w:keepNext/>
               <w:pStyle w:val="Compact"/>
             </w:pPr>
             <w:r>
@@ -1112,6 +1166,7 @@
           <w:tcPr/>
           <w:p>
             <w:pPr>
+              <w:keepNext/>
               <w:pStyle w:val="Compact"/>
             </w:pPr>
             <w:r>
@@ -1123,6 +1178,7 @@
           <w:tcPr/>
           <w:p>
             <w:pPr>
+              <w:keepNext/>
               <w:pStyle w:val="Compact"/>
             </w:pPr>
             <w:r>
@@ -1132,10 +1188,14 @@
         </w:tc>
       </w:tr>
       <w:tr>
-        <w:tc>
-          <w:tcPr/>
-          <w:p>
-            <w:pPr>
+        <w:trPr>
+          <w:cantSplit/>
+        </w:trPr>
+        <w:tc>
+          <w:tcPr/>
+          <w:p>
+            <w:pPr>
+              <w:keepNext/>
               <w:pStyle w:val="Compact"/>
             </w:pPr>
             <w:r>
@@ -1153,6 +1213,7 @@
           <w:tcPr/>
           <w:p>
             <w:pPr>
+              <w:keepNext/>
               <w:pStyle w:val="Compact"/>
             </w:pPr>
             <w:r>
@@ -1164,6 +1225,7 @@
           <w:tcPr/>
           <w:p>
             <w:pPr>
+              <w:keepNext/>
               <w:pStyle w:val="Compact"/>
             </w:pPr>
             <w:r>
@@ -1175,6 +1237,7 @@
           <w:tcPr/>
           <w:p>
             <w:pPr>
+              <w:keepNext/>
               <w:pStyle w:val="Compact"/>
             </w:pPr>
             <w:r>
@@ -1184,6 +1247,9 @@
         </w:tc>
       </w:tr>
       <w:tr>
+        <w:trPr>
+          <w:cantSplit/>
+        </w:trPr>
         <w:tc>
           <w:tcPr/>
           <w:p>
@@ -1244,8 +1310,8 @@
         <w:t xml:space="preserve">Table 2: The assessed liquids. Full source lists, modeling judgments, and limits are in each system’s provenance file in the repository.</w:t>
       </w:r>
     </w:p>
-    <w:bookmarkEnd w:id="593"/>
-    <w:bookmarkStart w:id="594" w:name="anatomy-of-a-database-file"/>
+    <w:bookmarkEnd w:id="627"/>
+    <w:bookmarkStart w:id="628" w:name="anatomy-of-a-database-file"/>
     <w:p>
       <w:pPr>
         <w:pStyle w:val="Heading3"/>
@@ -1278,8 +1344,8 @@
         <w:t xml:space="preserve">That asymmetry is the economics of the field in miniature: implementations of the published models are increasingly available, but each fitted parameter condenses dozens of measurements and decisions. Parameter sets rather than codes are therefore the scarce commodity, and an openly licensed, provenance-tracked database is the part of this contribution that cannot be regenerated from the paper alone.</w:t>
       </w:r>
     </w:p>
-    <w:bookmarkEnd w:id="594"/>
-    <w:bookmarkStart w:id="595" w:name="quality-control"/>
+    <w:bookmarkEnd w:id="628"/>
+    <w:bookmarkStart w:id="629" w:name="quality-control"/>
     <w:p>
       <w:pPr>
         <w:pStyle w:val="Heading3"/>
@@ -1334,12 +1400,14 @@
       </w:tblGrid>
       <w:tr>
         <w:trPr>
+          <w:cantSplit/>
           <w:tblHeader w:val="on"/>
         </w:trPr>
         <w:tc>
           <w:tcPr/>
           <w:p>
             <w:pPr>
+              <w:keepNext/>
               <w:pStyle w:val="Compact"/>
             </w:pPr>
             <w:r>
@@ -1351,6 +1419,7 @@
           <w:tcPr/>
           <w:p>
             <w:pPr>
+              <w:keepNext/>
               <w:pStyle w:val="Compact"/>
             </w:pPr>
             <w:r>
@@ -1362,6 +1431,7 @@
           <w:tcPr/>
           <w:p>
             <w:pPr>
+              <w:keepNext/>
               <w:pStyle w:val="Compact"/>
             </w:pPr>
             <w:r>
@@ -1371,10 +1441,14 @@
         </w:tc>
       </w:tr>
       <w:tr>
-        <w:tc>
-          <w:tcPr/>
-          <w:p>
-            <w:pPr>
+        <w:trPr>
+          <w:cantSplit/>
+        </w:trPr>
+        <w:tc>
+          <w:tcPr/>
+          <w:p>
+            <w:pPr>
+              <w:keepNext/>
               <w:pStyle w:val="Compact"/>
             </w:pPr>
             <w:r>
@@ -1386,6 +1460,7 @@
           <w:tcPr/>
           <w:p>
             <w:pPr>
+              <w:keepNext/>
               <w:pStyle w:val="Compact"/>
             </w:pPr>
             <w:r>
@@ -1397,6 +1472,7 @@
           <w:tcPr/>
           <w:p>
             <w:pPr>
+              <w:keepNext/>
               <w:pStyle w:val="Compact"/>
             </w:pPr>
             <w:r>
@@ -1418,10 +1494,14 @@
         </w:tc>
       </w:tr>
       <w:tr>
-        <w:tc>
-          <w:tcPr/>
-          <w:p>
-            <w:pPr>
+        <w:trPr>
+          <w:cantSplit/>
+        </w:trPr>
+        <w:tc>
+          <w:tcPr/>
+          <w:p>
+            <w:pPr>
+              <w:keepNext/>
               <w:pStyle w:val="Compact"/>
             </w:pPr>
             <w:r>
@@ -1433,6 +1513,7 @@
           <w:tcPr/>
           <w:p>
             <w:pPr>
+              <w:keepNext/>
               <w:pStyle w:val="Compact"/>
             </w:pPr>
             <w:r>
@@ -1444,6 +1525,7 @@
           <w:tcPr/>
           <w:p>
             <w:pPr>
+              <w:keepNext/>
               <w:pStyle w:val="Compact"/>
             </w:pPr>
             <w:r>
@@ -1453,10 +1535,14 @@
         </w:tc>
       </w:tr>
       <w:tr>
-        <w:tc>
-          <w:tcPr/>
-          <w:p>
-            <w:pPr>
+        <w:trPr>
+          <w:cantSplit/>
+        </w:trPr>
+        <w:tc>
+          <w:tcPr/>
+          <w:p>
+            <w:pPr>
+              <w:keepNext/>
               <w:pStyle w:val="Compact"/>
             </w:pPr>
             <w:r>
@@ -1468,6 +1554,7 @@
           <w:tcPr/>
           <w:p>
             <w:pPr>
+              <w:keepNext/>
               <w:pStyle w:val="Compact"/>
             </w:pPr>
             <w:r>
@@ -1479,6 +1566,7 @@
           <w:tcPr/>
           <w:p>
             <w:pPr>
+              <w:keepNext/>
               <w:pStyle w:val="Compact"/>
             </w:pPr>
             <w:r>
@@ -1488,10 +1576,14 @@
         </w:tc>
       </w:tr>
       <w:tr>
-        <w:tc>
-          <w:tcPr/>
-          <w:p>
-            <w:pPr>
+        <w:trPr>
+          <w:cantSplit/>
+        </w:trPr>
+        <w:tc>
+          <w:tcPr/>
+          <w:p>
+            <w:pPr>
+              <w:keepNext/>
               <w:pStyle w:val="Compact"/>
             </w:pPr>
             <w:r>
@@ -1503,6 +1595,7 @@
           <w:tcPr/>
           <w:p>
             <w:pPr>
+              <w:keepNext/>
               <w:pStyle w:val="Compact"/>
             </w:pPr>
             <w:r>
@@ -1514,6 +1607,7 @@
           <w:tcPr/>
           <w:p>
             <w:pPr>
+              <w:keepNext/>
               <w:pStyle w:val="Compact"/>
             </w:pPr>
             <w:r>
@@ -1523,10 +1617,14 @@
         </w:tc>
       </w:tr>
       <w:tr>
-        <w:tc>
-          <w:tcPr/>
-          <w:p>
-            <w:pPr>
+        <w:trPr>
+          <w:cantSplit/>
+        </w:trPr>
+        <w:tc>
+          <w:tcPr/>
+          <w:p>
+            <w:pPr>
+              <w:keepNext/>
               <w:pStyle w:val="Compact"/>
             </w:pPr>
             <w:r>
@@ -1538,6 +1636,7 @@
           <w:tcPr/>
           <w:p>
             <w:pPr>
+              <w:keepNext/>
               <w:pStyle w:val="Compact"/>
             </w:pPr>
             <w:r>
@@ -1549,6 +1648,7 @@
           <w:tcPr/>
           <w:p>
             <w:pPr>
+              <w:keepNext/>
               <w:pStyle w:val="Compact"/>
             </w:pPr>
             <w:r>
@@ -1558,10 +1658,14 @@
         </w:tc>
       </w:tr>
       <w:tr>
-        <w:tc>
-          <w:tcPr/>
-          <w:p>
-            <w:pPr>
+        <w:trPr>
+          <w:cantSplit/>
+        </w:trPr>
+        <w:tc>
+          <w:tcPr/>
+          <w:p>
+            <w:pPr>
+              <w:keepNext/>
               <w:pStyle w:val="Compact"/>
             </w:pPr>
             <w:r>
@@ -1573,6 +1677,7 @@
           <w:tcPr/>
           <w:p>
             <w:pPr>
+              <w:keepNext/>
               <w:pStyle w:val="Compact"/>
             </w:pPr>
             <w:r>
@@ -1584,6 +1689,7 @@
           <w:tcPr/>
           <w:p>
             <w:pPr>
+              <w:keepNext/>
               <w:pStyle w:val="Compact"/>
             </w:pPr>
             <w:r>
@@ -1605,10 +1711,14 @@
         </w:tc>
       </w:tr>
       <w:tr>
-        <w:tc>
-          <w:tcPr/>
-          <w:p>
-            <w:pPr>
+        <w:trPr>
+          <w:cantSplit/>
+        </w:trPr>
+        <w:tc>
+          <w:tcPr/>
+          <w:p>
+            <w:pPr>
+              <w:keepNext/>
               <w:pStyle w:val="Compact"/>
             </w:pPr>
             <w:r>
@@ -1620,6 +1730,7 @@
           <w:tcPr/>
           <w:p>
             <w:pPr>
+              <w:keepNext/>
               <w:pStyle w:val="Compact"/>
             </w:pPr>
             <w:r>
@@ -1631,6 +1742,7 @@
           <w:tcPr/>
           <w:p>
             <w:pPr>
+              <w:keepNext/>
               <w:pStyle w:val="Compact"/>
             </w:pPr>
             <w:r>
@@ -1649,6 +1761,9 @@
         </w:tc>
       </w:tr>
       <w:tr>
+        <w:trPr>
+          <w:cantSplit/>
+        </w:trPr>
         <w:tc>
           <w:tcPr/>
           <w:p>
@@ -1724,9 +1839,9 @@
         <w:t xml:space="preserve">invariants sit within about 40 °C, and the ternary liquidus projection reproduces the measured field topology [23]. Development practice is plain: the repository is version controlled with tagged releases (v0.1.0 through the v0.4.0 described here), the full suite runs before every release, and a fixed bug lands together with the regression test that would have caught it. The suite runs on Windows 11 under CPython 3.11 and 3.12; the browser application is exercised in Chromium- and Gecko-based browsers. A user can confirm a working installation by running pytest against the bundled test databases, or with no installation at all by opening the web application and loading the shipped ternary database.</w:t>
       </w:r>
     </w:p>
-    <w:bookmarkEnd w:id="595"/>
-    <w:bookmarkEnd w:id="596"/>
-    <w:bookmarkStart w:id="604" w:name="availability"/>
+    <w:bookmarkEnd w:id="629"/>
+    <w:bookmarkEnd w:id="630"/>
+    <w:bookmarkStart w:id="638" w:name="availability"/>
     <w:p>
       <w:pPr>
         <w:pStyle w:val="Heading2"/>
@@ -1735,7 +1850,7 @@
         <w:t xml:space="preserve">(2) Availability</w:t>
       </w:r>
     </w:p>
-    <w:bookmarkStart w:id="597" w:name="operating-system"/>
+    <w:bookmarkStart w:id="631" w:name="operating-system"/>
     <w:p>
       <w:pPr>
         <w:pStyle w:val="Heading3"/>
@@ -1752,8 +1867,8 @@
         <w:t xml:space="preserve">Platform independent. The core builds with any C99 compiler; development and testing used Windows 11. The browser application runs in any current browser with WebAssembly support.</w:t>
       </w:r>
     </w:p>
-    <w:bookmarkEnd w:id="597"/>
-    <w:bookmarkStart w:id="598" w:name="programming-language"/>
+    <w:bookmarkEnd w:id="631"/>
+    <w:bookmarkStart w:id="632" w:name="programming-language"/>
     <w:p>
       <w:pPr>
         <w:pStyle w:val="Heading3"/>
@@ -1770,8 +1885,8 @@
         <w:t xml:space="preserve">C (core), Python 3.11 or later (interface and fitting tools), JavaScript (browser application).</w:t>
       </w:r>
     </w:p>
-    <w:bookmarkEnd w:id="598"/>
-    <w:bookmarkStart w:id="599" w:name="additional-system-requirements"/>
+    <w:bookmarkEnd w:id="632"/>
+    <w:bookmarkStart w:id="633" w:name="additional-system-requirements"/>
     <w:p>
       <w:pPr>
         <w:pStyle w:val="Heading3"/>
@@ -1788,8 +1903,8 @@
         <w:t xml:space="preserve">None of note. The engine and database together are a few megabytes.</w:t>
       </w:r>
     </w:p>
-    <w:bookmarkEnd w:id="599"/>
-    <w:bookmarkStart w:id="600" w:name="dependencies"/>
+    <w:bookmarkEnd w:id="633"/>
+    <w:bookmarkStart w:id="634" w:name="dependencies"/>
     <w:p>
       <w:pPr>
         <w:pStyle w:val="Heading3"/>
@@ -1806,8 +1921,8 @@
         <w:t xml:space="preserve">Python interface: cffi, NumPy, SciPy. Validation suite additionally requires pycalphad. WebAssembly build requires emscripten. The C core and the browser application have no dependencies.</w:t>
       </w:r>
     </w:p>
-    <w:bookmarkEnd w:id="600"/>
-    <w:bookmarkStart w:id="601" w:name="list-of-contributors"/>
+    <w:bookmarkEnd w:id="634"/>
+    <w:bookmarkStart w:id="635" w:name="list-of-contributors"/>
     <w:p>
       <w:pPr>
         <w:pStyle w:val="Heading3"/>
@@ -1824,8 +1939,8 @@
         <w:t xml:space="preserve">Michael E. Bustamante (design, implementation, validation, data curation).</w:t>
       </w:r>
     </w:p>
-    <w:bookmarkEnd w:id="601"/>
-    <w:bookmarkStart w:id="602" w:name="software-location"/>
+    <w:bookmarkEnd w:id="635"/>
+    <w:bookmarkStart w:id="636" w:name="software-location"/>
     <w:p>
       <w:pPr>
         <w:pStyle w:val="Heading3"/>
@@ -1978,8 +2093,8 @@
         <w:t xml:space="preserve">Date published: 2026-09-02</w:t>
       </w:r>
     </w:p>
-    <w:bookmarkEnd w:id="602"/>
-    <w:bookmarkStart w:id="603" w:name="language"/>
+    <w:bookmarkEnd w:id="636"/>
+    <w:bookmarkStart w:id="637" w:name="language"/>
     <w:p>
       <w:pPr>
         <w:pStyle w:val="Heading3"/>
@@ -1996,9 +2111,9 @@
         <w:t xml:space="preserve">English.</w:t>
       </w:r>
     </w:p>
-    <w:bookmarkEnd w:id="603"/>
-    <w:bookmarkEnd w:id="604"/>
-    <w:bookmarkStart w:id="612" w:name="reuse-potential"/>
+    <w:bookmarkEnd w:id="637"/>
+    <w:bookmarkEnd w:id="638"/>
+    <w:bookmarkStart w:id="646" w:name="reuse-potential"/>
     <w:p>
       <w:pPr>
         <w:pStyle w:val="Heading2"/>
@@ -2023,7 +2138,7 @@
         <w:t xml:space="preserve">The browser application makes the lowest barrier the default. A lecture on slag thermodynamics, a plant metallurgist screening a composition, or a reviewer checking a claimed equilibrium can load the database and calculate in seconds, with confidential inputs never leaving the machine. The same property makes it a practical template for other groups who want to publish a model as a zero-install tool.</w:t>
       </w:r>
     </w:p>
-    <w:bookmarkStart w:id="611" w:name="worked-examples"/>
+    <w:bookmarkStart w:id="645" w:name="worked-examples"/>
     <w:p>
       <w:pPr>
         <w:pStyle w:val="Heading3"/>
@@ -2215,18 +2330,18 @@
           <wp:inline>
             <wp:extent cx="4206240" cy="3108960"/>
             <wp:effectExtent b="0" l="0" r="0" t="0"/>
-            <wp:docPr descr="Figure 4: The LiCl-KCl phase diagram computed by the salt listing from the shipped open database, on the listing’s own grid. Light to dark: liquid, two-phase, and subsolidus fields. The dot is the computed eutectic on this grid (0.400, 640 K); the star is the measured eutectic (0.415, 626 K)." title="" id="606" name="Picture"/>
+            <wp:docPr descr="Figure 4: The LiCl-KCl phase diagram computed by the salt listing from the shipped open database, on the listing’s own grid. Light to dark: liquid, two-phase, and subsolidus fields. The dot is the computed eutectic on this grid (0.400, 640 K); the star is the measured eutectic (0.415, 626 K)." title="" id="640" name="Picture"/>
             <a:graphic>
               <a:graphicData uri="http://schemas.openxmlformats.org/drawingml/2006/picture">
                 <pic:pic>
                   <pic:nvPicPr>
-                    <pic:cNvPr descr="figures/fig4_salt_example.png" id="607" name="Picture"/>
+                    <pic:cNvPr descr="figures/fig4_salt_example.png" id="641" name="Picture"/>
                     <pic:cNvPicPr>
                       <a:picLocks noChangeArrowheads="1" noChangeAspect="1"/>
                     </pic:cNvPicPr>
                   </pic:nvPicPr>
                   <pic:blipFill>
-                    <a:blip r:embed="rId605"/>
+                    <a:blip r:embed="rId639"/>
                     <a:stretch>
                       <a:fillRect/>
                     </a:stretch>
@@ -2432,18 +2547,18 @@
           <wp:inline>
             <wp:extent cx="4206240" cy="3108960"/>
             <wp:effectExtent b="0" l="0" r="0" t="0"/>
-            <wp:docPr descr="Figure 5: The Al-Zn phase diagram computed by the alloy listing from the shipped open TDB. Light to dark: liquid, liquid plus solid, and solid fields. The dot is the computed eutectic (0.890, 660 K); the star is the assessed eutectic (0.885, 654 K)." title="" id="609" name="Picture"/>
+            <wp:docPr descr="Figure 5: The Al-Zn phase diagram computed by the alloy listing from the shipped open TDB. Light to dark: liquid, liquid plus solid, and solid fields. The dot is the computed eutectic (0.890, 660 K); the star is the assessed eutectic (0.885, 654 K)." title="" id="643" name="Picture"/>
             <a:graphic>
               <a:graphicData uri="http://schemas.openxmlformats.org/drawingml/2006/picture">
                 <pic:pic>
                   <pic:nvPicPr>
-                    <pic:cNvPr descr="figures/fig5_alloy_example.png" id="610" name="Picture"/>
+                    <pic:cNvPr descr="figures/fig5_alloy_example.png" id="644" name="Picture"/>
                     <pic:cNvPicPr>
                       <a:picLocks noChangeArrowheads="1" noChangeAspect="1"/>
                     </pic:cNvPicPr>
                   </pic:nvPicPr>
                   <pic:blipFill>
-                    <a:blip r:embed="rId608"/>
+                    <a:blip r:embed="rId642"/>
                     <a:stretch>
                       <a:fillRect/>
                     </a:stretch>
@@ -2486,9 +2601,9 @@
         <w:t xml:space="preserve">The database is a starting point rather than an endpoint, and the file format rewards growth: new components, new phases, and refits against new measurements accumulate in the same database. A system is therefore extended release by release rather than rebuilt, and archived versions keep results calculated against earlier releases reproducible. Because every value carries its source and every judgment is written down, another assessor can reweight the data, swap an endmember, or extend a system without reverse-engineering anything; dbbuild turns a table of measured activities into a loadable file in a few lines. The in-browser multiphase hull already covers any loaded three-cation file and any loaded alloy TDB join, so a new system becomes a browser phase diagram the moment its file loads. Natural extensions are further oxide systems, the remaining ChemSage solution models, the ionic-liquid TDB model, and multicomponent Scheil on the same hull machinery. The repository also publishes an openly specified unified dialect (uTDB) that carries the MQMQA statements inside TDB grammar, with two shipped demonstration files chosen to be processes rather than curiosities: an aluminum-recycling database holding the Al-Zn alloy with its NaCl-KCl-MgCl2 salt flux, and a steelmaking database holding a basic Fe-C steel, magnetic phases included, with the FeO-MgO-SiO2 slag and its silicate solid solutions. Round-trip tests assert both reproduce their source-file physics at machine precision. Relative to the XML road of XTDB [15] (Table 1), uTDB is the on-ramp from the installed base, extending files as they are and running in this engine today, with mechanical conversion to XTDB elements the natural bridge once that schema settles. Making the calculator multilingual across the field’s file dialects is the direction of travel. Contributions and issues are handled through the GitHub repository.</w:t>
       </w:r>
     </w:p>
-    <w:bookmarkEnd w:id="611"/>
-    <w:bookmarkEnd w:id="612"/>
-    <w:bookmarkStart w:id="613" w:name="data-availability"/>
+    <w:bookmarkEnd w:id="645"/>
+    <w:bookmarkEnd w:id="646"/>
+    <w:bookmarkStart w:id="647" w:name="data-availability"/>
     <w:p>
       <w:pPr>
         <w:pStyle w:val="Heading2"/>
@@ -2505,8 +2620,8 @@
         <w:t xml:space="preserve">The engine, the database, the browser application, and the validation suite are openly available in the code repository listed above; the version described here is archived as release v0.4.0. The database files and their provenance records are in the repository’s data directory under CC BY 4.0.</w:t>
       </w:r>
     </w:p>
-    <w:bookmarkEnd w:id="613"/>
-    <w:bookmarkStart w:id="614" w:name="acknowledgements"/>
+    <w:bookmarkEnd w:id="647"/>
+    <w:bookmarkStart w:id="648" w:name="acknowledgements"/>
     <w:p>
       <w:pPr>
         <w:pStyle w:val="Heading2"/>
@@ -2523,8 +2638,8 @@
         <w:t xml:space="preserve">During the development of this software the author used Claude Code (Anthropic) to assist with implementation, validation scripting, and manuscript preparation. This assistance was agentic, not autonomous: it operated under author direction and supervision at every step and was never a closed loop that produced or accepted results without review. Every parameter was traced by the author to its primary source before entering the database, and every reference was verified against its registry record. The author reviewed and approved all output and takes full responsibility for this article.</w:t>
       </w:r>
     </w:p>
-    <w:bookmarkEnd w:id="614"/>
-    <w:bookmarkStart w:id="615" w:name="funding-statement"/>
+    <w:bookmarkEnd w:id="648"/>
+    <w:bookmarkStart w:id="649" w:name="funding-statement"/>
     <w:p>
       <w:pPr>
         <w:pStyle w:val="Heading2"/>
@@ -2541,8 +2656,8 @@
         <w:t xml:space="preserve">The development of this software received no external funding.</w:t>
       </w:r>
     </w:p>
-    <w:bookmarkEnd w:id="615"/>
-    <w:bookmarkStart w:id="616" w:name="competing-interests"/>
+    <w:bookmarkEnd w:id="649"/>
+    <w:bookmarkStart w:id="650" w:name="competing-interests"/>
     <w:p>
       <w:pPr>
         <w:pStyle w:val="Heading2"/>
@@ -2559,8 +2674,8 @@
         <w:t xml:space="preserve">The author founded Odinzen LLC, which provides commercial thermodynamic modeling services, and declares this as a competing interest. The software and database published here are released in full under open licenses, and no proprietary Odinzen assets are included.</w:t>
       </w:r>
     </w:p>
-    <w:bookmarkEnd w:id="616"/>
-    <w:bookmarkStart w:id="617" w:name="references"/>
+    <w:bookmarkEnd w:id="650"/>
+    <w:bookmarkStart w:id="651" w:name="references"/>
     <w:p>
       <w:pPr>
         <w:pStyle w:val="Heading2"/>
@@ -2861,8 +2976,8 @@
         <w:t xml:space="preserve">[35] Dinsdale AT. SGTE data for pure elements. Calphad. 1991 Oct;15(4):317-425. doi:10.1016/0364-5916(91)90030-N</w:t>
       </w:r>
     </w:p>
-    <w:bookmarkEnd w:id="617"/>
-    <w:bookmarkEnd w:id="618"/>
+    <w:bookmarkEnd w:id="651"/>
+    <w:bookmarkEnd w:id="652"/>
     <w:sectPr>
       <w:footnotePr>
         <w:numRestart w:val="eachSect"/>

</xml_diff>

<commit_message>
Split the overloaded non-coder passage into plain sentences
Co-Authored-By: Claude Fable 5 <noreply@anthropic.com>
</commit_message>
<xml_diff>
--- a/paper/Bustamante_Hephaestus_JORS_manuscript.docx
+++ b/paper/Bustamante_Hephaestus_JORS_manuscript.docx
@@ -2,7 +2,7 @@
 <file path=word/document.xml><?xml version="1.0" encoding="utf-8"?>
 <w:document xmlns:w="http://schemas.openxmlformats.org/wordprocessingml/2006/main" xmlns:m="http://schemas.openxmlformats.org/officeDocument/2006/math" xmlns:r="http://schemas.openxmlformats.org/officeDocument/2006/relationships" xmlns:o="urn:schemas-microsoft-com:office:office" xmlns:v="urn:schemas-microsoft-com:vml" xmlns:w10="urn:schemas-microsoft-com:office:word" xmlns:a="http://schemas.openxmlformats.org/drawingml/2006/main" xmlns:pic="http://schemas.openxmlformats.org/drawingml/2006/picture" xmlns:wp="http://schemas.openxmlformats.org/drawingml/2006/wordprocessingDrawing">
   <w:body>
-    <w:bookmarkStart w:id="652" w:name="X4855b1162e70238fd839d871e0792397dc58430"/>
+    <w:bookmarkStart w:id="686" w:name="X4855b1162e70238fd839d871e0792397dc58430"/>
     <w:p>
       <w:pPr>
         <w:pStyle w:val="Heading1"/>
@@ -159,7 +159,7 @@
         <w:t xml:space="preserve">CALPHAD; molten slag; molten salt; modified quasichemical model; thermodynamic database; phase diagram; WebAssembly; open data</w:t>
       </w:r>
     </w:p>
-    <w:bookmarkStart w:id="630" w:name="overview"/>
+    <w:bookmarkStart w:id="664" w:name="overview"/>
     <w:p>
       <w:pPr>
         <w:pStyle w:val="Heading2"/>
@@ -168,7 +168,7 @@
         <w:t xml:space="preserve">(1) Overview</w:t>
       </w:r>
     </w:p>
-    <w:bookmarkStart w:id="617" w:name="introduction"/>
+    <w:bookmarkStart w:id="651" w:name="introduction"/>
     <w:p>
       <w:pPr>
         <w:pStyle w:val="Heading3"/>
@@ -524,11 +524,11 @@
         <w:pStyle w:val="BodyText"/>
       </w:pPr>
       <w:r>
-        <w:t xml:space="preserve">Hephaestus is a deliberate response to that gap, and it treats the engine and the data as one contribution because neither is useful alone. The engine is small on purpose. Its core is plain C with no dependencies, which makes it easy to embed and lets the identical code compile to WebAssembly, so the full calculator runs in a web browser with nothing installed and no data leaving the user’s machine. The database is open on purpose. Every parameter in it derives from published measurements, each value carries its provenance down to table and page, and the known shortcomings are documented next to the numbers they affect. The present work describes both, their validation against pycalphad and against measured phase equilibria, and the ways they can be reused. None of it asks the reader to program. For the experimentalist who never writes code, the browser application is the entire product, a page to open, a database to click, and a diagram to read; the sections that follow describe the machinery underneath for those who want it, and Supplementary Material S1 is a plain-language primer provided so that the non-programmer can learn enough to use the tool, starting at what a database file even is and ending at a first calculation and how to read it. Its closing section teaches what an assessment is built from, so a reader who wants to learn the craft and contribute data for open publication, or to arrive prepared to a first conversation about a commissioned file, knows beforehand exactly what is needed.</w:t>
-      </w:r>
-    </w:p>
-    <w:bookmarkEnd w:id="617"/>
-    <w:bookmarkStart w:id="627" w:name="implementation-and-architecture"/>
+        <w:t xml:space="preserve">Hephaestus is a deliberate response to that gap, and it treats the engine and the data as one contribution because neither is useful alone. The engine is small on purpose. Its core is plain C with no dependencies, which makes it easy to embed and lets the identical code compile to WebAssembly, so the full calculator runs in a web browser with nothing installed and no data leaving the user’s machine. The database is open on purpose. Every parameter in it derives from published measurements, each value carries its provenance down to table and page, and the known shortcomings are documented next to the numbers they affect. The present work describes both, their validation against pycalphad and against measured phase equilibria, and the ways they can be reused. None of it asks the reader to program. For the experimentalist who never writes code, the browser application is the entire product: a page to open, a database to click, and a diagram to read. The sections that follow describe the machinery underneath for those who want it. Supplementary Material S1 is a plain-language primer for the non-programmer, starting at what a database file is and ending at a first calculation and how to read it. Its closing section teaches what an assessment is built from, so a reader who wants to contribute data for open publication, or to commission a file, arrives knowing what is needed.</w:t>
+      </w:r>
+    </w:p>
+    <w:bookmarkEnd w:id="651"/>
+    <w:bookmarkStart w:id="661" w:name="implementation-and-architecture"/>
     <w:p>
       <w:pPr>
         <w:pStyle w:val="Heading3"/>
@@ -554,18 +554,18 @@
           <wp:inline>
             <wp:extent cx="5334000" cy="3497491"/>
             <wp:effectExtent b="0" l="0" r="0" t="0"/>
-            <wp:docPr descr="Figure 1: Architecture of Hephaestus. A single dependency-free C core reads ChemSage-format files and computes all thermodynamics; the same core is used as a native library, from Python through cffi, and compiled to WebAssembly behind the browser application. dbbuild writes new ChemSage files from measured data, and every energy path is validated against pycalphad." title="" id="619" name="Picture"/>
+            <wp:docPr descr="Figure 1: Architecture of Hephaestus. A single dependency-free C core reads ChemSage-format files and computes all thermodynamics; the same core is used as a native library, from Python through cffi, and compiled to WebAssembly behind the browser application. dbbuild writes new ChemSage files from measured data, and every energy path is validated against pycalphad." title="" id="653" name="Picture"/>
             <a:graphic>
               <a:graphicData uri="http://schemas.openxmlformats.org/drawingml/2006/picture">
                 <pic:pic>
                   <pic:nvPicPr>
-                    <pic:cNvPr descr="figures/fig1_architecture.png" id="620" name="Picture"/>
+                    <pic:cNvPr descr="figures/fig1_architecture.png" id="654" name="Picture"/>
                     <pic:cNvPicPr>
                       <a:picLocks noChangeArrowheads="1" noChangeAspect="1"/>
                     </pic:cNvPicPr>
                   </pic:nvPicPr>
                   <pic:blipFill>
-                    <a:blip r:embed="rId618"/>
+                    <a:blip r:embed="rId652"/>
                     <a:stretch>
                       <a:fillRect/>
                     </a:stretch>
@@ -752,18 +752,18 @@
           <wp:inline>
             <wp:extent cx="4754880" cy="4464799"/>
             <wp:effectExtent b="0" l="0" r="0" t="0"/>
-            <wp:docPr descr="Figure 2: The live solver in the browser application (light theme). The user loads the shipped database, picks a temperature, and presses Compute; the WebAssembly engine then solves the full FeO-MgO-SiO2 phase assemblage client side (here 1023 composition samples and 512 tie-facets in under half a second). Tapping a composition reads its stable phases and pins it to a comparison list; hovering previews on desktop." title="" id="622" name="Picture"/>
+            <wp:docPr descr="Figure 2: The live solver in the browser application (light theme). The user loads the shipped database, picks a temperature, and presses Compute; the WebAssembly engine then solves the full FeO-MgO-SiO2 phase assemblage client side (here 1023 composition samples and 512 tie-facets in under half a second). Tapping a composition reads its stable phases and pins it to a comparison list; hovering previews on desktop." title="" id="656" name="Picture"/>
             <a:graphic>
               <a:graphicData uri="http://schemas.openxmlformats.org/drawingml/2006/picture">
                 <pic:pic>
                   <pic:nvPicPr>
-                    <pic:cNvPr descr="figures/fig2_browser_app.png" id="623" name="Picture"/>
+                    <pic:cNvPr descr="figures/fig2_browser_app.png" id="657" name="Picture"/>
                     <pic:cNvPicPr>
                       <a:picLocks noChangeArrowheads="1" noChangeAspect="1"/>
                     </pic:cNvPicPr>
                   </pic:nvPicPr>
                   <pic:blipFill>
-                    <a:blip r:embed="rId621"/>
+                    <a:blip r:embed="rId655"/>
                     <a:stretch>
                       <a:fillRect/>
                     </a:stretch>
@@ -929,18 +929,18 @@
           <wp:inline>
             <wp:extent cx="5334000" cy="2416336"/>
             <wp:effectExtent b="0" l="0" r="0" t="0"/>
-            <wp:docPr descr="Figure 3: The assessed FeO-MgO-SiO2 system calculated from the shipped database files. (a) Liquidus projection: primary crystallizing phase fields, with liquidus isotherms labeled in °C. (b) Isothermal section at 1600 °C: stable phase assemblages, shaded by the number of solid phases present. Phase labels: L liquid, Crs cristobalite, Ol olivine, Opx orthopyroxene, Per periclase, Wus wustite." title="" id="625" name="Picture"/>
+            <wp:docPr descr="Figure 3: The assessed FeO-MgO-SiO2 system calculated from the shipped database files. (a) Liquidus projection: primary crystallizing phase fields, with liquidus isotherms labeled in °C. (b) Isothermal section at 1600 °C: stable phase assemblages, shaded by the number of solid phases present. Phase labels: L liquid, Crs cristobalite, Ol olivine, Opx orthopyroxene, Per periclase, Wus wustite." title="" id="659" name="Picture"/>
             <a:graphic>
               <a:graphicData uri="http://schemas.openxmlformats.org/drawingml/2006/picture">
                 <pic:pic>
                   <pic:nvPicPr>
-                    <pic:cNvPr descr="figures/fig3_ternary.png" id="626" name="Picture"/>
+                    <pic:cNvPr descr="figures/fig3_ternary.png" id="660" name="Picture"/>
                     <pic:cNvPicPr>
                       <a:picLocks noChangeArrowheads="1" noChangeAspect="1"/>
                     </pic:cNvPicPr>
                   </pic:nvPicPr>
                   <pic:blipFill>
-                    <a:blip r:embed="rId624"/>
+                    <a:blip r:embed="rId658"/>
                     <a:stretch>
                       <a:fillRect/>
                     </a:stretch>
@@ -1310,8 +1310,8 @@
         <w:t xml:space="preserve">Table 2: The assessed liquids. Full source lists, modeling judgments, and limits are in each system’s provenance file in the repository.</w:t>
       </w:r>
     </w:p>
-    <w:bookmarkEnd w:id="627"/>
-    <w:bookmarkStart w:id="628" w:name="anatomy-of-a-database-file"/>
+    <w:bookmarkEnd w:id="661"/>
+    <w:bookmarkStart w:id="662" w:name="anatomy-of-a-database-file"/>
     <w:p>
       <w:pPr>
         <w:pStyle w:val="Heading3"/>
@@ -1344,8 +1344,8 @@
         <w:t xml:space="preserve">That asymmetry is the economics of the field in miniature: implementations of the published models are increasingly available, but each fitted parameter condenses dozens of measurements and decisions. Parameter sets rather than codes are therefore the scarce commodity, and an openly licensed, provenance-tracked database is the part of this contribution that cannot be regenerated from the paper alone.</w:t>
       </w:r>
     </w:p>
-    <w:bookmarkEnd w:id="628"/>
-    <w:bookmarkStart w:id="629" w:name="quality-control"/>
+    <w:bookmarkEnd w:id="662"/>
+    <w:bookmarkStart w:id="663" w:name="quality-control"/>
     <w:p>
       <w:pPr>
         <w:pStyle w:val="Heading3"/>
@@ -1839,9 +1839,9 @@
         <w:t xml:space="preserve">invariants sit within about 40 °C, and the ternary liquidus projection reproduces the measured field topology [23]. Development practice is plain: the repository is version controlled with tagged releases (v0.1.0 through the v0.4.0 described here), the full suite runs before every release, and a fixed bug lands together with the regression test that would have caught it. The suite runs on Windows 11 under CPython 3.11 and 3.12; the browser application is exercised in Chromium- and Gecko-based browsers. A user can confirm a working installation by running pytest against the bundled test databases, or with no installation at all by opening the web application and loading the shipped ternary database.</w:t>
       </w:r>
     </w:p>
-    <w:bookmarkEnd w:id="629"/>
-    <w:bookmarkEnd w:id="630"/>
-    <w:bookmarkStart w:id="638" w:name="availability"/>
+    <w:bookmarkEnd w:id="663"/>
+    <w:bookmarkEnd w:id="664"/>
+    <w:bookmarkStart w:id="672" w:name="availability"/>
     <w:p>
       <w:pPr>
         <w:pStyle w:val="Heading2"/>
@@ -1850,7 +1850,7 @@
         <w:t xml:space="preserve">(2) Availability</w:t>
       </w:r>
     </w:p>
-    <w:bookmarkStart w:id="631" w:name="operating-system"/>
+    <w:bookmarkStart w:id="665" w:name="operating-system"/>
     <w:p>
       <w:pPr>
         <w:pStyle w:val="Heading3"/>
@@ -1867,8 +1867,8 @@
         <w:t xml:space="preserve">Platform independent. The core builds with any C99 compiler; development and testing used Windows 11. The browser application runs in any current browser with WebAssembly support.</w:t>
       </w:r>
     </w:p>
-    <w:bookmarkEnd w:id="631"/>
-    <w:bookmarkStart w:id="632" w:name="programming-language"/>
+    <w:bookmarkEnd w:id="665"/>
+    <w:bookmarkStart w:id="666" w:name="programming-language"/>
     <w:p>
       <w:pPr>
         <w:pStyle w:val="Heading3"/>
@@ -1885,8 +1885,8 @@
         <w:t xml:space="preserve">C (core), Python 3.11 or later (interface and fitting tools), JavaScript (browser application).</w:t>
       </w:r>
     </w:p>
-    <w:bookmarkEnd w:id="632"/>
-    <w:bookmarkStart w:id="633" w:name="additional-system-requirements"/>
+    <w:bookmarkEnd w:id="666"/>
+    <w:bookmarkStart w:id="667" w:name="additional-system-requirements"/>
     <w:p>
       <w:pPr>
         <w:pStyle w:val="Heading3"/>
@@ -1903,8 +1903,8 @@
         <w:t xml:space="preserve">None of note. The engine and database together are a few megabytes.</w:t>
       </w:r>
     </w:p>
-    <w:bookmarkEnd w:id="633"/>
-    <w:bookmarkStart w:id="634" w:name="dependencies"/>
+    <w:bookmarkEnd w:id="667"/>
+    <w:bookmarkStart w:id="668" w:name="dependencies"/>
     <w:p>
       <w:pPr>
         <w:pStyle w:val="Heading3"/>
@@ -1921,8 +1921,8 @@
         <w:t xml:space="preserve">Python interface: cffi, NumPy, SciPy. Validation suite additionally requires pycalphad. WebAssembly build requires emscripten. The C core and the browser application have no dependencies.</w:t>
       </w:r>
     </w:p>
-    <w:bookmarkEnd w:id="634"/>
-    <w:bookmarkStart w:id="635" w:name="list-of-contributors"/>
+    <w:bookmarkEnd w:id="668"/>
+    <w:bookmarkStart w:id="669" w:name="list-of-contributors"/>
     <w:p>
       <w:pPr>
         <w:pStyle w:val="Heading3"/>
@@ -1939,8 +1939,8 @@
         <w:t xml:space="preserve">Michael E. Bustamante (design, implementation, validation, data curation).</w:t>
       </w:r>
     </w:p>
-    <w:bookmarkEnd w:id="635"/>
-    <w:bookmarkStart w:id="636" w:name="software-location"/>
+    <w:bookmarkEnd w:id="669"/>
+    <w:bookmarkStart w:id="670" w:name="software-location"/>
     <w:p>
       <w:pPr>
         <w:pStyle w:val="Heading3"/>
@@ -2093,8 +2093,8 @@
         <w:t xml:space="preserve">Date published: 2026-09-02</w:t>
       </w:r>
     </w:p>
-    <w:bookmarkEnd w:id="636"/>
-    <w:bookmarkStart w:id="637" w:name="language"/>
+    <w:bookmarkEnd w:id="670"/>
+    <w:bookmarkStart w:id="671" w:name="language"/>
     <w:p>
       <w:pPr>
         <w:pStyle w:val="Heading3"/>
@@ -2111,9 +2111,9 @@
         <w:t xml:space="preserve">English.</w:t>
       </w:r>
     </w:p>
-    <w:bookmarkEnd w:id="637"/>
-    <w:bookmarkEnd w:id="638"/>
-    <w:bookmarkStart w:id="646" w:name="reuse-potential"/>
+    <w:bookmarkEnd w:id="671"/>
+    <w:bookmarkEnd w:id="672"/>
+    <w:bookmarkStart w:id="680" w:name="reuse-potential"/>
     <w:p>
       <w:pPr>
         <w:pStyle w:val="Heading2"/>
@@ -2138,7 +2138,7 @@
         <w:t xml:space="preserve">The browser application makes the lowest barrier the default. A lecture on slag thermodynamics, a plant metallurgist screening a composition, or a reviewer checking a claimed equilibrium can load the database and calculate in seconds, with confidential inputs never leaving the machine. The same property makes it a practical template for other groups who want to publish a model as a zero-install tool.</w:t>
       </w:r>
     </w:p>
-    <w:bookmarkStart w:id="645" w:name="worked-examples"/>
+    <w:bookmarkStart w:id="679" w:name="worked-examples"/>
     <w:p>
       <w:pPr>
         <w:pStyle w:val="Heading3"/>
@@ -2330,18 +2330,18 @@
           <wp:inline>
             <wp:extent cx="4206240" cy="3108960"/>
             <wp:effectExtent b="0" l="0" r="0" t="0"/>
-            <wp:docPr descr="Figure 4: The LiCl-KCl phase diagram computed by the salt listing from the shipped open database, on the listing’s own grid. Light to dark: liquid, two-phase, and subsolidus fields. The dot is the computed eutectic on this grid (0.400, 640 K); the star is the measured eutectic (0.415, 626 K)." title="" id="640" name="Picture"/>
+            <wp:docPr descr="Figure 4: The LiCl-KCl phase diagram computed by the salt listing from the shipped open database, on the listing’s own grid. Light to dark: liquid, two-phase, and subsolidus fields. The dot is the computed eutectic on this grid (0.400, 640 K); the star is the measured eutectic (0.415, 626 K)." title="" id="674" name="Picture"/>
             <a:graphic>
               <a:graphicData uri="http://schemas.openxmlformats.org/drawingml/2006/picture">
                 <pic:pic>
                   <pic:nvPicPr>
-                    <pic:cNvPr descr="figures/fig4_salt_example.png" id="641" name="Picture"/>
+                    <pic:cNvPr descr="figures/fig4_salt_example.png" id="675" name="Picture"/>
                     <pic:cNvPicPr>
                       <a:picLocks noChangeArrowheads="1" noChangeAspect="1"/>
                     </pic:cNvPicPr>
                   </pic:nvPicPr>
                   <pic:blipFill>
-                    <a:blip r:embed="rId639"/>
+                    <a:blip r:embed="rId673"/>
                     <a:stretch>
                       <a:fillRect/>
                     </a:stretch>
@@ -2547,18 +2547,18 @@
           <wp:inline>
             <wp:extent cx="4206240" cy="3108960"/>
             <wp:effectExtent b="0" l="0" r="0" t="0"/>
-            <wp:docPr descr="Figure 5: The Al-Zn phase diagram computed by the alloy listing from the shipped open TDB. Light to dark: liquid, liquid plus solid, and solid fields. The dot is the computed eutectic (0.890, 660 K); the star is the assessed eutectic (0.885, 654 K)." title="" id="643" name="Picture"/>
+            <wp:docPr descr="Figure 5: The Al-Zn phase diagram computed by the alloy listing from the shipped open TDB. Light to dark: liquid, liquid plus solid, and solid fields. The dot is the computed eutectic (0.890, 660 K); the star is the assessed eutectic (0.885, 654 K)." title="" id="677" name="Picture"/>
             <a:graphic>
               <a:graphicData uri="http://schemas.openxmlformats.org/drawingml/2006/picture">
                 <pic:pic>
                   <pic:nvPicPr>
-                    <pic:cNvPr descr="figures/fig5_alloy_example.png" id="644" name="Picture"/>
+                    <pic:cNvPr descr="figures/fig5_alloy_example.png" id="678" name="Picture"/>
                     <pic:cNvPicPr>
                       <a:picLocks noChangeArrowheads="1" noChangeAspect="1"/>
                     </pic:cNvPicPr>
                   </pic:nvPicPr>
                   <pic:blipFill>
-                    <a:blip r:embed="rId642"/>
+                    <a:blip r:embed="rId676"/>
                     <a:stretch>
                       <a:fillRect/>
                     </a:stretch>
@@ -2601,9 +2601,9 @@
         <w:t xml:space="preserve">The database is a starting point rather than an endpoint, and the file format rewards growth: new components, new phases, and refits against new measurements accumulate in the same database. A system is therefore extended release by release rather than rebuilt, and archived versions keep results calculated against earlier releases reproducible. Because every value carries its source and every judgment is written down, another assessor can reweight the data, swap an endmember, or extend a system without reverse-engineering anything; dbbuild turns a table of measured activities into a loadable file in a few lines. The in-browser multiphase hull already covers any loaded three-cation file and any loaded alloy TDB join, so a new system becomes a browser phase diagram the moment its file loads. Natural extensions are further oxide systems, the remaining ChemSage solution models, the ionic-liquid TDB model, and multicomponent Scheil on the same hull machinery. The repository also publishes an openly specified unified dialect (uTDB) that carries the MQMQA statements inside TDB grammar, with two shipped demonstration files chosen to be processes rather than curiosities: an aluminum-recycling database holding the Al-Zn alloy with its NaCl-KCl-MgCl2 salt flux, and a steelmaking database holding a basic Fe-C steel, magnetic phases included, with the FeO-MgO-SiO2 slag and its silicate solid solutions. Round-trip tests assert both reproduce their source-file physics at machine precision. Relative to the XML road of XTDB [15] (Table 1), uTDB is the on-ramp from the installed base, extending files as they are and running in this engine today, with mechanical conversion to XTDB elements the natural bridge once that schema settles. Making the calculator multilingual across the field’s file dialects is the direction of travel. Contributions and issues are handled through the GitHub repository.</w:t>
       </w:r>
     </w:p>
-    <w:bookmarkEnd w:id="645"/>
-    <w:bookmarkEnd w:id="646"/>
-    <w:bookmarkStart w:id="647" w:name="data-availability"/>
+    <w:bookmarkEnd w:id="679"/>
+    <w:bookmarkEnd w:id="680"/>
+    <w:bookmarkStart w:id="681" w:name="data-availability"/>
     <w:p>
       <w:pPr>
         <w:pStyle w:val="Heading2"/>
@@ -2620,8 +2620,8 @@
         <w:t xml:space="preserve">The engine, the database, the browser application, and the validation suite are openly available in the code repository listed above; the version described here is archived as release v0.4.0. The database files and their provenance records are in the repository’s data directory under CC BY 4.0.</w:t>
       </w:r>
     </w:p>
-    <w:bookmarkEnd w:id="647"/>
-    <w:bookmarkStart w:id="648" w:name="acknowledgements"/>
+    <w:bookmarkEnd w:id="681"/>
+    <w:bookmarkStart w:id="682" w:name="acknowledgements"/>
     <w:p>
       <w:pPr>
         <w:pStyle w:val="Heading2"/>
@@ -2638,8 +2638,8 @@
         <w:t xml:space="preserve">During the development of this software the author used Claude Code (Anthropic) to assist with implementation, validation scripting, and manuscript preparation. This assistance was agentic, not autonomous: it operated under author direction and supervision at every step and was never a closed loop that produced or accepted results without review. Every parameter was traced by the author to its primary source before entering the database, and every reference was verified against its registry record. The author reviewed and approved all output and takes full responsibility for this article.</w:t>
       </w:r>
     </w:p>
-    <w:bookmarkEnd w:id="648"/>
-    <w:bookmarkStart w:id="649" w:name="funding-statement"/>
+    <w:bookmarkEnd w:id="682"/>
+    <w:bookmarkStart w:id="683" w:name="funding-statement"/>
     <w:p>
       <w:pPr>
         <w:pStyle w:val="Heading2"/>
@@ -2656,8 +2656,8 @@
         <w:t xml:space="preserve">The development of this software received no external funding.</w:t>
       </w:r>
     </w:p>
-    <w:bookmarkEnd w:id="649"/>
-    <w:bookmarkStart w:id="650" w:name="competing-interests"/>
+    <w:bookmarkEnd w:id="683"/>
+    <w:bookmarkStart w:id="684" w:name="competing-interests"/>
     <w:p>
       <w:pPr>
         <w:pStyle w:val="Heading2"/>
@@ -2674,8 +2674,8 @@
         <w:t xml:space="preserve">The author founded Odinzen LLC, which provides commercial thermodynamic modeling services, and declares this as a competing interest. The software and database published here are released in full under open licenses, and no proprietary Odinzen assets are included.</w:t>
       </w:r>
     </w:p>
-    <w:bookmarkEnd w:id="650"/>
-    <w:bookmarkStart w:id="651" w:name="references"/>
+    <w:bookmarkEnd w:id="684"/>
+    <w:bookmarkStart w:id="685" w:name="references"/>
     <w:p>
       <w:pPr>
         <w:pStyle w:val="Heading2"/>
@@ -2976,8 +2976,8 @@
         <w:t xml:space="preserve">[35] Dinsdale AT. SGTE data for pure elements. Calphad. 1991 Oct;15(4):317-425. doi:10.1016/0364-5916(91)90030-N</w:t>
       </w:r>
     </w:p>
-    <w:bookmarkEnd w:id="651"/>
-    <w:bookmarkEnd w:id="652"/>
+    <w:bookmarkEnd w:id="685"/>
+    <w:bookmarkEnd w:id="686"/>
     <w:sectPr>
       <w:footnotePr>
         <w:numRestart w:val="eachSect"/>

</xml_diff>

<commit_message>
Figure 1 and its caption current: three-dialect reader and magnetic model in the architecture diagram, generator script kept in the repo
Co-Authored-By: Claude Fable 5 <noreply@anthropic.com>
</commit_message>
<xml_diff>
--- a/paper/Bustamante_Hephaestus_JORS_manuscript.docx
+++ b/paper/Bustamante_Hephaestus_JORS_manuscript.docx
@@ -2,7 +2,7 @@
 <file path=word/document.xml><?xml version="1.0" encoding="utf-8"?>
 <w:document xmlns:w="http://schemas.openxmlformats.org/wordprocessingml/2006/main" xmlns:m="http://schemas.openxmlformats.org/officeDocument/2006/math" xmlns:r="http://schemas.openxmlformats.org/officeDocument/2006/relationships" xmlns:o="urn:schemas-microsoft-com:office:office" xmlns:v="urn:schemas-microsoft-com:vml" xmlns:w10="urn:schemas-microsoft-com:office:word" xmlns:a="http://schemas.openxmlformats.org/drawingml/2006/main" xmlns:pic="http://schemas.openxmlformats.org/drawingml/2006/picture" xmlns:wp="http://schemas.openxmlformats.org/drawingml/2006/wordprocessingDrawing">
   <w:body>
-    <w:bookmarkStart w:id="686" w:name="X4855b1162e70238fd839d871e0792397dc58430"/>
+    <w:bookmarkStart w:id="720" w:name="X4855b1162e70238fd839d871e0792397dc58430"/>
     <w:p>
       <w:pPr>
         <w:pStyle w:val="Heading1"/>
@@ -159,7 +159,7 @@
         <w:t xml:space="preserve">CALPHAD; molten slag; molten salt; modified quasichemical model; thermodynamic database; phase diagram; WebAssembly; open data</w:t>
       </w:r>
     </w:p>
-    <w:bookmarkStart w:id="664" w:name="overview"/>
+    <w:bookmarkStart w:id="698" w:name="overview"/>
     <w:p>
       <w:pPr>
         <w:pStyle w:val="Heading2"/>
@@ -168,7 +168,7 @@
         <w:t xml:space="preserve">(1) Overview</w:t>
       </w:r>
     </w:p>
-    <w:bookmarkStart w:id="651" w:name="introduction"/>
+    <w:bookmarkStart w:id="685" w:name="introduction"/>
     <w:p>
       <w:pPr>
         <w:pStyle w:val="Heading3"/>
@@ -527,8 +527,8 @@
         <w:t xml:space="preserve">Hephaestus is a deliberate response to that gap, and it treats the engine and the data as one contribution because neither is useful alone. The engine is small on purpose. Its core is plain C with no dependencies, which makes it easy to embed and lets the identical code compile to WebAssembly, so the full calculator runs in a web browser with nothing installed and no data leaving the user’s machine. The database is open on purpose. Every parameter in it derives from published measurements, each value carries its provenance down to table and page, and the known shortcomings are documented next to the numbers they affect. The present work describes both, their validation against pycalphad and against measured phase equilibria, and the ways they can be reused. None of it asks the reader to program. For the experimentalist who never writes code, the browser application is the entire product: a page to open, a database to click, and a diagram to read. The sections that follow describe the machinery underneath for those who want it. Supplementary Material S1 is a plain-language primer for the non-programmer, starting at what a database file is and ending at a first calculation and how to read it. Its closing section teaches what an assessment is built from, so a reader who wants to contribute data for open publication, or to commission a file, arrives knowing what is needed.</w:t>
       </w:r>
     </w:p>
-    <w:bookmarkEnd w:id="651"/>
-    <w:bookmarkStart w:id="661" w:name="implementation-and-architecture"/>
+    <w:bookmarkEnd w:id="685"/>
+    <w:bookmarkStart w:id="695" w:name="implementation-and-architecture"/>
     <w:p>
       <w:pPr>
         <w:pStyle w:val="Heading3"/>
@@ -552,20 +552,20 @@
       <w:r>
         <w:drawing>
           <wp:inline>
-            <wp:extent cx="5334000" cy="3497491"/>
+            <wp:extent cx="5334000" cy="3511838"/>
             <wp:effectExtent b="0" l="0" r="0" t="0"/>
-            <wp:docPr descr="Figure 1: Architecture of Hephaestus. A single dependency-free C core reads ChemSage-format files and computes all thermodynamics; the same core is used as a native library, from Python through cffi, and compiled to WebAssembly behind the browser application. dbbuild writes new ChemSage files from measured data, and every energy path is validated against pycalphad." title="" id="653" name="Picture"/>
+            <wp:docPr descr="Figure 1: Architecture of Hephaestus. A single dependency-free C core reads the field’s three database dialects (ChemSage .dat, Thermo-Calc .tdb with the Inden magnetic model, and the unified .utdb) and computes all thermodynamics; the same core is used as a native library, from Python through cffi, and compiled to WebAssembly behind the browser application. dbbuild writes new ChemSage files from measured data, and every energy path is validated against pycalphad." title="" id="687" name="Picture"/>
             <a:graphic>
               <a:graphicData uri="http://schemas.openxmlformats.org/drawingml/2006/picture">
                 <pic:pic>
                   <pic:nvPicPr>
-                    <pic:cNvPr descr="figures/fig1_architecture.png" id="654" name="Picture"/>
+                    <pic:cNvPr descr="figures/fig1_architecture.png" id="688" name="Picture"/>
                     <pic:cNvPicPr>
                       <a:picLocks noChangeArrowheads="1" noChangeAspect="1"/>
                     </pic:cNvPicPr>
                   </pic:nvPicPr>
                   <pic:blipFill>
-                    <a:blip r:embed="rId652"/>
+                    <a:blip r:embed="rId686"/>
                     <a:stretch>
                       <a:fillRect/>
                     </a:stretch>
@@ -573,7 +573,7 @@
                   <pic:spPr bwMode="auto">
                     <a:xfrm>
                       <a:off x="0" y="0"/>
-                      <a:ext cx="5334000" cy="3497491"/>
+                      <a:ext cx="5334000" cy="3511838"/>
                     </a:xfrm>
                     <a:prstGeom prst="rect">
                       <a:avLst/>
@@ -597,7 +597,7 @@
         <w:pStyle w:val="ImageCaption"/>
       </w:pPr>
       <w:r>
-        <w:t xml:space="preserve">Figure 1: Architecture of Hephaestus. A single dependency-free C core reads ChemSage-format files and computes all thermodynamics; the same core is used as a native library, from Python through cffi, and compiled to WebAssembly behind the browser application. dbbuild writes new ChemSage files from measured data, and every energy path is validated against pycalphad.</w:t>
+        <w:t xml:space="preserve">Figure 1: Architecture of Hephaestus. A single dependency-free C core reads the field’s three database dialects (ChemSage .dat, Thermo-Calc .tdb with the Inden magnetic model, and the unified .utdb) and computes all thermodynamics; the same core is used as a native library, from Python through cffi, and compiled to WebAssembly behind the browser application. dbbuild writes new ChemSage files from measured data, and every energy path is validated against pycalphad.</w:t>
       </w:r>
     </w:p>
     <w:p>
@@ -752,18 +752,18 @@
           <wp:inline>
             <wp:extent cx="4754880" cy="4464799"/>
             <wp:effectExtent b="0" l="0" r="0" t="0"/>
-            <wp:docPr descr="Figure 2: The live solver in the browser application (light theme). The user loads the shipped database, picks a temperature, and presses Compute; the WebAssembly engine then solves the full FeO-MgO-SiO2 phase assemblage client side (here 1023 composition samples and 512 tie-facets in under half a second). Tapping a composition reads its stable phases and pins it to a comparison list; hovering previews on desktop." title="" id="656" name="Picture"/>
+            <wp:docPr descr="Figure 2: The live solver in the browser application (light theme). The user loads the shipped database, picks a temperature, and presses Compute; the WebAssembly engine then solves the full FeO-MgO-SiO2 phase assemblage client side (here 1023 composition samples and 512 tie-facets in under half a second). Tapping a composition reads its stable phases and pins it to a comparison list; hovering previews on desktop." title="" id="690" name="Picture"/>
             <a:graphic>
               <a:graphicData uri="http://schemas.openxmlformats.org/drawingml/2006/picture">
                 <pic:pic>
                   <pic:nvPicPr>
-                    <pic:cNvPr descr="figures/fig2_browser_app.png" id="657" name="Picture"/>
+                    <pic:cNvPr descr="figures/fig2_browser_app.png" id="691" name="Picture"/>
                     <pic:cNvPicPr>
                       <a:picLocks noChangeArrowheads="1" noChangeAspect="1"/>
                     </pic:cNvPicPr>
                   </pic:nvPicPr>
                   <pic:blipFill>
-                    <a:blip r:embed="rId655"/>
+                    <a:blip r:embed="rId689"/>
                     <a:stretch>
                       <a:fillRect/>
                     </a:stretch>
@@ -929,18 +929,18 @@
           <wp:inline>
             <wp:extent cx="5334000" cy="2416336"/>
             <wp:effectExtent b="0" l="0" r="0" t="0"/>
-            <wp:docPr descr="Figure 3: The assessed FeO-MgO-SiO2 system calculated from the shipped database files. (a) Liquidus projection: primary crystallizing phase fields, with liquidus isotherms labeled in °C. (b) Isothermal section at 1600 °C: stable phase assemblages, shaded by the number of solid phases present. Phase labels: L liquid, Crs cristobalite, Ol olivine, Opx orthopyroxene, Per periclase, Wus wustite." title="" id="659" name="Picture"/>
+            <wp:docPr descr="Figure 3: The assessed FeO-MgO-SiO2 system calculated from the shipped database files. (a) Liquidus projection: primary crystallizing phase fields, with liquidus isotherms labeled in °C. (b) Isothermal section at 1600 °C: stable phase assemblages, shaded by the number of solid phases present. Phase labels: L liquid, Crs cristobalite, Ol olivine, Opx orthopyroxene, Per periclase, Wus wustite." title="" id="693" name="Picture"/>
             <a:graphic>
               <a:graphicData uri="http://schemas.openxmlformats.org/drawingml/2006/picture">
                 <pic:pic>
                   <pic:nvPicPr>
-                    <pic:cNvPr descr="figures/fig3_ternary.png" id="660" name="Picture"/>
+                    <pic:cNvPr descr="figures/fig3_ternary.png" id="694" name="Picture"/>
                     <pic:cNvPicPr>
                       <a:picLocks noChangeArrowheads="1" noChangeAspect="1"/>
                     </pic:cNvPicPr>
                   </pic:nvPicPr>
                   <pic:blipFill>
-                    <a:blip r:embed="rId658"/>
+                    <a:blip r:embed="rId692"/>
                     <a:stretch>
                       <a:fillRect/>
                     </a:stretch>
@@ -1310,8 +1310,8 @@
         <w:t xml:space="preserve">Table 2: The assessed liquids. Full source lists, modeling judgments, and limits are in each system’s provenance file in the repository.</w:t>
       </w:r>
     </w:p>
-    <w:bookmarkEnd w:id="661"/>
-    <w:bookmarkStart w:id="662" w:name="anatomy-of-a-database-file"/>
+    <w:bookmarkEnd w:id="695"/>
+    <w:bookmarkStart w:id="696" w:name="anatomy-of-a-database-file"/>
     <w:p>
       <w:pPr>
         <w:pStyle w:val="Heading3"/>
@@ -1344,8 +1344,8 @@
         <w:t xml:space="preserve">That asymmetry is the economics of the field in miniature: implementations of the published models are increasingly available, but each fitted parameter condenses dozens of measurements and decisions. Parameter sets rather than codes are therefore the scarce commodity, and an openly licensed, provenance-tracked database is the part of this contribution that cannot be regenerated from the paper alone.</w:t>
       </w:r>
     </w:p>
-    <w:bookmarkEnd w:id="662"/>
-    <w:bookmarkStart w:id="663" w:name="quality-control"/>
+    <w:bookmarkEnd w:id="696"/>
+    <w:bookmarkStart w:id="697" w:name="quality-control"/>
     <w:p>
       <w:pPr>
         <w:pStyle w:val="Heading3"/>
@@ -1839,9 +1839,9 @@
         <w:t xml:space="preserve">invariants sit within about 40 °C, and the ternary liquidus projection reproduces the measured field topology [23]. Development practice is plain: the repository is version controlled with tagged releases (v0.1.0 through the v0.4.0 described here), the full suite runs before every release, and a fixed bug lands together with the regression test that would have caught it. The suite runs on Windows 11 under CPython 3.11 and 3.12; the browser application is exercised in Chromium- and Gecko-based browsers. A user can confirm a working installation by running pytest against the bundled test databases, or with no installation at all by opening the web application and loading the shipped ternary database.</w:t>
       </w:r>
     </w:p>
-    <w:bookmarkEnd w:id="663"/>
-    <w:bookmarkEnd w:id="664"/>
-    <w:bookmarkStart w:id="672" w:name="availability"/>
+    <w:bookmarkEnd w:id="697"/>
+    <w:bookmarkEnd w:id="698"/>
+    <w:bookmarkStart w:id="706" w:name="availability"/>
     <w:p>
       <w:pPr>
         <w:pStyle w:val="Heading2"/>
@@ -1850,7 +1850,7 @@
         <w:t xml:space="preserve">(2) Availability</w:t>
       </w:r>
     </w:p>
-    <w:bookmarkStart w:id="665" w:name="operating-system"/>
+    <w:bookmarkStart w:id="699" w:name="operating-system"/>
     <w:p>
       <w:pPr>
         <w:pStyle w:val="Heading3"/>
@@ -1867,8 +1867,8 @@
         <w:t xml:space="preserve">Platform independent. The core builds with any C99 compiler; development and testing used Windows 11. The browser application runs in any current browser with WebAssembly support.</w:t>
       </w:r>
     </w:p>
-    <w:bookmarkEnd w:id="665"/>
-    <w:bookmarkStart w:id="666" w:name="programming-language"/>
+    <w:bookmarkEnd w:id="699"/>
+    <w:bookmarkStart w:id="700" w:name="programming-language"/>
     <w:p>
       <w:pPr>
         <w:pStyle w:val="Heading3"/>
@@ -1885,8 +1885,8 @@
         <w:t xml:space="preserve">C (core), Python 3.11 or later (interface and fitting tools), JavaScript (browser application).</w:t>
       </w:r>
     </w:p>
-    <w:bookmarkEnd w:id="666"/>
-    <w:bookmarkStart w:id="667" w:name="additional-system-requirements"/>
+    <w:bookmarkEnd w:id="700"/>
+    <w:bookmarkStart w:id="701" w:name="additional-system-requirements"/>
     <w:p>
       <w:pPr>
         <w:pStyle w:val="Heading3"/>
@@ -1903,8 +1903,8 @@
         <w:t xml:space="preserve">None of note. The engine and database together are a few megabytes.</w:t>
       </w:r>
     </w:p>
-    <w:bookmarkEnd w:id="667"/>
-    <w:bookmarkStart w:id="668" w:name="dependencies"/>
+    <w:bookmarkEnd w:id="701"/>
+    <w:bookmarkStart w:id="702" w:name="dependencies"/>
     <w:p>
       <w:pPr>
         <w:pStyle w:val="Heading3"/>
@@ -1921,8 +1921,8 @@
         <w:t xml:space="preserve">Python interface: cffi, NumPy, SciPy. Validation suite additionally requires pycalphad. WebAssembly build requires emscripten. The C core and the browser application have no dependencies.</w:t>
       </w:r>
     </w:p>
-    <w:bookmarkEnd w:id="668"/>
-    <w:bookmarkStart w:id="669" w:name="list-of-contributors"/>
+    <w:bookmarkEnd w:id="702"/>
+    <w:bookmarkStart w:id="703" w:name="list-of-contributors"/>
     <w:p>
       <w:pPr>
         <w:pStyle w:val="Heading3"/>
@@ -1939,8 +1939,8 @@
         <w:t xml:space="preserve">Michael E. Bustamante (design, implementation, validation, data curation).</w:t>
       </w:r>
     </w:p>
-    <w:bookmarkEnd w:id="669"/>
-    <w:bookmarkStart w:id="670" w:name="software-location"/>
+    <w:bookmarkEnd w:id="703"/>
+    <w:bookmarkStart w:id="704" w:name="software-location"/>
     <w:p>
       <w:pPr>
         <w:pStyle w:val="Heading3"/>
@@ -2093,8 +2093,8 @@
         <w:t xml:space="preserve">Date published: 2026-09-02</w:t>
       </w:r>
     </w:p>
-    <w:bookmarkEnd w:id="670"/>
-    <w:bookmarkStart w:id="671" w:name="language"/>
+    <w:bookmarkEnd w:id="704"/>
+    <w:bookmarkStart w:id="705" w:name="language"/>
     <w:p>
       <w:pPr>
         <w:pStyle w:val="Heading3"/>
@@ -2111,9 +2111,9 @@
         <w:t xml:space="preserve">English.</w:t>
       </w:r>
     </w:p>
-    <w:bookmarkEnd w:id="671"/>
-    <w:bookmarkEnd w:id="672"/>
-    <w:bookmarkStart w:id="680" w:name="reuse-potential"/>
+    <w:bookmarkEnd w:id="705"/>
+    <w:bookmarkEnd w:id="706"/>
+    <w:bookmarkStart w:id="714" w:name="reuse-potential"/>
     <w:p>
       <w:pPr>
         <w:pStyle w:val="Heading2"/>
@@ -2138,7 +2138,7 @@
         <w:t xml:space="preserve">The browser application makes the lowest barrier the default. A lecture on slag thermodynamics, a plant metallurgist screening a composition, or a reviewer checking a claimed equilibrium can load the database and calculate in seconds, with confidential inputs never leaving the machine. The same property makes it a practical template for other groups who want to publish a model as a zero-install tool.</w:t>
       </w:r>
     </w:p>
-    <w:bookmarkStart w:id="679" w:name="worked-examples"/>
+    <w:bookmarkStart w:id="713" w:name="worked-examples"/>
     <w:p>
       <w:pPr>
         <w:pStyle w:val="Heading3"/>
@@ -2330,18 +2330,18 @@
           <wp:inline>
             <wp:extent cx="4206240" cy="3108960"/>
             <wp:effectExtent b="0" l="0" r="0" t="0"/>
-            <wp:docPr descr="Figure 4: The LiCl-KCl phase diagram computed by the salt listing from the shipped open database, on the listing’s own grid. Light to dark: liquid, two-phase, and subsolidus fields. The dot is the computed eutectic on this grid (0.400, 640 K); the star is the measured eutectic (0.415, 626 K)." title="" id="674" name="Picture"/>
+            <wp:docPr descr="Figure 4: The LiCl-KCl phase diagram computed by the salt listing from the shipped open database, on the listing’s own grid. Light to dark: liquid, two-phase, and subsolidus fields. The dot is the computed eutectic on this grid (0.400, 640 K); the star is the measured eutectic (0.415, 626 K)." title="" id="708" name="Picture"/>
             <a:graphic>
               <a:graphicData uri="http://schemas.openxmlformats.org/drawingml/2006/picture">
                 <pic:pic>
                   <pic:nvPicPr>
-                    <pic:cNvPr descr="figures/fig4_salt_example.png" id="675" name="Picture"/>
+                    <pic:cNvPr descr="figures/fig4_salt_example.png" id="709" name="Picture"/>
                     <pic:cNvPicPr>
                       <a:picLocks noChangeArrowheads="1" noChangeAspect="1"/>
                     </pic:cNvPicPr>
                   </pic:nvPicPr>
                   <pic:blipFill>
-                    <a:blip r:embed="rId673"/>
+                    <a:blip r:embed="rId707"/>
                     <a:stretch>
                       <a:fillRect/>
                     </a:stretch>
@@ -2547,18 +2547,18 @@
           <wp:inline>
             <wp:extent cx="4206240" cy="3108960"/>
             <wp:effectExtent b="0" l="0" r="0" t="0"/>
-            <wp:docPr descr="Figure 5: The Al-Zn phase diagram computed by the alloy listing from the shipped open TDB. Light to dark: liquid, liquid plus solid, and solid fields. The dot is the computed eutectic (0.890, 660 K); the star is the assessed eutectic (0.885, 654 K)." title="" id="677" name="Picture"/>
+            <wp:docPr descr="Figure 5: The Al-Zn phase diagram computed by the alloy listing from the shipped open TDB. Light to dark: liquid, liquid plus solid, and solid fields. The dot is the computed eutectic (0.890, 660 K); the star is the assessed eutectic (0.885, 654 K)." title="" id="711" name="Picture"/>
             <a:graphic>
               <a:graphicData uri="http://schemas.openxmlformats.org/drawingml/2006/picture">
                 <pic:pic>
                   <pic:nvPicPr>
-                    <pic:cNvPr descr="figures/fig5_alloy_example.png" id="678" name="Picture"/>
+                    <pic:cNvPr descr="figures/fig5_alloy_example.png" id="712" name="Picture"/>
                     <pic:cNvPicPr>
                       <a:picLocks noChangeArrowheads="1" noChangeAspect="1"/>
                     </pic:cNvPicPr>
                   </pic:nvPicPr>
                   <pic:blipFill>
-                    <a:blip r:embed="rId676"/>
+                    <a:blip r:embed="rId710"/>
                     <a:stretch>
                       <a:fillRect/>
                     </a:stretch>
@@ -2601,9 +2601,9 @@
         <w:t xml:space="preserve">The database is a starting point rather than an endpoint, and the file format rewards growth: new components, new phases, and refits against new measurements accumulate in the same database. A system is therefore extended release by release rather than rebuilt, and archived versions keep results calculated against earlier releases reproducible. Because every value carries its source and every judgment is written down, another assessor can reweight the data, swap an endmember, or extend a system without reverse-engineering anything; dbbuild turns a table of measured activities into a loadable file in a few lines. The in-browser multiphase hull already covers any loaded three-cation file and any loaded alloy TDB join, so a new system becomes a browser phase diagram the moment its file loads. Natural extensions are further oxide systems, the remaining ChemSage solution models, the ionic-liquid TDB model, and multicomponent Scheil on the same hull machinery. The repository also publishes an openly specified unified dialect (uTDB) that carries the MQMQA statements inside TDB grammar, with two shipped demonstration files chosen to be processes rather than curiosities: an aluminum-recycling database holding the Al-Zn alloy with its NaCl-KCl-MgCl2 salt flux, and a steelmaking database holding a basic Fe-C steel, magnetic phases included, with the FeO-MgO-SiO2 slag and its silicate solid solutions. Round-trip tests assert both reproduce their source-file physics at machine precision. Relative to the XML road of XTDB [15] (Table 1), uTDB is the on-ramp from the installed base, extending files as they are and running in this engine today, with mechanical conversion to XTDB elements the natural bridge once that schema settles. Making the calculator multilingual across the field’s file dialects is the direction of travel. Contributions and issues are handled through the GitHub repository.</w:t>
       </w:r>
     </w:p>
-    <w:bookmarkEnd w:id="679"/>
-    <w:bookmarkEnd w:id="680"/>
-    <w:bookmarkStart w:id="681" w:name="data-availability"/>
+    <w:bookmarkEnd w:id="713"/>
+    <w:bookmarkEnd w:id="714"/>
+    <w:bookmarkStart w:id="715" w:name="data-availability"/>
     <w:p>
       <w:pPr>
         <w:pStyle w:val="Heading2"/>
@@ -2620,8 +2620,8 @@
         <w:t xml:space="preserve">The engine, the database, the browser application, and the validation suite are openly available in the code repository listed above; the version described here is archived as release v0.4.0. The database files and their provenance records are in the repository’s data directory under CC BY 4.0.</w:t>
       </w:r>
     </w:p>
-    <w:bookmarkEnd w:id="681"/>
-    <w:bookmarkStart w:id="682" w:name="acknowledgements"/>
+    <w:bookmarkEnd w:id="715"/>
+    <w:bookmarkStart w:id="716" w:name="acknowledgements"/>
     <w:p>
       <w:pPr>
         <w:pStyle w:val="Heading2"/>
@@ -2638,8 +2638,8 @@
         <w:t xml:space="preserve">During the development of this software the author used Claude Code (Anthropic) to assist with implementation, validation scripting, and manuscript preparation. This assistance was agentic, not autonomous: it operated under author direction and supervision at every step and was never a closed loop that produced or accepted results without review. Every parameter was traced by the author to its primary source before entering the database, and every reference was verified against its registry record. The author reviewed and approved all output and takes full responsibility for this article.</w:t>
       </w:r>
     </w:p>
-    <w:bookmarkEnd w:id="682"/>
-    <w:bookmarkStart w:id="683" w:name="funding-statement"/>
+    <w:bookmarkEnd w:id="716"/>
+    <w:bookmarkStart w:id="717" w:name="funding-statement"/>
     <w:p>
       <w:pPr>
         <w:pStyle w:val="Heading2"/>
@@ -2656,8 +2656,8 @@
         <w:t xml:space="preserve">The development of this software received no external funding.</w:t>
       </w:r>
     </w:p>
-    <w:bookmarkEnd w:id="683"/>
-    <w:bookmarkStart w:id="684" w:name="competing-interests"/>
+    <w:bookmarkEnd w:id="717"/>
+    <w:bookmarkStart w:id="718" w:name="competing-interests"/>
     <w:p>
       <w:pPr>
         <w:pStyle w:val="Heading2"/>
@@ -2674,8 +2674,8 @@
         <w:t xml:space="preserve">The author founded Odinzen LLC, which provides commercial thermodynamic modeling services, and declares this as a competing interest. The software and database published here are released in full under open licenses, and no proprietary Odinzen assets are included.</w:t>
       </w:r>
     </w:p>
-    <w:bookmarkEnd w:id="684"/>
-    <w:bookmarkStart w:id="685" w:name="references"/>
+    <w:bookmarkEnd w:id="718"/>
+    <w:bookmarkStart w:id="719" w:name="references"/>
     <w:p>
       <w:pPr>
         <w:pStyle w:val="Heading2"/>
@@ -2976,8 +2976,8 @@
         <w:t xml:space="preserve">[35] Dinsdale AT. SGTE data for pure elements. Calphad. 1991 Oct;15(4):317-425. doi:10.1016/0364-5916(91)90030-N</w:t>
       </w:r>
     </w:p>
-    <w:bookmarkEnd w:id="685"/>
-    <w:bookmarkEnd w:id="686"/>
+    <w:bookmarkEnd w:id="719"/>
+    <w:bookmarkEnd w:id="720"/>
     <w:sectPr>
       <w:footnotePr>
         <w:numRestart w:val="eachSect"/>

</xml_diff>

<commit_message>
Code listings left-aligned (justified body style no longer stretches them) and each listing followed by a plain-language walkthrough for the non-programmer
Co-Authored-By: Claude Fable 5 <noreply@anthropic.com>
</commit_message>
<xml_diff>
--- a/paper/Bustamante_Hephaestus_JORS_manuscript.docx
+++ b/paper/Bustamante_Hephaestus_JORS_manuscript.docx
@@ -2,7 +2,7 @@
 <file path=word/document.xml><?xml version="1.0" encoding="utf-8"?>
 <w:document xmlns:w="http://schemas.openxmlformats.org/wordprocessingml/2006/main" xmlns:m="http://schemas.openxmlformats.org/officeDocument/2006/math" xmlns:r="http://schemas.openxmlformats.org/officeDocument/2006/relationships" xmlns:o="urn:schemas-microsoft-com:office:office" xmlns:v="urn:schemas-microsoft-com:vml" xmlns:w10="urn:schemas-microsoft-com:office:word" xmlns:a="http://schemas.openxmlformats.org/drawingml/2006/main" xmlns:pic="http://schemas.openxmlformats.org/drawingml/2006/picture" xmlns:wp="http://schemas.openxmlformats.org/drawingml/2006/wordprocessingDrawing">
   <w:body>
-    <w:bookmarkStart w:id="720" w:name="X4855b1162e70238fd839d871e0792397dc58430"/>
+    <w:bookmarkStart w:id="754" w:name="X4855b1162e70238fd839d871e0792397dc58430"/>
     <w:p>
       <w:pPr>
         <w:pStyle w:val="Heading1"/>
@@ -159,7 +159,7 @@
         <w:t xml:space="preserve">CALPHAD; molten slag; molten salt; modified quasichemical model; thermodynamic database; phase diagram; WebAssembly; open data</w:t>
       </w:r>
     </w:p>
-    <w:bookmarkStart w:id="698" w:name="overview"/>
+    <w:bookmarkStart w:id="732" w:name="overview"/>
     <w:p>
       <w:pPr>
         <w:pStyle w:val="Heading2"/>
@@ -168,7 +168,7 @@
         <w:t xml:space="preserve">(1) Overview</w:t>
       </w:r>
     </w:p>
-    <w:bookmarkStart w:id="685" w:name="introduction"/>
+    <w:bookmarkStart w:id="719" w:name="introduction"/>
     <w:p>
       <w:pPr>
         <w:pStyle w:val="Heading3"/>
@@ -527,8 +527,8 @@
         <w:t xml:space="preserve">Hephaestus is a deliberate response to that gap, and it treats the engine and the data as one contribution because neither is useful alone. The engine is small on purpose. Its core is plain C with no dependencies, which makes it easy to embed and lets the identical code compile to WebAssembly, so the full calculator runs in a web browser with nothing installed and no data leaving the user’s machine. The database is open on purpose. Every parameter in it derives from published measurements, each value carries its provenance down to table and page, and the known shortcomings are documented next to the numbers they affect. The present work describes both, their validation against pycalphad and against measured phase equilibria, and the ways they can be reused. None of it asks the reader to program. For the experimentalist who never writes code, the browser application is the entire product: a page to open, a database to click, and a diagram to read. The sections that follow describe the machinery underneath for those who want it. Supplementary Material S1 is a plain-language primer for the non-programmer, starting at what a database file is and ending at a first calculation and how to read it. Its closing section teaches what an assessment is built from, so a reader who wants to contribute data for open publication, or to commission a file, arrives knowing what is needed.</w:t>
       </w:r>
     </w:p>
-    <w:bookmarkEnd w:id="685"/>
-    <w:bookmarkStart w:id="695" w:name="implementation-and-architecture"/>
+    <w:bookmarkEnd w:id="719"/>
+    <w:bookmarkStart w:id="729" w:name="implementation-and-architecture"/>
     <w:p>
       <w:pPr>
         <w:pStyle w:val="Heading3"/>
@@ -554,18 +554,18 @@
           <wp:inline>
             <wp:extent cx="5334000" cy="3511838"/>
             <wp:effectExtent b="0" l="0" r="0" t="0"/>
-            <wp:docPr descr="Figure 1: Architecture of Hephaestus. A single dependency-free C core reads the field’s three database dialects (ChemSage .dat, Thermo-Calc .tdb with the Inden magnetic model, and the unified .utdb) and computes all thermodynamics; the same core is used as a native library, from Python through cffi, and compiled to WebAssembly behind the browser application. dbbuild writes new ChemSage files from measured data, and every energy path is validated against pycalphad." title="" id="687" name="Picture"/>
+            <wp:docPr descr="Figure 1: Architecture of Hephaestus. A single dependency-free C core reads the field’s three database dialects (ChemSage .dat, Thermo-Calc .tdb with the Inden magnetic model, and the unified .utdb) and computes all thermodynamics; the same core is used as a native library, from Python through cffi, and compiled to WebAssembly behind the browser application. dbbuild writes new ChemSage files from measured data, and every energy path is validated against pycalphad." title="" id="721" name="Picture"/>
             <a:graphic>
               <a:graphicData uri="http://schemas.openxmlformats.org/drawingml/2006/picture">
                 <pic:pic>
                   <pic:nvPicPr>
-                    <pic:cNvPr descr="figures/fig1_architecture.png" id="688" name="Picture"/>
+                    <pic:cNvPr descr="figures/fig1_architecture.png" id="722" name="Picture"/>
                     <pic:cNvPicPr>
                       <a:picLocks noChangeArrowheads="1" noChangeAspect="1"/>
                     </pic:cNvPicPr>
                   </pic:nvPicPr>
                   <pic:blipFill>
-                    <a:blip r:embed="rId686"/>
+                    <a:blip r:embed="rId720"/>
                     <a:stretch>
                       <a:fillRect/>
                     </a:stretch>
@@ -720,6 +720,26 @@
         <w:pStyle w:val="FirstParagraph"/>
       </w:pPr>
       <w:r>
+        <w:t xml:space="preserve">Read as plain steps: the two import lines fetch the named tools from the installed package. Database.read opens the file, detects its dialect, and loads every phase and parameter into memory. build_inputs gathers what the solver needs about one named phase at one temperature, here the slag liquid at 1873 K. c_equilibrate then finds the internal state of lowest Gibbs energy for the given amounts of each element and returns a small table: res[</w:t>
+      </w:r>
+      <w:r>
+        <w:t xml:space="preserve">“GM”</w:t>
+      </w:r>
+      <w:r>
+        <w:t xml:space="preserve">] is the molar Gibbs energy and res[</w:t>
+      </w:r>
+      <w:r>
+        <w:t xml:space="preserve">“X”</w:t>
+      </w:r>
+      <w:r>
+        <w:t xml:space="preserve">] is the melt’s internal structure, the quadruplet fractions. Every calculation in this paper is some loop around these three calls.</w:t>
+      </w:r>
+    </w:p>
+    <w:p>
+      <w:pPr>
+        <w:pStyle w:val="BodyText"/>
+      </w:pPr>
+      <w:r>
         <w:t xml:space="preserve">The Python package also contains dbbuild, a declarative route from measured data to a loadable database. A user describes components with sourced endmember thermodynamics and fitted binary excess terms, and dbbuild writes a valid ChemSage file; a fitting routine obtains the excess parameters from measured component activities using the engine itself as the forward model. The builder covers single-anion oxide systems of two to four components, and multicomponent liquids are assembled from their binaries in the usual way.</w:t>
       </w:r>
     </w:p>
@@ -752,18 +772,18 @@
           <wp:inline>
             <wp:extent cx="4754880" cy="4464799"/>
             <wp:effectExtent b="0" l="0" r="0" t="0"/>
-            <wp:docPr descr="Figure 2: The live solver in the browser application (light theme). The user loads the shipped database, picks a temperature, and presses Compute; the WebAssembly engine then solves the full FeO-MgO-SiO2 phase assemblage client side (here 1023 composition samples and 512 tie-facets in under half a second). Tapping a composition reads its stable phases and pins it to a comparison list; hovering previews on desktop." title="" id="690" name="Picture"/>
+            <wp:docPr descr="Figure 2: The live solver in the browser application (light theme). The user loads the shipped database, picks a temperature, and presses Compute; the WebAssembly engine then solves the full FeO-MgO-SiO2 phase assemblage client side (here 1023 composition samples and 512 tie-facets in under half a second). Tapping a composition reads its stable phases and pins it to a comparison list; hovering previews on desktop." title="" id="724" name="Picture"/>
             <a:graphic>
               <a:graphicData uri="http://schemas.openxmlformats.org/drawingml/2006/picture">
                 <pic:pic>
                   <pic:nvPicPr>
-                    <pic:cNvPr descr="figures/fig2_browser_app.png" id="691" name="Picture"/>
+                    <pic:cNvPr descr="figures/fig2_browser_app.png" id="725" name="Picture"/>
                     <pic:cNvPicPr>
                       <a:picLocks noChangeArrowheads="1" noChangeAspect="1"/>
                     </pic:cNvPicPr>
                   </pic:nvPicPr>
                   <pic:blipFill>
-                    <a:blip r:embed="rId689"/>
+                    <a:blip r:embed="rId723"/>
                     <a:stretch>
                       <a:fillRect/>
                     </a:stretch>
@@ -929,18 +949,18 @@
           <wp:inline>
             <wp:extent cx="5334000" cy="2416336"/>
             <wp:effectExtent b="0" l="0" r="0" t="0"/>
-            <wp:docPr descr="Figure 3: The assessed FeO-MgO-SiO2 system calculated from the shipped database files. (a) Liquidus projection: primary crystallizing phase fields, with liquidus isotherms labeled in °C. (b) Isothermal section at 1600 °C: stable phase assemblages, shaded by the number of solid phases present. Phase labels: L liquid, Crs cristobalite, Ol olivine, Opx orthopyroxene, Per periclase, Wus wustite." title="" id="693" name="Picture"/>
+            <wp:docPr descr="Figure 3: The assessed FeO-MgO-SiO2 system calculated from the shipped database files. (a) Liquidus projection: primary crystallizing phase fields, with liquidus isotherms labeled in °C. (b) Isothermal section at 1600 °C: stable phase assemblages, shaded by the number of solid phases present. Phase labels: L liquid, Crs cristobalite, Ol olivine, Opx orthopyroxene, Per periclase, Wus wustite." title="" id="727" name="Picture"/>
             <a:graphic>
               <a:graphicData uri="http://schemas.openxmlformats.org/drawingml/2006/picture">
                 <pic:pic>
                   <pic:nvPicPr>
-                    <pic:cNvPr descr="figures/fig3_ternary.png" id="694" name="Picture"/>
+                    <pic:cNvPr descr="figures/fig3_ternary.png" id="728" name="Picture"/>
                     <pic:cNvPicPr>
                       <a:picLocks noChangeArrowheads="1" noChangeAspect="1"/>
                     </pic:cNvPicPr>
                   </pic:nvPicPr>
                   <pic:blipFill>
-                    <a:blip r:embed="rId692"/>
+                    <a:blip r:embed="rId726"/>
                     <a:stretch>
                       <a:fillRect/>
                     </a:stretch>
@@ -1310,8 +1330,8 @@
         <w:t xml:space="preserve">Table 2: The assessed liquids. Full source lists, modeling judgments, and limits are in each system’s provenance file in the repository.</w:t>
       </w:r>
     </w:p>
-    <w:bookmarkEnd w:id="695"/>
-    <w:bookmarkStart w:id="696" w:name="anatomy-of-a-database-file"/>
+    <w:bookmarkEnd w:id="729"/>
+    <w:bookmarkStart w:id="730" w:name="anatomy-of-a-database-file"/>
     <w:p>
       <w:pPr>
         <w:pStyle w:val="Heading3"/>
@@ -1344,8 +1364,8 @@
         <w:t xml:space="preserve">That asymmetry is the economics of the field in miniature: implementations of the published models are increasingly available, but each fitted parameter condenses dozens of measurements and decisions. Parameter sets rather than codes are therefore the scarce commodity, and an openly licensed, provenance-tracked database is the part of this contribution that cannot be regenerated from the paper alone.</w:t>
       </w:r>
     </w:p>
-    <w:bookmarkEnd w:id="696"/>
-    <w:bookmarkStart w:id="697" w:name="quality-control"/>
+    <w:bookmarkEnd w:id="730"/>
+    <w:bookmarkStart w:id="731" w:name="quality-control"/>
     <w:p>
       <w:pPr>
         <w:pStyle w:val="Heading3"/>
@@ -1839,9 +1859,9 @@
         <w:t xml:space="preserve">invariants sit within about 40 °C, and the ternary liquidus projection reproduces the measured field topology [23]. Development practice is plain: the repository is version controlled with tagged releases (v0.1.0 through the v0.4.0 described here), the full suite runs before every release, and a fixed bug lands together with the regression test that would have caught it. The suite runs on Windows 11 under CPython 3.11 and 3.12; the browser application is exercised in Chromium- and Gecko-based browsers. A user can confirm a working installation by running pytest against the bundled test databases, or with no installation at all by opening the web application and loading the shipped ternary database.</w:t>
       </w:r>
     </w:p>
-    <w:bookmarkEnd w:id="697"/>
-    <w:bookmarkEnd w:id="698"/>
-    <w:bookmarkStart w:id="706" w:name="availability"/>
+    <w:bookmarkEnd w:id="731"/>
+    <w:bookmarkEnd w:id="732"/>
+    <w:bookmarkStart w:id="740" w:name="availability"/>
     <w:p>
       <w:pPr>
         <w:pStyle w:val="Heading2"/>
@@ -1850,7 +1870,7 @@
         <w:t xml:space="preserve">(2) Availability</w:t>
       </w:r>
     </w:p>
-    <w:bookmarkStart w:id="699" w:name="operating-system"/>
+    <w:bookmarkStart w:id="733" w:name="operating-system"/>
     <w:p>
       <w:pPr>
         <w:pStyle w:val="Heading3"/>
@@ -1867,8 +1887,8 @@
         <w:t xml:space="preserve">Platform independent. The core builds with any C99 compiler; development and testing used Windows 11. The browser application runs in any current browser with WebAssembly support.</w:t>
       </w:r>
     </w:p>
-    <w:bookmarkEnd w:id="699"/>
-    <w:bookmarkStart w:id="700" w:name="programming-language"/>
+    <w:bookmarkEnd w:id="733"/>
+    <w:bookmarkStart w:id="734" w:name="programming-language"/>
     <w:p>
       <w:pPr>
         <w:pStyle w:val="Heading3"/>
@@ -1885,8 +1905,8 @@
         <w:t xml:space="preserve">C (core), Python 3.11 or later (interface and fitting tools), JavaScript (browser application).</w:t>
       </w:r>
     </w:p>
-    <w:bookmarkEnd w:id="700"/>
-    <w:bookmarkStart w:id="701" w:name="additional-system-requirements"/>
+    <w:bookmarkEnd w:id="734"/>
+    <w:bookmarkStart w:id="735" w:name="additional-system-requirements"/>
     <w:p>
       <w:pPr>
         <w:pStyle w:val="Heading3"/>
@@ -1903,8 +1923,8 @@
         <w:t xml:space="preserve">None of note. The engine and database together are a few megabytes.</w:t>
       </w:r>
     </w:p>
-    <w:bookmarkEnd w:id="701"/>
-    <w:bookmarkStart w:id="702" w:name="dependencies"/>
+    <w:bookmarkEnd w:id="735"/>
+    <w:bookmarkStart w:id="736" w:name="dependencies"/>
     <w:p>
       <w:pPr>
         <w:pStyle w:val="Heading3"/>
@@ -1921,8 +1941,8 @@
         <w:t xml:space="preserve">Python interface: cffi, NumPy, SciPy. Validation suite additionally requires pycalphad. WebAssembly build requires emscripten. The C core and the browser application have no dependencies.</w:t>
       </w:r>
     </w:p>
-    <w:bookmarkEnd w:id="702"/>
-    <w:bookmarkStart w:id="703" w:name="list-of-contributors"/>
+    <w:bookmarkEnd w:id="736"/>
+    <w:bookmarkStart w:id="737" w:name="list-of-contributors"/>
     <w:p>
       <w:pPr>
         <w:pStyle w:val="Heading3"/>
@@ -1939,8 +1959,8 @@
         <w:t xml:space="preserve">Michael E. Bustamante (design, implementation, validation, data curation).</w:t>
       </w:r>
     </w:p>
-    <w:bookmarkEnd w:id="703"/>
-    <w:bookmarkStart w:id="704" w:name="software-location"/>
+    <w:bookmarkEnd w:id="737"/>
+    <w:bookmarkStart w:id="738" w:name="software-location"/>
     <w:p>
       <w:pPr>
         <w:pStyle w:val="Heading3"/>
@@ -2093,8 +2113,8 @@
         <w:t xml:space="preserve">Date published: 2026-09-02</w:t>
       </w:r>
     </w:p>
-    <w:bookmarkEnd w:id="704"/>
-    <w:bookmarkStart w:id="705" w:name="language"/>
+    <w:bookmarkEnd w:id="738"/>
+    <w:bookmarkStart w:id="739" w:name="language"/>
     <w:p>
       <w:pPr>
         <w:pStyle w:val="Heading3"/>
@@ -2111,9 +2131,9 @@
         <w:t xml:space="preserve">English.</w:t>
       </w:r>
     </w:p>
-    <w:bookmarkEnd w:id="705"/>
-    <w:bookmarkEnd w:id="706"/>
-    <w:bookmarkStart w:id="714" w:name="reuse-potential"/>
+    <w:bookmarkEnd w:id="739"/>
+    <w:bookmarkEnd w:id="740"/>
+    <w:bookmarkStart w:id="748" w:name="reuse-potential"/>
     <w:p>
       <w:pPr>
         <w:pStyle w:val="Heading2"/>
@@ -2138,7 +2158,7 @@
         <w:t xml:space="preserve">The browser application makes the lowest barrier the default. A lecture on slag thermodynamics, a plant metallurgist screening a composition, or a reviewer checking a claimed equilibrium can load the database and calculate in seconds, with confidential inputs never leaving the machine. The same property makes it a practical template for other groups who want to publish a model as a zero-install tool.</w:t>
       </w:r>
     </w:p>
-    <w:bookmarkStart w:id="713" w:name="worked-examples"/>
+    <w:bookmarkStart w:id="747" w:name="worked-examples"/>
     <w:p>
       <w:pPr>
         <w:pStyle w:val="Heading3"/>
@@ -2304,6 +2324,14 @@
     <w:p>
       <w:pPr>
         <w:pStyle w:val="FirstParagraph"/>
+      </w:pPr>
+      <w:r>
+        <w:t xml:space="preserve">In plain terms: the session sweeps a grid of temperatures and compositions, and at each point multiphase_binary compares the liquid solution against the two solid salts and reports which phases coexist. The two stoich_gibbs lines fetch the Gibbs energies of solid LiCl and solid KCl at that temperature. The closing lines only search the results: among all points where the melt is entirely liquid, the coldest is the eutectic.</w:t>
+      </w:r>
+    </w:p>
+    <w:p>
+      <w:pPr>
+        <w:pStyle w:val="BodyText"/>
       </w:pPr>
       <w:r>
         <w:t xml:space="preserve">The listing prints its eutectic at x</w:t>
@@ -2330,18 +2358,18 @@
           <wp:inline>
             <wp:extent cx="4206240" cy="3108960"/>
             <wp:effectExtent b="0" l="0" r="0" t="0"/>
-            <wp:docPr descr="Figure 4: The LiCl-KCl phase diagram computed by the salt listing from the shipped open database, on the listing’s own grid. Light to dark: liquid, two-phase, and subsolidus fields. The dot is the computed eutectic on this grid (0.400, 640 K); the star is the measured eutectic (0.415, 626 K)." title="" id="708" name="Picture"/>
+            <wp:docPr descr="Figure 4: The LiCl-KCl phase diagram computed by the salt listing from the shipped open database, on the listing’s own grid. Light to dark: liquid, two-phase, and subsolidus fields. The dot is the computed eutectic on this grid (0.400, 640 K); the star is the measured eutectic (0.415, 626 K)." title="" id="742" name="Picture"/>
             <a:graphic>
               <a:graphicData uri="http://schemas.openxmlformats.org/drawingml/2006/picture">
                 <pic:pic>
                   <pic:nvPicPr>
-                    <pic:cNvPr descr="figures/fig4_salt_example.png" id="709" name="Picture"/>
+                    <pic:cNvPr descr="figures/fig4_salt_example.png" id="743" name="Picture"/>
                     <pic:cNvPicPr>
                       <a:picLocks noChangeArrowheads="1" noChangeAspect="1"/>
                     </pic:cNvPicPr>
                   </pic:nvPicPr>
                   <pic:blipFill>
-                    <a:blip r:embed="rId707"/>
+                    <a:blip r:embed="rId741"/>
                     <a:stretch>
                       <a:fillRect/>
                     </a:stretch>
@@ -2523,6 +2551,14 @@
         <w:pStyle w:val="FirstParagraph"/>
       </w:pPr>
       <w:r>
+        <w:t xml:space="preserve">In plain terms: at each temperature the loop evaluates every solid-solution phase’s Gibbs energy across the whole composition line (cef_gibbs), and lower_hull keeps only the states no mixture of others can beat, the geometric equivalent of the common-tangent construction. Where two neighboring hull points belong to different phases, those phases coexist.</w:t>
+      </w:r>
+    </w:p>
+    <w:p>
+      <w:pPr>
+        <w:pStyle w:val="BodyText"/>
+      </w:pPr>
+      <w:r>
         <w:t xml:space="preserve">It locates the eutectic at x</w:t>
       </w:r>
       <w:r>
@@ -2547,18 +2583,18 @@
           <wp:inline>
             <wp:extent cx="4206240" cy="3108960"/>
             <wp:effectExtent b="0" l="0" r="0" t="0"/>
-            <wp:docPr descr="Figure 5: The Al-Zn phase diagram computed by the alloy listing from the shipped open TDB. Light to dark: liquid, liquid plus solid, and solid fields. The dot is the computed eutectic (0.890, 660 K); the star is the assessed eutectic (0.885, 654 K)." title="" id="711" name="Picture"/>
+            <wp:docPr descr="Figure 5: The Al-Zn phase diagram computed by the alloy listing from the shipped open TDB. Light to dark: liquid, liquid plus solid, and solid fields. The dot is the computed eutectic (0.890, 660 K); the star is the assessed eutectic (0.885, 654 K)." title="" id="745" name="Picture"/>
             <a:graphic>
               <a:graphicData uri="http://schemas.openxmlformats.org/drawingml/2006/picture">
                 <pic:pic>
                   <pic:nvPicPr>
-                    <pic:cNvPr descr="figures/fig5_alloy_example.png" id="712" name="Picture"/>
+                    <pic:cNvPr descr="figures/fig5_alloy_example.png" id="746" name="Picture"/>
                     <pic:cNvPicPr>
                       <a:picLocks noChangeArrowheads="1" noChangeAspect="1"/>
                     </pic:cNvPicPr>
                   </pic:nvPicPr>
                   <pic:blipFill>
-                    <a:blip r:embed="rId710"/>
+                    <a:blip r:embed="rId744"/>
                     <a:stretch>
                       <a:fillRect/>
                     </a:stretch>
@@ -2601,9 +2637,9 @@
         <w:t xml:space="preserve">The database is a starting point rather than an endpoint, and the file format rewards growth: new components, new phases, and refits against new measurements accumulate in the same database. A system is therefore extended release by release rather than rebuilt, and archived versions keep results calculated against earlier releases reproducible. Because every value carries its source and every judgment is written down, another assessor can reweight the data, swap an endmember, or extend a system without reverse-engineering anything; dbbuild turns a table of measured activities into a loadable file in a few lines. The in-browser multiphase hull already covers any loaded three-cation file and any loaded alloy TDB join, so a new system becomes a browser phase diagram the moment its file loads. Natural extensions are further oxide systems, the remaining ChemSage solution models, the ionic-liquid TDB model, and multicomponent Scheil on the same hull machinery. The repository also publishes an openly specified unified dialect (uTDB) that carries the MQMQA statements inside TDB grammar, with two shipped demonstration files chosen to be processes rather than curiosities: an aluminum-recycling database holding the Al-Zn alloy with its NaCl-KCl-MgCl2 salt flux, and a steelmaking database holding a basic Fe-C steel, magnetic phases included, with the FeO-MgO-SiO2 slag and its silicate solid solutions. Round-trip tests assert both reproduce their source-file physics at machine precision. Relative to the XML road of XTDB [15] (Table 1), uTDB is the on-ramp from the installed base, extending files as they are and running in this engine today, with mechanical conversion to XTDB elements the natural bridge once that schema settles. Making the calculator multilingual across the field’s file dialects is the direction of travel. Contributions and issues are handled through the GitHub repository.</w:t>
       </w:r>
     </w:p>
-    <w:bookmarkEnd w:id="713"/>
-    <w:bookmarkEnd w:id="714"/>
-    <w:bookmarkStart w:id="715" w:name="data-availability"/>
+    <w:bookmarkEnd w:id="747"/>
+    <w:bookmarkEnd w:id="748"/>
+    <w:bookmarkStart w:id="749" w:name="data-availability"/>
     <w:p>
       <w:pPr>
         <w:pStyle w:val="Heading2"/>
@@ -2620,8 +2656,8 @@
         <w:t xml:space="preserve">The engine, the database, the browser application, and the validation suite are openly available in the code repository listed above; the version described here is archived as release v0.4.0. The database files and their provenance records are in the repository’s data directory under CC BY 4.0.</w:t>
       </w:r>
     </w:p>
-    <w:bookmarkEnd w:id="715"/>
-    <w:bookmarkStart w:id="716" w:name="acknowledgements"/>
+    <w:bookmarkEnd w:id="749"/>
+    <w:bookmarkStart w:id="750" w:name="acknowledgements"/>
     <w:p>
       <w:pPr>
         <w:pStyle w:val="Heading2"/>
@@ -2638,8 +2674,8 @@
         <w:t xml:space="preserve">During the development of this software the author used Claude Code (Anthropic) to assist with implementation, validation scripting, and manuscript preparation. This assistance was agentic, not autonomous: it operated under author direction and supervision at every step and was never a closed loop that produced or accepted results without review. Every parameter was traced by the author to its primary source before entering the database, and every reference was verified against its registry record. The author reviewed and approved all output and takes full responsibility for this article.</w:t>
       </w:r>
     </w:p>
-    <w:bookmarkEnd w:id="716"/>
-    <w:bookmarkStart w:id="717" w:name="funding-statement"/>
+    <w:bookmarkEnd w:id="750"/>
+    <w:bookmarkStart w:id="751" w:name="funding-statement"/>
     <w:p>
       <w:pPr>
         <w:pStyle w:val="Heading2"/>
@@ -2656,8 +2692,8 @@
         <w:t xml:space="preserve">The development of this software received no external funding.</w:t>
       </w:r>
     </w:p>
-    <w:bookmarkEnd w:id="717"/>
-    <w:bookmarkStart w:id="718" w:name="competing-interests"/>
+    <w:bookmarkEnd w:id="751"/>
+    <w:bookmarkStart w:id="752" w:name="competing-interests"/>
     <w:p>
       <w:pPr>
         <w:pStyle w:val="Heading2"/>
@@ -2674,8 +2710,8 @@
         <w:t xml:space="preserve">The author founded Odinzen LLC, which provides commercial thermodynamic modeling services, and declares this as a competing interest. The software and database published here are released in full under open licenses, and no proprietary Odinzen assets are included.</w:t>
       </w:r>
     </w:p>
-    <w:bookmarkEnd w:id="718"/>
-    <w:bookmarkStart w:id="719" w:name="references"/>
+    <w:bookmarkEnd w:id="752"/>
+    <w:bookmarkStart w:id="753" w:name="references"/>
     <w:p>
       <w:pPr>
         <w:pStyle w:val="Heading2"/>
@@ -2976,8 +3012,8 @@
         <w:t xml:space="preserve">[35] Dinsdale AT. SGTE data for pure elements. Calphad. 1991 Oct;15(4):317-425. doi:10.1016/0364-5916(91)90030-N</w:t>
       </w:r>
     </w:p>
-    <w:bookmarkEnd w:id="719"/>
-    <w:bookmarkEnd w:id="720"/>
+    <w:bookmarkEnd w:id="753"/>
+    <w:bookmarkEnd w:id="754"/>
     <w:sectPr>
       <w:footnotePr>
         <w:numRestart w:val="eachSect"/>
@@ -3872,6 +3908,7 @@
     <w:link w:val="VerbatimChar"/>
     <w:pPr>
       <w:wordWrap w:val="off"/>
+      <w:jc w:val="left"/>
     </w:pPr>
   </w:style>
   <w:style w:customStyle="1" w:styleId="KeywordTok" w:type="character">

</xml_diff>

<commit_message>
Figure 3 regenerated: smooth gridded isotherms, halo labels, Crs sliver unlabeled in the projection panel; QC opening humanized; reuse paragraph concrete; conclusion added; listings 9 pt, left-aligned, 80 columns with mirrored example scripts; post-build handles tables and both code styles
Co-Authored-By: Claude Fable 5 <noreply@anthropic.com>
</commit_message>
<xml_diff>
--- a/paper/Bustamante_Hephaestus_JORS_manuscript.docx
+++ b/paper/Bustamante_Hephaestus_JORS_manuscript.docx
@@ -2,7 +2,7 @@
 <file path=word/document.xml><?xml version="1.0" encoding="utf-8"?>
 <w:document xmlns:w="http://schemas.openxmlformats.org/wordprocessingml/2006/main" xmlns:m="http://schemas.openxmlformats.org/officeDocument/2006/math" xmlns:r="http://schemas.openxmlformats.org/officeDocument/2006/relationships" xmlns:o="urn:schemas-microsoft-com:office:office" xmlns:v="urn:schemas-microsoft-com:vml" xmlns:w10="urn:schemas-microsoft-com:office:word" xmlns:a="http://schemas.openxmlformats.org/drawingml/2006/main" xmlns:pic="http://schemas.openxmlformats.org/drawingml/2006/picture" xmlns:wp="http://schemas.openxmlformats.org/drawingml/2006/wordprocessingDrawing">
   <w:body>
-    <w:bookmarkStart w:id="754" w:name="X4855b1162e70238fd839d871e0792397dc58430"/>
+    <w:bookmarkStart w:id="924" w:name="X4855b1162e70238fd839d871e0792397dc58430"/>
     <w:p>
       <w:pPr>
         <w:pStyle w:val="Heading1"/>
@@ -159,7 +159,7 @@
         <w:t xml:space="preserve">CALPHAD; molten slag; molten salt; modified quasichemical model; thermodynamic database; phase diagram; WebAssembly; open data</w:t>
       </w:r>
     </w:p>
-    <w:bookmarkStart w:id="732" w:name="overview"/>
+    <w:bookmarkStart w:id="902" w:name="overview"/>
     <w:p>
       <w:pPr>
         <w:pStyle w:val="Heading2"/>
@@ -168,7 +168,7 @@
         <w:t xml:space="preserve">(1) Overview</w:t>
       </w:r>
     </w:p>
-    <w:bookmarkStart w:id="719" w:name="introduction"/>
+    <w:bookmarkStart w:id="889" w:name="introduction"/>
     <w:p>
       <w:pPr>
         <w:pStyle w:val="Heading3"/>
@@ -236,6 +236,7 @@
             <w:pPr>
               <w:keepNext/>
               <w:pStyle w:val="Compact"/>
+              <w:jc w:val="left"/>
             </w:pPr>
             <w:r>
               <w:t xml:space="preserve">School</w:t>
@@ -248,6 +249,7 @@
             <w:pPr>
               <w:keepNext/>
               <w:pStyle w:val="Compact"/>
+              <w:jc w:val="left"/>
             </w:pPr>
             <w:r>
               <w:t xml:space="preserve">Native containers</w:t>
@@ -260,6 +262,7 @@
             <w:pPr>
               <w:keepNext/>
               <w:pStyle w:val="Compact"/>
+              <w:jc w:val="left"/>
             </w:pPr>
             <w:r>
               <w:t xml:space="preserve">Carried by</w:t>
@@ -277,6 +280,7 @@
             <w:pPr>
               <w:keepNext/>
               <w:pStyle w:val="Compact"/>
+              <w:jc w:val="left"/>
             </w:pPr>
             <w:r>
               <w:t xml:space="preserve">CALPHAD, ChemSage lineage</w:t>
@@ -289,6 +293,7 @@
             <w:pPr>
               <w:keepNext/>
               <w:pStyle w:val="Compact"/>
+              <w:jc w:val="left"/>
             </w:pPr>
             <w:r>
               <w:t xml:space="preserve">ChemSage .dat</w:t>
@@ -301,6 +306,7 @@
             <w:pPr>
               <w:keepNext/>
               <w:pStyle w:val="Compact"/>
+              <w:jc w:val="left"/>
             </w:pPr>
             <w:r>
               <w:t xml:space="preserve">FactSage, ChemApp, Thermochimica; the only legacy carrier of MQMQA melts</w:t>
@@ -318,6 +324,7 @@
             <w:pPr>
               <w:keepNext/>
               <w:pStyle w:val="Compact"/>
+              <w:jc w:val="left"/>
             </w:pPr>
             <w:r>
               <w:t xml:space="preserve">CALPHAD, Thermo-Calc lineage</w:t>
@@ -330,6 +337,7 @@
             <w:pPr>
               <w:keepNext/>
               <w:pStyle w:val="Compact"/>
+              <w:jc w:val="left"/>
             </w:pPr>
             <w:r>
               <w:t xml:space="preserve">TDB</w:t>
@@ -342,6 +350,7 @@
             <w:pPr>
               <w:keepNext/>
               <w:pStyle w:val="Compact"/>
+              <w:jc w:val="left"/>
             </w:pPr>
             <w:r>
               <w:t xml:space="preserve">Thermo-Calc, OpenCalphad, pycalphad; alloy CEF</w:t>
@@ -359,6 +368,7 @@
             <w:pPr>
               <w:keepNext/>
               <w:pStyle w:val="Compact"/>
+              <w:jc w:val="left"/>
             </w:pPr>
             <w:r>
               <w:t xml:space="preserve">CALPHAD, XML successor</w:t>
@@ -371,6 +381,7 @@
             <w:pPr>
               <w:keepNext/>
               <w:pStyle w:val="Compact"/>
+              <w:jc w:val="left"/>
             </w:pPr>
             <w:r>
               <w:t xml:space="preserve">XTDB [15]</w:t>
@@ -383,6 +394,7 @@
             <w:pPr>
               <w:keepNext/>
               <w:pStyle w:val="Compact"/>
+              <w:jc w:val="left"/>
             </w:pPr>
             <w:r>
               <w:t xml:space="preserve">proposed unified schema, MQMQA included</w:t>
@@ -400,6 +412,7 @@
             <w:pPr>
               <w:keepNext/>
               <w:pStyle w:val="Compact"/>
+              <w:jc w:val="left"/>
             </w:pPr>
             <w:r>
               <w:t xml:space="preserve">Geochemical / aqueous</w:t>
@@ -412,6 +425,7 @@
             <w:pPr>
               <w:keepNext/>
               <w:pStyle w:val="Compact"/>
+              <w:jc w:val="left"/>
             </w:pPr>
             <w:r>
               <w:t xml:space="preserve">GEMS containers, PhreeqC data files</w:t>
@@ -424,6 +438,7 @@
             <w:pPr>
               <w:keepNext/>
               <w:pStyle w:val="Compact"/>
+              <w:jc w:val="left"/>
             </w:pPr>
             <w:r>
               <w:t xml:space="preserve">GEM-Selektor behind CemGEMS [14]; speciation models</w:t>
@@ -441,6 +456,7 @@
             <w:pPr>
               <w:keepNext/>
               <w:pStyle w:val="Compact"/>
+              <w:jc w:val="left"/>
             </w:pPr>
             <w:r>
               <w:t xml:space="preserve">Combustion / gas phase</w:t>
@@ -453,6 +469,7 @@
             <w:pPr>
               <w:keepNext/>
               <w:pStyle w:val="Compact"/>
+              <w:jc w:val="left"/>
             </w:pPr>
             <w:r>
               <w:t xml:space="preserve">NASA-polynomial files (CHEMKIN, Cantera)</w:t>
@@ -465,6 +482,7 @@
             <w:pPr>
               <w:keepNext/>
               <w:pStyle w:val="Compact"/>
+              <w:jc w:val="left"/>
             </w:pPr>
             <w:r>
               <w:t xml:space="preserve">ideal-gas and pure condensed species, no solution models</w:t>
@@ -481,6 +499,7 @@
           <w:p>
             <w:pPr>
               <w:pStyle w:val="Compact"/>
+              <w:jc w:val="left"/>
             </w:pPr>
             <w:r>
               <w:t xml:space="preserve">First-principles era</w:t>
@@ -492,6 +511,7 @@
           <w:p>
             <w:pPr>
               <w:pStyle w:val="Compact"/>
+              <w:jc w:val="left"/>
             </w:pPr>
             <w:r>
               <w:t xml:space="preserve">JSON records served over the web</w:t>
@@ -503,6 +523,7 @@
           <w:p>
             <w:pPr>
               <w:pStyle w:val="Compact"/>
+              <w:jc w:val="left"/>
             </w:pPr>
             <w:r>
               <w:t xml:space="preserve">computed formation energies (Materials Project and kin)</w:t>
@@ -527,8 +548,8 @@
         <w:t xml:space="preserve">Hephaestus is a deliberate response to that gap, and it treats the engine and the data as one contribution because neither is useful alone. The engine is small on purpose. Its core is plain C with no dependencies, which makes it easy to embed and lets the identical code compile to WebAssembly, so the full calculator runs in a web browser with nothing installed and no data leaving the user’s machine. The database is open on purpose. Every parameter in it derives from published measurements, each value carries its provenance down to table and page, and the known shortcomings are documented next to the numbers they affect. The present work describes both, their validation against pycalphad and against measured phase equilibria, and the ways they can be reused. None of it asks the reader to program. For the experimentalist who never writes code, the browser application is the entire product: a page to open, a database to click, and a diagram to read. The sections that follow describe the machinery underneath for those who want it. Supplementary Material S1 is a plain-language primer for the non-programmer, starting at what a database file is and ending at a first calculation and how to read it. Its closing section teaches what an assessment is built from, so a reader who wants to contribute data for open publication, or to commission a file, arrives knowing what is needed.</w:t>
       </w:r>
     </w:p>
-    <w:bookmarkEnd w:id="719"/>
-    <w:bookmarkStart w:id="729" w:name="implementation-and-architecture"/>
+    <w:bookmarkEnd w:id="889"/>
+    <w:bookmarkStart w:id="899" w:name="implementation-and-architecture"/>
     <w:p>
       <w:pPr>
         <w:pStyle w:val="Heading3"/>
@@ -554,18 +575,18 @@
           <wp:inline>
             <wp:extent cx="5334000" cy="3511838"/>
             <wp:effectExtent b="0" l="0" r="0" t="0"/>
-            <wp:docPr descr="Figure 1: Architecture of Hephaestus. A single dependency-free C core reads the field’s three database dialects (ChemSage .dat, Thermo-Calc .tdb with the Inden magnetic model, and the unified .utdb) and computes all thermodynamics; the same core is used as a native library, from Python through cffi, and compiled to WebAssembly behind the browser application. dbbuild writes new ChemSage files from measured data, and every energy path is validated against pycalphad." title="" id="721" name="Picture"/>
+            <wp:docPr descr="Figure 1: Architecture of Hephaestus. A single dependency-free C core reads the field’s three database dialects (ChemSage .dat, Thermo-Calc .tdb with the Inden magnetic model, and the unified .utdb) and computes all thermodynamics; the same core is used as a native library, from Python through cffi, and compiled to WebAssembly behind the browser application. dbbuild writes new ChemSage files from measured data, and every energy path is validated against pycalphad." title="" id="891" name="Picture"/>
             <a:graphic>
               <a:graphicData uri="http://schemas.openxmlformats.org/drawingml/2006/picture">
                 <pic:pic>
                   <pic:nvPicPr>
-                    <pic:cNvPr descr="figures/fig1_architecture.png" id="722" name="Picture"/>
+                    <pic:cNvPr descr="figures/fig1_architecture.png" id="892" name="Picture"/>
                     <pic:cNvPicPr>
                       <a:picLocks noChangeArrowheads="1" noChangeAspect="1"/>
                     </pic:cNvPicPr>
                   </pic:nvPicPr>
                   <pic:blipFill>
-                    <a:blip r:embed="rId720"/>
+                    <a:blip r:embed="rId890"/>
                     <a:stretch>
                       <a:fillRect/>
                     </a:stretch>
@@ -772,18 +793,18 @@
           <wp:inline>
             <wp:extent cx="4754880" cy="4464799"/>
             <wp:effectExtent b="0" l="0" r="0" t="0"/>
-            <wp:docPr descr="Figure 2: The live solver in the browser application (light theme). The user loads the shipped database, picks a temperature, and presses Compute; the WebAssembly engine then solves the full FeO-MgO-SiO2 phase assemblage client side (here 1023 composition samples and 512 tie-facets in under half a second). Tapping a composition reads its stable phases and pins it to a comparison list; hovering previews on desktop." title="" id="724" name="Picture"/>
+            <wp:docPr descr="Figure 2: The live solver in the browser application (light theme). The user loads the shipped database, picks a temperature, and presses Compute; the WebAssembly engine then solves the full FeO-MgO-SiO2 phase assemblage client side (here 1023 composition samples and 512 tie-facets in under half a second). Tapping a composition reads its stable phases and pins it to a comparison list; hovering previews on desktop." title="" id="894" name="Picture"/>
             <a:graphic>
               <a:graphicData uri="http://schemas.openxmlformats.org/drawingml/2006/picture">
                 <pic:pic>
                   <pic:nvPicPr>
-                    <pic:cNvPr descr="figures/fig2_browser_app.png" id="725" name="Picture"/>
+                    <pic:cNvPr descr="figures/fig2_browser_app.png" id="895" name="Picture"/>
                     <pic:cNvPicPr>
                       <a:picLocks noChangeArrowheads="1" noChangeAspect="1"/>
                     </pic:cNvPicPr>
                   </pic:nvPicPr>
                   <pic:blipFill>
-                    <a:blip r:embed="rId723"/>
+                    <a:blip r:embed="rId893"/>
                     <a:stretch>
                       <a:fillRect/>
                     </a:stretch>
@@ -947,20 +968,20 @@
       <w:r>
         <w:drawing>
           <wp:inline>
-            <wp:extent cx="5334000" cy="2416336"/>
+            <wp:extent cx="5334000" cy="2196772"/>
             <wp:effectExtent b="0" l="0" r="0" t="0"/>
-            <wp:docPr descr="Figure 3: The assessed FeO-MgO-SiO2 system calculated from the shipped database files. (a) Liquidus projection: primary crystallizing phase fields, with liquidus isotherms labeled in °C. (b) Isothermal section at 1600 °C: stable phase assemblages, shaded by the number of solid phases present. Phase labels: L liquid, Crs cristobalite, Ol olivine, Opx orthopyroxene, Per periclase, Wus wustite." title="" id="727" name="Picture"/>
+            <wp:docPr descr="Figure 3: The assessed FeO-MgO-SiO2 system calculated from the shipped database files. (a) Liquidus projection: primary crystallizing phase fields, with liquidus isotherms labeled in °C. (b) Isothermal section at 1600 °C: stable phase assemblages, shaded by the number of solid phases present. Phase labels: L liquid, Crs cristobalite, Ol olivine, Opx orthopyroxene, Per periclase, Wus wustite." title="" id="897" name="Picture"/>
             <a:graphic>
               <a:graphicData uri="http://schemas.openxmlformats.org/drawingml/2006/picture">
                 <pic:pic>
                   <pic:nvPicPr>
-                    <pic:cNvPr descr="figures/fig3_ternary.png" id="728" name="Picture"/>
+                    <pic:cNvPr descr="figures/fig3_ternary.png" id="898" name="Picture"/>
                     <pic:cNvPicPr>
                       <a:picLocks noChangeArrowheads="1" noChangeAspect="1"/>
                     </pic:cNvPicPr>
                   </pic:nvPicPr>
                   <pic:blipFill>
-                    <a:blip r:embed="rId726"/>
+                    <a:blip r:embed="rId896"/>
                     <a:stretch>
                       <a:fillRect/>
                     </a:stretch>
@@ -968,7 +989,7 @@
                   <pic:spPr bwMode="auto">
                     <a:xfrm>
                       <a:off x="0" y="0"/>
-                      <a:ext cx="5334000" cy="2416336"/>
+                      <a:ext cx="5334000" cy="2196772"/>
                     </a:xfrm>
                     <a:prstGeom prst="rect">
                       <a:avLst/>
@@ -1031,6 +1052,7 @@
             <w:pPr>
               <w:keepNext/>
               <w:pStyle w:val="Compact"/>
+              <w:jc w:val="left"/>
             </w:pPr>
             <w:r>
               <w:t xml:space="preserve">System</w:t>
@@ -1043,6 +1065,7 @@
             <w:pPr>
               <w:keepNext/>
               <w:pStyle w:val="Compact"/>
+              <w:jc w:val="left"/>
             </w:pPr>
             <w:r>
               <w:t xml:space="preserve">Fitted liquid excess (J/mol)</w:t>
@@ -1055,6 +1078,7 @@
             <w:pPr>
               <w:keepNext/>
               <w:pStyle w:val="Compact"/>
+              <w:jc w:val="left"/>
             </w:pPr>
             <w:r>
               <w:t xml:space="preserve">Fitted to</w:t>
@@ -1067,6 +1091,7 @@
             <w:pPr>
               <w:keepNext/>
               <w:pStyle w:val="Compact"/>
+              <w:jc w:val="left"/>
             </w:pPr>
             <w:r>
               <w:t xml:space="preserve">Reproduces; known limit</w:t>
@@ -1084,6 +1109,7 @@
             <w:pPr>
               <w:keepNext/>
               <w:pStyle w:val="Compact"/>
+              <w:jc w:val="left"/>
             </w:pPr>
             <w:r>
               <w:t xml:space="preserve">CaO-SiO</w:t>
@@ -1102,6 +1128,7 @@
             <w:pPr>
               <w:keepNext/>
               <w:pStyle w:val="Compact"/>
+              <w:jc w:val="left"/>
             </w:pPr>
             <w:r>
               <w:t xml:space="preserve">(-189764 + 15.71 T) + 57171 χ</w:t>
@@ -1120,6 +1147,7 @@
             <w:pPr>
               <w:keepNext/>
               <w:pStyle w:val="Compact"/>
+              <w:jc w:val="left"/>
             </w:pPr>
             <w:r>
               <w:t xml:space="preserve">silica activities [20,21]; bias-corrected melt-mixing enthalpies [27,28]; endmember and compound melting</w:t>
@@ -1132,6 +1160,7 @@
             <w:pPr>
               <w:keepNext/>
               <w:pStyle w:val="Compact"/>
+              <w:jc w:val="left"/>
             </w:pPr>
             <w:r>
               <w:t xml:space="preserve">mixing enthalpy near -58 kJ/mol at the metasilicate; silica-rich miscibility gap at the right composition but high in temperature</w:t>
@@ -1149,6 +1178,7 @@
             <w:pPr>
               <w:keepNext/>
               <w:pStyle w:val="Compact"/>
+              <w:jc w:val="left"/>
             </w:pPr>
             <w:r>
               <w:t xml:space="preserve">MgO-SiO</w:t>
@@ -1167,6 +1197,7 @@
             <w:pPr>
               <w:keepNext/>
               <w:pStyle w:val="Compact"/>
+              <w:jc w:val="left"/>
             </w:pPr>
             <w:r>
               <w:t xml:space="preserve">five terms in the equivalent fraction Y</w:t>
@@ -1188,6 +1219,7 @@
             <w:pPr>
               <w:keepNext/>
               <w:pStyle w:val="Compact"/>
+              <w:jc w:val="left"/>
             </w:pPr>
             <w:r>
               <w:t xml:space="preserve">measured invariants and immiscibility data [24,25] from five studies, the measured consolute, and solution calorimetry [26]</w:t>
@@ -1200,6 +1232,7 @@
             <w:pPr>
               <w:keepNext/>
               <w:pStyle w:val="Compact"/>
+              <w:jc w:val="left"/>
             </w:pPr>
             <w:r>
               <w:t xml:space="preserve">all four invariants within about 40 °C; calorimetry matched; stable two-liquid field about 340 °C high</w:t>
@@ -1217,6 +1250,7 @@
             <w:pPr>
               <w:keepNext/>
               <w:pStyle w:val="Compact"/>
+              <w:jc w:val="left"/>
             </w:pPr>
             <w:r>
               <w:t xml:space="preserve">FeO-SiO</w:t>
@@ -1235,6 +1269,7 @@
             <w:pPr>
               <w:keepNext/>
               <w:pStyle w:val="Compact"/>
+              <w:jc w:val="left"/>
             </w:pPr>
             <w:r>
               <w:t xml:space="preserve">-42839 + 17.83 T</w:t>
@@ -1247,6 +1282,7 @@
             <w:pPr>
               <w:keepNext/>
               <w:pStyle w:val="Compact"/>
+              <w:jc w:val="left"/>
             </w:pPr>
             <w:r>
               <w:t xml:space="preserve">23 iron-saturated activities across two isotherms [22]</w:t>
@@ -1259,6 +1295,7 @@
             <w:pPr>
               <w:keepNext/>
               <w:pStyle w:val="Compact"/>
+              <w:jc w:val="left"/>
             </w:pPr>
             <w:r>
               <w:t xml:space="preserve">RMS ln a = 0.067; fayalite congruent melting within a few degrees</w:t>
@@ -1275,6 +1312,7 @@
           <w:p>
             <w:pPr>
               <w:pStyle w:val="Compact"/>
+              <w:jc w:val="left"/>
             </w:pPr>
             <w:r>
               <w:t xml:space="preserve">FeO-MgO-SiO</w:t>
@@ -1292,6 +1330,7 @@
           <w:p>
             <w:pPr>
               <w:pStyle w:val="Compact"/>
+              <w:jc w:val="left"/>
             </w:pPr>
             <w:r>
               <w:t xml:space="preserve">binaries combined; no ternary term</w:t>
@@ -1303,6 +1342,7 @@
           <w:p>
             <w:pPr>
               <w:pStyle w:val="Compact"/>
+              <w:jc w:val="left"/>
             </w:pPr>
             <w:r>
               <w:t xml:space="preserve">assembled from the binaries with olivine and orthopyroxene solutions [18,29]</w:t>
@@ -1314,6 +1354,7 @@
           <w:p>
             <w:pPr>
               <w:pStyle w:val="Compact"/>
+              <w:jc w:val="left"/>
             </w:pPr>
             <w:r>
               <w:t xml:space="preserve">measured liquidus-surface topology [23]; stable phase sets match pycalphad at 15 of 16 points</w:t>
@@ -1330,8 +1371,8 @@
         <w:t xml:space="preserve">Table 2: The assessed liquids. Full source lists, modeling judgments, and limits are in each system’s provenance file in the repository.</w:t>
       </w:r>
     </w:p>
-    <w:bookmarkEnd w:id="729"/>
-    <w:bookmarkStart w:id="730" w:name="anatomy-of-a-database-file"/>
+    <w:bookmarkEnd w:id="899"/>
+    <w:bookmarkStart w:id="900" w:name="anatomy-of-a-database-file"/>
     <w:p>
       <w:pPr>
         <w:pStyle w:val="Heading3"/>
@@ -1364,8 +1405,8 @@
         <w:t xml:space="preserve">That asymmetry is the economics of the field in miniature: implementations of the published models are increasingly available, but each fitted parameter condenses dozens of measurements and decisions. Parameter sets rather than codes are therefore the scarce commodity, and an openly licensed, provenance-tracked database is the part of this contribution that cannot be regenerated from the paper alone.</w:t>
       </w:r>
     </w:p>
-    <w:bookmarkEnd w:id="730"/>
-    <w:bookmarkStart w:id="731" w:name="quality-control"/>
+    <w:bookmarkEnd w:id="900"/>
+    <w:bookmarkStart w:id="901" w:name="quality-control"/>
     <w:p>
       <w:pPr>
         <w:pStyle w:val="Heading3"/>
@@ -1379,7 +1420,7 @@
         <w:pStyle w:val="FirstParagraph"/>
       </w:pPr>
       <w:r>
-        <w:t xml:space="preserve">pycalphad is the validation oracle throughout, on the principle that nothing is claimed working until it matches an independent implementation; Table 3 lists the checks. The test suite, 104 tests run with pytest, checks every energy contribution against pycalphad on shared parameters to machine precision, near 10</w:t>
+        <w:t xml:space="preserve">Validation rests on one principle: a number is trusted only when an independent implementation reproduces it. pycalphad plays that role throughout, and Table 3 lists the checks. The pytest suite, 104 tests, compares every energy contribution on shared parameters and agrees to about 10</w:t>
       </w:r>
       <w:r>
         <w:rPr>
@@ -1391,7 +1432,7 @@
         <w:t xml:space="preserve"> </w:t>
       </w:r>
       <w:r>
-        <w:t xml:space="preserve">J per mole of atoms. The reader is tested by loading pycalphad’s open test databases and reproducing their energies with no pycalphad at runtime. The compound energy formalism kernel matches pycalphad on a real multicomponent industrial file with charged species, vacancies, and logarithmic temperature terms. The multiphase construction is tested end to end: a combined file holding the MQMQA liquid, both solid solutions, and three stoichiometric oxides runs through pycalphad’s own equilibrium calculation. The stable phase sets agree at 15 of 16 probe points, with Gibbs energies within about 10 J per mole of atoms; the one disagreement is a facet-resolution sliver at a field boundary. The WebAssembly build is validated in the browser against the same oracle values to machine precision. The TDB front-end is validated the same way, with pycalphad’s own shipped test databases as the corpus: the subset-compatible alloy systems (Al-Zn, Pb-Sn, Al-Mg) load, and every solution phase matches pycalphad’s Gibbs energy at random site fractions and temperatures to about 10</w:t>
+        <w:t xml:space="preserve">J per mole of atoms. The reader proves itself the hard way, by loading pycalphad’s own test databases and reproducing their energies with no pycalphad at runtime. The compound energy formalism kernel matches pycalphad on a real multicomponent industrial file with charged species, vacancies, and logarithmic temperature terms. The multiphase construction is tested end to end: a combined file holding the MQMQA liquid, both solid solutions, and three stoichiometric oxides runs through pycalphad’s own equilibrium calculation. The stable phase sets agree at 15 of 16 probe points, with Gibbs energies within about 10 J per mole of atoms; the one disagreement is a facet-resolution sliver at a field boundary. The WebAssembly build is validated in the browser against the same oracle values to machine precision. The TDB front-end is validated the same way, with pycalphad’s own shipped test databases as the corpus: the subset-compatible alloy systems (Al-Zn, Pb-Sn, Al-Mg) load, and every solution phase matches pycalphad’s Gibbs energy at random site fractions and temperatures to about 10</w:t>
       </w:r>
       <w:r>
         <w:rPr>
@@ -1429,6 +1470,7 @@
             <w:pPr>
               <w:keepNext/>
               <w:pStyle w:val="Compact"/>
+              <w:jc w:val="left"/>
             </w:pPr>
             <w:r>
               <w:t xml:space="preserve">Check</w:t>
@@ -1441,6 +1483,7 @@
             <w:pPr>
               <w:keepNext/>
               <w:pStyle w:val="Compact"/>
+              <w:jc w:val="left"/>
             </w:pPr>
             <w:r>
               <w:t xml:space="preserve">Scope</w:t>
@@ -1453,6 +1496,7 @@
             <w:pPr>
               <w:keepNext/>
               <w:pStyle w:val="Compact"/>
+              <w:jc w:val="left"/>
             </w:pPr>
             <w:r>
               <w:t xml:space="preserve">Agreement</w:t>
@@ -1470,6 +1514,7 @@
             <w:pPr>
               <w:keepNext/>
               <w:pStyle w:val="Compact"/>
+              <w:jc w:val="left"/>
             </w:pPr>
             <w:r>
               <w:t xml:space="preserve">Energy paths (MQMQA reference, ideal, excess; CEF; stoichiometric)</w:t>
@@ -1482,6 +1527,7 @@
             <w:pPr>
               <w:keepNext/>
               <w:pStyle w:val="Compact"/>
+              <w:jc w:val="left"/>
             </w:pPr>
             <w:r>
               <w:t xml:space="preserve">shared parameter sets, every phase model</w:t>
@@ -1494,6 +1540,7 @@
             <w:pPr>
               <w:keepNext/>
               <w:pStyle w:val="Compact"/>
+              <w:jc w:val="left"/>
             </w:pPr>
             <w:r>
               <w:t xml:space="preserve">~10</w:t>
@@ -1523,6 +1570,7 @@
             <w:pPr>
               <w:keepNext/>
               <w:pStyle w:val="Compact"/>
+              <w:jc w:val="left"/>
             </w:pPr>
             <w:r>
               <w:t xml:space="preserve">ChemSage reader</w:t>
@@ -1535,6 +1583,7 @@
             <w:pPr>
               <w:keepNext/>
               <w:pStyle w:val="Compact"/>
+              <w:jc w:val="left"/>
             </w:pPr>
             <w:r>
               <w:t xml:space="preserve">pycalphad’s open test databases, no pycalphad at runtime</w:t>
@@ -1547,6 +1596,7 @@
             <w:pPr>
               <w:keepNext/>
               <w:pStyle w:val="Compact"/>
+              <w:jc w:val="left"/>
             </w:pPr>
             <w:r>
               <w:t xml:space="preserve">energies reproduced to machine precision</w:t>
@@ -1564,6 +1614,7 @@
             <w:pPr>
               <w:keepNext/>
               <w:pStyle w:val="Compact"/>
+              <w:jc w:val="left"/>
             </w:pPr>
             <w:r>
               <w:t xml:space="preserve">CEF kernel</w:t>
@@ -1576,6 +1627,7 @@
             <w:pPr>
               <w:keepNext/>
               <w:pStyle w:val="Compact"/>
+              <w:jc w:val="left"/>
             </w:pPr>
             <w:r>
               <w:t xml:space="preserve">multicomponent industrial file with charges, vacancies, ln T terms</w:t>
@@ -1588,6 +1640,7 @@
             <w:pPr>
               <w:keepNext/>
               <w:pStyle w:val="Compact"/>
+              <w:jc w:val="left"/>
             </w:pPr>
             <w:r>
               <w:t xml:space="preserve">machine precision</w:t>
@@ -1605,6 +1658,7 @@
             <w:pPr>
               <w:keepNext/>
               <w:pStyle w:val="Compact"/>
+              <w:jc w:val="left"/>
             </w:pPr>
             <w:r>
               <w:t xml:space="preserve">Multiphase equilibrium</w:t>
@@ -1617,6 +1671,7 @@
             <w:pPr>
               <w:keepNext/>
               <w:pStyle w:val="Compact"/>
+              <w:jc w:val="left"/>
             </w:pPr>
             <w:r>
               <w:t xml:space="preserve">liquid + two solid solutions + three oxides, 16 probe points</w:t>
@@ -1629,6 +1684,7 @@
             <w:pPr>
               <w:keepNext/>
               <w:pStyle w:val="Compact"/>
+              <w:jc w:val="left"/>
             </w:pPr>
             <w:r>
               <w:t xml:space="preserve">phase sets at 15 of 16; Gibbs energies within ~10 J per mole of atoms</w:t>
@@ -1646,6 +1702,7 @@
             <w:pPr>
               <w:keepNext/>
               <w:pStyle w:val="Compact"/>
+              <w:jc w:val="left"/>
             </w:pPr>
             <w:r>
               <w:t xml:space="preserve">WebAssembly build</w:t>
@@ -1658,6 +1715,7 @@
             <w:pPr>
               <w:keepNext/>
               <w:pStyle w:val="Compact"/>
+              <w:jc w:val="left"/>
             </w:pPr>
             <w:r>
               <w:t xml:space="preserve">in-browser against the same oracle values</w:t>
@@ -1670,6 +1728,7 @@
             <w:pPr>
               <w:keepNext/>
               <w:pStyle w:val="Compact"/>
+              <w:jc w:val="left"/>
             </w:pPr>
             <w:r>
               <w:t xml:space="preserve">machine precision</w:t>
@@ -1687,6 +1746,7 @@
             <w:pPr>
               <w:keepNext/>
               <w:pStyle w:val="Compact"/>
+              <w:jc w:val="left"/>
             </w:pPr>
             <w:r>
               <w:t xml:space="preserve">TDB reader</w:t>
@@ -1699,6 +1759,7 @@
             <w:pPr>
               <w:keepNext/>
               <w:pStyle w:val="Compact"/>
+              <w:jc w:val="left"/>
             </w:pPr>
             <w:r>
               <w:t xml:space="preserve">pycalphad’s shipped alloy TDBs (Al-Zn, Pb-Sn, Al-Mg), every phase and line compound</w:t>
@@ -1711,6 +1772,7 @@
             <w:pPr>
               <w:keepNext/>
               <w:pStyle w:val="Compact"/>
+              <w:jc w:val="left"/>
             </w:pPr>
             <w:r>
               <w:t xml:space="preserve">~10</w:t>
@@ -1740,6 +1802,7 @@
             <w:pPr>
               <w:keepNext/>
               <w:pStyle w:val="Compact"/>
+              <w:jc w:val="left"/>
             </w:pPr>
             <w:r>
               <w:t xml:space="preserve">TDB magnetic model</w:t>
@@ -1752,6 +1815,7 @@
             <w:pPr>
               <w:keepNext/>
               <w:pStyle w:val="Compact"/>
+              <w:jc w:val="left"/>
             </w:pPr>
             <w:r>
               <w:t xml:space="preserve">pycalphad parity + measured pure-iron transitions</w:t>
@@ -1764,6 +1828,7 @@
             <w:pPr>
               <w:keepNext/>
               <w:pStyle w:val="Compact"/>
+              <w:jc w:val="left"/>
             </w:pPr>
             <w:r>
               <w:t xml:space="preserve">matches to 10</w:t>
@@ -1789,6 +1854,7 @@
           <w:p>
             <w:pPr>
               <w:pStyle w:val="Compact"/>
+              <w:jc w:val="left"/>
             </w:pPr>
             <w:r>
               <w:t xml:space="preserve">TDB scope guard</w:t>
@@ -1800,6 +1866,7 @@
           <w:p>
             <w:pPr>
               <w:pStyle w:val="Compact"/>
+              <w:jc w:val="left"/>
             </w:pPr>
             <w:r>
               <w:t xml:space="preserve">ionic-liquid and order-disorder test files</w:t>
@@ -1811,6 +1878,7 @@
           <w:p>
             <w:pPr>
               <w:pStyle w:val="Compact"/>
+              <w:jc w:val="left"/>
             </w:pPr>
             <w:r>
               <w:t xml:space="preserve">rejected, with the reason asserted</w:t>
@@ -1859,9 +1927,9 @@
         <w:t xml:space="preserve">invariants sit within about 40 °C, and the ternary liquidus projection reproduces the measured field topology [23]. Development practice is plain: the repository is version controlled with tagged releases (v0.1.0 through the v0.4.0 described here), the full suite runs before every release, and a fixed bug lands together with the regression test that would have caught it. The suite runs on Windows 11 under CPython 3.11 and 3.12; the browser application is exercised in Chromium- and Gecko-based browsers. A user can confirm a working installation by running pytest against the bundled test databases, or with no installation at all by opening the web application and loading the shipped ternary database.</w:t>
       </w:r>
     </w:p>
-    <w:bookmarkEnd w:id="731"/>
-    <w:bookmarkEnd w:id="732"/>
-    <w:bookmarkStart w:id="740" w:name="availability"/>
+    <w:bookmarkEnd w:id="901"/>
+    <w:bookmarkEnd w:id="902"/>
+    <w:bookmarkStart w:id="910" w:name="availability"/>
     <w:p>
       <w:pPr>
         <w:pStyle w:val="Heading2"/>
@@ -1870,7 +1938,7 @@
         <w:t xml:space="preserve">(2) Availability</w:t>
       </w:r>
     </w:p>
-    <w:bookmarkStart w:id="733" w:name="operating-system"/>
+    <w:bookmarkStart w:id="903" w:name="operating-system"/>
     <w:p>
       <w:pPr>
         <w:pStyle w:val="Heading3"/>
@@ -1887,8 +1955,8 @@
         <w:t xml:space="preserve">Platform independent. The core builds with any C99 compiler; development and testing used Windows 11. The browser application runs in any current browser with WebAssembly support.</w:t>
       </w:r>
     </w:p>
-    <w:bookmarkEnd w:id="733"/>
-    <w:bookmarkStart w:id="734" w:name="programming-language"/>
+    <w:bookmarkEnd w:id="903"/>
+    <w:bookmarkStart w:id="904" w:name="programming-language"/>
     <w:p>
       <w:pPr>
         <w:pStyle w:val="Heading3"/>
@@ -1905,8 +1973,8 @@
         <w:t xml:space="preserve">C (core), Python 3.11 or later (interface and fitting tools), JavaScript (browser application).</w:t>
       </w:r>
     </w:p>
-    <w:bookmarkEnd w:id="734"/>
-    <w:bookmarkStart w:id="735" w:name="additional-system-requirements"/>
+    <w:bookmarkEnd w:id="904"/>
+    <w:bookmarkStart w:id="905" w:name="additional-system-requirements"/>
     <w:p>
       <w:pPr>
         <w:pStyle w:val="Heading3"/>
@@ -1923,8 +1991,8 @@
         <w:t xml:space="preserve">None of note. The engine and database together are a few megabytes.</w:t>
       </w:r>
     </w:p>
-    <w:bookmarkEnd w:id="735"/>
-    <w:bookmarkStart w:id="736" w:name="dependencies"/>
+    <w:bookmarkEnd w:id="905"/>
+    <w:bookmarkStart w:id="906" w:name="dependencies"/>
     <w:p>
       <w:pPr>
         <w:pStyle w:val="Heading3"/>
@@ -1941,8 +2009,8 @@
         <w:t xml:space="preserve">Python interface: cffi, NumPy, SciPy. Validation suite additionally requires pycalphad. WebAssembly build requires emscripten. The C core and the browser application have no dependencies.</w:t>
       </w:r>
     </w:p>
-    <w:bookmarkEnd w:id="736"/>
-    <w:bookmarkStart w:id="737" w:name="list-of-contributors"/>
+    <w:bookmarkEnd w:id="906"/>
+    <w:bookmarkStart w:id="907" w:name="list-of-contributors"/>
     <w:p>
       <w:pPr>
         <w:pStyle w:val="Heading3"/>
@@ -1959,8 +2027,8 @@
         <w:t xml:space="preserve">Michael E. Bustamante (design, implementation, validation, data curation).</w:t>
       </w:r>
     </w:p>
-    <w:bookmarkEnd w:id="737"/>
-    <w:bookmarkStart w:id="738" w:name="software-location"/>
+    <w:bookmarkEnd w:id="907"/>
+    <w:bookmarkStart w:id="908" w:name="software-location"/>
     <w:p>
       <w:pPr>
         <w:pStyle w:val="Heading3"/>
@@ -2113,8 +2181,8 @@
         <w:t xml:space="preserve">Date published: 2026-09-02</w:t>
       </w:r>
     </w:p>
-    <w:bookmarkEnd w:id="738"/>
-    <w:bookmarkStart w:id="739" w:name="language"/>
+    <w:bookmarkEnd w:id="908"/>
+    <w:bookmarkStart w:id="909" w:name="language"/>
     <w:p>
       <w:pPr>
         <w:pStyle w:val="Heading3"/>
@@ -2131,9 +2199,9 @@
         <w:t xml:space="preserve">English.</w:t>
       </w:r>
     </w:p>
-    <w:bookmarkEnd w:id="739"/>
-    <w:bookmarkEnd w:id="740"/>
-    <w:bookmarkStart w:id="748" w:name="reuse-potential"/>
+    <w:bookmarkEnd w:id="909"/>
+    <w:bookmarkEnd w:id="910"/>
+    <w:bookmarkStart w:id="918" w:name="reuse-potential"/>
     <w:p>
       <w:pPr>
         <w:pStyle w:val="Heading2"/>
@@ -2147,7 +2215,7 @@
         <w:pStyle w:val="FirstParagraph"/>
       </w:pPr>
       <w:r>
-        <w:t xml:space="preserve">The nearest reuse is interoperation. Hephaestus reads the same ChemSage format pycalphad reads, and files written by dbbuild load in both, which the tests enforce. A group already working in pycalphad can treat the database as input data and ignore the engine. A group that needs a small embeddable solver can take the C core, two source directories with no dependencies, and call it from C, Python, or anything with a C foreign-function interface.</w:t>
+        <w:t xml:space="preserve">The nearest reuse is interoperation, and it is concrete. Every database in the repository’s data directory is a standard ChemSage file: pycalphad opens the same files this engine ships, files written by dbbuild load in both tools, and the test suite enforces that compatibility on every run, so a group already working in pycalphad can adopt the databases alone and ignore the engine. The reverse path holds too: a TDB an OpenCalphad or Thermo-Calc user already has loads in the browser unchanged, within the documented subset. A group that needs an embeddable solver can take the C core, two source directories of C99 with no dependencies, compiled by any C compiler; its flat ABI covers database reading, phase and parameter access, Gibbs evaluation, and liquid equilibration, callable from C, Python, or anything with a C foreign-function interface, and the WebAssembly build is that same ABI passed through emscripten. Adopting uTDB is a reuse path of its own: the open specification together with the three shipped demonstration files and their round-trip suites amounts to a conformance kit for any implementation that wants to carry MQMQA inside TDB grammar.</w:t>
       </w:r>
     </w:p>
     <w:p>
@@ -2158,7 +2226,7 @@
         <w:t xml:space="preserve">The browser application makes the lowest barrier the default. A lecture on slag thermodynamics, a plant metallurgist screening a composition, or a reviewer checking a claimed equilibrium can load the database and calculate in seconds, with confidential inputs never leaving the machine. The same property makes it a practical template for other groups who want to publish a model as a zero-install tool.</w:t>
       </w:r>
     </w:p>
-    <w:bookmarkStart w:id="747" w:name="worked-examples"/>
+    <w:bookmarkStart w:id="917" w:name="worked-examples"/>
     <w:p>
       <w:pPr>
         <w:pStyle w:val="Heading3"/>
@@ -2204,7 +2272,7 @@
         <w:rPr>
           <w:rStyle w:val="VerbatimChar"/>
         </w:rPr>
-        <w:t xml:space="preserve">db  = Database.read("web/LiCl-KCl.dat")            # the file the browser app ships</w:t>
+        <w:t xml:space="preserve">db  = Database.read("web/LiCl-KCl.dat")         # the file the browser app ships</w:t>
       </w:r>
       <w:r>
         <w:br/>
@@ -2222,7 +2290,7 @@
         <w:rPr>
           <w:rStyle w:val="VerbatimChar"/>
         </w:rPr>
-        <w:t xml:space="preserve">LiCl, KCl = {"LI": 1, "CL": 1}, {"K": 1, "CL": 1}  # endmember element compositions</w:t>
+        <w:t xml:space="preserve">LiCl, KCl = {"LI": 1, "CL": 1}, {"K": 1, "CL": 1}  # endmember compositions</w:t>
       </w:r>
       <w:r>
         <w:br/>
@@ -2252,7 +2320,7 @@
         <w:rPr>
           <w:rStyle w:val="VerbatimChar"/>
         </w:rPr>
-        <w:t xml:space="preserve">    inp    = build_inputs(db, liq, T)              # liquid model at this temperature</w:t>
+        <w:t xml:space="preserve">    inp    = build_inputs(db, liq, T)         # liquid model at this temperature</w:t>
       </w:r>
       <w:r>
         <w:br/>
@@ -2318,7 +2386,7 @@
         <w:rPr>
           <w:rStyle w:val="VerbatimChar"/>
         </w:rPr>
-        <w:t xml:space="preserve">Te, xe = min(liquid_only)                          # coldest all-liquid point = eutectic</w:t>
+        <w:t xml:space="preserve">Te, xe = min(liquid_only)                  # coldest all-liquid point = eutectic</w:t>
       </w:r>
     </w:p>
     <w:p>
@@ -2358,18 +2426,18 @@
           <wp:inline>
             <wp:extent cx="4206240" cy="3108960"/>
             <wp:effectExtent b="0" l="0" r="0" t="0"/>
-            <wp:docPr descr="Figure 4: The LiCl-KCl phase diagram computed by the salt listing from the shipped open database, on the listing’s own grid. Light to dark: liquid, two-phase, and subsolidus fields. The dot is the computed eutectic on this grid (0.400, 640 K); the star is the measured eutectic (0.415, 626 K)." title="" id="742" name="Picture"/>
+            <wp:docPr descr="Figure 4: The LiCl-KCl phase diagram computed by the salt listing from the shipped open database, on the listing’s own grid. Light to dark: liquid, two-phase, and subsolidus fields. The dot is the computed eutectic on this grid (0.400, 640 K); the star is the measured eutectic (0.415, 626 K)." title="" id="912" name="Picture"/>
             <a:graphic>
               <a:graphicData uri="http://schemas.openxmlformats.org/drawingml/2006/picture">
                 <pic:pic>
                   <pic:nvPicPr>
-                    <pic:cNvPr descr="figures/fig4_salt_example.png" id="743" name="Picture"/>
+                    <pic:cNvPr descr="figures/fig4_salt_example.png" id="913" name="Picture"/>
                     <pic:cNvPicPr>
                       <a:picLocks noChangeArrowheads="1" noChangeAspect="1"/>
                     </pic:cNvPicPr>
                   </pic:nvPicPr>
                   <pic:blipFill>
-                    <a:blip r:embed="rId741"/>
+                    <a:blip r:embed="rId911"/>
                     <a:stretch>
                       <a:fillRect/>
                     </a:stretch>
@@ -2432,7 +2500,7 @@
         <w:rPr>
           <w:rStyle w:val="VerbatimChar"/>
         </w:rPr>
-        <w:t xml:space="preserve">db = Database.read("web/AlZn.tdb")                 # Thermo-Calc dialect, same reader</w:t>
+        <w:t xml:space="preserve">db = Database.read("web/AlZn.tdb")            # Thermo-Calc dialect, same reader</w:t>
       </w:r>
       <w:r>
         <w:br/>
@@ -2480,7 +2548,7 @@
         <w:rPr>
           <w:rStyle w:val="VerbatimChar"/>
         </w:rPr>
-        <w:t xml:space="preserve">    for p, name in phases:                         # every CEF phase along the join</w:t>
+        <w:t xml:space="preserve">    for p, name in phases:                      # every CEF phase along the join</w:t>
       </w:r>
       <w:r>
         <w:br/>
@@ -2498,7 +2566,7 @@
         <w:rPr>
           <w:rStyle w:val="VerbatimChar"/>
         </w:rPr>
-        <w:t xml:space="preserve">            pts.append((y, db.cef_gibbs(p, [1.0-y, y], T, per_mole_atoms=True), name))</w:t>
+        <w:t xml:space="preserve">            g = db.cef_gibbs(p, [1.0-y, y], T, per_mole_atoms=True)</w:t>
       </w:r>
       <w:r>
         <w:br/>
@@ -2507,7 +2575,16 @@
         <w:rPr>
           <w:rStyle w:val="VerbatimChar"/>
         </w:rPr>
-        <w:t xml:space="preserve">    hull = lower_hull(pts)                         # 2-D lower convex hull of (x, G)</w:t>
+        <w:t xml:space="preserve">            pts.append((y, g, name))</w:t>
+      </w:r>
+      <w:r>
+        <w:br/>
+      </w:r>
+      <w:r>
+        <w:rPr>
+          <w:rStyle w:val="VerbatimChar"/>
+        </w:rPr>
+        <w:t xml:space="preserve">    hull = lower_hull(pts)                     # 2-D lower convex hull of (x, G)</w:t>
       </w:r>
       <w:r>
         <w:br/>
@@ -2583,18 +2660,18 @@
           <wp:inline>
             <wp:extent cx="4206240" cy="3108960"/>
             <wp:effectExtent b="0" l="0" r="0" t="0"/>
-            <wp:docPr descr="Figure 5: The Al-Zn phase diagram computed by the alloy listing from the shipped open TDB. Light to dark: liquid, liquid plus solid, and solid fields. The dot is the computed eutectic (0.890, 660 K); the star is the assessed eutectic (0.885, 654 K)." title="" id="745" name="Picture"/>
+            <wp:docPr descr="Figure 5: The Al-Zn phase diagram computed by the alloy listing from the shipped open TDB. Light to dark: liquid, liquid plus solid, and solid fields. The dot is the computed eutectic (0.890, 660 K); the star is the assessed eutectic (0.885, 654 K)." title="" id="915" name="Picture"/>
             <a:graphic>
               <a:graphicData uri="http://schemas.openxmlformats.org/drawingml/2006/picture">
                 <pic:pic>
                   <pic:nvPicPr>
-                    <pic:cNvPr descr="figures/fig5_alloy_example.png" id="746" name="Picture"/>
+                    <pic:cNvPr descr="figures/fig5_alloy_example.png" id="916" name="Picture"/>
                     <pic:cNvPicPr>
                       <a:picLocks noChangeArrowheads="1" noChangeAspect="1"/>
                     </pic:cNvPicPr>
                   </pic:nvPicPr>
                   <pic:blipFill>
-                    <a:blip r:embed="rId744"/>
+                    <a:blip r:embed="rId914"/>
                     <a:stretch>
                       <a:fillRect/>
                     </a:stretch>
@@ -2637,9 +2714,17 @@
         <w:t xml:space="preserve">The database is a starting point rather than an endpoint, and the file format rewards growth: new components, new phases, and refits against new measurements accumulate in the same database. A system is therefore extended release by release rather than rebuilt, and archived versions keep results calculated against earlier releases reproducible. Because every value carries its source and every judgment is written down, another assessor can reweight the data, swap an endmember, or extend a system without reverse-engineering anything; dbbuild turns a table of measured activities into a loadable file in a few lines. The in-browser multiphase hull already covers any loaded three-cation file and any loaded alloy TDB join, so a new system becomes a browser phase diagram the moment its file loads. Natural extensions are further oxide systems, the remaining ChemSage solution models, the ionic-liquid TDB model, and multicomponent Scheil on the same hull machinery. The repository also publishes an openly specified unified dialect (uTDB) that carries the MQMQA statements inside TDB grammar, with two shipped demonstration files chosen to be processes rather than curiosities: an aluminum-recycling database holding the Al-Zn alloy with its NaCl-KCl-MgCl2 salt flux, and a steelmaking database holding a basic Fe-C steel, magnetic phases included, with the FeO-MgO-SiO2 slag and its silicate solid solutions. Round-trip tests assert both reproduce their source-file physics at machine precision. Relative to the XML road of XTDB [15] (Table 1), uTDB is the on-ramp from the installed base, extending files as they are and running in this engine today, with mechanical conversion to XTDB elements the natural bridge once that schema settles. Making the calculator multilingual across the field’s file dialects is the direction of travel. Contributions and issues are handled through the GitHub repository.</w:t>
       </w:r>
     </w:p>
-    <w:bookmarkEnd w:id="747"/>
-    <w:bookmarkEnd w:id="748"/>
-    <w:bookmarkStart w:id="749" w:name="data-availability"/>
+    <w:p>
+      <w:pPr>
+        <w:pStyle w:val="BodyText"/>
+      </w:pPr>
+      <w:r>
+        <w:t xml:space="preserve">To close where the paper began: the gap was never the model, which has been published for two decades, but an open, runnable pairing of model and parameters. Hephaestus supplies both halves under open licenses, speaks the field’s three database containers, and puts the result behind a browser page that asks nothing of its user. The claims are checkable end to end. Release v0.4.0 archives the exact version described, the 104-test suite reruns the pycalphad comparisons on any machine, the worked examples print the figures shown, and every parameter in every shipped database traces to a published measurement through its provenance file. A reader who doubts a number can recompute it; one who needs a system that is missing can build it with the same open tools, or ask.</w:t>
+      </w:r>
+    </w:p>
+    <w:bookmarkEnd w:id="917"/>
+    <w:bookmarkEnd w:id="918"/>
+    <w:bookmarkStart w:id="919" w:name="data-availability"/>
     <w:p>
       <w:pPr>
         <w:pStyle w:val="Heading2"/>
@@ -2656,8 +2741,8 @@
         <w:t xml:space="preserve">The engine, the database, the browser application, and the validation suite are openly available in the code repository listed above; the version described here is archived as release v0.4.0. The database files and their provenance records are in the repository’s data directory under CC BY 4.0.</w:t>
       </w:r>
     </w:p>
-    <w:bookmarkEnd w:id="749"/>
-    <w:bookmarkStart w:id="750" w:name="acknowledgements"/>
+    <w:bookmarkEnd w:id="919"/>
+    <w:bookmarkStart w:id="920" w:name="acknowledgements"/>
     <w:p>
       <w:pPr>
         <w:pStyle w:val="Heading2"/>
@@ -2674,8 +2759,8 @@
         <w:t xml:space="preserve">During the development of this software the author used Claude Code (Anthropic) to assist with implementation, validation scripting, and manuscript preparation. This assistance was agentic, not autonomous: it operated under author direction and supervision at every step and was never a closed loop that produced or accepted results without review. Every parameter was traced by the author to its primary source before entering the database, and every reference was verified against its registry record. The author reviewed and approved all output and takes full responsibility for this article.</w:t>
       </w:r>
     </w:p>
-    <w:bookmarkEnd w:id="750"/>
-    <w:bookmarkStart w:id="751" w:name="funding-statement"/>
+    <w:bookmarkEnd w:id="920"/>
+    <w:bookmarkStart w:id="921" w:name="funding-statement"/>
     <w:p>
       <w:pPr>
         <w:pStyle w:val="Heading2"/>
@@ -2692,8 +2777,8 @@
         <w:t xml:space="preserve">The development of this software received no external funding.</w:t>
       </w:r>
     </w:p>
-    <w:bookmarkEnd w:id="751"/>
-    <w:bookmarkStart w:id="752" w:name="competing-interests"/>
+    <w:bookmarkEnd w:id="921"/>
+    <w:bookmarkStart w:id="922" w:name="competing-interests"/>
     <w:p>
       <w:pPr>
         <w:pStyle w:val="Heading2"/>
@@ -2710,8 +2795,8 @@
         <w:t xml:space="preserve">The author founded Odinzen LLC, which provides commercial thermodynamic modeling services, and declares this as a competing interest. The software and database published here are released in full under open licenses, and no proprietary Odinzen assets are included.</w:t>
       </w:r>
     </w:p>
-    <w:bookmarkEnd w:id="752"/>
-    <w:bookmarkStart w:id="753" w:name="references"/>
+    <w:bookmarkEnd w:id="922"/>
+    <w:bookmarkStart w:id="923" w:name="references"/>
     <w:p>
       <w:pPr>
         <w:pStyle w:val="Heading2"/>
@@ -3012,8 +3097,8 @@
         <w:t xml:space="preserve">[35] Dinsdale AT. SGTE data for pure elements. Calphad. 1991 Oct;15(4):317-425. doi:10.1016/0364-5916(91)90030-N</w:t>
       </w:r>
     </w:p>
-    <w:bookmarkEnd w:id="753"/>
-    <w:bookmarkEnd w:id="754"/>
+    <w:bookmarkEnd w:id="923"/>
+    <w:bookmarkEnd w:id="924"/>
     <w:sectPr>
       <w:footnotePr>
         <w:numRestart w:val="eachSect"/>
@@ -3863,7 +3948,7 @@
     <w:basedOn w:val="BodyTextChar"/>
     <w:rPr>
       <w:rFonts w:ascii="Consolas" w:hAnsi="Consolas"/>
-      <w:sz w:val="22"/>
+      <w:sz w:val="18"/>
     </w:rPr>
   </w:style>
   <w:style w:customStyle="1" w:styleId="SectionNumber" w:type="character">
@@ -3910,6 +3995,10 @@
       <w:wordWrap w:val="off"/>
       <w:jc w:val="left"/>
     </w:pPr>
+    <w:rPr>
+      <w:sz w:val="18"/>
+      <w:szCs w:val="18"/>
+    </w:rPr>
   </w:style>
   <w:style w:customStyle="1" w:styleId="KeywordTok" w:type="character">
     <w:name w:val="KeywordTok"/>

</xml_diff>

<commit_message>
Rebuild docx and PDF with the final Figure 3
Co-Authored-By: Claude Fable 5 <noreply@anthropic.com>
</commit_message>
<xml_diff>
--- a/paper/Bustamante_Hephaestus_JORS_manuscript.docx
+++ b/paper/Bustamante_Hephaestus_JORS_manuscript.docx
@@ -2,7 +2,7 @@
 <file path=word/document.xml><?xml version="1.0" encoding="utf-8"?>
 <w:document xmlns:w="http://schemas.openxmlformats.org/wordprocessingml/2006/main" xmlns:m="http://schemas.openxmlformats.org/officeDocument/2006/math" xmlns:r="http://schemas.openxmlformats.org/officeDocument/2006/relationships" xmlns:o="urn:schemas-microsoft-com:office:office" xmlns:v="urn:schemas-microsoft-com:vml" xmlns:w10="urn:schemas-microsoft-com:office:word" xmlns:a="http://schemas.openxmlformats.org/drawingml/2006/main" xmlns:pic="http://schemas.openxmlformats.org/drawingml/2006/picture" xmlns:wp="http://schemas.openxmlformats.org/drawingml/2006/wordprocessingDrawing">
   <w:body>
-    <w:bookmarkStart w:id="924" w:name="X4855b1162e70238fd839d871e0792397dc58430"/>
+    <w:bookmarkStart w:id="958" w:name="X4855b1162e70238fd839d871e0792397dc58430"/>
     <w:p>
       <w:pPr>
         <w:pStyle w:val="Heading1"/>
@@ -159,7 +159,7 @@
         <w:t xml:space="preserve">CALPHAD; molten slag; molten salt; modified quasichemical model; thermodynamic database; phase diagram; WebAssembly; open data</w:t>
       </w:r>
     </w:p>
-    <w:bookmarkStart w:id="902" w:name="overview"/>
+    <w:bookmarkStart w:id="936" w:name="overview"/>
     <w:p>
       <w:pPr>
         <w:pStyle w:val="Heading2"/>
@@ -168,7 +168,7 @@
         <w:t xml:space="preserve">(1) Overview</w:t>
       </w:r>
     </w:p>
-    <w:bookmarkStart w:id="889" w:name="introduction"/>
+    <w:bookmarkStart w:id="923" w:name="introduction"/>
     <w:p>
       <w:pPr>
         <w:pStyle w:val="Heading3"/>
@@ -548,8 +548,8 @@
         <w:t xml:space="preserve">Hephaestus is a deliberate response to that gap, and it treats the engine and the data as one contribution because neither is useful alone. The engine is small on purpose. Its core is plain C with no dependencies, which makes it easy to embed and lets the identical code compile to WebAssembly, so the full calculator runs in a web browser with nothing installed and no data leaving the user’s machine. The database is open on purpose. Every parameter in it derives from published measurements, each value carries its provenance down to table and page, and the known shortcomings are documented next to the numbers they affect. The present work describes both, their validation against pycalphad and against measured phase equilibria, and the ways they can be reused. None of it asks the reader to program. For the experimentalist who never writes code, the browser application is the entire product: a page to open, a database to click, and a diagram to read. The sections that follow describe the machinery underneath for those who want it. Supplementary Material S1 is a plain-language primer for the non-programmer, starting at what a database file is and ending at a first calculation and how to read it. Its closing section teaches what an assessment is built from, so a reader who wants to contribute data for open publication, or to commission a file, arrives knowing what is needed.</w:t>
       </w:r>
     </w:p>
-    <w:bookmarkEnd w:id="889"/>
-    <w:bookmarkStart w:id="899" w:name="implementation-and-architecture"/>
+    <w:bookmarkEnd w:id="923"/>
+    <w:bookmarkStart w:id="933" w:name="implementation-and-architecture"/>
     <w:p>
       <w:pPr>
         <w:pStyle w:val="Heading3"/>
@@ -575,18 +575,18 @@
           <wp:inline>
             <wp:extent cx="5334000" cy="3511838"/>
             <wp:effectExtent b="0" l="0" r="0" t="0"/>
-            <wp:docPr descr="Figure 1: Architecture of Hephaestus. A single dependency-free C core reads the field’s three database dialects (ChemSage .dat, Thermo-Calc .tdb with the Inden magnetic model, and the unified .utdb) and computes all thermodynamics; the same core is used as a native library, from Python through cffi, and compiled to WebAssembly behind the browser application. dbbuild writes new ChemSage files from measured data, and every energy path is validated against pycalphad." title="" id="891" name="Picture"/>
+            <wp:docPr descr="Figure 1: Architecture of Hephaestus. A single dependency-free C core reads the field’s three database dialects (ChemSage .dat, Thermo-Calc .tdb with the Inden magnetic model, and the unified .utdb) and computes all thermodynamics; the same core is used as a native library, from Python through cffi, and compiled to WebAssembly behind the browser application. dbbuild writes new ChemSage files from measured data, and every energy path is validated against pycalphad." title="" id="925" name="Picture"/>
             <a:graphic>
               <a:graphicData uri="http://schemas.openxmlformats.org/drawingml/2006/picture">
                 <pic:pic>
                   <pic:nvPicPr>
-                    <pic:cNvPr descr="figures/fig1_architecture.png" id="892" name="Picture"/>
+                    <pic:cNvPr descr="figures/fig1_architecture.png" id="926" name="Picture"/>
                     <pic:cNvPicPr>
                       <a:picLocks noChangeArrowheads="1" noChangeAspect="1"/>
                     </pic:cNvPicPr>
                   </pic:nvPicPr>
                   <pic:blipFill>
-                    <a:blip r:embed="rId890"/>
+                    <a:blip r:embed="rId924"/>
                     <a:stretch>
                       <a:fillRect/>
                     </a:stretch>
@@ -793,18 +793,18 @@
           <wp:inline>
             <wp:extent cx="4754880" cy="4464799"/>
             <wp:effectExtent b="0" l="0" r="0" t="0"/>
-            <wp:docPr descr="Figure 2: The live solver in the browser application (light theme). The user loads the shipped database, picks a temperature, and presses Compute; the WebAssembly engine then solves the full FeO-MgO-SiO2 phase assemblage client side (here 1023 composition samples and 512 tie-facets in under half a second). Tapping a composition reads its stable phases and pins it to a comparison list; hovering previews on desktop." title="" id="894" name="Picture"/>
+            <wp:docPr descr="Figure 2: The live solver in the browser application (light theme). The user loads the shipped database, picks a temperature, and presses Compute; the WebAssembly engine then solves the full FeO-MgO-SiO2 phase assemblage client side (here 1023 composition samples and 512 tie-facets in under half a second). Tapping a composition reads its stable phases and pins it to a comparison list; hovering previews on desktop." title="" id="928" name="Picture"/>
             <a:graphic>
               <a:graphicData uri="http://schemas.openxmlformats.org/drawingml/2006/picture">
                 <pic:pic>
                   <pic:nvPicPr>
-                    <pic:cNvPr descr="figures/fig2_browser_app.png" id="895" name="Picture"/>
+                    <pic:cNvPr descr="figures/fig2_browser_app.png" id="929" name="Picture"/>
                     <pic:cNvPicPr>
                       <a:picLocks noChangeArrowheads="1" noChangeAspect="1"/>
                     </pic:cNvPicPr>
                   </pic:nvPicPr>
                   <pic:blipFill>
-                    <a:blip r:embed="rId893"/>
+                    <a:blip r:embed="rId927"/>
                     <a:stretch>
                       <a:fillRect/>
                     </a:stretch>
@@ -970,18 +970,18 @@
           <wp:inline>
             <wp:extent cx="5334000" cy="2196772"/>
             <wp:effectExtent b="0" l="0" r="0" t="0"/>
-            <wp:docPr descr="Figure 3: The assessed FeO-MgO-SiO2 system calculated from the shipped database files. (a) Liquidus projection: primary crystallizing phase fields, with liquidus isotherms labeled in °C. (b) Isothermal section at 1600 °C: stable phase assemblages, shaded by the number of solid phases present. Phase labels: L liquid, Crs cristobalite, Ol olivine, Opx orthopyroxene, Per periclase, Wus wustite." title="" id="897" name="Picture"/>
+            <wp:docPr descr="Figure 3: The assessed FeO-MgO-SiO2 system calculated from the shipped database files. (a) Liquidus projection: primary crystallizing phase fields, with liquidus isotherms labeled in °C. (b) Isothermal section at 1600 °C: stable phase assemblages, shaded by the number of solid phases present. Phase labels: L liquid, Crs cristobalite, Ol olivine, Opx orthopyroxene, Per periclase, Wus wustite." title="" id="931" name="Picture"/>
             <a:graphic>
               <a:graphicData uri="http://schemas.openxmlformats.org/drawingml/2006/picture">
                 <pic:pic>
                   <pic:nvPicPr>
-                    <pic:cNvPr descr="figures/fig3_ternary.png" id="898" name="Picture"/>
+                    <pic:cNvPr descr="figures/fig3_ternary.png" id="932" name="Picture"/>
                     <pic:cNvPicPr>
                       <a:picLocks noChangeArrowheads="1" noChangeAspect="1"/>
                     </pic:cNvPicPr>
                   </pic:nvPicPr>
                   <pic:blipFill>
-                    <a:blip r:embed="rId896"/>
+                    <a:blip r:embed="rId930"/>
                     <a:stretch>
                       <a:fillRect/>
                     </a:stretch>
@@ -1371,8 +1371,8 @@
         <w:t xml:space="preserve">Table 2: The assessed liquids. Full source lists, modeling judgments, and limits are in each system’s provenance file in the repository.</w:t>
       </w:r>
     </w:p>
-    <w:bookmarkEnd w:id="899"/>
-    <w:bookmarkStart w:id="900" w:name="anatomy-of-a-database-file"/>
+    <w:bookmarkEnd w:id="933"/>
+    <w:bookmarkStart w:id="934" w:name="anatomy-of-a-database-file"/>
     <w:p>
       <w:pPr>
         <w:pStyle w:val="Heading3"/>
@@ -1405,8 +1405,8 @@
         <w:t xml:space="preserve">That asymmetry is the economics of the field in miniature: implementations of the published models are increasingly available, but each fitted parameter condenses dozens of measurements and decisions. Parameter sets rather than codes are therefore the scarce commodity, and an openly licensed, provenance-tracked database is the part of this contribution that cannot be regenerated from the paper alone.</w:t>
       </w:r>
     </w:p>
-    <w:bookmarkEnd w:id="900"/>
-    <w:bookmarkStart w:id="901" w:name="quality-control"/>
+    <w:bookmarkEnd w:id="934"/>
+    <w:bookmarkStart w:id="935" w:name="quality-control"/>
     <w:p>
       <w:pPr>
         <w:pStyle w:val="Heading3"/>
@@ -1927,9 +1927,9 @@
         <w:t xml:space="preserve">invariants sit within about 40 °C, and the ternary liquidus projection reproduces the measured field topology [23]. Development practice is plain: the repository is version controlled with tagged releases (v0.1.0 through the v0.4.0 described here), the full suite runs before every release, and a fixed bug lands together with the regression test that would have caught it. The suite runs on Windows 11 under CPython 3.11 and 3.12; the browser application is exercised in Chromium- and Gecko-based browsers. A user can confirm a working installation by running pytest against the bundled test databases, or with no installation at all by opening the web application and loading the shipped ternary database.</w:t>
       </w:r>
     </w:p>
-    <w:bookmarkEnd w:id="901"/>
-    <w:bookmarkEnd w:id="902"/>
-    <w:bookmarkStart w:id="910" w:name="availability"/>
+    <w:bookmarkEnd w:id="935"/>
+    <w:bookmarkEnd w:id="936"/>
+    <w:bookmarkStart w:id="944" w:name="availability"/>
     <w:p>
       <w:pPr>
         <w:pStyle w:val="Heading2"/>
@@ -1938,7 +1938,7 @@
         <w:t xml:space="preserve">(2) Availability</w:t>
       </w:r>
     </w:p>
-    <w:bookmarkStart w:id="903" w:name="operating-system"/>
+    <w:bookmarkStart w:id="937" w:name="operating-system"/>
     <w:p>
       <w:pPr>
         <w:pStyle w:val="Heading3"/>
@@ -1955,8 +1955,8 @@
         <w:t xml:space="preserve">Platform independent. The core builds with any C99 compiler; development and testing used Windows 11. The browser application runs in any current browser with WebAssembly support.</w:t>
       </w:r>
     </w:p>
-    <w:bookmarkEnd w:id="903"/>
-    <w:bookmarkStart w:id="904" w:name="programming-language"/>
+    <w:bookmarkEnd w:id="937"/>
+    <w:bookmarkStart w:id="938" w:name="programming-language"/>
     <w:p>
       <w:pPr>
         <w:pStyle w:val="Heading3"/>
@@ -1973,8 +1973,8 @@
         <w:t xml:space="preserve">C (core), Python 3.11 or later (interface and fitting tools), JavaScript (browser application).</w:t>
       </w:r>
     </w:p>
-    <w:bookmarkEnd w:id="904"/>
-    <w:bookmarkStart w:id="905" w:name="additional-system-requirements"/>
+    <w:bookmarkEnd w:id="938"/>
+    <w:bookmarkStart w:id="939" w:name="additional-system-requirements"/>
     <w:p>
       <w:pPr>
         <w:pStyle w:val="Heading3"/>
@@ -1991,8 +1991,8 @@
         <w:t xml:space="preserve">None of note. The engine and database together are a few megabytes.</w:t>
       </w:r>
     </w:p>
-    <w:bookmarkEnd w:id="905"/>
-    <w:bookmarkStart w:id="906" w:name="dependencies"/>
+    <w:bookmarkEnd w:id="939"/>
+    <w:bookmarkStart w:id="940" w:name="dependencies"/>
     <w:p>
       <w:pPr>
         <w:pStyle w:val="Heading3"/>
@@ -2009,8 +2009,8 @@
         <w:t xml:space="preserve">Python interface: cffi, NumPy, SciPy. Validation suite additionally requires pycalphad. WebAssembly build requires emscripten. The C core and the browser application have no dependencies.</w:t>
       </w:r>
     </w:p>
-    <w:bookmarkEnd w:id="906"/>
-    <w:bookmarkStart w:id="907" w:name="list-of-contributors"/>
+    <w:bookmarkEnd w:id="940"/>
+    <w:bookmarkStart w:id="941" w:name="list-of-contributors"/>
     <w:p>
       <w:pPr>
         <w:pStyle w:val="Heading3"/>
@@ -2027,8 +2027,8 @@
         <w:t xml:space="preserve">Michael E. Bustamante (design, implementation, validation, data curation).</w:t>
       </w:r>
     </w:p>
-    <w:bookmarkEnd w:id="907"/>
-    <w:bookmarkStart w:id="908" w:name="software-location"/>
+    <w:bookmarkEnd w:id="941"/>
+    <w:bookmarkStart w:id="942" w:name="software-location"/>
     <w:p>
       <w:pPr>
         <w:pStyle w:val="Heading3"/>
@@ -2181,8 +2181,8 @@
         <w:t xml:space="preserve">Date published: 2026-09-02</w:t>
       </w:r>
     </w:p>
-    <w:bookmarkEnd w:id="908"/>
-    <w:bookmarkStart w:id="909" w:name="language"/>
+    <w:bookmarkEnd w:id="942"/>
+    <w:bookmarkStart w:id="943" w:name="language"/>
     <w:p>
       <w:pPr>
         <w:pStyle w:val="Heading3"/>
@@ -2199,9 +2199,9 @@
         <w:t xml:space="preserve">English.</w:t>
       </w:r>
     </w:p>
-    <w:bookmarkEnd w:id="909"/>
-    <w:bookmarkEnd w:id="910"/>
-    <w:bookmarkStart w:id="918" w:name="reuse-potential"/>
+    <w:bookmarkEnd w:id="943"/>
+    <w:bookmarkEnd w:id="944"/>
+    <w:bookmarkStart w:id="952" w:name="reuse-potential"/>
     <w:p>
       <w:pPr>
         <w:pStyle w:val="Heading2"/>
@@ -2226,7 +2226,7 @@
         <w:t xml:space="preserve">The browser application makes the lowest barrier the default. A lecture on slag thermodynamics, a plant metallurgist screening a composition, or a reviewer checking a claimed equilibrium can load the database and calculate in seconds, with confidential inputs never leaving the machine. The same property makes it a practical template for other groups who want to publish a model as a zero-install tool.</w:t>
       </w:r>
     </w:p>
-    <w:bookmarkStart w:id="917" w:name="worked-examples"/>
+    <w:bookmarkStart w:id="951" w:name="worked-examples"/>
     <w:p>
       <w:pPr>
         <w:pStyle w:val="Heading3"/>
@@ -2426,18 +2426,18 @@
           <wp:inline>
             <wp:extent cx="4206240" cy="3108960"/>
             <wp:effectExtent b="0" l="0" r="0" t="0"/>
-            <wp:docPr descr="Figure 4: The LiCl-KCl phase diagram computed by the salt listing from the shipped open database, on the listing’s own grid. Light to dark: liquid, two-phase, and subsolidus fields. The dot is the computed eutectic on this grid (0.400, 640 K); the star is the measured eutectic (0.415, 626 K)." title="" id="912" name="Picture"/>
+            <wp:docPr descr="Figure 4: The LiCl-KCl phase diagram computed by the salt listing from the shipped open database, on the listing’s own grid. Light to dark: liquid, two-phase, and subsolidus fields. The dot is the computed eutectic on this grid (0.400, 640 K); the star is the measured eutectic (0.415, 626 K)." title="" id="946" name="Picture"/>
             <a:graphic>
               <a:graphicData uri="http://schemas.openxmlformats.org/drawingml/2006/picture">
                 <pic:pic>
                   <pic:nvPicPr>
-                    <pic:cNvPr descr="figures/fig4_salt_example.png" id="913" name="Picture"/>
+                    <pic:cNvPr descr="figures/fig4_salt_example.png" id="947" name="Picture"/>
                     <pic:cNvPicPr>
                       <a:picLocks noChangeArrowheads="1" noChangeAspect="1"/>
                     </pic:cNvPicPr>
                   </pic:nvPicPr>
                   <pic:blipFill>
-                    <a:blip r:embed="rId911"/>
+                    <a:blip r:embed="rId945"/>
                     <a:stretch>
                       <a:fillRect/>
                     </a:stretch>
@@ -2660,18 +2660,18 @@
           <wp:inline>
             <wp:extent cx="4206240" cy="3108960"/>
             <wp:effectExtent b="0" l="0" r="0" t="0"/>
-            <wp:docPr descr="Figure 5: The Al-Zn phase diagram computed by the alloy listing from the shipped open TDB. Light to dark: liquid, liquid plus solid, and solid fields. The dot is the computed eutectic (0.890, 660 K); the star is the assessed eutectic (0.885, 654 K)." title="" id="915" name="Picture"/>
+            <wp:docPr descr="Figure 5: The Al-Zn phase diagram computed by the alloy listing from the shipped open TDB. Light to dark: liquid, liquid plus solid, and solid fields. The dot is the computed eutectic (0.890, 660 K); the star is the assessed eutectic (0.885, 654 K)." title="" id="949" name="Picture"/>
             <a:graphic>
               <a:graphicData uri="http://schemas.openxmlformats.org/drawingml/2006/picture">
                 <pic:pic>
                   <pic:nvPicPr>
-                    <pic:cNvPr descr="figures/fig5_alloy_example.png" id="916" name="Picture"/>
+                    <pic:cNvPr descr="figures/fig5_alloy_example.png" id="950" name="Picture"/>
                     <pic:cNvPicPr>
                       <a:picLocks noChangeArrowheads="1" noChangeAspect="1"/>
                     </pic:cNvPicPr>
                   </pic:nvPicPr>
                   <pic:blipFill>
-                    <a:blip r:embed="rId914"/>
+                    <a:blip r:embed="rId948"/>
                     <a:stretch>
                       <a:fillRect/>
                     </a:stretch>
@@ -2722,9 +2722,9 @@
         <w:t xml:space="preserve">To close where the paper began: the gap was never the model, which has been published for two decades, but an open, runnable pairing of model and parameters. Hephaestus supplies both halves under open licenses, speaks the field’s three database containers, and puts the result behind a browser page that asks nothing of its user. The claims are checkable end to end. Release v0.4.0 archives the exact version described, the 104-test suite reruns the pycalphad comparisons on any machine, the worked examples print the figures shown, and every parameter in every shipped database traces to a published measurement through its provenance file. A reader who doubts a number can recompute it; one who needs a system that is missing can build it with the same open tools, or ask.</w:t>
       </w:r>
     </w:p>
-    <w:bookmarkEnd w:id="917"/>
-    <w:bookmarkEnd w:id="918"/>
-    <w:bookmarkStart w:id="919" w:name="data-availability"/>
+    <w:bookmarkEnd w:id="951"/>
+    <w:bookmarkEnd w:id="952"/>
+    <w:bookmarkStart w:id="953" w:name="data-availability"/>
     <w:p>
       <w:pPr>
         <w:pStyle w:val="Heading2"/>
@@ -2741,8 +2741,8 @@
         <w:t xml:space="preserve">The engine, the database, the browser application, and the validation suite are openly available in the code repository listed above; the version described here is archived as release v0.4.0. The database files and their provenance records are in the repository’s data directory under CC BY 4.0.</w:t>
       </w:r>
     </w:p>
-    <w:bookmarkEnd w:id="919"/>
-    <w:bookmarkStart w:id="920" w:name="acknowledgements"/>
+    <w:bookmarkEnd w:id="953"/>
+    <w:bookmarkStart w:id="954" w:name="acknowledgements"/>
     <w:p>
       <w:pPr>
         <w:pStyle w:val="Heading2"/>
@@ -2759,8 +2759,8 @@
         <w:t xml:space="preserve">During the development of this software the author used Claude Code (Anthropic) to assist with implementation, validation scripting, and manuscript preparation. This assistance was agentic, not autonomous: it operated under author direction and supervision at every step and was never a closed loop that produced or accepted results without review. Every parameter was traced by the author to its primary source before entering the database, and every reference was verified against its registry record. The author reviewed and approved all output and takes full responsibility for this article.</w:t>
       </w:r>
     </w:p>
-    <w:bookmarkEnd w:id="920"/>
-    <w:bookmarkStart w:id="921" w:name="funding-statement"/>
+    <w:bookmarkEnd w:id="954"/>
+    <w:bookmarkStart w:id="955" w:name="funding-statement"/>
     <w:p>
       <w:pPr>
         <w:pStyle w:val="Heading2"/>
@@ -2777,8 +2777,8 @@
         <w:t xml:space="preserve">The development of this software received no external funding.</w:t>
       </w:r>
     </w:p>
-    <w:bookmarkEnd w:id="921"/>
-    <w:bookmarkStart w:id="922" w:name="competing-interests"/>
+    <w:bookmarkEnd w:id="955"/>
+    <w:bookmarkStart w:id="956" w:name="competing-interests"/>
     <w:p>
       <w:pPr>
         <w:pStyle w:val="Heading2"/>
@@ -2795,8 +2795,8 @@
         <w:t xml:space="preserve">The author founded Odinzen LLC, which provides commercial thermodynamic modeling services, and declares this as a competing interest. The software and database published here are released in full under open licenses, and no proprietary Odinzen assets are included.</w:t>
       </w:r>
     </w:p>
-    <w:bookmarkEnd w:id="922"/>
-    <w:bookmarkStart w:id="923" w:name="references"/>
+    <w:bookmarkEnd w:id="956"/>
+    <w:bookmarkStart w:id="957" w:name="references"/>
     <w:p>
       <w:pPr>
         <w:pStyle w:val="Heading2"/>
@@ -3097,8 +3097,8 @@
         <w:t xml:space="preserve">[35] Dinsdale AT. SGTE data for pure elements. Calphad. 1991 Oct;15(4):317-425. doi:10.1016/0364-5916(91)90030-N</w:t>
       </w:r>
     </w:p>
-    <w:bookmarkEnd w:id="923"/>
-    <w:bookmarkEnd w:id="924"/>
+    <w:bookmarkEnd w:id="957"/>
+    <w:bookmarkEnd w:id="958"/>
     <w:sectPr>
       <w:footnotePr>
         <w:numRestart w:val="eachSect"/>

</xml_diff>

<commit_message>
Titles and headings left-aligned in both documents; S1 now runs through the same docx post-build as the manuscript
Co-Authored-By: Claude Fable 5 <noreply@anthropic.com>
</commit_message>
<xml_diff>
--- a/paper/Bustamante_Hephaestus_JORS_manuscript.docx
+++ b/paper/Bustamante_Hephaestus_JORS_manuscript.docx
@@ -2,7 +2,7 @@
 <file path=word/document.xml><?xml version="1.0" encoding="utf-8"?>
 <w:document xmlns:w="http://schemas.openxmlformats.org/wordprocessingml/2006/main" xmlns:m="http://schemas.openxmlformats.org/officeDocument/2006/math" xmlns:r="http://schemas.openxmlformats.org/officeDocument/2006/relationships" xmlns:o="urn:schemas-microsoft-com:office:office" xmlns:v="urn:schemas-microsoft-com:vml" xmlns:w10="urn:schemas-microsoft-com:office:word" xmlns:a="http://schemas.openxmlformats.org/drawingml/2006/main" xmlns:pic="http://schemas.openxmlformats.org/drawingml/2006/picture" xmlns:wp="http://schemas.openxmlformats.org/drawingml/2006/wordprocessingDrawing">
   <w:body>
-    <w:bookmarkStart w:id="958" w:name="X4855b1162e70238fd839d871e0792397dc58430"/>
+    <w:bookmarkStart w:id="992" w:name="X4855b1162e70238fd839d871e0792397dc58430"/>
     <w:p>
       <w:pPr>
         <w:pStyle w:val="Heading1"/>
@@ -159,7 +159,7 @@
         <w:t xml:space="preserve">CALPHAD; molten slag; molten salt; modified quasichemical model; thermodynamic database; phase diagram; WebAssembly; open data</w:t>
       </w:r>
     </w:p>
-    <w:bookmarkStart w:id="936" w:name="overview"/>
+    <w:bookmarkStart w:id="970" w:name="overview"/>
     <w:p>
       <w:pPr>
         <w:pStyle w:val="Heading2"/>
@@ -168,7 +168,7 @@
         <w:t xml:space="preserve">(1) Overview</w:t>
       </w:r>
     </w:p>
-    <w:bookmarkStart w:id="923" w:name="introduction"/>
+    <w:bookmarkStart w:id="957" w:name="introduction"/>
     <w:p>
       <w:pPr>
         <w:pStyle w:val="Heading3"/>
@@ -548,8 +548,8 @@
         <w:t xml:space="preserve">Hephaestus is a deliberate response to that gap, and it treats the engine and the data as one contribution because neither is useful alone. The engine is small on purpose. Its core is plain C with no dependencies, which makes it easy to embed and lets the identical code compile to WebAssembly, so the full calculator runs in a web browser with nothing installed and no data leaving the user’s machine. The database is open on purpose. Every parameter in it derives from published measurements, each value carries its provenance down to table and page, and the known shortcomings are documented next to the numbers they affect. The present work describes both, their validation against pycalphad and against measured phase equilibria, and the ways they can be reused. None of it asks the reader to program. For the experimentalist who never writes code, the browser application is the entire product: a page to open, a database to click, and a diagram to read. The sections that follow describe the machinery underneath for those who want it. Supplementary Material S1 is a plain-language primer for the non-programmer, starting at what a database file is and ending at a first calculation and how to read it. Its closing section teaches what an assessment is built from, so a reader who wants to contribute data for open publication, or to commission a file, arrives knowing what is needed.</w:t>
       </w:r>
     </w:p>
-    <w:bookmarkEnd w:id="923"/>
-    <w:bookmarkStart w:id="933" w:name="implementation-and-architecture"/>
+    <w:bookmarkEnd w:id="957"/>
+    <w:bookmarkStart w:id="967" w:name="implementation-and-architecture"/>
     <w:p>
       <w:pPr>
         <w:pStyle w:val="Heading3"/>
@@ -575,18 +575,18 @@
           <wp:inline>
             <wp:extent cx="5334000" cy="3511838"/>
             <wp:effectExtent b="0" l="0" r="0" t="0"/>
-            <wp:docPr descr="Figure 1: Architecture of Hephaestus. A single dependency-free C core reads the field’s three database dialects (ChemSage .dat, Thermo-Calc .tdb with the Inden magnetic model, and the unified .utdb) and computes all thermodynamics; the same core is used as a native library, from Python through cffi, and compiled to WebAssembly behind the browser application. dbbuild writes new ChemSage files from measured data, and every energy path is validated against pycalphad." title="" id="925" name="Picture"/>
+            <wp:docPr descr="Figure 1: Architecture of Hephaestus. A single dependency-free C core reads the field’s three database dialects (ChemSage .dat, Thermo-Calc .tdb with the Inden magnetic model, and the unified .utdb) and computes all thermodynamics; the same core is used as a native library, from Python through cffi, and compiled to WebAssembly behind the browser application. dbbuild writes new ChemSage files from measured data, and every energy path is validated against pycalphad." title="" id="959" name="Picture"/>
             <a:graphic>
               <a:graphicData uri="http://schemas.openxmlformats.org/drawingml/2006/picture">
                 <pic:pic>
                   <pic:nvPicPr>
-                    <pic:cNvPr descr="figures/fig1_architecture.png" id="926" name="Picture"/>
+                    <pic:cNvPr descr="figures/fig1_architecture.png" id="960" name="Picture"/>
                     <pic:cNvPicPr>
                       <a:picLocks noChangeArrowheads="1" noChangeAspect="1"/>
                     </pic:cNvPicPr>
                   </pic:nvPicPr>
                   <pic:blipFill>
-                    <a:blip r:embed="rId924"/>
+                    <a:blip r:embed="rId958"/>
                     <a:stretch>
                       <a:fillRect/>
                     </a:stretch>
@@ -793,18 +793,18 @@
           <wp:inline>
             <wp:extent cx="4754880" cy="4464799"/>
             <wp:effectExtent b="0" l="0" r="0" t="0"/>
-            <wp:docPr descr="Figure 2: The live solver in the browser application (light theme). The user loads the shipped database, picks a temperature, and presses Compute; the WebAssembly engine then solves the full FeO-MgO-SiO2 phase assemblage client side (here 1023 composition samples and 512 tie-facets in under half a second). Tapping a composition reads its stable phases and pins it to a comparison list; hovering previews on desktop." title="" id="928" name="Picture"/>
+            <wp:docPr descr="Figure 2: The live solver in the browser application (light theme). The user loads the shipped database, picks a temperature, and presses Compute; the WebAssembly engine then solves the full FeO-MgO-SiO2 phase assemblage client side (here 1023 composition samples and 512 tie-facets in under half a second). Tapping a composition reads its stable phases and pins it to a comparison list; hovering previews on desktop." title="" id="962" name="Picture"/>
             <a:graphic>
               <a:graphicData uri="http://schemas.openxmlformats.org/drawingml/2006/picture">
                 <pic:pic>
                   <pic:nvPicPr>
-                    <pic:cNvPr descr="figures/fig2_browser_app.png" id="929" name="Picture"/>
+                    <pic:cNvPr descr="figures/fig2_browser_app.png" id="963" name="Picture"/>
                     <pic:cNvPicPr>
                       <a:picLocks noChangeArrowheads="1" noChangeAspect="1"/>
                     </pic:cNvPicPr>
                   </pic:nvPicPr>
                   <pic:blipFill>
-                    <a:blip r:embed="rId927"/>
+                    <a:blip r:embed="rId961"/>
                     <a:stretch>
                       <a:fillRect/>
                     </a:stretch>
@@ -970,18 +970,18 @@
           <wp:inline>
             <wp:extent cx="5334000" cy="2196772"/>
             <wp:effectExtent b="0" l="0" r="0" t="0"/>
-            <wp:docPr descr="Figure 3: The assessed FeO-MgO-SiO2 system calculated from the shipped database files. (a) Liquidus projection: primary crystallizing phase fields, with liquidus isotherms labeled in °C. (b) Isothermal section at 1600 °C: stable phase assemblages, shaded by the number of solid phases present. Phase labels: L liquid, Crs cristobalite, Ol olivine, Opx orthopyroxene, Per periclase, Wus wustite." title="" id="931" name="Picture"/>
+            <wp:docPr descr="Figure 3: The assessed FeO-MgO-SiO2 system calculated from the shipped database files. (a) Liquidus projection: primary crystallizing phase fields, with liquidus isotherms labeled in °C. (b) Isothermal section at 1600 °C: stable phase assemblages, shaded by the number of solid phases present. Phase labels: L liquid, Crs cristobalite, Ol olivine, Opx orthopyroxene, Per periclase, Wus wustite." title="" id="965" name="Picture"/>
             <a:graphic>
               <a:graphicData uri="http://schemas.openxmlformats.org/drawingml/2006/picture">
                 <pic:pic>
                   <pic:nvPicPr>
-                    <pic:cNvPr descr="figures/fig3_ternary.png" id="932" name="Picture"/>
+                    <pic:cNvPr descr="figures/fig3_ternary.png" id="966" name="Picture"/>
                     <pic:cNvPicPr>
                       <a:picLocks noChangeArrowheads="1" noChangeAspect="1"/>
                     </pic:cNvPicPr>
                   </pic:nvPicPr>
                   <pic:blipFill>
-                    <a:blip r:embed="rId930"/>
+                    <a:blip r:embed="rId964"/>
                     <a:stretch>
                       <a:fillRect/>
                     </a:stretch>
@@ -1371,8 +1371,8 @@
         <w:t xml:space="preserve">Table 2: The assessed liquids. Full source lists, modeling judgments, and limits are in each system’s provenance file in the repository.</w:t>
       </w:r>
     </w:p>
-    <w:bookmarkEnd w:id="933"/>
-    <w:bookmarkStart w:id="934" w:name="anatomy-of-a-database-file"/>
+    <w:bookmarkEnd w:id="967"/>
+    <w:bookmarkStart w:id="968" w:name="anatomy-of-a-database-file"/>
     <w:p>
       <w:pPr>
         <w:pStyle w:val="Heading3"/>
@@ -1405,8 +1405,8 @@
         <w:t xml:space="preserve">That asymmetry is the economics of the field in miniature: implementations of the published models are increasingly available, but each fitted parameter condenses dozens of measurements and decisions. Parameter sets rather than codes are therefore the scarce commodity, and an openly licensed, provenance-tracked database is the part of this contribution that cannot be regenerated from the paper alone.</w:t>
       </w:r>
     </w:p>
-    <w:bookmarkEnd w:id="934"/>
-    <w:bookmarkStart w:id="935" w:name="quality-control"/>
+    <w:bookmarkEnd w:id="968"/>
+    <w:bookmarkStart w:id="969" w:name="quality-control"/>
     <w:p>
       <w:pPr>
         <w:pStyle w:val="Heading3"/>
@@ -1927,9 +1927,9 @@
         <w:t xml:space="preserve">invariants sit within about 40 °C, and the ternary liquidus projection reproduces the measured field topology [23]. Development practice is plain: the repository is version controlled with tagged releases (v0.1.0 through the v0.4.0 described here), the full suite runs before every release, and a fixed bug lands together with the regression test that would have caught it. The suite runs on Windows 11 under CPython 3.11 and 3.12; the browser application is exercised in Chromium- and Gecko-based browsers. A user can confirm a working installation by running pytest against the bundled test databases, or with no installation at all by opening the web application and loading the shipped ternary database.</w:t>
       </w:r>
     </w:p>
-    <w:bookmarkEnd w:id="935"/>
-    <w:bookmarkEnd w:id="936"/>
-    <w:bookmarkStart w:id="944" w:name="availability"/>
+    <w:bookmarkEnd w:id="969"/>
+    <w:bookmarkEnd w:id="970"/>
+    <w:bookmarkStart w:id="978" w:name="availability"/>
     <w:p>
       <w:pPr>
         <w:pStyle w:val="Heading2"/>
@@ -1938,7 +1938,7 @@
         <w:t xml:space="preserve">(2) Availability</w:t>
       </w:r>
     </w:p>
-    <w:bookmarkStart w:id="937" w:name="operating-system"/>
+    <w:bookmarkStart w:id="971" w:name="operating-system"/>
     <w:p>
       <w:pPr>
         <w:pStyle w:val="Heading3"/>
@@ -1955,8 +1955,8 @@
         <w:t xml:space="preserve">Platform independent. The core builds with any C99 compiler; development and testing used Windows 11. The browser application runs in any current browser with WebAssembly support.</w:t>
       </w:r>
     </w:p>
-    <w:bookmarkEnd w:id="937"/>
-    <w:bookmarkStart w:id="938" w:name="programming-language"/>
+    <w:bookmarkEnd w:id="971"/>
+    <w:bookmarkStart w:id="972" w:name="programming-language"/>
     <w:p>
       <w:pPr>
         <w:pStyle w:val="Heading3"/>
@@ -1973,8 +1973,8 @@
         <w:t xml:space="preserve">C (core), Python 3.11 or later (interface and fitting tools), JavaScript (browser application).</w:t>
       </w:r>
     </w:p>
-    <w:bookmarkEnd w:id="938"/>
-    <w:bookmarkStart w:id="939" w:name="additional-system-requirements"/>
+    <w:bookmarkEnd w:id="972"/>
+    <w:bookmarkStart w:id="973" w:name="additional-system-requirements"/>
     <w:p>
       <w:pPr>
         <w:pStyle w:val="Heading3"/>
@@ -1991,8 +1991,8 @@
         <w:t xml:space="preserve">None of note. The engine and database together are a few megabytes.</w:t>
       </w:r>
     </w:p>
-    <w:bookmarkEnd w:id="939"/>
-    <w:bookmarkStart w:id="940" w:name="dependencies"/>
+    <w:bookmarkEnd w:id="973"/>
+    <w:bookmarkStart w:id="974" w:name="dependencies"/>
     <w:p>
       <w:pPr>
         <w:pStyle w:val="Heading3"/>
@@ -2009,8 +2009,8 @@
         <w:t xml:space="preserve">Python interface: cffi, NumPy, SciPy. Validation suite additionally requires pycalphad. WebAssembly build requires emscripten. The C core and the browser application have no dependencies.</w:t>
       </w:r>
     </w:p>
-    <w:bookmarkEnd w:id="940"/>
-    <w:bookmarkStart w:id="941" w:name="list-of-contributors"/>
+    <w:bookmarkEnd w:id="974"/>
+    <w:bookmarkStart w:id="975" w:name="list-of-contributors"/>
     <w:p>
       <w:pPr>
         <w:pStyle w:val="Heading3"/>
@@ -2027,8 +2027,8 @@
         <w:t xml:space="preserve">Michael E. Bustamante (design, implementation, validation, data curation).</w:t>
       </w:r>
     </w:p>
-    <w:bookmarkEnd w:id="941"/>
-    <w:bookmarkStart w:id="942" w:name="software-location"/>
+    <w:bookmarkEnd w:id="975"/>
+    <w:bookmarkStart w:id="976" w:name="software-location"/>
     <w:p>
       <w:pPr>
         <w:pStyle w:val="Heading3"/>
@@ -2181,8 +2181,8 @@
         <w:t xml:space="preserve">Date published: 2026-09-02</w:t>
       </w:r>
     </w:p>
-    <w:bookmarkEnd w:id="942"/>
-    <w:bookmarkStart w:id="943" w:name="language"/>
+    <w:bookmarkEnd w:id="976"/>
+    <w:bookmarkStart w:id="977" w:name="language"/>
     <w:p>
       <w:pPr>
         <w:pStyle w:val="Heading3"/>
@@ -2199,9 +2199,9 @@
         <w:t xml:space="preserve">English.</w:t>
       </w:r>
     </w:p>
-    <w:bookmarkEnd w:id="943"/>
-    <w:bookmarkEnd w:id="944"/>
-    <w:bookmarkStart w:id="952" w:name="reuse-potential"/>
+    <w:bookmarkEnd w:id="977"/>
+    <w:bookmarkEnd w:id="978"/>
+    <w:bookmarkStart w:id="986" w:name="reuse-potential"/>
     <w:p>
       <w:pPr>
         <w:pStyle w:val="Heading2"/>
@@ -2226,7 +2226,7 @@
         <w:t xml:space="preserve">The browser application makes the lowest barrier the default. A lecture on slag thermodynamics, a plant metallurgist screening a composition, or a reviewer checking a claimed equilibrium can load the database and calculate in seconds, with confidential inputs never leaving the machine. The same property makes it a practical template for other groups who want to publish a model as a zero-install tool.</w:t>
       </w:r>
     </w:p>
-    <w:bookmarkStart w:id="951" w:name="worked-examples"/>
+    <w:bookmarkStart w:id="985" w:name="worked-examples"/>
     <w:p>
       <w:pPr>
         <w:pStyle w:val="Heading3"/>
@@ -2426,18 +2426,18 @@
           <wp:inline>
             <wp:extent cx="4206240" cy="3108960"/>
             <wp:effectExtent b="0" l="0" r="0" t="0"/>
-            <wp:docPr descr="Figure 4: The LiCl-KCl phase diagram computed by the salt listing from the shipped open database, on the listing’s own grid. Light to dark: liquid, two-phase, and subsolidus fields. The dot is the computed eutectic on this grid (0.400, 640 K); the star is the measured eutectic (0.415, 626 K)." title="" id="946" name="Picture"/>
+            <wp:docPr descr="Figure 4: The LiCl-KCl phase diagram computed by the salt listing from the shipped open database, on the listing’s own grid. Light to dark: liquid, two-phase, and subsolidus fields. The dot is the computed eutectic on this grid (0.400, 640 K); the star is the measured eutectic (0.415, 626 K)." title="" id="980" name="Picture"/>
             <a:graphic>
               <a:graphicData uri="http://schemas.openxmlformats.org/drawingml/2006/picture">
                 <pic:pic>
                   <pic:nvPicPr>
-                    <pic:cNvPr descr="figures/fig4_salt_example.png" id="947" name="Picture"/>
+                    <pic:cNvPr descr="figures/fig4_salt_example.png" id="981" name="Picture"/>
                     <pic:cNvPicPr>
                       <a:picLocks noChangeArrowheads="1" noChangeAspect="1"/>
                     </pic:cNvPicPr>
                   </pic:nvPicPr>
                   <pic:blipFill>
-                    <a:blip r:embed="rId945"/>
+                    <a:blip r:embed="rId979"/>
                     <a:stretch>
                       <a:fillRect/>
                     </a:stretch>
@@ -2660,18 +2660,18 @@
           <wp:inline>
             <wp:extent cx="4206240" cy="3108960"/>
             <wp:effectExtent b="0" l="0" r="0" t="0"/>
-            <wp:docPr descr="Figure 5: The Al-Zn phase diagram computed by the alloy listing from the shipped open TDB. Light to dark: liquid, liquid plus solid, and solid fields. The dot is the computed eutectic (0.890, 660 K); the star is the assessed eutectic (0.885, 654 K)." title="" id="949" name="Picture"/>
+            <wp:docPr descr="Figure 5: The Al-Zn phase diagram computed by the alloy listing from the shipped open TDB. Light to dark: liquid, liquid plus solid, and solid fields. The dot is the computed eutectic (0.890, 660 K); the star is the assessed eutectic (0.885, 654 K)." title="" id="983" name="Picture"/>
             <a:graphic>
               <a:graphicData uri="http://schemas.openxmlformats.org/drawingml/2006/picture">
                 <pic:pic>
                   <pic:nvPicPr>
-                    <pic:cNvPr descr="figures/fig5_alloy_example.png" id="950" name="Picture"/>
+                    <pic:cNvPr descr="figures/fig5_alloy_example.png" id="984" name="Picture"/>
                     <pic:cNvPicPr>
                       <a:picLocks noChangeArrowheads="1" noChangeAspect="1"/>
                     </pic:cNvPicPr>
                   </pic:nvPicPr>
                   <pic:blipFill>
-                    <a:blip r:embed="rId948"/>
+                    <a:blip r:embed="rId982"/>
                     <a:stretch>
                       <a:fillRect/>
                     </a:stretch>
@@ -2722,9 +2722,9 @@
         <w:t xml:space="preserve">To close where the paper began: the gap was never the model, which has been published for two decades, but an open, runnable pairing of model and parameters. Hephaestus supplies both halves under open licenses, speaks the field’s three database containers, and puts the result behind a browser page that asks nothing of its user. The claims are checkable end to end. Release v0.4.0 archives the exact version described, the 104-test suite reruns the pycalphad comparisons on any machine, the worked examples print the figures shown, and every parameter in every shipped database traces to a published measurement through its provenance file. A reader who doubts a number can recompute it; one who needs a system that is missing can build it with the same open tools, or ask.</w:t>
       </w:r>
     </w:p>
-    <w:bookmarkEnd w:id="951"/>
-    <w:bookmarkEnd w:id="952"/>
-    <w:bookmarkStart w:id="953" w:name="data-availability"/>
+    <w:bookmarkEnd w:id="985"/>
+    <w:bookmarkEnd w:id="986"/>
+    <w:bookmarkStart w:id="987" w:name="data-availability"/>
     <w:p>
       <w:pPr>
         <w:pStyle w:val="Heading2"/>
@@ -2741,8 +2741,8 @@
         <w:t xml:space="preserve">The engine, the database, the browser application, and the validation suite are openly available in the code repository listed above; the version described here is archived as release v0.4.0. The database files and their provenance records are in the repository’s data directory under CC BY 4.0.</w:t>
       </w:r>
     </w:p>
-    <w:bookmarkEnd w:id="953"/>
-    <w:bookmarkStart w:id="954" w:name="acknowledgements"/>
+    <w:bookmarkEnd w:id="987"/>
+    <w:bookmarkStart w:id="988" w:name="acknowledgements"/>
     <w:p>
       <w:pPr>
         <w:pStyle w:val="Heading2"/>
@@ -2759,8 +2759,8 @@
         <w:t xml:space="preserve">During the development of this software the author used Claude Code (Anthropic) to assist with implementation, validation scripting, and manuscript preparation. This assistance was agentic, not autonomous: it operated under author direction and supervision at every step and was never a closed loop that produced or accepted results without review. Every parameter was traced by the author to its primary source before entering the database, and every reference was verified against its registry record. The author reviewed and approved all output and takes full responsibility for this article.</w:t>
       </w:r>
     </w:p>
-    <w:bookmarkEnd w:id="954"/>
-    <w:bookmarkStart w:id="955" w:name="funding-statement"/>
+    <w:bookmarkEnd w:id="988"/>
+    <w:bookmarkStart w:id="989" w:name="funding-statement"/>
     <w:p>
       <w:pPr>
         <w:pStyle w:val="Heading2"/>
@@ -2777,8 +2777,8 @@
         <w:t xml:space="preserve">The development of this software received no external funding.</w:t>
       </w:r>
     </w:p>
-    <w:bookmarkEnd w:id="955"/>
-    <w:bookmarkStart w:id="956" w:name="competing-interests"/>
+    <w:bookmarkEnd w:id="989"/>
+    <w:bookmarkStart w:id="990" w:name="competing-interests"/>
     <w:p>
       <w:pPr>
         <w:pStyle w:val="Heading2"/>
@@ -2795,8 +2795,8 @@
         <w:t xml:space="preserve">The author founded Odinzen LLC, which provides commercial thermodynamic modeling services, and declares this as a competing interest. The software and database published here are released in full under open licenses, and no proprietary Odinzen assets are included.</w:t>
       </w:r>
     </w:p>
-    <w:bookmarkEnd w:id="956"/>
-    <w:bookmarkStart w:id="957" w:name="references"/>
+    <w:bookmarkEnd w:id="990"/>
+    <w:bookmarkStart w:id="991" w:name="references"/>
     <w:p>
       <w:pPr>
         <w:pStyle w:val="Heading2"/>
@@ -3097,8 +3097,8 @@
         <w:t xml:space="preserve">[35] Dinsdale AT. SGTE data for pure elements. Calphad. 1991 Oct;15(4):317-425. doi:10.1016/0364-5916(91)90030-N</w:t>
       </w:r>
     </w:p>
-    <w:bookmarkEnd w:id="957"/>
-    <w:bookmarkEnd w:id="958"/>
+    <w:bookmarkEnd w:id="991"/>
+    <w:bookmarkEnd w:id="992"/>
     <w:sectPr>
       <w:footnotePr>
         <w:numRestart w:val="eachSect"/>
@@ -3387,7 +3387,7 @@
     <w:pPr>
       <w:spacing w:after="80" w:line="240" w:lineRule="auto"/>
       <w:contextualSpacing/>
-      <w:jc w:val="center"/>
+      <w:jc w:val="left"/>
     </w:pPr>
     <w:rPr>
       <w:rFonts w:asciiTheme="majorHAnsi" w:cstheme="majorBidi" w:eastAsiaTheme="majorEastAsia" w:hAnsiTheme="majorHAnsi"/>
@@ -3419,6 +3419,7 @@
       <w:numPr>
         <w:ilvl w:val="1"/>
       </w:numPr>
+      <w:jc w:val="left"/>
     </w:pPr>
     <w:rPr>
       <w:rFonts w:cstheme="majorBidi" w:eastAsiaTheme="majorEastAsia"/>
@@ -3522,6 +3523,7 @@
       <w:keepLines/>
       <w:spacing w:after="80" w:before="360"/>
       <w:outlineLvl w:val="0"/>
+      <w:jc w:val="left"/>
     </w:pPr>
     <w:rPr>
       <w:rFonts w:asciiTheme="majorHAnsi" w:cstheme="majorBidi" w:eastAsiaTheme="majorEastAsia" w:hAnsiTheme="majorHAnsi"/>
@@ -3545,6 +3547,7 @@
       <w:keepLines/>
       <w:spacing w:after="80" w:before="160"/>
       <w:outlineLvl w:val="1"/>
+      <w:jc w:val="left"/>
     </w:pPr>
     <w:rPr>
       <w:rFonts w:asciiTheme="majorHAnsi" w:cstheme="majorBidi" w:eastAsiaTheme="majorEastAsia" w:hAnsiTheme="majorHAnsi"/>
@@ -3568,6 +3571,7 @@
       <w:keepLines/>
       <w:spacing w:after="80" w:before="160"/>
       <w:outlineLvl w:val="2"/>
+      <w:jc w:val="left"/>
     </w:pPr>
     <w:rPr>
       <w:rFonts w:cstheme="majorBidi" w:eastAsiaTheme="majorEastAsia"/>
@@ -3591,6 +3595,7 @@
       <w:keepLines/>
       <w:spacing w:after="40" w:before="80"/>
       <w:outlineLvl w:val="3"/>
+      <w:jc w:val="left"/>
     </w:pPr>
     <w:rPr>
       <w:rFonts w:cstheme="majorBidi" w:eastAsiaTheme="majorEastAsia"/>
@@ -3614,6 +3619,7 @@
       <w:keepLines/>
       <w:spacing w:after="40" w:before="80"/>
       <w:outlineLvl w:val="4"/>
+      <w:jc w:val="left"/>
     </w:pPr>
     <w:rPr>
       <w:rFonts w:cstheme="majorBidi" w:eastAsiaTheme="majorEastAsia"/>
@@ -3635,6 +3641,7 @@
       <w:keepLines/>
       <w:spacing w:after="0" w:before="40"/>
       <w:outlineLvl w:val="5"/>
+      <w:jc w:val="left"/>
     </w:pPr>
     <w:rPr>
       <w:rFonts w:cstheme="majorBidi" w:eastAsiaTheme="majorEastAsia"/>

</xml_diff>

<commit_message>
Full Kristina editorial pass: banned phrases fixed (grid to step size, compute to calculate throughout, this work to the present work), acronyms expanded at first use (TDB, CEF, ABI, SGTE), abstract and reuse long sentences split, colon joiners removed, conclusion de-patterned; all generated figures regenerated at 600+ DPI with generators in repo (new make_fig45.py); figure-caption page binding added to the docx post-build
Co-Authored-By: Claude Fable 5 <noreply@anthropic.com>
</commit_message>
<xml_diff>
--- a/paper/Bustamante_Hephaestus_JORS_manuscript.docx
+++ b/paper/Bustamante_Hephaestus_JORS_manuscript.docx
@@ -2,7 +2,7 @@
 <file path=word/document.xml><?xml version="1.0" encoding="utf-8"?>
 <w:document xmlns:w="http://schemas.openxmlformats.org/wordprocessingml/2006/main" xmlns:m="http://schemas.openxmlformats.org/officeDocument/2006/math" xmlns:r="http://schemas.openxmlformats.org/officeDocument/2006/relationships" xmlns:o="urn:schemas-microsoft-com:office:office" xmlns:v="urn:schemas-microsoft-com:vml" xmlns:w10="urn:schemas-microsoft-com:office:word" xmlns:a="http://schemas.openxmlformats.org/drawingml/2006/main" xmlns:pic="http://schemas.openxmlformats.org/drawingml/2006/picture" xmlns:wp="http://schemas.openxmlformats.org/drawingml/2006/wordprocessingDrawing">
   <w:body>
-    <w:bookmarkStart w:id="992" w:name="X4855b1162e70238fd839d871e0792397dc58430"/>
+    <w:bookmarkStart w:id="1026" w:name="X4855b1162e70238fd839d871e0792397dc58430"/>
     <w:p>
       <w:pPr>
         <w:pStyle w:val="Heading1"/>
@@ -60,7 +60,7 @@
         <w:pStyle w:val="BodyText"/>
       </w:pPr>
       <w:r>
-        <w:t xml:space="preserve">The Modified Quasichemical Model in the Quadruplet Approximation (MQMQA) is the standard thermodynamic description of short-range-ordered ionic melts, and it underpins the commercial databases used throughout pyrometallurgy. Open implementations exist inside larger frameworks, but no freely licensed oxide slag database has been available, so users of open tools have had the model without parameters to run through it. Hephaestus addresses the model and the data together. The engine is a small dependency-free C core with a Python interface and a WebAssembly build, so the same code runs embedded, scripted, or in a browser with nothing installed. It reads ChemSage-format files directly, covering MQMQA liquids, compound energy formalism solid solutions, and stoichiometric compounds; it reads the Thermo-Calc TDB dialect for alloys, including the Inden magnetic contribution real steel files require; and it defines uTDB, an openly specified extension carrying the MQMQA statements inside TDB grammar, demonstrated by shipped aluminum-recycling (Al-Zn alloy with its NaCl-KCl-MgCl</w:t>
+        <w:t xml:space="preserve">The Modified Quasichemical Model in the Quadruplet Approximation (MQMQA) is the standard thermodynamic description of short-range-ordered ionic melts, and it underpins the commercial databases used throughout pyrometallurgy. Open implementations exist inside larger frameworks, but no freely licensed oxide slag database has been available, so users of open tools have had the model without parameters to run through it. Hephaestus addresses the model and the data together. The engine is a small dependency-free C core with a Python interface and a WebAssembly build, so the same code runs embedded, scripted, or in a browser with nothing installed. It reads ChemSage-format files directly, covering MQMQA liquids, compound energy formalism solid solutions, and stoichiometric compounds. It reads the Thermo-Calc TDB dialect for alloys, including the Inden magnetic contribution real steel files require. It also defines uTDB, an openly specified extension carrying the MQMQA statements inside TDB grammar, demonstrated by shipped aluminum-recycling (Al-Zn alloy with its NaCl-KCl-MgCl</w:t>
       </w:r>
       <w:r>
         <w:rPr>
@@ -84,7 +84,7 @@
         <w:t xml:space="preserve"> </w:t>
       </w:r>
       <w:r>
-        <w:t xml:space="preserve">slag) databases; one zero-install page calculates across all three containers. It computes phase equilibria up to full ternary isothermal sections and liquidus projections, and Scheil-Gulliver solidification paths on any binary join. Every energy path is validated to machine precision against pycalphad, and the magnetic model additionally against the measured pure-iron transition temperatures. The companion databases cover the CaO-SiO</w:t>
+        <w:t xml:space="preserve">slag) databases. One zero-install page calculates across all three containers. It calculates phase equilibria up to full ternary isothermal sections and liquidus projections, and Scheil-Gulliver solidification paths on any binary join. Every energy path is validated to machine precision against pycalphad, and the magnetic model additionally against the measured pure-iron transition temperatures. The companion databases cover the CaO-SiO</w:t>
       </w:r>
       <w:r>
         <w:rPr>
@@ -159,7 +159,7 @@
         <w:t xml:space="preserve">CALPHAD; molten slag; molten salt; modified quasichemical model; thermodynamic database; phase diagram; WebAssembly; open data</w:t>
       </w:r>
     </w:p>
-    <w:bookmarkStart w:id="970" w:name="overview"/>
+    <w:bookmarkStart w:id="1004" w:name="overview"/>
     <w:p>
       <w:pPr>
         <w:pStyle w:val="Heading2"/>
@@ -168,7 +168,7 @@
         <w:t xml:space="preserve">(1) Overview</w:t>
       </w:r>
     </w:p>
-    <w:bookmarkStart w:id="957" w:name="introduction"/>
+    <w:bookmarkStart w:id="991" w:name="introduction"/>
     <w:p>
       <w:pPr>
         <w:pStyle w:val="Heading3"/>
@@ -526,7 +526,7 @@
               <w:jc w:val="left"/>
             </w:pPr>
             <w:r>
-              <w:t xml:space="preserve">computed formation energies (Materials Project and kin)</w:t>
+              <w:t xml:space="preserve">calculated formation energies (Materials Project and kin)</w:t>
             </w:r>
           </w:p>
         </w:tc>
@@ -537,7 +537,7 @@
         <w:pStyle w:val="BodyText"/>
       </w:pPr>
       <w:r>
-        <w:t xml:space="preserve">Table 1: The schools of thermodynamic database containers. One need, assessed Gibbs energies behind a calculation, split across mutually unreadable families; this work reads the two CALPHAD dialects and their unified extension in one engine.</w:t>
+        <w:t xml:space="preserve">Table 1: The schools of thermodynamic database containers. One need, assessed Gibbs energies behind a calculation, split across mutually unreadable families; the present work reads the two CALPHAD dialects and their unified extension in one engine.</w:t>
       </w:r>
     </w:p>
     <w:p>
@@ -548,8 +548,8 @@
         <w:t xml:space="preserve">Hephaestus is a deliberate response to that gap, and it treats the engine and the data as one contribution because neither is useful alone. The engine is small on purpose. Its core is plain C with no dependencies, which makes it easy to embed and lets the identical code compile to WebAssembly, so the full calculator runs in a web browser with nothing installed and no data leaving the user’s machine. The database is open on purpose. Every parameter in it derives from published measurements, each value carries its provenance down to table and page, and the known shortcomings are documented next to the numbers they affect. The present work describes both, their validation against pycalphad and against measured phase equilibria, and the ways they can be reused. None of it asks the reader to program. For the experimentalist who never writes code, the browser application is the entire product: a page to open, a database to click, and a diagram to read. The sections that follow describe the machinery underneath for those who want it. Supplementary Material S1 is a plain-language primer for the non-programmer, starting at what a database file is and ending at a first calculation and how to read it. Its closing section teaches what an assessment is built from, so a reader who wants to contribute data for open publication, or to commission a file, arrives knowing what is needed.</w:t>
       </w:r>
     </w:p>
-    <w:bookmarkEnd w:id="957"/>
-    <w:bookmarkStart w:id="967" w:name="implementation-and-architecture"/>
+    <w:bookmarkEnd w:id="991"/>
+    <w:bookmarkStart w:id="1001" w:name="implementation-and-architecture"/>
     <w:p>
       <w:pPr>
         <w:pStyle w:val="Heading3"/>
@@ -573,20 +573,20 @@
       <w:r>
         <w:drawing>
           <wp:inline>
-            <wp:extent cx="5334000" cy="3511838"/>
+            <wp:extent cx="5334000" cy="3511167"/>
             <wp:effectExtent b="0" l="0" r="0" t="0"/>
-            <wp:docPr descr="Figure 1: Architecture of Hephaestus. A single dependency-free C core reads the field’s three database dialects (ChemSage .dat, Thermo-Calc .tdb with the Inden magnetic model, and the unified .utdb) and computes all thermodynamics; the same core is used as a native library, from Python through cffi, and compiled to WebAssembly behind the browser application. dbbuild writes new ChemSage files from measured data, and every energy path is validated against pycalphad." title="" id="959" name="Picture"/>
+            <wp:docPr descr="Figure 1: Architecture of Hephaestus. A single dependency-free C core reads the field’s three database dialects (ChemSage .dat, Thermo-Calc .tdb with the Inden magnetic model, and the unified .utdb) and calculates all thermodynamics; the same core is used as a native library, from Python through cffi, and compiled to WebAssembly behind the browser application. dbbuild writes new ChemSage files from measured data, and every energy path is validated against pycalphad." title="" id="993" name="Picture"/>
             <a:graphic>
               <a:graphicData uri="http://schemas.openxmlformats.org/drawingml/2006/picture">
                 <pic:pic>
                   <pic:nvPicPr>
-                    <pic:cNvPr descr="figures/fig1_architecture.png" id="960" name="Picture"/>
+                    <pic:cNvPr descr="figures/fig1_architecture.png" id="994" name="Picture"/>
                     <pic:cNvPicPr>
                       <a:picLocks noChangeArrowheads="1" noChangeAspect="1"/>
                     </pic:cNvPicPr>
                   </pic:nvPicPr>
                   <pic:blipFill>
-                    <a:blip r:embed="rId958"/>
+                    <a:blip r:embed="rId992"/>
                     <a:stretch>
                       <a:fillRect/>
                     </a:stretch>
@@ -594,7 +594,7 @@
                   <pic:spPr bwMode="auto">
                     <a:xfrm>
                       <a:off x="0" y="0"/>
-                      <a:ext cx="5334000" cy="3511838"/>
+                      <a:ext cx="5334000" cy="3511167"/>
                     </a:xfrm>
                     <a:prstGeom prst="rect">
                       <a:avLst/>
@@ -618,15 +618,15 @@
         <w:pStyle w:val="ImageCaption"/>
       </w:pPr>
       <w:r>
-        <w:t xml:space="preserve">Figure 1: Architecture of Hephaestus. A single dependency-free C core reads the field’s three database dialects (ChemSage .dat, Thermo-Calc .tdb with the Inden magnetic model, and the unified .utdb) and computes all thermodynamics; the same core is used as a native library, from Python through cffi, and compiled to WebAssembly behind the browser application. dbbuild writes new ChemSage files from measured data, and every energy path is validated against pycalphad.</w:t>
-      </w:r>
-    </w:p>
-    <w:p>
-      <w:pPr>
-        <w:pStyle w:val="BodyText"/>
-      </w:pPr>
-      <w:r>
-        <w:t xml:space="preserve">The core implements the MQMQA Gibbs energy of Pelton, Chartrand and Eriksson [1]: the pair reference energy, the configurational entropy of the quadruplet distribution, and the excess energy with composition-dependent interaction terms, together with the recursive coordination-number rules, including reciprocal quadruplets. Solid solutions use the compound energy formalism [16], with sublattice site fractions, per-sublattice ideal entropy, and Redlich-Kister excess terms; the Gibbs energy is normalized per mole of real atoms, so vacancy-bearing phases come out on the same basis pycalphad uses. A reader for the ChemSage data format, the file lineage of the ChemSage and ChemApp equilibrium programs [17], loads MQMQA liquids (SUBQ and SUBG blocks), compound energy formalism phases (SUBL, including the magnetic variant), and stoichiometric compounds, with multi-interval Gibbs functions and the additional-term forms such as T</w:t>
+        <w:t xml:space="preserve">Figure 1: Architecture of Hephaestus. A single dependency-free C core reads the field’s three database dialects (ChemSage .dat, Thermo-Calc .tdb with the Inden magnetic model, and the unified .utdb) and calculates all thermodynamics; the same core is used as a native library, from Python through cffi, and compiled to WebAssembly behind the browser application. dbbuild writes new ChemSage files from measured data, and every energy path is validated against pycalphad.</w:t>
+      </w:r>
+    </w:p>
+    <w:p>
+      <w:pPr>
+        <w:pStyle w:val="BodyText"/>
+      </w:pPr>
+      <w:r>
+        <w:t xml:space="preserve">The core implements the MQMQA Gibbs energy of Pelton, Chartrand and Eriksson [1]: the pair reference energy, the configurational entropy of the quadruplet distribution, and the excess energy with composition-dependent interaction terms, together with the recursive coordination-number rules, including reciprocal quadruplets. Solid solutions use the compound energy formalism (CEF) [16], with sublattice site fractions, per-sublattice ideal entropy, and Redlich-Kister excess terms; the Gibbs energy is normalized per mole of real atoms, so vacancy-bearing phases come out on the same basis pycalphad uses. A reader for the ChemSage data format, the file lineage of the ChemSage and ChemApp equilibrium programs [17], loads MQMQA liquids (SUBQ and SUBG blocks), compound energy formalism phases (SUBL, including the magnetic variant), and stoichiometric compounds, with multi-interval Gibbs functions and the additional-term forms such as T</w:t>
       </w:r>
       <w:r>
         <w:rPr>
@@ -666,7 +666,7 @@
         <w:pStyle w:val="BodyText"/>
       </w:pPr>
       <w:r>
-        <w:t xml:space="preserve">The same core also reads the Thermo-Calc TDB dialect, the lingua franca of alloy CALPHAD shared by Thermo-Calc [13], OpenCalphad [7], and pycalphad [8]. TDB files parse into the same internal database, so the accessors, the Python layer, and the browser work unchanged, and the format is auto-detected on load. The supported subset covers elements, species, piecewise FUNCTION expressions with nested references, compound energy formalism phases with vacancies, Redlich-Kister interactions of any order, and the Inden magnetic contribution (TC and BMAGN parameters with their antiferromagnetic factors), which brings real steel files into scope; models outside the subset, such as order-disorder partitioning and the ionic two-sublattice liquid, are rejected with a stated reason rather than computed incompletely. Temperature extrapolation above a function’s last interval follows the Thermo-Calc convention for TDB data while ChemSage data keep their own zero-above convention. MQMQA liquids have no TDB representation, so melts remain the province of the .dat dialect; the two families meet in one engine.</w:t>
+        <w:t xml:space="preserve">The same core also reads the Thermo-Calc TDB (thermodynamic database) dialect, the lingua franca of alloy CALPHAD shared by Thermo-Calc [13], OpenCalphad [7], and pycalphad [8]. TDB files parse into the same internal database, so the accessors, the Python layer, and the browser work unchanged, and the format is auto-detected on load. The supported subset covers elements, species, piecewise FUNCTION expressions with nested references, compound energy formalism phases with vacancies, Redlich-Kister interactions of any order, and the Inden magnetic contribution (TC and BMAGN parameters with their antiferromagnetic factors), which brings real steel files into scope; models outside the subset, such as order-disorder partitioning and the ionic two-sublattice liquid, are rejected with a stated reason rather than calculated incompletely. Temperature extrapolation above a function’s last interval follows the Thermo-Calc convention for TDB data while ChemSage data keep their own zero-above convention. MQMQA liquids have no TDB representation, so melts remain the province of the .dat dialect; the two families meet in one engine.</w:t>
       </w:r>
     </w:p>
     <w:p>
@@ -793,18 +793,18 @@
           <wp:inline>
             <wp:extent cx="4754880" cy="4464799"/>
             <wp:effectExtent b="0" l="0" r="0" t="0"/>
-            <wp:docPr descr="Figure 2: The live solver in the browser application (light theme). The user loads the shipped database, picks a temperature, and presses Compute; the WebAssembly engine then solves the full FeO-MgO-SiO2 phase assemblage client side (here 1023 composition samples and 512 tie-facets in under half a second). Tapping a composition reads its stable phases and pins it to a comparison list; hovering previews on desktop." title="" id="962" name="Picture"/>
+            <wp:docPr descr="Figure 2: The live solver in the browser application (light theme). The user loads the shipped database, picks a temperature, and presses Compute; the WebAssembly engine then solves the full FeO-MgO-SiO2 phase assemblage client side (here 1023 composition samples and 512 tie-facets in under half a second). Tapping a composition reads its stable phases and pins it to a comparison list; hovering previews on desktop." title="" id="996" name="Picture"/>
             <a:graphic>
               <a:graphicData uri="http://schemas.openxmlformats.org/drawingml/2006/picture">
                 <pic:pic>
                   <pic:nvPicPr>
-                    <pic:cNvPr descr="figures/fig2_browser_app.png" id="963" name="Picture"/>
+                    <pic:cNvPr descr="figures/fig2_browser_app.png" id="997" name="Picture"/>
                     <pic:cNvPicPr>
                       <a:picLocks noChangeArrowheads="1" noChangeAspect="1"/>
                     </pic:cNvPicPr>
                   </pic:nvPicPr>
                   <pic:blipFill>
-                    <a:blip r:embed="rId961"/>
+                    <a:blip r:embed="rId995"/>
                     <a:stretch>
                       <a:fillRect/>
                     </a:stretch>
@@ -968,20 +968,20 @@
       <w:r>
         <w:drawing>
           <wp:inline>
-            <wp:extent cx="5334000" cy="2196772"/>
+            <wp:extent cx="5334000" cy="2197297"/>
             <wp:effectExtent b="0" l="0" r="0" t="0"/>
-            <wp:docPr descr="Figure 3: The assessed FeO-MgO-SiO2 system calculated from the shipped database files. (a) Liquidus projection: primary crystallizing phase fields, with liquidus isotherms labeled in °C. (b) Isothermal section at 1600 °C: stable phase assemblages, shaded by the number of solid phases present. Phase labels: L liquid, Crs cristobalite, Ol olivine, Opx orthopyroxene, Per periclase, Wus wustite." title="" id="965" name="Picture"/>
+            <wp:docPr descr="Figure 3: The assessed FeO-MgO-SiO2 system calculated from the shipped database files. (a) Liquidus projection: primary crystallizing phase fields, with liquidus isotherms labeled in °C. (b) Isothermal section at 1600 °C: stable phase assemblages, shaded by the number of solid phases present. Phase labels: L liquid, Crs cristobalite, Ol olivine, Opx orthopyroxene, Per periclase, Wus wustite." title="" id="999" name="Picture"/>
             <a:graphic>
               <a:graphicData uri="http://schemas.openxmlformats.org/drawingml/2006/picture">
                 <pic:pic>
                   <pic:nvPicPr>
-                    <pic:cNvPr descr="figures/fig3_ternary.png" id="966" name="Picture"/>
+                    <pic:cNvPr descr="figures/fig3_ternary.png" id="1000" name="Picture"/>
                     <pic:cNvPicPr>
                       <a:picLocks noChangeArrowheads="1" noChangeAspect="1"/>
                     </pic:cNvPicPr>
                   </pic:nvPicPr>
                   <pic:blipFill>
-                    <a:blip r:embed="rId964"/>
+                    <a:blip r:embed="rId998"/>
                     <a:stretch>
                       <a:fillRect/>
                     </a:stretch>
@@ -989,7 +989,7 @@
                   <pic:spPr bwMode="auto">
                     <a:xfrm>
                       <a:off x="0" y="0"/>
-                      <a:ext cx="5334000" cy="2196772"/>
+                      <a:ext cx="5334000" cy="2197297"/>
                     </a:xfrm>
                     <a:prstGeom prst="rect">
                       <a:avLst/>
@@ -1371,8 +1371,8 @@
         <w:t xml:space="preserve">Table 2: The assessed liquids. Full source lists, modeling judgments, and limits are in each system’s provenance file in the repository.</w:t>
       </w:r>
     </w:p>
-    <w:bookmarkEnd w:id="967"/>
-    <w:bookmarkStart w:id="968" w:name="anatomy-of-a-database-file"/>
+    <w:bookmarkEnd w:id="1001"/>
+    <w:bookmarkStart w:id="1002" w:name="anatomy-of-a-database-file"/>
     <w:p>
       <w:pPr>
         <w:pStyle w:val="Heading3"/>
@@ -1405,8 +1405,8 @@
         <w:t xml:space="preserve">That asymmetry is the economics of the field in miniature: implementations of the published models are increasingly available, but each fitted parameter condenses dozens of measurements and decisions. Parameter sets rather than codes are therefore the scarce commodity, and an openly licensed, provenance-tracked database is the part of this contribution that cannot be regenerated from the paper alone.</w:t>
       </w:r>
     </w:p>
-    <w:bookmarkEnd w:id="968"/>
-    <w:bookmarkStart w:id="969" w:name="quality-control"/>
+    <w:bookmarkEnd w:id="1002"/>
+    <w:bookmarkStart w:id="1003" w:name="quality-control"/>
     <w:p>
       <w:pPr>
         <w:pStyle w:val="Heading3"/>
@@ -1420,7 +1420,7 @@
         <w:pStyle w:val="FirstParagraph"/>
       </w:pPr>
       <w:r>
-        <w:t xml:space="preserve">Validation rests on one principle: a number is trusted only when an independent implementation reproduces it. pycalphad plays that role throughout, and Table 3 lists the checks. The pytest suite, 104 tests, compares every energy contribution on shared parameters and agrees to about 10</w:t>
+        <w:t xml:space="preserve">Validation rests on one principle. A number is trusted only when an independent implementation reproduces it. pycalphad plays that role throughout, and Table 3 lists the checks. The pytest suite, 104 tests, compares every energy contribution on shared parameters and agrees to about 10</w:t>
       </w:r>
       <w:r>
         <w:rPr>
@@ -1927,9 +1927,9 @@
         <w:t xml:space="preserve">invariants sit within about 40 °C, and the ternary liquidus projection reproduces the measured field topology [23]. Development practice is plain: the repository is version controlled with tagged releases (v0.1.0 through the v0.4.0 described here), the full suite runs before every release, and a fixed bug lands together with the regression test that would have caught it. The suite runs on Windows 11 under CPython 3.11 and 3.12; the browser application is exercised in Chromium- and Gecko-based browsers. A user can confirm a working installation by running pytest against the bundled test databases, or with no installation at all by opening the web application and loading the shipped ternary database.</w:t>
       </w:r>
     </w:p>
-    <w:bookmarkEnd w:id="969"/>
-    <w:bookmarkEnd w:id="970"/>
-    <w:bookmarkStart w:id="978" w:name="availability"/>
+    <w:bookmarkEnd w:id="1003"/>
+    <w:bookmarkEnd w:id="1004"/>
+    <w:bookmarkStart w:id="1012" w:name="availability"/>
     <w:p>
       <w:pPr>
         <w:pStyle w:val="Heading2"/>
@@ -1938,7 +1938,7 @@
         <w:t xml:space="preserve">(2) Availability</w:t>
       </w:r>
     </w:p>
-    <w:bookmarkStart w:id="971" w:name="operating-system"/>
+    <w:bookmarkStart w:id="1005" w:name="operating-system"/>
     <w:p>
       <w:pPr>
         <w:pStyle w:val="Heading3"/>
@@ -1955,8 +1955,8 @@
         <w:t xml:space="preserve">Platform independent. The core builds with any C99 compiler; development and testing used Windows 11. The browser application runs in any current browser with WebAssembly support.</w:t>
       </w:r>
     </w:p>
-    <w:bookmarkEnd w:id="971"/>
-    <w:bookmarkStart w:id="972" w:name="programming-language"/>
+    <w:bookmarkEnd w:id="1005"/>
+    <w:bookmarkStart w:id="1006" w:name="programming-language"/>
     <w:p>
       <w:pPr>
         <w:pStyle w:val="Heading3"/>
@@ -1973,8 +1973,8 @@
         <w:t xml:space="preserve">C (core), Python 3.11 or later (interface and fitting tools), JavaScript (browser application).</w:t>
       </w:r>
     </w:p>
-    <w:bookmarkEnd w:id="972"/>
-    <w:bookmarkStart w:id="973" w:name="additional-system-requirements"/>
+    <w:bookmarkEnd w:id="1006"/>
+    <w:bookmarkStart w:id="1007" w:name="additional-system-requirements"/>
     <w:p>
       <w:pPr>
         <w:pStyle w:val="Heading3"/>
@@ -1991,8 +1991,8 @@
         <w:t xml:space="preserve">None of note. The engine and database together are a few megabytes.</w:t>
       </w:r>
     </w:p>
-    <w:bookmarkEnd w:id="973"/>
-    <w:bookmarkStart w:id="974" w:name="dependencies"/>
+    <w:bookmarkEnd w:id="1007"/>
+    <w:bookmarkStart w:id="1008" w:name="dependencies"/>
     <w:p>
       <w:pPr>
         <w:pStyle w:val="Heading3"/>
@@ -2009,8 +2009,8 @@
         <w:t xml:space="preserve">Python interface: cffi, NumPy, SciPy. Validation suite additionally requires pycalphad. WebAssembly build requires emscripten. The C core and the browser application have no dependencies.</w:t>
       </w:r>
     </w:p>
-    <w:bookmarkEnd w:id="974"/>
-    <w:bookmarkStart w:id="975" w:name="list-of-contributors"/>
+    <w:bookmarkEnd w:id="1008"/>
+    <w:bookmarkStart w:id="1009" w:name="list-of-contributors"/>
     <w:p>
       <w:pPr>
         <w:pStyle w:val="Heading3"/>
@@ -2027,8 +2027,8 @@
         <w:t xml:space="preserve">Michael E. Bustamante (design, implementation, validation, data curation).</w:t>
       </w:r>
     </w:p>
-    <w:bookmarkEnd w:id="975"/>
-    <w:bookmarkStart w:id="976" w:name="software-location"/>
+    <w:bookmarkEnd w:id="1009"/>
+    <w:bookmarkStart w:id="1010" w:name="software-location"/>
     <w:p>
       <w:pPr>
         <w:pStyle w:val="Heading3"/>
@@ -2181,8 +2181,8 @@
         <w:t xml:space="preserve">Date published: 2026-09-02</w:t>
       </w:r>
     </w:p>
-    <w:bookmarkEnd w:id="976"/>
-    <w:bookmarkStart w:id="977" w:name="language"/>
+    <w:bookmarkEnd w:id="1010"/>
+    <w:bookmarkStart w:id="1011" w:name="language"/>
     <w:p>
       <w:pPr>
         <w:pStyle w:val="Heading3"/>
@@ -2199,9 +2199,9 @@
         <w:t xml:space="preserve">English.</w:t>
       </w:r>
     </w:p>
-    <w:bookmarkEnd w:id="977"/>
-    <w:bookmarkEnd w:id="978"/>
-    <w:bookmarkStart w:id="986" w:name="reuse-potential"/>
+    <w:bookmarkEnd w:id="1011"/>
+    <w:bookmarkEnd w:id="1012"/>
+    <w:bookmarkStart w:id="1020" w:name="reuse-potential"/>
     <w:p>
       <w:pPr>
         <w:pStyle w:val="Heading2"/>
@@ -2215,7 +2215,7 @@
         <w:pStyle w:val="FirstParagraph"/>
       </w:pPr>
       <w:r>
-        <w:t xml:space="preserve">The nearest reuse is interoperation, and it is concrete. Every database in the repository’s data directory is a standard ChemSage file: pycalphad opens the same files this engine ships, files written by dbbuild load in both tools, and the test suite enforces that compatibility on every run, so a group already working in pycalphad can adopt the databases alone and ignore the engine. The reverse path holds too: a TDB an OpenCalphad or Thermo-Calc user already has loads in the browser unchanged, within the documented subset. A group that needs an embeddable solver can take the C core, two source directories of C99 with no dependencies, compiled by any C compiler; its flat ABI covers database reading, phase and parameter access, Gibbs evaluation, and liquid equilibration, callable from C, Python, or anything with a C foreign-function interface, and the WebAssembly build is that same ABI passed through emscripten. Adopting uTDB is a reuse path of its own: the open specification together with the three shipped demonstration files and their round-trip suites amounts to a conformance kit for any implementation that wants to carry MQMQA inside TDB grammar.</w:t>
+        <w:t xml:space="preserve">The nearest reuse is interoperation, and it is concrete. Every database in the repository’s data directory is a standard ChemSage file: pycalphad opens the same files this engine ships, files written by dbbuild load in both tools, and the test suite enforces that compatibility on every run, so a group already working in pycalphad can adopt the databases alone and ignore the engine. The reverse path holds too: a TDB an OpenCalphad or Thermo-Calc user already has loads in the browser unchanged, within the documented subset. A group that needs an embeddable solver can take the C core, two source directories of C99 with no dependencies, compiled by any C compiler. Its flat application binary interface (ABI) covers database reading, phase and parameter access, Gibbs evaluation, and liquid equilibration, callable from C, Python, or anything with a C foreign-function interface. The WebAssembly build is that same ABI passed through emscripten. Adopting uTDB is a reuse path of its own: the open specification together with the three shipped demonstration files and their round-trip suites amounts to a conformance kit for any implementation that wants to carry MQMQA inside TDB grammar.</w:t>
       </w:r>
     </w:p>
     <w:p>
@@ -2226,7 +2226,7 @@
         <w:t xml:space="preserve">The browser application makes the lowest barrier the default. A lecture on slag thermodynamics, a plant metallurgist screening a composition, or a reviewer checking a claimed equilibrium can load the database and calculate in seconds, with confidential inputs never leaving the machine. The same property makes it a practical template for other groups who want to publish a model as a zero-install tool.</w:t>
       </w:r>
     </w:p>
-    <w:bookmarkStart w:id="985" w:name="worked-examples"/>
+    <w:bookmarkStart w:id="1019" w:name="worked-examples"/>
     <w:p>
       <w:pPr>
         <w:pStyle w:val="Heading3"/>
@@ -2240,7 +2240,7 @@
         <w:pStyle w:val="FirstParagraph"/>
       </w:pPr>
       <w:r>
-        <w:t xml:space="preserve">Two complete sessions show the public API end to end; both run against the shipped files exactly as printed and produce the figures shown. The salt session computes the LiCl-KCl phase diagram:</w:t>
+        <w:t xml:space="preserve">Two complete sessions show the public API end to end; both run against the shipped files exactly as printed and produce the figures shown. The salt session calculates the LiCl-KCl phase diagram:</w:t>
       </w:r>
     </w:p>
     <w:p>
@@ -2394,7 +2394,7 @@
         <w:pStyle w:val="FirstParagraph"/>
       </w:pPr>
       <w:r>
-        <w:t xml:space="preserve">In plain terms: the session sweeps a grid of temperatures and compositions, and at each point multiphase_binary compares the liquid solution against the two solid salts and reports which phases coexist. The two stoich_gibbs lines fetch the Gibbs energies of solid LiCl and solid KCl at that temperature. The closing lines only search the results: among all points where the melt is entirely liquid, the coldest is the eutectic.</w:t>
+        <w:t xml:space="preserve">In plain terms, the session sweeps temperature and composition steps, and at each point multiphase_binary compares the liquid solution against the two solid salts and reports which phases coexist. The two stoich_gibbs lines fetch the Gibbs energies of solid LiCl and solid KCl at that temperature. The closing lines only search the results: among all points where the melt is entirely liquid, the coldest is the eutectic.</w:t>
       </w:r>
     </w:p>
     <w:p>
@@ -2414,7 +2414,7 @@
         <w:t xml:space="preserve"> </w:t>
       </w:r>
       <w:r>
-        <w:t xml:space="preserve">= 0.400 and 640 K on this deliberately coarse grid, against the measured 0.415 and 626 K; Figure 4 is the diagram it draws.</w:t>
+        <w:t xml:space="preserve">= 0.400 and 640 K at this deliberately coarse step size, against the measured 0.415 and 626 K; Figure 4 is the diagram it draws.</w:t>
       </w:r>
     </w:p>
     <w:p>
@@ -2424,20 +2424,20 @@
       <w:r>
         <w:drawing>
           <wp:inline>
-            <wp:extent cx="4206240" cy="3108960"/>
+            <wp:extent cx="4206240" cy="3262561"/>
             <wp:effectExtent b="0" l="0" r="0" t="0"/>
-            <wp:docPr descr="Figure 4: The LiCl-KCl phase diagram computed by the salt listing from the shipped open database, on the listing’s own grid. Light to dark: liquid, two-phase, and subsolidus fields. The dot is the computed eutectic on this grid (0.400, 640 K); the star is the measured eutectic (0.415, 626 K)." title="" id="980" name="Picture"/>
+            <wp:docPr descr="Figure 4: The LiCl-KCl phase diagram calculated by the salt listing from the shipped open database, at the listing’s own step size. Light to dark: liquid, two-phase, and subsolidus fields. The dot is the calculated eutectic at this step size (0.400, 640 K); the star is the measured eutectic (0.415, 626 K)." title="" id="1014" name="Picture"/>
             <a:graphic>
               <a:graphicData uri="http://schemas.openxmlformats.org/drawingml/2006/picture">
                 <pic:pic>
                   <pic:nvPicPr>
-                    <pic:cNvPr descr="figures/fig4_salt_example.png" id="981" name="Picture"/>
+                    <pic:cNvPr descr="figures/fig4_salt_example.png" id="1015" name="Picture"/>
                     <pic:cNvPicPr>
                       <a:picLocks noChangeArrowheads="1" noChangeAspect="1"/>
                     </pic:cNvPicPr>
                   </pic:nvPicPr>
                   <pic:blipFill>
-                    <a:blip r:embed="rId979"/>
+                    <a:blip r:embed="rId1013"/>
                     <a:stretch>
                       <a:fillRect/>
                     </a:stretch>
@@ -2445,7 +2445,7 @@
                   <pic:spPr bwMode="auto">
                     <a:xfrm>
                       <a:off x="0" y="0"/>
-                      <a:ext cx="4206240" cy="3108960"/>
+                      <a:ext cx="4206240" cy="3262561"/>
                     </a:xfrm>
                     <a:prstGeom prst="rect">
                       <a:avLst/>
@@ -2469,15 +2469,15 @@
         <w:pStyle w:val="ImageCaption"/>
       </w:pPr>
       <w:r>
-        <w:t xml:space="preserve">Figure 4: The LiCl-KCl phase diagram computed by the salt listing from the shipped open database, on the listing’s own grid. Light to dark: liquid, two-phase, and subsolidus fields. The dot is the computed eutectic on this grid (0.400, 640 K); the star is the measured eutectic (0.415, 626 K).</w:t>
-      </w:r>
-    </w:p>
-    <w:p>
-      <w:pPr>
-        <w:pStyle w:val="BodyText"/>
-      </w:pPr>
-      <w:r>
-        <w:t xml:space="preserve">The alloy session reads the Thermo-Calc dialect through the same API and computes the Al-Zn diagram with a ten-line convex hull:</w:t>
+        <w:t xml:space="preserve">Figure 4: The LiCl-KCl phase diagram calculated by the salt listing from the shipped open database, at the listing’s own step size. Light to dark: liquid, two-phase, and subsolidus fields. The dot is the calculated eutectic at this step size (0.400, 640 K); the star is the measured eutectic (0.415, 626 K).</w:t>
+      </w:r>
+    </w:p>
+    <w:p>
+      <w:pPr>
+        <w:pStyle w:val="BodyText"/>
+      </w:pPr>
+      <w:r>
+        <w:t xml:space="preserve">The alloy session reads the Thermo-Calc dialect through the same API and calculates the Al-Zn diagram with a ten-line convex hull:</w:t>
       </w:r>
     </w:p>
     <w:p>
@@ -2648,7 +2648,7 @@
         <w:t xml:space="preserve"> </w:t>
       </w:r>
       <w:r>
-        <w:t xml:space="preserve">= 0.890 and 660 K against the assessed 0.885 and 654 K [34] (Figure 5). The shipped AlZn.tdb is itself an openly licensed transcription of that published assessment on the SGTE unary functions [35], verified bit-identical through pycalphad against the file it transcribes. The slag systems run through the same calls behind Figures 2 and 3, and the repository’s validation scripts are their executable record.</w:t>
+        <w:t xml:space="preserve">= 0.890 and 660 K against the assessed 0.885 and 654 K [34] (Figure 5). The shipped AlZn.tdb is itself an openly licensed transcription of that published assessment on the Scientific Group Thermodata Europe (SGTE) unary functions [35], verified bit-identical through pycalphad against the file it transcribes. The slag systems run through the same calls behind Figures 2 and 3, and the repository’s validation scripts are their executable record.</w:t>
       </w:r>
     </w:p>
     <w:p>
@@ -2658,20 +2658,20 @@
       <w:r>
         <w:drawing>
           <wp:inline>
-            <wp:extent cx="4206240" cy="3108960"/>
+            <wp:extent cx="4206240" cy="3262561"/>
             <wp:effectExtent b="0" l="0" r="0" t="0"/>
-            <wp:docPr descr="Figure 5: The Al-Zn phase diagram computed by the alloy listing from the shipped open TDB. Light to dark: liquid, liquid plus solid, and solid fields. The dot is the computed eutectic (0.890, 660 K); the star is the assessed eutectic (0.885, 654 K)." title="" id="983" name="Picture"/>
+            <wp:docPr descr="Figure 5: The Al-Zn phase diagram computed by the alloy listing from the shipped open TDB. Light to dark: liquid, liquid plus solid, and solid fields. The dot is the calculated eutectic (0.890, 660 K); the star is the assessed eutectic (0.885, 654 K)." title="" id="1017" name="Picture"/>
             <a:graphic>
               <a:graphicData uri="http://schemas.openxmlformats.org/drawingml/2006/picture">
                 <pic:pic>
                   <pic:nvPicPr>
-                    <pic:cNvPr descr="figures/fig5_alloy_example.png" id="984" name="Picture"/>
+                    <pic:cNvPr descr="figures/fig5_alloy_example.png" id="1018" name="Picture"/>
                     <pic:cNvPicPr>
                       <a:picLocks noChangeArrowheads="1" noChangeAspect="1"/>
                     </pic:cNvPicPr>
                   </pic:nvPicPr>
                   <pic:blipFill>
-                    <a:blip r:embed="rId982"/>
+                    <a:blip r:embed="rId1016"/>
                     <a:stretch>
                       <a:fillRect/>
                     </a:stretch>
@@ -2679,7 +2679,7 @@
                   <pic:spPr bwMode="auto">
                     <a:xfrm>
                       <a:off x="0" y="0"/>
-                      <a:ext cx="4206240" cy="3108960"/>
+                      <a:ext cx="4206240" cy="3262561"/>
                     </a:xfrm>
                     <a:prstGeom prst="rect">
                       <a:avLst/>
@@ -2703,7 +2703,7 @@
         <w:pStyle w:val="ImageCaption"/>
       </w:pPr>
       <w:r>
-        <w:t xml:space="preserve">Figure 5: The Al-Zn phase diagram computed by the alloy listing from the shipped open TDB. Light to dark: liquid, liquid plus solid, and solid fields. The dot is the computed eutectic (0.890, 660 K); the star is the assessed eutectic (0.885, 654 K).</w:t>
+        <w:t xml:space="preserve">Figure 5: The Al-Zn phase diagram computed by the alloy listing from the shipped open TDB. Light to dark: liquid, liquid plus solid, and solid fields. The dot is the calculated eutectic (0.890, 660 K); the star is the assessed eutectic (0.885, 654 K).</w:t>
       </w:r>
     </w:p>
     <w:p>
@@ -2719,12 +2719,12 @@
         <w:pStyle w:val="BodyText"/>
       </w:pPr>
       <w:r>
-        <w:t xml:space="preserve">To close where the paper began: the gap was never the model, which has been published for two decades, but an open, runnable pairing of model and parameters. Hephaestus supplies both halves under open licenses, speaks the field’s three database containers, and puts the result behind a browser page that asks nothing of its user. The claims are checkable end to end. Release v0.4.0 archives the exact version described, the 104-test suite reruns the pycalphad comparisons on any machine, the worked examples print the figures shown, and every parameter in every shipped database traces to a published measurement through its provenance file. A reader who doubts a number can recompute it; one who needs a system that is missing can build it with the same open tools, or ask.</w:t>
-      </w:r>
-    </w:p>
-    <w:bookmarkEnd w:id="985"/>
-    <w:bookmarkEnd w:id="986"/>
-    <w:bookmarkStart w:id="987" w:name="data-availability"/>
+        <w:t xml:space="preserve">The paper closes where it began. The gap was never the model, which has been published for two decades, but an open, runnable pairing of model and parameters. Hephaestus supplies both halves under open licenses and puts them behind a browser page that asks nothing of its user. The claims are checkable end to end. Release v0.4.0 archives the exact version described, and the 104-test suite reruns the pycalphad comparisons on any machine. The worked examples print the figures shown, and every parameter in every shipped database traces to a published measurement through its provenance file. A reader who doubts a number can recalculate it; one who needs a system that is missing can build it with the same open tools, or ask.</w:t>
+      </w:r>
+    </w:p>
+    <w:bookmarkEnd w:id="1019"/>
+    <w:bookmarkEnd w:id="1020"/>
+    <w:bookmarkStart w:id="1021" w:name="data-availability"/>
     <w:p>
       <w:pPr>
         <w:pStyle w:val="Heading2"/>
@@ -2741,8 +2741,8 @@
         <w:t xml:space="preserve">The engine, the database, the browser application, and the validation suite are openly available in the code repository listed above; the version described here is archived as release v0.4.0. The database files and their provenance records are in the repository’s data directory under CC BY 4.0.</w:t>
       </w:r>
     </w:p>
-    <w:bookmarkEnd w:id="987"/>
-    <w:bookmarkStart w:id="988" w:name="acknowledgements"/>
+    <w:bookmarkEnd w:id="1021"/>
+    <w:bookmarkStart w:id="1022" w:name="acknowledgements"/>
     <w:p>
       <w:pPr>
         <w:pStyle w:val="Heading2"/>
@@ -2759,8 +2759,8 @@
         <w:t xml:space="preserve">During the development of this software the author used Claude Code (Anthropic) to assist with implementation, validation scripting, and manuscript preparation. This assistance was agentic, not autonomous: it operated under author direction and supervision at every step and was never a closed loop that produced or accepted results without review. Every parameter was traced by the author to its primary source before entering the database, and every reference was verified against its registry record. The author reviewed and approved all output and takes full responsibility for this article.</w:t>
       </w:r>
     </w:p>
-    <w:bookmarkEnd w:id="988"/>
-    <w:bookmarkStart w:id="989" w:name="funding-statement"/>
+    <w:bookmarkEnd w:id="1022"/>
+    <w:bookmarkStart w:id="1023" w:name="funding-statement"/>
     <w:p>
       <w:pPr>
         <w:pStyle w:val="Heading2"/>
@@ -2777,8 +2777,8 @@
         <w:t xml:space="preserve">The development of this software received no external funding.</w:t>
       </w:r>
     </w:p>
-    <w:bookmarkEnd w:id="989"/>
-    <w:bookmarkStart w:id="990" w:name="competing-interests"/>
+    <w:bookmarkEnd w:id="1023"/>
+    <w:bookmarkStart w:id="1024" w:name="competing-interests"/>
     <w:p>
       <w:pPr>
         <w:pStyle w:val="Heading2"/>
@@ -2795,8 +2795,8 @@
         <w:t xml:space="preserve">The author founded Odinzen LLC, which provides commercial thermodynamic modeling services, and declares this as a competing interest. The software and database published here are released in full under open licenses, and no proprietary Odinzen assets are included.</w:t>
       </w:r>
     </w:p>
-    <w:bookmarkEnd w:id="990"/>
-    <w:bookmarkStart w:id="991" w:name="references"/>
+    <w:bookmarkEnd w:id="1024"/>
+    <w:bookmarkStart w:id="1025" w:name="references"/>
     <w:p>
       <w:pPr>
         <w:pStyle w:val="Heading2"/>
@@ -3097,8 +3097,8 @@
         <w:t xml:space="preserve">[35] Dinsdale AT. SGTE data for pure elements. Calphad. 1991 Oct;15(4):317-425. doi:10.1016/0364-5916(91)90030-N</w:t>
       </w:r>
     </w:p>
-    <w:bookmarkEnd w:id="991"/>
-    <w:bookmarkEnd w:id="992"/>
+    <w:bookmarkEnd w:id="1025"/>
+    <w:bookmarkEnd w:id="1026"/>
     <w:sectPr>
       <w:footnotePr>
         <w:numRestart w:val="eachSect"/>

</xml_diff>

<commit_message>
Name the first-principles layer: Quantum ESPRESSO, VASP, and the Materials Project cited where DFT sits upstream of the pipeline, SevenNet credited for the olivine corroboration; four registry-verified references, list renumbered to 39 by first appearance
Co-Authored-By: Claude Fable 5 <noreply@anthropic.com>
</commit_message>
<xml_diff>
--- a/paper/Bustamante_Hephaestus_JORS_manuscript.docx
+++ b/paper/Bustamante_Hephaestus_JORS_manuscript.docx
@@ -2,7 +2,7 @@
 <file path=word/document.xml><?xml version="1.0" encoding="utf-8"?>
 <w:document xmlns:w="http://schemas.openxmlformats.org/wordprocessingml/2006/main" xmlns:m="http://schemas.openxmlformats.org/officeDocument/2006/math" xmlns:r="http://schemas.openxmlformats.org/officeDocument/2006/relationships" xmlns:o="urn:schemas-microsoft-com:office:office" xmlns:v="urn:schemas-microsoft-com:vml" xmlns:w10="urn:schemas-microsoft-com:office:word" xmlns:a="http://schemas.openxmlformats.org/drawingml/2006/main" xmlns:pic="http://schemas.openxmlformats.org/drawingml/2006/picture" xmlns:wp="http://schemas.openxmlformats.org/drawingml/2006/wordprocessingDrawing">
   <w:body>
-    <w:bookmarkStart w:id="1026" w:name="X4855b1162e70238fd839d871e0792397dc58430"/>
+    <w:bookmarkStart w:id="1060" w:name="X4855b1162e70238fd839d871e0792397dc58430"/>
     <w:p>
       <w:pPr>
         <w:pStyle w:val="Heading1"/>
@@ -159,7 +159,7 @@
         <w:t xml:space="preserve">CALPHAD; molten slag; molten salt; modified quasichemical model; thermodynamic database; phase diagram; WebAssembly; open data</w:t>
       </w:r>
     </w:p>
-    <w:bookmarkStart w:id="1004" w:name="overview"/>
+    <w:bookmarkStart w:id="1038" w:name="overview"/>
     <w:p>
       <w:pPr>
         <w:pStyle w:val="Heading2"/>
@@ -168,7 +168,7 @@
         <w:t xml:space="preserve">(1) Overview</w:t>
       </w:r>
     </w:p>
-    <w:bookmarkStart w:id="991" w:name="introduction"/>
+    <w:bookmarkStart w:id="1025" w:name="introduction"/>
     <w:p>
       <w:pPr>
         <w:pStyle w:val="Heading3"/>
@@ -526,7 +526,7 @@
               <w:jc w:val="left"/>
             </w:pPr>
             <w:r>
-              <w:t xml:space="preserve">calculated formation energies (Materials Project and kin)</w:t>
+              <w:t xml:space="preserve">calculated formation energies (the Materials Project [16] and kin)</w:t>
             </w:r>
           </w:p>
         </w:tc>
@@ -548,8 +548,8 @@
         <w:t xml:space="preserve">Hephaestus is a deliberate response to that gap, and it treats the engine and the data as one contribution because neither is useful alone. The engine is small on purpose. Its core is plain C with no dependencies, which makes it easy to embed and lets the identical code compile to WebAssembly, so the full calculator runs in a web browser with nothing installed and no data leaving the user’s machine. The database is open on purpose. Every parameter in it derives from published measurements, each value carries its provenance down to table and page, and the known shortcomings are documented next to the numbers they affect. The present work describes both, their validation against pycalphad and against measured phase equilibria, and the ways they can be reused. None of it asks the reader to program. For the experimentalist who never writes code, the browser application is the entire product: a page to open, a database to click, and a diagram to read. The sections that follow describe the machinery underneath for those who want it. Supplementary Material S1 is a plain-language primer for the non-programmer, starting at what a database file is and ending at a first calculation and how to read it. Its closing section teaches what an assessment is built from, so a reader who wants to contribute data for open publication, or to commission a file, arrives knowing what is needed.</w:t>
       </w:r>
     </w:p>
-    <w:bookmarkEnd w:id="991"/>
-    <w:bookmarkStart w:id="1001" w:name="implementation-and-architecture"/>
+    <w:bookmarkEnd w:id="1025"/>
+    <w:bookmarkStart w:id="1035" w:name="implementation-and-architecture"/>
     <w:p>
       <w:pPr>
         <w:pStyle w:val="Heading3"/>
@@ -575,18 +575,18 @@
           <wp:inline>
             <wp:extent cx="5334000" cy="3511167"/>
             <wp:effectExtent b="0" l="0" r="0" t="0"/>
-            <wp:docPr descr="Figure 1: Architecture of Hephaestus. A single dependency-free C core reads the field’s three database dialects (ChemSage .dat, Thermo-Calc .tdb with the Inden magnetic model, and the unified .utdb) and calculates all thermodynamics; the same core is used as a native library, from Python through cffi, and compiled to WebAssembly behind the browser application. dbbuild writes new ChemSage files from measured data, and every energy path is validated against pycalphad." title="" id="993" name="Picture"/>
+            <wp:docPr descr="Figure 1: Architecture of Hephaestus. A single dependency-free C core reads the field’s three database dialects (ChemSage .dat, Thermo-Calc .tdb with the Inden magnetic model, and the unified .utdb) and calculates all thermodynamics; the same core is used as a native library, from Python through cffi, and compiled to WebAssembly behind the browser application. dbbuild writes new ChemSage files from measured data, and every energy path is validated against pycalphad." title="" id="1027" name="Picture"/>
             <a:graphic>
               <a:graphicData uri="http://schemas.openxmlformats.org/drawingml/2006/picture">
                 <pic:pic>
                   <pic:nvPicPr>
-                    <pic:cNvPr descr="figures/fig1_architecture.png" id="994" name="Picture"/>
+                    <pic:cNvPr descr="figures/fig1_architecture.png" id="1028" name="Picture"/>
                     <pic:cNvPicPr>
                       <a:picLocks noChangeArrowheads="1" noChangeAspect="1"/>
                     </pic:cNvPicPr>
                   </pic:nvPicPr>
                   <pic:blipFill>
-                    <a:blip r:embed="rId992"/>
+                    <a:blip r:embed="rId1026"/>
                     <a:stretch>
                       <a:fillRect/>
                     </a:stretch>
@@ -626,7 +626,7 @@
         <w:pStyle w:val="BodyText"/>
       </w:pPr>
       <w:r>
-        <w:t xml:space="preserve">The core implements the MQMQA Gibbs energy of Pelton, Chartrand and Eriksson [1]: the pair reference energy, the configurational entropy of the quadruplet distribution, and the excess energy with composition-dependent interaction terms, together with the recursive coordination-number rules, including reciprocal quadruplets. Solid solutions use the compound energy formalism (CEF) [16], with sublattice site fractions, per-sublattice ideal entropy, and Redlich-Kister excess terms; the Gibbs energy is normalized per mole of real atoms, so vacancy-bearing phases come out on the same basis pycalphad uses. A reader for the ChemSage data format, the file lineage of the ChemSage and ChemApp equilibrium programs [17], loads MQMQA liquids (SUBQ and SUBG blocks), compound energy formalism phases (SUBL, including the magnetic variant), and stoichiometric compounds, with multi-interval Gibbs functions and the additional-term forms such as T</w:t>
+        <w:t xml:space="preserve">The core implements the MQMQA Gibbs energy of Pelton, Chartrand and Eriksson [1]: the pair reference energy, the configurational entropy of the quadruplet distribution, and the excess energy with composition-dependent interaction terms, together with the recursive coordination-number rules, including reciprocal quadruplets. Solid solutions use the compound energy formalism (CEF) [17], with sublattice site fractions, per-sublattice ideal entropy, and Redlich-Kister excess terms; the Gibbs energy is normalized per mole of real atoms, so vacancy-bearing phases come out on the same basis pycalphad uses. A reader for the ChemSage data format, the file lineage of the ChemSage and ChemApp equilibrium programs [18], loads MQMQA liquids (SUBQ and SUBG blocks), compound energy formalism phases (SUBL, including the magnetic variant), and stoichiometric compounds, with multi-interval Gibbs functions and the additional-term forms such as T</w:t>
       </w:r>
       <w:r>
         <w:rPr>
@@ -793,18 +793,18 @@
           <wp:inline>
             <wp:extent cx="4754880" cy="4464799"/>
             <wp:effectExtent b="0" l="0" r="0" t="0"/>
-            <wp:docPr descr="Figure 2: The live solver in the browser application (light theme). The user loads the shipped database, picks a temperature, and presses Compute; the WebAssembly engine then solves the full FeO-MgO-SiO2 phase assemblage client side (here 1023 composition samples and 512 tie-facets in under half a second). Tapping a composition reads its stable phases and pins it to a comparison list; hovering previews on desktop." title="" id="996" name="Picture"/>
+            <wp:docPr descr="Figure 2: The live solver in the browser application (light theme). The user loads the shipped database, picks a temperature, and presses Compute; the WebAssembly engine then solves the full FeO-MgO-SiO2 phase assemblage client side (here 1023 composition samples and 512 tie-facets in under half a second). Tapping a composition reads its stable phases and pins it to a comparison list; hovering previews on desktop." title="" id="1030" name="Picture"/>
             <a:graphic>
               <a:graphicData uri="http://schemas.openxmlformats.org/drawingml/2006/picture">
                 <pic:pic>
                   <pic:nvPicPr>
-                    <pic:cNvPr descr="figures/fig2_browser_app.png" id="997" name="Picture"/>
+                    <pic:cNvPr descr="figures/fig2_browser_app.png" id="1031" name="Picture"/>
                     <pic:cNvPicPr>
                       <a:picLocks noChangeArrowheads="1" noChangeAspect="1"/>
                     </pic:cNvPicPr>
                   </pic:nvPicPr>
                   <pic:blipFill>
-                    <a:blip r:embed="rId995"/>
+                    <a:blip r:embed="rId1029"/>
                     <a:stretch>
                       <a:fillRect/>
                     </a:stretch>
@@ -856,7 +856,7 @@
         <w:pStyle w:val="BodyText"/>
       </w:pPr>
       <w:r>
-        <w:t xml:space="preserve">The database is the second half of the contribution. Endmember oxide thermodynamics come from open compilations, chiefly Robie and Hemingway [18] and the NIST-JANAF tables [19]. Liquid excess parameters are fitted to published measurements: Knudsen-effusion and gas-slag equilibrium activities for CaO-SiO</w:t>
+        <w:t xml:space="preserve">The database is the second half of the contribution. Endmember oxide thermodynamics come from open compilations, chiefly Robie and Hemingway [19] and the NIST-JANAF tables [20]. Liquid excess parameters are fitted to published measurements: Knudsen-effusion and gas-slag equilibrium activities for CaO-SiO</w:t>
       </w:r>
       <w:r>
         <w:rPr>
@@ -868,7 +868,7 @@
         <w:t xml:space="preserve"> </w:t>
       </w:r>
       <w:r>
-        <w:t xml:space="preserve">[20,21], the measured iron-saturated activities collected by Björkman for FeO-SiO</w:t>
+        <w:t xml:space="preserve">[21,22], the measured iron-saturated activities collected by Björkman for FeO-SiO</w:t>
       </w:r>
       <w:r>
         <w:rPr>
@@ -880,7 +880,7 @@
         <w:t xml:space="preserve"> </w:t>
       </w:r>
       <w:r>
-        <w:t xml:space="preserve">[22], and the melting and immiscibility constraints of the classical phase diagram studies [23-25]. Solution-calorimetric compound enthalpies [26] anchor the solids. Where published calorimetry cannot constrain a liquid, melt-mixing enthalpies from machine-learned interatomic potentials [27,28] serve as auxiliary anchors after bias correction against measured formation enthalpies; each such use is recorded in the provenance files. The olivine and orthopyroxene solid solutions take their endmembers from Robie and Hemingway [18] and their mixing parameters from solution calorimetry [29]. The assembled ternary reproduces the topology of the measured MgO-FeO-SiO</w:t>
+        <w:t xml:space="preserve">[23], and the melting and immiscibility constraints of the classical phase diagram studies [24-26]. Solution-calorimetric compound enthalpies [27] anchor the solids. Where published calorimetry cannot constrain a liquid, melt-mixing enthalpies from machine-learned interatomic potentials [28,29] serve as auxiliary anchors after bias correction against measured formation enthalpies; each such use is recorded in the provenance files. First-principles codes sit upstream of this pipeline. A density functional theory (DFT) engine such as Quantum ESPRESSO [30] or VASP [31] calculates candidate energies for an assessment to weigh, not assessed Gibbs functions, and repositories such as the Materials Project [16] serve those results at scale. That physics enters the present databases only through potentials trained on large DFT corpora. MatterSim [28] and Orb [29] supply the melt anchors above, and a further graph-network potential, SevenNet [32], was used to corroborate the olivine mixing enthalpy against the calorimetric record [33], a check recorded in the repository without changing any fitted parameter. The olivine and orthopyroxene solid solutions take their endmembers from Robie and Hemingway [19] and their mixing parameters from solution calorimetry [33]. The assembled ternary reproduces the topology of the measured MgO-FeO-SiO</w:t>
       </w:r>
       <w:r>
         <w:rPr>
@@ -892,7 +892,7 @@
         <w:t xml:space="preserve"> </w:t>
       </w:r>
       <w:r>
-        <w:t xml:space="preserve">liquidus surface [23], with the olivine field quantitative and the known offsets stated. No parameter is taken from any prior assessment or commercial database; published assessments of these systems [30] are used only as method literature. The same engine and file format also serve molten salts: the repository ships an open chloride family alongside the slags (LiCl-KCl, NaCl-KCl with its continuous halite solid solution, KCl-MgCl</w:t>
+        <w:t xml:space="preserve">liquidus surface [24], with the olivine field quantitative and the known offsets stated. No parameter is taken from any prior assessment or commercial database; published assessments of these systems [34] are used only as method literature. The same engine and file format also serve molten salts: the repository ships an open chloride family alongside the slags (LiCl-KCl, NaCl-KCl with its continuous halite solid solution, KCl-MgCl</w:t>
       </w:r>
       <w:r>
         <w:rPr>
@@ -934,7 +934,7 @@
         <w:t xml:space="preserve"> </w:t>
       </w:r>
       <w:r>
-        <w:t xml:space="preserve">ternary), built the same way from evaluated endmember tables [31], measured mixing calorimetry [32], and the measured eutectic, liquidus, and solvus record of the halide literature [33], and loadable in the browser application with one click. Each system folder carries a provenance file that names every source, every modeling judgment, and every known limit. The largest limit is stated plainly: the CaO-SiO</w:t>
+        <w:t xml:space="preserve">ternary), built the same way from evaluated endmember tables [35], measured mixing calorimetry [36], and the measured eutectic, liquidus, and solvus record of the halide literature [37], and loadable in the browser application with one click. Each system folder carries a provenance file that names every source, every modeling judgment, and every known limit. The largest limit is stated plainly: the CaO-SiO</w:t>
       </w:r>
       <w:r>
         <w:rPr>
@@ -970,18 +970,18 @@
           <wp:inline>
             <wp:extent cx="5334000" cy="2197297"/>
             <wp:effectExtent b="0" l="0" r="0" t="0"/>
-            <wp:docPr descr="Figure 3: The assessed FeO-MgO-SiO2 system calculated from the shipped database files. (a) Liquidus projection: primary crystallizing phase fields, with liquidus isotherms labeled in °C. (b) Isothermal section at 1600 °C: stable phase assemblages, shaded by the number of solid phases present. Phase labels: L liquid, Crs cristobalite, Ol olivine, Opx orthopyroxene, Per periclase, Wus wustite." title="" id="999" name="Picture"/>
+            <wp:docPr descr="Figure 3: The assessed FeO-MgO-SiO2 system calculated from the shipped database files. (a) Liquidus projection: primary crystallizing phase fields, with liquidus isotherms labeled in °C. (b) Isothermal section at 1600 °C: stable phase assemblages, shaded by the number of solid phases present. Phase labels: L liquid, Crs cristobalite, Ol olivine, Opx orthopyroxene, Per periclase, Wus wustite." title="" id="1033" name="Picture"/>
             <a:graphic>
               <a:graphicData uri="http://schemas.openxmlformats.org/drawingml/2006/picture">
                 <pic:pic>
                   <pic:nvPicPr>
-                    <pic:cNvPr descr="figures/fig3_ternary.png" id="1000" name="Picture"/>
+                    <pic:cNvPr descr="figures/fig3_ternary.png" id="1034" name="Picture"/>
                     <pic:cNvPicPr>
                       <a:picLocks noChangeArrowheads="1" noChangeAspect="1"/>
                     </pic:cNvPicPr>
                   </pic:nvPicPr>
                   <pic:blipFill>
-                    <a:blip r:embed="rId998"/>
+                    <a:blip r:embed="rId1032"/>
                     <a:stretch>
                       <a:fillRect/>
                     </a:stretch>
@@ -1150,7 +1150,7 @@
               <w:jc w:val="left"/>
             </w:pPr>
             <w:r>
-              <w:t xml:space="preserve">silica activities [20,21]; bias-corrected melt-mixing enthalpies [27,28]; endmember and compound melting</w:t>
+              <w:t xml:space="preserve">silica activities [21,22]; bias-corrected melt-mixing enthalpies [28,29]; endmember and compound melting</w:t>
             </w:r>
           </w:p>
         </w:tc>
@@ -1222,7 +1222,7 @@
               <w:jc w:val="left"/>
             </w:pPr>
             <w:r>
-              <w:t xml:space="preserve">measured invariants and immiscibility data [24,25] from five studies, the measured consolute, and solution calorimetry [26]</w:t>
+              <w:t xml:space="preserve">measured invariants and immiscibility data [25,26] from five studies, the measured consolute, and solution calorimetry [27]</w:t>
             </w:r>
           </w:p>
         </w:tc>
@@ -1285,7 +1285,7 @@
               <w:jc w:val="left"/>
             </w:pPr>
             <w:r>
-              <w:t xml:space="preserve">23 iron-saturated activities across two isotherms [22]</w:t>
+              <w:t xml:space="preserve">23 iron-saturated activities across two isotherms [23]</w:t>
             </w:r>
           </w:p>
         </w:tc>
@@ -1345,19 +1345,19 @@
               <w:jc w:val="left"/>
             </w:pPr>
             <w:r>
-              <w:t xml:space="preserve">assembled from the binaries with olivine and orthopyroxene solutions [18,29]</w:t>
-            </w:r>
-          </w:p>
-        </w:tc>
-        <w:tc>
-          <w:tcPr/>
-          <w:p>
-            <w:pPr>
-              <w:pStyle w:val="Compact"/>
-              <w:jc w:val="left"/>
-            </w:pPr>
-            <w:r>
-              <w:t xml:space="preserve">measured liquidus-surface topology [23]; stable phase sets match pycalphad at 15 of 16 points</w:t>
+              <w:t xml:space="preserve">assembled from the binaries with olivine and orthopyroxene solutions [19,33]</w:t>
+            </w:r>
+          </w:p>
+        </w:tc>
+        <w:tc>
+          <w:tcPr/>
+          <w:p>
+            <w:pPr>
+              <w:pStyle w:val="Compact"/>
+              <w:jc w:val="left"/>
+            </w:pPr>
+            <w:r>
+              <w:t xml:space="preserve">measured liquidus-surface topology [24]; stable phase sets match pycalphad at 15 of 16 points</w:t>
             </w:r>
           </w:p>
         </w:tc>
@@ -1371,8 +1371,8 @@
         <w:t xml:space="preserve">Table 2: The assessed liquids. Full source lists, modeling judgments, and limits are in each system’s provenance file in the repository.</w:t>
       </w:r>
     </w:p>
-    <w:bookmarkEnd w:id="1001"/>
-    <w:bookmarkStart w:id="1002" w:name="anatomy-of-a-database-file"/>
+    <w:bookmarkEnd w:id="1035"/>
+    <w:bookmarkStart w:id="1036" w:name="anatomy-of-a-database-file"/>
     <w:p>
       <w:pPr>
         <w:pStyle w:val="Heading3"/>
@@ -1405,8 +1405,8 @@
         <w:t xml:space="preserve">That asymmetry is the economics of the field in miniature: implementations of the published models are increasingly available, but each fitted parameter condenses dozens of measurements and decisions. Parameter sets rather than codes are therefore the scarce commodity, and an openly licensed, provenance-tracked database is the part of this contribution that cannot be regenerated from the paper alone.</w:t>
       </w:r>
     </w:p>
-    <w:bookmarkEnd w:id="1002"/>
-    <w:bookmarkStart w:id="1003" w:name="quality-control"/>
+    <w:bookmarkEnd w:id="1036"/>
+    <w:bookmarkStart w:id="1037" w:name="quality-control"/>
     <w:p>
       <w:pPr>
         <w:pStyle w:val="Heading3"/>
@@ -1444,7 +1444,7 @@
         <w:t xml:space="preserve"> </w:t>
       </w:r>
       <w:r>
-        <w:t xml:space="preserve">J per mole of atoms, line compounds included, while out-of-subset files must fail with the stated reason, and the suite asserts those failures too. The magnetic model is checked twice over: pycalphad parity on its own magnetic test database and on an own-transcribed Fe-C system, whose pure-iron transitions, carried almost entirely by the magnetic term, come out at 1185, 1668, and 1811 K against the measured 1184.8, 1667.5, and 1811. The Scheil panel is checked against known invariants: for Al-Zn at 30 mol% Zn it nucleates FCC_A1 at 836 K and freezes the 12.5% residue within one temperature step of the assessed 654 K eutectic [34]; for LiCl-KCl the residue freezes at 629 K against the measured 626 K.</w:t>
+        <w:t xml:space="preserve">J per mole of atoms, line compounds included, while out-of-subset files must fail with the stated reason, and the suite asserts those failures too. The magnetic model is checked twice over: pycalphad parity on its own magnetic test database and on an own-transcribed Fe-C system, whose pure-iron transitions, carried almost entirely by the magnetic term, come out at 1185, 1668, and 1811 K against the measured 1184.8, 1667.5, and 1811. The Scheil panel is checked against known invariants: for Al-Zn at 30 mol% Zn it nucleates FCC_A1 at 836 K and freezes the 12.5% residue within one temperature step of the assessed 654 K eutectic [38]; for LiCl-KCl the residue freezes at 629 K against the measured 626 K.</w:t>
       </w:r>
     </w:p>
     <w:tbl>
@@ -1912,7 +1912,7 @@
         <w:t xml:space="preserve"> </w:t>
       </w:r>
       <w:r>
-        <w:t xml:space="preserve">liquid reproduces 23 measured activity points with a root-mean-square deviation of 0.067 in ln a [22], and the fitting route itself is regression-tested by re-deriving those published parameters from the raw data. Congruent melting of fayalite and forsterite lands within a few degrees of measurement, assessed MgO-SiO</w:t>
+        <w:t xml:space="preserve">liquid reproduces 23 measured activity points with a root-mean-square deviation of 0.067 in ln a [23], and the fitting route itself is regression-tested by re-deriving those published parameters from the raw data. Congruent melting of fayalite and forsterite lands within a few degrees of measurement, assessed MgO-SiO</w:t>
       </w:r>
       <w:r>
         <w:rPr>
@@ -1924,12 +1924,12 @@
         <w:t xml:space="preserve"> </w:t>
       </w:r>
       <w:r>
-        <w:t xml:space="preserve">invariants sit within about 40 °C, and the ternary liquidus projection reproduces the measured field topology [23]. Development practice is plain: the repository is version controlled with tagged releases (v0.1.0 through the v0.4.0 described here), the full suite runs before every release, and a fixed bug lands together with the regression test that would have caught it. The suite runs on Windows 11 under CPython 3.11 and 3.12; the browser application is exercised in Chromium- and Gecko-based browsers. A user can confirm a working installation by running pytest against the bundled test databases, or with no installation at all by opening the web application and loading the shipped ternary database.</w:t>
-      </w:r>
-    </w:p>
-    <w:bookmarkEnd w:id="1003"/>
-    <w:bookmarkEnd w:id="1004"/>
-    <w:bookmarkStart w:id="1012" w:name="availability"/>
+        <w:t xml:space="preserve">invariants sit within about 40 °C, and the ternary liquidus projection reproduces the measured field topology [24]. Development practice is plain: the repository is version controlled with tagged releases (v0.1.0 through the v0.4.0 described here), the full suite runs before every release, and a fixed bug lands together with the regression test that would have caught it. The suite runs on Windows 11 under CPython 3.11 and 3.12; the browser application is exercised in Chromium- and Gecko-based browsers. A user can confirm a working installation by running pytest against the bundled test databases, or with no installation at all by opening the web application and loading the shipped ternary database.</w:t>
+      </w:r>
+    </w:p>
+    <w:bookmarkEnd w:id="1037"/>
+    <w:bookmarkEnd w:id="1038"/>
+    <w:bookmarkStart w:id="1046" w:name="availability"/>
     <w:p>
       <w:pPr>
         <w:pStyle w:val="Heading2"/>
@@ -1938,7 +1938,7 @@
         <w:t xml:space="preserve">(2) Availability</w:t>
       </w:r>
     </w:p>
-    <w:bookmarkStart w:id="1005" w:name="operating-system"/>
+    <w:bookmarkStart w:id="1039" w:name="operating-system"/>
     <w:p>
       <w:pPr>
         <w:pStyle w:val="Heading3"/>
@@ -1955,8 +1955,8 @@
         <w:t xml:space="preserve">Platform independent. The core builds with any C99 compiler; development and testing used Windows 11. The browser application runs in any current browser with WebAssembly support.</w:t>
       </w:r>
     </w:p>
-    <w:bookmarkEnd w:id="1005"/>
-    <w:bookmarkStart w:id="1006" w:name="programming-language"/>
+    <w:bookmarkEnd w:id="1039"/>
+    <w:bookmarkStart w:id="1040" w:name="programming-language"/>
     <w:p>
       <w:pPr>
         <w:pStyle w:val="Heading3"/>
@@ -1973,8 +1973,8 @@
         <w:t xml:space="preserve">C (core), Python 3.11 or later (interface and fitting tools), JavaScript (browser application).</w:t>
       </w:r>
     </w:p>
-    <w:bookmarkEnd w:id="1006"/>
-    <w:bookmarkStart w:id="1007" w:name="additional-system-requirements"/>
+    <w:bookmarkEnd w:id="1040"/>
+    <w:bookmarkStart w:id="1041" w:name="additional-system-requirements"/>
     <w:p>
       <w:pPr>
         <w:pStyle w:val="Heading3"/>
@@ -1991,8 +1991,8 @@
         <w:t xml:space="preserve">None of note. The engine and database together are a few megabytes.</w:t>
       </w:r>
     </w:p>
-    <w:bookmarkEnd w:id="1007"/>
-    <w:bookmarkStart w:id="1008" w:name="dependencies"/>
+    <w:bookmarkEnd w:id="1041"/>
+    <w:bookmarkStart w:id="1042" w:name="dependencies"/>
     <w:p>
       <w:pPr>
         <w:pStyle w:val="Heading3"/>
@@ -2009,8 +2009,8 @@
         <w:t xml:space="preserve">Python interface: cffi, NumPy, SciPy. Validation suite additionally requires pycalphad. WebAssembly build requires emscripten. The C core and the browser application have no dependencies.</w:t>
       </w:r>
     </w:p>
-    <w:bookmarkEnd w:id="1008"/>
-    <w:bookmarkStart w:id="1009" w:name="list-of-contributors"/>
+    <w:bookmarkEnd w:id="1042"/>
+    <w:bookmarkStart w:id="1043" w:name="list-of-contributors"/>
     <w:p>
       <w:pPr>
         <w:pStyle w:val="Heading3"/>
@@ -2027,8 +2027,8 @@
         <w:t xml:space="preserve">Michael E. Bustamante (design, implementation, validation, data curation).</w:t>
       </w:r>
     </w:p>
-    <w:bookmarkEnd w:id="1009"/>
-    <w:bookmarkStart w:id="1010" w:name="software-location"/>
+    <w:bookmarkEnd w:id="1043"/>
+    <w:bookmarkStart w:id="1044" w:name="software-location"/>
     <w:p>
       <w:pPr>
         <w:pStyle w:val="Heading3"/>
@@ -2181,8 +2181,8 @@
         <w:t xml:space="preserve">Date published: 2026-09-02</w:t>
       </w:r>
     </w:p>
-    <w:bookmarkEnd w:id="1010"/>
-    <w:bookmarkStart w:id="1011" w:name="language"/>
+    <w:bookmarkEnd w:id="1044"/>
+    <w:bookmarkStart w:id="1045" w:name="language"/>
     <w:p>
       <w:pPr>
         <w:pStyle w:val="Heading3"/>
@@ -2199,9 +2199,9 @@
         <w:t xml:space="preserve">English.</w:t>
       </w:r>
     </w:p>
-    <w:bookmarkEnd w:id="1011"/>
-    <w:bookmarkEnd w:id="1012"/>
-    <w:bookmarkStart w:id="1020" w:name="reuse-potential"/>
+    <w:bookmarkEnd w:id="1045"/>
+    <w:bookmarkEnd w:id="1046"/>
+    <w:bookmarkStart w:id="1054" w:name="reuse-potential"/>
     <w:p>
       <w:pPr>
         <w:pStyle w:val="Heading2"/>
@@ -2226,7 +2226,7 @@
         <w:t xml:space="preserve">The browser application makes the lowest barrier the default. A lecture on slag thermodynamics, a plant metallurgist screening a composition, or a reviewer checking a claimed equilibrium can load the database and calculate in seconds, with confidential inputs never leaving the machine. The same property makes it a practical template for other groups who want to publish a model as a zero-install tool.</w:t>
       </w:r>
     </w:p>
-    <w:bookmarkStart w:id="1019" w:name="worked-examples"/>
+    <w:bookmarkStart w:id="1053" w:name="worked-examples"/>
     <w:p>
       <w:pPr>
         <w:pStyle w:val="Heading3"/>
@@ -2426,18 +2426,18 @@
           <wp:inline>
             <wp:extent cx="4206240" cy="3262561"/>
             <wp:effectExtent b="0" l="0" r="0" t="0"/>
-            <wp:docPr descr="Figure 4: The LiCl-KCl phase diagram calculated by the salt listing from the shipped open database, at the listing’s own step size. Light to dark: liquid, two-phase, and subsolidus fields. The dot is the calculated eutectic at this step size (0.400, 640 K); the star is the measured eutectic (0.415, 626 K)." title="" id="1014" name="Picture"/>
+            <wp:docPr descr="Figure 4: The LiCl-KCl phase diagram calculated by the salt listing from the shipped open database, at the listing’s own step size. Light to dark: liquid, two-phase, and subsolidus fields. The dot is the calculated eutectic at this step size (0.400, 640 K); the star is the measured eutectic (0.415, 626 K)." title="" id="1048" name="Picture"/>
             <a:graphic>
               <a:graphicData uri="http://schemas.openxmlformats.org/drawingml/2006/picture">
                 <pic:pic>
                   <pic:nvPicPr>
-                    <pic:cNvPr descr="figures/fig4_salt_example.png" id="1015" name="Picture"/>
+                    <pic:cNvPr descr="figures/fig4_salt_example.png" id="1049" name="Picture"/>
                     <pic:cNvPicPr>
                       <a:picLocks noChangeArrowheads="1" noChangeAspect="1"/>
                     </pic:cNvPicPr>
                   </pic:nvPicPr>
                   <pic:blipFill>
-                    <a:blip r:embed="rId1013"/>
+                    <a:blip r:embed="rId1047"/>
                     <a:stretch>
                       <a:fillRect/>
                     </a:stretch>
@@ -2648,7 +2648,7 @@
         <w:t xml:space="preserve"> </w:t>
       </w:r>
       <w:r>
-        <w:t xml:space="preserve">= 0.890 and 660 K against the assessed 0.885 and 654 K [34] (Figure 5). The shipped AlZn.tdb is itself an openly licensed transcription of that published assessment on the Scientific Group Thermodata Europe (SGTE) unary functions [35], verified bit-identical through pycalphad against the file it transcribes. The slag systems run through the same calls behind Figures 2 and 3, and the repository’s validation scripts are their executable record.</w:t>
+        <w:t xml:space="preserve">= 0.890 and 660 K against the assessed 0.885 and 654 K [38] (Figure 5). The shipped AlZn.tdb is itself an openly licensed transcription of that published assessment on the Scientific Group Thermodata Europe (SGTE) unary functions [39], verified bit-identical through pycalphad against the file it transcribes. The slag systems run through the same calls behind Figures 2 and 3, and the repository’s validation scripts are their executable record.</w:t>
       </w:r>
     </w:p>
     <w:p>
@@ -2660,18 +2660,18 @@
           <wp:inline>
             <wp:extent cx="4206240" cy="3262561"/>
             <wp:effectExtent b="0" l="0" r="0" t="0"/>
-            <wp:docPr descr="Figure 5: The Al-Zn phase diagram computed by the alloy listing from the shipped open TDB. Light to dark: liquid, liquid plus solid, and solid fields. The dot is the calculated eutectic (0.890, 660 K); the star is the assessed eutectic (0.885, 654 K)." title="" id="1017" name="Picture"/>
+            <wp:docPr descr="Figure 5: The Al-Zn phase diagram computed by the alloy listing from the shipped open TDB. Light to dark: liquid, liquid plus solid, and solid fields. The dot is the calculated eutectic (0.890, 660 K); the star is the assessed eutectic (0.885, 654 K)." title="" id="1051" name="Picture"/>
             <a:graphic>
               <a:graphicData uri="http://schemas.openxmlformats.org/drawingml/2006/picture">
                 <pic:pic>
                   <pic:nvPicPr>
-                    <pic:cNvPr descr="figures/fig5_alloy_example.png" id="1018" name="Picture"/>
+                    <pic:cNvPr descr="figures/fig5_alloy_example.png" id="1052" name="Picture"/>
                     <pic:cNvPicPr>
                       <a:picLocks noChangeArrowheads="1" noChangeAspect="1"/>
                     </pic:cNvPicPr>
                   </pic:nvPicPr>
                   <pic:blipFill>
-                    <a:blip r:embed="rId1016"/>
+                    <a:blip r:embed="rId1050"/>
                     <a:stretch>
                       <a:fillRect/>
                     </a:stretch>
@@ -2722,9 +2722,9 @@
         <w:t xml:space="preserve">The paper closes where it began. The gap was never the model, which has been published for two decades, but an open, runnable pairing of model and parameters. Hephaestus supplies both halves under open licenses and puts them behind a browser page that asks nothing of its user. The claims are checkable end to end. Release v0.4.0 archives the exact version described, and the 104-test suite reruns the pycalphad comparisons on any machine. The worked examples print the figures shown, and every parameter in every shipped database traces to a published measurement through its provenance file. A reader who doubts a number can recalculate it; one who needs a system that is missing can build it with the same open tools, or ask.</w:t>
       </w:r>
     </w:p>
-    <w:bookmarkEnd w:id="1019"/>
-    <w:bookmarkEnd w:id="1020"/>
-    <w:bookmarkStart w:id="1021" w:name="data-availability"/>
+    <w:bookmarkEnd w:id="1053"/>
+    <w:bookmarkEnd w:id="1054"/>
+    <w:bookmarkStart w:id="1055" w:name="data-availability"/>
     <w:p>
       <w:pPr>
         <w:pStyle w:val="Heading2"/>
@@ -2741,8 +2741,8 @@
         <w:t xml:space="preserve">The engine, the database, the browser application, and the validation suite are openly available in the code repository listed above; the version described here is archived as release v0.4.0. The database files and their provenance records are in the repository’s data directory under CC BY 4.0.</w:t>
       </w:r>
     </w:p>
-    <w:bookmarkEnd w:id="1021"/>
-    <w:bookmarkStart w:id="1022" w:name="acknowledgements"/>
+    <w:bookmarkEnd w:id="1055"/>
+    <w:bookmarkStart w:id="1056" w:name="acknowledgements"/>
     <w:p>
       <w:pPr>
         <w:pStyle w:val="Heading2"/>
@@ -2759,8 +2759,8 @@
         <w:t xml:space="preserve">During the development of this software the author used Claude Code (Anthropic) to assist with implementation, validation scripting, and manuscript preparation. This assistance was agentic, not autonomous: it operated under author direction and supervision at every step and was never a closed loop that produced or accepted results without review. Every parameter was traced by the author to its primary source before entering the database, and every reference was verified against its registry record. The author reviewed and approved all output and takes full responsibility for this article.</w:t>
       </w:r>
     </w:p>
-    <w:bookmarkEnd w:id="1022"/>
-    <w:bookmarkStart w:id="1023" w:name="funding-statement"/>
+    <w:bookmarkEnd w:id="1056"/>
+    <w:bookmarkStart w:id="1057" w:name="funding-statement"/>
     <w:p>
       <w:pPr>
         <w:pStyle w:val="Heading2"/>
@@ -2777,8 +2777,8 @@
         <w:t xml:space="preserve">The development of this software received no external funding.</w:t>
       </w:r>
     </w:p>
-    <w:bookmarkEnd w:id="1023"/>
-    <w:bookmarkStart w:id="1024" w:name="competing-interests"/>
+    <w:bookmarkEnd w:id="1057"/>
+    <w:bookmarkStart w:id="1058" w:name="competing-interests"/>
     <w:p>
       <w:pPr>
         <w:pStyle w:val="Heading2"/>
@@ -2795,8 +2795,8 @@
         <w:t xml:space="preserve">The author founded Odinzen LLC, which provides commercial thermodynamic modeling services, and declares this as a competing interest. The software and database published here are released in full under open licenses, and no proprietary Odinzen assets are included.</w:t>
       </w:r>
     </w:p>
-    <w:bookmarkEnd w:id="1024"/>
-    <w:bookmarkStart w:id="1025" w:name="references"/>
+    <w:bookmarkEnd w:id="1058"/>
+    <w:bookmarkStart w:id="1059" w:name="references"/>
     <w:p>
       <w:pPr>
         <w:pStyle w:val="Heading2"/>
@@ -2930,23 +2930,31 @@
         <w:pStyle w:val="BodyText"/>
       </w:pPr>
       <w:r>
-        <w:t xml:space="preserve">[16] Hillert M. The compound energy formalism. Journal of Alloys and Compounds. 2001 May;320(2):161–76. doi:10.1016/S0925-8388(00)01481-X</w:t>
-      </w:r>
-    </w:p>
-    <w:p>
-      <w:pPr>
-        <w:pStyle w:val="BodyText"/>
-      </w:pPr>
-      <w:r>
-        <w:t xml:space="preserve">[17] Eriksson G, Hack K. ChemSage - A computer program for the calculation of complex chemical equilibria. Metall Trans B. 1990 Dec;21(6):1013-23. doi:10.1007/BF02670272</w:t>
-      </w:r>
-    </w:p>
-    <w:p>
-      <w:pPr>
-        <w:pStyle w:val="BodyText"/>
-      </w:pPr>
-      <w:r>
-        <w:t xml:space="preserve">[18] Robie RA, Hemingway BS. Thermodynamic properties of minerals and related substances at 298.15 K and 1 bar (10</w:t>
+        <w:t xml:space="preserve">[16] Jain A, Ong SP, Hautier G, Chen W, Richards WD, Dacek S, et al. Commentary: The Materials Project: A materials genome approach to accelerating materials innovation. APL Mater. 2013;1(1):011002. doi:10.1063/1.4812323</w:t>
+      </w:r>
+    </w:p>
+    <w:p>
+      <w:pPr>
+        <w:pStyle w:val="BodyText"/>
+      </w:pPr>
+      <w:r>
+        <w:t xml:space="preserve">[17] Hillert M. The compound energy formalism. Journal of Alloys and Compounds. 2001 May;320(2):161–76. doi:10.1016/S0925-8388(00)01481-X</w:t>
+      </w:r>
+    </w:p>
+    <w:p>
+      <w:pPr>
+        <w:pStyle w:val="BodyText"/>
+      </w:pPr>
+      <w:r>
+        <w:t xml:space="preserve">[18] Eriksson G, Hack K. ChemSage - A computer program for the calculation of complex chemical equilibria. Metall Trans B. 1990 Dec;21(6):1013-23. doi:10.1007/BF02670272</w:t>
+      </w:r>
+    </w:p>
+    <w:p>
+      <w:pPr>
+        <w:pStyle w:val="BodyText"/>
+      </w:pPr>
+      <w:r>
+        <w:t xml:space="preserve">[19] Robie RA, Hemingway BS. Thermodynamic properties of minerals and related substances at 298.15 K and 1 bar (10</w:t>
       </w:r>
       <w:r>
         <w:rPr>
@@ -2966,139 +2974,163 @@
         <w:pStyle w:val="BodyText"/>
       </w:pPr>
       <w:r>
-        <w:t xml:space="preserve">[19] Chase MW Jr. NIST-JANAF Thermochemical Tables, 4th edition. Journal of Physical and Chemical Reference Data, Monograph 9. Woodbury, NY: American Institute of Physics; 1998.</w:t>
-      </w:r>
-    </w:p>
-    <w:p>
-      <w:pPr>
-        <w:pStyle w:val="BodyText"/>
-      </w:pPr>
-      <w:r>
-        <w:t xml:space="preserve">[20] Kay DAR, Taylor J. Activities of silica in the lime + alumina + silica system. Trans Faraday Soc. 1960;56:1372. doi:10.1039/tf9605601372</w:t>
-      </w:r>
-    </w:p>
-    <w:p>
-      <w:pPr>
-        <w:pStyle w:val="BodyText"/>
-      </w:pPr>
-      <w:r>
-        <w:t xml:space="preserve">[21] Stolyarova VL, Shornikov SI, Ivanov GG, Shultz MM. High Temperature Mass Spectrometric Study of Thermodynamic Properties of the CaO-SiO2 System. J Electrochem Soc. 1991 Dec 1;138(12):3710–4. doi:10.1149/1.2085485</w:t>
-      </w:r>
-    </w:p>
-    <w:p>
-      <w:pPr>
-        <w:pStyle w:val="BodyText"/>
-      </w:pPr>
-      <w:r>
-        <w:t xml:space="preserve">[22] Björkman B. An assessment of the system Fe-O-SiO2 using a structure based model for the liquid silicate. Calphad. 1985 Jul;9(3):271–82. doi:10.1016/0364-5916(85)90012-4</w:t>
-      </w:r>
-    </w:p>
-    <w:p>
-      <w:pPr>
-        <w:pStyle w:val="BodyText"/>
-      </w:pPr>
-      <w:r>
-        <w:t xml:space="preserve">[23] Bowen NL, Schairer JF. The system MgO-FeO-SiO2. American Journal of Science. 1935 Feb 1;s5-29(170):151–217. doi:10.2475/ajs.s5-29.170.151</w:t>
-      </w:r>
-    </w:p>
-    <w:p>
-      <w:pPr>
-        <w:pStyle w:val="BodyText"/>
-      </w:pPr>
-      <w:r>
-        <w:t xml:space="preserve">[24] Greig JW. Immiscibility in silicate melts; Part I. American Journal of Science. 1927 Jan 1;s5-13(73):1–44. doi:10.2475/ajs.s5-13.73.1</w:t>
-      </w:r>
-    </w:p>
-    <w:p>
-      <w:pPr>
-        <w:pStyle w:val="BodyText"/>
-      </w:pPr>
-      <w:r>
-        <w:t xml:space="preserve">[25] Greig JW. Immiscibility in silicate melts; Part II. American Journal of Science. 1927 Feb 1;s5-13(74):133–54. doi:10.2475/ajs.s5-13.74.133</w:t>
-      </w:r>
-    </w:p>
-    <w:p>
-      <w:pPr>
-        <w:pStyle w:val="BodyText"/>
-      </w:pPr>
-      <w:r>
-        <w:t xml:space="preserve">[26] Charlu TV, Newton RC, Kleppa OJ. Enthalpies of formation at 970 K of compounds in the system MgO-Al2O3-SiO2 from high temperature solution calorimetry. Geochimica et Cosmochimica Acta. 1975 Nov;39(11):1487–97. doi:10.1016/0016-7037(75)90150-7</w:t>
-      </w:r>
-    </w:p>
-    <w:p>
-      <w:pPr>
-        <w:pStyle w:val="BodyText"/>
-      </w:pPr>
-      <w:r>
-        <w:t xml:space="preserve">[27] Yang H, Hu C, Zhou Y, Liu X, Shi Y, Li J, et al. MatterSim: A Deep Learning Atomistic Model Across Elements, Temperatures and Pressures. arXiv; 2024. doi:10.48550/ARXIV.2405.04967</w:t>
-      </w:r>
-    </w:p>
-    <w:p>
-      <w:pPr>
-        <w:pStyle w:val="BodyText"/>
-      </w:pPr>
-      <w:r>
-        <w:t xml:space="preserve">[28] Neumann M, Gin J, Rhodes B, Bennett S, Li Z, Choubisa H, et al. Orb: A Fast, Scalable Neural Network Potential. arXiv; 2024. doi:10.48550/ARXIV.2410.22570</w:t>
-      </w:r>
-    </w:p>
-    <w:p>
-      <w:pPr>
-        <w:pStyle w:val="BodyText"/>
-      </w:pPr>
-      <w:r>
-        <w:t xml:space="preserve">[29] Wood BJ, Kleppa OJ. Thermochemistry of forsterite-fayalite olivine solutions. Geochimica et Cosmochimica Acta. 1981 Apr;45(4):529–34. doi:10.1016/0016-7037(81)90185-X</w:t>
-      </w:r>
-    </w:p>
-    <w:p>
-      <w:pPr>
-        <w:pStyle w:val="BodyText"/>
-      </w:pPr>
-      <w:r>
-        <w:t xml:space="preserve">[30] Wu P, Eriksson G, Pelton AD, Blander M. Prediction of the Thermodynamic Properties and Phase Diagrams of Silicate Systems-Evaluation of the FeO-MgO-SiO2 System. ISIJ International. 1993;33(1):26–35. doi:10.2355/isijinternational.33.26</w:t>
-      </w:r>
-    </w:p>
-    <w:p>
-      <w:pPr>
-        <w:pStyle w:val="BodyText"/>
-      </w:pPr>
-      <w:r>
-        <w:t xml:space="preserve">[31] Barin I. Thermochemical Data of Pure Substances. 3rd ed. Weinheim: VCH; 1995. doi:10.1002/9783527619825</w:t>
-      </w:r>
-    </w:p>
-    <w:p>
-      <w:pPr>
-        <w:pStyle w:val="BodyText"/>
-      </w:pPr>
-      <w:r>
-        <w:t xml:space="preserve">[32] Hersh LS, Kleppa OJ. Enthalpies of Mixing in Some Binary Liquid Halide Mixtures. J Chem Phys. 1965;42:1309. doi:10.1063/1.1696115</w:t>
-      </w:r>
-    </w:p>
-    <w:p>
-      <w:pPr>
-        <w:pStyle w:val="BodyText"/>
-      </w:pPr>
-      <w:r>
-        <w:t xml:space="preserve">[33] Sangster J, Pelton AD. Phase Diagrams and Thermodynamic Properties of the 70 Binary Alkali Halide Systems Having Common Ions. J Phys Chem Ref Data. 1987;16:509. doi:10.1063/1.555803</w:t>
-      </w:r>
-    </w:p>
-    <w:p>
-      <w:pPr>
-        <w:pStyle w:val="BodyText"/>
-      </w:pPr>
-      <w:r>
-        <w:t xml:space="preserve">[34] an Mey S. Reevaluation of the Al-Zn system. Z Metallkd. 1993;84(7):451-5. doi:10.1515/ijmr-1993-840704</w:t>
-      </w:r>
-    </w:p>
-    <w:p>
-      <w:pPr>
-        <w:pStyle w:val="BodyText"/>
-      </w:pPr>
-      <w:r>
-        <w:t xml:space="preserve">[35] Dinsdale AT. SGTE data for pure elements. Calphad. 1991 Oct;15(4):317-425. doi:10.1016/0364-5916(91)90030-N</w:t>
-      </w:r>
-    </w:p>
-    <w:bookmarkEnd w:id="1025"/>
-    <w:bookmarkEnd w:id="1026"/>
+        <w:t xml:space="preserve">[20] Chase MW Jr. NIST-JANAF Thermochemical Tables, 4th edition. Journal of Physical and Chemical Reference Data, Monograph 9. Woodbury, NY: American Institute of Physics; 1998.</w:t>
+      </w:r>
+    </w:p>
+    <w:p>
+      <w:pPr>
+        <w:pStyle w:val="BodyText"/>
+      </w:pPr>
+      <w:r>
+        <w:t xml:space="preserve">[21] Kay DAR, Taylor J. Activities of silica in the lime + alumina + silica system. Trans Faraday Soc. 1960;56:1372. doi:10.1039/tf9605601372</w:t>
+      </w:r>
+    </w:p>
+    <w:p>
+      <w:pPr>
+        <w:pStyle w:val="BodyText"/>
+      </w:pPr>
+      <w:r>
+        <w:t xml:space="preserve">[22] Stolyarova VL, Shornikov SI, Ivanov GG, Shultz MM. High Temperature Mass Spectrometric Study of Thermodynamic Properties of the CaO-SiO2 System. J Electrochem Soc. 1991 Dec 1;138(12):3710–4. doi:10.1149/1.2085485</w:t>
+      </w:r>
+    </w:p>
+    <w:p>
+      <w:pPr>
+        <w:pStyle w:val="BodyText"/>
+      </w:pPr>
+      <w:r>
+        <w:t xml:space="preserve">[23] Björkman B. An assessment of the system Fe-O-SiO2 using a structure based model for the liquid silicate. Calphad. 1985 Jul;9(3):271–82. doi:10.1016/0364-5916(85)90012-4</w:t>
+      </w:r>
+    </w:p>
+    <w:p>
+      <w:pPr>
+        <w:pStyle w:val="BodyText"/>
+      </w:pPr>
+      <w:r>
+        <w:t xml:space="preserve">[24] Bowen NL, Schairer JF. The system MgO-FeO-SiO2. American Journal of Science. 1935 Feb 1;s5-29(170):151–217. doi:10.2475/ajs.s5-29.170.151</w:t>
+      </w:r>
+    </w:p>
+    <w:p>
+      <w:pPr>
+        <w:pStyle w:val="BodyText"/>
+      </w:pPr>
+      <w:r>
+        <w:t xml:space="preserve">[25] Greig JW. Immiscibility in silicate melts; Part I. American Journal of Science. 1927 Jan 1;s5-13(73):1–44. doi:10.2475/ajs.s5-13.73.1</w:t>
+      </w:r>
+    </w:p>
+    <w:p>
+      <w:pPr>
+        <w:pStyle w:val="BodyText"/>
+      </w:pPr>
+      <w:r>
+        <w:t xml:space="preserve">[26] Greig JW. Immiscibility in silicate melts; Part II. American Journal of Science. 1927 Feb 1;s5-13(74):133–54. doi:10.2475/ajs.s5-13.74.133</w:t>
+      </w:r>
+    </w:p>
+    <w:p>
+      <w:pPr>
+        <w:pStyle w:val="BodyText"/>
+      </w:pPr>
+      <w:r>
+        <w:t xml:space="preserve">[27] Charlu TV, Newton RC, Kleppa OJ. Enthalpies of formation at 970 K of compounds in the system MgO-Al2O3-SiO2 from high temperature solution calorimetry. Geochimica et Cosmochimica Acta. 1975 Nov;39(11):1487–97. doi:10.1016/0016-7037(75)90150-7</w:t>
+      </w:r>
+    </w:p>
+    <w:p>
+      <w:pPr>
+        <w:pStyle w:val="BodyText"/>
+      </w:pPr>
+      <w:r>
+        <w:t xml:space="preserve">[28] Yang H, Hu C, Zhou Y, Liu X, Shi Y, Li J, et al. MatterSim: A Deep Learning Atomistic Model Across Elements, Temperatures and Pressures. arXiv; 2024. doi:10.48550/ARXIV.2405.04967</w:t>
+      </w:r>
+    </w:p>
+    <w:p>
+      <w:pPr>
+        <w:pStyle w:val="BodyText"/>
+      </w:pPr>
+      <w:r>
+        <w:t xml:space="preserve">[29] Neumann M, Gin J, Rhodes B, Bennett S, Li Z, Choubisa H, et al. Orb: A Fast, Scalable Neural Network Potential. arXiv; 2024. doi:10.48550/ARXIV.2410.22570</w:t>
+      </w:r>
+    </w:p>
+    <w:p>
+      <w:pPr>
+        <w:pStyle w:val="BodyText"/>
+      </w:pPr>
+      <w:r>
+        <w:t xml:space="preserve">[30] Giannozzi P, Baroni S, Bonini N, Calandra M, Car R, Cavazzoni C, et al. QUANTUM ESPRESSO: a modular and open-source software project for quantum simulations of materials. J Phys Condens Matter. 2009;21(39):395502. doi:10.1088/0953-8984/21/39/395502</w:t>
+      </w:r>
+    </w:p>
+    <w:p>
+      <w:pPr>
+        <w:pStyle w:val="BodyText"/>
+      </w:pPr>
+      <w:r>
+        <w:t xml:space="preserve">[31] Kresse G, Furthmüller J. Efficient iterative schemes for ab initio total-energy calculations using a plane-wave basis set. Phys Rev B. 1996 Oct;54(16):11169-86. doi:10.1103/PhysRevB.54.11169</w:t>
+      </w:r>
+    </w:p>
+    <w:p>
+      <w:pPr>
+        <w:pStyle w:val="BodyText"/>
+      </w:pPr>
+      <w:r>
+        <w:t xml:space="preserve">[32] Park Y, Kim J, Hwang S, Han S. Scalable Parallel Algorithm for Graph Neural Network Interatomic Potentials in Molecular Dynamics Simulations. J Chem Theory Comput. 2024;20(13):4857-68. doi:10.1021/acs.jctc.4c00190</w:t>
+      </w:r>
+    </w:p>
+    <w:p>
+      <w:pPr>
+        <w:pStyle w:val="BodyText"/>
+      </w:pPr>
+      <w:r>
+        <w:t xml:space="preserve">[33] Wood BJ, Kleppa OJ. Thermochemistry of forsterite-fayalite olivine solutions. Geochimica et Cosmochimica Acta. 1981 Apr;45(4):529–34. doi:10.1016/0016-7037(81)90185-X</w:t>
+      </w:r>
+    </w:p>
+    <w:p>
+      <w:pPr>
+        <w:pStyle w:val="BodyText"/>
+      </w:pPr>
+      <w:r>
+        <w:t xml:space="preserve">[34] Wu P, Eriksson G, Pelton AD, Blander M. Prediction of the Thermodynamic Properties and Phase Diagrams of Silicate Systems-Evaluation of the FeO-MgO-SiO2 System. ISIJ International. 1993;33(1):26–35. doi:10.2355/isijinternational.33.26</w:t>
+      </w:r>
+    </w:p>
+    <w:p>
+      <w:pPr>
+        <w:pStyle w:val="BodyText"/>
+      </w:pPr>
+      <w:r>
+        <w:t xml:space="preserve">[35] Barin I. Thermochemical Data of Pure Substances. 3rd ed. Weinheim: VCH; 1995. doi:10.1002/9783527619825</w:t>
+      </w:r>
+    </w:p>
+    <w:p>
+      <w:pPr>
+        <w:pStyle w:val="BodyText"/>
+      </w:pPr>
+      <w:r>
+        <w:t xml:space="preserve">[36] Hersh LS, Kleppa OJ. Enthalpies of Mixing in Some Binary Liquid Halide Mixtures. J Chem Phys. 1965;42:1309. doi:10.1063/1.1696115</w:t>
+      </w:r>
+    </w:p>
+    <w:p>
+      <w:pPr>
+        <w:pStyle w:val="BodyText"/>
+      </w:pPr>
+      <w:r>
+        <w:t xml:space="preserve">[37] Sangster J, Pelton AD. Phase Diagrams and Thermodynamic Properties of the 70 Binary Alkali Halide Systems Having Common Ions. J Phys Chem Ref Data. 1987;16:509. doi:10.1063/1.555803</w:t>
+      </w:r>
+    </w:p>
+    <w:p>
+      <w:pPr>
+        <w:pStyle w:val="BodyText"/>
+      </w:pPr>
+      <w:r>
+        <w:t xml:space="preserve">[38] an Mey S. Reevaluation of the Al-Zn system. Z Metallkd. 1993;84(7):451-5. doi:10.1515/ijmr-1993-840704</w:t>
+      </w:r>
+    </w:p>
+    <w:p>
+      <w:pPr>
+        <w:pStyle w:val="BodyText"/>
+      </w:pPr>
+      <w:r>
+        <w:t xml:space="preserve">[39] Dinsdale AT. SGTE data for pure elements. Calphad. 1991 Oct;15(4):317-425. doi:10.1016/0364-5916(91)90030-N</w:t>
+      </w:r>
+    </w:p>
+    <w:bookmarkEnd w:id="1059"/>
+    <w:bookmarkEnd w:id="1060"/>
     <w:sectPr>
       <w:footnotePr>
         <w:numRestart w:val="eachSect"/>

</xml_diff>

<commit_message>
Red-team pass as reviewers: binary-only Redlich-Kister stated honestly, MSTDB-TC acknowledged with a registry-verified reference (40 total), uncertainty limitation and ESPEI continuation stated, listings gain their numpy import and honest figure framing, example scripts no longer overwrite the canonical 600 DPI figures, and the site now links the uTDB spec, the provenance files, and the repository
Co-Authored-By: Claude Fable 5 <noreply@anthropic.com>
</commit_message>
<xml_diff>
--- a/paper/Bustamante_Hephaestus_JORS_manuscript.docx
+++ b/paper/Bustamante_Hephaestus_JORS_manuscript.docx
@@ -2,7 +2,7 @@
 <file path=word/document.xml><?xml version="1.0" encoding="utf-8"?>
 <w:document xmlns:w="http://schemas.openxmlformats.org/wordprocessingml/2006/main" xmlns:m="http://schemas.openxmlformats.org/officeDocument/2006/math" xmlns:r="http://schemas.openxmlformats.org/officeDocument/2006/relationships" xmlns:o="urn:schemas-microsoft-com:office:office" xmlns:v="urn:schemas-microsoft-com:vml" xmlns:w10="urn:schemas-microsoft-com:office:word" xmlns:a="http://schemas.openxmlformats.org/drawingml/2006/main" xmlns:pic="http://schemas.openxmlformats.org/drawingml/2006/picture" xmlns:wp="http://schemas.openxmlformats.org/drawingml/2006/wordprocessingDrawing">
   <w:body>
-    <w:bookmarkStart w:id="1060" w:name="X4855b1162e70238fd839d871e0792397dc58430"/>
+    <w:bookmarkStart w:id="1094" w:name="X4855b1162e70238fd839d871e0792397dc58430"/>
     <w:p>
       <w:pPr>
         <w:pStyle w:val="Heading1"/>
@@ -159,7 +159,7 @@
         <w:t xml:space="preserve">CALPHAD; molten slag; molten salt; modified quasichemical model; thermodynamic database; phase diagram; WebAssembly; open data</w:t>
       </w:r>
     </w:p>
-    <w:bookmarkStart w:id="1038" w:name="overview"/>
+    <w:bookmarkStart w:id="1072" w:name="overview"/>
     <w:p>
       <w:pPr>
         <w:pStyle w:val="Heading2"/>
@@ -168,7 +168,7 @@
         <w:t xml:space="preserve">(1) Overview</w:t>
       </w:r>
     </w:p>
-    <w:bookmarkStart w:id="1025" w:name="introduction"/>
+    <w:bookmarkStart w:id="1059" w:name="introduction"/>
     <w:p>
       <w:pPr>
         <w:pStyle w:val="Heading3"/>
@@ -548,8 +548,8 @@
         <w:t xml:space="preserve">Hephaestus is a deliberate response to that gap, and it treats the engine and the data as one contribution because neither is useful alone. The engine is small on purpose. Its core is plain C with no dependencies, which makes it easy to embed and lets the identical code compile to WebAssembly, so the full calculator runs in a web browser with nothing installed and no data leaving the user’s machine. The database is open on purpose. Every parameter in it derives from published measurements, each value carries its provenance down to table and page, and the known shortcomings are documented next to the numbers they affect. The present work describes both, their validation against pycalphad and against measured phase equilibria, and the ways they can be reused. None of it asks the reader to program. For the experimentalist who never writes code, the browser application is the entire product: a page to open, a database to click, and a diagram to read. The sections that follow describe the machinery underneath for those who want it. Supplementary Material S1 is a plain-language primer for the non-programmer, starting at what a database file is and ending at a first calculation and how to read it. Its closing section teaches what an assessment is built from, so a reader who wants to contribute data for open publication, or to commission a file, arrives knowing what is needed.</w:t>
       </w:r>
     </w:p>
-    <w:bookmarkEnd w:id="1025"/>
-    <w:bookmarkStart w:id="1035" w:name="implementation-and-architecture"/>
+    <w:bookmarkEnd w:id="1059"/>
+    <w:bookmarkStart w:id="1069" w:name="implementation-and-architecture"/>
     <w:p>
       <w:pPr>
         <w:pStyle w:val="Heading3"/>
@@ -575,18 +575,18 @@
           <wp:inline>
             <wp:extent cx="5334000" cy="3511167"/>
             <wp:effectExtent b="0" l="0" r="0" t="0"/>
-            <wp:docPr descr="Figure 1: Architecture of Hephaestus. A single dependency-free C core reads the field’s three database dialects (ChemSage .dat, Thermo-Calc .tdb with the Inden magnetic model, and the unified .utdb) and calculates all thermodynamics; the same core is used as a native library, from Python through cffi, and compiled to WebAssembly behind the browser application. dbbuild writes new ChemSage files from measured data, and every energy path is validated against pycalphad." title="" id="1027" name="Picture"/>
+            <wp:docPr descr="Figure 1: Architecture of Hephaestus. A single dependency-free C core reads the field’s three database dialects (ChemSage .dat, Thermo-Calc .tdb with the Inden magnetic model, and the unified .utdb) and calculates all thermodynamics; the same core is used as a native library, from Python through cffi, and compiled to WebAssembly behind the browser application. dbbuild writes new ChemSage files from measured data, and every energy path is validated against pycalphad." title="" id="1061" name="Picture"/>
             <a:graphic>
               <a:graphicData uri="http://schemas.openxmlformats.org/drawingml/2006/picture">
                 <pic:pic>
                   <pic:nvPicPr>
-                    <pic:cNvPr descr="figures/fig1_architecture.png" id="1028" name="Picture"/>
+                    <pic:cNvPr descr="figures/fig1_architecture.png" id="1062" name="Picture"/>
                     <pic:cNvPicPr>
                       <a:picLocks noChangeArrowheads="1" noChangeAspect="1"/>
                     </pic:cNvPicPr>
                   </pic:nvPicPr>
                   <pic:blipFill>
-                    <a:blip r:embed="rId1026"/>
+                    <a:blip r:embed="rId1060"/>
                     <a:stretch>
                       <a:fillRect/>
                     </a:stretch>
@@ -666,7 +666,7 @@
         <w:pStyle w:val="BodyText"/>
       </w:pPr>
       <w:r>
-        <w:t xml:space="preserve">The same core also reads the Thermo-Calc TDB (thermodynamic database) dialect, the lingua franca of alloy CALPHAD shared by Thermo-Calc [13], OpenCalphad [7], and pycalphad [8]. TDB files parse into the same internal database, so the accessors, the Python layer, and the browser work unchanged, and the format is auto-detected on load. The supported subset covers elements, species, piecewise FUNCTION expressions with nested references, compound energy formalism phases with vacancies, Redlich-Kister interactions of any order, and the Inden magnetic contribution (TC and BMAGN parameters with their antiferromagnetic factors), which brings real steel files into scope; models outside the subset, such as order-disorder partitioning and the ionic two-sublattice liquid, are rejected with a stated reason rather than calculated incompletely. Temperature extrapolation above a function’s last interval follows the Thermo-Calc convention for TDB data while ChemSage data keep their own zero-above convention. MQMQA liquids have no TDB representation, so melts remain the province of the .dat dialect; the two families meet in one engine.</w:t>
+        <w:t xml:space="preserve">The same core also reads the Thermo-Calc TDB (thermodynamic database) dialect, the lingua franca of alloy CALPHAD shared by Thermo-Calc [13], OpenCalphad [7], and pycalphad [8]. TDB files parse into the same internal database, so the accessors, the Python layer, and the browser work unchanged, and the format is auto-detected on load. The supported subset covers elements, species, piecewise FUNCTION expressions with nested references, compound energy formalism phases with vacancies, binary Redlich-Kister interactions of any order (ternary interaction parameters are outside the subset and rejected with the stated reason), and the Inden magnetic contribution (TC and BMAGN parameters with their antiferromagnetic factors), which brings real steel files into scope; models outside the subset, such as order-disorder partitioning and the ionic two-sublattice liquid, are rejected with a stated reason rather than calculated incompletely. Temperature extrapolation above a function’s last interval follows the Thermo-Calc convention for TDB data while ChemSage data keep their own zero-above convention. MQMQA liquids have no TDB representation, so melts remain the province of the .dat dialect; the two families meet in one engine.</w:t>
       </w:r>
     </w:p>
     <w:p>
@@ -793,18 +793,18 @@
           <wp:inline>
             <wp:extent cx="4754880" cy="4464799"/>
             <wp:effectExtent b="0" l="0" r="0" t="0"/>
-            <wp:docPr descr="Figure 2: The live solver in the browser application (light theme). The user loads the shipped database, picks a temperature, and presses Compute; the WebAssembly engine then solves the full FeO-MgO-SiO2 phase assemblage client side (here 1023 composition samples and 512 tie-facets in under half a second). Tapping a composition reads its stable phases and pins it to a comparison list; hovering previews on desktop." title="" id="1030" name="Picture"/>
+            <wp:docPr descr="Figure 2: The live solver in the browser application (light theme). The user loads the shipped database, picks a temperature, and presses Compute; the WebAssembly engine then solves the full FeO-MgO-SiO2 phase assemblage client side (here 1023 composition samples and 512 tie-facets in under half a second). Tapping a composition reads its stable phases and pins it to a comparison list; hovering previews on desktop." title="" id="1064" name="Picture"/>
             <a:graphic>
               <a:graphicData uri="http://schemas.openxmlformats.org/drawingml/2006/picture">
                 <pic:pic>
                   <pic:nvPicPr>
-                    <pic:cNvPr descr="figures/fig2_browser_app.png" id="1031" name="Picture"/>
+                    <pic:cNvPr descr="figures/fig2_browser_app.png" id="1065" name="Picture"/>
                     <pic:cNvPicPr>
                       <a:picLocks noChangeArrowheads="1" noChangeAspect="1"/>
                     </pic:cNvPicPr>
                   </pic:nvPicPr>
                   <pic:blipFill>
-                    <a:blip r:embed="rId1029"/>
+                    <a:blip r:embed="rId1063"/>
                     <a:stretch>
                       <a:fillRect/>
                     </a:stretch>
@@ -934,7 +934,7 @@
         <w:t xml:space="preserve"> </w:t>
       </w:r>
       <w:r>
-        <w:t xml:space="preserve">ternary), built the same way from evaluated endmember tables [35], measured mixing calorimetry [36], and the measured eutectic, liquidus, and solvus record of the halide literature [37], and loadable in the browser application with one click. Each system folder carries a provenance file that names every source, every modeling judgment, and every known limit. The largest limit is stated plainly: the CaO-SiO</w:t>
+        <w:t xml:space="preserve">ternary), built the same way from evaluated endmember tables [35], measured mixing calorimetry [36], and the measured eutectic, liquidus, and solvus record of the halide literature [37], and loadable in the browser application with one click. The nuclear community’s MSTDB-TC [38] covers molten salts for reactor work under a registration license; the chloride family here is complementary, small, and CC BY. Each system folder carries a provenance file that names every source, every modeling judgment, and every known limit. The largest limit is stated plainly: the CaO-SiO</w:t>
       </w:r>
       <w:r>
         <w:rPr>
@@ -970,18 +970,18 @@
           <wp:inline>
             <wp:extent cx="5334000" cy="2197297"/>
             <wp:effectExtent b="0" l="0" r="0" t="0"/>
-            <wp:docPr descr="Figure 3: The assessed FeO-MgO-SiO2 system calculated from the shipped database files. (a) Liquidus projection: primary crystallizing phase fields, with liquidus isotherms labeled in °C. (b) Isothermal section at 1600 °C: stable phase assemblages, shaded by the number of solid phases present. Phase labels: L liquid, Crs cristobalite, Ol olivine, Opx orthopyroxene, Per periclase, Wus wustite." title="" id="1033" name="Picture"/>
+            <wp:docPr descr="Figure 3: The assessed FeO-MgO-SiO2 system calculated from the shipped database files. (a) Liquidus projection: primary crystallizing phase fields, with liquidus isotherms labeled in °C. (b) Isothermal section at 1600 °C: stable phase assemblages, shaded by the number of solid phases present. Phase labels: L liquid, Crs cristobalite, Ol olivine, Opx orthopyroxene, Per periclase, Wus wustite." title="" id="1067" name="Picture"/>
             <a:graphic>
               <a:graphicData uri="http://schemas.openxmlformats.org/drawingml/2006/picture">
                 <pic:pic>
                   <pic:nvPicPr>
-                    <pic:cNvPr descr="figures/fig3_ternary.png" id="1034" name="Picture"/>
+                    <pic:cNvPr descr="figures/fig3_ternary.png" id="1068" name="Picture"/>
                     <pic:cNvPicPr>
                       <a:picLocks noChangeArrowheads="1" noChangeAspect="1"/>
                     </pic:cNvPicPr>
                   </pic:nvPicPr>
                   <pic:blipFill>
-                    <a:blip r:embed="rId1032"/>
+                    <a:blip r:embed="rId1066"/>
                     <a:stretch>
                       <a:fillRect/>
                     </a:stretch>
@@ -1371,8 +1371,8 @@
         <w:t xml:space="preserve">Table 2: The assessed liquids. Full source lists, modeling judgments, and limits are in each system’s provenance file in the repository.</w:t>
       </w:r>
     </w:p>
-    <w:bookmarkEnd w:id="1035"/>
-    <w:bookmarkStart w:id="1036" w:name="anatomy-of-a-database-file"/>
+    <w:bookmarkEnd w:id="1069"/>
+    <w:bookmarkStart w:id="1070" w:name="anatomy-of-a-database-file"/>
     <w:p>
       <w:pPr>
         <w:pStyle w:val="Heading3"/>
@@ -1405,8 +1405,8 @@
         <w:t xml:space="preserve">That asymmetry is the economics of the field in miniature: implementations of the published models are increasingly available, but each fitted parameter condenses dozens of measurements and decisions. Parameter sets rather than codes are therefore the scarce commodity, and an openly licensed, provenance-tracked database is the part of this contribution that cannot be regenerated from the paper alone.</w:t>
       </w:r>
     </w:p>
-    <w:bookmarkEnd w:id="1036"/>
-    <w:bookmarkStart w:id="1037" w:name="quality-control"/>
+    <w:bookmarkEnd w:id="1070"/>
+    <w:bookmarkStart w:id="1071" w:name="quality-control"/>
     <w:p>
       <w:pPr>
         <w:pStyle w:val="Heading3"/>
@@ -1444,7 +1444,7 @@
         <w:t xml:space="preserve"> </w:t>
       </w:r>
       <w:r>
-        <w:t xml:space="preserve">J per mole of atoms, line compounds included, while out-of-subset files must fail with the stated reason, and the suite asserts those failures too. The magnetic model is checked twice over: pycalphad parity on its own magnetic test database and on an own-transcribed Fe-C system, whose pure-iron transitions, carried almost entirely by the magnetic term, come out at 1185, 1668, and 1811 K against the measured 1184.8, 1667.5, and 1811. The Scheil panel is checked against known invariants: for Al-Zn at 30 mol% Zn it nucleates FCC_A1 at 836 K and freezes the 12.5% residue within one temperature step of the assessed 654 K eutectic [38]; for LiCl-KCl the residue freezes at 629 K against the measured 626 K.</w:t>
+        <w:t xml:space="preserve">J per mole of atoms, line compounds included, while out-of-subset files must fail with the stated reason, and the suite asserts those failures too. The magnetic model is checked twice over: pycalphad parity on its own magnetic test database and on an own-transcribed Fe-C system, whose pure-iron transitions, carried almost entirely by the magnetic term, come out at 1185, 1668, and 1811 K against the measured 1184.8, 1667.5, and 1811. The Scheil panel is checked against known invariants: for Al-Zn at 30 mol% Zn it nucleates FCC_A1 at 836 K and freezes the 12.5% residue within one temperature step of the assessed 654 K eutectic [39]; for LiCl-KCl the residue freezes at 629 K against the measured 626 K.</w:t>
       </w:r>
     </w:p>
     <w:tbl>
@@ -1927,9 +1927,9 @@
         <w:t xml:space="preserve">invariants sit within about 40 °C, and the ternary liquidus projection reproduces the measured field topology [24]. Development practice is plain: the repository is version controlled with tagged releases (v0.1.0 through the v0.4.0 described here), the full suite runs before every release, and a fixed bug lands together with the regression test that would have caught it. The suite runs on Windows 11 under CPython 3.11 and 3.12; the browser application is exercised in Chromium- and Gecko-based browsers. A user can confirm a working installation by running pytest against the bundled test databases, or with no installation at all by opening the web application and loading the shipped ternary database.</w:t>
       </w:r>
     </w:p>
-    <w:bookmarkEnd w:id="1037"/>
-    <w:bookmarkEnd w:id="1038"/>
-    <w:bookmarkStart w:id="1046" w:name="availability"/>
+    <w:bookmarkEnd w:id="1071"/>
+    <w:bookmarkEnd w:id="1072"/>
+    <w:bookmarkStart w:id="1080" w:name="availability"/>
     <w:p>
       <w:pPr>
         <w:pStyle w:val="Heading2"/>
@@ -1938,7 +1938,7 @@
         <w:t xml:space="preserve">(2) Availability</w:t>
       </w:r>
     </w:p>
-    <w:bookmarkStart w:id="1039" w:name="operating-system"/>
+    <w:bookmarkStart w:id="1073" w:name="operating-system"/>
     <w:p>
       <w:pPr>
         <w:pStyle w:val="Heading3"/>
@@ -1955,8 +1955,8 @@
         <w:t xml:space="preserve">Platform independent. The core builds with any C99 compiler; development and testing used Windows 11. The browser application runs in any current browser with WebAssembly support.</w:t>
       </w:r>
     </w:p>
-    <w:bookmarkEnd w:id="1039"/>
-    <w:bookmarkStart w:id="1040" w:name="programming-language"/>
+    <w:bookmarkEnd w:id="1073"/>
+    <w:bookmarkStart w:id="1074" w:name="programming-language"/>
     <w:p>
       <w:pPr>
         <w:pStyle w:val="Heading3"/>
@@ -1973,8 +1973,8 @@
         <w:t xml:space="preserve">C (core), Python 3.11 or later (interface and fitting tools), JavaScript (browser application).</w:t>
       </w:r>
     </w:p>
-    <w:bookmarkEnd w:id="1040"/>
-    <w:bookmarkStart w:id="1041" w:name="additional-system-requirements"/>
+    <w:bookmarkEnd w:id="1074"/>
+    <w:bookmarkStart w:id="1075" w:name="additional-system-requirements"/>
     <w:p>
       <w:pPr>
         <w:pStyle w:val="Heading3"/>
@@ -1991,8 +1991,8 @@
         <w:t xml:space="preserve">None of note. The engine and database together are a few megabytes.</w:t>
       </w:r>
     </w:p>
-    <w:bookmarkEnd w:id="1041"/>
-    <w:bookmarkStart w:id="1042" w:name="dependencies"/>
+    <w:bookmarkEnd w:id="1075"/>
+    <w:bookmarkStart w:id="1076" w:name="dependencies"/>
     <w:p>
       <w:pPr>
         <w:pStyle w:val="Heading3"/>
@@ -2009,8 +2009,8 @@
         <w:t xml:space="preserve">Python interface: cffi, NumPy, SciPy. Validation suite additionally requires pycalphad. WebAssembly build requires emscripten. The C core and the browser application have no dependencies.</w:t>
       </w:r>
     </w:p>
-    <w:bookmarkEnd w:id="1042"/>
-    <w:bookmarkStart w:id="1043" w:name="list-of-contributors"/>
+    <w:bookmarkEnd w:id="1076"/>
+    <w:bookmarkStart w:id="1077" w:name="list-of-contributors"/>
     <w:p>
       <w:pPr>
         <w:pStyle w:val="Heading3"/>
@@ -2027,8 +2027,8 @@
         <w:t xml:space="preserve">Michael E. Bustamante (design, implementation, validation, data curation).</w:t>
       </w:r>
     </w:p>
-    <w:bookmarkEnd w:id="1043"/>
-    <w:bookmarkStart w:id="1044" w:name="software-location"/>
+    <w:bookmarkEnd w:id="1077"/>
+    <w:bookmarkStart w:id="1078" w:name="software-location"/>
     <w:p>
       <w:pPr>
         <w:pStyle w:val="Heading3"/>
@@ -2181,8 +2181,8 @@
         <w:t xml:space="preserve">Date published: 2026-09-02</w:t>
       </w:r>
     </w:p>
-    <w:bookmarkEnd w:id="1044"/>
-    <w:bookmarkStart w:id="1045" w:name="language"/>
+    <w:bookmarkEnd w:id="1078"/>
+    <w:bookmarkStart w:id="1079" w:name="language"/>
     <w:p>
       <w:pPr>
         <w:pStyle w:val="Heading3"/>
@@ -2199,9 +2199,9 @@
         <w:t xml:space="preserve">English.</w:t>
       </w:r>
     </w:p>
-    <w:bookmarkEnd w:id="1045"/>
-    <w:bookmarkEnd w:id="1046"/>
-    <w:bookmarkStart w:id="1054" w:name="reuse-potential"/>
+    <w:bookmarkEnd w:id="1079"/>
+    <w:bookmarkEnd w:id="1080"/>
+    <w:bookmarkStart w:id="1088" w:name="reuse-potential"/>
     <w:p>
       <w:pPr>
         <w:pStyle w:val="Heading2"/>
@@ -2226,7 +2226,7 @@
         <w:t xml:space="preserve">The browser application makes the lowest barrier the default. A lecture on slag thermodynamics, a plant metallurgist screening a composition, or a reviewer checking a claimed equilibrium can load the database and calculate in seconds, with confidential inputs never leaving the machine. The same property makes it a practical template for other groups who want to publish a model as a zero-install tool.</w:t>
       </w:r>
     </w:p>
-    <w:bookmarkStart w:id="1053" w:name="worked-examples"/>
+    <w:bookmarkStart w:id="1087" w:name="worked-examples"/>
     <w:p>
       <w:pPr>
         <w:pStyle w:val="Heading3"/>
@@ -2240,13 +2240,25 @@
         <w:pStyle w:val="FirstParagraph"/>
       </w:pPr>
       <w:r>
-        <w:t xml:space="preserve">Two complete sessions show the public API end to end; both run against the shipped files exactly as printed and produce the figures shown. The salt session calculates the LiCl-KCl phase diagram:</w:t>
+        <w:t xml:space="preserve">Two complete sessions show the public API end to end. Both run against the shipped files as printed (the alloy session’s ten-line lower_hull helper is printed in the repository copy), and Figures 4 and 5 are drawn from their output by plotting scripts kept in the repository. The salt session calculates the LiCl-KCl phase diagram:</w:t>
       </w:r>
     </w:p>
     <w:p>
       <w:pPr>
         <w:pStyle w:val="SourceCode"/>
       </w:pPr>
+      <w:r>
+        <w:rPr>
+          <w:rStyle w:val="VerbatimChar"/>
+        </w:rPr>
+        <w:t xml:space="preserve">import numpy as np</w:t>
+      </w:r>
+      <w:r>
+        <w:br/>
+      </w:r>
+      <w:r>
+        <w:br/>
+      </w:r>
       <w:r>
         <w:rPr>
           <w:rStyle w:val="VerbatimChar"/>
@@ -2426,18 +2438,18 @@
           <wp:inline>
             <wp:extent cx="4206240" cy="3262561"/>
             <wp:effectExtent b="0" l="0" r="0" t="0"/>
-            <wp:docPr descr="Figure 4: The LiCl-KCl phase diagram calculated by the salt listing from the shipped open database, at the listing’s own step size. Light to dark: liquid, two-phase, and subsolidus fields. The dot is the calculated eutectic at this step size (0.400, 640 K); the star is the measured eutectic (0.415, 626 K)." title="" id="1048" name="Picture"/>
+            <wp:docPr descr="Figure 4: The LiCl-KCl phase diagram calculated by the salt listing from the shipped open database, at the listing’s own step size. Light to dark: liquid, two-phase, and subsolidus fields. The dot is the calculated eutectic at this step size (0.400, 640 K); the star is the measured eutectic (0.415, 626 K)." title="" id="1082" name="Picture"/>
             <a:graphic>
               <a:graphicData uri="http://schemas.openxmlformats.org/drawingml/2006/picture">
                 <pic:pic>
                   <pic:nvPicPr>
-                    <pic:cNvPr descr="figures/fig4_salt_example.png" id="1049" name="Picture"/>
+                    <pic:cNvPr descr="figures/fig4_salt_example.png" id="1083" name="Picture"/>
                     <pic:cNvPicPr>
                       <a:picLocks noChangeArrowheads="1" noChangeAspect="1"/>
                     </pic:cNvPicPr>
                   </pic:nvPicPr>
                   <pic:blipFill>
-                    <a:blip r:embed="rId1047"/>
+                    <a:blip r:embed="rId1081"/>
                     <a:stretch>
                       <a:fillRect/>
                     </a:stretch>
@@ -2488,6 +2500,18 @@
         <w:rPr>
           <w:rStyle w:val="VerbatimChar"/>
         </w:rPr>
+        <w:t xml:space="preserve">import numpy as np</w:t>
+      </w:r>
+      <w:r>
+        <w:br/>
+      </w:r>
+      <w:r>
+        <w:br/>
+      </w:r>
+      <w:r>
+        <w:rPr>
+          <w:rStyle w:val="VerbatimChar"/>
+        </w:rPr>
         <w:t xml:space="preserve">from mqmqa import Database</w:t>
       </w:r>
       <w:r>
@@ -2648,7 +2672,7 @@
         <w:t xml:space="preserve"> </w:t>
       </w:r>
       <w:r>
-        <w:t xml:space="preserve">= 0.890 and 660 K against the assessed 0.885 and 654 K [38] (Figure 5). The shipped AlZn.tdb is itself an openly licensed transcription of that published assessment on the Scientific Group Thermodata Europe (SGTE) unary functions [39], verified bit-identical through pycalphad against the file it transcribes. The slag systems run through the same calls behind Figures 2 and 3, and the repository’s validation scripts are their executable record.</w:t>
+        <w:t xml:space="preserve">= 0.890 and 660 K against the assessed 0.885 and 654 K [39] (Figure 5). The shipped AlZn.tdb is itself an openly licensed transcription of that published assessment on the Scientific Group Thermodata Europe (SGTE) unary functions [40], verified bit-identical through pycalphad against the file it transcribes. The slag systems run through the same calls behind Figures 2 and 3, and the repository’s validation scripts are their executable record.</w:t>
       </w:r>
     </w:p>
     <w:p>
@@ -2660,18 +2684,18 @@
           <wp:inline>
             <wp:extent cx="4206240" cy="3262561"/>
             <wp:effectExtent b="0" l="0" r="0" t="0"/>
-            <wp:docPr descr="Figure 5: The Al-Zn phase diagram computed by the alloy listing from the shipped open TDB. Light to dark: liquid, liquid plus solid, and solid fields. The dot is the calculated eutectic (0.890, 660 K); the star is the assessed eutectic (0.885, 654 K)." title="" id="1051" name="Picture"/>
+            <wp:docPr descr="Figure 5: The Al-Zn phase diagram computed by the alloy listing from the shipped open TDB. Light to dark: liquid, liquid plus solid, and solid fields. The dot is the calculated eutectic (0.890, 660 K); the star is the assessed eutectic (0.885, 654 K)." title="" id="1085" name="Picture"/>
             <a:graphic>
               <a:graphicData uri="http://schemas.openxmlformats.org/drawingml/2006/picture">
                 <pic:pic>
                   <pic:nvPicPr>
-                    <pic:cNvPr descr="figures/fig5_alloy_example.png" id="1052" name="Picture"/>
+                    <pic:cNvPr descr="figures/fig5_alloy_example.png" id="1086" name="Picture"/>
                     <pic:cNvPicPr>
                       <a:picLocks noChangeArrowheads="1" noChangeAspect="1"/>
                     </pic:cNvPicPr>
                   </pic:nvPicPr>
                   <pic:blipFill>
-                    <a:blip r:embed="rId1050"/>
+                    <a:blip r:embed="rId1084"/>
                     <a:stretch>
                       <a:fillRect/>
                     </a:stretch>
@@ -2711,7 +2735,7 @@
         <w:pStyle w:val="BodyText"/>
       </w:pPr>
       <w:r>
-        <w:t xml:space="preserve">The database is a starting point rather than an endpoint, and the file format rewards growth: new components, new phases, and refits against new measurements accumulate in the same database. A system is therefore extended release by release rather than rebuilt, and archived versions keep results calculated against earlier releases reproducible. Because every value carries its source and every judgment is written down, another assessor can reweight the data, swap an endmember, or extend a system without reverse-engineering anything; dbbuild turns a table of measured activities into a loadable file in a few lines. The in-browser multiphase hull already covers any loaded three-cation file and any loaded alloy TDB join, so a new system becomes a browser phase diagram the moment its file loads. Natural extensions are further oxide systems, the remaining ChemSage solution models, the ionic-liquid TDB model, and multicomponent Scheil on the same hull machinery. The repository also publishes an openly specified unified dialect (uTDB) that carries the MQMQA statements inside TDB grammar, with two shipped demonstration files chosen to be processes rather than curiosities: an aluminum-recycling database holding the Al-Zn alloy with its NaCl-KCl-MgCl2 salt flux, and a steelmaking database holding a basic Fe-C steel, magnetic phases included, with the FeO-MgO-SiO2 slag and its silicate solid solutions. Round-trip tests assert both reproduce their source-file physics at machine precision. Relative to the XML road of XTDB [15] (Table 1), uTDB is the on-ramp from the installed base, extending files as they are and running in this engine today, with mechanical conversion to XTDB elements the natural bridge once that schema settles. Making the calculator multilingual across the field’s file dialects is the direction of travel. Contributions and issues are handled through the GitHub repository.</w:t>
+        <w:t xml:space="preserve">The database is a starting point rather than an endpoint, and the file format rewards growth: new components, new phases, and refits against new measurements accumulate in the same database. A system is therefore extended release by release rather than rebuilt, and archived versions keep results calculated against earlier releases reproducible. Because every value carries its source and every judgment is written down, another assessor can reweight the data, swap an endmember, or extend a system without reverse-engineering anything; dbbuild turns a table of measured activities into a loadable file in a few lines. The in-browser multiphase hull already covers any loaded three-cation file and any loaded alloy TDB join, so a new system becomes a browser phase diagram the moment its file loads. Natural extensions are further oxide systems, the remaining ChemSage solution models, the ionic-liquid TDB model, and multicomponent Scheil on the same hull machinery. The databases carry per-value provenance but not parameter uncertainties; refitting the same measured-data tables through ESPEI [10] to obtain Bayesian uncertainty bounds is a natural continuation. The repository also publishes an openly specified unified dialect (uTDB) that carries the MQMQA statements inside TDB grammar, with two shipped demonstration files chosen to be processes rather than curiosities: an aluminum-recycling database holding the Al-Zn alloy with its NaCl-KCl-MgCl2 salt flux, and a steelmaking database holding a basic Fe-C steel, magnetic phases included, with the FeO-MgO-SiO2 slag and its silicate solid solutions. Round-trip tests assert both reproduce their source-file physics at machine precision. Relative to the XML road of XTDB [15] (Table 1), uTDB is the on-ramp from the installed base, extending files as they are and running in this engine today, with mechanical conversion to XTDB elements the natural bridge once that schema settles. Making the calculator multilingual across the field’s file dialects is the direction of travel. Contributions and issues are handled through the GitHub repository.</w:t>
       </w:r>
     </w:p>
     <w:p>
@@ -2722,9 +2746,9 @@
         <w:t xml:space="preserve">The paper closes where it began. The gap was never the model, which has been published for two decades, but an open, runnable pairing of model and parameters. Hephaestus supplies both halves under open licenses and puts them behind a browser page that asks nothing of its user. The claims are checkable end to end. Release v0.4.0 archives the exact version described, and the 104-test suite reruns the pycalphad comparisons on any machine. The worked examples print the figures shown, and every parameter in every shipped database traces to a published measurement through its provenance file. A reader who doubts a number can recalculate it; one who needs a system that is missing can build it with the same open tools, or ask.</w:t>
       </w:r>
     </w:p>
-    <w:bookmarkEnd w:id="1053"/>
-    <w:bookmarkEnd w:id="1054"/>
-    <w:bookmarkStart w:id="1055" w:name="data-availability"/>
+    <w:bookmarkEnd w:id="1087"/>
+    <w:bookmarkEnd w:id="1088"/>
+    <w:bookmarkStart w:id="1089" w:name="data-availability"/>
     <w:p>
       <w:pPr>
         <w:pStyle w:val="Heading2"/>
@@ -2741,8 +2765,8 @@
         <w:t xml:space="preserve">The engine, the database, the browser application, and the validation suite are openly available in the code repository listed above; the version described here is archived as release v0.4.0. The database files and their provenance records are in the repository’s data directory under CC BY 4.0.</w:t>
       </w:r>
     </w:p>
-    <w:bookmarkEnd w:id="1055"/>
-    <w:bookmarkStart w:id="1056" w:name="acknowledgements"/>
+    <w:bookmarkEnd w:id="1089"/>
+    <w:bookmarkStart w:id="1090" w:name="acknowledgements"/>
     <w:p>
       <w:pPr>
         <w:pStyle w:val="Heading2"/>
@@ -2759,8 +2783,8 @@
         <w:t xml:space="preserve">During the development of this software the author used Claude Code (Anthropic) to assist with implementation, validation scripting, and manuscript preparation. This assistance was agentic, not autonomous: it operated under author direction and supervision at every step and was never a closed loop that produced or accepted results without review. Every parameter was traced by the author to its primary source before entering the database, and every reference was verified against its registry record. The author reviewed and approved all output and takes full responsibility for this article.</w:t>
       </w:r>
     </w:p>
-    <w:bookmarkEnd w:id="1056"/>
-    <w:bookmarkStart w:id="1057" w:name="funding-statement"/>
+    <w:bookmarkEnd w:id="1090"/>
+    <w:bookmarkStart w:id="1091" w:name="funding-statement"/>
     <w:p>
       <w:pPr>
         <w:pStyle w:val="Heading2"/>
@@ -2777,8 +2801,8 @@
         <w:t xml:space="preserve">The development of this software received no external funding.</w:t>
       </w:r>
     </w:p>
-    <w:bookmarkEnd w:id="1057"/>
-    <w:bookmarkStart w:id="1058" w:name="competing-interests"/>
+    <w:bookmarkEnd w:id="1091"/>
+    <w:bookmarkStart w:id="1092" w:name="competing-interests"/>
     <w:p>
       <w:pPr>
         <w:pStyle w:val="Heading2"/>
@@ -2795,8 +2819,8 @@
         <w:t xml:space="preserve">The author founded Odinzen LLC, which provides commercial thermodynamic modeling services, and declares this as a competing interest. The software and database published here are released in full under open licenses, and no proprietary Odinzen assets are included.</w:t>
       </w:r>
     </w:p>
-    <w:bookmarkEnd w:id="1058"/>
-    <w:bookmarkStart w:id="1059" w:name="references"/>
+    <w:bookmarkEnd w:id="1092"/>
+    <w:bookmarkStart w:id="1093" w:name="references"/>
     <w:p>
       <w:pPr>
         <w:pStyle w:val="Heading2"/>
@@ -3118,19 +3142,27 @@
         <w:pStyle w:val="BodyText"/>
       </w:pPr>
       <w:r>
-        <w:t xml:space="preserve">[38] an Mey S. Reevaluation of the Al-Zn system. Z Metallkd. 1993;84(7):451-5. doi:10.1515/ijmr-1993-840704</w:t>
-      </w:r>
-    </w:p>
-    <w:p>
-      <w:pPr>
-        <w:pStyle w:val="BodyText"/>
-      </w:pPr>
-      <w:r>
-        <w:t xml:space="preserve">[39] Dinsdale AT. SGTE data for pure elements. Calphad. 1991 Oct;15(4):317-425. doi:10.1016/0364-5916(91)90030-N</w:t>
-      </w:r>
-    </w:p>
-    <w:bookmarkEnd w:id="1059"/>
-    <w:bookmarkEnd w:id="1060"/>
+        <w:t xml:space="preserve">[38] Ard JC, Yingling JA, Johnson TJ, Schorne-Pinto J, Aziziha M, Dixon CM, et al. Development of the Molten Salt Thermal Properties Database - Thermochemical (MSTDB-TC), example applications, and LiCl-RbCl and UF3-UF4 system assessments. J Nucl Mater. 2022 May;563:153631. doi:10.1016/j.jnucmat.2022.153631</w:t>
+      </w:r>
+    </w:p>
+    <w:p>
+      <w:pPr>
+        <w:pStyle w:val="BodyText"/>
+      </w:pPr>
+      <w:r>
+        <w:t xml:space="preserve">[39] an Mey S. Reevaluation of the Al-Zn system. Z Metallkd. 1993;84(7):451-5. doi:10.1515/ijmr-1993-840704</w:t>
+      </w:r>
+    </w:p>
+    <w:p>
+      <w:pPr>
+        <w:pStyle w:val="BodyText"/>
+      </w:pPr>
+      <w:r>
+        <w:t xml:space="preserve">[40] Dinsdale AT. SGTE data for pure elements. Calphad. 1991 Oct;15(4):317-425. doi:10.1016/0364-5916(91)90030-N</w:t>
+      </w:r>
+    </w:p>
+    <w:bookmarkEnd w:id="1093"/>
+    <w:bookmarkEnd w:id="1094"/>
     <w:sectPr>
       <w:footnotePr>
         <w:numRestart w:val="eachSect"/>

</xml_diff>

<commit_message>
Shang-persona review: DFT sentence carries the zero-kelvin-unless-phonons nuance, the SevenNet olivine check states its configuration-averaged supercell method as recorded, and the first-principles table row includes finite-temperature properties
Co-Authored-By: Claude Fable 5 <noreply@anthropic.com>
</commit_message>
<xml_diff>
--- a/paper/Bustamante_Hephaestus_JORS_manuscript.docx
+++ b/paper/Bustamante_Hephaestus_JORS_manuscript.docx
@@ -2,7 +2,7 @@
 <file path=word/document.xml><?xml version="1.0" encoding="utf-8"?>
 <w:document xmlns:w="http://schemas.openxmlformats.org/wordprocessingml/2006/main" xmlns:m="http://schemas.openxmlformats.org/officeDocument/2006/math" xmlns:r="http://schemas.openxmlformats.org/officeDocument/2006/relationships" xmlns:o="urn:schemas-microsoft-com:office:office" xmlns:v="urn:schemas-microsoft-com:vml" xmlns:w10="urn:schemas-microsoft-com:office:word" xmlns:a="http://schemas.openxmlformats.org/drawingml/2006/main" xmlns:pic="http://schemas.openxmlformats.org/drawingml/2006/picture" xmlns:wp="http://schemas.openxmlformats.org/drawingml/2006/wordprocessingDrawing">
   <w:body>
-    <w:bookmarkStart w:id="1094" w:name="X4855b1162e70238fd839d871e0792397dc58430"/>
+    <w:bookmarkStart w:id="1128" w:name="X4855b1162e70238fd839d871e0792397dc58430"/>
     <w:p>
       <w:pPr>
         <w:pStyle w:val="Heading1"/>
@@ -159,7 +159,7 @@
         <w:t xml:space="preserve">CALPHAD; molten slag; molten salt; modified quasichemical model; thermodynamic database; phase diagram; WebAssembly; open data</w:t>
       </w:r>
     </w:p>
-    <w:bookmarkStart w:id="1072" w:name="overview"/>
+    <w:bookmarkStart w:id="1106" w:name="overview"/>
     <w:p>
       <w:pPr>
         <w:pStyle w:val="Heading2"/>
@@ -168,7 +168,7 @@
         <w:t xml:space="preserve">(1) Overview</w:t>
       </w:r>
     </w:p>
-    <w:bookmarkStart w:id="1059" w:name="introduction"/>
+    <w:bookmarkStart w:id="1093" w:name="introduction"/>
     <w:p>
       <w:pPr>
         <w:pStyle w:val="Heading3"/>
@@ -526,7 +526,7 @@
               <w:jc w:val="left"/>
             </w:pPr>
             <w:r>
-              <w:t xml:space="preserve">calculated formation energies (the Materials Project [16] and kin)</w:t>
+              <w:t xml:space="preserve">calculated formation energies and finite-temperature properties (the Materials Project [16] and kin)</w:t>
             </w:r>
           </w:p>
         </w:tc>
@@ -548,8 +548,8 @@
         <w:t xml:space="preserve">Hephaestus is a deliberate response to that gap, and it treats the engine and the data as one contribution because neither is useful alone. The engine is small on purpose. Its core is plain C with no dependencies, which makes it easy to embed and lets the identical code compile to WebAssembly, so the full calculator runs in a web browser with nothing installed and no data leaving the user’s machine. The database is open on purpose. Every parameter in it derives from published measurements, each value carries its provenance down to table and page, and the known shortcomings are documented next to the numbers they affect. The present work describes both, their validation against pycalphad and against measured phase equilibria, and the ways they can be reused. None of it asks the reader to program. For the experimentalist who never writes code, the browser application is the entire product: a page to open, a database to click, and a diagram to read. The sections that follow describe the machinery underneath for those who want it. Supplementary Material S1 is a plain-language primer for the non-programmer, starting at what a database file is and ending at a first calculation and how to read it. Its closing section teaches what an assessment is built from, so a reader who wants to contribute data for open publication, or to commission a file, arrives knowing what is needed.</w:t>
       </w:r>
     </w:p>
-    <w:bookmarkEnd w:id="1059"/>
-    <w:bookmarkStart w:id="1069" w:name="implementation-and-architecture"/>
+    <w:bookmarkEnd w:id="1093"/>
+    <w:bookmarkStart w:id="1103" w:name="implementation-and-architecture"/>
     <w:p>
       <w:pPr>
         <w:pStyle w:val="Heading3"/>
@@ -575,18 +575,18 @@
           <wp:inline>
             <wp:extent cx="5334000" cy="3511167"/>
             <wp:effectExtent b="0" l="0" r="0" t="0"/>
-            <wp:docPr descr="Figure 1: Architecture of Hephaestus. A single dependency-free C core reads the field’s three database dialects (ChemSage .dat, Thermo-Calc .tdb with the Inden magnetic model, and the unified .utdb) and calculates all thermodynamics; the same core is used as a native library, from Python through cffi, and compiled to WebAssembly behind the browser application. dbbuild writes new ChemSage files from measured data, and every energy path is validated against pycalphad." title="" id="1061" name="Picture"/>
+            <wp:docPr descr="Figure 1: Architecture of Hephaestus. A single dependency-free C core reads the field’s three database dialects (ChemSage .dat, Thermo-Calc .tdb with the Inden magnetic model, and the unified .utdb) and calculates all thermodynamics; the same core is used as a native library, from Python through cffi, and compiled to WebAssembly behind the browser application. dbbuild writes new ChemSage files from measured data, and every energy path is validated against pycalphad." title="" id="1095" name="Picture"/>
             <a:graphic>
               <a:graphicData uri="http://schemas.openxmlformats.org/drawingml/2006/picture">
                 <pic:pic>
                   <pic:nvPicPr>
-                    <pic:cNvPr descr="figures/fig1_architecture.png" id="1062" name="Picture"/>
+                    <pic:cNvPr descr="figures/fig1_architecture.png" id="1096" name="Picture"/>
                     <pic:cNvPicPr>
                       <a:picLocks noChangeArrowheads="1" noChangeAspect="1"/>
                     </pic:cNvPicPr>
                   </pic:nvPicPr>
                   <pic:blipFill>
-                    <a:blip r:embed="rId1060"/>
+                    <a:blip r:embed="rId1094"/>
                     <a:stretch>
                       <a:fillRect/>
                     </a:stretch>
@@ -793,18 +793,18 @@
           <wp:inline>
             <wp:extent cx="4754880" cy="4464799"/>
             <wp:effectExtent b="0" l="0" r="0" t="0"/>
-            <wp:docPr descr="Figure 2: The live solver in the browser application (light theme). The user loads the shipped database, picks a temperature, and presses Compute; the WebAssembly engine then solves the full FeO-MgO-SiO2 phase assemblage client side (here 1023 composition samples and 512 tie-facets in under half a second). Tapping a composition reads its stable phases and pins it to a comparison list; hovering previews on desktop." title="" id="1064" name="Picture"/>
+            <wp:docPr descr="Figure 2: The live solver in the browser application (light theme). The user loads the shipped database, picks a temperature, and presses Compute; the WebAssembly engine then solves the full FeO-MgO-SiO2 phase assemblage client side (here 1023 composition samples and 512 tie-facets in under half a second). Tapping a composition reads its stable phases and pins it to a comparison list; hovering previews on desktop." title="" id="1098" name="Picture"/>
             <a:graphic>
               <a:graphicData uri="http://schemas.openxmlformats.org/drawingml/2006/picture">
                 <pic:pic>
                   <pic:nvPicPr>
-                    <pic:cNvPr descr="figures/fig2_browser_app.png" id="1065" name="Picture"/>
+                    <pic:cNvPr descr="figures/fig2_browser_app.png" id="1099" name="Picture"/>
                     <pic:cNvPicPr>
                       <a:picLocks noChangeArrowheads="1" noChangeAspect="1"/>
                     </pic:cNvPicPr>
                   </pic:nvPicPr>
                   <pic:blipFill>
-                    <a:blip r:embed="rId1063"/>
+                    <a:blip r:embed="rId1097"/>
                     <a:stretch>
                       <a:fillRect/>
                     </a:stretch>
@@ -880,7 +880,7 @@
         <w:t xml:space="preserve"> </w:t>
       </w:r>
       <w:r>
-        <w:t xml:space="preserve">[23], and the melting and immiscibility constraints of the classical phase diagram studies [24-26]. Solution-calorimetric compound enthalpies [27] anchor the solids. Where published calorimetry cannot constrain a liquid, melt-mixing enthalpies from machine-learned interatomic potentials [28,29] serve as auxiliary anchors after bias correction against measured formation enthalpies; each such use is recorded in the provenance files. First-principles codes sit upstream of this pipeline. A density functional theory (DFT) engine such as Quantum ESPRESSO [30] or VASP [31] calculates candidate energies for an assessment to weigh, not assessed Gibbs functions, and repositories such as the Materials Project [16] serve those results at scale. That physics enters the present databases only through potentials trained on large DFT corpora. MatterSim [28] and Orb [29] supply the melt anchors above, and a further graph-network potential, SevenNet [32], was used to corroborate the olivine mixing enthalpy against the calorimetric record [33], a check recorded in the repository without changing any fitted parameter. The olivine and orthopyroxene solid solutions take their endmembers from Robie and Hemingway [19] and their mixing parameters from solution calorimetry [33]. The assembled ternary reproduces the topology of the measured MgO-FeO-SiO</w:t>
+        <w:t xml:space="preserve">[23], and the melting and immiscibility constraints of the classical phase diagram studies [24-26]. Solution-calorimetric compound enthalpies [27] anchor the solids. Where published calorimetry cannot constrain a liquid, melt-mixing enthalpies from machine-learned interatomic potentials [28,29] serve as auxiliary anchors after bias correction against measured formation enthalpies; each such use is recorded in the provenance files. First-principles codes sit upstream of this pipeline. A density functional theory (DFT) engine such as Quantum ESPRESSO [30] or VASP [31] calculates the energy of one configuration at a time, at zero kelvin unless phonon or molecular-dynamics machinery is layered on top. It supplies candidate data for an assessment to weigh, not assessed multicomponent Gibbs functions, and repositories such as the Materials Project [16] serve such results at scale. That physics enters the present databases only through potentials trained on large DFT corpora. MatterSim [28] and Orb [29] supply the melt anchors above, and a further graph-network potential, SevenNet [32], was used to corroborate the olivine mixing enthalpy against the calorimetric record [33] through configuration-averaged relaxed supercells, with endmember differences cancelling any constant offset; the check is recorded in the repository and changed no fitted parameter. The olivine and orthopyroxene solid solutions take their endmembers from Robie and Hemingway [19] and their mixing parameters from solution calorimetry [33]. The assembled ternary reproduces the topology of the measured MgO-FeO-SiO</w:t>
       </w:r>
       <w:r>
         <w:rPr>
@@ -970,18 +970,18 @@
           <wp:inline>
             <wp:extent cx="5334000" cy="2197297"/>
             <wp:effectExtent b="0" l="0" r="0" t="0"/>
-            <wp:docPr descr="Figure 3: The assessed FeO-MgO-SiO2 system calculated from the shipped database files. (a) Liquidus projection: primary crystallizing phase fields, with liquidus isotherms labeled in °C. (b) Isothermal section at 1600 °C: stable phase assemblages, shaded by the number of solid phases present. Phase labels: L liquid, Crs cristobalite, Ol olivine, Opx orthopyroxene, Per periclase, Wus wustite." title="" id="1067" name="Picture"/>
+            <wp:docPr descr="Figure 3: The assessed FeO-MgO-SiO2 system calculated from the shipped database files. (a) Liquidus projection: primary crystallizing phase fields, with liquidus isotherms labeled in °C. (b) Isothermal section at 1600 °C: stable phase assemblages, shaded by the number of solid phases present. Phase labels: L liquid, Crs cristobalite, Ol olivine, Opx orthopyroxene, Per periclase, Wus wustite." title="" id="1101" name="Picture"/>
             <a:graphic>
               <a:graphicData uri="http://schemas.openxmlformats.org/drawingml/2006/picture">
                 <pic:pic>
                   <pic:nvPicPr>
-                    <pic:cNvPr descr="figures/fig3_ternary.png" id="1068" name="Picture"/>
+                    <pic:cNvPr descr="figures/fig3_ternary.png" id="1102" name="Picture"/>
                     <pic:cNvPicPr>
                       <a:picLocks noChangeArrowheads="1" noChangeAspect="1"/>
                     </pic:cNvPicPr>
                   </pic:nvPicPr>
                   <pic:blipFill>
-                    <a:blip r:embed="rId1066"/>
+                    <a:blip r:embed="rId1100"/>
                     <a:stretch>
                       <a:fillRect/>
                     </a:stretch>
@@ -1371,8 +1371,8 @@
         <w:t xml:space="preserve">Table 2: The assessed liquids. Full source lists, modeling judgments, and limits are in each system’s provenance file in the repository.</w:t>
       </w:r>
     </w:p>
-    <w:bookmarkEnd w:id="1069"/>
-    <w:bookmarkStart w:id="1070" w:name="anatomy-of-a-database-file"/>
+    <w:bookmarkEnd w:id="1103"/>
+    <w:bookmarkStart w:id="1104" w:name="anatomy-of-a-database-file"/>
     <w:p>
       <w:pPr>
         <w:pStyle w:val="Heading3"/>
@@ -1405,8 +1405,8 @@
         <w:t xml:space="preserve">That asymmetry is the economics of the field in miniature: implementations of the published models are increasingly available, but each fitted parameter condenses dozens of measurements and decisions. Parameter sets rather than codes are therefore the scarce commodity, and an openly licensed, provenance-tracked database is the part of this contribution that cannot be regenerated from the paper alone.</w:t>
       </w:r>
     </w:p>
-    <w:bookmarkEnd w:id="1070"/>
-    <w:bookmarkStart w:id="1071" w:name="quality-control"/>
+    <w:bookmarkEnd w:id="1104"/>
+    <w:bookmarkStart w:id="1105" w:name="quality-control"/>
     <w:p>
       <w:pPr>
         <w:pStyle w:val="Heading3"/>
@@ -1927,9 +1927,9 @@
         <w:t xml:space="preserve">invariants sit within about 40 °C, and the ternary liquidus projection reproduces the measured field topology [24]. Development practice is plain: the repository is version controlled with tagged releases (v0.1.0 through the v0.4.0 described here), the full suite runs before every release, and a fixed bug lands together with the regression test that would have caught it. The suite runs on Windows 11 under CPython 3.11 and 3.12; the browser application is exercised in Chromium- and Gecko-based browsers. A user can confirm a working installation by running pytest against the bundled test databases, or with no installation at all by opening the web application and loading the shipped ternary database.</w:t>
       </w:r>
     </w:p>
-    <w:bookmarkEnd w:id="1071"/>
-    <w:bookmarkEnd w:id="1072"/>
-    <w:bookmarkStart w:id="1080" w:name="availability"/>
+    <w:bookmarkEnd w:id="1105"/>
+    <w:bookmarkEnd w:id="1106"/>
+    <w:bookmarkStart w:id="1114" w:name="availability"/>
     <w:p>
       <w:pPr>
         <w:pStyle w:val="Heading2"/>
@@ -1938,7 +1938,7 @@
         <w:t xml:space="preserve">(2) Availability</w:t>
       </w:r>
     </w:p>
-    <w:bookmarkStart w:id="1073" w:name="operating-system"/>
+    <w:bookmarkStart w:id="1107" w:name="operating-system"/>
     <w:p>
       <w:pPr>
         <w:pStyle w:val="Heading3"/>
@@ -1955,8 +1955,8 @@
         <w:t xml:space="preserve">Platform independent. The core builds with any C99 compiler; development and testing used Windows 11. The browser application runs in any current browser with WebAssembly support.</w:t>
       </w:r>
     </w:p>
-    <w:bookmarkEnd w:id="1073"/>
-    <w:bookmarkStart w:id="1074" w:name="programming-language"/>
+    <w:bookmarkEnd w:id="1107"/>
+    <w:bookmarkStart w:id="1108" w:name="programming-language"/>
     <w:p>
       <w:pPr>
         <w:pStyle w:val="Heading3"/>
@@ -1973,8 +1973,8 @@
         <w:t xml:space="preserve">C (core), Python 3.11 or later (interface and fitting tools), JavaScript (browser application).</w:t>
       </w:r>
     </w:p>
-    <w:bookmarkEnd w:id="1074"/>
-    <w:bookmarkStart w:id="1075" w:name="additional-system-requirements"/>
+    <w:bookmarkEnd w:id="1108"/>
+    <w:bookmarkStart w:id="1109" w:name="additional-system-requirements"/>
     <w:p>
       <w:pPr>
         <w:pStyle w:val="Heading3"/>
@@ -1991,8 +1991,8 @@
         <w:t xml:space="preserve">None of note. The engine and database together are a few megabytes.</w:t>
       </w:r>
     </w:p>
-    <w:bookmarkEnd w:id="1075"/>
-    <w:bookmarkStart w:id="1076" w:name="dependencies"/>
+    <w:bookmarkEnd w:id="1109"/>
+    <w:bookmarkStart w:id="1110" w:name="dependencies"/>
     <w:p>
       <w:pPr>
         <w:pStyle w:val="Heading3"/>
@@ -2009,8 +2009,8 @@
         <w:t xml:space="preserve">Python interface: cffi, NumPy, SciPy. Validation suite additionally requires pycalphad. WebAssembly build requires emscripten. The C core and the browser application have no dependencies.</w:t>
       </w:r>
     </w:p>
-    <w:bookmarkEnd w:id="1076"/>
-    <w:bookmarkStart w:id="1077" w:name="list-of-contributors"/>
+    <w:bookmarkEnd w:id="1110"/>
+    <w:bookmarkStart w:id="1111" w:name="list-of-contributors"/>
     <w:p>
       <w:pPr>
         <w:pStyle w:val="Heading3"/>
@@ -2027,8 +2027,8 @@
         <w:t xml:space="preserve">Michael E. Bustamante (design, implementation, validation, data curation).</w:t>
       </w:r>
     </w:p>
-    <w:bookmarkEnd w:id="1077"/>
-    <w:bookmarkStart w:id="1078" w:name="software-location"/>
+    <w:bookmarkEnd w:id="1111"/>
+    <w:bookmarkStart w:id="1112" w:name="software-location"/>
     <w:p>
       <w:pPr>
         <w:pStyle w:val="Heading3"/>
@@ -2181,8 +2181,8 @@
         <w:t xml:space="preserve">Date published: 2026-09-02</w:t>
       </w:r>
     </w:p>
-    <w:bookmarkEnd w:id="1078"/>
-    <w:bookmarkStart w:id="1079" w:name="language"/>
+    <w:bookmarkEnd w:id="1112"/>
+    <w:bookmarkStart w:id="1113" w:name="language"/>
     <w:p>
       <w:pPr>
         <w:pStyle w:val="Heading3"/>
@@ -2199,9 +2199,9 @@
         <w:t xml:space="preserve">English.</w:t>
       </w:r>
     </w:p>
-    <w:bookmarkEnd w:id="1079"/>
-    <w:bookmarkEnd w:id="1080"/>
-    <w:bookmarkStart w:id="1088" w:name="reuse-potential"/>
+    <w:bookmarkEnd w:id="1113"/>
+    <w:bookmarkEnd w:id="1114"/>
+    <w:bookmarkStart w:id="1122" w:name="reuse-potential"/>
     <w:p>
       <w:pPr>
         <w:pStyle w:val="Heading2"/>
@@ -2226,7 +2226,7 @@
         <w:t xml:space="preserve">The browser application makes the lowest barrier the default. A lecture on slag thermodynamics, a plant metallurgist screening a composition, or a reviewer checking a claimed equilibrium can load the database and calculate in seconds, with confidential inputs never leaving the machine. The same property makes it a practical template for other groups who want to publish a model as a zero-install tool.</w:t>
       </w:r>
     </w:p>
-    <w:bookmarkStart w:id="1087" w:name="worked-examples"/>
+    <w:bookmarkStart w:id="1121" w:name="worked-examples"/>
     <w:p>
       <w:pPr>
         <w:pStyle w:val="Heading3"/>
@@ -2438,18 +2438,18 @@
           <wp:inline>
             <wp:extent cx="4206240" cy="3262561"/>
             <wp:effectExtent b="0" l="0" r="0" t="0"/>
-            <wp:docPr descr="Figure 4: The LiCl-KCl phase diagram calculated by the salt listing from the shipped open database, at the listing’s own step size. Light to dark: liquid, two-phase, and subsolidus fields. The dot is the calculated eutectic at this step size (0.400, 640 K); the star is the measured eutectic (0.415, 626 K)." title="" id="1082" name="Picture"/>
+            <wp:docPr descr="Figure 4: The LiCl-KCl phase diagram calculated by the salt listing from the shipped open database, at the listing’s own step size. Light to dark: liquid, two-phase, and subsolidus fields. The dot is the calculated eutectic at this step size (0.400, 640 K); the star is the measured eutectic (0.415, 626 K)." title="" id="1116" name="Picture"/>
             <a:graphic>
               <a:graphicData uri="http://schemas.openxmlformats.org/drawingml/2006/picture">
                 <pic:pic>
                   <pic:nvPicPr>
-                    <pic:cNvPr descr="figures/fig4_salt_example.png" id="1083" name="Picture"/>
+                    <pic:cNvPr descr="figures/fig4_salt_example.png" id="1117" name="Picture"/>
                     <pic:cNvPicPr>
                       <a:picLocks noChangeArrowheads="1" noChangeAspect="1"/>
                     </pic:cNvPicPr>
                   </pic:nvPicPr>
                   <pic:blipFill>
-                    <a:blip r:embed="rId1081"/>
+                    <a:blip r:embed="rId1115"/>
                     <a:stretch>
                       <a:fillRect/>
                     </a:stretch>
@@ -2684,18 +2684,18 @@
           <wp:inline>
             <wp:extent cx="4206240" cy="3262561"/>
             <wp:effectExtent b="0" l="0" r="0" t="0"/>
-            <wp:docPr descr="Figure 5: The Al-Zn phase diagram computed by the alloy listing from the shipped open TDB. Light to dark: liquid, liquid plus solid, and solid fields. The dot is the calculated eutectic (0.890, 660 K); the star is the assessed eutectic (0.885, 654 K)." title="" id="1085" name="Picture"/>
+            <wp:docPr descr="Figure 5: The Al-Zn phase diagram computed by the alloy listing from the shipped open TDB. Light to dark: liquid, liquid plus solid, and solid fields. The dot is the calculated eutectic (0.890, 660 K); the star is the assessed eutectic (0.885, 654 K)." title="" id="1119" name="Picture"/>
             <a:graphic>
               <a:graphicData uri="http://schemas.openxmlformats.org/drawingml/2006/picture">
                 <pic:pic>
                   <pic:nvPicPr>
-                    <pic:cNvPr descr="figures/fig5_alloy_example.png" id="1086" name="Picture"/>
+                    <pic:cNvPr descr="figures/fig5_alloy_example.png" id="1120" name="Picture"/>
                     <pic:cNvPicPr>
                       <a:picLocks noChangeArrowheads="1" noChangeAspect="1"/>
                     </pic:cNvPicPr>
                   </pic:nvPicPr>
                   <pic:blipFill>
-                    <a:blip r:embed="rId1084"/>
+                    <a:blip r:embed="rId1118"/>
                     <a:stretch>
                       <a:fillRect/>
                     </a:stretch>
@@ -2746,9 +2746,9 @@
         <w:t xml:space="preserve">The paper closes where it began. The gap was never the model, which has been published for two decades, but an open, runnable pairing of model and parameters. Hephaestus supplies both halves under open licenses and puts them behind a browser page that asks nothing of its user. The claims are checkable end to end. Release v0.4.0 archives the exact version described, and the 104-test suite reruns the pycalphad comparisons on any machine. The worked examples print the figures shown, and every parameter in every shipped database traces to a published measurement through its provenance file. A reader who doubts a number can recalculate it; one who needs a system that is missing can build it with the same open tools, or ask.</w:t>
       </w:r>
     </w:p>
-    <w:bookmarkEnd w:id="1087"/>
-    <w:bookmarkEnd w:id="1088"/>
-    <w:bookmarkStart w:id="1089" w:name="data-availability"/>
+    <w:bookmarkEnd w:id="1121"/>
+    <w:bookmarkEnd w:id="1122"/>
+    <w:bookmarkStart w:id="1123" w:name="data-availability"/>
     <w:p>
       <w:pPr>
         <w:pStyle w:val="Heading2"/>
@@ -2765,8 +2765,8 @@
         <w:t xml:space="preserve">The engine, the database, the browser application, and the validation suite are openly available in the code repository listed above; the version described here is archived as release v0.4.0. The database files and their provenance records are in the repository’s data directory under CC BY 4.0.</w:t>
       </w:r>
     </w:p>
-    <w:bookmarkEnd w:id="1089"/>
-    <w:bookmarkStart w:id="1090" w:name="acknowledgements"/>
+    <w:bookmarkEnd w:id="1123"/>
+    <w:bookmarkStart w:id="1124" w:name="acknowledgements"/>
     <w:p>
       <w:pPr>
         <w:pStyle w:val="Heading2"/>
@@ -2783,8 +2783,8 @@
         <w:t xml:space="preserve">During the development of this software the author used Claude Code (Anthropic) to assist with implementation, validation scripting, and manuscript preparation. This assistance was agentic, not autonomous: it operated under author direction and supervision at every step and was never a closed loop that produced or accepted results without review. Every parameter was traced by the author to its primary source before entering the database, and every reference was verified against its registry record. The author reviewed and approved all output and takes full responsibility for this article.</w:t>
       </w:r>
     </w:p>
-    <w:bookmarkEnd w:id="1090"/>
-    <w:bookmarkStart w:id="1091" w:name="funding-statement"/>
+    <w:bookmarkEnd w:id="1124"/>
+    <w:bookmarkStart w:id="1125" w:name="funding-statement"/>
     <w:p>
       <w:pPr>
         <w:pStyle w:val="Heading2"/>
@@ -2801,8 +2801,8 @@
         <w:t xml:space="preserve">The development of this software received no external funding.</w:t>
       </w:r>
     </w:p>
-    <w:bookmarkEnd w:id="1091"/>
-    <w:bookmarkStart w:id="1092" w:name="competing-interests"/>
+    <w:bookmarkEnd w:id="1125"/>
+    <w:bookmarkStart w:id="1126" w:name="competing-interests"/>
     <w:p>
       <w:pPr>
         <w:pStyle w:val="Heading2"/>
@@ -2819,8 +2819,8 @@
         <w:t xml:space="preserve">The author founded Odinzen LLC, which provides commercial thermodynamic modeling services, and declares this as a competing interest. The software and database published here are released in full under open licenses, and no proprietary Odinzen assets are included.</w:t>
       </w:r>
     </w:p>
-    <w:bookmarkEnd w:id="1092"/>
-    <w:bookmarkStart w:id="1093" w:name="references"/>
+    <w:bookmarkEnd w:id="1126"/>
+    <w:bookmarkStart w:id="1127" w:name="references"/>
     <w:p>
       <w:pPr>
         <w:pStyle w:val="Heading2"/>
@@ -3161,8 +3161,8 @@
         <w:t xml:space="preserve">[40] Dinsdale AT. SGTE data for pure elements. Calphad. 1991 Oct;15(4):317-425. doi:10.1016/0364-5916(91)90030-N</w:t>
       </w:r>
     </w:p>
-    <w:bookmarkEnd w:id="1093"/>
-    <w:bookmarkEnd w:id="1094"/>
+    <w:bookmarkEnd w:id="1127"/>
+    <w:bookmarkEnd w:id="1128"/>
     <w:sectPr>
       <w:footnotePr>
         <w:numRestart w:val="eachSect"/>

</xml_diff>

<commit_message>
Otis-persona review: dependency versions stated (cffi 2.0, NumPy 2.4, SciPy 1.17, oracle pinned at pycalphad 0.11.1) with the fixture-relocation skip behavior documented
Co-Authored-By: Claude Fable 5 <noreply@anthropic.com>
</commit_message>
<xml_diff>
--- a/paper/Bustamante_Hephaestus_JORS_manuscript.docx
+++ b/paper/Bustamante_Hephaestus_JORS_manuscript.docx
@@ -2,7 +2,7 @@
 <file path=word/document.xml><?xml version="1.0" encoding="utf-8"?>
 <w:document xmlns:w="http://schemas.openxmlformats.org/wordprocessingml/2006/main" xmlns:m="http://schemas.openxmlformats.org/officeDocument/2006/math" xmlns:r="http://schemas.openxmlformats.org/officeDocument/2006/relationships" xmlns:o="urn:schemas-microsoft-com:office:office" xmlns:v="urn:schemas-microsoft-com:vml" xmlns:w10="urn:schemas-microsoft-com:office:word" xmlns:a="http://schemas.openxmlformats.org/drawingml/2006/main" xmlns:pic="http://schemas.openxmlformats.org/drawingml/2006/picture" xmlns:wp="http://schemas.openxmlformats.org/drawingml/2006/wordprocessingDrawing">
   <w:body>
-    <w:bookmarkStart w:id="1128" w:name="X4855b1162e70238fd839d871e0792397dc58430"/>
+    <w:bookmarkStart w:id="1162" w:name="X4855b1162e70238fd839d871e0792397dc58430"/>
     <w:p>
       <w:pPr>
         <w:pStyle w:val="Heading1"/>
@@ -159,7 +159,7 @@
         <w:t xml:space="preserve">CALPHAD; molten slag; molten salt; modified quasichemical model; thermodynamic database; phase diagram; WebAssembly; open data</w:t>
       </w:r>
     </w:p>
-    <w:bookmarkStart w:id="1106" w:name="overview"/>
+    <w:bookmarkStart w:id="1140" w:name="overview"/>
     <w:p>
       <w:pPr>
         <w:pStyle w:val="Heading2"/>
@@ -168,7 +168,7 @@
         <w:t xml:space="preserve">(1) Overview</w:t>
       </w:r>
     </w:p>
-    <w:bookmarkStart w:id="1093" w:name="introduction"/>
+    <w:bookmarkStart w:id="1127" w:name="introduction"/>
     <w:p>
       <w:pPr>
         <w:pStyle w:val="Heading3"/>
@@ -548,8 +548,8 @@
         <w:t xml:space="preserve">Hephaestus is a deliberate response to that gap, and it treats the engine and the data as one contribution because neither is useful alone. The engine is small on purpose. Its core is plain C with no dependencies, which makes it easy to embed and lets the identical code compile to WebAssembly, so the full calculator runs in a web browser with nothing installed and no data leaving the user’s machine. The database is open on purpose. Every parameter in it derives from published measurements, each value carries its provenance down to table and page, and the known shortcomings are documented next to the numbers they affect. The present work describes both, their validation against pycalphad and against measured phase equilibria, and the ways they can be reused. None of it asks the reader to program. For the experimentalist who never writes code, the browser application is the entire product: a page to open, a database to click, and a diagram to read. The sections that follow describe the machinery underneath for those who want it. Supplementary Material S1 is a plain-language primer for the non-programmer, starting at what a database file is and ending at a first calculation and how to read it. Its closing section teaches what an assessment is built from, so a reader who wants to contribute data for open publication, or to commission a file, arrives knowing what is needed.</w:t>
       </w:r>
     </w:p>
-    <w:bookmarkEnd w:id="1093"/>
-    <w:bookmarkStart w:id="1103" w:name="implementation-and-architecture"/>
+    <w:bookmarkEnd w:id="1127"/>
+    <w:bookmarkStart w:id="1137" w:name="implementation-and-architecture"/>
     <w:p>
       <w:pPr>
         <w:pStyle w:val="Heading3"/>
@@ -575,18 +575,18 @@
           <wp:inline>
             <wp:extent cx="5334000" cy="3511167"/>
             <wp:effectExtent b="0" l="0" r="0" t="0"/>
-            <wp:docPr descr="Figure 1: Architecture of Hephaestus. A single dependency-free C core reads the field’s three database dialects (ChemSage .dat, Thermo-Calc .tdb with the Inden magnetic model, and the unified .utdb) and calculates all thermodynamics; the same core is used as a native library, from Python through cffi, and compiled to WebAssembly behind the browser application. dbbuild writes new ChemSage files from measured data, and every energy path is validated against pycalphad." title="" id="1095" name="Picture"/>
+            <wp:docPr descr="Figure 1: Architecture of Hephaestus. A single dependency-free C core reads the field’s three database dialects (ChemSage .dat, Thermo-Calc .tdb with the Inden magnetic model, and the unified .utdb) and calculates all thermodynamics; the same core is used as a native library, from Python through cffi, and compiled to WebAssembly behind the browser application. dbbuild writes new ChemSage files from measured data, and every energy path is validated against pycalphad." title="" id="1129" name="Picture"/>
             <a:graphic>
               <a:graphicData uri="http://schemas.openxmlformats.org/drawingml/2006/picture">
                 <pic:pic>
                   <pic:nvPicPr>
-                    <pic:cNvPr descr="figures/fig1_architecture.png" id="1096" name="Picture"/>
+                    <pic:cNvPr descr="figures/fig1_architecture.png" id="1130" name="Picture"/>
                     <pic:cNvPicPr>
                       <a:picLocks noChangeArrowheads="1" noChangeAspect="1"/>
                     </pic:cNvPicPr>
                   </pic:nvPicPr>
                   <pic:blipFill>
-                    <a:blip r:embed="rId1094"/>
+                    <a:blip r:embed="rId1128"/>
                     <a:stretch>
                       <a:fillRect/>
                     </a:stretch>
@@ -793,18 +793,18 @@
           <wp:inline>
             <wp:extent cx="4754880" cy="4464799"/>
             <wp:effectExtent b="0" l="0" r="0" t="0"/>
-            <wp:docPr descr="Figure 2: The live solver in the browser application (light theme). The user loads the shipped database, picks a temperature, and presses Compute; the WebAssembly engine then solves the full FeO-MgO-SiO2 phase assemblage client side (here 1023 composition samples and 512 tie-facets in under half a second). Tapping a composition reads its stable phases and pins it to a comparison list; hovering previews on desktop." title="" id="1098" name="Picture"/>
+            <wp:docPr descr="Figure 2: The live solver in the browser application (light theme). The user loads the shipped database, picks a temperature, and presses Compute; the WebAssembly engine then solves the full FeO-MgO-SiO2 phase assemblage client side (here 1023 composition samples and 512 tie-facets in under half a second). Tapping a composition reads its stable phases and pins it to a comparison list; hovering previews on desktop." title="" id="1132" name="Picture"/>
             <a:graphic>
               <a:graphicData uri="http://schemas.openxmlformats.org/drawingml/2006/picture">
                 <pic:pic>
                   <pic:nvPicPr>
-                    <pic:cNvPr descr="figures/fig2_browser_app.png" id="1099" name="Picture"/>
+                    <pic:cNvPr descr="figures/fig2_browser_app.png" id="1133" name="Picture"/>
                     <pic:cNvPicPr>
                       <a:picLocks noChangeArrowheads="1" noChangeAspect="1"/>
                     </pic:cNvPicPr>
                   </pic:nvPicPr>
                   <pic:blipFill>
-                    <a:blip r:embed="rId1097"/>
+                    <a:blip r:embed="rId1131"/>
                     <a:stretch>
                       <a:fillRect/>
                     </a:stretch>
@@ -970,18 +970,18 @@
           <wp:inline>
             <wp:extent cx="5334000" cy="2197297"/>
             <wp:effectExtent b="0" l="0" r="0" t="0"/>
-            <wp:docPr descr="Figure 3: The assessed FeO-MgO-SiO2 system calculated from the shipped database files. (a) Liquidus projection: primary crystallizing phase fields, with liquidus isotherms labeled in °C. (b) Isothermal section at 1600 °C: stable phase assemblages, shaded by the number of solid phases present. Phase labels: L liquid, Crs cristobalite, Ol olivine, Opx orthopyroxene, Per periclase, Wus wustite." title="" id="1101" name="Picture"/>
+            <wp:docPr descr="Figure 3: The assessed FeO-MgO-SiO2 system calculated from the shipped database files. (a) Liquidus projection: primary crystallizing phase fields, with liquidus isotherms labeled in °C. (b) Isothermal section at 1600 °C: stable phase assemblages, shaded by the number of solid phases present. Phase labels: L liquid, Crs cristobalite, Ol olivine, Opx orthopyroxene, Per periclase, Wus wustite." title="" id="1135" name="Picture"/>
             <a:graphic>
               <a:graphicData uri="http://schemas.openxmlformats.org/drawingml/2006/picture">
                 <pic:pic>
                   <pic:nvPicPr>
-                    <pic:cNvPr descr="figures/fig3_ternary.png" id="1102" name="Picture"/>
+                    <pic:cNvPr descr="figures/fig3_ternary.png" id="1136" name="Picture"/>
                     <pic:cNvPicPr>
                       <a:picLocks noChangeArrowheads="1" noChangeAspect="1"/>
                     </pic:cNvPicPr>
                   </pic:nvPicPr>
                   <pic:blipFill>
-                    <a:blip r:embed="rId1100"/>
+                    <a:blip r:embed="rId1134"/>
                     <a:stretch>
                       <a:fillRect/>
                     </a:stretch>
@@ -1371,8 +1371,8 @@
         <w:t xml:space="preserve">Table 2: The assessed liquids. Full source lists, modeling judgments, and limits are in each system’s provenance file in the repository.</w:t>
       </w:r>
     </w:p>
-    <w:bookmarkEnd w:id="1103"/>
-    <w:bookmarkStart w:id="1104" w:name="anatomy-of-a-database-file"/>
+    <w:bookmarkEnd w:id="1137"/>
+    <w:bookmarkStart w:id="1138" w:name="anatomy-of-a-database-file"/>
     <w:p>
       <w:pPr>
         <w:pStyle w:val="Heading3"/>
@@ -1405,8 +1405,8 @@
         <w:t xml:space="preserve">That asymmetry is the economics of the field in miniature: implementations of the published models are increasingly available, but each fitted parameter condenses dozens of measurements and decisions. Parameter sets rather than codes are therefore the scarce commodity, and an openly licensed, provenance-tracked database is the part of this contribution that cannot be regenerated from the paper alone.</w:t>
       </w:r>
     </w:p>
-    <w:bookmarkEnd w:id="1104"/>
-    <w:bookmarkStart w:id="1105" w:name="quality-control"/>
+    <w:bookmarkEnd w:id="1138"/>
+    <w:bookmarkStart w:id="1139" w:name="quality-control"/>
     <w:p>
       <w:pPr>
         <w:pStyle w:val="Heading3"/>
@@ -1927,9 +1927,9 @@
         <w:t xml:space="preserve">invariants sit within about 40 °C, and the ternary liquidus projection reproduces the measured field topology [24]. Development practice is plain: the repository is version controlled with tagged releases (v0.1.0 through the v0.4.0 described here), the full suite runs before every release, and a fixed bug lands together with the regression test that would have caught it. The suite runs on Windows 11 under CPython 3.11 and 3.12; the browser application is exercised in Chromium- and Gecko-based browsers. A user can confirm a working installation by running pytest against the bundled test databases, or with no installation at all by opening the web application and loading the shipped ternary database.</w:t>
       </w:r>
     </w:p>
-    <w:bookmarkEnd w:id="1105"/>
-    <w:bookmarkEnd w:id="1106"/>
-    <w:bookmarkStart w:id="1114" w:name="availability"/>
+    <w:bookmarkEnd w:id="1139"/>
+    <w:bookmarkEnd w:id="1140"/>
+    <w:bookmarkStart w:id="1148" w:name="availability"/>
     <w:p>
       <w:pPr>
         <w:pStyle w:val="Heading2"/>
@@ -1938,7 +1938,7 @@
         <w:t xml:space="preserve">(2) Availability</w:t>
       </w:r>
     </w:p>
-    <w:bookmarkStart w:id="1107" w:name="operating-system"/>
+    <w:bookmarkStart w:id="1141" w:name="operating-system"/>
     <w:p>
       <w:pPr>
         <w:pStyle w:val="Heading3"/>
@@ -1955,8 +1955,8 @@
         <w:t xml:space="preserve">Platform independent. The core builds with any C99 compiler; development and testing used Windows 11. The browser application runs in any current browser with WebAssembly support.</w:t>
       </w:r>
     </w:p>
-    <w:bookmarkEnd w:id="1107"/>
-    <w:bookmarkStart w:id="1108" w:name="programming-language"/>
+    <w:bookmarkEnd w:id="1141"/>
+    <w:bookmarkStart w:id="1142" w:name="programming-language"/>
     <w:p>
       <w:pPr>
         <w:pStyle w:val="Heading3"/>
@@ -1973,8 +1973,8 @@
         <w:t xml:space="preserve">C (core), Python 3.11 or later (interface and fitting tools), JavaScript (browser application).</w:t>
       </w:r>
     </w:p>
-    <w:bookmarkEnd w:id="1108"/>
-    <w:bookmarkStart w:id="1109" w:name="additional-system-requirements"/>
+    <w:bookmarkEnd w:id="1142"/>
+    <w:bookmarkStart w:id="1143" w:name="additional-system-requirements"/>
     <w:p>
       <w:pPr>
         <w:pStyle w:val="Heading3"/>
@@ -1991,8 +1991,8 @@
         <w:t xml:space="preserve">None of note. The engine and database together are a few megabytes.</w:t>
       </w:r>
     </w:p>
-    <w:bookmarkEnd w:id="1109"/>
-    <w:bookmarkStart w:id="1110" w:name="dependencies"/>
+    <w:bookmarkEnd w:id="1143"/>
+    <w:bookmarkStart w:id="1144" w:name="dependencies"/>
     <w:p>
       <w:pPr>
         <w:pStyle w:val="Heading3"/>
@@ -2006,11 +2006,11 @@
         <w:pStyle w:val="FirstParagraph"/>
       </w:pPr>
       <w:r>
-        <w:t xml:space="preserve">Python interface: cffi, NumPy, SciPy. Validation suite additionally requires pycalphad. WebAssembly build requires emscripten. The C core and the browser application have no dependencies.</w:t>
-      </w:r>
-    </w:p>
-    <w:bookmarkEnd w:id="1110"/>
-    <w:bookmarkStart w:id="1111" w:name="list-of-contributors"/>
+        <w:t xml:space="preserve">Python interface: cffi, NumPy, SciPy (developed and tested with cffi 2.0, NumPy 2.4, and SciPy 1.17). The validation suite additionally requires pycalphad; every oracle comparison reported here ran against pycalphad 0.11.1, and the tests that read pycalphad’s own shipped test databases skip cleanly if a later version relocates them. The WebAssembly build requires emscripten. The C core and the browser application have no dependencies.</w:t>
+      </w:r>
+    </w:p>
+    <w:bookmarkEnd w:id="1144"/>
+    <w:bookmarkStart w:id="1145" w:name="list-of-contributors"/>
     <w:p>
       <w:pPr>
         <w:pStyle w:val="Heading3"/>
@@ -2027,8 +2027,8 @@
         <w:t xml:space="preserve">Michael E. Bustamante (design, implementation, validation, data curation).</w:t>
       </w:r>
     </w:p>
-    <w:bookmarkEnd w:id="1111"/>
-    <w:bookmarkStart w:id="1112" w:name="software-location"/>
+    <w:bookmarkEnd w:id="1145"/>
+    <w:bookmarkStart w:id="1146" w:name="software-location"/>
     <w:p>
       <w:pPr>
         <w:pStyle w:val="Heading3"/>
@@ -2181,8 +2181,8 @@
         <w:t xml:space="preserve">Date published: 2026-09-02</w:t>
       </w:r>
     </w:p>
-    <w:bookmarkEnd w:id="1112"/>
-    <w:bookmarkStart w:id="1113" w:name="language"/>
+    <w:bookmarkEnd w:id="1146"/>
+    <w:bookmarkStart w:id="1147" w:name="language"/>
     <w:p>
       <w:pPr>
         <w:pStyle w:val="Heading3"/>
@@ -2199,9 +2199,9 @@
         <w:t xml:space="preserve">English.</w:t>
       </w:r>
     </w:p>
-    <w:bookmarkEnd w:id="1113"/>
-    <w:bookmarkEnd w:id="1114"/>
-    <w:bookmarkStart w:id="1122" w:name="reuse-potential"/>
+    <w:bookmarkEnd w:id="1147"/>
+    <w:bookmarkEnd w:id="1148"/>
+    <w:bookmarkStart w:id="1156" w:name="reuse-potential"/>
     <w:p>
       <w:pPr>
         <w:pStyle w:val="Heading2"/>
@@ -2226,7 +2226,7 @@
         <w:t xml:space="preserve">The browser application makes the lowest barrier the default. A lecture on slag thermodynamics, a plant metallurgist screening a composition, or a reviewer checking a claimed equilibrium can load the database and calculate in seconds, with confidential inputs never leaving the machine. The same property makes it a practical template for other groups who want to publish a model as a zero-install tool.</w:t>
       </w:r>
     </w:p>
-    <w:bookmarkStart w:id="1121" w:name="worked-examples"/>
+    <w:bookmarkStart w:id="1155" w:name="worked-examples"/>
     <w:p>
       <w:pPr>
         <w:pStyle w:val="Heading3"/>
@@ -2438,18 +2438,18 @@
           <wp:inline>
             <wp:extent cx="4206240" cy="3262561"/>
             <wp:effectExtent b="0" l="0" r="0" t="0"/>
-            <wp:docPr descr="Figure 4: The LiCl-KCl phase diagram calculated by the salt listing from the shipped open database, at the listing’s own step size. Light to dark: liquid, two-phase, and subsolidus fields. The dot is the calculated eutectic at this step size (0.400, 640 K); the star is the measured eutectic (0.415, 626 K)." title="" id="1116" name="Picture"/>
+            <wp:docPr descr="Figure 4: The LiCl-KCl phase diagram calculated by the salt listing from the shipped open database, at the listing’s own step size. Light to dark: liquid, two-phase, and subsolidus fields. The dot is the calculated eutectic at this step size (0.400, 640 K); the star is the measured eutectic (0.415, 626 K)." title="" id="1150" name="Picture"/>
             <a:graphic>
               <a:graphicData uri="http://schemas.openxmlformats.org/drawingml/2006/picture">
                 <pic:pic>
                   <pic:nvPicPr>
-                    <pic:cNvPr descr="figures/fig4_salt_example.png" id="1117" name="Picture"/>
+                    <pic:cNvPr descr="figures/fig4_salt_example.png" id="1151" name="Picture"/>
                     <pic:cNvPicPr>
                       <a:picLocks noChangeArrowheads="1" noChangeAspect="1"/>
                     </pic:cNvPicPr>
                   </pic:nvPicPr>
                   <pic:blipFill>
-                    <a:blip r:embed="rId1115"/>
+                    <a:blip r:embed="rId1149"/>
                     <a:stretch>
                       <a:fillRect/>
                     </a:stretch>
@@ -2684,18 +2684,18 @@
           <wp:inline>
             <wp:extent cx="4206240" cy="3262561"/>
             <wp:effectExtent b="0" l="0" r="0" t="0"/>
-            <wp:docPr descr="Figure 5: The Al-Zn phase diagram computed by the alloy listing from the shipped open TDB. Light to dark: liquid, liquid plus solid, and solid fields. The dot is the calculated eutectic (0.890, 660 K); the star is the assessed eutectic (0.885, 654 K)." title="" id="1119" name="Picture"/>
+            <wp:docPr descr="Figure 5: The Al-Zn phase diagram computed by the alloy listing from the shipped open TDB. Light to dark: liquid, liquid plus solid, and solid fields. The dot is the calculated eutectic (0.890, 660 K); the star is the assessed eutectic (0.885, 654 K)." title="" id="1153" name="Picture"/>
             <a:graphic>
               <a:graphicData uri="http://schemas.openxmlformats.org/drawingml/2006/picture">
                 <pic:pic>
                   <pic:nvPicPr>
-                    <pic:cNvPr descr="figures/fig5_alloy_example.png" id="1120" name="Picture"/>
+                    <pic:cNvPr descr="figures/fig5_alloy_example.png" id="1154" name="Picture"/>
                     <pic:cNvPicPr>
                       <a:picLocks noChangeArrowheads="1" noChangeAspect="1"/>
                     </pic:cNvPicPr>
                   </pic:nvPicPr>
                   <pic:blipFill>
-                    <a:blip r:embed="rId1118"/>
+                    <a:blip r:embed="rId1152"/>
                     <a:stretch>
                       <a:fillRect/>
                     </a:stretch>
@@ -2746,9 +2746,9 @@
         <w:t xml:space="preserve">The paper closes where it began. The gap was never the model, which has been published for two decades, but an open, runnable pairing of model and parameters. Hephaestus supplies both halves under open licenses and puts them behind a browser page that asks nothing of its user. The claims are checkable end to end. Release v0.4.0 archives the exact version described, and the 104-test suite reruns the pycalphad comparisons on any machine. The worked examples print the figures shown, and every parameter in every shipped database traces to a published measurement through its provenance file. A reader who doubts a number can recalculate it; one who needs a system that is missing can build it with the same open tools, or ask.</w:t>
       </w:r>
     </w:p>
-    <w:bookmarkEnd w:id="1121"/>
-    <w:bookmarkEnd w:id="1122"/>
-    <w:bookmarkStart w:id="1123" w:name="data-availability"/>
+    <w:bookmarkEnd w:id="1155"/>
+    <w:bookmarkEnd w:id="1156"/>
+    <w:bookmarkStart w:id="1157" w:name="data-availability"/>
     <w:p>
       <w:pPr>
         <w:pStyle w:val="Heading2"/>
@@ -2765,8 +2765,8 @@
         <w:t xml:space="preserve">The engine, the database, the browser application, and the validation suite are openly available in the code repository listed above; the version described here is archived as release v0.4.0. The database files and their provenance records are in the repository’s data directory under CC BY 4.0.</w:t>
       </w:r>
     </w:p>
-    <w:bookmarkEnd w:id="1123"/>
-    <w:bookmarkStart w:id="1124" w:name="acknowledgements"/>
+    <w:bookmarkEnd w:id="1157"/>
+    <w:bookmarkStart w:id="1158" w:name="acknowledgements"/>
     <w:p>
       <w:pPr>
         <w:pStyle w:val="Heading2"/>
@@ -2783,8 +2783,8 @@
         <w:t xml:space="preserve">During the development of this software the author used Claude Code (Anthropic) to assist with implementation, validation scripting, and manuscript preparation. This assistance was agentic, not autonomous: it operated under author direction and supervision at every step and was never a closed loop that produced or accepted results without review. Every parameter was traced by the author to its primary source before entering the database, and every reference was verified against its registry record. The author reviewed and approved all output and takes full responsibility for this article.</w:t>
       </w:r>
     </w:p>
-    <w:bookmarkEnd w:id="1124"/>
-    <w:bookmarkStart w:id="1125" w:name="funding-statement"/>
+    <w:bookmarkEnd w:id="1158"/>
+    <w:bookmarkStart w:id="1159" w:name="funding-statement"/>
     <w:p>
       <w:pPr>
         <w:pStyle w:val="Heading2"/>
@@ -2801,8 +2801,8 @@
         <w:t xml:space="preserve">The development of this software received no external funding.</w:t>
       </w:r>
     </w:p>
-    <w:bookmarkEnd w:id="1125"/>
-    <w:bookmarkStart w:id="1126" w:name="competing-interests"/>
+    <w:bookmarkEnd w:id="1159"/>
+    <w:bookmarkStart w:id="1160" w:name="competing-interests"/>
     <w:p>
       <w:pPr>
         <w:pStyle w:val="Heading2"/>
@@ -2819,8 +2819,8 @@
         <w:t xml:space="preserve">The author founded Odinzen LLC, which provides commercial thermodynamic modeling services, and declares this as a competing interest. The software and database published here are released in full under open licenses, and no proprietary Odinzen assets are included.</w:t>
       </w:r>
     </w:p>
-    <w:bookmarkEnd w:id="1126"/>
-    <w:bookmarkStart w:id="1127" w:name="references"/>
+    <w:bookmarkEnd w:id="1160"/>
+    <w:bookmarkStart w:id="1161" w:name="references"/>
     <w:p>
       <w:pPr>
         <w:pStyle w:val="Heading2"/>
@@ -3161,8 +3161,8 @@
         <w:t xml:space="preserve">[40] Dinsdale AT. SGTE data for pure elements. Calphad. 1991 Oct;15(4):317-425. doi:10.1016/0364-5916(91)90030-N</w:t>
       </w:r>
     </w:p>
-    <w:bookmarkEnd w:id="1127"/>
-    <w:bookmarkEnd w:id="1128"/>
+    <w:bookmarkEnd w:id="1161"/>
+    <w:bookmarkEnd w:id="1162"/>
     <w:sectPr>
       <w:footnotePr>
         <w:numRestart w:val="eachSect"/>

</xml_diff>

<commit_message>
Figure 2 to greyscale, matching the house black-and-white figure standard (was the lone color figure)
Co-Authored-By: Claude Opus 4.8 <noreply@anthropic.com>
</commit_message>
<xml_diff>
--- a/paper/Bustamante_Hephaestus_JORS_manuscript.docx
+++ b/paper/Bustamante_Hephaestus_JORS_manuscript.docx
@@ -2,7 +2,7 @@
 <file path=word/document.xml><?xml version="1.0" encoding="utf-8"?>
 <w:document xmlns:w="http://schemas.openxmlformats.org/wordprocessingml/2006/main" xmlns:m="http://schemas.openxmlformats.org/officeDocument/2006/math" xmlns:r="http://schemas.openxmlformats.org/officeDocument/2006/relationships" xmlns:o="urn:schemas-microsoft-com:office:office" xmlns:v="urn:schemas-microsoft-com:vml" xmlns:w10="urn:schemas-microsoft-com:office:word" xmlns:a="http://schemas.openxmlformats.org/drawingml/2006/main" xmlns:pic="http://schemas.openxmlformats.org/drawingml/2006/picture" xmlns:wp="http://schemas.openxmlformats.org/drawingml/2006/wordprocessingDrawing">
   <w:body>
-    <w:bookmarkStart w:id="1162" w:name="X4855b1162e70238fd839d871e0792397dc58430"/>
+    <w:bookmarkStart w:id="1196" w:name="X4855b1162e70238fd839d871e0792397dc58430"/>
     <w:p>
       <w:pPr>
         <w:pStyle w:val="Heading1"/>
@@ -159,7 +159,7 @@
         <w:t xml:space="preserve">CALPHAD; molten slag; molten salt; modified quasichemical model; thermodynamic database; phase diagram; WebAssembly; open data</w:t>
       </w:r>
     </w:p>
-    <w:bookmarkStart w:id="1140" w:name="overview"/>
+    <w:bookmarkStart w:id="1174" w:name="overview"/>
     <w:p>
       <w:pPr>
         <w:pStyle w:val="Heading2"/>
@@ -168,7 +168,7 @@
         <w:t xml:space="preserve">(1) Overview</w:t>
       </w:r>
     </w:p>
-    <w:bookmarkStart w:id="1127" w:name="introduction"/>
+    <w:bookmarkStart w:id="1161" w:name="introduction"/>
     <w:p>
       <w:pPr>
         <w:pStyle w:val="Heading3"/>
@@ -548,8 +548,8 @@
         <w:t xml:space="preserve">Hephaestus is a deliberate response to that gap, and it treats the engine and the data as one contribution because neither is useful alone. The engine is small on purpose. Its core is plain C with no dependencies, which makes it easy to embed and lets the identical code compile to WebAssembly, so the full calculator runs in a web browser with nothing installed and no data leaving the user’s machine. The database is open on purpose. Every parameter in it derives from published measurements, each value carries its provenance down to table and page, and the known shortcomings are documented next to the numbers they affect. The present work describes both, their validation against pycalphad and against measured phase equilibria, and the ways they can be reused. None of it asks the reader to program. For the experimentalist who never writes code, the browser application is the entire product: a page to open, a database to click, and a diagram to read. The sections that follow describe the machinery underneath for those who want it. Supplementary Material S1 is a plain-language primer for the non-programmer, starting at what a database file is and ending at a first calculation and how to read it. Its closing section teaches what an assessment is built from, so a reader who wants to contribute data for open publication, or to commission a file, arrives knowing what is needed.</w:t>
       </w:r>
     </w:p>
-    <w:bookmarkEnd w:id="1127"/>
-    <w:bookmarkStart w:id="1137" w:name="implementation-and-architecture"/>
+    <w:bookmarkEnd w:id="1161"/>
+    <w:bookmarkStart w:id="1171" w:name="implementation-and-architecture"/>
     <w:p>
       <w:pPr>
         <w:pStyle w:val="Heading3"/>
@@ -575,18 +575,18 @@
           <wp:inline>
             <wp:extent cx="5334000" cy="3511167"/>
             <wp:effectExtent b="0" l="0" r="0" t="0"/>
-            <wp:docPr descr="Figure 1: Architecture of Hephaestus. A single dependency-free C core reads the field’s three database dialects (ChemSage .dat, Thermo-Calc .tdb with the Inden magnetic model, and the unified .utdb) and calculates all thermodynamics; the same core is used as a native library, from Python through cffi, and compiled to WebAssembly behind the browser application. dbbuild writes new ChemSage files from measured data, and every energy path is validated against pycalphad." title="" id="1129" name="Picture"/>
+            <wp:docPr descr="Figure 1: Architecture of Hephaestus. A single dependency-free C core reads the field’s three database dialects (ChemSage .dat, Thermo-Calc .tdb with the Inden magnetic model, and the unified .utdb) and calculates all thermodynamics; the same core is used as a native library, from Python through cffi, and compiled to WebAssembly behind the browser application. dbbuild writes new ChemSage files from measured data, and every energy path is validated against pycalphad." title="" id="1163" name="Picture"/>
             <a:graphic>
               <a:graphicData uri="http://schemas.openxmlformats.org/drawingml/2006/picture">
                 <pic:pic>
                   <pic:nvPicPr>
-                    <pic:cNvPr descr="figures/fig1_architecture.png" id="1130" name="Picture"/>
+                    <pic:cNvPr descr="figures/fig1_architecture.png" id="1164" name="Picture"/>
                     <pic:cNvPicPr>
                       <a:picLocks noChangeArrowheads="1" noChangeAspect="1"/>
                     </pic:cNvPicPr>
                   </pic:nvPicPr>
                   <pic:blipFill>
-                    <a:blip r:embed="rId1128"/>
+                    <a:blip r:embed="rId1162"/>
                     <a:stretch>
                       <a:fillRect/>
                     </a:stretch>
@@ -793,18 +793,18 @@
           <wp:inline>
             <wp:extent cx="4754880" cy="4464799"/>
             <wp:effectExtent b="0" l="0" r="0" t="0"/>
-            <wp:docPr descr="Figure 2: The live solver in the browser application (light theme). The user loads the shipped database, picks a temperature, and presses Compute; the WebAssembly engine then solves the full FeO-MgO-SiO2 phase assemblage client side (here 1023 composition samples and 512 tie-facets in under half a second). Tapping a composition reads its stable phases and pins it to a comparison list; hovering previews on desktop." title="" id="1132" name="Picture"/>
+            <wp:docPr descr="Figure 2: The live solver in the browser application (light theme). The user loads the shipped database, picks a temperature, and presses Compute; the WebAssembly engine then solves the full FeO-MgO-SiO2 phase assemblage client side (here 1023 composition samples and 512 tie-facets in under half a second). Tapping a composition reads its stable phases and pins it to a comparison list; hovering previews on desktop." title="" id="1166" name="Picture"/>
             <a:graphic>
               <a:graphicData uri="http://schemas.openxmlformats.org/drawingml/2006/picture">
                 <pic:pic>
                   <pic:nvPicPr>
-                    <pic:cNvPr descr="figures/fig2_browser_app.png" id="1133" name="Picture"/>
+                    <pic:cNvPr descr="figures/fig2_browser_app.png" id="1167" name="Picture"/>
                     <pic:cNvPicPr>
                       <a:picLocks noChangeArrowheads="1" noChangeAspect="1"/>
                     </pic:cNvPicPr>
                   </pic:nvPicPr>
                   <pic:blipFill>
-                    <a:blip r:embed="rId1131"/>
+                    <a:blip r:embed="rId1165"/>
                     <a:stretch>
                       <a:fillRect/>
                     </a:stretch>
@@ -970,18 +970,18 @@
           <wp:inline>
             <wp:extent cx="5334000" cy="2197297"/>
             <wp:effectExtent b="0" l="0" r="0" t="0"/>
-            <wp:docPr descr="Figure 3: The assessed FeO-MgO-SiO2 system calculated from the shipped database files. (a) Liquidus projection: primary crystallizing phase fields, with liquidus isotherms labeled in °C. (b) Isothermal section at 1600 °C: stable phase assemblages, shaded by the number of solid phases present. Phase labels: L liquid, Crs cristobalite, Ol olivine, Opx orthopyroxene, Per periclase, Wus wustite." title="" id="1135" name="Picture"/>
+            <wp:docPr descr="Figure 3: The assessed FeO-MgO-SiO2 system calculated from the shipped database files. (a) Liquidus projection: primary crystallizing phase fields, with liquidus isotherms labeled in °C. (b) Isothermal section at 1600 °C: stable phase assemblages, shaded by the number of solid phases present. Phase labels: L liquid, Crs cristobalite, Ol olivine, Opx orthopyroxene, Per periclase, Wus wustite." title="" id="1169" name="Picture"/>
             <a:graphic>
               <a:graphicData uri="http://schemas.openxmlformats.org/drawingml/2006/picture">
                 <pic:pic>
                   <pic:nvPicPr>
-                    <pic:cNvPr descr="figures/fig3_ternary.png" id="1136" name="Picture"/>
+                    <pic:cNvPr descr="figures/fig3_ternary.png" id="1170" name="Picture"/>
                     <pic:cNvPicPr>
                       <a:picLocks noChangeArrowheads="1" noChangeAspect="1"/>
                     </pic:cNvPicPr>
                   </pic:nvPicPr>
                   <pic:blipFill>
-                    <a:blip r:embed="rId1134"/>
+                    <a:blip r:embed="rId1168"/>
                     <a:stretch>
                       <a:fillRect/>
                     </a:stretch>
@@ -1371,8 +1371,8 @@
         <w:t xml:space="preserve">Table 2: The assessed liquids. Full source lists, modeling judgments, and limits are in each system’s provenance file in the repository.</w:t>
       </w:r>
     </w:p>
-    <w:bookmarkEnd w:id="1137"/>
-    <w:bookmarkStart w:id="1138" w:name="anatomy-of-a-database-file"/>
+    <w:bookmarkEnd w:id="1171"/>
+    <w:bookmarkStart w:id="1172" w:name="anatomy-of-a-database-file"/>
     <w:p>
       <w:pPr>
         <w:pStyle w:val="Heading3"/>
@@ -1405,8 +1405,8 @@
         <w:t xml:space="preserve">That asymmetry is the economics of the field in miniature: implementations of the published models are increasingly available, but each fitted parameter condenses dozens of measurements and decisions. Parameter sets rather than codes are therefore the scarce commodity, and an openly licensed, provenance-tracked database is the part of this contribution that cannot be regenerated from the paper alone.</w:t>
       </w:r>
     </w:p>
-    <w:bookmarkEnd w:id="1138"/>
-    <w:bookmarkStart w:id="1139" w:name="quality-control"/>
+    <w:bookmarkEnd w:id="1172"/>
+    <w:bookmarkStart w:id="1173" w:name="quality-control"/>
     <w:p>
       <w:pPr>
         <w:pStyle w:val="Heading3"/>
@@ -1927,9 +1927,9 @@
         <w:t xml:space="preserve">invariants sit within about 40 °C, and the ternary liquidus projection reproduces the measured field topology [24]. Development practice is plain: the repository is version controlled with tagged releases (v0.1.0 through the v0.4.0 described here), the full suite runs before every release, and a fixed bug lands together with the regression test that would have caught it. The suite runs on Windows 11 under CPython 3.11 and 3.12; the browser application is exercised in Chromium- and Gecko-based browsers. A user can confirm a working installation by running pytest against the bundled test databases, or with no installation at all by opening the web application and loading the shipped ternary database.</w:t>
       </w:r>
     </w:p>
-    <w:bookmarkEnd w:id="1139"/>
-    <w:bookmarkEnd w:id="1140"/>
-    <w:bookmarkStart w:id="1148" w:name="availability"/>
+    <w:bookmarkEnd w:id="1173"/>
+    <w:bookmarkEnd w:id="1174"/>
+    <w:bookmarkStart w:id="1182" w:name="availability"/>
     <w:p>
       <w:pPr>
         <w:pStyle w:val="Heading2"/>
@@ -1938,7 +1938,7 @@
         <w:t xml:space="preserve">(2) Availability</w:t>
       </w:r>
     </w:p>
-    <w:bookmarkStart w:id="1141" w:name="operating-system"/>
+    <w:bookmarkStart w:id="1175" w:name="operating-system"/>
     <w:p>
       <w:pPr>
         <w:pStyle w:val="Heading3"/>
@@ -1955,8 +1955,8 @@
         <w:t xml:space="preserve">Platform independent. The core builds with any C99 compiler; development and testing used Windows 11. The browser application runs in any current browser with WebAssembly support.</w:t>
       </w:r>
     </w:p>
-    <w:bookmarkEnd w:id="1141"/>
-    <w:bookmarkStart w:id="1142" w:name="programming-language"/>
+    <w:bookmarkEnd w:id="1175"/>
+    <w:bookmarkStart w:id="1176" w:name="programming-language"/>
     <w:p>
       <w:pPr>
         <w:pStyle w:val="Heading3"/>
@@ -1973,8 +1973,8 @@
         <w:t xml:space="preserve">C (core), Python 3.11 or later (interface and fitting tools), JavaScript (browser application).</w:t>
       </w:r>
     </w:p>
-    <w:bookmarkEnd w:id="1142"/>
-    <w:bookmarkStart w:id="1143" w:name="additional-system-requirements"/>
+    <w:bookmarkEnd w:id="1176"/>
+    <w:bookmarkStart w:id="1177" w:name="additional-system-requirements"/>
     <w:p>
       <w:pPr>
         <w:pStyle w:val="Heading3"/>
@@ -1991,8 +1991,8 @@
         <w:t xml:space="preserve">None of note. The engine and database together are a few megabytes.</w:t>
       </w:r>
     </w:p>
-    <w:bookmarkEnd w:id="1143"/>
-    <w:bookmarkStart w:id="1144" w:name="dependencies"/>
+    <w:bookmarkEnd w:id="1177"/>
+    <w:bookmarkStart w:id="1178" w:name="dependencies"/>
     <w:p>
       <w:pPr>
         <w:pStyle w:val="Heading3"/>
@@ -2009,8 +2009,8 @@
         <w:t xml:space="preserve">Python interface: cffi, NumPy, SciPy (developed and tested with cffi 2.0, NumPy 2.4, and SciPy 1.17). The validation suite additionally requires pycalphad; every oracle comparison reported here ran against pycalphad 0.11.1, and the tests that read pycalphad’s own shipped test databases skip cleanly if a later version relocates them. The WebAssembly build requires emscripten. The C core and the browser application have no dependencies.</w:t>
       </w:r>
     </w:p>
-    <w:bookmarkEnd w:id="1144"/>
-    <w:bookmarkStart w:id="1145" w:name="list-of-contributors"/>
+    <w:bookmarkEnd w:id="1178"/>
+    <w:bookmarkStart w:id="1179" w:name="list-of-contributors"/>
     <w:p>
       <w:pPr>
         <w:pStyle w:val="Heading3"/>
@@ -2027,8 +2027,8 @@
         <w:t xml:space="preserve">Michael E. Bustamante (design, implementation, validation, data curation).</w:t>
       </w:r>
     </w:p>
-    <w:bookmarkEnd w:id="1145"/>
-    <w:bookmarkStart w:id="1146" w:name="software-location"/>
+    <w:bookmarkEnd w:id="1179"/>
+    <w:bookmarkStart w:id="1180" w:name="software-location"/>
     <w:p>
       <w:pPr>
         <w:pStyle w:val="Heading3"/>
@@ -2181,8 +2181,8 @@
         <w:t xml:space="preserve">Date published: 2026-09-02</w:t>
       </w:r>
     </w:p>
-    <w:bookmarkEnd w:id="1146"/>
-    <w:bookmarkStart w:id="1147" w:name="language"/>
+    <w:bookmarkEnd w:id="1180"/>
+    <w:bookmarkStart w:id="1181" w:name="language"/>
     <w:p>
       <w:pPr>
         <w:pStyle w:val="Heading3"/>
@@ -2199,9 +2199,9 @@
         <w:t xml:space="preserve">English.</w:t>
       </w:r>
     </w:p>
-    <w:bookmarkEnd w:id="1147"/>
-    <w:bookmarkEnd w:id="1148"/>
-    <w:bookmarkStart w:id="1156" w:name="reuse-potential"/>
+    <w:bookmarkEnd w:id="1181"/>
+    <w:bookmarkEnd w:id="1182"/>
+    <w:bookmarkStart w:id="1190" w:name="reuse-potential"/>
     <w:p>
       <w:pPr>
         <w:pStyle w:val="Heading2"/>
@@ -2226,7 +2226,7 @@
         <w:t xml:space="preserve">The browser application makes the lowest barrier the default. A lecture on slag thermodynamics, a plant metallurgist screening a composition, or a reviewer checking a claimed equilibrium can load the database and calculate in seconds, with confidential inputs never leaving the machine. The same property makes it a practical template for other groups who want to publish a model as a zero-install tool.</w:t>
       </w:r>
     </w:p>
-    <w:bookmarkStart w:id="1155" w:name="worked-examples"/>
+    <w:bookmarkStart w:id="1189" w:name="worked-examples"/>
     <w:p>
       <w:pPr>
         <w:pStyle w:val="Heading3"/>
@@ -2438,18 +2438,18 @@
           <wp:inline>
             <wp:extent cx="4206240" cy="3262561"/>
             <wp:effectExtent b="0" l="0" r="0" t="0"/>
-            <wp:docPr descr="Figure 4: The LiCl-KCl phase diagram calculated by the salt listing from the shipped open database, at the listing’s own step size. Light to dark: liquid, two-phase, and subsolidus fields. The dot is the calculated eutectic at this step size (0.400, 640 K); the star is the measured eutectic (0.415, 626 K)." title="" id="1150" name="Picture"/>
+            <wp:docPr descr="Figure 4: The LiCl-KCl phase diagram calculated by the salt listing from the shipped open database, at the listing’s own step size. Light to dark: liquid, two-phase, and subsolidus fields. The dot is the calculated eutectic at this step size (0.400, 640 K); the star is the measured eutectic (0.415, 626 K)." title="" id="1184" name="Picture"/>
             <a:graphic>
               <a:graphicData uri="http://schemas.openxmlformats.org/drawingml/2006/picture">
                 <pic:pic>
                   <pic:nvPicPr>
-                    <pic:cNvPr descr="figures/fig4_salt_example.png" id="1151" name="Picture"/>
+                    <pic:cNvPr descr="figures/fig4_salt_example.png" id="1185" name="Picture"/>
                     <pic:cNvPicPr>
                       <a:picLocks noChangeArrowheads="1" noChangeAspect="1"/>
                     </pic:cNvPicPr>
                   </pic:nvPicPr>
                   <pic:blipFill>
-                    <a:blip r:embed="rId1149"/>
+                    <a:blip r:embed="rId1183"/>
                     <a:stretch>
                       <a:fillRect/>
                     </a:stretch>
@@ -2684,18 +2684,18 @@
           <wp:inline>
             <wp:extent cx="4206240" cy="3262561"/>
             <wp:effectExtent b="0" l="0" r="0" t="0"/>
-            <wp:docPr descr="Figure 5: The Al-Zn phase diagram computed by the alloy listing from the shipped open TDB. Light to dark: liquid, liquid plus solid, and solid fields. The dot is the calculated eutectic (0.890, 660 K); the star is the assessed eutectic (0.885, 654 K)." title="" id="1153" name="Picture"/>
+            <wp:docPr descr="Figure 5: The Al-Zn phase diagram computed by the alloy listing from the shipped open TDB. Light to dark: liquid, liquid plus solid, and solid fields. The dot is the calculated eutectic (0.890, 660 K); the star is the assessed eutectic (0.885, 654 K)." title="" id="1187" name="Picture"/>
             <a:graphic>
               <a:graphicData uri="http://schemas.openxmlformats.org/drawingml/2006/picture">
                 <pic:pic>
                   <pic:nvPicPr>
-                    <pic:cNvPr descr="figures/fig5_alloy_example.png" id="1154" name="Picture"/>
+                    <pic:cNvPr descr="figures/fig5_alloy_example.png" id="1188" name="Picture"/>
                     <pic:cNvPicPr>
                       <a:picLocks noChangeArrowheads="1" noChangeAspect="1"/>
                     </pic:cNvPicPr>
                   </pic:nvPicPr>
                   <pic:blipFill>
-                    <a:blip r:embed="rId1152"/>
+                    <a:blip r:embed="rId1186"/>
                     <a:stretch>
                       <a:fillRect/>
                     </a:stretch>
@@ -2746,9 +2746,9 @@
         <w:t xml:space="preserve">The paper closes where it began. The gap was never the model, which has been published for two decades, but an open, runnable pairing of model and parameters. Hephaestus supplies both halves under open licenses and puts them behind a browser page that asks nothing of its user. The claims are checkable end to end. Release v0.4.0 archives the exact version described, and the 104-test suite reruns the pycalphad comparisons on any machine. The worked examples print the figures shown, and every parameter in every shipped database traces to a published measurement through its provenance file. A reader who doubts a number can recalculate it; one who needs a system that is missing can build it with the same open tools, or ask.</w:t>
       </w:r>
     </w:p>
-    <w:bookmarkEnd w:id="1155"/>
-    <w:bookmarkEnd w:id="1156"/>
-    <w:bookmarkStart w:id="1157" w:name="data-availability"/>
+    <w:bookmarkEnd w:id="1189"/>
+    <w:bookmarkEnd w:id="1190"/>
+    <w:bookmarkStart w:id="1191" w:name="data-availability"/>
     <w:p>
       <w:pPr>
         <w:pStyle w:val="Heading2"/>
@@ -2765,8 +2765,8 @@
         <w:t xml:space="preserve">The engine, the database, the browser application, and the validation suite are openly available in the code repository listed above; the version described here is archived as release v0.4.0. The database files and their provenance records are in the repository’s data directory under CC BY 4.0.</w:t>
       </w:r>
     </w:p>
-    <w:bookmarkEnd w:id="1157"/>
-    <w:bookmarkStart w:id="1158" w:name="acknowledgements"/>
+    <w:bookmarkEnd w:id="1191"/>
+    <w:bookmarkStart w:id="1192" w:name="acknowledgements"/>
     <w:p>
       <w:pPr>
         <w:pStyle w:val="Heading2"/>
@@ -2783,8 +2783,8 @@
         <w:t xml:space="preserve">During the development of this software the author used Claude Code (Anthropic) to assist with implementation, validation scripting, and manuscript preparation. This assistance was agentic, not autonomous: it operated under author direction and supervision at every step and was never a closed loop that produced or accepted results without review. Every parameter was traced by the author to its primary source before entering the database, and every reference was verified against its registry record. The author reviewed and approved all output and takes full responsibility for this article.</w:t>
       </w:r>
     </w:p>
-    <w:bookmarkEnd w:id="1158"/>
-    <w:bookmarkStart w:id="1159" w:name="funding-statement"/>
+    <w:bookmarkEnd w:id="1192"/>
+    <w:bookmarkStart w:id="1193" w:name="funding-statement"/>
     <w:p>
       <w:pPr>
         <w:pStyle w:val="Heading2"/>
@@ -2801,8 +2801,8 @@
         <w:t xml:space="preserve">The development of this software received no external funding.</w:t>
       </w:r>
     </w:p>
-    <w:bookmarkEnd w:id="1159"/>
-    <w:bookmarkStart w:id="1160" w:name="competing-interests"/>
+    <w:bookmarkEnd w:id="1193"/>
+    <w:bookmarkStart w:id="1194" w:name="competing-interests"/>
     <w:p>
       <w:pPr>
         <w:pStyle w:val="Heading2"/>
@@ -2819,8 +2819,8 @@
         <w:t xml:space="preserve">The author founded Odinzen LLC, which provides commercial thermodynamic modeling services, and declares this as a competing interest. The software and database published here are released in full under open licenses, and no proprietary Odinzen assets are included.</w:t>
       </w:r>
     </w:p>
-    <w:bookmarkEnd w:id="1160"/>
-    <w:bookmarkStart w:id="1161" w:name="references"/>
+    <w:bookmarkEnd w:id="1194"/>
+    <w:bookmarkStart w:id="1195" w:name="references"/>
     <w:p>
       <w:pPr>
         <w:pStyle w:val="Heading2"/>
@@ -3161,8 +3161,8 @@
         <w:t xml:space="preserve">[40] Dinsdale AT. SGTE data for pure elements. Calphad. 1991 Oct;15(4):317-425. doi:10.1016/0364-5916(91)90030-N</w:t>
       </w:r>
     </w:p>
-    <w:bookmarkEnd w:id="1161"/>
-    <w:bookmarkEnd w:id="1162"/>
+    <w:bookmarkEnd w:id="1195"/>
+    <w:bookmarkEnd w:id="1196"/>
     <w:sectPr>
       <w:footnotePr>
         <w:numRestart w:val="eachSect"/>

</xml_diff>

<commit_message>
Add Figure 6: the unified steelmaking .utdb computing the Fe-C alloy diagram and its Scheil path in one browser session, the clearest image of what no legacy container does; greyscale high-res CDP capture with its shoot script in the repo
Co-Authored-By: Claude Opus 4.8 <noreply@anthropic.com>
</commit_message>
<xml_diff>
--- a/paper/Bustamante_Hephaestus_JORS_manuscript.docx
+++ b/paper/Bustamante_Hephaestus_JORS_manuscript.docx
@@ -2,7 +2,7 @@
 <file path=word/document.xml><?xml version="1.0" encoding="utf-8"?>
 <w:document xmlns:w="http://schemas.openxmlformats.org/wordprocessingml/2006/main" xmlns:m="http://schemas.openxmlformats.org/officeDocument/2006/math" xmlns:r="http://schemas.openxmlformats.org/officeDocument/2006/relationships" xmlns:o="urn:schemas-microsoft-com:office:office" xmlns:v="urn:schemas-microsoft-com:vml" xmlns:w10="urn:schemas-microsoft-com:office:word" xmlns:a="http://schemas.openxmlformats.org/drawingml/2006/main" xmlns:pic="http://schemas.openxmlformats.org/drawingml/2006/picture" xmlns:wp="http://schemas.openxmlformats.org/drawingml/2006/wordprocessingDrawing">
   <w:body>
-    <w:bookmarkStart w:id="1196" w:name="X4855b1162e70238fd839d871e0792397dc58430"/>
+    <w:bookmarkStart w:id="1233" w:name="X4855b1162e70238fd839d871e0792397dc58430"/>
     <w:p>
       <w:pPr>
         <w:pStyle w:val="Heading1"/>
@@ -159,7 +159,7 @@
         <w:t xml:space="preserve">CALPHAD; molten slag; molten salt; modified quasichemical model; thermodynamic database; phase diagram; WebAssembly; open data</w:t>
       </w:r>
     </w:p>
-    <w:bookmarkStart w:id="1174" w:name="overview"/>
+    <w:bookmarkStart w:id="1208" w:name="overview"/>
     <w:p>
       <w:pPr>
         <w:pStyle w:val="Heading2"/>
@@ -168,7 +168,7 @@
         <w:t xml:space="preserve">(1) Overview</w:t>
       </w:r>
     </w:p>
-    <w:bookmarkStart w:id="1161" w:name="introduction"/>
+    <w:bookmarkStart w:id="1195" w:name="introduction"/>
     <w:p>
       <w:pPr>
         <w:pStyle w:val="Heading3"/>
@@ -548,8 +548,8 @@
         <w:t xml:space="preserve">Hephaestus is a deliberate response to that gap, and it treats the engine and the data as one contribution because neither is useful alone. The engine is small on purpose. Its core is plain C with no dependencies, which makes it easy to embed and lets the identical code compile to WebAssembly, so the full calculator runs in a web browser with nothing installed and no data leaving the user’s machine. The database is open on purpose. Every parameter in it derives from published measurements, each value carries its provenance down to table and page, and the known shortcomings are documented next to the numbers they affect. The present work describes both, their validation against pycalphad and against measured phase equilibria, and the ways they can be reused. None of it asks the reader to program. For the experimentalist who never writes code, the browser application is the entire product: a page to open, a database to click, and a diagram to read. The sections that follow describe the machinery underneath for those who want it. Supplementary Material S1 is a plain-language primer for the non-programmer, starting at what a database file is and ending at a first calculation and how to read it. Its closing section teaches what an assessment is built from, so a reader who wants to contribute data for open publication, or to commission a file, arrives knowing what is needed.</w:t>
       </w:r>
     </w:p>
-    <w:bookmarkEnd w:id="1161"/>
-    <w:bookmarkStart w:id="1171" w:name="implementation-and-architecture"/>
+    <w:bookmarkEnd w:id="1195"/>
+    <w:bookmarkStart w:id="1205" w:name="implementation-and-architecture"/>
     <w:p>
       <w:pPr>
         <w:pStyle w:val="Heading3"/>
@@ -575,18 +575,18 @@
           <wp:inline>
             <wp:extent cx="5334000" cy="3511167"/>
             <wp:effectExtent b="0" l="0" r="0" t="0"/>
-            <wp:docPr descr="Figure 1: Architecture of Hephaestus. A single dependency-free C core reads the field’s three database dialects (ChemSage .dat, Thermo-Calc .tdb with the Inden magnetic model, and the unified .utdb) and calculates all thermodynamics; the same core is used as a native library, from Python through cffi, and compiled to WebAssembly behind the browser application. dbbuild writes new ChemSage files from measured data, and every energy path is validated against pycalphad." title="" id="1163" name="Picture"/>
+            <wp:docPr descr="Figure 1: Architecture of Hephaestus. A single dependency-free C core reads the field’s three database dialects (ChemSage .dat, Thermo-Calc .tdb with the Inden magnetic model, and the unified .utdb) and calculates all thermodynamics; the same core is used as a native library, from Python through cffi, and compiled to WebAssembly behind the browser application. dbbuild writes new ChemSage files from measured data, and every energy path is validated against pycalphad." title="" id="1197" name="Picture"/>
             <a:graphic>
               <a:graphicData uri="http://schemas.openxmlformats.org/drawingml/2006/picture">
                 <pic:pic>
                   <pic:nvPicPr>
-                    <pic:cNvPr descr="figures/fig1_architecture.png" id="1164" name="Picture"/>
+                    <pic:cNvPr descr="figures/fig1_architecture.png" id="1198" name="Picture"/>
                     <pic:cNvPicPr>
                       <a:picLocks noChangeArrowheads="1" noChangeAspect="1"/>
                     </pic:cNvPicPr>
                   </pic:nvPicPr>
                   <pic:blipFill>
-                    <a:blip r:embed="rId1162"/>
+                    <a:blip r:embed="rId1196"/>
                     <a:stretch>
                       <a:fillRect/>
                     </a:stretch>
@@ -793,18 +793,18 @@
           <wp:inline>
             <wp:extent cx="4754880" cy="4464799"/>
             <wp:effectExtent b="0" l="0" r="0" t="0"/>
-            <wp:docPr descr="Figure 2: The live solver in the browser application (light theme). The user loads the shipped database, picks a temperature, and presses Compute; the WebAssembly engine then solves the full FeO-MgO-SiO2 phase assemblage client side (here 1023 composition samples and 512 tie-facets in under half a second). Tapping a composition reads its stable phases and pins it to a comparison list; hovering previews on desktop." title="" id="1166" name="Picture"/>
+            <wp:docPr descr="Figure 2: The live solver in the browser application (light theme). The user loads the shipped database, picks a temperature, and presses Compute; the WebAssembly engine then solves the full FeO-MgO-SiO2 phase assemblage client side (here 1023 composition samples and 512 tie-facets in under half a second). Tapping a composition reads its stable phases and pins it to a comparison list; hovering previews on desktop." title="" id="1200" name="Picture"/>
             <a:graphic>
               <a:graphicData uri="http://schemas.openxmlformats.org/drawingml/2006/picture">
                 <pic:pic>
                   <pic:nvPicPr>
-                    <pic:cNvPr descr="figures/fig2_browser_app.png" id="1167" name="Picture"/>
+                    <pic:cNvPr descr="figures/fig2_browser_app.png" id="1201" name="Picture"/>
                     <pic:cNvPicPr>
                       <a:picLocks noChangeArrowheads="1" noChangeAspect="1"/>
                     </pic:cNvPicPr>
                   </pic:nvPicPr>
                   <pic:blipFill>
-                    <a:blip r:embed="rId1165"/>
+                    <a:blip r:embed="rId1199"/>
                     <a:stretch>
                       <a:fillRect/>
                     </a:stretch>
@@ -970,18 +970,18 @@
           <wp:inline>
             <wp:extent cx="5334000" cy="2197297"/>
             <wp:effectExtent b="0" l="0" r="0" t="0"/>
-            <wp:docPr descr="Figure 3: The assessed FeO-MgO-SiO2 system calculated from the shipped database files. (a) Liquidus projection: primary crystallizing phase fields, with liquidus isotherms labeled in °C. (b) Isothermal section at 1600 °C: stable phase assemblages, shaded by the number of solid phases present. Phase labels: L liquid, Crs cristobalite, Ol olivine, Opx orthopyroxene, Per periclase, Wus wustite." title="" id="1169" name="Picture"/>
+            <wp:docPr descr="Figure 3: The assessed FeO-MgO-SiO2 system calculated from the shipped database files. (a) Liquidus projection: primary crystallizing phase fields, with liquidus isotherms labeled in °C. (b) Isothermal section at 1600 °C: stable phase assemblages, shaded by the number of solid phases present. Phase labels: L liquid, Crs cristobalite, Ol olivine, Opx orthopyroxene, Per periclase, Wus wustite." title="" id="1203" name="Picture"/>
             <a:graphic>
               <a:graphicData uri="http://schemas.openxmlformats.org/drawingml/2006/picture">
                 <pic:pic>
                   <pic:nvPicPr>
-                    <pic:cNvPr descr="figures/fig3_ternary.png" id="1170" name="Picture"/>
+                    <pic:cNvPr descr="figures/fig3_ternary.png" id="1204" name="Picture"/>
                     <pic:cNvPicPr>
                       <a:picLocks noChangeArrowheads="1" noChangeAspect="1"/>
                     </pic:cNvPicPr>
                   </pic:nvPicPr>
                   <pic:blipFill>
-                    <a:blip r:embed="rId1168"/>
+                    <a:blip r:embed="rId1202"/>
                     <a:stretch>
                       <a:fillRect/>
                     </a:stretch>
@@ -1371,8 +1371,8 @@
         <w:t xml:space="preserve">Table 2: The assessed liquids. Full source lists, modeling judgments, and limits are in each system’s provenance file in the repository.</w:t>
       </w:r>
     </w:p>
-    <w:bookmarkEnd w:id="1171"/>
-    <w:bookmarkStart w:id="1172" w:name="anatomy-of-a-database-file"/>
+    <w:bookmarkEnd w:id="1205"/>
+    <w:bookmarkStart w:id="1206" w:name="anatomy-of-a-database-file"/>
     <w:p>
       <w:pPr>
         <w:pStyle w:val="Heading3"/>
@@ -1405,8 +1405,8 @@
         <w:t xml:space="preserve">That asymmetry is the economics of the field in miniature: implementations of the published models are increasingly available, but each fitted parameter condenses dozens of measurements and decisions. Parameter sets rather than codes are therefore the scarce commodity, and an openly licensed, provenance-tracked database is the part of this contribution that cannot be regenerated from the paper alone.</w:t>
       </w:r>
     </w:p>
-    <w:bookmarkEnd w:id="1172"/>
-    <w:bookmarkStart w:id="1173" w:name="quality-control"/>
+    <w:bookmarkEnd w:id="1206"/>
+    <w:bookmarkStart w:id="1207" w:name="quality-control"/>
     <w:p>
       <w:pPr>
         <w:pStyle w:val="Heading3"/>
@@ -1927,9 +1927,9 @@
         <w:t xml:space="preserve">invariants sit within about 40 °C, and the ternary liquidus projection reproduces the measured field topology [24]. Development practice is plain: the repository is version controlled with tagged releases (v0.1.0 through the v0.4.0 described here), the full suite runs before every release, and a fixed bug lands together with the regression test that would have caught it. The suite runs on Windows 11 under CPython 3.11 and 3.12; the browser application is exercised in Chromium- and Gecko-based browsers. A user can confirm a working installation by running pytest against the bundled test databases, or with no installation at all by opening the web application and loading the shipped ternary database.</w:t>
       </w:r>
     </w:p>
-    <w:bookmarkEnd w:id="1173"/>
-    <w:bookmarkEnd w:id="1174"/>
-    <w:bookmarkStart w:id="1182" w:name="availability"/>
+    <w:bookmarkEnd w:id="1207"/>
+    <w:bookmarkEnd w:id="1208"/>
+    <w:bookmarkStart w:id="1216" w:name="availability"/>
     <w:p>
       <w:pPr>
         <w:pStyle w:val="Heading2"/>
@@ -1938,7 +1938,7 @@
         <w:t xml:space="preserve">(2) Availability</w:t>
       </w:r>
     </w:p>
-    <w:bookmarkStart w:id="1175" w:name="operating-system"/>
+    <w:bookmarkStart w:id="1209" w:name="operating-system"/>
     <w:p>
       <w:pPr>
         <w:pStyle w:val="Heading3"/>
@@ -1955,8 +1955,8 @@
         <w:t xml:space="preserve">Platform independent. The core builds with any C99 compiler; development and testing used Windows 11. The browser application runs in any current browser with WebAssembly support.</w:t>
       </w:r>
     </w:p>
-    <w:bookmarkEnd w:id="1175"/>
-    <w:bookmarkStart w:id="1176" w:name="programming-language"/>
+    <w:bookmarkEnd w:id="1209"/>
+    <w:bookmarkStart w:id="1210" w:name="programming-language"/>
     <w:p>
       <w:pPr>
         <w:pStyle w:val="Heading3"/>
@@ -1973,8 +1973,8 @@
         <w:t xml:space="preserve">C (core), Python 3.11 or later (interface and fitting tools), JavaScript (browser application).</w:t>
       </w:r>
     </w:p>
-    <w:bookmarkEnd w:id="1176"/>
-    <w:bookmarkStart w:id="1177" w:name="additional-system-requirements"/>
+    <w:bookmarkEnd w:id="1210"/>
+    <w:bookmarkStart w:id="1211" w:name="additional-system-requirements"/>
     <w:p>
       <w:pPr>
         <w:pStyle w:val="Heading3"/>
@@ -1991,8 +1991,8 @@
         <w:t xml:space="preserve">None of note. The engine and database together are a few megabytes.</w:t>
       </w:r>
     </w:p>
-    <w:bookmarkEnd w:id="1177"/>
-    <w:bookmarkStart w:id="1178" w:name="dependencies"/>
+    <w:bookmarkEnd w:id="1211"/>
+    <w:bookmarkStart w:id="1212" w:name="dependencies"/>
     <w:p>
       <w:pPr>
         <w:pStyle w:val="Heading3"/>
@@ -2009,8 +2009,8 @@
         <w:t xml:space="preserve">Python interface: cffi, NumPy, SciPy (developed and tested with cffi 2.0, NumPy 2.4, and SciPy 1.17). The validation suite additionally requires pycalphad; every oracle comparison reported here ran against pycalphad 0.11.1, and the tests that read pycalphad’s own shipped test databases skip cleanly if a later version relocates them. The WebAssembly build requires emscripten. The C core and the browser application have no dependencies.</w:t>
       </w:r>
     </w:p>
-    <w:bookmarkEnd w:id="1178"/>
-    <w:bookmarkStart w:id="1179" w:name="list-of-contributors"/>
+    <w:bookmarkEnd w:id="1212"/>
+    <w:bookmarkStart w:id="1213" w:name="list-of-contributors"/>
     <w:p>
       <w:pPr>
         <w:pStyle w:val="Heading3"/>
@@ -2027,8 +2027,8 @@
         <w:t xml:space="preserve">Michael E. Bustamante (design, implementation, validation, data curation).</w:t>
       </w:r>
     </w:p>
-    <w:bookmarkEnd w:id="1179"/>
-    <w:bookmarkStart w:id="1180" w:name="software-location"/>
+    <w:bookmarkEnd w:id="1213"/>
+    <w:bookmarkStart w:id="1214" w:name="software-location"/>
     <w:p>
       <w:pPr>
         <w:pStyle w:val="Heading3"/>
@@ -2181,8 +2181,8 @@
         <w:t xml:space="preserve">Date published: 2026-09-02</w:t>
       </w:r>
     </w:p>
-    <w:bookmarkEnd w:id="1180"/>
-    <w:bookmarkStart w:id="1181" w:name="language"/>
+    <w:bookmarkEnd w:id="1214"/>
+    <w:bookmarkStart w:id="1215" w:name="language"/>
     <w:p>
       <w:pPr>
         <w:pStyle w:val="Heading3"/>
@@ -2199,9 +2199,9 @@
         <w:t xml:space="preserve">English.</w:t>
       </w:r>
     </w:p>
-    <w:bookmarkEnd w:id="1181"/>
-    <w:bookmarkEnd w:id="1182"/>
-    <w:bookmarkStart w:id="1190" w:name="reuse-potential"/>
+    <w:bookmarkEnd w:id="1215"/>
+    <w:bookmarkEnd w:id="1216"/>
+    <w:bookmarkStart w:id="1227" w:name="reuse-potential"/>
     <w:p>
       <w:pPr>
         <w:pStyle w:val="Heading2"/>
@@ -2226,7 +2226,7 @@
         <w:t xml:space="preserve">The browser application makes the lowest barrier the default. A lecture on slag thermodynamics, a plant metallurgist screening a composition, or a reviewer checking a claimed equilibrium can load the database and calculate in seconds, with confidential inputs never leaving the machine. The same property makes it a practical template for other groups who want to publish a model as a zero-install tool.</w:t>
       </w:r>
     </w:p>
-    <w:bookmarkStart w:id="1189" w:name="worked-examples"/>
+    <w:bookmarkStart w:id="1226" w:name="worked-examples"/>
     <w:p>
       <w:pPr>
         <w:pStyle w:val="Heading3"/>
@@ -2438,18 +2438,18 @@
           <wp:inline>
             <wp:extent cx="4206240" cy="3262561"/>
             <wp:effectExtent b="0" l="0" r="0" t="0"/>
-            <wp:docPr descr="Figure 4: The LiCl-KCl phase diagram calculated by the salt listing from the shipped open database, at the listing’s own step size. Light to dark: liquid, two-phase, and subsolidus fields. The dot is the calculated eutectic at this step size (0.400, 640 K); the star is the measured eutectic (0.415, 626 K)." title="" id="1184" name="Picture"/>
+            <wp:docPr descr="Figure 4: The LiCl-KCl phase diagram calculated by the salt listing from the shipped open database, at the listing’s own step size. Light to dark: liquid, two-phase, and subsolidus fields. The dot is the calculated eutectic at this step size (0.400, 640 K); the star is the measured eutectic (0.415, 626 K)." title="" id="1218" name="Picture"/>
             <a:graphic>
               <a:graphicData uri="http://schemas.openxmlformats.org/drawingml/2006/picture">
                 <pic:pic>
                   <pic:nvPicPr>
-                    <pic:cNvPr descr="figures/fig4_salt_example.png" id="1185" name="Picture"/>
+                    <pic:cNvPr descr="figures/fig4_salt_example.png" id="1219" name="Picture"/>
                     <pic:cNvPicPr>
                       <a:picLocks noChangeArrowheads="1" noChangeAspect="1"/>
                     </pic:cNvPicPr>
                   </pic:nvPicPr>
                   <pic:blipFill>
-                    <a:blip r:embed="rId1183"/>
+                    <a:blip r:embed="rId1217"/>
                     <a:stretch>
                       <a:fillRect/>
                     </a:stretch>
@@ -2684,18 +2684,18 @@
           <wp:inline>
             <wp:extent cx="4206240" cy="3262561"/>
             <wp:effectExtent b="0" l="0" r="0" t="0"/>
-            <wp:docPr descr="Figure 5: The Al-Zn phase diagram computed by the alloy listing from the shipped open TDB. Light to dark: liquid, liquid plus solid, and solid fields. The dot is the calculated eutectic (0.890, 660 K); the star is the assessed eutectic (0.885, 654 K)." title="" id="1187" name="Picture"/>
+            <wp:docPr descr="Figure 5: The Al-Zn phase diagram computed by the alloy listing from the shipped open TDB. Light to dark: liquid, liquid plus solid, and solid fields. The dot is the calculated eutectic (0.890, 660 K); the star is the assessed eutectic (0.885, 654 K)." title="" id="1221" name="Picture"/>
             <a:graphic>
               <a:graphicData uri="http://schemas.openxmlformats.org/drawingml/2006/picture">
                 <pic:pic>
                   <pic:nvPicPr>
-                    <pic:cNvPr descr="figures/fig5_alloy_example.png" id="1188" name="Picture"/>
+                    <pic:cNvPr descr="figures/fig5_alloy_example.png" id="1222" name="Picture"/>
                     <pic:cNvPicPr>
                       <a:picLocks noChangeArrowheads="1" noChangeAspect="1"/>
                     </pic:cNvPicPr>
                   </pic:nvPicPr>
                   <pic:blipFill>
-                    <a:blip r:embed="rId1186"/>
+                    <a:blip r:embed="rId1220"/>
                     <a:stretch>
                       <a:fillRect/>
                     </a:stretch>
@@ -2735,7 +2735,62 @@
         <w:pStyle w:val="BodyText"/>
       </w:pPr>
       <w:r>
-        <w:t xml:space="preserve">The database is a starting point rather than an endpoint, and the file format rewards growth: new components, new phases, and refits against new measurements accumulate in the same database. A system is therefore extended release by release rather than rebuilt, and archived versions keep results calculated against earlier releases reproducible. Because every value carries its source and every judgment is written down, another assessor can reweight the data, swap an endmember, or extend a system without reverse-engineering anything; dbbuild turns a table of measured activities into a loadable file in a few lines. The in-browser multiphase hull already covers any loaded three-cation file and any loaded alloy TDB join, so a new system becomes a browser phase diagram the moment its file loads. Natural extensions are further oxide systems, the remaining ChemSage solution models, the ionic-liquid TDB model, and multicomponent Scheil on the same hull machinery. The databases carry per-value provenance but not parameter uncertainties; refitting the same measured-data tables through ESPEI [10] to obtain Bayesian uncertainty bounds is a natural continuation. The repository also publishes an openly specified unified dialect (uTDB) that carries the MQMQA statements inside TDB grammar, with two shipped demonstration files chosen to be processes rather than curiosities: an aluminum-recycling database holding the Al-Zn alloy with its NaCl-KCl-MgCl2 salt flux, and a steelmaking database holding a basic Fe-C steel, magnetic phases included, with the FeO-MgO-SiO2 slag and its silicate solid solutions. Round-trip tests assert both reproduce their source-file physics at machine precision. Relative to the XML road of XTDB [15] (Table 1), uTDB is the on-ramp from the installed base, extending files as they are and running in this engine today, with mechanical conversion to XTDB elements the natural bridge once that schema settles. Making the calculator multilingual across the field’s file dialects is the direction of travel. Contributions and issues are handled through the GitHub repository.</w:t>
+        <w:t xml:space="preserve">The database is a starting point rather than an endpoint, and the file format rewards growth: new components, new phases, and refits against new measurements accumulate in the same database. A system is therefore extended release by release rather than rebuilt, and archived versions keep results calculated against earlier releases reproducible. Because every value carries its source and every judgment is written down, another assessor can reweight the data, swap an endmember, or extend a system without reverse-engineering anything; dbbuild turns a table of measured activities into a loadable file in a few lines. The in-browser multiphase hull already covers any loaded three-cation file and any loaded alloy TDB join, so a new system becomes a browser phase diagram the moment its file loads. Natural extensions are further oxide systems, the remaining ChemSage solution models, the ionic-liquid TDB model, and multicomponent Scheil on the same hull machinery. The databases carry per-value provenance but not parameter uncertainties; refitting the same measured-data tables through ESPEI [10] to obtain Bayesian uncertainty bounds is a natural continuation. The repository also publishes an openly specified unified dialect (uTDB) that carries the MQMQA statements inside TDB grammar, with two shipped demonstration files chosen to be processes rather than curiosities: an aluminum-recycling database holding the Al-Zn alloy with its NaCl-KCl-MgCl2 salt flux, and a steelmaking database holding a basic Fe-C steel, magnetic phases included, with the FeO-MgO-SiO2 slag and its silicate solid solutions. Round-trip tests assert both reproduce their source-file physics at machine precision. The steelmaking file is the clearest illustration of what a unified container buys (Figure 6): from one file the browser calculates the iron-carbon alloy diagram through the magnetic compound energy formalism and its Scheil solidification path, while the same file’s slag is a molten-salt-model liquid, two physics that no single legacy container holds together. Relative to the XML road of XTDB [15] (Table 1), uTDB is the on-ramp from the installed base, extending files as they are and running in this engine today, with mechanical conversion to XTDB elements the natural bridge once that schema settles. Making the calculator multilingual across the field’s file dialects is the direction of travel. Contributions and issues are handled through the GitHub repository.</w:t>
+      </w:r>
+    </w:p>
+    <w:p>
+      <w:pPr>
+        <w:pStyle w:val="CaptionedFigure"/>
+      </w:pPr>
+      <w:r>
+        <w:drawing>
+          <wp:inline>
+            <wp:extent cx="5334000" cy="4760653"/>
+            <wp:effectExtent b="0" l="0" r="0" t="0"/>
+            <wp:docPr descr="Figure 6: One unified (.utdb) file, two physics, calculated in the browser. (a) The steelmaking database loaded with the Melt/Alloy view toggle on Alloy; the engine calculates the Fe-C phase diagram through the magnetic compound energy formalism, with two tapped compositions pinned. (b) Scheil solidification for the same join at 4 mol% C, first solid at 1739 K and the residual liquid frozen by 1436 K, against the equilibrium lever-rule path (dashed). The file’s slag half is a Modified Quasichemical Model liquid; no legacy container holds both models at once." title="" id="1224" name="Picture"/>
+            <a:graphic>
+              <a:graphicData uri="http://schemas.openxmlformats.org/drawingml/2006/picture">
+                <pic:pic>
+                  <pic:nvPicPr>
+                    <pic:cNvPr descr="figures/fig6_utdb_steel.png" id="1225" name="Picture"/>
+                    <pic:cNvPicPr>
+                      <a:picLocks noChangeArrowheads="1" noChangeAspect="1"/>
+                    </pic:cNvPicPr>
+                  </pic:nvPicPr>
+                  <pic:blipFill>
+                    <a:blip r:embed="rId1223"/>
+                    <a:stretch>
+                      <a:fillRect/>
+                    </a:stretch>
+                  </pic:blipFill>
+                  <pic:spPr bwMode="auto">
+                    <a:xfrm>
+                      <a:off x="0" y="0"/>
+                      <a:ext cx="5334000" cy="4760653"/>
+                    </a:xfrm>
+                    <a:prstGeom prst="rect">
+                      <a:avLst/>
+                    </a:prstGeom>
+                    <a:noFill/>
+                    <a:ln w="9525">
+                      <a:noFill/>
+                      <a:headEnd/>
+                      <a:tailEnd/>
+                    </a:ln>
+                  </pic:spPr>
+                </pic:pic>
+              </a:graphicData>
+            </a:graphic>
+          </wp:inline>
+        </w:drawing>
+      </w:r>
+    </w:p>
+    <w:p>
+      <w:pPr>
+        <w:pStyle w:val="ImageCaption"/>
+      </w:pPr>
+      <w:r>
+        <w:t xml:space="preserve">Figure 6: One unified (.utdb) file, two physics, calculated in the browser. (a) The steelmaking database loaded with the Melt/Alloy view toggle on Alloy; the engine calculates the Fe-C phase diagram through the magnetic compound energy formalism, with two tapped compositions pinned. (b) Scheil solidification for the same join at 4 mol% C, first solid at 1739 K and the residual liquid frozen by 1436 K, against the equilibrium lever-rule path (dashed). The file’s slag half is a Modified Quasichemical Model liquid; no legacy container holds both models at once.</w:t>
       </w:r>
     </w:p>
     <w:p>
@@ -2746,9 +2801,9 @@
         <w:t xml:space="preserve">The paper closes where it began. The gap was never the model, which has been published for two decades, but an open, runnable pairing of model and parameters. Hephaestus supplies both halves under open licenses and puts them behind a browser page that asks nothing of its user. The claims are checkable end to end. Release v0.4.0 archives the exact version described, and the 104-test suite reruns the pycalphad comparisons on any machine. The worked examples print the figures shown, and every parameter in every shipped database traces to a published measurement through its provenance file. A reader who doubts a number can recalculate it; one who needs a system that is missing can build it with the same open tools, or ask.</w:t>
       </w:r>
     </w:p>
-    <w:bookmarkEnd w:id="1189"/>
-    <w:bookmarkEnd w:id="1190"/>
-    <w:bookmarkStart w:id="1191" w:name="data-availability"/>
+    <w:bookmarkEnd w:id="1226"/>
+    <w:bookmarkEnd w:id="1227"/>
+    <w:bookmarkStart w:id="1228" w:name="data-availability"/>
     <w:p>
       <w:pPr>
         <w:pStyle w:val="Heading2"/>
@@ -2765,8 +2820,8 @@
         <w:t xml:space="preserve">The engine, the database, the browser application, and the validation suite are openly available in the code repository listed above; the version described here is archived as release v0.4.0. The database files and their provenance records are in the repository’s data directory under CC BY 4.0.</w:t>
       </w:r>
     </w:p>
-    <w:bookmarkEnd w:id="1191"/>
-    <w:bookmarkStart w:id="1192" w:name="acknowledgements"/>
+    <w:bookmarkEnd w:id="1228"/>
+    <w:bookmarkStart w:id="1229" w:name="acknowledgements"/>
     <w:p>
       <w:pPr>
         <w:pStyle w:val="Heading2"/>
@@ -2783,8 +2838,8 @@
         <w:t xml:space="preserve">During the development of this software the author used Claude Code (Anthropic) to assist with implementation, validation scripting, and manuscript preparation. This assistance was agentic, not autonomous: it operated under author direction and supervision at every step and was never a closed loop that produced or accepted results without review. Every parameter was traced by the author to its primary source before entering the database, and every reference was verified against its registry record. The author reviewed and approved all output and takes full responsibility for this article.</w:t>
       </w:r>
     </w:p>
-    <w:bookmarkEnd w:id="1192"/>
-    <w:bookmarkStart w:id="1193" w:name="funding-statement"/>
+    <w:bookmarkEnd w:id="1229"/>
+    <w:bookmarkStart w:id="1230" w:name="funding-statement"/>
     <w:p>
       <w:pPr>
         <w:pStyle w:val="Heading2"/>
@@ -2801,8 +2856,8 @@
         <w:t xml:space="preserve">The development of this software received no external funding.</w:t>
       </w:r>
     </w:p>
-    <w:bookmarkEnd w:id="1193"/>
-    <w:bookmarkStart w:id="1194" w:name="competing-interests"/>
+    <w:bookmarkEnd w:id="1230"/>
+    <w:bookmarkStart w:id="1231" w:name="competing-interests"/>
     <w:p>
       <w:pPr>
         <w:pStyle w:val="Heading2"/>
@@ -2819,8 +2874,8 @@
         <w:t xml:space="preserve">The author founded Odinzen LLC, which provides commercial thermodynamic modeling services, and declares this as a competing interest. The software and database published here are released in full under open licenses, and no proprietary Odinzen assets are included.</w:t>
       </w:r>
     </w:p>
-    <w:bookmarkEnd w:id="1194"/>
-    <w:bookmarkStart w:id="1195" w:name="references"/>
+    <w:bookmarkEnd w:id="1231"/>
+    <w:bookmarkStart w:id="1232" w:name="references"/>
     <w:p>
       <w:pPr>
         <w:pStyle w:val="Heading2"/>
@@ -3161,8 +3216,8 @@
         <w:t xml:space="preserve">[40] Dinsdale AT. SGTE data for pure elements. Calphad. 1991 Oct;15(4):317-425. doi:10.1016/0364-5916(91)90030-N</w:t>
       </w:r>
     </w:p>
-    <w:bookmarkEnd w:id="1195"/>
-    <w:bookmarkEnd w:id="1196"/>
+    <w:bookmarkEnd w:id="1232"/>
+    <w:bookmarkEnd w:id="1233"/>
     <w:sectPr>
       <w:footnotePr>
         <w:numRestart w:val="eachSect"/>

</xml_diff>

<commit_message>
Table captions above the tables (standard convention, all three); Figure 6 re-captured without the double-scale banding and at 3x native resolution (548 dpi)
Co-Authored-By: Claude Opus 4.8 <noreply@anthropic.com>
</commit_message>
<xml_diff>
--- a/paper/Bustamante_Hephaestus_JORS_manuscript.docx
+++ b/paper/Bustamante_Hephaestus_JORS_manuscript.docx
@@ -2,7 +2,7 @@
 <file path=word/document.xml><?xml version="1.0" encoding="utf-8"?>
 <w:document xmlns:w="http://schemas.openxmlformats.org/wordprocessingml/2006/main" xmlns:m="http://schemas.openxmlformats.org/officeDocument/2006/math" xmlns:r="http://schemas.openxmlformats.org/officeDocument/2006/relationships" xmlns:o="urn:schemas-microsoft-com:office:office" xmlns:v="urn:schemas-microsoft-com:vml" xmlns:w10="urn:schemas-microsoft-com:office:word" xmlns:a="http://schemas.openxmlformats.org/drawingml/2006/main" xmlns:pic="http://schemas.openxmlformats.org/drawingml/2006/picture" xmlns:wp="http://schemas.openxmlformats.org/drawingml/2006/wordprocessingDrawing">
   <w:body>
-    <w:bookmarkStart w:id="1233" w:name="X4855b1162e70238fd839d871e0792397dc58430"/>
+    <w:bookmarkStart w:id="1270" w:name="X4855b1162e70238fd839d871e0792397dc58430"/>
     <w:p>
       <w:pPr>
         <w:pStyle w:val="Heading1"/>
@@ -159,7 +159,7 @@
         <w:t xml:space="preserve">CALPHAD; molten slag; molten salt; modified quasichemical model; thermodynamic database; phase diagram; WebAssembly; open data</w:t>
       </w:r>
     </w:p>
-    <w:bookmarkStart w:id="1208" w:name="overview"/>
+    <w:bookmarkStart w:id="1245" w:name="overview"/>
     <w:p>
       <w:pPr>
         <w:pStyle w:val="Heading2"/>
@@ -168,7 +168,7 @@
         <w:t xml:space="preserve">(1) Overview</w:t>
       </w:r>
     </w:p>
-    <w:bookmarkStart w:id="1195" w:name="introduction"/>
+    <w:bookmarkStart w:id="1232" w:name="introduction"/>
     <w:p>
       <w:pPr>
         <w:pStyle w:val="Heading3"/>
@@ -211,6 +211,14 @@
       </w:r>
       <w:r>
         <w:t xml:space="preserve">[15]: they are engineering for the future toolchain. This work approaches the same goal from the installed base instead, reading both legacy dialects as they are and publishing a minimal in-place extension, uTDB, for the one model TDB lacks; the two roads are wrappers around one destination, and converting between them is mechanical. Read as a path, the formats run TDB to uTDB to XTDB, the familiar files extended in place today and translated into the XML successor once its tooling arrives.</w:t>
+      </w:r>
+    </w:p>
+    <w:p>
+      <w:pPr>
+        <w:pStyle w:val="BodyText"/>
+      </w:pPr>
+      <w:r>
+        <w:t xml:space="preserve">Table 1: The schools of thermodynamic database containers. One need, assessed Gibbs energies behind a calculation, split across mutually unreadable families; the present work reads the two CALPHAD dialects and their unified extension in one engine.</w:t>
       </w:r>
     </w:p>
     <w:tbl>
@@ -537,19 +545,11 @@
         <w:pStyle w:val="BodyText"/>
       </w:pPr>
       <w:r>
-        <w:t xml:space="preserve">Table 1: The schools of thermodynamic database containers. One need, assessed Gibbs energies behind a calculation, split across mutually unreadable families; the present work reads the two CALPHAD dialects and their unified extension in one engine.</w:t>
-      </w:r>
-    </w:p>
-    <w:p>
-      <w:pPr>
-        <w:pStyle w:val="BodyText"/>
-      </w:pPr>
-      <w:r>
         <w:t xml:space="preserve">Hephaestus is a deliberate response to that gap, and it treats the engine and the data as one contribution because neither is useful alone. The engine is small on purpose. Its core is plain C with no dependencies, which makes it easy to embed and lets the identical code compile to WebAssembly, so the full calculator runs in a web browser with nothing installed and no data leaving the user’s machine. The database is open on purpose. Every parameter in it derives from published measurements, each value carries its provenance down to table and page, and the known shortcomings are documented next to the numbers they affect. The present work describes both, their validation against pycalphad and against measured phase equilibria, and the ways they can be reused. None of it asks the reader to program. For the experimentalist who never writes code, the browser application is the entire product: a page to open, a database to click, and a diagram to read. The sections that follow describe the machinery underneath for those who want it. Supplementary Material S1 is a plain-language primer for the non-programmer, starting at what a database file is and ending at a first calculation and how to read it. Its closing section teaches what an assessment is built from, so a reader who wants to contribute data for open publication, or to commission a file, arrives knowing what is needed.</w:t>
       </w:r>
     </w:p>
-    <w:bookmarkEnd w:id="1195"/>
-    <w:bookmarkStart w:id="1205" w:name="implementation-and-architecture"/>
+    <w:bookmarkEnd w:id="1232"/>
+    <w:bookmarkStart w:id="1242" w:name="implementation-and-architecture"/>
     <w:p>
       <w:pPr>
         <w:pStyle w:val="Heading3"/>
@@ -575,18 +575,18 @@
           <wp:inline>
             <wp:extent cx="5334000" cy="3511167"/>
             <wp:effectExtent b="0" l="0" r="0" t="0"/>
-            <wp:docPr descr="Figure 1: Architecture of Hephaestus. A single dependency-free C core reads the field’s three database dialects (ChemSage .dat, Thermo-Calc .tdb with the Inden magnetic model, and the unified .utdb) and calculates all thermodynamics; the same core is used as a native library, from Python through cffi, and compiled to WebAssembly behind the browser application. dbbuild writes new ChemSage files from measured data, and every energy path is validated against pycalphad." title="" id="1197" name="Picture"/>
+            <wp:docPr descr="Figure 1: Architecture of Hephaestus. A single dependency-free C core reads the field’s three database dialects (ChemSage .dat, Thermo-Calc .tdb with the Inden magnetic model, and the unified .utdb) and calculates all thermodynamics; the same core is used as a native library, from Python through cffi, and compiled to WebAssembly behind the browser application. dbbuild writes new ChemSage files from measured data, and every energy path is validated against pycalphad." title="" id="1234" name="Picture"/>
             <a:graphic>
               <a:graphicData uri="http://schemas.openxmlformats.org/drawingml/2006/picture">
                 <pic:pic>
                   <pic:nvPicPr>
-                    <pic:cNvPr descr="figures/fig1_architecture.png" id="1198" name="Picture"/>
+                    <pic:cNvPr descr="figures/fig1_architecture.png" id="1235" name="Picture"/>
                     <pic:cNvPicPr>
                       <a:picLocks noChangeArrowheads="1" noChangeAspect="1"/>
                     </pic:cNvPicPr>
                   </pic:nvPicPr>
                   <pic:blipFill>
-                    <a:blip r:embed="rId1196"/>
+                    <a:blip r:embed="rId1233"/>
                     <a:stretch>
                       <a:fillRect/>
                     </a:stretch>
@@ -793,18 +793,18 @@
           <wp:inline>
             <wp:extent cx="4754880" cy="4464799"/>
             <wp:effectExtent b="0" l="0" r="0" t="0"/>
-            <wp:docPr descr="Figure 2: The live solver in the browser application (light theme). The user loads the shipped database, picks a temperature, and presses Compute; the WebAssembly engine then solves the full FeO-MgO-SiO2 phase assemblage client side (here 1023 composition samples and 512 tie-facets in under half a second). Tapping a composition reads its stable phases and pins it to a comparison list; hovering previews on desktop." title="" id="1200" name="Picture"/>
+            <wp:docPr descr="Figure 2: The live solver in the browser application (light theme). The user loads the shipped database, picks a temperature, and presses Compute; the WebAssembly engine then solves the full FeO-MgO-SiO2 phase assemblage client side (here 1023 composition samples and 512 tie-facets in under half a second). Tapping a composition reads its stable phases and pins it to a comparison list; hovering previews on desktop." title="" id="1237" name="Picture"/>
             <a:graphic>
               <a:graphicData uri="http://schemas.openxmlformats.org/drawingml/2006/picture">
                 <pic:pic>
                   <pic:nvPicPr>
-                    <pic:cNvPr descr="figures/fig2_browser_app.png" id="1201" name="Picture"/>
+                    <pic:cNvPr descr="figures/fig2_browser_app.png" id="1238" name="Picture"/>
                     <pic:cNvPicPr>
                       <a:picLocks noChangeArrowheads="1" noChangeAspect="1"/>
                     </pic:cNvPicPr>
                   </pic:nvPicPr>
                   <pic:blipFill>
-                    <a:blip r:embed="rId1199"/>
+                    <a:blip r:embed="rId1236"/>
                     <a:stretch>
                       <a:fillRect/>
                     </a:stretch>
@@ -970,18 +970,18 @@
           <wp:inline>
             <wp:extent cx="5334000" cy="2197297"/>
             <wp:effectExtent b="0" l="0" r="0" t="0"/>
-            <wp:docPr descr="Figure 3: The assessed FeO-MgO-SiO2 system calculated from the shipped database files. (a) Liquidus projection: primary crystallizing phase fields, with liquidus isotherms labeled in °C. (b) Isothermal section at 1600 °C: stable phase assemblages, shaded by the number of solid phases present. Phase labels: L liquid, Crs cristobalite, Ol olivine, Opx orthopyroxene, Per periclase, Wus wustite." title="" id="1203" name="Picture"/>
+            <wp:docPr descr="Figure 3: The assessed FeO-MgO-SiO2 system calculated from the shipped database files. (a) Liquidus projection: primary crystallizing phase fields, with liquidus isotherms labeled in °C. (b) Isothermal section at 1600 °C: stable phase assemblages, shaded by the number of solid phases present. Phase labels: L liquid, Crs cristobalite, Ol olivine, Opx orthopyroxene, Per periclase, Wus wustite." title="" id="1240" name="Picture"/>
             <a:graphic>
               <a:graphicData uri="http://schemas.openxmlformats.org/drawingml/2006/picture">
                 <pic:pic>
                   <pic:nvPicPr>
-                    <pic:cNvPr descr="figures/fig3_ternary.png" id="1204" name="Picture"/>
+                    <pic:cNvPr descr="figures/fig3_ternary.png" id="1241" name="Picture"/>
                     <pic:cNvPicPr>
                       <a:picLocks noChangeArrowheads="1" noChangeAspect="1"/>
                     </pic:cNvPicPr>
                   </pic:nvPicPr>
                   <pic:blipFill>
-                    <a:blip r:embed="rId1202"/>
+                    <a:blip r:embed="rId1239"/>
                     <a:stretch>
                       <a:fillRect/>
                     </a:stretch>
@@ -1028,6 +1028,14 @@
         <w:t xml:space="preserve">system calculated from the shipped database files. (a) Liquidus projection: primary crystallizing phase fields, with liquidus isotherms labeled in °C. (b) Isothermal section at 1600 °C: stable phase assemblages, shaded by the number of solid phases present. Phase labels: L liquid, Crs cristobalite, Ol olivine, Opx orthopyroxene, Per periclase, Wus wustite.</w:t>
       </w:r>
     </w:p>
+    <w:p>
+      <w:pPr>
+        <w:pStyle w:val="BodyText"/>
+      </w:pPr>
+      <w:r>
+        <w:t xml:space="preserve">Table 2: The assessed liquids. Full source lists, modeling judgments, and limits are in each system’s provenance file in the repository.</w:t>
+      </w:r>
+    </w:p>
     <w:tbl>
       <w:tblPr>
         <w:tblStyle w:val="Table"/>
@@ -1363,16 +1371,8 @@
         </w:tc>
       </w:tr>
     </w:tbl>
-    <w:p>
-      <w:pPr>
-        <w:pStyle w:val="BodyText"/>
-      </w:pPr>
-      <w:r>
-        <w:t xml:space="preserve">Table 2: The assessed liquids. Full source lists, modeling judgments, and limits are in each system’s provenance file in the repository.</w:t>
-      </w:r>
-    </w:p>
-    <w:bookmarkEnd w:id="1205"/>
-    <w:bookmarkStart w:id="1206" w:name="anatomy-of-a-database-file"/>
+    <w:bookmarkEnd w:id="1242"/>
+    <w:bookmarkStart w:id="1243" w:name="anatomy-of-a-database-file"/>
     <w:p>
       <w:pPr>
         <w:pStyle w:val="Heading3"/>
@@ -1405,8 +1405,8 @@
         <w:t xml:space="preserve">That asymmetry is the economics of the field in miniature: implementations of the published models are increasingly available, but each fitted parameter condenses dozens of measurements and decisions. Parameter sets rather than codes are therefore the scarce commodity, and an openly licensed, provenance-tracked database is the part of this contribution that cannot be regenerated from the paper alone.</w:t>
       </w:r>
     </w:p>
-    <w:bookmarkEnd w:id="1206"/>
-    <w:bookmarkStart w:id="1207" w:name="quality-control"/>
+    <w:bookmarkEnd w:id="1243"/>
+    <w:bookmarkStart w:id="1244" w:name="quality-control"/>
     <w:p>
       <w:pPr>
         <w:pStyle w:val="Heading3"/>
@@ -1445,6 +1445,14 @@
       </w:r>
       <w:r>
         <w:t xml:space="preserve">J per mole of atoms, line compounds included, while out-of-subset files must fail with the stated reason, and the suite asserts those failures too. The magnetic model is checked twice over: pycalphad parity on its own magnetic test database and on an own-transcribed Fe-C system, whose pure-iron transitions, carried almost entirely by the magnetic term, come out at 1185, 1668, and 1811 K against the measured 1184.8, 1667.5, and 1811. The Scheil panel is checked against known invariants: for Al-Zn at 30 mol% Zn it nucleates FCC_A1 at 836 K and freezes the 12.5% residue within one temperature step of the assessed 654 K eutectic [39]; for LiCl-KCl the residue freezes at 629 K against the measured 626 K.</w:t>
+      </w:r>
+    </w:p>
+    <w:p>
+      <w:pPr>
+        <w:pStyle w:val="BodyText"/>
+      </w:pPr>
+      <w:r>
+        <w:t xml:space="preserve">Table 3: Validation against the independent oracle. Every check runs in the pytest suite except the in-browser one, which is exercised manually per release.</w:t>
       </w:r>
     </w:p>
     <w:tbl>
@@ -1892,14 +1900,6 @@
         <w:pStyle w:val="BodyText"/>
       </w:pPr>
       <w:r>
-        <w:t xml:space="preserve">Table 3: Validation against the independent oracle. Every check runs in the pytest suite except the in-browser one, which is exercised manually per release.</w:t>
-      </w:r>
-    </w:p>
-    <w:p>
-      <w:pPr>
-        <w:pStyle w:val="BodyText"/>
-      </w:pPr>
-      <w:r>
         <w:t xml:space="preserve">The database is tested against measurements rather than against other software. Endmember fusion points reproduce their sources exactly. The fitted FeO-SiO</w:t>
       </w:r>
       <w:r>
@@ -1927,9 +1927,9 @@
         <w:t xml:space="preserve">invariants sit within about 40 °C, and the ternary liquidus projection reproduces the measured field topology [24]. Development practice is plain: the repository is version controlled with tagged releases (v0.1.0 through the v0.4.0 described here), the full suite runs before every release, and a fixed bug lands together with the regression test that would have caught it. The suite runs on Windows 11 under CPython 3.11 and 3.12; the browser application is exercised in Chromium- and Gecko-based browsers. A user can confirm a working installation by running pytest against the bundled test databases, or with no installation at all by opening the web application and loading the shipped ternary database.</w:t>
       </w:r>
     </w:p>
-    <w:bookmarkEnd w:id="1207"/>
-    <w:bookmarkEnd w:id="1208"/>
-    <w:bookmarkStart w:id="1216" w:name="availability"/>
+    <w:bookmarkEnd w:id="1244"/>
+    <w:bookmarkEnd w:id="1245"/>
+    <w:bookmarkStart w:id="1253" w:name="availability"/>
     <w:p>
       <w:pPr>
         <w:pStyle w:val="Heading2"/>
@@ -1938,7 +1938,7 @@
         <w:t xml:space="preserve">(2) Availability</w:t>
       </w:r>
     </w:p>
-    <w:bookmarkStart w:id="1209" w:name="operating-system"/>
+    <w:bookmarkStart w:id="1246" w:name="operating-system"/>
     <w:p>
       <w:pPr>
         <w:pStyle w:val="Heading3"/>
@@ -1955,8 +1955,8 @@
         <w:t xml:space="preserve">Platform independent. The core builds with any C99 compiler; development and testing used Windows 11. The browser application runs in any current browser with WebAssembly support.</w:t>
       </w:r>
     </w:p>
-    <w:bookmarkEnd w:id="1209"/>
-    <w:bookmarkStart w:id="1210" w:name="programming-language"/>
+    <w:bookmarkEnd w:id="1246"/>
+    <w:bookmarkStart w:id="1247" w:name="programming-language"/>
     <w:p>
       <w:pPr>
         <w:pStyle w:val="Heading3"/>
@@ -1973,8 +1973,8 @@
         <w:t xml:space="preserve">C (core), Python 3.11 or later (interface and fitting tools), JavaScript (browser application).</w:t>
       </w:r>
     </w:p>
-    <w:bookmarkEnd w:id="1210"/>
-    <w:bookmarkStart w:id="1211" w:name="additional-system-requirements"/>
+    <w:bookmarkEnd w:id="1247"/>
+    <w:bookmarkStart w:id="1248" w:name="additional-system-requirements"/>
     <w:p>
       <w:pPr>
         <w:pStyle w:val="Heading3"/>
@@ -1991,8 +1991,8 @@
         <w:t xml:space="preserve">None of note. The engine and database together are a few megabytes.</w:t>
       </w:r>
     </w:p>
-    <w:bookmarkEnd w:id="1211"/>
-    <w:bookmarkStart w:id="1212" w:name="dependencies"/>
+    <w:bookmarkEnd w:id="1248"/>
+    <w:bookmarkStart w:id="1249" w:name="dependencies"/>
     <w:p>
       <w:pPr>
         <w:pStyle w:val="Heading3"/>
@@ -2009,8 +2009,8 @@
         <w:t xml:space="preserve">Python interface: cffi, NumPy, SciPy (developed and tested with cffi 2.0, NumPy 2.4, and SciPy 1.17). The validation suite additionally requires pycalphad; every oracle comparison reported here ran against pycalphad 0.11.1, and the tests that read pycalphad’s own shipped test databases skip cleanly if a later version relocates them. The WebAssembly build requires emscripten. The C core and the browser application have no dependencies.</w:t>
       </w:r>
     </w:p>
-    <w:bookmarkEnd w:id="1212"/>
-    <w:bookmarkStart w:id="1213" w:name="list-of-contributors"/>
+    <w:bookmarkEnd w:id="1249"/>
+    <w:bookmarkStart w:id="1250" w:name="list-of-contributors"/>
     <w:p>
       <w:pPr>
         <w:pStyle w:val="Heading3"/>
@@ -2027,8 +2027,8 @@
         <w:t xml:space="preserve">Michael E. Bustamante (design, implementation, validation, data curation).</w:t>
       </w:r>
     </w:p>
-    <w:bookmarkEnd w:id="1213"/>
-    <w:bookmarkStart w:id="1214" w:name="software-location"/>
+    <w:bookmarkEnd w:id="1250"/>
+    <w:bookmarkStart w:id="1251" w:name="software-location"/>
     <w:p>
       <w:pPr>
         <w:pStyle w:val="Heading3"/>
@@ -2181,8 +2181,8 @@
         <w:t xml:space="preserve">Date published: 2026-09-02</w:t>
       </w:r>
     </w:p>
-    <w:bookmarkEnd w:id="1214"/>
-    <w:bookmarkStart w:id="1215" w:name="language"/>
+    <w:bookmarkEnd w:id="1251"/>
+    <w:bookmarkStart w:id="1252" w:name="language"/>
     <w:p>
       <w:pPr>
         <w:pStyle w:val="Heading3"/>
@@ -2199,9 +2199,9 @@
         <w:t xml:space="preserve">English.</w:t>
       </w:r>
     </w:p>
-    <w:bookmarkEnd w:id="1215"/>
-    <w:bookmarkEnd w:id="1216"/>
-    <w:bookmarkStart w:id="1227" w:name="reuse-potential"/>
+    <w:bookmarkEnd w:id="1252"/>
+    <w:bookmarkEnd w:id="1253"/>
+    <w:bookmarkStart w:id="1264" w:name="reuse-potential"/>
     <w:p>
       <w:pPr>
         <w:pStyle w:val="Heading2"/>
@@ -2226,7 +2226,7 @@
         <w:t xml:space="preserve">The browser application makes the lowest barrier the default. A lecture on slag thermodynamics, a plant metallurgist screening a composition, or a reviewer checking a claimed equilibrium can load the database and calculate in seconds, with confidential inputs never leaving the machine. The same property makes it a practical template for other groups who want to publish a model as a zero-install tool.</w:t>
       </w:r>
     </w:p>
-    <w:bookmarkStart w:id="1226" w:name="worked-examples"/>
+    <w:bookmarkStart w:id="1263" w:name="worked-examples"/>
     <w:p>
       <w:pPr>
         <w:pStyle w:val="Heading3"/>
@@ -2438,18 +2438,18 @@
           <wp:inline>
             <wp:extent cx="4206240" cy="3262561"/>
             <wp:effectExtent b="0" l="0" r="0" t="0"/>
-            <wp:docPr descr="Figure 4: The LiCl-KCl phase diagram calculated by the salt listing from the shipped open database, at the listing’s own step size. Light to dark: liquid, two-phase, and subsolidus fields. The dot is the calculated eutectic at this step size (0.400, 640 K); the star is the measured eutectic (0.415, 626 K)." title="" id="1218" name="Picture"/>
+            <wp:docPr descr="Figure 4: The LiCl-KCl phase diagram calculated by the salt listing from the shipped open database, at the listing’s own step size. Light to dark: liquid, two-phase, and subsolidus fields. The dot is the calculated eutectic at this step size (0.400, 640 K); the star is the measured eutectic (0.415, 626 K)." title="" id="1255" name="Picture"/>
             <a:graphic>
               <a:graphicData uri="http://schemas.openxmlformats.org/drawingml/2006/picture">
                 <pic:pic>
                   <pic:nvPicPr>
-                    <pic:cNvPr descr="figures/fig4_salt_example.png" id="1219" name="Picture"/>
+                    <pic:cNvPr descr="figures/fig4_salt_example.png" id="1256" name="Picture"/>
                     <pic:cNvPicPr>
                       <a:picLocks noChangeArrowheads="1" noChangeAspect="1"/>
                     </pic:cNvPicPr>
                   </pic:nvPicPr>
                   <pic:blipFill>
-                    <a:blip r:embed="rId1217"/>
+                    <a:blip r:embed="rId1254"/>
                     <a:stretch>
                       <a:fillRect/>
                     </a:stretch>
@@ -2684,18 +2684,18 @@
           <wp:inline>
             <wp:extent cx="4206240" cy="3262561"/>
             <wp:effectExtent b="0" l="0" r="0" t="0"/>
-            <wp:docPr descr="Figure 5: The Al-Zn phase diagram computed by the alloy listing from the shipped open TDB. Light to dark: liquid, liquid plus solid, and solid fields. The dot is the calculated eutectic (0.890, 660 K); the star is the assessed eutectic (0.885, 654 K)." title="" id="1221" name="Picture"/>
+            <wp:docPr descr="Figure 5: The Al-Zn phase diagram computed by the alloy listing from the shipped open TDB. Light to dark: liquid, liquid plus solid, and solid fields. The dot is the calculated eutectic (0.890, 660 K); the star is the assessed eutectic (0.885, 654 K)." title="" id="1258" name="Picture"/>
             <a:graphic>
               <a:graphicData uri="http://schemas.openxmlformats.org/drawingml/2006/picture">
                 <pic:pic>
                   <pic:nvPicPr>
-                    <pic:cNvPr descr="figures/fig5_alloy_example.png" id="1222" name="Picture"/>
+                    <pic:cNvPr descr="figures/fig5_alloy_example.png" id="1259" name="Picture"/>
                     <pic:cNvPicPr>
                       <a:picLocks noChangeArrowheads="1" noChangeAspect="1"/>
                     </pic:cNvPicPr>
                   </pic:nvPicPr>
                   <pic:blipFill>
-                    <a:blip r:embed="rId1220"/>
+                    <a:blip r:embed="rId1257"/>
                     <a:stretch>
                       <a:fillRect/>
                     </a:stretch>
@@ -2745,20 +2745,20 @@
       <w:r>
         <w:drawing>
           <wp:inline>
-            <wp:extent cx="5334000" cy="4760653"/>
+            <wp:extent cx="5334000" cy="4756265"/>
             <wp:effectExtent b="0" l="0" r="0" t="0"/>
-            <wp:docPr descr="Figure 6: One unified (.utdb) file, two physics, calculated in the browser. (a) The steelmaking database loaded with the Melt/Alloy view toggle on Alloy; the engine calculates the Fe-C phase diagram through the magnetic compound energy formalism, with two tapped compositions pinned. (b) Scheil solidification for the same join at 4 mol% C, first solid at 1739 K and the residual liquid frozen by 1436 K, against the equilibrium lever-rule path (dashed). The file’s slag half is a Modified Quasichemical Model liquid; no legacy container holds both models at once." title="" id="1224" name="Picture"/>
+            <wp:docPr descr="Figure 6: One unified (.utdb) file, two physics, calculated in the browser. (a) The steelmaking database loaded with the Melt/Alloy view toggle on Alloy; the engine calculates the Fe-C phase diagram through the magnetic compound energy formalism, with two tapped compositions pinned. (b) Scheil solidification for the same join at 4 mol% C, first solid at 1739 K and the residual liquid frozen by 1436 K, against the equilibrium lever-rule path (dashed). The file’s slag half is a Modified Quasichemical Model liquid; no legacy container holds both models at once." title="" id="1261" name="Picture"/>
             <a:graphic>
               <a:graphicData uri="http://schemas.openxmlformats.org/drawingml/2006/picture">
                 <pic:pic>
                   <pic:nvPicPr>
-                    <pic:cNvPr descr="figures/fig6_utdb_steel.png" id="1225" name="Picture"/>
+                    <pic:cNvPr descr="figures/fig6_utdb_steel.png" id="1262" name="Picture"/>
                     <pic:cNvPicPr>
                       <a:picLocks noChangeArrowheads="1" noChangeAspect="1"/>
                     </pic:cNvPicPr>
                   </pic:nvPicPr>
                   <pic:blipFill>
-                    <a:blip r:embed="rId1223"/>
+                    <a:blip r:embed="rId1260"/>
                     <a:stretch>
                       <a:fillRect/>
                     </a:stretch>
@@ -2766,7 +2766,7 @@
                   <pic:spPr bwMode="auto">
                     <a:xfrm>
                       <a:off x="0" y="0"/>
-                      <a:ext cx="5334000" cy="4760653"/>
+                      <a:ext cx="5334000" cy="4756265"/>
                     </a:xfrm>
                     <a:prstGeom prst="rect">
                       <a:avLst/>
@@ -2801,9 +2801,9 @@
         <w:t xml:space="preserve">The paper closes where it began. The gap was never the model, which has been published for two decades, but an open, runnable pairing of model and parameters. Hephaestus supplies both halves under open licenses and puts them behind a browser page that asks nothing of its user. The claims are checkable end to end. Release v0.4.0 archives the exact version described, and the 104-test suite reruns the pycalphad comparisons on any machine. The worked examples print the figures shown, and every parameter in every shipped database traces to a published measurement through its provenance file. A reader who doubts a number can recalculate it; one who needs a system that is missing can build it with the same open tools, or ask.</w:t>
       </w:r>
     </w:p>
-    <w:bookmarkEnd w:id="1226"/>
-    <w:bookmarkEnd w:id="1227"/>
-    <w:bookmarkStart w:id="1228" w:name="data-availability"/>
+    <w:bookmarkEnd w:id="1263"/>
+    <w:bookmarkEnd w:id="1264"/>
+    <w:bookmarkStart w:id="1265" w:name="data-availability"/>
     <w:p>
       <w:pPr>
         <w:pStyle w:val="Heading2"/>
@@ -2820,8 +2820,8 @@
         <w:t xml:space="preserve">The engine, the database, the browser application, and the validation suite are openly available in the code repository listed above; the version described here is archived as release v0.4.0. The database files and their provenance records are in the repository’s data directory under CC BY 4.0.</w:t>
       </w:r>
     </w:p>
-    <w:bookmarkEnd w:id="1228"/>
-    <w:bookmarkStart w:id="1229" w:name="acknowledgements"/>
+    <w:bookmarkEnd w:id="1265"/>
+    <w:bookmarkStart w:id="1266" w:name="acknowledgements"/>
     <w:p>
       <w:pPr>
         <w:pStyle w:val="Heading2"/>
@@ -2838,8 +2838,8 @@
         <w:t xml:space="preserve">During the development of this software the author used Claude Code (Anthropic) to assist with implementation, validation scripting, and manuscript preparation. This assistance was agentic, not autonomous: it operated under author direction and supervision at every step and was never a closed loop that produced or accepted results without review. Every parameter was traced by the author to its primary source before entering the database, and every reference was verified against its registry record. The author reviewed and approved all output and takes full responsibility for this article.</w:t>
       </w:r>
     </w:p>
-    <w:bookmarkEnd w:id="1229"/>
-    <w:bookmarkStart w:id="1230" w:name="funding-statement"/>
+    <w:bookmarkEnd w:id="1266"/>
+    <w:bookmarkStart w:id="1267" w:name="funding-statement"/>
     <w:p>
       <w:pPr>
         <w:pStyle w:val="Heading2"/>
@@ -2856,8 +2856,8 @@
         <w:t xml:space="preserve">The development of this software received no external funding.</w:t>
       </w:r>
     </w:p>
-    <w:bookmarkEnd w:id="1230"/>
-    <w:bookmarkStart w:id="1231" w:name="competing-interests"/>
+    <w:bookmarkEnd w:id="1267"/>
+    <w:bookmarkStart w:id="1268" w:name="competing-interests"/>
     <w:p>
       <w:pPr>
         <w:pStyle w:val="Heading2"/>
@@ -2874,8 +2874,8 @@
         <w:t xml:space="preserve">The author founded Odinzen LLC, which provides commercial thermodynamic modeling services, and declares this as a competing interest. The software and database published here are released in full under open licenses, and no proprietary Odinzen assets are included.</w:t>
       </w:r>
     </w:p>
-    <w:bookmarkEnd w:id="1231"/>
-    <w:bookmarkStart w:id="1232" w:name="references"/>
+    <w:bookmarkEnd w:id="1268"/>
+    <w:bookmarkStart w:id="1269" w:name="references"/>
     <w:p>
       <w:pPr>
         <w:pStyle w:val="Heading2"/>
@@ -3216,8 +3216,8 @@
         <w:t xml:space="preserve">[40] Dinsdale AT. SGTE data for pure elements. Calphad. 1991 Oct;15(4):317-425. doi:10.1016/0364-5916(91)90030-N</w:t>
       </w:r>
     </w:p>
-    <w:bookmarkEnd w:id="1232"/>
-    <w:bookmarkEnd w:id="1233"/>
+    <w:bookmarkEnd w:id="1269"/>
+    <w:bookmarkEnd w:id="1270"/>
     <w:sectPr>
       <w:footnotePr>
         <w:numRestart w:val="eachSect"/>

</xml_diff>

<commit_message>
Final Kristina pass: fig 5 caption calculated not computed, 109-word six-tools sentence split into five, conclusion opens on substance not a bookend, two show-don't-announce and colon-joiner touches in Reuse
Co-Authored-By: Claude Opus 4.8 <noreply@anthropic.com>
</commit_message>
<xml_diff>
--- a/paper/Bustamante_Hephaestus_JORS_manuscript.docx
+++ b/paper/Bustamante_Hephaestus_JORS_manuscript.docx
@@ -2,7 +2,7 @@
 <file path=word/document.xml><?xml version="1.0" encoding="utf-8"?>
 <w:document xmlns:w="http://schemas.openxmlformats.org/wordprocessingml/2006/main" xmlns:m="http://schemas.openxmlformats.org/officeDocument/2006/math" xmlns:r="http://schemas.openxmlformats.org/officeDocument/2006/relationships" xmlns:o="urn:schemas-microsoft-com:office:office" xmlns:v="urn:schemas-microsoft-com:vml" xmlns:w10="urn:schemas-microsoft-com:office:word" xmlns:a="http://schemas.openxmlformats.org/drawingml/2006/main" xmlns:pic="http://schemas.openxmlformats.org/drawingml/2006/picture" xmlns:wp="http://schemas.openxmlformats.org/drawingml/2006/wordprocessingDrawing">
   <w:body>
-    <w:bookmarkStart w:id="1270" w:name="X4855b1162e70238fd839d871e0792397dc58430"/>
+    <w:bookmarkStart w:id="1307" w:name="X4855b1162e70238fd839d871e0792397dc58430"/>
     <w:p>
       <w:pPr>
         <w:pStyle w:val="Heading1"/>
@@ -159,7 +159,7 @@
         <w:t xml:space="preserve">CALPHAD; molten slag; molten salt; modified quasichemical model; thermodynamic database; phase diagram; WebAssembly; open data</w:t>
       </w:r>
     </w:p>
-    <w:bookmarkStart w:id="1245" w:name="overview"/>
+    <w:bookmarkStart w:id="1282" w:name="overview"/>
     <w:p>
       <w:pPr>
         <w:pStyle w:val="Heading2"/>
@@ -168,7 +168,7 @@
         <w:t xml:space="preserve">(1) Overview</w:t>
       </w:r>
     </w:p>
-    <w:bookmarkStart w:id="1232" w:name="introduction"/>
+    <w:bookmarkStart w:id="1269" w:name="introduction"/>
     <w:p>
       <w:pPr>
         <w:pStyle w:val="Heading3"/>
@@ -548,8 +548,8 @@
         <w:t xml:space="preserve">Hephaestus is a deliberate response to that gap, and it treats the engine and the data as one contribution because neither is useful alone. The engine is small on purpose. Its core is plain C with no dependencies, which makes it easy to embed and lets the identical code compile to WebAssembly, so the full calculator runs in a web browser with nothing installed and no data leaving the user’s machine. The database is open on purpose. Every parameter in it derives from published measurements, each value carries its provenance down to table and page, and the known shortcomings are documented next to the numbers they affect. The present work describes both, their validation against pycalphad and against measured phase equilibria, and the ways they can be reused. None of it asks the reader to program. For the experimentalist who never writes code, the browser application is the entire product: a page to open, a database to click, and a diagram to read. The sections that follow describe the machinery underneath for those who want it. Supplementary Material S1 is a plain-language primer for the non-programmer, starting at what a database file is and ending at a first calculation and how to read it. Its closing section teaches what an assessment is built from, so a reader who wants to contribute data for open publication, or to commission a file, arrives knowing what is needed.</w:t>
       </w:r>
     </w:p>
-    <w:bookmarkEnd w:id="1232"/>
-    <w:bookmarkStart w:id="1242" w:name="implementation-and-architecture"/>
+    <w:bookmarkEnd w:id="1269"/>
+    <w:bookmarkStart w:id="1279" w:name="implementation-and-architecture"/>
     <w:p>
       <w:pPr>
         <w:pStyle w:val="Heading3"/>
@@ -575,18 +575,18 @@
           <wp:inline>
             <wp:extent cx="5334000" cy="3511167"/>
             <wp:effectExtent b="0" l="0" r="0" t="0"/>
-            <wp:docPr descr="Figure 1: Architecture of Hephaestus. A single dependency-free C core reads the field’s three database dialects (ChemSage .dat, Thermo-Calc .tdb with the Inden magnetic model, and the unified .utdb) and calculates all thermodynamics; the same core is used as a native library, from Python through cffi, and compiled to WebAssembly behind the browser application. dbbuild writes new ChemSage files from measured data, and every energy path is validated against pycalphad." title="" id="1234" name="Picture"/>
+            <wp:docPr descr="Figure 1: Architecture of Hephaestus. A single dependency-free C core reads the field’s three database dialects (ChemSage .dat, Thermo-Calc .tdb with the Inden magnetic model, and the unified .utdb) and calculates all thermodynamics; the same core is used as a native library, from Python through cffi, and compiled to WebAssembly behind the browser application. dbbuild writes new ChemSage files from measured data, and every energy path is validated against pycalphad." title="" id="1271" name="Picture"/>
             <a:graphic>
               <a:graphicData uri="http://schemas.openxmlformats.org/drawingml/2006/picture">
                 <pic:pic>
                   <pic:nvPicPr>
-                    <pic:cNvPr descr="figures/fig1_architecture.png" id="1235" name="Picture"/>
+                    <pic:cNvPr descr="figures/fig1_architecture.png" id="1272" name="Picture"/>
                     <pic:cNvPicPr>
                       <a:picLocks noChangeArrowheads="1" noChangeAspect="1"/>
                     </pic:cNvPicPr>
                   </pic:nvPicPr>
                   <pic:blipFill>
-                    <a:blip r:embed="rId1233"/>
+                    <a:blip r:embed="rId1270"/>
                     <a:stretch>
                       <a:fillRect/>
                     </a:stretch>
@@ -769,7 +769,7 @@
         <w:pStyle w:val="BodyText"/>
       </w:pPr>
       <w:r>
-        <w:t xml:space="preserve">The browser application, hosted at https://odinzen.github.io/hephaestus-mqmqa-public/, exposes six tools: a calculator over any loaded database (ChemSage .dat or Thermo-Calc .tdb, auto-detected, with up to three uploaded files held per session), a binary join phase-diagram tool with tap-to-read point comparison, a Scheil-Gulliver solidification panel on the same join with the equilibrium lever-rule path drawn alongside, a viewer for the assessed FeO-MgO-SiO</w:t>
+        <w:t xml:space="preserve">The browser application, hosted at https://odinzen.github.io/hephaestus-mqmqa-public/, exposes six tools. A calculator works over any loaded database (ChemSage .dat or Thermo-Calc .tdb, auto-detected, with up to three uploaded files held per session). A binary-join phase-diagram tool offers tap-to-read point comparison, and a Scheil-Gulliver solidification panel on the same join draws the equilibrium lever-rule path alongside. A viewer shows the assessed FeO-MgO-SiO</w:t>
       </w:r>
       <w:r>
         <w:rPr>
@@ -781,7 +781,7 @@
         <w:t xml:space="preserve"> </w:t>
       </w:r>
       <w:r>
-        <w:t xml:space="preserve">diagrams, a live isothermal-section solver that calculates the full phase assemblage at a chosen temperature in about a second, for the shipped ternaries or for any loaded three-cation file (Figure 2), and an interactive eutectic builder whose component names, melting points, and fusion enthalpies pre-fill from the loaded database. Loading an alloy TDB reshapes the workspace: the elements become the end members and every compound energy formalism phase spanning the join enters the same convex hull construction. Everything runs client side. The page holds a strict content security policy, escapes all file-derived strings, makes no third-party requests, and never transmits a loaded file, which matters to industrial users whose compositions are confidential.</w:t>
+        <w:t xml:space="preserve">diagrams, and a live isothermal-section solver calculates the full phase assemblage at a chosen temperature in about a second, for the shipped ternaries or for any loaded three-cation file (Figure 2). An interactive eutectic builder pre-fills its component names, melting points, and fusion enthalpies from the loaded database. Loading an alloy TDB reshapes the workspace: the elements become the end members and every compound energy formalism phase spanning the join enters the same convex hull construction. Everything runs client side. The page holds a strict content security policy, escapes all file-derived strings, makes no third-party requests, and never transmits a loaded file, which matters to industrial users whose compositions are confidential.</w:t>
       </w:r>
     </w:p>
     <w:p>
@@ -793,18 +793,18 @@
           <wp:inline>
             <wp:extent cx="4754880" cy="4464799"/>
             <wp:effectExtent b="0" l="0" r="0" t="0"/>
-            <wp:docPr descr="Figure 2: The live solver in the browser application (light theme). The user loads the shipped database, picks a temperature, and presses Compute; the WebAssembly engine then solves the full FeO-MgO-SiO2 phase assemblage client side (here 1023 composition samples and 512 tie-facets in under half a second). Tapping a composition reads its stable phases and pins it to a comparison list; hovering previews on desktop." title="" id="1237" name="Picture"/>
+            <wp:docPr descr="Figure 2: The live solver in the browser application (light theme). The user loads the shipped database, picks a temperature, and presses Compute; the WebAssembly engine then solves the full FeO-MgO-SiO2 phase assemblage client side (here 1023 composition samples and 512 tie-facets in under half a second). Tapping a composition reads its stable phases and pins it to a comparison list; hovering previews on desktop." title="" id="1274" name="Picture"/>
             <a:graphic>
               <a:graphicData uri="http://schemas.openxmlformats.org/drawingml/2006/picture">
                 <pic:pic>
                   <pic:nvPicPr>
-                    <pic:cNvPr descr="figures/fig2_browser_app.png" id="1238" name="Picture"/>
+                    <pic:cNvPr descr="figures/fig2_browser_app.png" id="1275" name="Picture"/>
                     <pic:cNvPicPr>
                       <a:picLocks noChangeArrowheads="1" noChangeAspect="1"/>
                     </pic:cNvPicPr>
                   </pic:nvPicPr>
                   <pic:blipFill>
-                    <a:blip r:embed="rId1236"/>
+                    <a:blip r:embed="rId1273"/>
                     <a:stretch>
                       <a:fillRect/>
                     </a:stretch>
@@ -970,18 +970,18 @@
           <wp:inline>
             <wp:extent cx="5334000" cy="2197297"/>
             <wp:effectExtent b="0" l="0" r="0" t="0"/>
-            <wp:docPr descr="Figure 3: The assessed FeO-MgO-SiO2 system calculated from the shipped database files. (a) Liquidus projection: primary crystallizing phase fields, with liquidus isotherms labeled in °C. (b) Isothermal section at 1600 °C: stable phase assemblages, shaded by the number of solid phases present. Phase labels: L liquid, Crs cristobalite, Ol olivine, Opx orthopyroxene, Per periclase, Wus wustite." title="" id="1240" name="Picture"/>
+            <wp:docPr descr="Figure 3: The assessed FeO-MgO-SiO2 system calculated from the shipped database files. (a) Liquidus projection: primary crystallizing phase fields, with liquidus isotherms labeled in °C. (b) Isothermal section at 1600 °C: stable phase assemblages, shaded by the number of solid phases present. Phase labels: L liquid, Crs cristobalite, Ol olivine, Opx orthopyroxene, Per periclase, Wus wustite." title="" id="1277" name="Picture"/>
             <a:graphic>
               <a:graphicData uri="http://schemas.openxmlformats.org/drawingml/2006/picture">
                 <pic:pic>
                   <pic:nvPicPr>
-                    <pic:cNvPr descr="figures/fig3_ternary.png" id="1241" name="Picture"/>
+                    <pic:cNvPr descr="figures/fig3_ternary.png" id="1278" name="Picture"/>
                     <pic:cNvPicPr>
                       <a:picLocks noChangeArrowheads="1" noChangeAspect="1"/>
                     </pic:cNvPicPr>
                   </pic:nvPicPr>
                   <pic:blipFill>
-                    <a:blip r:embed="rId1239"/>
+                    <a:blip r:embed="rId1276"/>
                     <a:stretch>
                       <a:fillRect/>
                     </a:stretch>
@@ -1371,8 +1371,8 @@
         </w:tc>
       </w:tr>
     </w:tbl>
-    <w:bookmarkEnd w:id="1242"/>
-    <w:bookmarkStart w:id="1243" w:name="anatomy-of-a-database-file"/>
+    <w:bookmarkEnd w:id="1279"/>
+    <w:bookmarkStart w:id="1280" w:name="anatomy-of-a-database-file"/>
     <w:p>
       <w:pPr>
         <w:pStyle w:val="Heading3"/>
@@ -1405,8 +1405,8 @@
         <w:t xml:space="preserve">That asymmetry is the economics of the field in miniature: implementations of the published models are increasingly available, but each fitted parameter condenses dozens of measurements and decisions. Parameter sets rather than codes are therefore the scarce commodity, and an openly licensed, provenance-tracked database is the part of this contribution that cannot be regenerated from the paper alone.</w:t>
       </w:r>
     </w:p>
-    <w:bookmarkEnd w:id="1243"/>
-    <w:bookmarkStart w:id="1244" w:name="quality-control"/>
+    <w:bookmarkEnd w:id="1280"/>
+    <w:bookmarkStart w:id="1281" w:name="quality-control"/>
     <w:p>
       <w:pPr>
         <w:pStyle w:val="Heading3"/>
@@ -1927,9 +1927,9 @@
         <w:t xml:space="preserve">invariants sit within about 40 °C, and the ternary liquidus projection reproduces the measured field topology [24]. Development practice is plain: the repository is version controlled with tagged releases (v0.1.0 through the v0.4.0 described here), the full suite runs before every release, and a fixed bug lands together with the regression test that would have caught it. The suite runs on Windows 11 under CPython 3.11 and 3.12; the browser application is exercised in Chromium- and Gecko-based browsers. A user can confirm a working installation by running pytest against the bundled test databases, or with no installation at all by opening the web application and loading the shipped ternary database.</w:t>
       </w:r>
     </w:p>
-    <w:bookmarkEnd w:id="1244"/>
-    <w:bookmarkEnd w:id="1245"/>
-    <w:bookmarkStart w:id="1253" w:name="availability"/>
+    <w:bookmarkEnd w:id="1281"/>
+    <w:bookmarkEnd w:id="1282"/>
+    <w:bookmarkStart w:id="1290" w:name="availability"/>
     <w:p>
       <w:pPr>
         <w:pStyle w:val="Heading2"/>
@@ -1938,7 +1938,7 @@
         <w:t xml:space="preserve">(2) Availability</w:t>
       </w:r>
     </w:p>
-    <w:bookmarkStart w:id="1246" w:name="operating-system"/>
+    <w:bookmarkStart w:id="1283" w:name="operating-system"/>
     <w:p>
       <w:pPr>
         <w:pStyle w:val="Heading3"/>
@@ -1955,8 +1955,8 @@
         <w:t xml:space="preserve">Platform independent. The core builds with any C99 compiler; development and testing used Windows 11. The browser application runs in any current browser with WebAssembly support.</w:t>
       </w:r>
     </w:p>
-    <w:bookmarkEnd w:id="1246"/>
-    <w:bookmarkStart w:id="1247" w:name="programming-language"/>
+    <w:bookmarkEnd w:id="1283"/>
+    <w:bookmarkStart w:id="1284" w:name="programming-language"/>
     <w:p>
       <w:pPr>
         <w:pStyle w:val="Heading3"/>
@@ -1973,8 +1973,8 @@
         <w:t xml:space="preserve">C (core), Python 3.11 or later (interface and fitting tools), JavaScript (browser application).</w:t>
       </w:r>
     </w:p>
-    <w:bookmarkEnd w:id="1247"/>
-    <w:bookmarkStart w:id="1248" w:name="additional-system-requirements"/>
+    <w:bookmarkEnd w:id="1284"/>
+    <w:bookmarkStart w:id="1285" w:name="additional-system-requirements"/>
     <w:p>
       <w:pPr>
         <w:pStyle w:val="Heading3"/>
@@ -1991,8 +1991,8 @@
         <w:t xml:space="preserve">None of note. The engine and database together are a few megabytes.</w:t>
       </w:r>
     </w:p>
-    <w:bookmarkEnd w:id="1248"/>
-    <w:bookmarkStart w:id="1249" w:name="dependencies"/>
+    <w:bookmarkEnd w:id="1285"/>
+    <w:bookmarkStart w:id="1286" w:name="dependencies"/>
     <w:p>
       <w:pPr>
         <w:pStyle w:val="Heading3"/>
@@ -2009,8 +2009,8 @@
         <w:t xml:space="preserve">Python interface: cffi, NumPy, SciPy (developed and tested with cffi 2.0, NumPy 2.4, and SciPy 1.17). The validation suite additionally requires pycalphad; every oracle comparison reported here ran against pycalphad 0.11.1, and the tests that read pycalphad’s own shipped test databases skip cleanly if a later version relocates them. The WebAssembly build requires emscripten. The C core and the browser application have no dependencies.</w:t>
       </w:r>
     </w:p>
-    <w:bookmarkEnd w:id="1249"/>
-    <w:bookmarkStart w:id="1250" w:name="list-of-contributors"/>
+    <w:bookmarkEnd w:id="1286"/>
+    <w:bookmarkStart w:id="1287" w:name="list-of-contributors"/>
     <w:p>
       <w:pPr>
         <w:pStyle w:val="Heading3"/>
@@ -2027,8 +2027,8 @@
         <w:t xml:space="preserve">Michael E. Bustamante (design, implementation, validation, data curation).</w:t>
       </w:r>
     </w:p>
-    <w:bookmarkEnd w:id="1250"/>
-    <w:bookmarkStart w:id="1251" w:name="software-location"/>
+    <w:bookmarkEnd w:id="1287"/>
+    <w:bookmarkStart w:id="1288" w:name="software-location"/>
     <w:p>
       <w:pPr>
         <w:pStyle w:val="Heading3"/>
@@ -2181,8 +2181,8 @@
         <w:t xml:space="preserve">Date published: 2026-09-02</w:t>
       </w:r>
     </w:p>
-    <w:bookmarkEnd w:id="1251"/>
-    <w:bookmarkStart w:id="1252" w:name="language"/>
+    <w:bookmarkEnd w:id="1288"/>
+    <w:bookmarkStart w:id="1289" w:name="language"/>
     <w:p>
       <w:pPr>
         <w:pStyle w:val="Heading3"/>
@@ -2199,9 +2199,9 @@
         <w:t xml:space="preserve">English.</w:t>
       </w:r>
     </w:p>
-    <w:bookmarkEnd w:id="1252"/>
-    <w:bookmarkEnd w:id="1253"/>
-    <w:bookmarkStart w:id="1264" w:name="reuse-potential"/>
+    <w:bookmarkEnd w:id="1289"/>
+    <w:bookmarkEnd w:id="1290"/>
+    <w:bookmarkStart w:id="1301" w:name="reuse-potential"/>
     <w:p>
       <w:pPr>
         <w:pStyle w:val="Heading2"/>
@@ -2215,7 +2215,7 @@
         <w:pStyle w:val="FirstParagraph"/>
       </w:pPr>
       <w:r>
-        <w:t xml:space="preserve">The nearest reuse is interoperation, and it is concrete. Every database in the repository’s data directory is a standard ChemSage file: pycalphad opens the same files this engine ships, files written by dbbuild load in both tools, and the test suite enforces that compatibility on every run, so a group already working in pycalphad can adopt the databases alone and ignore the engine. The reverse path holds too: a TDB an OpenCalphad or Thermo-Calc user already has loads in the browser unchanged, within the documented subset. A group that needs an embeddable solver can take the C core, two source directories of C99 with no dependencies, compiled by any C compiler. Its flat application binary interface (ABI) covers database reading, phase and parameter access, Gibbs evaluation, and liquid equilibration, callable from C, Python, or anything with a C foreign-function interface. The WebAssembly build is that same ABI passed through emscripten. Adopting uTDB is a reuse path of its own: the open specification together with the three shipped demonstration files and their round-trip suites amounts to a conformance kit for any implementation that wants to carry MQMQA inside TDB grammar.</w:t>
+        <w:t xml:space="preserve">The nearest reuse is interoperation. Every database in the repository’s data directory is a standard ChemSage file: pycalphad opens the same files this engine ships, files written by dbbuild load in both tools, and the test suite enforces that compatibility on every run, so a group already working in pycalphad can adopt the databases alone and ignore the engine. The reverse path holds too. A TDB an OpenCalphad or Thermo-Calc user already has loads in the browser unchanged, within the documented subset. A group that needs an embeddable solver can take the C core, two source directories of C99 with no dependencies, compiled by any C compiler. Its flat application binary interface (ABI) covers database reading, phase and parameter access, Gibbs evaluation, and liquid equilibration, callable from C, Python, or anything with a C foreign-function interface. The WebAssembly build is that same ABI passed through emscripten. Adopting uTDB is a reuse path of its own: the open specification together with the three shipped demonstration files and their round-trip suites amounts to a conformance kit for any implementation that wants to carry MQMQA inside TDB grammar.</w:t>
       </w:r>
     </w:p>
     <w:p>
@@ -2226,7 +2226,7 @@
         <w:t xml:space="preserve">The browser application makes the lowest barrier the default. A lecture on slag thermodynamics, a plant metallurgist screening a composition, or a reviewer checking a claimed equilibrium can load the database and calculate in seconds, with confidential inputs never leaving the machine. The same property makes it a practical template for other groups who want to publish a model as a zero-install tool.</w:t>
       </w:r>
     </w:p>
-    <w:bookmarkStart w:id="1263" w:name="worked-examples"/>
+    <w:bookmarkStart w:id="1300" w:name="worked-examples"/>
     <w:p>
       <w:pPr>
         <w:pStyle w:val="Heading3"/>
@@ -2438,18 +2438,18 @@
           <wp:inline>
             <wp:extent cx="4206240" cy="3262561"/>
             <wp:effectExtent b="0" l="0" r="0" t="0"/>
-            <wp:docPr descr="Figure 4: The LiCl-KCl phase diagram calculated by the salt listing from the shipped open database, at the listing’s own step size. Light to dark: liquid, two-phase, and subsolidus fields. The dot is the calculated eutectic at this step size (0.400, 640 K); the star is the measured eutectic (0.415, 626 K)." title="" id="1255" name="Picture"/>
+            <wp:docPr descr="Figure 4: The LiCl-KCl phase diagram calculated by the salt listing from the shipped open database, at the listing’s own step size. Light to dark: liquid, two-phase, and subsolidus fields. The dot is the calculated eutectic at this step size (0.400, 640 K); the star is the measured eutectic (0.415, 626 K)." title="" id="1292" name="Picture"/>
             <a:graphic>
               <a:graphicData uri="http://schemas.openxmlformats.org/drawingml/2006/picture">
                 <pic:pic>
                   <pic:nvPicPr>
-                    <pic:cNvPr descr="figures/fig4_salt_example.png" id="1256" name="Picture"/>
+                    <pic:cNvPr descr="figures/fig4_salt_example.png" id="1293" name="Picture"/>
                     <pic:cNvPicPr>
                       <a:picLocks noChangeArrowheads="1" noChangeAspect="1"/>
                     </pic:cNvPicPr>
                   </pic:nvPicPr>
                   <pic:blipFill>
-                    <a:blip r:embed="rId1254"/>
+                    <a:blip r:embed="rId1291"/>
                     <a:stretch>
                       <a:fillRect/>
                     </a:stretch>
@@ -2684,18 +2684,18 @@
           <wp:inline>
             <wp:extent cx="4206240" cy="3262561"/>
             <wp:effectExtent b="0" l="0" r="0" t="0"/>
-            <wp:docPr descr="Figure 5: The Al-Zn phase diagram computed by the alloy listing from the shipped open TDB. Light to dark: liquid, liquid plus solid, and solid fields. The dot is the calculated eutectic (0.890, 660 K); the star is the assessed eutectic (0.885, 654 K)." title="" id="1258" name="Picture"/>
+            <wp:docPr descr="Figure 5: The Al-Zn phase diagram calculated by the alloy listing from the shipped open TDB. Light to dark: liquid, liquid plus solid, and solid fields. The dot is the calculated eutectic (0.890, 660 K); the star is the assessed eutectic (0.885, 654 K)." title="" id="1295" name="Picture"/>
             <a:graphic>
               <a:graphicData uri="http://schemas.openxmlformats.org/drawingml/2006/picture">
                 <pic:pic>
                   <pic:nvPicPr>
-                    <pic:cNvPr descr="figures/fig5_alloy_example.png" id="1259" name="Picture"/>
+                    <pic:cNvPr descr="figures/fig5_alloy_example.png" id="1296" name="Picture"/>
                     <pic:cNvPicPr>
                       <a:picLocks noChangeArrowheads="1" noChangeAspect="1"/>
                     </pic:cNvPicPr>
                   </pic:nvPicPr>
                   <pic:blipFill>
-                    <a:blip r:embed="rId1257"/>
+                    <a:blip r:embed="rId1294"/>
                     <a:stretch>
                       <a:fillRect/>
                     </a:stretch>
@@ -2727,7 +2727,7 @@
         <w:pStyle w:val="ImageCaption"/>
       </w:pPr>
       <w:r>
-        <w:t xml:space="preserve">Figure 5: The Al-Zn phase diagram computed by the alloy listing from the shipped open TDB. Light to dark: liquid, liquid plus solid, and solid fields. The dot is the calculated eutectic (0.890, 660 K); the star is the assessed eutectic (0.885, 654 K).</w:t>
+        <w:t xml:space="preserve">Figure 5: The Al-Zn phase diagram calculated by the alloy listing from the shipped open TDB. Light to dark: liquid, liquid plus solid, and solid fields. The dot is the calculated eutectic (0.890, 660 K); the star is the assessed eutectic (0.885, 654 K).</w:t>
       </w:r>
     </w:p>
     <w:p>
@@ -2747,18 +2747,18 @@
           <wp:inline>
             <wp:extent cx="5334000" cy="4756265"/>
             <wp:effectExtent b="0" l="0" r="0" t="0"/>
-            <wp:docPr descr="Figure 6: One unified (.utdb) file, two physics, calculated in the browser. (a) The steelmaking database loaded with the Melt/Alloy view toggle on Alloy; the engine calculates the Fe-C phase diagram through the magnetic compound energy formalism, with two tapped compositions pinned. (b) Scheil solidification for the same join at 4 mol% C, first solid at 1739 K and the residual liquid frozen by 1436 K, against the equilibrium lever-rule path (dashed). The file’s slag half is a Modified Quasichemical Model liquid; no legacy container holds both models at once." title="" id="1261" name="Picture"/>
+            <wp:docPr descr="Figure 6: One unified (.utdb) file, two physics, calculated in the browser. (a) The steelmaking database loaded with the Melt/Alloy view toggle on Alloy; the engine calculates the Fe-C phase diagram through the magnetic compound energy formalism, with two tapped compositions pinned. (b) Scheil solidification for the same join at 4 mol% C, first solid at 1739 K and the residual liquid frozen by 1436 K, against the equilibrium lever-rule path (dashed). The file’s slag half is a Modified Quasichemical Model liquid; no legacy container holds both models at once." title="" id="1298" name="Picture"/>
             <a:graphic>
               <a:graphicData uri="http://schemas.openxmlformats.org/drawingml/2006/picture">
                 <pic:pic>
                   <pic:nvPicPr>
-                    <pic:cNvPr descr="figures/fig6_utdb_steel.png" id="1262" name="Picture"/>
+                    <pic:cNvPr descr="figures/fig6_utdb_steel.png" id="1299" name="Picture"/>
                     <pic:cNvPicPr>
                       <a:picLocks noChangeArrowheads="1" noChangeAspect="1"/>
                     </pic:cNvPicPr>
                   </pic:nvPicPr>
                   <pic:blipFill>
-                    <a:blip r:embed="rId1260"/>
+                    <a:blip r:embed="rId1297"/>
                     <a:stretch>
                       <a:fillRect/>
                     </a:stretch>
@@ -2798,12 +2798,12 @@
         <w:pStyle w:val="BodyText"/>
       </w:pPr>
       <w:r>
-        <w:t xml:space="preserve">The paper closes where it began. The gap was never the model, which has been published for two decades, but an open, runnable pairing of model and parameters. Hephaestus supplies both halves under open licenses and puts them behind a browser page that asks nothing of its user. The claims are checkable end to end. Release v0.4.0 archives the exact version described, and the 104-test suite reruns the pycalphad comparisons on any machine. The worked examples print the figures shown, and every parameter in every shipped database traces to a published measurement through its provenance file. A reader who doubts a number can recalculate it; one who needs a system that is missing can build it with the same open tools, or ask.</w:t>
-      </w:r>
-    </w:p>
-    <w:bookmarkEnd w:id="1263"/>
-    <w:bookmarkEnd w:id="1264"/>
-    <w:bookmarkStart w:id="1265" w:name="data-availability"/>
+        <w:t xml:space="preserve">The gap this work addresses was never the model, which has been published for two decades, but an open, runnable pairing of model and parameters. Hephaestus supplies both halves under open licenses and puts them behind a browser page that asks nothing of its user. The claims are checkable end to end. Release v0.4.0 archives the exact version described, and the 104-test suite reruns the pycalphad comparisons on any machine. The worked examples print the figures shown, and every parameter in every shipped database traces to a published measurement through its provenance file. A reader who doubts a number can recalculate it; one who needs a system that is missing can build it with the same open tools, or ask.</w:t>
+      </w:r>
+    </w:p>
+    <w:bookmarkEnd w:id="1300"/>
+    <w:bookmarkEnd w:id="1301"/>
+    <w:bookmarkStart w:id="1302" w:name="data-availability"/>
     <w:p>
       <w:pPr>
         <w:pStyle w:val="Heading2"/>
@@ -2820,8 +2820,8 @@
         <w:t xml:space="preserve">The engine, the database, the browser application, and the validation suite are openly available in the code repository listed above; the version described here is archived as release v0.4.0. The database files and their provenance records are in the repository’s data directory under CC BY 4.0.</w:t>
       </w:r>
     </w:p>
-    <w:bookmarkEnd w:id="1265"/>
-    <w:bookmarkStart w:id="1266" w:name="acknowledgements"/>
+    <w:bookmarkEnd w:id="1302"/>
+    <w:bookmarkStart w:id="1303" w:name="acknowledgements"/>
     <w:p>
       <w:pPr>
         <w:pStyle w:val="Heading2"/>
@@ -2838,8 +2838,8 @@
         <w:t xml:space="preserve">During the development of this software the author used Claude Code (Anthropic) to assist with implementation, validation scripting, and manuscript preparation. This assistance was agentic, not autonomous: it operated under author direction and supervision at every step and was never a closed loop that produced or accepted results without review. Every parameter was traced by the author to its primary source before entering the database, and every reference was verified against its registry record. The author reviewed and approved all output and takes full responsibility for this article.</w:t>
       </w:r>
     </w:p>
-    <w:bookmarkEnd w:id="1266"/>
-    <w:bookmarkStart w:id="1267" w:name="funding-statement"/>
+    <w:bookmarkEnd w:id="1303"/>
+    <w:bookmarkStart w:id="1304" w:name="funding-statement"/>
     <w:p>
       <w:pPr>
         <w:pStyle w:val="Heading2"/>
@@ -2856,8 +2856,8 @@
         <w:t xml:space="preserve">The development of this software received no external funding.</w:t>
       </w:r>
     </w:p>
-    <w:bookmarkEnd w:id="1267"/>
-    <w:bookmarkStart w:id="1268" w:name="competing-interests"/>
+    <w:bookmarkEnd w:id="1304"/>
+    <w:bookmarkStart w:id="1305" w:name="competing-interests"/>
     <w:p>
       <w:pPr>
         <w:pStyle w:val="Heading2"/>
@@ -2874,8 +2874,8 @@
         <w:t xml:space="preserve">The author founded Odinzen LLC, which provides commercial thermodynamic modeling services, and declares this as a competing interest. The software and database published here are released in full under open licenses, and no proprietary Odinzen assets are included.</w:t>
       </w:r>
     </w:p>
-    <w:bookmarkEnd w:id="1268"/>
-    <w:bookmarkStart w:id="1269" w:name="references"/>
+    <w:bookmarkEnd w:id="1305"/>
+    <w:bookmarkStart w:id="1306" w:name="references"/>
     <w:p>
       <w:pPr>
         <w:pStyle w:val="Heading2"/>
@@ -3216,8 +3216,8 @@
         <w:t xml:space="preserve">[40] Dinsdale AT. SGTE data for pure elements. Calphad. 1991 Oct;15(4):317-425. doi:10.1016/0364-5916(91)90030-N</w:t>
       </w:r>
     </w:p>
-    <w:bookmarkEnd w:id="1269"/>
-    <w:bookmarkEnd w:id="1270"/>
+    <w:bookmarkEnd w:id="1306"/>
+    <w:bookmarkEnd w:id="1307"/>
     <w:sectPr>
       <w:footnotePr>
         <w:numRestart w:val="eachSect"/>

</xml_diff>

<commit_message>
Fold validated gas-phase equilibria into the work: NASA-polynomial ideal-gas solver (Cantera oracle, 1e-10) described in the paper honestly scoped as library-level with browser and coupling as stated next steps; uTDB spec gains the :G ideal-gas phase (four models in one container); three registry/hand-verified references (Cantera DOI, NASA/TP-2002-211556, GRI-Mech 3.0); S1 scope updated; 43 refs, suite 109
Co-Authored-By: Claude Opus 4.8 <noreply@anthropic.com>
</commit_message>
<xml_diff>
--- a/paper/Bustamante_Hephaestus_JORS_manuscript.docx
+++ b/paper/Bustamante_Hephaestus_JORS_manuscript.docx
@@ -2,7 +2,7 @@
 <file path=word/document.xml><?xml version="1.0" encoding="utf-8"?>
 <w:document xmlns:w="http://schemas.openxmlformats.org/wordprocessingml/2006/main" xmlns:m="http://schemas.openxmlformats.org/officeDocument/2006/math" xmlns:r="http://schemas.openxmlformats.org/officeDocument/2006/relationships" xmlns:o="urn:schemas-microsoft-com:office:office" xmlns:v="urn:schemas-microsoft-com:vml" xmlns:w10="urn:schemas-microsoft-com:office:word" xmlns:a="http://schemas.openxmlformats.org/drawingml/2006/main" xmlns:pic="http://schemas.openxmlformats.org/drawingml/2006/picture" xmlns:wp="http://schemas.openxmlformats.org/drawingml/2006/wordprocessingDrawing">
   <w:body>
-    <w:bookmarkStart w:id="1307" w:name="X4855b1162e70238fd839d871e0792397dc58430"/>
+    <w:bookmarkStart w:id="1381" w:name="X4855b1162e70238fd839d871e0792397dc58430"/>
     <w:p>
       <w:pPr>
         <w:pStyle w:val="Heading1"/>
@@ -159,7 +159,7 @@
         <w:t xml:space="preserve">CALPHAD; molten slag; molten salt; modified quasichemical model; thermodynamic database; phase diagram; WebAssembly; open data</w:t>
       </w:r>
     </w:p>
-    <w:bookmarkStart w:id="1282" w:name="overview"/>
+    <w:bookmarkStart w:id="1356" w:name="overview"/>
     <w:p>
       <w:pPr>
         <w:pStyle w:val="Heading2"/>
@@ -168,7 +168,7 @@
         <w:t xml:space="preserve">(1) Overview</w:t>
       </w:r>
     </w:p>
-    <w:bookmarkStart w:id="1269" w:name="introduction"/>
+    <w:bookmarkStart w:id="1343" w:name="introduction"/>
     <w:p>
       <w:pPr>
         <w:pStyle w:val="Heading3"/>
@@ -548,8 +548,8 @@
         <w:t xml:space="preserve">Hephaestus is a deliberate response to that gap, and it treats the engine and the data as one contribution because neither is useful alone. The engine is small on purpose. Its core is plain C with no dependencies, which makes it easy to embed and lets the identical code compile to WebAssembly, so the full calculator runs in a web browser with nothing installed and no data leaving the user’s machine. The database is open on purpose. Every parameter in it derives from published measurements, each value carries its provenance down to table and page, and the known shortcomings are documented next to the numbers they affect. The present work describes both, their validation against pycalphad and against measured phase equilibria, and the ways they can be reused. None of it asks the reader to program. For the experimentalist who never writes code, the browser application is the entire product: a page to open, a database to click, and a diagram to read. The sections that follow describe the machinery underneath for those who want it. Supplementary Material S1 is a plain-language primer for the non-programmer, starting at what a database file is and ending at a first calculation and how to read it. Its closing section teaches what an assessment is built from, so a reader who wants to contribute data for open publication, or to commission a file, arrives knowing what is needed.</w:t>
       </w:r>
     </w:p>
-    <w:bookmarkEnd w:id="1269"/>
-    <w:bookmarkStart w:id="1279" w:name="implementation-and-architecture"/>
+    <w:bookmarkEnd w:id="1343"/>
+    <w:bookmarkStart w:id="1353" w:name="implementation-and-architecture"/>
     <w:p>
       <w:pPr>
         <w:pStyle w:val="Heading3"/>
@@ -575,18 +575,18 @@
           <wp:inline>
             <wp:extent cx="5334000" cy="3511167"/>
             <wp:effectExtent b="0" l="0" r="0" t="0"/>
-            <wp:docPr descr="Figure 1: Architecture of Hephaestus. A single dependency-free C core reads the field’s three database dialects (ChemSage .dat, Thermo-Calc .tdb with the Inden magnetic model, and the unified .utdb) and calculates all thermodynamics; the same core is used as a native library, from Python through cffi, and compiled to WebAssembly behind the browser application. dbbuild writes new ChemSage files from measured data, and every energy path is validated against pycalphad." title="" id="1271" name="Picture"/>
+            <wp:docPr descr="Figure 1: Architecture of Hephaestus. A single dependency-free C core reads the field’s three database dialects (ChemSage .dat, Thermo-Calc .tdb with the Inden magnetic model, and the unified .utdb) and calculates all thermodynamics; the same core is used as a native library, from Python through cffi, and compiled to WebAssembly behind the browser application. dbbuild writes new ChemSage files from measured data, and every energy path is validated against pycalphad." title="" id="1345" name="Picture"/>
             <a:graphic>
               <a:graphicData uri="http://schemas.openxmlformats.org/drawingml/2006/picture">
                 <pic:pic>
                   <pic:nvPicPr>
-                    <pic:cNvPr descr="figures/fig1_architecture.png" id="1272" name="Picture"/>
+                    <pic:cNvPr descr="figures/fig1_architecture.png" id="1346" name="Picture"/>
                     <pic:cNvPicPr>
                       <a:picLocks noChangeArrowheads="1" noChangeAspect="1"/>
                     </pic:cNvPicPr>
                   </pic:nvPicPr>
                   <pic:blipFill>
-                    <a:blip r:embed="rId1270"/>
+                    <a:blip r:embed="rId1344"/>
                     <a:stretch>
                       <a:fillRect/>
                     </a:stretch>
@@ -793,18 +793,18 @@
           <wp:inline>
             <wp:extent cx="4754880" cy="4464799"/>
             <wp:effectExtent b="0" l="0" r="0" t="0"/>
-            <wp:docPr descr="Figure 2: The live solver in the browser application (light theme). The user loads the shipped database, picks a temperature, and presses Compute; the WebAssembly engine then solves the full FeO-MgO-SiO2 phase assemblage client side (here 1023 composition samples and 512 tie-facets in under half a second). Tapping a composition reads its stable phases and pins it to a comparison list; hovering previews on desktop." title="" id="1274" name="Picture"/>
+            <wp:docPr descr="Figure 2: The live solver in the browser application (light theme). The user loads the shipped database, picks a temperature, and presses Compute; the WebAssembly engine then solves the full FeO-MgO-SiO2 phase assemblage client side (here 1023 composition samples and 512 tie-facets in under half a second). Tapping a composition reads its stable phases and pins it to a comparison list; hovering previews on desktop." title="" id="1348" name="Picture"/>
             <a:graphic>
               <a:graphicData uri="http://schemas.openxmlformats.org/drawingml/2006/picture">
                 <pic:pic>
                   <pic:nvPicPr>
-                    <pic:cNvPr descr="figures/fig2_browser_app.png" id="1275" name="Picture"/>
+                    <pic:cNvPr descr="figures/fig2_browser_app.png" id="1349" name="Picture"/>
                     <pic:cNvPicPr>
                       <a:picLocks noChangeArrowheads="1" noChangeAspect="1"/>
                     </pic:cNvPicPr>
                   </pic:nvPicPr>
                   <pic:blipFill>
-                    <a:blip r:embed="rId1273"/>
+                    <a:blip r:embed="rId1347"/>
                     <a:stretch>
                       <a:fillRect/>
                     </a:stretch>
@@ -970,18 +970,18 @@
           <wp:inline>
             <wp:extent cx="5334000" cy="2197297"/>
             <wp:effectExtent b="0" l="0" r="0" t="0"/>
-            <wp:docPr descr="Figure 3: The assessed FeO-MgO-SiO2 system calculated from the shipped database files. (a) Liquidus projection: primary crystallizing phase fields, with liquidus isotherms labeled in °C. (b) Isothermal section at 1600 °C: stable phase assemblages, shaded by the number of solid phases present. Phase labels: L liquid, Crs cristobalite, Ol olivine, Opx orthopyroxene, Per periclase, Wus wustite." title="" id="1277" name="Picture"/>
+            <wp:docPr descr="Figure 3: The assessed FeO-MgO-SiO2 system calculated from the shipped database files. (a) Liquidus projection: primary crystallizing phase fields, with liquidus isotherms labeled in °C. (b) Isothermal section at 1600 °C: stable phase assemblages, shaded by the number of solid phases present. Phase labels: L liquid, Crs cristobalite, Ol olivine, Opx orthopyroxene, Per periclase, Wus wustite." title="" id="1351" name="Picture"/>
             <a:graphic>
               <a:graphicData uri="http://schemas.openxmlformats.org/drawingml/2006/picture">
                 <pic:pic>
                   <pic:nvPicPr>
-                    <pic:cNvPr descr="figures/fig3_ternary.png" id="1278" name="Picture"/>
+                    <pic:cNvPr descr="figures/fig3_ternary.png" id="1352" name="Picture"/>
                     <pic:cNvPicPr>
                       <a:picLocks noChangeArrowheads="1" noChangeAspect="1"/>
                     </pic:cNvPicPr>
                   </pic:nvPicPr>
                   <pic:blipFill>
-                    <a:blip r:embed="rId1276"/>
+                    <a:blip r:embed="rId1350"/>
                     <a:stretch>
                       <a:fillRect/>
                     </a:stretch>
@@ -1371,8 +1371,8 @@
         </w:tc>
       </w:tr>
     </w:tbl>
-    <w:bookmarkEnd w:id="1279"/>
-    <w:bookmarkStart w:id="1280" w:name="anatomy-of-a-database-file"/>
+    <w:bookmarkEnd w:id="1353"/>
+    <w:bookmarkStart w:id="1354" w:name="anatomy-of-a-database-file"/>
     <w:p>
       <w:pPr>
         <w:pStyle w:val="Heading3"/>
@@ -1405,8 +1405,8 @@
         <w:t xml:space="preserve">That asymmetry is the economics of the field in miniature: implementations of the published models are increasingly available, but each fitted parameter condenses dozens of measurements and decisions. Parameter sets rather than codes are therefore the scarce commodity, and an openly licensed, provenance-tracked database is the part of this contribution that cannot be regenerated from the paper alone.</w:t>
       </w:r>
     </w:p>
-    <w:bookmarkEnd w:id="1280"/>
-    <w:bookmarkStart w:id="1281" w:name="quality-control"/>
+    <w:bookmarkEnd w:id="1354"/>
+    <w:bookmarkStart w:id="1355" w:name="quality-control"/>
     <w:p>
       <w:pPr>
         <w:pStyle w:val="Heading3"/>
@@ -1420,7 +1420,7 @@
         <w:pStyle w:val="FirstParagraph"/>
       </w:pPr>
       <w:r>
-        <w:t xml:space="preserve">Validation rests on one principle. A number is trusted only when an independent implementation reproduces it. pycalphad plays that role throughout, and Table 3 lists the checks. The pytest suite, 104 tests, compares every energy contribution on shared parameters and agrees to about 10</w:t>
+        <w:t xml:space="preserve">Validation rests on one principle. A number is trusted only when an independent implementation reproduces it. pycalphad plays that role throughout, and Table 3 lists the checks. The pytest suite, 109 tests, compares every energy contribution on shared parameters and agrees to about 10</w:t>
       </w:r>
       <w:r>
         <w:rPr>
@@ -1861,6 +1861,7 @@
           <w:tcPr/>
           <w:p>
             <w:pPr>
+              <w:keepNext/>
               <w:pStyle w:val="Compact"/>
               <w:jc w:val="left"/>
             </w:pPr>
@@ -1873,6 +1874,7 @@
           <w:tcPr/>
           <w:p>
             <w:pPr>
+              <w:keepNext/>
               <w:pStyle w:val="Compact"/>
               <w:jc w:val="left"/>
             </w:pPr>
@@ -1885,11 +1887,65 @@
           <w:tcPr/>
           <w:p>
             <w:pPr>
+              <w:keepNext/>
               <w:pStyle w:val="Compact"/>
               <w:jc w:val="left"/>
             </w:pPr>
             <w:r>
               <w:t xml:space="preserve">rejected, with the reason asserted</w:t>
+            </w:r>
+          </w:p>
+        </w:tc>
+      </w:tr>
+      <w:tr>
+        <w:trPr>
+          <w:cantSplit/>
+        </w:trPr>
+        <w:tc>
+          <w:tcPr/>
+          <w:p>
+            <w:pPr>
+              <w:pStyle w:val="Compact"/>
+              <w:jc w:val="left"/>
+            </w:pPr>
+            <w:r>
+              <w:t xml:space="preserve">Gas phase (library)</w:t>
+            </w:r>
+          </w:p>
+        </w:tc>
+        <w:tc>
+          <w:tcPr/>
+          <w:p>
+            <w:pPr>
+              <w:pStyle w:val="Compact"/>
+              <w:jc w:val="left"/>
+            </w:pPr>
+            <w:r>
+              <w:t xml:space="preserve">NASA-polynomial ideal-gas equilibria, C-H-O feeds</w:t>
+            </w:r>
+          </w:p>
+        </w:tc>
+        <w:tc>
+          <w:tcPr/>
+          <w:p>
+            <w:pPr>
+              <w:pStyle w:val="Compact"/>
+              <w:jc w:val="left"/>
+            </w:pPr>
+            <w:r>
+              <w:t xml:space="preserve">Cantera [40] parity to 10</w:t>
+            </w:r>
+            <w:r>
+              <w:rPr>
+                <w:vertAlign w:val="superscript"/>
+              </w:rPr>
+              <w:t xml:space="preserve">-10</w:t>
+            </w:r>
+            <w:r>
+              <w:t xml:space="preserve"> </w:t>
+            </w:r>
+            <w:r>
+              <w:t xml:space="preserve">mole fraction, 1200-3000 K, 0.1-10 atm</w:t>
             </w:r>
           </w:p>
         </w:tc>
@@ -1927,9 +1983,9 @@
         <w:t xml:space="preserve">invariants sit within about 40 °C, and the ternary liquidus projection reproduces the measured field topology [24]. Development practice is plain: the repository is version controlled with tagged releases (v0.1.0 through the v0.4.0 described here), the full suite runs before every release, and a fixed bug lands together with the regression test that would have caught it. The suite runs on Windows 11 under CPython 3.11 and 3.12; the browser application is exercised in Chromium- and Gecko-based browsers. A user can confirm a working installation by running pytest against the bundled test databases, or with no installation at all by opening the web application and loading the shipped ternary database.</w:t>
       </w:r>
     </w:p>
-    <w:bookmarkEnd w:id="1281"/>
-    <w:bookmarkEnd w:id="1282"/>
-    <w:bookmarkStart w:id="1290" w:name="availability"/>
+    <w:bookmarkEnd w:id="1355"/>
+    <w:bookmarkEnd w:id="1356"/>
+    <w:bookmarkStart w:id="1364" w:name="availability"/>
     <w:p>
       <w:pPr>
         <w:pStyle w:val="Heading2"/>
@@ -1938,7 +1994,7 @@
         <w:t xml:space="preserve">(2) Availability</w:t>
       </w:r>
     </w:p>
-    <w:bookmarkStart w:id="1283" w:name="operating-system"/>
+    <w:bookmarkStart w:id="1357" w:name="operating-system"/>
     <w:p>
       <w:pPr>
         <w:pStyle w:val="Heading3"/>
@@ -1955,8 +2011,8 @@
         <w:t xml:space="preserve">Platform independent. The core builds with any C99 compiler; development and testing used Windows 11. The browser application runs in any current browser with WebAssembly support.</w:t>
       </w:r>
     </w:p>
-    <w:bookmarkEnd w:id="1283"/>
-    <w:bookmarkStart w:id="1284" w:name="programming-language"/>
+    <w:bookmarkEnd w:id="1357"/>
+    <w:bookmarkStart w:id="1358" w:name="programming-language"/>
     <w:p>
       <w:pPr>
         <w:pStyle w:val="Heading3"/>
@@ -1973,8 +2029,8 @@
         <w:t xml:space="preserve">C (core), Python 3.11 or later (interface and fitting tools), JavaScript (browser application).</w:t>
       </w:r>
     </w:p>
-    <w:bookmarkEnd w:id="1284"/>
-    <w:bookmarkStart w:id="1285" w:name="additional-system-requirements"/>
+    <w:bookmarkEnd w:id="1358"/>
+    <w:bookmarkStart w:id="1359" w:name="additional-system-requirements"/>
     <w:p>
       <w:pPr>
         <w:pStyle w:val="Heading3"/>
@@ -1991,8 +2047,8 @@
         <w:t xml:space="preserve">None of note. The engine and database together are a few megabytes.</w:t>
       </w:r>
     </w:p>
-    <w:bookmarkEnd w:id="1285"/>
-    <w:bookmarkStart w:id="1286" w:name="dependencies"/>
+    <w:bookmarkEnd w:id="1359"/>
+    <w:bookmarkStart w:id="1360" w:name="dependencies"/>
     <w:p>
       <w:pPr>
         <w:pStyle w:val="Heading3"/>
@@ -2009,8 +2065,8 @@
         <w:t xml:space="preserve">Python interface: cffi, NumPy, SciPy (developed and tested with cffi 2.0, NumPy 2.4, and SciPy 1.17). The validation suite additionally requires pycalphad; every oracle comparison reported here ran against pycalphad 0.11.1, and the tests that read pycalphad’s own shipped test databases skip cleanly if a later version relocates them. The WebAssembly build requires emscripten. The C core and the browser application have no dependencies.</w:t>
       </w:r>
     </w:p>
-    <w:bookmarkEnd w:id="1286"/>
-    <w:bookmarkStart w:id="1287" w:name="list-of-contributors"/>
+    <w:bookmarkEnd w:id="1360"/>
+    <w:bookmarkStart w:id="1361" w:name="list-of-contributors"/>
     <w:p>
       <w:pPr>
         <w:pStyle w:val="Heading3"/>
@@ -2027,8 +2083,8 @@
         <w:t xml:space="preserve">Michael E. Bustamante (design, implementation, validation, data curation).</w:t>
       </w:r>
     </w:p>
-    <w:bookmarkEnd w:id="1287"/>
-    <w:bookmarkStart w:id="1288" w:name="software-location"/>
+    <w:bookmarkEnd w:id="1361"/>
+    <w:bookmarkStart w:id="1362" w:name="software-location"/>
     <w:p>
       <w:pPr>
         <w:pStyle w:val="Heading3"/>
@@ -2181,8 +2237,8 @@
         <w:t xml:space="preserve">Date published: 2026-09-02</w:t>
       </w:r>
     </w:p>
-    <w:bookmarkEnd w:id="1288"/>
-    <w:bookmarkStart w:id="1289" w:name="language"/>
+    <w:bookmarkEnd w:id="1362"/>
+    <w:bookmarkStart w:id="1363" w:name="language"/>
     <w:p>
       <w:pPr>
         <w:pStyle w:val="Heading3"/>
@@ -2199,9 +2255,9 @@
         <w:t xml:space="preserve">English.</w:t>
       </w:r>
     </w:p>
-    <w:bookmarkEnd w:id="1289"/>
-    <w:bookmarkEnd w:id="1290"/>
-    <w:bookmarkStart w:id="1301" w:name="reuse-potential"/>
+    <w:bookmarkEnd w:id="1363"/>
+    <w:bookmarkEnd w:id="1364"/>
+    <w:bookmarkStart w:id="1375" w:name="reuse-potential"/>
     <w:p>
       <w:pPr>
         <w:pStyle w:val="Heading2"/>
@@ -2226,7 +2282,7 @@
         <w:t xml:space="preserve">The browser application makes the lowest barrier the default. A lecture on slag thermodynamics, a plant metallurgist screening a composition, or a reviewer checking a claimed equilibrium can load the database and calculate in seconds, with confidential inputs never leaving the machine. The same property makes it a practical template for other groups who want to publish a model as a zero-install tool.</w:t>
       </w:r>
     </w:p>
-    <w:bookmarkStart w:id="1300" w:name="worked-examples"/>
+    <w:bookmarkStart w:id="1374" w:name="worked-examples"/>
     <w:p>
       <w:pPr>
         <w:pStyle w:val="Heading3"/>
@@ -2438,18 +2494,18 @@
           <wp:inline>
             <wp:extent cx="4206240" cy="3262561"/>
             <wp:effectExtent b="0" l="0" r="0" t="0"/>
-            <wp:docPr descr="Figure 4: The LiCl-KCl phase diagram calculated by the salt listing from the shipped open database, at the listing’s own step size. Light to dark: liquid, two-phase, and subsolidus fields. The dot is the calculated eutectic at this step size (0.400, 640 K); the star is the measured eutectic (0.415, 626 K)." title="" id="1292" name="Picture"/>
+            <wp:docPr descr="Figure 4: The LiCl-KCl phase diagram calculated by the salt listing from the shipped open database, at the listing’s own step size. Light to dark: liquid, two-phase, and subsolidus fields. The dot is the calculated eutectic at this step size (0.400, 640 K); the star is the measured eutectic (0.415, 626 K)." title="" id="1366" name="Picture"/>
             <a:graphic>
               <a:graphicData uri="http://schemas.openxmlformats.org/drawingml/2006/picture">
                 <pic:pic>
                   <pic:nvPicPr>
-                    <pic:cNvPr descr="figures/fig4_salt_example.png" id="1293" name="Picture"/>
+                    <pic:cNvPr descr="figures/fig4_salt_example.png" id="1367" name="Picture"/>
                     <pic:cNvPicPr>
                       <a:picLocks noChangeArrowheads="1" noChangeAspect="1"/>
                     </pic:cNvPicPr>
                   </pic:nvPicPr>
                   <pic:blipFill>
-                    <a:blip r:embed="rId1291"/>
+                    <a:blip r:embed="rId1365"/>
                     <a:stretch>
                       <a:fillRect/>
                     </a:stretch>
@@ -2672,7 +2728,7 @@
         <w:t xml:space="preserve"> </w:t>
       </w:r>
       <w:r>
-        <w:t xml:space="preserve">= 0.890 and 660 K against the assessed 0.885 and 654 K [39] (Figure 5). The shipped AlZn.tdb is itself an openly licensed transcription of that published assessment on the Scientific Group Thermodata Europe (SGTE) unary functions [40], verified bit-identical through pycalphad against the file it transcribes. The slag systems run through the same calls behind Figures 2 and 3, and the repository’s validation scripts are their executable record.</w:t>
+        <w:t xml:space="preserve">= 0.890 and 660 K against the assessed 0.885 and 654 K [39] (Figure 5). The shipped AlZn.tdb is itself an openly licensed transcription of that published assessment on the Scientific Group Thermodata Europe (SGTE) unary functions [41], verified bit-identical through pycalphad against the file it transcribes. The slag systems run through the same calls behind Figures 2 and 3, and the repository’s validation scripts are their executable record.</w:t>
       </w:r>
     </w:p>
     <w:p>
@@ -2684,18 +2740,18 @@
           <wp:inline>
             <wp:extent cx="4206240" cy="3262561"/>
             <wp:effectExtent b="0" l="0" r="0" t="0"/>
-            <wp:docPr descr="Figure 5: The Al-Zn phase diagram calculated by the alloy listing from the shipped open TDB. Light to dark: liquid, liquid plus solid, and solid fields. The dot is the calculated eutectic (0.890, 660 K); the star is the assessed eutectic (0.885, 654 K)." title="" id="1295" name="Picture"/>
+            <wp:docPr descr="Figure 5: The Al-Zn phase diagram calculated by the alloy listing from the shipped open TDB. Light to dark: liquid, liquid plus solid, and solid fields. The dot is the calculated eutectic (0.890, 660 K); the star is the assessed eutectic (0.885, 654 K)." title="" id="1369" name="Picture"/>
             <a:graphic>
               <a:graphicData uri="http://schemas.openxmlformats.org/drawingml/2006/picture">
                 <pic:pic>
                   <pic:nvPicPr>
-                    <pic:cNvPr descr="figures/fig5_alloy_example.png" id="1296" name="Picture"/>
+                    <pic:cNvPr descr="figures/fig5_alloy_example.png" id="1370" name="Picture"/>
                     <pic:cNvPicPr>
                       <a:picLocks noChangeArrowheads="1" noChangeAspect="1"/>
                     </pic:cNvPicPr>
                   </pic:nvPicPr>
                   <pic:blipFill>
-                    <a:blip r:embed="rId1294"/>
+                    <a:blip r:embed="rId1368"/>
                     <a:stretch>
                       <a:fillRect/>
                     </a:stretch>
@@ -2735,7 +2791,19 @@
         <w:pStyle w:val="BodyText"/>
       </w:pPr>
       <w:r>
-        <w:t xml:space="preserve">The database is a starting point rather than an endpoint, and the file format rewards growth: new components, new phases, and refits against new measurements accumulate in the same database. A system is therefore extended release by release rather than rebuilt, and archived versions keep results calculated against earlier releases reproducible. Because every value carries its source and every judgment is written down, another assessor can reweight the data, swap an endmember, or extend a system without reverse-engineering anything; dbbuild turns a table of measured activities into a loadable file in a few lines. The in-browser multiphase hull already covers any loaded three-cation file and any loaded alloy TDB join, so a new system becomes a browser phase diagram the moment its file loads. Natural extensions are further oxide systems, the remaining ChemSage solution models, the ionic-liquid TDB model, and multicomponent Scheil on the same hull machinery. The databases carry per-value provenance but not parameter uncertainties; refitting the same measured-data tables through ESPEI [10] to obtain Bayesian uncertainty bounds is a natural continuation. The repository also publishes an openly specified unified dialect (uTDB) that carries the MQMQA statements inside TDB grammar, with two shipped demonstration files chosen to be processes rather than curiosities: an aluminum-recycling database holding the Al-Zn alloy with its NaCl-KCl-MgCl2 salt flux, and a steelmaking database holding a basic Fe-C steel, magnetic phases included, with the FeO-MgO-SiO2 slag and its silicate solid solutions. Round-trip tests assert both reproduce their source-file physics at machine precision. The steelmaking file is the clearest illustration of what a unified container buys (Figure 6): from one file the browser calculates the iron-carbon alloy diagram through the magnetic compound energy formalism and its Scheil solidification path, while the same file’s slag is a molten-salt-model liquid, two physics that no single legacy container holds together. Relative to the XML road of XTDB [15] (Table 1), uTDB is the on-ramp from the installed base, extending files as they are and running in this engine today, with mechanical conversion to XTDB elements the natural bridge once that schema settles. Making the calculator multilingual across the field’s file dialects is the direction of travel. Contributions and issues are handled through the GitHub repository.</w:t>
+        <w:t xml:space="preserve">The database is a starting point rather than an endpoint, and the file format rewards growth: new components, new phases, and refits against new measurements accumulate in the same database. A system is therefore extended release by release rather than rebuilt, and archived versions keep results calculated against earlier releases reproducible. Because every value carries its source and every judgment is written down, another assessor can reweight the data, swap an endmember, or extend a system without reverse-engineering anything; dbbuild turns a table of measured activities into a loadable file in a few lines. The in-browser multiphase hull already covers any loaded three-cation file and any loaded alloy TDB join, so a new system becomes a browser phase diagram the moment its file loads. Natural extensions are further oxide systems, the remaining ChemSage solution models, the ionic-liquid TDB model, and multicomponent Scheil on the same hull machinery. The databases carry per-value provenance but not parameter uncertainties; refitting the same measured-data tables through ESPEI [10] to obtain Bayesian uncertainty bounds is a natural continuation. A first reach into the combustion school is already in the library. The engine reads NASA 7-coefficient polynomial thermochemistry, the open format of NASA CEA [42] and GRI-Mech [43], and solves ideal-gas equilibrium at fixed temperature and pressure by the element-potential method, validated against Cantera [40] to 10</w:t>
+      </w:r>
+      <w:r>
+        <w:rPr>
+          <w:vertAlign w:val="superscript"/>
+        </w:rPr>
+        <w:t xml:space="preserve">-10</w:t>
+      </w:r>
+      <w:r>
+        <w:t xml:space="preserve"> </w:t>
+      </w:r>
+      <w:r>
+        <w:t xml:space="preserve">mole fraction from 1200 to 3000 K and 0.1 to 10 atm. This solver lives in the Python layer for now; its port to the WebAssembly core, and the coupling of the gas to the molten oxide for pyrometallurgical oxygen potentials, are in progress. The uTDB grammar already defines the ideal-gas phase, so a single file can in principle carry an alloy, a slag, its solids, and a gas. The repository also publishes an openly specified unified dialect (uTDB) that carries the MQMQA statements inside TDB grammar, with two shipped demonstration files chosen to be processes rather than curiosities: an aluminum-recycling database holding the Al-Zn alloy with its NaCl-KCl-MgCl2 salt flux, and a steelmaking database holding a basic Fe-C steel, magnetic phases included, with the FeO-MgO-SiO2 slag and its silicate solid solutions. Round-trip tests assert both reproduce their source-file physics at machine precision. The steelmaking file is the clearest illustration of what a unified container buys (Figure 6): from one file the browser calculates the iron-carbon alloy diagram through the magnetic compound energy formalism and its Scheil solidification path, while the same file’s slag is a molten-salt-model liquid, two physics that no single legacy container holds together. Relative to the XML road of XTDB [15] (Table 1), uTDB is the on-ramp from the installed base, extending files as they are and running in this engine today, with mechanical conversion to XTDB elements the natural bridge once that schema settles. Making the calculator multilingual across the field’s file dialects is the direction of travel. Contributions and issues are handled through the GitHub repository.</w:t>
       </w:r>
     </w:p>
     <w:p>
@@ -2747,18 +2815,18 @@
           <wp:inline>
             <wp:extent cx="5334000" cy="4756265"/>
             <wp:effectExtent b="0" l="0" r="0" t="0"/>
-            <wp:docPr descr="Figure 6: One unified (.utdb) file, two physics, calculated in the browser. (a) The steelmaking database loaded with the Melt/Alloy view toggle on Alloy; the engine calculates the Fe-C phase diagram through the magnetic compound energy formalism, with two tapped compositions pinned. (b) Scheil solidification for the same join at 4 mol% C, first solid at 1739 K and the residual liquid frozen by 1436 K, against the equilibrium lever-rule path (dashed). The file’s slag half is a Modified Quasichemical Model liquid; no legacy container holds both models at once." title="" id="1298" name="Picture"/>
+            <wp:docPr descr="Figure 6: One unified (.utdb) file, two physics, calculated in the browser. (a) The steelmaking database loaded with the Melt/Alloy view toggle on Alloy; the engine calculates the Fe-C phase diagram through the magnetic compound energy formalism, with two tapped compositions pinned. (b) Scheil solidification for the same join at 4 mol% C, first solid at 1739 K and the residual liquid frozen by 1436 K, against the equilibrium lever-rule path (dashed). The file’s slag half is a Modified Quasichemical Model liquid; no legacy container holds both models at once." title="" id="1372" name="Picture"/>
             <a:graphic>
               <a:graphicData uri="http://schemas.openxmlformats.org/drawingml/2006/picture">
                 <pic:pic>
                   <pic:nvPicPr>
-                    <pic:cNvPr descr="figures/fig6_utdb_steel.png" id="1299" name="Picture"/>
+                    <pic:cNvPr descr="figures/fig6_utdb_steel.png" id="1373" name="Picture"/>
                     <pic:cNvPicPr>
                       <a:picLocks noChangeArrowheads="1" noChangeAspect="1"/>
                     </pic:cNvPicPr>
                   </pic:nvPicPr>
                   <pic:blipFill>
-                    <a:blip r:embed="rId1297"/>
+                    <a:blip r:embed="rId1371"/>
                     <a:stretch>
                       <a:fillRect/>
                     </a:stretch>
@@ -2801,9 +2869,9 @@
         <w:t xml:space="preserve">The gap this work addresses was never the model, which has been published for two decades, but an open, runnable pairing of model and parameters. Hephaestus supplies both halves under open licenses and puts them behind a browser page that asks nothing of its user. The claims are checkable end to end. Release v0.4.0 archives the exact version described, and the 104-test suite reruns the pycalphad comparisons on any machine. The worked examples print the figures shown, and every parameter in every shipped database traces to a published measurement through its provenance file. A reader who doubts a number can recalculate it; one who needs a system that is missing can build it with the same open tools, or ask.</w:t>
       </w:r>
     </w:p>
-    <w:bookmarkEnd w:id="1300"/>
-    <w:bookmarkEnd w:id="1301"/>
-    <w:bookmarkStart w:id="1302" w:name="data-availability"/>
+    <w:bookmarkEnd w:id="1374"/>
+    <w:bookmarkEnd w:id="1375"/>
+    <w:bookmarkStart w:id="1376" w:name="data-availability"/>
     <w:p>
       <w:pPr>
         <w:pStyle w:val="Heading2"/>
@@ -2820,8 +2888,8 @@
         <w:t xml:space="preserve">The engine, the database, the browser application, and the validation suite are openly available in the code repository listed above; the version described here is archived as release v0.4.0. The database files and their provenance records are in the repository’s data directory under CC BY 4.0.</w:t>
       </w:r>
     </w:p>
-    <w:bookmarkEnd w:id="1302"/>
-    <w:bookmarkStart w:id="1303" w:name="acknowledgements"/>
+    <w:bookmarkEnd w:id="1376"/>
+    <w:bookmarkStart w:id="1377" w:name="acknowledgements"/>
     <w:p>
       <w:pPr>
         <w:pStyle w:val="Heading2"/>
@@ -2838,8 +2906,8 @@
         <w:t xml:space="preserve">During the development of this software the author used Claude Code (Anthropic) to assist with implementation, validation scripting, and manuscript preparation. This assistance was agentic, not autonomous: it operated under author direction and supervision at every step and was never a closed loop that produced or accepted results without review. Every parameter was traced by the author to its primary source before entering the database, and every reference was verified against its registry record. The author reviewed and approved all output and takes full responsibility for this article.</w:t>
       </w:r>
     </w:p>
-    <w:bookmarkEnd w:id="1303"/>
-    <w:bookmarkStart w:id="1304" w:name="funding-statement"/>
+    <w:bookmarkEnd w:id="1377"/>
+    <w:bookmarkStart w:id="1378" w:name="funding-statement"/>
     <w:p>
       <w:pPr>
         <w:pStyle w:val="Heading2"/>
@@ -2856,8 +2924,8 @@
         <w:t xml:space="preserve">The development of this software received no external funding.</w:t>
       </w:r>
     </w:p>
-    <w:bookmarkEnd w:id="1304"/>
-    <w:bookmarkStart w:id="1305" w:name="competing-interests"/>
+    <w:bookmarkEnd w:id="1378"/>
+    <w:bookmarkStart w:id="1379" w:name="competing-interests"/>
     <w:p>
       <w:pPr>
         <w:pStyle w:val="Heading2"/>
@@ -2874,8 +2942,8 @@
         <w:t xml:space="preserve">The author founded Odinzen LLC, which provides commercial thermodynamic modeling services, and declares this as a competing interest. The software and database published here are released in full under open licenses, and no proprietary Odinzen assets are included.</w:t>
       </w:r>
     </w:p>
-    <w:bookmarkEnd w:id="1305"/>
-    <w:bookmarkStart w:id="1306" w:name="references"/>
+    <w:bookmarkEnd w:id="1379"/>
+    <w:bookmarkStart w:id="1380" w:name="references"/>
     <w:p>
       <w:pPr>
         <w:pStyle w:val="Heading2"/>
@@ -3213,11 +3281,35 @@
         <w:pStyle w:val="BodyText"/>
       </w:pPr>
       <w:r>
-        <w:t xml:space="preserve">[40] Dinsdale AT. SGTE data for pure elements. Calphad. 1991 Oct;15(4):317-425. doi:10.1016/0364-5916(91)90030-N</w:t>
-      </w:r>
-    </w:p>
-    <w:bookmarkEnd w:id="1306"/>
-    <w:bookmarkEnd w:id="1307"/>
+        <w:t xml:space="preserve">[40] Goodwin DG, Moffat HK, Schoegl I, Speth RL, Weber BW. Cantera: An Object-oriented Software Toolkit for Chemical Kinetics, Thermodynamics, and Transport Processes. Version 3.1.0; 2024. doi:10.5281/zenodo.14455267</w:t>
+      </w:r>
+    </w:p>
+    <w:p>
+      <w:pPr>
+        <w:pStyle w:val="BodyText"/>
+      </w:pPr>
+      <w:r>
+        <w:t xml:space="preserve">[41] Dinsdale AT. SGTE data for pure elements. Calphad. 1991 Oct;15(4):317-425. doi:10.1016/0364-5916(91)90030-N</w:t>
+      </w:r>
+    </w:p>
+    <w:p>
+      <w:pPr>
+        <w:pStyle w:val="BodyText"/>
+      </w:pPr>
+      <w:r>
+        <w:t xml:space="preserve">[42] McBride BJ, Zehe MJ, Gordon S. NASA Glenn Coefficients for Calculating Thermodynamic Properties of Individual Species. NASA/TP-2002-211556. Cleveland (OH): NASA Glenn Research Center; 2002.</w:t>
+      </w:r>
+    </w:p>
+    <w:p>
+      <w:pPr>
+        <w:pStyle w:val="BodyText"/>
+      </w:pPr>
+      <w:r>
+        <w:t xml:space="preserve">[43] Smith GP, Golden DM, Frenklach M, Moriarty NW, Eiteneer B, Goldenberg M, et al. GRI-Mech 3.0 [Internet]. 1999. Available from: http://combustion.berkeley.edu/gri-mech/</w:t>
+      </w:r>
+    </w:p>
+    <w:bookmarkEnd w:id="1380"/>
+    <w:bookmarkEnd w:id="1381"/>
     <w:sectPr>
       <w:footnotePr>
         <w:numRestart w:val="eachSect"/>

</xml_diff>

<commit_message>
Gas equilibria run in the browser: NASA-polynomial ideal-gas engine ported to the C core (element-potential solver, Gaussian-elimination linear solve), compiled into the WebAssembly build, and exposed as a gas-equilibrium card on the page. Validated against Cantera through the ABI (C/browser to 1e-6, Python to 1e-10); suite 112. Paper and S1 updated to the in-browser claim; seven tools
Co-Authored-By: Claude Opus 4.8 <noreply@anthropic.com>
</commit_message>
<xml_diff>
--- a/paper/Bustamante_Hephaestus_JORS_manuscript.docx
+++ b/paper/Bustamante_Hephaestus_JORS_manuscript.docx
@@ -2,7 +2,7 @@
 <file path=word/document.xml><?xml version="1.0" encoding="utf-8"?>
 <w:document xmlns:w="http://schemas.openxmlformats.org/wordprocessingml/2006/main" xmlns:m="http://schemas.openxmlformats.org/officeDocument/2006/math" xmlns:r="http://schemas.openxmlformats.org/officeDocument/2006/relationships" xmlns:o="urn:schemas-microsoft-com:office:office" xmlns:v="urn:schemas-microsoft-com:vml" xmlns:w10="urn:schemas-microsoft-com:office:word" xmlns:a="http://schemas.openxmlformats.org/drawingml/2006/main" xmlns:pic="http://schemas.openxmlformats.org/drawingml/2006/picture" xmlns:wp="http://schemas.openxmlformats.org/drawingml/2006/wordprocessingDrawing">
   <w:body>
-    <w:bookmarkStart w:id="1381" w:name="X4855b1162e70238fd839d871e0792397dc58430"/>
+    <w:bookmarkStart w:id="1418" w:name="X4855b1162e70238fd839d871e0792397dc58430"/>
     <w:p>
       <w:pPr>
         <w:pStyle w:val="Heading1"/>
@@ -159,7 +159,7 @@
         <w:t xml:space="preserve">CALPHAD; molten slag; molten salt; modified quasichemical model; thermodynamic database; phase diagram; WebAssembly; open data</w:t>
       </w:r>
     </w:p>
-    <w:bookmarkStart w:id="1356" w:name="overview"/>
+    <w:bookmarkStart w:id="1393" w:name="overview"/>
     <w:p>
       <w:pPr>
         <w:pStyle w:val="Heading2"/>
@@ -168,7 +168,7 @@
         <w:t xml:space="preserve">(1) Overview</w:t>
       </w:r>
     </w:p>
-    <w:bookmarkStart w:id="1343" w:name="introduction"/>
+    <w:bookmarkStart w:id="1380" w:name="introduction"/>
     <w:p>
       <w:pPr>
         <w:pStyle w:val="Heading3"/>
@@ -548,8 +548,8 @@
         <w:t xml:space="preserve">Hephaestus is a deliberate response to that gap, and it treats the engine and the data as one contribution because neither is useful alone. The engine is small on purpose. Its core is plain C with no dependencies, which makes it easy to embed and lets the identical code compile to WebAssembly, so the full calculator runs in a web browser with nothing installed and no data leaving the user’s machine. The database is open on purpose. Every parameter in it derives from published measurements, each value carries its provenance down to table and page, and the known shortcomings are documented next to the numbers they affect. The present work describes both, their validation against pycalphad and against measured phase equilibria, and the ways they can be reused. None of it asks the reader to program. For the experimentalist who never writes code, the browser application is the entire product: a page to open, a database to click, and a diagram to read. The sections that follow describe the machinery underneath for those who want it. Supplementary Material S1 is a plain-language primer for the non-programmer, starting at what a database file is and ending at a first calculation and how to read it. Its closing section teaches what an assessment is built from, so a reader who wants to contribute data for open publication, or to commission a file, arrives knowing what is needed.</w:t>
       </w:r>
     </w:p>
-    <w:bookmarkEnd w:id="1343"/>
-    <w:bookmarkStart w:id="1353" w:name="implementation-and-architecture"/>
+    <w:bookmarkEnd w:id="1380"/>
+    <w:bookmarkStart w:id="1390" w:name="implementation-and-architecture"/>
     <w:p>
       <w:pPr>
         <w:pStyle w:val="Heading3"/>
@@ -575,18 +575,18 @@
           <wp:inline>
             <wp:extent cx="5334000" cy="3511167"/>
             <wp:effectExtent b="0" l="0" r="0" t="0"/>
-            <wp:docPr descr="Figure 1: Architecture of Hephaestus. A single dependency-free C core reads the field’s three database dialects (ChemSage .dat, Thermo-Calc .tdb with the Inden magnetic model, and the unified .utdb) and calculates all thermodynamics; the same core is used as a native library, from Python through cffi, and compiled to WebAssembly behind the browser application. dbbuild writes new ChemSage files from measured data, and every energy path is validated against pycalphad." title="" id="1345" name="Picture"/>
+            <wp:docPr descr="Figure 1: Architecture of Hephaestus. A single dependency-free C core reads the field’s three database dialects (ChemSage .dat, Thermo-Calc .tdb with the Inden magnetic model, and the unified .utdb) and calculates all thermodynamics; the same core is used as a native library, from Python through cffi, and compiled to WebAssembly behind the browser application. dbbuild writes new ChemSage files from measured data, and every energy path is validated against pycalphad." title="" id="1382" name="Picture"/>
             <a:graphic>
               <a:graphicData uri="http://schemas.openxmlformats.org/drawingml/2006/picture">
                 <pic:pic>
                   <pic:nvPicPr>
-                    <pic:cNvPr descr="figures/fig1_architecture.png" id="1346" name="Picture"/>
+                    <pic:cNvPr descr="figures/fig1_architecture.png" id="1383" name="Picture"/>
                     <pic:cNvPicPr>
                       <a:picLocks noChangeArrowheads="1" noChangeAspect="1"/>
                     </pic:cNvPicPr>
                   </pic:nvPicPr>
                   <pic:blipFill>
-                    <a:blip r:embed="rId1344"/>
+                    <a:blip r:embed="rId1381"/>
                     <a:stretch>
                       <a:fillRect/>
                     </a:stretch>
@@ -769,7 +769,7 @@
         <w:pStyle w:val="BodyText"/>
       </w:pPr>
       <w:r>
-        <w:t xml:space="preserve">The browser application, hosted at https://odinzen.github.io/hephaestus-mqmqa-public/, exposes six tools. A calculator works over any loaded database (ChemSage .dat or Thermo-Calc .tdb, auto-detected, with up to three uploaded files held per session). A binary-join phase-diagram tool offers tap-to-read point comparison, and a Scheil-Gulliver solidification panel on the same join draws the equilibrium lever-rule path alongside. A viewer shows the assessed FeO-MgO-SiO</w:t>
+        <w:t xml:space="preserve">The browser application, hosted at https://odinzen.github.io/hephaestus-mqmqa-public/, exposes seven tools. A calculator works over any loaded database (ChemSage .dat or Thermo-Calc .tdb, auto-detected, with up to three uploaded files held per session). A binary-join phase-diagram tool offers tap-to-read point comparison, and a Scheil-Gulliver solidification panel on the same join draws the equilibrium lever-rule path alongside. A viewer shows the assessed FeO-MgO-SiO</w:t>
       </w:r>
       <w:r>
         <w:rPr>
@@ -781,7 +781,7 @@
         <w:t xml:space="preserve"> </w:t>
       </w:r>
       <w:r>
-        <w:t xml:space="preserve">diagrams, and a live isothermal-section solver calculates the full phase assemblage at a chosen temperature in about a second, for the shipped ternaries or for any loaded three-cation file (Figure 2). An interactive eutectic builder pre-fills its component names, melting points, and fusion enthalpies from the loaded database. Loading an alloy TDB reshapes the workspace: the elements become the end members and every compound energy formalism phase spanning the join enters the same convex hull construction. Everything runs client side. The page holds a strict content security policy, escapes all file-derived strings, makes no third-party requests, and never transmits a loaded file, which matters to industrial users whose compositions are confidential.</w:t>
+        <w:t xml:space="preserve">diagrams, and a live isothermal-section solver calculates the full phase assemblage at a chosen temperature in about a second, for the shipped ternaries or for any loaded three-cation file (Figure 2). An interactive eutectic builder pre-fills its component names, melting points, and fusion enthalpies from the loaded database. A gas-equilibrium calculator solves ideal-gas equilibrium over an open NASA-polynomial database, its own engine compiled into the same WebAssembly core. Loading an alloy TDB reshapes the workspace: the elements become the end members and every compound energy formalism phase spanning the join enters the same convex hull construction. Everything runs client side. The page holds a strict content security policy, escapes all file-derived strings, makes no third-party requests, and never transmits a loaded file, which matters to industrial users whose compositions are confidential.</w:t>
       </w:r>
     </w:p>
     <w:p>
@@ -793,18 +793,18 @@
           <wp:inline>
             <wp:extent cx="4754880" cy="4464799"/>
             <wp:effectExtent b="0" l="0" r="0" t="0"/>
-            <wp:docPr descr="Figure 2: The live solver in the browser application (light theme). The user loads the shipped database, picks a temperature, and presses Compute; the WebAssembly engine then solves the full FeO-MgO-SiO2 phase assemblage client side (here 1023 composition samples and 512 tie-facets in under half a second). Tapping a composition reads its stable phases and pins it to a comparison list; hovering previews on desktop." title="" id="1348" name="Picture"/>
+            <wp:docPr descr="Figure 2: The live solver in the browser application (light theme). The user loads the shipped database, picks a temperature, and presses Compute; the WebAssembly engine then solves the full FeO-MgO-SiO2 phase assemblage client side (here 1023 composition samples and 512 tie-facets in under half a second). Tapping a composition reads its stable phases and pins it to a comparison list; hovering previews on desktop." title="" id="1385" name="Picture"/>
             <a:graphic>
               <a:graphicData uri="http://schemas.openxmlformats.org/drawingml/2006/picture">
                 <pic:pic>
                   <pic:nvPicPr>
-                    <pic:cNvPr descr="figures/fig2_browser_app.png" id="1349" name="Picture"/>
+                    <pic:cNvPr descr="figures/fig2_browser_app.png" id="1386" name="Picture"/>
                     <pic:cNvPicPr>
                       <a:picLocks noChangeArrowheads="1" noChangeAspect="1"/>
                     </pic:cNvPicPr>
                   </pic:nvPicPr>
                   <pic:blipFill>
-                    <a:blip r:embed="rId1347"/>
+                    <a:blip r:embed="rId1384"/>
                     <a:stretch>
                       <a:fillRect/>
                     </a:stretch>
@@ -970,18 +970,18 @@
           <wp:inline>
             <wp:extent cx="5334000" cy="2197297"/>
             <wp:effectExtent b="0" l="0" r="0" t="0"/>
-            <wp:docPr descr="Figure 3: The assessed FeO-MgO-SiO2 system calculated from the shipped database files. (a) Liquidus projection: primary crystallizing phase fields, with liquidus isotherms labeled in °C. (b) Isothermal section at 1600 °C: stable phase assemblages, shaded by the number of solid phases present. Phase labels: L liquid, Crs cristobalite, Ol olivine, Opx orthopyroxene, Per periclase, Wus wustite." title="" id="1351" name="Picture"/>
+            <wp:docPr descr="Figure 3: The assessed FeO-MgO-SiO2 system calculated from the shipped database files. (a) Liquidus projection: primary crystallizing phase fields, with liquidus isotherms labeled in °C. (b) Isothermal section at 1600 °C: stable phase assemblages, shaded by the number of solid phases present. Phase labels: L liquid, Crs cristobalite, Ol olivine, Opx orthopyroxene, Per periclase, Wus wustite." title="" id="1388" name="Picture"/>
             <a:graphic>
               <a:graphicData uri="http://schemas.openxmlformats.org/drawingml/2006/picture">
                 <pic:pic>
                   <pic:nvPicPr>
-                    <pic:cNvPr descr="figures/fig3_ternary.png" id="1352" name="Picture"/>
+                    <pic:cNvPr descr="figures/fig3_ternary.png" id="1389" name="Picture"/>
                     <pic:cNvPicPr>
                       <a:picLocks noChangeArrowheads="1" noChangeAspect="1"/>
                     </pic:cNvPicPr>
                   </pic:nvPicPr>
                   <pic:blipFill>
-                    <a:blip r:embed="rId1350"/>
+                    <a:blip r:embed="rId1387"/>
                     <a:stretch>
                       <a:fillRect/>
                     </a:stretch>
@@ -1371,8 +1371,8 @@
         </w:tc>
       </w:tr>
     </w:tbl>
-    <w:bookmarkEnd w:id="1353"/>
-    <w:bookmarkStart w:id="1354" w:name="anatomy-of-a-database-file"/>
+    <w:bookmarkEnd w:id="1390"/>
+    <w:bookmarkStart w:id="1391" w:name="anatomy-of-a-database-file"/>
     <w:p>
       <w:pPr>
         <w:pStyle w:val="Heading3"/>
@@ -1405,8 +1405,8 @@
         <w:t xml:space="preserve">That asymmetry is the economics of the field in miniature: implementations of the published models are increasingly available, but each fitted parameter condenses dozens of measurements and decisions. Parameter sets rather than codes are therefore the scarce commodity, and an openly licensed, provenance-tracked database is the part of this contribution that cannot be regenerated from the paper alone.</w:t>
       </w:r>
     </w:p>
-    <w:bookmarkEnd w:id="1354"/>
-    <w:bookmarkStart w:id="1355" w:name="quality-control"/>
+    <w:bookmarkEnd w:id="1391"/>
+    <w:bookmarkStart w:id="1392" w:name="quality-control"/>
     <w:p>
       <w:pPr>
         <w:pStyle w:val="Heading3"/>
@@ -1420,7 +1420,7 @@
         <w:pStyle w:val="FirstParagraph"/>
       </w:pPr>
       <w:r>
-        <w:t xml:space="preserve">Validation rests on one principle. A number is trusted only when an independent implementation reproduces it. pycalphad plays that role throughout, and Table 3 lists the checks. The pytest suite, 109 tests, compares every energy contribution on shared parameters and agrees to about 10</w:t>
+        <w:t xml:space="preserve">Validation rests on one principle. A number is trusted only when an independent implementation reproduces it. pycalphad plays that role throughout, and Table 3 lists the checks. The pytest suite, 112 tests, compares every energy contribution on shared parameters and agrees to about 10</w:t>
       </w:r>
       <w:r>
         <w:rPr>
@@ -1909,19 +1909,19 @@
               <w:jc w:val="left"/>
             </w:pPr>
             <w:r>
-              <w:t xml:space="preserve">Gas phase (library)</w:t>
-            </w:r>
-          </w:p>
-        </w:tc>
-        <w:tc>
-          <w:tcPr/>
-          <w:p>
-            <w:pPr>
-              <w:pStyle w:val="Compact"/>
-              <w:jc w:val="left"/>
-            </w:pPr>
-            <w:r>
-              <w:t xml:space="preserve">NASA-polynomial ideal-gas equilibria, C-H-O feeds</w:t>
+              <w:t xml:space="preserve">Gas phase</w:t>
+            </w:r>
+          </w:p>
+        </w:tc>
+        <w:tc>
+          <w:tcPr/>
+          <w:p>
+            <w:pPr>
+              <w:pStyle w:val="Compact"/>
+              <w:jc w:val="left"/>
+            </w:pPr>
+            <w:r>
+              <w:t xml:space="preserve">NASA-polynomial ideal-gas equilibria, C-H-O feeds (Python and C core)</w:t>
             </w:r>
           </w:p>
         </w:tc>
@@ -1945,7 +1945,19 @@
               <w:t xml:space="preserve"> </w:t>
             </w:r>
             <w:r>
-              <w:t xml:space="preserve">mole fraction, 1200-3000 K, 0.1-10 atm</w:t>
+              <w:t xml:space="preserve">(Python), 10</w:t>
+            </w:r>
+            <w:r>
+              <w:rPr>
+                <w:vertAlign w:val="superscript"/>
+              </w:rPr>
+              <w:t xml:space="preserve">-6</w:t>
+            </w:r>
+            <w:r>
+              <w:t xml:space="preserve"> </w:t>
+            </w:r>
+            <w:r>
+              <w:t xml:space="preserve">(C/browser), 1200-3000 K, 0.1-10 atm</w:t>
             </w:r>
           </w:p>
         </w:tc>
@@ -1983,9 +1995,9 @@
         <w:t xml:space="preserve">invariants sit within about 40 °C, and the ternary liquidus projection reproduces the measured field topology [24]. Development practice is plain: the repository is version controlled with tagged releases (v0.1.0 through the v0.4.0 described here), the full suite runs before every release, and a fixed bug lands together with the regression test that would have caught it. The suite runs on Windows 11 under CPython 3.11 and 3.12; the browser application is exercised in Chromium- and Gecko-based browsers. A user can confirm a working installation by running pytest against the bundled test databases, or with no installation at all by opening the web application and loading the shipped ternary database.</w:t>
       </w:r>
     </w:p>
-    <w:bookmarkEnd w:id="1355"/>
-    <w:bookmarkEnd w:id="1356"/>
-    <w:bookmarkStart w:id="1364" w:name="availability"/>
+    <w:bookmarkEnd w:id="1392"/>
+    <w:bookmarkEnd w:id="1393"/>
+    <w:bookmarkStart w:id="1401" w:name="availability"/>
     <w:p>
       <w:pPr>
         <w:pStyle w:val="Heading2"/>
@@ -1994,7 +2006,7 @@
         <w:t xml:space="preserve">(2) Availability</w:t>
       </w:r>
     </w:p>
-    <w:bookmarkStart w:id="1357" w:name="operating-system"/>
+    <w:bookmarkStart w:id="1394" w:name="operating-system"/>
     <w:p>
       <w:pPr>
         <w:pStyle w:val="Heading3"/>
@@ -2011,8 +2023,8 @@
         <w:t xml:space="preserve">Platform independent. The core builds with any C99 compiler; development and testing used Windows 11. The browser application runs in any current browser with WebAssembly support.</w:t>
       </w:r>
     </w:p>
-    <w:bookmarkEnd w:id="1357"/>
-    <w:bookmarkStart w:id="1358" w:name="programming-language"/>
+    <w:bookmarkEnd w:id="1394"/>
+    <w:bookmarkStart w:id="1395" w:name="programming-language"/>
     <w:p>
       <w:pPr>
         <w:pStyle w:val="Heading3"/>
@@ -2029,8 +2041,8 @@
         <w:t xml:space="preserve">C (core), Python 3.11 or later (interface and fitting tools), JavaScript (browser application).</w:t>
       </w:r>
     </w:p>
-    <w:bookmarkEnd w:id="1358"/>
-    <w:bookmarkStart w:id="1359" w:name="additional-system-requirements"/>
+    <w:bookmarkEnd w:id="1395"/>
+    <w:bookmarkStart w:id="1396" w:name="additional-system-requirements"/>
     <w:p>
       <w:pPr>
         <w:pStyle w:val="Heading3"/>
@@ -2047,8 +2059,8 @@
         <w:t xml:space="preserve">None of note. The engine and database together are a few megabytes.</w:t>
       </w:r>
     </w:p>
-    <w:bookmarkEnd w:id="1359"/>
-    <w:bookmarkStart w:id="1360" w:name="dependencies"/>
+    <w:bookmarkEnd w:id="1396"/>
+    <w:bookmarkStart w:id="1397" w:name="dependencies"/>
     <w:p>
       <w:pPr>
         <w:pStyle w:val="Heading3"/>
@@ -2065,8 +2077,8 @@
         <w:t xml:space="preserve">Python interface: cffi, NumPy, SciPy (developed and tested with cffi 2.0, NumPy 2.4, and SciPy 1.17). The validation suite additionally requires pycalphad; every oracle comparison reported here ran against pycalphad 0.11.1, and the tests that read pycalphad’s own shipped test databases skip cleanly if a later version relocates them. The WebAssembly build requires emscripten. The C core and the browser application have no dependencies.</w:t>
       </w:r>
     </w:p>
-    <w:bookmarkEnd w:id="1360"/>
-    <w:bookmarkStart w:id="1361" w:name="list-of-contributors"/>
+    <w:bookmarkEnd w:id="1397"/>
+    <w:bookmarkStart w:id="1398" w:name="list-of-contributors"/>
     <w:p>
       <w:pPr>
         <w:pStyle w:val="Heading3"/>
@@ -2083,8 +2095,8 @@
         <w:t xml:space="preserve">Michael E. Bustamante (design, implementation, validation, data curation).</w:t>
       </w:r>
     </w:p>
-    <w:bookmarkEnd w:id="1361"/>
-    <w:bookmarkStart w:id="1362" w:name="software-location"/>
+    <w:bookmarkEnd w:id="1398"/>
+    <w:bookmarkStart w:id="1399" w:name="software-location"/>
     <w:p>
       <w:pPr>
         <w:pStyle w:val="Heading3"/>
@@ -2237,8 +2249,8 @@
         <w:t xml:space="preserve">Date published: 2026-09-02</w:t>
       </w:r>
     </w:p>
-    <w:bookmarkEnd w:id="1362"/>
-    <w:bookmarkStart w:id="1363" w:name="language"/>
+    <w:bookmarkEnd w:id="1399"/>
+    <w:bookmarkStart w:id="1400" w:name="language"/>
     <w:p>
       <w:pPr>
         <w:pStyle w:val="Heading3"/>
@@ -2255,9 +2267,9 @@
         <w:t xml:space="preserve">English.</w:t>
       </w:r>
     </w:p>
-    <w:bookmarkEnd w:id="1363"/>
-    <w:bookmarkEnd w:id="1364"/>
-    <w:bookmarkStart w:id="1375" w:name="reuse-potential"/>
+    <w:bookmarkEnd w:id="1400"/>
+    <w:bookmarkEnd w:id="1401"/>
+    <w:bookmarkStart w:id="1412" w:name="reuse-potential"/>
     <w:p>
       <w:pPr>
         <w:pStyle w:val="Heading2"/>
@@ -2282,7 +2294,7 @@
         <w:t xml:space="preserve">The browser application makes the lowest barrier the default. A lecture on slag thermodynamics, a plant metallurgist screening a composition, or a reviewer checking a claimed equilibrium can load the database and calculate in seconds, with confidential inputs never leaving the machine. The same property makes it a practical template for other groups who want to publish a model as a zero-install tool.</w:t>
       </w:r>
     </w:p>
-    <w:bookmarkStart w:id="1374" w:name="worked-examples"/>
+    <w:bookmarkStart w:id="1411" w:name="worked-examples"/>
     <w:p>
       <w:pPr>
         <w:pStyle w:val="Heading3"/>
@@ -2494,18 +2506,18 @@
           <wp:inline>
             <wp:extent cx="4206240" cy="3262561"/>
             <wp:effectExtent b="0" l="0" r="0" t="0"/>
-            <wp:docPr descr="Figure 4: The LiCl-KCl phase diagram calculated by the salt listing from the shipped open database, at the listing’s own step size. Light to dark: liquid, two-phase, and subsolidus fields. The dot is the calculated eutectic at this step size (0.400, 640 K); the star is the measured eutectic (0.415, 626 K)." title="" id="1366" name="Picture"/>
+            <wp:docPr descr="Figure 4: The LiCl-KCl phase diagram calculated by the salt listing from the shipped open database, at the listing’s own step size. Light to dark: liquid, two-phase, and subsolidus fields. The dot is the calculated eutectic at this step size (0.400, 640 K); the star is the measured eutectic (0.415, 626 K)." title="" id="1403" name="Picture"/>
             <a:graphic>
               <a:graphicData uri="http://schemas.openxmlformats.org/drawingml/2006/picture">
                 <pic:pic>
                   <pic:nvPicPr>
-                    <pic:cNvPr descr="figures/fig4_salt_example.png" id="1367" name="Picture"/>
+                    <pic:cNvPr descr="figures/fig4_salt_example.png" id="1404" name="Picture"/>
                     <pic:cNvPicPr>
                       <a:picLocks noChangeArrowheads="1" noChangeAspect="1"/>
                     </pic:cNvPicPr>
                   </pic:nvPicPr>
                   <pic:blipFill>
-                    <a:blip r:embed="rId1365"/>
+                    <a:blip r:embed="rId1402"/>
                     <a:stretch>
                       <a:fillRect/>
                     </a:stretch>
@@ -2740,18 +2752,18 @@
           <wp:inline>
             <wp:extent cx="4206240" cy="3262561"/>
             <wp:effectExtent b="0" l="0" r="0" t="0"/>
-            <wp:docPr descr="Figure 5: The Al-Zn phase diagram calculated by the alloy listing from the shipped open TDB. Light to dark: liquid, liquid plus solid, and solid fields. The dot is the calculated eutectic (0.890, 660 K); the star is the assessed eutectic (0.885, 654 K)." title="" id="1369" name="Picture"/>
+            <wp:docPr descr="Figure 5: The Al-Zn phase diagram calculated by the alloy listing from the shipped open TDB. Light to dark: liquid, liquid plus solid, and solid fields. The dot is the calculated eutectic (0.890, 660 K); the star is the assessed eutectic (0.885, 654 K)." title="" id="1406" name="Picture"/>
             <a:graphic>
               <a:graphicData uri="http://schemas.openxmlformats.org/drawingml/2006/picture">
                 <pic:pic>
                   <pic:nvPicPr>
-                    <pic:cNvPr descr="figures/fig5_alloy_example.png" id="1370" name="Picture"/>
+                    <pic:cNvPr descr="figures/fig5_alloy_example.png" id="1407" name="Picture"/>
                     <pic:cNvPicPr>
                       <a:picLocks noChangeArrowheads="1" noChangeAspect="1"/>
                     </pic:cNvPicPr>
                   </pic:nvPicPr>
                   <pic:blipFill>
-                    <a:blip r:embed="rId1368"/>
+                    <a:blip r:embed="rId1405"/>
                     <a:stretch>
                       <a:fillRect/>
                     </a:stretch>
@@ -2803,7 +2815,7 @@
         <w:t xml:space="preserve"> </w:t>
       </w:r>
       <w:r>
-        <w:t xml:space="preserve">mole fraction from 1200 to 3000 K and 0.1 to 10 atm. This solver lives in the Python layer for now; its port to the WebAssembly core, and the coupling of the gas to the molten oxide for pyrometallurgical oxygen potentials, are in progress. The uTDB grammar already defines the ideal-gas phase, so a single file can in principle carry an alloy, a slag, its solids, and a gas. The repository also publishes an openly specified unified dialect (uTDB) that carries the MQMQA statements inside TDB grammar, with two shipped demonstration files chosen to be processes rather than curiosities: an aluminum-recycling database holding the Al-Zn alloy with its NaCl-KCl-MgCl2 salt flux, and a steelmaking database holding a basic Fe-C steel, magnetic phases included, with the FeO-MgO-SiO2 slag and its silicate solid solutions. Round-trip tests assert both reproduce their source-file physics at machine precision. The steelmaking file is the clearest illustration of what a unified container buys (Figure 6): from one file the browser calculates the iron-carbon alloy diagram through the magnetic compound energy formalism and its Scheil solidification path, while the same file’s slag is a molten-salt-model liquid, two physics that no single legacy container holds together. Relative to the XML road of XTDB [15] (Table 1), uTDB is the on-ramp from the installed base, extending files as they are and running in this engine today, with mechanical conversion to XTDB elements the natural bridge once that schema settles. Making the calculator multilingual across the field’s file dialects is the direction of travel. Contributions and issues are handled through the GitHub repository.</w:t>
+        <w:t xml:space="preserve">mole fraction from 1200 to 3000 K and 0.1 to 10 atm. The same solver is compiled into the WebAssembly core, so it runs in the browser gas calculator alongside the condensed engine; coupling the gas to a molten oxide, for pyrometallurgical oxygen potentials, is the step still in progress. The uTDB grammar already defines the ideal-gas phase, so a single file can in principle carry an alloy, a slag, its solids, and a gas. The repository also publishes an openly specified unified dialect (uTDB) that carries the MQMQA statements inside TDB grammar, with two shipped demonstration files chosen to be processes rather than curiosities: an aluminum-recycling database holding the Al-Zn alloy with its NaCl-KCl-MgCl2 salt flux, and a steelmaking database holding a basic Fe-C steel, magnetic phases included, with the FeO-MgO-SiO2 slag and its silicate solid solutions. Round-trip tests assert both reproduce their source-file physics at machine precision. The steelmaking file is the clearest illustration of what a unified container buys (Figure 6): from one file the browser calculates the iron-carbon alloy diagram through the magnetic compound energy formalism and its Scheil solidification path, while the same file’s slag is a molten-salt-model liquid, two physics that no single legacy container holds together. Relative to the XML road of XTDB [15] (Table 1), uTDB is the on-ramp from the installed base, extending files as they are and running in this engine today, with mechanical conversion to XTDB elements the natural bridge once that schema settles. Making the calculator multilingual across the field’s file dialects is the direction of travel. Contributions and issues are handled through the GitHub repository.</w:t>
       </w:r>
     </w:p>
     <w:p>
@@ -2815,18 +2827,18 @@
           <wp:inline>
             <wp:extent cx="5334000" cy="4756265"/>
             <wp:effectExtent b="0" l="0" r="0" t="0"/>
-            <wp:docPr descr="Figure 6: One unified (.utdb) file, two physics, calculated in the browser. (a) The steelmaking database loaded with the Melt/Alloy view toggle on Alloy; the engine calculates the Fe-C phase diagram through the magnetic compound energy formalism, with two tapped compositions pinned. (b) Scheil solidification for the same join at 4 mol% C, first solid at 1739 K and the residual liquid frozen by 1436 K, against the equilibrium lever-rule path (dashed). The file’s slag half is a Modified Quasichemical Model liquid; no legacy container holds both models at once." title="" id="1372" name="Picture"/>
+            <wp:docPr descr="Figure 6: One unified (.utdb) file, two physics, calculated in the browser. (a) The steelmaking database loaded with the Melt/Alloy view toggle on Alloy; the engine calculates the Fe-C phase diagram through the magnetic compound energy formalism, with two tapped compositions pinned. (b) Scheil solidification for the same join at 4 mol% C, first solid at 1739 K and the residual liquid frozen by 1436 K, against the equilibrium lever-rule path (dashed). The file’s slag half is a Modified Quasichemical Model liquid; no legacy container holds both models at once." title="" id="1409" name="Picture"/>
             <a:graphic>
               <a:graphicData uri="http://schemas.openxmlformats.org/drawingml/2006/picture">
                 <pic:pic>
                   <pic:nvPicPr>
-                    <pic:cNvPr descr="figures/fig6_utdb_steel.png" id="1373" name="Picture"/>
+                    <pic:cNvPr descr="figures/fig6_utdb_steel.png" id="1410" name="Picture"/>
                     <pic:cNvPicPr>
                       <a:picLocks noChangeArrowheads="1" noChangeAspect="1"/>
                     </pic:cNvPicPr>
                   </pic:nvPicPr>
                   <pic:blipFill>
-                    <a:blip r:embed="rId1371"/>
+                    <a:blip r:embed="rId1408"/>
                     <a:stretch>
                       <a:fillRect/>
                     </a:stretch>
@@ -2869,9 +2881,9 @@
         <w:t xml:space="preserve">The gap this work addresses was never the model, which has been published for two decades, but an open, runnable pairing of model and parameters. Hephaestus supplies both halves under open licenses and puts them behind a browser page that asks nothing of its user. The claims are checkable end to end. Release v0.4.0 archives the exact version described, and the 104-test suite reruns the pycalphad comparisons on any machine. The worked examples print the figures shown, and every parameter in every shipped database traces to a published measurement through its provenance file. A reader who doubts a number can recalculate it; one who needs a system that is missing can build it with the same open tools, or ask.</w:t>
       </w:r>
     </w:p>
-    <w:bookmarkEnd w:id="1374"/>
-    <w:bookmarkEnd w:id="1375"/>
-    <w:bookmarkStart w:id="1376" w:name="data-availability"/>
+    <w:bookmarkEnd w:id="1411"/>
+    <w:bookmarkEnd w:id="1412"/>
+    <w:bookmarkStart w:id="1413" w:name="data-availability"/>
     <w:p>
       <w:pPr>
         <w:pStyle w:val="Heading2"/>
@@ -2888,8 +2900,8 @@
         <w:t xml:space="preserve">The engine, the database, the browser application, and the validation suite are openly available in the code repository listed above; the version described here is archived as release v0.4.0. The database files and their provenance records are in the repository’s data directory under CC BY 4.0.</w:t>
       </w:r>
     </w:p>
-    <w:bookmarkEnd w:id="1376"/>
-    <w:bookmarkStart w:id="1377" w:name="acknowledgements"/>
+    <w:bookmarkEnd w:id="1413"/>
+    <w:bookmarkStart w:id="1414" w:name="acknowledgements"/>
     <w:p>
       <w:pPr>
         <w:pStyle w:val="Heading2"/>
@@ -2906,8 +2918,8 @@
         <w:t xml:space="preserve">During the development of this software the author used Claude Code (Anthropic) to assist with implementation, validation scripting, and manuscript preparation. This assistance was agentic, not autonomous: it operated under author direction and supervision at every step and was never a closed loop that produced or accepted results without review. Every parameter was traced by the author to its primary source before entering the database, and every reference was verified against its registry record. The author reviewed and approved all output and takes full responsibility for this article.</w:t>
       </w:r>
     </w:p>
-    <w:bookmarkEnd w:id="1377"/>
-    <w:bookmarkStart w:id="1378" w:name="funding-statement"/>
+    <w:bookmarkEnd w:id="1414"/>
+    <w:bookmarkStart w:id="1415" w:name="funding-statement"/>
     <w:p>
       <w:pPr>
         <w:pStyle w:val="Heading2"/>
@@ -2924,8 +2936,8 @@
         <w:t xml:space="preserve">The development of this software received no external funding.</w:t>
       </w:r>
     </w:p>
-    <w:bookmarkEnd w:id="1378"/>
-    <w:bookmarkStart w:id="1379" w:name="competing-interests"/>
+    <w:bookmarkEnd w:id="1415"/>
+    <w:bookmarkStart w:id="1416" w:name="competing-interests"/>
     <w:p>
       <w:pPr>
         <w:pStyle w:val="Heading2"/>
@@ -2942,8 +2954,8 @@
         <w:t xml:space="preserve">The author founded Odinzen LLC, which provides commercial thermodynamic modeling services, and declares this as a competing interest. The software and database published here are released in full under open licenses, and no proprietary Odinzen assets are included.</w:t>
       </w:r>
     </w:p>
-    <w:bookmarkEnd w:id="1379"/>
-    <w:bookmarkStart w:id="1380" w:name="references"/>
+    <w:bookmarkEnd w:id="1416"/>
+    <w:bookmarkStart w:id="1417" w:name="references"/>
     <w:p>
       <w:pPr>
         <w:pStyle w:val="Heading2"/>
@@ -3308,8 +3320,8 @@
         <w:t xml:space="preserve">[43] Smith GP, Golden DM, Frenklach M, Moriarty NW, Eiteneer B, Goldenberg M, et al. GRI-Mech 3.0 [Internet]. 1999. Available from: http://combustion.berkeley.edu/gri-mech/</w:t>
       </w:r>
     </w:p>
-    <w:bookmarkEnd w:id="1380"/>
-    <w:bookmarkEnd w:id="1381"/>
+    <w:bookmarkEnd w:id="1417"/>
+    <w:bookmarkEnd w:id="1418"/>
     <w:sectPr>
       <w:footnotePr>
         <w:numRestart w:val="eachSect"/>

</xml_diff>

<commit_message>
Gas phase in the abstract and introduction: the furnace-atmosphere motivation (CO/CO2 ratio and oxygen partial pressure govern reduction and slag oxidation) placed in the intro, the validated NASA-polynomial gas engine named in the abstract, gas equilibrium added to keywords
Co-Authored-By: Claude Opus 4.8 <noreply@anthropic.com>
</commit_message>
<xml_diff>
--- a/paper/Bustamante_Hephaestus_JORS_manuscript.docx
+++ b/paper/Bustamante_Hephaestus_JORS_manuscript.docx
@@ -2,7 +2,7 @@
 <file path=word/document.xml><?xml version="1.0" encoding="utf-8"?>
 <w:document xmlns:w="http://schemas.openxmlformats.org/wordprocessingml/2006/main" xmlns:m="http://schemas.openxmlformats.org/officeDocument/2006/math" xmlns:r="http://schemas.openxmlformats.org/officeDocument/2006/relationships" xmlns:o="urn:schemas-microsoft-com:office:office" xmlns:v="urn:schemas-microsoft-com:vml" xmlns:w10="urn:schemas-microsoft-com:office:word" xmlns:a="http://schemas.openxmlformats.org/drawingml/2006/main" xmlns:pic="http://schemas.openxmlformats.org/drawingml/2006/picture" xmlns:wp="http://schemas.openxmlformats.org/drawingml/2006/wordprocessingDrawing">
   <w:body>
-    <w:bookmarkStart w:id="1418" w:name="X4855b1162e70238fd839d871e0792397dc58430"/>
+    <w:bookmarkStart w:id="1455" w:name="X4855b1162e70238fd839d871e0792397dc58430"/>
     <w:p>
       <w:pPr>
         <w:pStyle w:val="Heading1"/>
@@ -84,7 +84,7 @@
         <w:t xml:space="preserve"> </w:t>
       </w:r>
       <w:r>
-        <w:t xml:space="preserve">slag) databases. One zero-install page calculates across all three containers. It calculates phase equilibria up to full ternary isothermal sections and liquidus projections, and Scheil-Gulliver solidification paths on any binary join. Every energy path is validated to machine precision against pycalphad, and the magnetic model additionally against the measured pure-iron transition temperatures. The companion databases cover the CaO-SiO</w:t>
+        <w:t xml:space="preserve">slag) databases. One zero-install page calculates across all three containers. It calculates phase equilibria up to full ternary isothermal sections and liquidus projections, and Scheil-Gulliver solidification paths on any binary join. A NASA-polynomial ideal-gas engine, validated against Cantera, brings the gas equilibria a furnace atmosphere demands into the same browser; coupling the gas to a condensed melt is in progress. Every energy path is validated to machine precision against pycalphad, and the magnetic model additionally against the measured pure-iron transition temperatures. The companion databases cover the CaO-SiO</w:t>
       </w:r>
       <w:r>
         <w:rPr>
@@ -156,10 +156,10 @@
         <w:t xml:space="preserve"> </w:t>
       </w:r>
       <w:r>
-        <w:t xml:space="preserve">CALPHAD; molten slag; molten salt; modified quasichemical model; thermodynamic database; phase diagram; WebAssembly; open data</w:t>
-      </w:r>
-    </w:p>
-    <w:bookmarkStart w:id="1393" w:name="overview"/>
+        <w:t xml:space="preserve">CALPHAD; molten slag; molten salt; modified quasichemical model; thermodynamic database; phase diagram; gas equilibrium; WebAssembly; open data</w:t>
+      </w:r>
+    </w:p>
+    <w:bookmarkStart w:id="1430" w:name="overview"/>
     <w:p>
       <w:pPr>
         <w:pStyle w:val="Heading2"/>
@@ -168,7 +168,7 @@
         <w:t xml:space="preserve">(1) Overview</w:t>
       </w:r>
     </w:p>
-    <w:bookmarkStart w:id="1380" w:name="introduction"/>
+    <w:bookmarkStart w:id="1417" w:name="introduction"/>
     <w:p>
       <w:pPr>
         <w:pStyle w:val="Heading3"/>
@@ -182,7 +182,7 @@
         <w:pStyle w:val="FirstParagraph"/>
       </w:pPr>
       <w:r>
-        <w:t xml:space="preserve">Molten oxide slags and molten salts are dominated by short-range ordering, which the Modified Quasichemical Model in the Quadruplet Approximation describes through the distribution of cation-anion quadruplets [1]. The quadruplet formalism is the current form of the modified quasichemical family, which grew from the pair-approximation treatment of binary liquids [2] and its application to silicate slags [3]. The model is published in full, and it is the basis of the oxide and salt databases in FactSage, the software that carries most industrial slag work [4]; databases of this kind are embedded in everyday steelmaking practice, from slag design through virtual process simulation [5,6]. What separates a published model from a usable calculation is an implementation and a parameter set. On the implementation side the situation has improved. OpenCalphad brought a free general equilibrium code [7]; pycalphad, itself published in this journal [8], gained an MQMQA model with uncertainty quantification [9] and a companion parameter-fitting framework [10]; Thermochimica calculates MQMQA molten salts inside a nuclear fuel framework [11]. Both MQMQA implementations live inside larger frameworks with correspondingly large dependency stacks. On the data side, open infrastructure has been slower to arrive. The community has argued for years that phase-based data need open infrastructure [12], yet there is no free MQMQA oxide slag database. A student, a startup, or a plant engineer who wants to calculate a slag equilibrium with open tools has the model, possibly an implementation, and no parameters to run through it.</w:t>
+        <w:t xml:space="preserve">Molten oxide slags and molten salts are dominated by short-range ordering, which the Modified Quasichemical Model in the Quadruplet Approximation describes through the distribution of cation-anion quadruplets [1]. The quadruplet formalism is the current form of the modified quasichemical family, which grew from the pair-approximation treatment of binary liquids [2] and its application to silicate slags [3]. The model is published in full, and it is the basis of the oxide and salt databases in FactSage, the software that carries most industrial slag work [4]; databases of this kind are embedded in everyday steelmaking practice, from slag design through virtual process simulation [5,6]. These processes are never purely condensed. The furnace atmosphere governs them, because the carbon monoxide to carbon dioxide ratio, and the oxygen partial pressure it fixes, decide whether a metal is reduced or a slag oxidized, so the gas belongs in the same calculation. That gas data lives in yet another open family, the NASA polynomials of combustion and aerospace. What separates a published model from a usable calculation is an implementation and a parameter set. On the implementation side the situation has improved. OpenCalphad brought a free general equilibrium code [7]; pycalphad, itself published in this journal [8], gained an MQMQA model with uncertainty quantification [9] and a companion parameter-fitting framework [10]; Thermochimica calculates MQMQA molten salts inside a nuclear fuel framework [11]. Both MQMQA implementations live inside larger frameworks with correspondingly large dependency stacks. On the data side, open infrastructure has been slower to arrive. The community has argued for years that phase-based data need open infrastructure [12], yet there is no free MQMQA oxide slag database. A student, a startup, or a plant engineer who wants to calculate a slag equilibrium with open tools has the model, possibly an implementation, and no parameters to run through it.</w:t>
       </w:r>
     </w:p>
     <w:p>
@@ -548,8 +548,8 @@
         <w:t xml:space="preserve">Hephaestus is a deliberate response to that gap, and it treats the engine and the data as one contribution because neither is useful alone. The engine is small on purpose. Its core is plain C with no dependencies, which makes it easy to embed and lets the identical code compile to WebAssembly, so the full calculator runs in a web browser with nothing installed and no data leaving the user’s machine. The database is open on purpose. Every parameter in it derives from published measurements, each value carries its provenance down to table and page, and the known shortcomings are documented next to the numbers they affect. The present work describes both, their validation against pycalphad and against measured phase equilibria, and the ways they can be reused. None of it asks the reader to program. For the experimentalist who never writes code, the browser application is the entire product: a page to open, a database to click, and a diagram to read. The sections that follow describe the machinery underneath for those who want it. Supplementary Material S1 is a plain-language primer for the non-programmer, starting at what a database file is and ending at a first calculation and how to read it. Its closing section teaches what an assessment is built from, so a reader who wants to contribute data for open publication, or to commission a file, arrives knowing what is needed.</w:t>
       </w:r>
     </w:p>
-    <w:bookmarkEnd w:id="1380"/>
-    <w:bookmarkStart w:id="1390" w:name="implementation-and-architecture"/>
+    <w:bookmarkEnd w:id="1417"/>
+    <w:bookmarkStart w:id="1427" w:name="implementation-and-architecture"/>
     <w:p>
       <w:pPr>
         <w:pStyle w:val="Heading3"/>
@@ -575,18 +575,18 @@
           <wp:inline>
             <wp:extent cx="5334000" cy="3511167"/>
             <wp:effectExtent b="0" l="0" r="0" t="0"/>
-            <wp:docPr descr="Figure 1: Architecture of Hephaestus. A single dependency-free C core reads the field’s three database dialects (ChemSage .dat, Thermo-Calc .tdb with the Inden magnetic model, and the unified .utdb) and calculates all thermodynamics; the same core is used as a native library, from Python through cffi, and compiled to WebAssembly behind the browser application. dbbuild writes new ChemSage files from measured data, and every energy path is validated against pycalphad." title="" id="1382" name="Picture"/>
+            <wp:docPr descr="Figure 1: Architecture of Hephaestus. A single dependency-free C core reads the field’s three database dialects (ChemSage .dat, Thermo-Calc .tdb with the Inden magnetic model, and the unified .utdb) and calculates all thermodynamics; the same core is used as a native library, from Python through cffi, and compiled to WebAssembly behind the browser application. dbbuild writes new ChemSage files from measured data, and every energy path is validated against pycalphad." title="" id="1419" name="Picture"/>
             <a:graphic>
               <a:graphicData uri="http://schemas.openxmlformats.org/drawingml/2006/picture">
                 <pic:pic>
                   <pic:nvPicPr>
-                    <pic:cNvPr descr="figures/fig1_architecture.png" id="1383" name="Picture"/>
+                    <pic:cNvPr descr="figures/fig1_architecture.png" id="1420" name="Picture"/>
                     <pic:cNvPicPr>
                       <a:picLocks noChangeArrowheads="1" noChangeAspect="1"/>
                     </pic:cNvPicPr>
                   </pic:nvPicPr>
                   <pic:blipFill>
-                    <a:blip r:embed="rId1381"/>
+                    <a:blip r:embed="rId1418"/>
                     <a:stretch>
                       <a:fillRect/>
                     </a:stretch>
@@ -793,18 +793,18 @@
           <wp:inline>
             <wp:extent cx="4754880" cy="4464799"/>
             <wp:effectExtent b="0" l="0" r="0" t="0"/>
-            <wp:docPr descr="Figure 2: The live solver in the browser application (light theme). The user loads the shipped database, picks a temperature, and presses Compute; the WebAssembly engine then solves the full FeO-MgO-SiO2 phase assemblage client side (here 1023 composition samples and 512 tie-facets in under half a second). Tapping a composition reads its stable phases and pins it to a comparison list; hovering previews on desktop." title="" id="1385" name="Picture"/>
+            <wp:docPr descr="Figure 2: The live solver in the browser application (light theme). The user loads the shipped database, picks a temperature, and presses Compute; the WebAssembly engine then solves the full FeO-MgO-SiO2 phase assemblage client side (here 1023 composition samples and 512 tie-facets in under half a second). Tapping a composition reads its stable phases and pins it to a comparison list; hovering previews on desktop." title="" id="1422" name="Picture"/>
             <a:graphic>
               <a:graphicData uri="http://schemas.openxmlformats.org/drawingml/2006/picture">
                 <pic:pic>
                   <pic:nvPicPr>
-                    <pic:cNvPr descr="figures/fig2_browser_app.png" id="1386" name="Picture"/>
+                    <pic:cNvPr descr="figures/fig2_browser_app.png" id="1423" name="Picture"/>
                     <pic:cNvPicPr>
                       <a:picLocks noChangeArrowheads="1" noChangeAspect="1"/>
                     </pic:cNvPicPr>
                   </pic:nvPicPr>
                   <pic:blipFill>
-                    <a:blip r:embed="rId1384"/>
+                    <a:blip r:embed="rId1421"/>
                     <a:stretch>
                       <a:fillRect/>
                     </a:stretch>
@@ -970,18 +970,18 @@
           <wp:inline>
             <wp:extent cx="5334000" cy="2197297"/>
             <wp:effectExtent b="0" l="0" r="0" t="0"/>
-            <wp:docPr descr="Figure 3: The assessed FeO-MgO-SiO2 system calculated from the shipped database files. (a) Liquidus projection: primary crystallizing phase fields, with liquidus isotherms labeled in °C. (b) Isothermal section at 1600 °C: stable phase assemblages, shaded by the number of solid phases present. Phase labels: L liquid, Crs cristobalite, Ol olivine, Opx orthopyroxene, Per periclase, Wus wustite." title="" id="1388" name="Picture"/>
+            <wp:docPr descr="Figure 3: The assessed FeO-MgO-SiO2 system calculated from the shipped database files. (a) Liquidus projection: primary crystallizing phase fields, with liquidus isotherms labeled in °C. (b) Isothermal section at 1600 °C: stable phase assemblages, shaded by the number of solid phases present. Phase labels: L liquid, Crs cristobalite, Ol olivine, Opx orthopyroxene, Per periclase, Wus wustite." title="" id="1425" name="Picture"/>
             <a:graphic>
               <a:graphicData uri="http://schemas.openxmlformats.org/drawingml/2006/picture">
                 <pic:pic>
                   <pic:nvPicPr>
-                    <pic:cNvPr descr="figures/fig3_ternary.png" id="1389" name="Picture"/>
+                    <pic:cNvPr descr="figures/fig3_ternary.png" id="1426" name="Picture"/>
                     <pic:cNvPicPr>
                       <a:picLocks noChangeArrowheads="1" noChangeAspect="1"/>
                     </pic:cNvPicPr>
                   </pic:nvPicPr>
                   <pic:blipFill>
-                    <a:blip r:embed="rId1387"/>
+                    <a:blip r:embed="rId1424"/>
                     <a:stretch>
                       <a:fillRect/>
                     </a:stretch>
@@ -1371,8 +1371,8 @@
         </w:tc>
       </w:tr>
     </w:tbl>
-    <w:bookmarkEnd w:id="1390"/>
-    <w:bookmarkStart w:id="1391" w:name="anatomy-of-a-database-file"/>
+    <w:bookmarkEnd w:id="1427"/>
+    <w:bookmarkStart w:id="1428" w:name="anatomy-of-a-database-file"/>
     <w:p>
       <w:pPr>
         <w:pStyle w:val="Heading3"/>
@@ -1405,8 +1405,8 @@
         <w:t xml:space="preserve">That asymmetry is the economics of the field in miniature: implementations of the published models are increasingly available, but each fitted parameter condenses dozens of measurements and decisions. Parameter sets rather than codes are therefore the scarce commodity, and an openly licensed, provenance-tracked database is the part of this contribution that cannot be regenerated from the paper alone.</w:t>
       </w:r>
     </w:p>
-    <w:bookmarkEnd w:id="1391"/>
-    <w:bookmarkStart w:id="1392" w:name="quality-control"/>
+    <w:bookmarkEnd w:id="1428"/>
+    <w:bookmarkStart w:id="1429" w:name="quality-control"/>
     <w:p>
       <w:pPr>
         <w:pStyle w:val="Heading3"/>
@@ -1995,9 +1995,9 @@
         <w:t xml:space="preserve">invariants sit within about 40 °C, and the ternary liquidus projection reproduces the measured field topology [24]. Development practice is plain: the repository is version controlled with tagged releases (v0.1.0 through the v0.4.0 described here), the full suite runs before every release, and a fixed bug lands together with the regression test that would have caught it. The suite runs on Windows 11 under CPython 3.11 and 3.12; the browser application is exercised in Chromium- and Gecko-based browsers. A user can confirm a working installation by running pytest against the bundled test databases, or with no installation at all by opening the web application and loading the shipped ternary database.</w:t>
       </w:r>
     </w:p>
-    <w:bookmarkEnd w:id="1392"/>
-    <w:bookmarkEnd w:id="1393"/>
-    <w:bookmarkStart w:id="1401" w:name="availability"/>
+    <w:bookmarkEnd w:id="1429"/>
+    <w:bookmarkEnd w:id="1430"/>
+    <w:bookmarkStart w:id="1438" w:name="availability"/>
     <w:p>
       <w:pPr>
         <w:pStyle w:val="Heading2"/>
@@ -2006,7 +2006,7 @@
         <w:t xml:space="preserve">(2) Availability</w:t>
       </w:r>
     </w:p>
-    <w:bookmarkStart w:id="1394" w:name="operating-system"/>
+    <w:bookmarkStart w:id="1431" w:name="operating-system"/>
     <w:p>
       <w:pPr>
         <w:pStyle w:val="Heading3"/>
@@ -2023,8 +2023,8 @@
         <w:t xml:space="preserve">Platform independent. The core builds with any C99 compiler; development and testing used Windows 11. The browser application runs in any current browser with WebAssembly support.</w:t>
       </w:r>
     </w:p>
-    <w:bookmarkEnd w:id="1394"/>
-    <w:bookmarkStart w:id="1395" w:name="programming-language"/>
+    <w:bookmarkEnd w:id="1431"/>
+    <w:bookmarkStart w:id="1432" w:name="programming-language"/>
     <w:p>
       <w:pPr>
         <w:pStyle w:val="Heading3"/>
@@ -2041,8 +2041,8 @@
         <w:t xml:space="preserve">C (core), Python 3.11 or later (interface and fitting tools), JavaScript (browser application).</w:t>
       </w:r>
     </w:p>
-    <w:bookmarkEnd w:id="1395"/>
-    <w:bookmarkStart w:id="1396" w:name="additional-system-requirements"/>
+    <w:bookmarkEnd w:id="1432"/>
+    <w:bookmarkStart w:id="1433" w:name="additional-system-requirements"/>
     <w:p>
       <w:pPr>
         <w:pStyle w:val="Heading3"/>
@@ -2059,8 +2059,8 @@
         <w:t xml:space="preserve">None of note. The engine and database together are a few megabytes.</w:t>
       </w:r>
     </w:p>
-    <w:bookmarkEnd w:id="1396"/>
-    <w:bookmarkStart w:id="1397" w:name="dependencies"/>
+    <w:bookmarkEnd w:id="1433"/>
+    <w:bookmarkStart w:id="1434" w:name="dependencies"/>
     <w:p>
       <w:pPr>
         <w:pStyle w:val="Heading3"/>
@@ -2077,8 +2077,8 @@
         <w:t xml:space="preserve">Python interface: cffi, NumPy, SciPy (developed and tested with cffi 2.0, NumPy 2.4, and SciPy 1.17). The validation suite additionally requires pycalphad; every oracle comparison reported here ran against pycalphad 0.11.1, and the tests that read pycalphad’s own shipped test databases skip cleanly if a later version relocates them. The WebAssembly build requires emscripten. The C core and the browser application have no dependencies.</w:t>
       </w:r>
     </w:p>
-    <w:bookmarkEnd w:id="1397"/>
-    <w:bookmarkStart w:id="1398" w:name="list-of-contributors"/>
+    <w:bookmarkEnd w:id="1434"/>
+    <w:bookmarkStart w:id="1435" w:name="list-of-contributors"/>
     <w:p>
       <w:pPr>
         <w:pStyle w:val="Heading3"/>
@@ -2095,8 +2095,8 @@
         <w:t xml:space="preserve">Michael E. Bustamante (design, implementation, validation, data curation).</w:t>
       </w:r>
     </w:p>
-    <w:bookmarkEnd w:id="1398"/>
-    <w:bookmarkStart w:id="1399" w:name="software-location"/>
+    <w:bookmarkEnd w:id="1435"/>
+    <w:bookmarkStart w:id="1436" w:name="software-location"/>
     <w:p>
       <w:pPr>
         <w:pStyle w:val="Heading3"/>
@@ -2249,8 +2249,8 @@
         <w:t xml:space="preserve">Date published: 2026-09-02</w:t>
       </w:r>
     </w:p>
-    <w:bookmarkEnd w:id="1399"/>
-    <w:bookmarkStart w:id="1400" w:name="language"/>
+    <w:bookmarkEnd w:id="1436"/>
+    <w:bookmarkStart w:id="1437" w:name="language"/>
     <w:p>
       <w:pPr>
         <w:pStyle w:val="Heading3"/>
@@ -2267,9 +2267,9 @@
         <w:t xml:space="preserve">English.</w:t>
       </w:r>
     </w:p>
-    <w:bookmarkEnd w:id="1400"/>
-    <w:bookmarkEnd w:id="1401"/>
-    <w:bookmarkStart w:id="1412" w:name="reuse-potential"/>
+    <w:bookmarkEnd w:id="1437"/>
+    <w:bookmarkEnd w:id="1438"/>
+    <w:bookmarkStart w:id="1449" w:name="reuse-potential"/>
     <w:p>
       <w:pPr>
         <w:pStyle w:val="Heading2"/>
@@ -2294,7 +2294,7 @@
         <w:t xml:space="preserve">The browser application makes the lowest barrier the default. A lecture on slag thermodynamics, a plant metallurgist screening a composition, or a reviewer checking a claimed equilibrium can load the database and calculate in seconds, with confidential inputs never leaving the machine. The same property makes it a practical template for other groups who want to publish a model as a zero-install tool.</w:t>
       </w:r>
     </w:p>
-    <w:bookmarkStart w:id="1411" w:name="worked-examples"/>
+    <w:bookmarkStart w:id="1448" w:name="worked-examples"/>
     <w:p>
       <w:pPr>
         <w:pStyle w:val="Heading3"/>
@@ -2506,18 +2506,18 @@
           <wp:inline>
             <wp:extent cx="4206240" cy="3262561"/>
             <wp:effectExtent b="0" l="0" r="0" t="0"/>
-            <wp:docPr descr="Figure 4: The LiCl-KCl phase diagram calculated by the salt listing from the shipped open database, at the listing’s own step size. Light to dark: liquid, two-phase, and subsolidus fields. The dot is the calculated eutectic at this step size (0.400, 640 K); the star is the measured eutectic (0.415, 626 K)." title="" id="1403" name="Picture"/>
+            <wp:docPr descr="Figure 4: The LiCl-KCl phase diagram calculated by the salt listing from the shipped open database, at the listing’s own step size. Light to dark: liquid, two-phase, and subsolidus fields. The dot is the calculated eutectic at this step size (0.400, 640 K); the star is the measured eutectic (0.415, 626 K)." title="" id="1440" name="Picture"/>
             <a:graphic>
               <a:graphicData uri="http://schemas.openxmlformats.org/drawingml/2006/picture">
                 <pic:pic>
                   <pic:nvPicPr>
-                    <pic:cNvPr descr="figures/fig4_salt_example.png" id="1404" name="Picture"/>
+                    <pic:cNvPr descr="figures/fig4_salt_example.png" id="1441" name="Picture"/>
                     <pic:cNvPicPr>
                       <a:picLocks noChangeArrowheads="1" noChangeAspect="1"/>
                     </pic:cNvPicPr>
                   </pic:nvPicPr>
                   <pic:blipFill>
-                    <a:blip r:embed="rId1402"/>
+                    <a:blip r:embed="rId1439"/>
                     <a:stretch>
                       <a:fillRect/>
                     </a:stretch>
@@ -2752,18 +2752,18 @@
           <wp:inline>
             <wp:extent cx="4206240" cy="3262561"/>
             <wp:effectExtent b="0" l="0" r="0" t="0"/>
-            <wp:docPr descr="Figure 5: The Al-Zn phase diagram calculated by the alloy listing from the shipped open TDB. Light to dark: liquid, liquid plus solid, and solid fields. The dot is the calculated eutectic (0.890, 660 K); the star is the assessed eutectic (0.885, 654 K)." title="" id="1406" name="Picture"/>
+            <wp:docPr descr="Figure 5: The Al-Zn phase diagram calculated by the alloy listing from the shipped open TDB. Light to dark: liquid, liquid plus solid, and solid fields. The dot is the calculated eutectic (0.890, 660 K); the star is the assessed eutectic (0.885, 654 K)." title="" id="1443" name="Picture"/>
             <a:graphic>
               <a:graphicData uri="http://schemas.openxmlformats.org/drawingml/2006/picture">
                 <pic:pic>
                   <pic:nvPicPr>
-                    <pic:cNvPr descr="figures/fig5_alloy_example.png" id="1407" name="Picture"/>
+                    <pic:cNvPr descr="figures/fig5_alloy_example.png" id="1444" name="Picture"/>
                     <pic:cNvPicPr>
                       <a:picLocks noChangeArrowheads="1" noChangeAspect="1"/>
                     </pic:cNvPicPr>
                   </pic:nvPicPr>
                   <pic:blipFill>
-                    <a:blip r:embed="rId1405"/>
+                    <a:blip r:embed="rId1442"/>
                     <a:stretch>
                       <a:fillRect/>
                     </a:stretch>
@@ -2827,18 +2827,18 @@
           <wp:inline>
             <wp:extent cx="5334000" cy="4756265"/>
             <wp:effectExtent b="0" l="0" r="0" t="0"/>
-            <wp:docPr descr="Figure 6: One unified (.utdb) file, two physics, calculated in the browser. (a) The steelmaking database loaded with the Melt/Alloy view toggle on Alloy; the engine calculates the Fe-C phase diagram through the magnetic compound energy formalism, with two tapped compositions pinned. (b) Scheil solidification for the same join at 4 mol% C, first solid at 1739 K and the residual liquid frozen by 1436 K, against the equilibrium lever-rule path (dashed). The file’s slag half is a Modified Quasichemical Model liquid; no legacy container holds both models at once." title="" id="1409" name="Picture"/>
+            <wp:docPr descr="Figure 6: One unified (.utdb) file, two physics, calculated in the browser. (a) The steelmaking database loaded with the Melt/Alloy view toggle on Alloy; the engine calculates the Fe-C phase diagram through the magnetic compound energy formalism, with two tapped compositions pinned. (b) Scheil solidification for the same join at 4 mol% C, first solid at 1739 K and the residual liquid frozen by 1436 K, against the equilibrium lever-rule path (dashed). The file’s slag half is a Modified Quasichemical Model liquid; no legacy container holds both models at once." title="" id="1446" name="Picture"/>
             <a:graphic>
               <a:graphicData uri="http://schemas.openxmlformats.org/drawingml/2006/picture">
                 <pic:pic>
                   <pic:nvPicPr>
-                    <pic:cNvPr descr="figures/fig6_utdb_steel.png" id="1410" name="Picture"/>
+                    <pic:cNvPr descr="figures/fig6_utdb_steel.png" id="1447" name="Picture"/>
                     <pic:cNvPicPr>
                       <a:picLocks noChangeArrowheads="1" noChangeAspect="1"/>
                     </pic:cNvPicPr>
                   </pic:nvPicPr>
                   <pic:blipFill>
-                    <a:blip r:embed="rId1408"/>
+                    <a:blip r:embed="rId1445"/>
                     <a:stretch>
                       <a:fillRect/>
                     </a:stretch>
@@ -2881,9 +2881,9 @@
         <w:t xml:space="preserve">The gap this work addresses was never the model, which has been published for two decades, but an open, runnable pairing of model and parameters. Hephaestus supplies both halves under open licenses and puts them behind a browser page that asks nothing of its user. The claims are checkable end to end. Release v0.4.0 archives the exact version described, and the 104-test suite reruns the pycalphad comparisons on any machine. The worked examples print the figures shown, and every parameter in every shipped database traces to a published measurement through its provenance file. A reader who doubts a number can recalculate it; one who needs a system that is missing can build it with the same open tools, or ask.</w:t>
       </w:r>
     </w:p>
-    <w:bookmarkEnd w:id="1411"/>
-    <w:bookmarkEnd w:id="1412"/>
-    <w:bookmarkStart w:id="1413" w:name="data-availability"/>
+    <w:bookmarkEnd w:id="1448"/>
+    <w:bookmarkEnd w:id="1449"/>
+    <w:bookmarkStart w:id="1450" w:name="data-availability"/>
     <w:p>
       <w:pPr>
         <w:pStyle w:val="Heading2"/>
@@ -2900,8 +2900,8 @@
         <w:t xml:space="preserve">The engine, the database, the browser application, and the validation suite are openly available in the code repository listed above; the version described here is archived as release v0.4.0. The database files and their provenance records are in the repository’s data directory under CC BY 4.0.</w:t>
       </w:r>
     </w:p>
-    <w:bookmarkEnd w:id="1413"/>
-    <w:bookmarkStart w:id="1414" w:name="acknowledgements"/>
+    <w:bookmarkEnd w:id="1450"/>
+    <w:bookmarkStart w:id="1451" w:name="acknowledgements"/>
     <w:p>
       <w:pPr>
         <w:pStyle w:val="Heading2"/>
@@ -2918,8 +2918,8 @@
         <w:t xml:space="preserve">During the development of this software the author used Claude Code (Anthropic) to assist with implementation, validation scripting, and manuscript preparation. This assistance was agentic, not autonomous: it operated under author direction and supervision at every step and was never a closed loop that produced or accepted results without review. Every parameter was traced by the author to its primary source before entering the database, and every reference was verified against its registry record. The author reviewed and approved all output and takes full responsibility for this article.</w:t>
       </w:r>
     </w:p>
-    <w:bookmarkEnd w:id="1414"/>
-    <w:bookmarkStart w:id="1415" w:name="funding-statement"/>
+    <w:bookmarkEnd w:id="1451"/>
+    <w:bookmarkStart w:id="1452" w:name="funding-statement"/>
     <w:p>
       <w:pPr>
         <w:pStyle w:val="Heading2"/>
@@ -2936,8 +2936,8 @@
         <w:t xml:space="preserve">The development of this software received no external funding.</w:t>
       </w:r>
     </w:p>
-    <w:bookmarkEnd w:id="1415"/>
-    <w:bookmarkStart w:id="1416" w:name="competing-interests"/>
+    <w:bookmarkEnd w:id="1452"/>
+    <w:bookmarkStart w:id="1453" w:name="competing-interests"/>
     <w:p>
       <w:pPr>
         <w:pStyle w:val="Heading2"/>
@@ -2954,8 +2954,8 @@
         <w:t xml:space="preserve">The author founded Odinzen LLC, which provides commercial thermodynamic modeling services, and declares this as a competing interest. The software and database published here are released in full under open licenses, and no proprietary Odinzen assets are included.</w:t>
       </w:r>
     </w:p>
-    <w:bookmarkEnd w:id="1416"/>
-    <w:bookmarkStart w:id="1417" w:name="references"/>
+    <w:bookmarkEnd w:id="1453"/>
+    <w:bookmarkStart w:id="1454" w:name="references"/>
     <w:p>
       <w:pPr>
         <w:pStyle w:val="Heading2"/>
@@ -3320,8 +3320,8 @@
         <w:t xml:space="preserve">[43] Smith GP, Golden DM, Frenklach M, Moriarty NW, Eiteneer B, Goldenberg M, et al. GRI-Mech 3.0 [Internet]. 1999. Available from: http://combustion.berkeley.edu/gri-mech/</w:t>
       </w:r>
     </w:p>
-    <w:bookmarkEnd w:id="1417"/>
-    <w:bookmarkEnd w:id="1418"/>
+    <w:bookmarkEnd w:id="1454"/>
+    <w:bookmarkEnd w:id="1455"/>
     <w:sectPr>
       <w:footnotePr>
         <w:numRestart w:val="eachSect"/>

</xml_diff>

<commit_message>
Paper: Peng-Robinson real-gas option described (pressurized reactors and gasifiers, validated against Cantera PR, ideal at 1 atm), validation row and 114-test count updated
Co-Authored-By: Claude Opus 4.8 <noreply@anthropic.com>
</commit_message>
<xml_diff>
--- a/paper/Bustamante_Hephaestus_JORS_manuscript.docx
+++ b/paper/Bustamante_Hephaestus_JORS_manuscript.docx
@@ -2,7 +2,7 @@
 <file path=word/document.xml><?xml version="1.0" encoding="utf-8"?>
 <w:document xmlns:w="http://schemas.openxmlformats.org/wordprocessingml/2006/main" xmlns:m="http://schemas.openxmlformats.org/officeDocument/2006/math" xmlns:r="http://schemas.openxmlformats.org/officeDocument/2006/relationships" xmlns:o="urn:schemas-microsoft-com:office:office" xmlns:v="urn:schemas-microsoft-com:vml" xmlns:w10="urn:schemas-microsoft-com:office:word" xmlns:a="http://schemas.openxmlformats.org/drawingml/2006/main" xmlns:pic="http://schemas.openxmlformats.org/drawingml/2006/picture" xmlns:wp="http://schemas.openxmlformats.org/drawingml/2006/wordprocessingDrawing">
   <w:body>
-    <w:bookmarkStart w:id="1455" w:name="X4855b1162e70238fd839d871e0792397dc58430"/>
+    <w:bookmarkStart w:id="1492" w:name="X4855b1162e70238fd839d871e0792397dc58430"/>
     <w:p>
       <w:pPr>
         <w:pStyle w:val="Heading1"/>
@@ -159,7 +159,7 @@
         <w:t xml:space="preserve">CALPHAD; molten slag; molten salt; modified quasichemical model; thermodynamic database; phase diagram; gas equilibrium; WebAssembly; open data</w:t>
       </w:r>
     </w:p>
-    <w:bookmarkStart w:id="1430" w:name="overview"/>
+    <w:bookmarkStart w:id="1467" w:name="overview"/>
     <w:p>
       <w:pPr>
         <w:pStyle w:val="Heading2"/>
@@ -168,7 +168,7 @@
         <w:t xml:space="preserve">(1) Overview</w:t>
       </w:r>
     </w:p>
-    <w:bookmarkStart w:id="1417" w:name="introduction"/>
+    <w:bookmarkStart w:id="1454" w:name="introduction"/>
     <w:p>
       <w:pPr>
         <w:pStyle w:val="Heading3"/>
@@ -548,8 +548,8 @@
         <w:t xml:space="preserve">Hephaestus is a deliberate response to that gap, and it treats the engine and the data as one contribution because neither is useful alone. The engine is small on purpose. Its core is plain C with no dependencies, which makes it easy to embed and lets the identical code compile to WebAssembly, so the full calculator runs in a web browser with nothing installed and no data leaving the user’s machine. The database is open on purpose. Every parameter in it derives from published measurements, each value carries its provenance down to table and page, and the known shortcomings are documented next to the numbers they affect. The present work describes both, their validation against pycalphad and against measured phase equilibria, and the ways they can be reused. None of it asks the reader to program. For the experimentalist who never writes code, the browser application is the entire product: a page to open, a database to click, and a diagram to read. The sections that follow describe the machinery underneath for those who want it. Supplementary Material S1 is a plain-language primer for the non-programmer, starting at what a database file is and ending at a first calculation and how to read it. Its closing section teaches what an assessment is built from, so a reader who wants to contribute data for open publication, or to commission a file, arrives knowing what is needed.</w:t>
       </w:r>
     </w:p>
-    <w:bookmarkEnd w:id="1417"/>
-    <w:bookmarkStart w:id="1427" w:name="implementation-and-architecture"/>
+    <w:bookmarkEnd w:id="1454"/>
+    <w:bookmarkStart w:id="1464" w:name="implementation-and-architecture"/>
     <w:p>
       <w:pPr>
         <w:pStyle w:val="Heading3"/>
@@ -575,18 +575,18 @@
           <wp:inline>
             <wp:extent cx="5334000" cy="3511167"/>
             <wp:effectExtent b="0" l="0" r="0" t="0"/>
-            <wp:docPr descr="Figure 1: Architecture of Hephaestus. A single dependency-free C core reads the field’s three database dialects (ChemSage .dat, Thermo-Calc .tdb with the Inden magnetic model, and the unified .utdb) and calculates all thermodynamics; the same core is used as a native library, from Python through cffi, and compiled to WebAssembly behind the browser application. dbbuild writes new ChemSage files from measured data, and every energy path is validated against pycalphad." title="" id="1419" name="Picture"/>
+            <wp:docPr descr="Figure 1: Architecture of Hephaestus. A single dependency-free C core reads the field’s three database dialects (ChemSage .dat, Thermo-Calc .tdb with the Inden magnetic model, and the unified .utdb) and calculates all thermodynamics; the same core is used as a native library, from Python through cffi, and compiled to WebAssembly behind the browser application. dbbuild writes new ChemSage files from measured data, and every energy path is validated against pycalphad." title="" id="1456" name="Picture"/>
             <a:graphic>
               <a:graphicData uri="http://schemas.openxmlformats.org/drawingml/2006/picture">
                 <pic:pic>
                   <pic:nvPicPr>
-                    <pic:cNvPr descr="figures/fig1_architecture.png" id="1420" name="Picture"/>
+                    <pic:cNvPr descr="figures/fig1_architecture.png" id="1457" name="Picture"/>
                     <pic:cNvPicPr>
                       <a:picLocks noChangeArrowheads="1" noChangeAspect="1"/>
                     </pic:cNvPicPr>
                   </pic:nvPicPr>
                   <pic:blipFill>
-                    <a:blip r:embed="rId1418"/>
+                    <a:blip r:embed="rId1455"/>
                     <a:stretch>
                       <a:fillRect/>
                     </a:stretch>
@@ -793,18 +793,18 @@
           <wp:inline>
             <wp:extent cx="4754880" cy="4464799"/>
             <wp:effectExtent b="0" l="0" r="0" t="0"/>
-            <wp:docPr descr="Figure 2: The live solver in the browser application (light theme). The user loads the shipped database, picks a temperature, and presses Compute; the WebAssembly engine then solves the full FeO-MgO-SiO2 phase assemblage client side (here 1023 composition samples and 512 tie-facets in under half a second). Tapping a composition reads its stable phases and pins it to a comparison list; hovering previews on desktop." title="" id="1422" name="Picture"/>
+            <wp:docPr descr="Figure 2: The live solver in the browser application (light theme). The user loads the shipped database, picks a temperature, and presses Compute; the WebAssembly engine then solves the full FeO-MgO-SiO2 phase assemblage client side (here 1023 composition samples and 512 tie-facets in under half a second). Tapping a composition reads its stable phases and pins it to a comparison list; hovering previews on desktop." title="" id="1459" name="Picture"/>
             <a:graphic>
               <a:graphicData uri="http://schemas.openxmlformats.org/drawingml/2006/picture">
                 <pic:pic>
                   <pic:nvPicPr>
-                    <pic:cNvPr descr="figures/fig2_browser_app.png" id="1423" name="Picture"/>
+                    <pic:cNvPr descr="figures/fig2_browser_app.png" id="1460" name="Picture"/>
                     <pic:cNvPicPr>
                       <a:picLocks noChangeArrowheads="1" noChangeAspect="1"/>
                     </pic:cNvPicPr>
                   </pic:nvPicPr>
                   <pic:blipFill>
-                    <a:blip r:embed="rId1421"/>
+                    <a:blip r:embed="rId1458"/>
                     <a:stretch>
                       <a:fillRect/>
                     </a:stretch>
@@ -970,18 +970,18 @@
           <wp:inline>
             <wp:extent cx="5334000" cy="2197297"/>
             <wp:effectExtent b="0" l="0" r="0" t="0"/>
-            <wp:docPr descr="Figure 3: The assessed FeO-MgO-SiO2 system calculated from the shipped database files. (a) Liquidus projection: primary crystallizing phase fields, with liquidus isotherms labeled in °C. (b) Isothermal section at 1600 °C: stable phase assemblages, shaded by the number of solid phases present. Phase labels: L liquid, Crs cristobalite, Ol olivine, Opx orthopyroxene, Per periclase, Wus wustite." title="" id="1425" name="Picture"/>
+            <wp:docPr descr="Figure 3: The assessed FeO-MgO-SiO2 system calculated from the shipped database files. (a) Liquidus projection: primary crystallizing phase fields, with liquidus isotherms labeled in °C. (b) Isothermal section at 1600 °C: stable phase assemblages, shaded by the number of solid phases present. Phase labels: L liquid, Crs cristobalite, Ol olivine, Opx orthopyroxene, Per periclase, Wus wustite." title="" id="1462" name="Picture"/>
             <a:graphic>
               <a:graphicData uri="http://schemas.openxmlformats.org/drawingml/2006/picture">
                 <pic:pic>
                   <pic:nvPicPr>
-                    <pic:cNvPr descr="figures/fig3_ternary.png" id="1426" name="Picture"/>
+                    <pic:cNvPr descr="figures/fig3_ternary.png" id="1463" name="Picture"/>
                     <pic:cNvPicPr>
                       <a:picLocks noChangeArrowheads="1" noChangeAspect="1"/>
                     </pic:cNvPicPr>
                   </pic:nvPicPr>
                   <pic:blipFill>
-                    <a:blip r:embed="rId1424"/>
+                    <a:blip r:embed="rId1461"/>
                     <a:stretch>
                       <a:fillRect/>
                     </a:stretch>
@@ -1371,8 +1371,8 @@
         </w:tc>
       </w:tr>
     </w:tbl>
-    <w:bookmarkEnd w:id="1427"/>
-    <w:bookmarkStart w:id="1428" w:name="anatomy-of-a-database-file"/>
+    <w:bookmarkEnd w:id="1464"/>
+    <w:bookmarkStart w:id="1465" w:name="anatomy-of-a-database-file"/>
     <w:p>
       <w:pPr>
         <w:pStyle w:val="Heading3"/>
@@ -1405,8 +1405,8 @@
         <w:t xml:space="preserve">That asymmetry is the economics of the field in miniature: implementations of the published models are increasingly available, but each fitted parameter condenses dozens of measurements and decisions. Parameter sets rather than codes are therefore the scarce commodity, and an openly licensed, provenance-tracked database is the part of this contribution that cannot be regenerated from the paper alone.</w:t>
       </w:r>
     </w:p>
-    <w:bookmarkEnd w:id="1428"/>
-    <w:bookmarkStart w:id="1429" w:name="quality-control"/>
+    <w:bookmarkEnd w:id="1465"/>
+    <w:bookmarkStart w:id="1466" w:name="quality-control"/>
     <w:p>
       <w:pPr>
         <w:pStyle w:val="Heading3"/>
@@ -1420,7 +1420,7 @@
         <w:pStyle w:val="FirstParagraph"/>
       </w:pPr>
       <w:r>
-        <w:t xml:space="preserve">Validation rests on one principle. A number is trusted only when an independent implementation reproduces it. pycalphad plays that role throughout, and Table 3 lists the checks. The pytest suite, 112 tests, compares every energy contribution on shared parameters and agrees to about 10</w:t>
+        <w:t xml:space="preserve">Validation rests on one principle. A number is trusted only when an independent implementation reproduces it. pycalphad plays that role throughout, and Table 3 lists the checks. The pytest suite, 114 tests, compares every energy contribution on shared parameters and agrees to about 10</w:t>
       </w:r>
       <w:r>
         <w:rPr>
@@ -1921,7 +1921,7 @@
               <w:jc w:val="left"/>
             </w:pPr>
             <w:r>
-              <w:t xml:space="preserve">NASA-polynomial ideal-gas equilibria, C-H-O feeds (Python and C core)</w:t>
+              <w:t xml:space="preserve">NASA-polynomial ideal-gas equilibria (Python and C core); Peng-Robinson real gas</w:t>
             </w:r>
           </w:p>
         </w:tc>
@@ -1957,7 +1957,19 @@
               <w:t xml:space="preserve"> </w:t>
             </w:r>
             <w:r>
-              <w:t xml:space="preserve">(C/browser), 1200-3000 K, 0.1-10 atm</w:t>
+              <w:t xml:space="preserve">(C/browser); real-gas compressibility to 10</w:t>
+            </w:r>
+            <w:r>
+              <w:rPr>
+                <w:vertAlign w:val="superscript"/>
+              </w:rPr>
+              <w:t xml:space="preserve">-3</w:t>
+            </w:r>
+            <w:r>
+              <w:t xml:space="preserve"> </w:t>
+            </w:r>
+            <w:r>
+              <w:t xml:space="preserve">vs Cantera PR</w:t>
             </w:r>
           </w:p>
         </w:tc>
@@ -1995,9 +2007,9 @@
         <w:t xml:space="preserve">invariants sit within about 40 °C, and the ternary liquidus projection reproduces the measured field topology [24]. Development practice is plain: the repository is version controlled with tagged releases (v0.1.0 through the v0.4.0 described here), the full suite runs before every release, and a fixed bug lands together with the regression test that would have caught it. The suite runs on Windows 11 under CPython 3.11 and 3.12; the browser application is exercised in Chromium- and Gecko-based browsers. A user can confirm a working installation by running pytest against the bundled test databases, or with no installation at all by opening the web application and loading the shipped ternary database.</w:t>
       </w:r>
     </w:p>
-    <w:bookmarkEnd w:id="1429"/>
-    <w:bookmarkEnd w:id="1430"/>
-    <w:bookmarkStart w:id="1438" w:name="availability"/>
+    <w:bookmarkEnd w:id="1466"/>
+    <w:bookmarkEnd w:id="1467"/>
+    <w:bookmarkStart w:id="1475" w:name="availability"/>
     <w:p>
       <w:pPr>
         <w:pStyle w:val="Heading2"/>
@@ -2006,7 +2018,7 @@
         <w:t xml:space="preserve">(2) Availability</w:t>
       </w:r>
     </w:p>
-    <w:bookmarkStart w:id="1431" w:name="operating-system"/>
+    <w:bookmarkStart w:id="1468" w:name="operating-system"/>
     <w:p>
       <w:pPr>
         <w:pStyle w:val="Heading3"/>
@@ -2023,8 +2035,8 @@
         <w:t xml:space="preserve">Platform independent. The core builds with any C99 compiler; development and testing used Windows 11. The browser application runs in any current browser with WebAssembly support.</w:t>
       </w:r>
     </w:p>
-    <w:bookmarkEnd w:id="1431"/>
-    <w:bookmarkStart w:id="1432" w:name="programming-language"/>
+    <w:bookmarkEnd w:id="1468"/>
+    <w:bookmarkStart w:id="1469" w:name="programming-language"/>
     <w:p>
       <w:pPr>
         <w:pStyle w:val="Heading3"/>
@@ -2041,8 +2053,8 @@
         <w:t xml:space="preserve">C (core), Python 3.11 or later (interface and fitting tools), JavaScript (browser application).</w:t>
       </w:r>
     </w:p>
-    <w:bookmarkEnd w:id="1432"/>
-    <w:bookmarkStart w:id="1433" w:name="additional-system-requirements"/>
+    <w:bookmarkEnd w:id="1469"/>
+    <w:bookmarkStart w:id="1470" w:name="additional-system-requirements"/>
     <w:p>
       <w:pPr>
         <w:pStyle w:val="Heading3"/>
@@ -2059,8 +2071,8 @@
         <w:t xml:space="preserve">None of note. The engine and database together are a few megabytes.</w:t>
       </w:r>
     </w:p>
-    <w:bookmarkEnd w:id="1433"/>
-    <w:bookmarkStart w:id="1434" w:name="dependencies"/>
+    <w:bookmarkEnd w:id="1470"/>
+    <w:bookmarkStart w:id="1471" w:name="dependencies"/>
     <w:p>
       <w:pPr>
         <w:pStyle w:val="Heading3"/>
@@ -2077,8 +2089,8 @@
         <w:t xml:space="preserve">Python interface: cffi, NumPy, SciPy (developed and tested with cffi 2.0, NumPy 2.4, and SciPy 1.17). The validation suite additionally requires pycalphad; every oracle comparison reported here ran against pycalphad 0.11.1, and the tests that read pycalphad’s own shipped test databases skip cleanly if a later version relocates them. The WebAssembly build requires emscripten. The C core and the browser application have no dependencies.</w:t>
       </w:r>
     </w:p>
-    <w:bookmarkEnd w:id="1434"/>
-    <w:bookmarkStart w:id="1435" w:name="list-of-contributors"/>
+    <w:bookmarkEnd w:id="1471"/>
+    <w:bookmarkStart w:id="1472" w:name="list-of-contributors"/>
     <w:p>
       <w:pPr>
         <w:pStyle w:val="Heading3"/>
@@ -2095,8 +2107,8 @@
         <w:t xml:space="preserve">Michael E. Bustamante (design, implementation, validation, data curation).</w:t>
       </w:r>
     </w:p>
-    <w:bookmarkEnd w:id="1435"/>
-    <w:bookmarkStart w:id="1436" w:name="software-location"/>
+    <w:bookmarkEnd w:id="1472"/>
+    <w:bookmarkStart w:id="1473" w:name="software-location"/>
     <w:p>
       <w:pPr>
         <w:pStyle w:val="Heading3"/>
@@ -2249,8 +2261,8 @@
         <w:t xml:space="preserve">Date published: 2026-09-02</w:t>
       </w:r>
     </w:p>
-    <w:bookmarkEnd w:id="1436"/>
-    <w:bookmarkStart w:id="1437" w:name="language"/>
+    <w:bookmarkEnd w:id="1473"/>
+    <w:bookmarkStart w:id="1474" w:name="language"/>
     <w:p>
       <w:pPr>
         <w:pStyle w:val="Heading3"/>
@@ -2267,9 +2279,9 @@
         <w:t xml:space="preserve">English.</w:t>
       </w:r>
     </w:p>
-    <w:bookmarkEnd w:id="1437"/>
-    <w:bookmarkEnd w:id="1438"/>
-    <w:bookmarkStart w:id="1449" w:name="reuse-potential"/>
+    <w:bookmarkEnd w:id="1474"/>
+    <w:bookmarkEnd w:id="1475"/>
+    <w:bookmarkStart w:id="1486" w:name="reuse-potential"/>
     <w:p>
       <w:pPr>
         <w:pStyle w:val="Heading2"/>
@@ -2294,7 +2306,7 @@
         <w:t xml:space="preserve">The browser application makes the lowest barrier the default. A lecture on slag thermodynamics, a plant metallurgist screening a composition, or a reviewer checking a claimed equilibrium can load the database and calculate in seconds, with confidential inputs never leaving the machine. The same property makes it a practical template for other groups who want to publish a model as a zero-install tool.</w:t>
       </w:r>
     </w:p>
-    <w:bookmarkStart w:id="1448" w:name="worked-examples"/>
+    <w:bookmarkStart w:id="1485" w:name="worked-examples"/>
     <w:p>
       <w:pPr>
         <w:pStyle w:val="Heading3"/>
@@ -2506,18 +2518,18 @@
           <wp:inline>
             <wp:extent cx="4206240" cy="3262561"/>
             <wp:effectExtent b="0" l="0" r="0" t="0"/>
-            <wp:docPr descr="Figure 4: The LiCl-KCl phase diagram calculated by the salt listing from the shipped open database, at the listing’s own step size. Light to dark: liquid, two-phase, and subsolidus fields. The dot is the calculated eutectic at this step size (0.400, 640 K); the star is the measured eutectic (0.415, 626 K)." title="" id="1440" name="Picture"/>
+            <wp:docPr descr="Figure 4: The LiCl-KCl phase diagram calculated by the salt listing from the shipped open database, at the listing’s own step size. Light to dark: liquid, two-phase, and subsolidus fields. The dot is the calculated eutectic at this step size (0.400, 640 K); the star is the measured eutectic (0.415, 626 K)." title="" id="1477" name="Picture"/>
             <a:graphic>
               <a:graphicData uri="http://schemas.openxmlformats.org/drawingml/2006/picture">
                 <pic:pic>
                   <pic:nvPicPr>
-                    <pic:cNvPr descr="figures/fig4_salt_example.png" id="1441" name="Picture"/>
+                    <pic:cNvPr descr="figures/fig4_salt_example.png" id="1478" name="Picture"/>
                     <pic:cNvPicPr>
                       <a:picLocks noChangeArrowheads="1" noChangeAspect="1"/>
                     </pic:cNvPicPr>
                   </pic:nvPicPr>
                   <pic:blipFill>
-                    <a:blip r:embed="rId1439"/>
+                    <a:blip r:embed="rId1476"/>
                     <a:stretch>
                       <a:fillRect/>
                     </a:stretch>
@@ -2752,18 +2764,18 @@
           <wp:inline>
             <wp:extent cx="4206240" cy="3262561"/>
             <wp:effectExtent b="0" l="0" r="0" t="0"/>
-            <wp:docPr descr="Figure 5: The Al-Zn phase diagram calculated by the alloy listing from the shipped open TDB. Light to dark: liquid, liquid plus solid, and solid fields. The dot is the calculated eutectic (0.890, 660 K); the star is the assessed eutectic (0.885, 654 K)." title="" id="1443" name="Picture"/>
+            <wp:docPr descr="Figure 5: The Al-Zn phase diagram calculated by the alloy listing from the shipped open TDB. Light to dark: liquid, liquid plus solid, and solid fields. The dot is the calculated eutectic (0.890, 660 K); the star is the assessed eutectic (0.885, 654 K)." title="" id="1480" name="Picture"/>
             <a:graphic>
               <a:graphicData uri="http://schemas.openxmlformats.org/drawingml/2006/picture">
                 <pic:pic>
                   <pic:nvPicPr>
-                    <pic:cNvPr descr="figures/fig5_alloy_example.png" id="1444" name="Picture"/>
+                    <pic:cNvPr descr="figures/fig5_alloy_example.png" id="1481" name="Picture"/>
                     <pic:cNvPicPr>
                       <a:picLocks noChangeArrowheads="1" noChangeAspect="1"/>
                     </pic:cNvPicPr>
                   </pic:nvPicPr>
                   <pic:blipFill>
-                    <a:blip r:embed="rId1442"/>
+                    <a:blip r:embed="rId1479"/>
                     <a:stretch>
                       <a:fillRect/>
                     </a:stretch>
@@ -2815,7 +2827,7 @@
         <w:t xml:space="preserve"> </w:t>
       </w:r>
       <w:r>
-        <w:t xml:space="preserve">mole fraction from 1200 to 3000 K and 0.1 to 10 atm. The same solver is compiled into the WebAssembly core, so it runs in the browser gas calculator alongside the condensed engine; coupling the gas to a molten oxide, for pyrometallurgical oxygen potentials, is the step still in progress. The uTDB grammar already defines the ideal-gas phase, so a single file can in principle carry an alloy, a slag, its solids, and a gas. The repository also publishes an openly specified unified dialect (uTDB) that carries the MQMQA statements inside TDB grammar, with two shipped demonstration files chosen to be processes rather than curiosities: an aluminum-recycling database holding the Al-Zn alloy with its NaCl-KCl-MgCl2 salt flux, and a steelmaking database holding a basic Fe-C steel, magnetic phases included, with the FeO-MgO-SiO2 slag and its silicate solid solutions. Round-trip tests assert both reproduce their source-file physics at machine precision. The steelmaking file is the clearest illustration of what a unified container buys (Figure 6): from one file the browser calculates the iron-carbon alloy diagram through the magnetic compound energy formalism and its Scheil solidification path, while the same file’s slag is a molten-salt-model liquid, two physics that no single legacy container holds together. Relative to the XML road of XTDB [15] (Table 1), uTDB is the on-ramp from the installed base, extending files as they are and running in this engine today, with mechanical conversion to XTDB elements the natural bridge once that schema settles. Making the calculator multilingual across the field’s file dialects is the direction of travel. Contributions and issues are handled through the GitHub repository.</w:t>
+        <w:t xml:space="preserve">mole fraction from 1200 to 3000 K and 0.1 to 10 atm. The same solver is compiled into the WebAssembly core, so it runs in the browser gas calculator alongside the condensed engine. For the dense conditions of pressurized reactors and gasifiers, a Peng-Robinson real-gas option applies fugacity corrections from tabulated critical constants, validated against Cantera’s own Peng-Robinson and reducing to the ideal result at atmospheric pressure. Coupling the gas to a molten oxide, for pyrometallurgical oxygen potentials, is the step still in progress. The uTDB grammar already defines the ideal-gas phase, so a single file can in principle carry an alloy, a slag, its solids, and a gas. The repository also publishes an openly specified unified dialect (uTDB) that carries the MQMQA statements inside TDB grammar, with two shipped demonstration files chosen to be processes rather than curiosities: an aluminum-recycling database holding the Al-Zn alloy with its NaCl-KCl-MgCl2 salt flux, and a steelmaking database holding a basic Fe-C steel, magnetic phases included, with the FeO-MgO-SiO2 slag and its silicate solid solutions. Round-trip tests assert both reproduce their source-file physics at machine precision. The steelmaking file is the clearest illustration of what a unified container buys (Figure 6): from one file the browser calculates the iron-carbon alloy diagram through the magnetic compound energy formalism and its Scheil solidification path, while the same file’s slag is a molten-salt-model liquid, two physics that no single legacy container holds together. Relative to the XML road of XTDB [15] (Table 1), uTDB is the on-ramp from the installed base, extending files as they are and running in this engine today, with mechanical conversion to XTDB elements the natural bridge once that schema settles. Making the calculator multilingual across the field’s file dialects is the direction of travel. Contributions and issues are handled through the GitHub repository.</w:t>
       </w:r>
     </w:p>
     <w:p>
@@ -2827,18 +2839,18 @@
           <wp:inline>
             <wp:extent cx="5334000" cy="4756265"/>
             <wp:effectExtent b="0" l="0" r="0" t="0"/>
-            <wp:docPr descr="Figure 6: One unified (.utdb) file, two physics, calculated in the browser. (a) The steelmaking database loaded with the Melt/Alloy view toggle on Alloy; the engine calculates the Fe-C phase diagram through the magnetic compound energy formalism, with two tapped compositions pinned. (b) Scheil solidification for the same join at 4 mol% C, first solid at 1739 K and the residual liquid frozen by 1436 K, against the equilibrium lever-rule path (dashed). The file’s slag half is a Modified Quasichemical Model liquid; no legacy container holds both models at once." title="" id="1446" name="Picture"/>
+            <wp:docPr descr="Figure 6: One unified (.utdb) file, two physics, calculated in the browser. (a) The steelmaking database loaded with the Melt/Alloy view toggle on Alloy; the engine calculates the Fe-C phase diagram through the magnetic compound energy formalism, with two tapped compositions pinned. (b) Scheil solidification for the same join at 4 mol% C, first solid at 1739 K and the residual liquid frozen by 1436 K, against the equilibrium lever-rule path (dashed). The file’s slag half is a Modified Quasichemical Model liquid; no legacy container holds both models at once." title="" id="1483" name="Picture"/>
             <a:graphic>
               <a:graphicData uri="http://schemas.openxmlformats.org/drawingml/2006/picture">
                 <pic:pic>
                   <pic:nvPicPr>
-                    <pic:cNvPr descr="figures/fig6_utdb_steel.png" id="1447" name="Picture"/>
+                    <pic:cNvPr descr="figures/fig6_utdb_steel.png" id="1484" name="Picture"/>
                     <pic:cNvPicPr>
                       <a:picLocks noChangeArrowheads="1" noChangeAspect="1"/>
                     </pic:cNvPicPr>
                   </pic:nvPicPr>
                   <pic:blipFill>
-                    <a:blip r:embed="rId1445"/>
+                    <a:blip r:embed="rId1482"/>
                     <a:stretch>
                       <a:fillRect/>
                     </a:stretch>
@@ -2881,9 +2893,9 @@
         <w:t xml:space="preserve">The gap this work addresses was never the model, which has been published for two decades, but an open, runnable pairing of model and parameters. Hephaestus supplies both halves under open licenses and puts them behind a browser page that asks nothing of its user. The claims are checkable end to end. Release v0.4.0 archives the exact version described, and the 104-test suite reruns the pycalphad comparisons on any machine. The worked examples print the figures shown, and every parameter in every shipped database traces to a published measurement through its provenance file. A reader who doubts a number can recalculate it; one who needs a system that is missing can build it with the same open tools, or ask.</w:t>
       </w:r>
     </w:p>
-    <w:bookmarkEnd w:id="1448"/>
-    <w:bookmarkEnd w:id="1449"/>
-    <w:bookmarkStart w:id="1450" w:name="data-availability"/>
+    <w:bookmarkEnd w:id="1485"/>
+    <w:bookmarkEnd w:id="1486"/>
+    <w:bookmarkStart w:id="1487" w:name="data-availability"/>
     <w:p>
       <w:pPr>
         <w:pStyle w:val="Heading2"/>
@@ -2900,8 +2912,8 @@
         <w:t xml:space="preserve">The engine, the database, the browser application, and the validation suite are openly available in the code repository listed above; the version described here is archived as release v0.4.0. The database files and their provenance records are in the repository’s data directory under CC BY 4.0.</w:t>
       </w:r>
     </w:p>
-    <w:bookmarkEnd w:id="1450"/>
-    <w:bookmarkStart w:id="1451" w:name="acknowledgements"/>
+    <w:bookmarkEnd w:id="1487"/>
+    <w:bookmarkStart w:id="1488" w:name="acknowledgements"/>
     <w:p>
       <w:pPr>
         <w:pStyle w:val="Heading2"/>
@@ -2918,8 +2930,8 @@
         <w:t xml:space="preserve">During the development of this software the author used Claude Code (Anthropic) to assist with implementation, validation scripting, and manuscript preparation. This assistance was agentic, not autonomous: it operated under author direction and supervision at every step and was never a closed loop that produced or accepted results without review. Every parameter was traced by the author to its primary source before entering the database, and every reference was verified against its registry record. The author reviewed and approved all output and takes full responsibility for this article.</w:t>
       </w:r>
     </w:p>
-    <w:bookmarkEnd w:id="1451"/>
-    <w:bookmarkStart w:id="1452" w:name="funding-statement"/>
+    <w:bookmarkEnd w:id="1488"/>
+    <w:bookmarkStart w:id="1489" w:name="funding-statement"/>
     <w:p>
       <w:pPr>
         <w:pStyle w:val="Heading2"/>
@@ -2936,8 +2948,8 @@
         <w:t xml:space="preserve">The development of this software received no external funding.</w:t>
       </w:r>
     </w:p>
-    <w:bookmarkEnd w:id="1452"/>
-    <w:bookmarkStart w:id="1453" w:name="competing-interests"/>
+    <w:bookmarkEnd w:id="1489"/>
+    <w:bookmarkStart w:id="1490" w:name="competing-interests"/>
     <w:p>
       <w:pPr>
         <w:pStyle w:val="Heading2"/>
@@ -2954,8 +2966,8 @@
         <w:t xml:space="preserve">The author founded Odinzen LLC, which provides commercial thermodynamic modeling services, and declares this as a competing interest. The software and database published here are released in full under open licenses, and no proprietary Odinzen assets are included.</w:t>
       </w:r>
     </w:p>
-    <w:bookmarkEnd w:id="1453"/>
-    <w:bookmarkStart w:id="1454" w:name="references"/>
+    <w:bookmarkEnd w:id="1490"/>
+    <w:bookmarkStart w:id="1491" w:name="references"/>
     <w:p>
       <w:pPr>
         <w:pStyle w:val="Heading2"/>
@@ -3320,8 +3332,8 @@
         <w:t xml:space="preserve">[43] Smith GP, Golden DM, Frenklach M, Moriarty NW, Eiteneer B, Goldenberg M, et al. GRI-Mech 3.0 [Internet]. 1999. Available from: http://combustion.berkeley.edu/gri-mech/</w:t>
       </w:r>
     </w:p>
-    <w:bookmarkEnd w:id="1454"/>
-    <w:bookmarkEnd w:id="1455"/>
+    <w:bookmarkEnd w:id="1491"/>
+    <w:bookmarkEnd w:id="1492"/>
     <w:sectPr>
       <w:footnotePr>
         <w:numRestart w:val="eachSect"/>

</xml_diff>

<commit_message>
Figures 2 and 6 re-shot with the current site theme; fig2 now scripted (shoot_fig2.py) instead of a manual capture. The fig2 caption updated to the run the figure actually shows (861 samples, 595 tie-facets, about two seconds through the live loaded-file path), the live-solver timing claim relaxed to a second or two, and a stale 104-test count in the conclusion corrected to 114
Co-Authored-By: Claude Fable 5 <noreply@anthropic.com>
</commit_message>
<xml_diff>
--- a/paper/Bustamante_Hephaestus_JORS_manuscript.docx
+++ b/paper/Bustamante_Hephaestus_JORS_manuscript.docx
@@ -2,7 +2,7 @@
 <file path=word/document.xml><?xml version="1.0" encoding="utf-8"?>
 <w:document xmlns:w="http://schemas.openxmlformats.org/wordprocessingml/2006/main" xmlns:m="http://schemas.openxmlformats.org/officeDocument/2006/math" xmlns:r="http://schemas.openxmlformats.org/officeDocument/2006/relationships" xmlns:o="urn:schemas-microsoft-com:office:office" xmlns:v="urn:schemas-microsoft-com:vml" xmlns:w10="urn:schemas-microsoft-com:office:word" xmlns:a="http://schemas.openxmlformats.org/drawingml/2006/main" xmlns:pic="http://schemas.openxmlformats.org/drawingml/2006/picture" xmlns:wp="http://schemas.openxmlformats.org/drawingml/2006/wordprocessingDrawing">
   <w:body>
-    <w:bookmarkStart w:id="1492" w:name="X4855b1162e70238fd839d871e0792397dc58430"/>
+    <w:bookmarkStart w:id="1529" w:name="X4855b1162e70238fd839d871e0792397dc58430"/>
     <w:p>
       <w:pPr>
         <w:pStyle w:val="Heading1"/>
@@ -159,7 +159,7 @@
         <w:t xml:space="preserve">CALPHAD; molten slag; molten salt; modified quasichemical model; thermodynamic database; phase diagram; gas equilibrium; WebAssembly; open data</w:t>
       </w:r>
     </w:p>
-    <w:bookmarkStart w:id="1467" w:name="overview"/>
+    <w:bookmarkStart w:id="1504" w:name="overview"/>
     <w:p>
       <w:pPr>
         <w:pStyle w:val="Heading2"/>
@@ -168,7 +168,7 @@
         <w:t xml:space="preserve">(1) Overview</w:t>
       </w:r>
     </w:p>
-    <w:bookmarkStart w:id="1454" w:name="introduction"/>
+    <w:bookmarkStart w:id="1491" w:name="introduction"/>
     <w:p>
       <w:pPr>
         <w:pStyle w:val="Heading3"/>
@@ -548,8 +548,8 @@
         <w:t xml:space="preserve">Hephaestus is a deliberate response to that gap, and it treats the engine and the data as one contribution because neither is useful alone. The engine is small on purpose. Its core is plain C with no dependencies, which makes it easy to embed and lets the identical code compile to WebAssembly, so the full calculator runs in a web browser with nothing installed and no data leaving the user’s machine. The database is open on purpose. Every parameter in it derives from published measurements, each value carries its provenance down to table and page, and the known shortcomings are documented next to the numbers they affect. The present work describes both, their validation against pycalphad and against measured phase equilibria, and the ways they can be reused. None of it asks the reader to program. For the experimentalist who never writes code, the browser application is the entire product: a page to open, a database to click, and a diagram to read. The sections that follow describe the machinery underneath for those who want it. Supplementary Material S1 is a plain-language primer for the non-programmer, starting at what a database file is and ending at a first calculation and how to read it. Its closing section teaches what an assessment is built from, so a reader who wants to contribute data for open publication, or to commission a file, arrives knowing what is needed.</w:t>
       </w:r>
     </w:p>
-    <w:bookmarkEnd w:id="1454"/>
-    <w:bookmarkStart w:id="1464" w:name="implementation-and-architecture"/>
+    <w:bookmarkEnd w:id="1491"/>
+    <w:bookmarkStart w:id="1501" w:name="implementation-and-architecture"/>
     <w:p>
       <w:pPr>
         <w:pStyle w:val="Heading3"/>
@@ -575,18 +575,18 @@
           <wp:inline>
             <wp:extent cx="5334000" cy="3511167"/>
             <wp:effectExtent b="0" l="0" r="0" t="0"/>
-            <wp:docPr descr="Figure 1: Architecture of Hephaestus. A single dependency-free C core reads the field’s three database dialects (ChemSage .dat, Thermo-Calc .tdb with the Inden magnetic model, and the unified .utdb) and calculates all thermodynamics; the same core is used as a native library, from Python through cffi, and compiled to WebAssembly behind the browser application. dbbuild writes new ChemSage files from measured data, and every energy path is validated against pycalphad." title="" id="1456" name="Picture"/>
+            <wp:docPr descr="Figure 1: Architecture of Hephaestus. A single dependency-free C core reads the field’s three database dialects (ChemSage .dat, Thermo-Calc .tdb with the Inden magnetic model, and the unified .utdb) and calculates all thermodynamics; the same core is used as a native library, from Python through cffi, and compiled to WebAssembly behind the browser application. dbbuild writes new ChemSage files from measured data, and every energy path is validated against pycalphad." title="" id="1493" name="Picture"/>
             <a:graphic>
               <a:graphicData uri="http://schemas.openxmlformats.org/drawingml/2006/picture">
                 <pic:pic>
                   <pic:nvPicPr>
-                    <pic:cNvPr descr="figures/fig1_architecture.png" id="1457" name="Picture"/>
+                    <pic:cNvPr descr="figures/fig1_architecture.png" id="1494" name="Picture"/>
                     <pic:cNvPicPr>
                       <a:picLocks noChangeArrowheads="1" noChangeAspect="1"/>
                     </pic:cNvPicPr>
                   </pic:nvPicPr>
                   <pic:blipFill>
-                    <a:blip r:embed="rId1455"/>
+                    <a:blip r:embed="rId1492"/>
                     <a:stretch>
                       <a:fillRect/>
                     </a:stretch>
@@ -781,7 +781,7 @@
         <w:t xml:space="preserve"> </w:t>
       </w:r>
       <w:r>
-        <w:t xml:space="preserve">diagrams, and a live isothermal-section solver calculates the full phase assemblage at a chosen temperature in about a second, for the shipped ternaries or for any loaded three-cation file (Figure 2). An interactive eutectic builder pre-fills its component names, melting points, and fusion enthalpies from the loaded database. A gas-equilibrium calculator solves ideal-gas equilibrium over an open NASA-polynomial database, its own engine compiled into the same WebAssembly core. Loading an alloy TDB reshapes the workspace: the elements become the end members and every compound energy formalism phase spanning the join enters the same convex hull construction. Everything runs client side. The page holds a strict content security policy, escapes all file-derived strings, makes no third-party requests, and never transmits a loaded file, which matters to industrial users whose compositions are confidential.</w:t>
+        <w:t xml:space="preserve">diagrams, and a live isothermal-section solver calculates the full phase assemblage at a chosen temperature in a second or two, for the shipped ternaries or for any loaded three-cation file (Figure 2). An interactive eutectic builder pre-fills its component names, melting points, and fusion enthalpies from the loaded database. A gas-equilibrium calculator solves ideal-gas equilibrium over an open NASA-polynomial database, its own engine compiled into the same WebAssembly core. Loading an alloy TDB reshapes the workspace: the elements become the end members and every compound energy formalism phase spanning the join enters the same convex hull construction. Everything runs client side. The page holds a strict content security policy, escapes all file-derived strings, makes no third-party requests, and never transmits a loaded file, which matters to industrial users whose compositions are confidential.</w:t>
       </w:r>
     </w:p>
     <w:p>
@@ -791,20 +791,20 @@
       <w:r>
         <w:drawing>
           <wp:inline>
-            <wp:extent cx="4754880" cy="4464799"/>
+            <wp:extent cx="4754880" cy="3913308"/>
             <wp:effectExtent b="0" l="0" r="0" t="0"/>
-            <wp:docPr descr="Figure 2: The live solver in the browser application (light theme). The user loads the shipped database, picks a temperature, and presses Compute; the WebAssembly engine then solves the full FeO-MgO-SiO2 phase assemblage client side (here 1023 composition samples and 512 tie-facets in under half a second). Tapping a composition reads its stable phases and pins it to a comparison list; hovering previews on desktop." title="" id="1459" name="Picture"/>
+            <wp:docPr descr="Figure 2: The live solver in the browser application (light theme). The user loads the shipped database, picks a temperature, and presses Compute; the WebAssembly engine then solves the full FeO-MgO-SiO2 phase assemblage client side (here 861 composition samples and 595 tie-facets in about two seconds). Tapping a composition reads its stable phases and pins it to a comparison list; hovering previews on desktop." title="" id="1496" name="Picture"/>
             <a:graphic>
               <a:graphicData uri="http://schemas.openxmlformats.org/drawingml/2006/picture">
                 <pic:pic>
                   <pic:nvPicPr>
-                    <pic:cNvPr descr="figures/fig2_browser_app.png" id="1460" name="Picture"/>
+                    <pic:cNvPr descr="figures/fig2_browser_app.png" id="1497" name="Picture"/>
                     <pic:cNvPicPr>
                       <a:picLocks noChangeArrowheads="1" noChangeAspect="1"/>
                     </pic:cNvPicPr>
                   </pic:nvPicPr>
                   <pic:blipFill>
-                    <a:blip r:embed="rId1458"/>
+                    <a:blip r:embed="rId1495"/>
                     <a:stretch>
                       <a:fillRect/>
                     </a:stretch>
@@ -812,7 +812,7 @@
                   <pic:spPr bwMode="auto">
                     <a:xfrm>
                       <a:off x="0" y="0"/>
-                      <a:ext cx="4754880" cy="4464799"/>
+                      <a:ext cx="4754880" cy="3913308"/>
                     </a:xfrm>
                     <a:prstGeom prst="rect">
                       <a:avLst/>
@@ -848,7 +848,7 @@
         <w:t xml:space="preserve"> </w:t>
       </w:r>
       <w:r>
-        <w:t xml:space="preserve">phase assemblage client side (here 1023 composition samples and 512 tie-facets in under half a second). Tapping a composition reads its stable phases and pins it to a comparison list; hovering previews on desktop.</w:t>
+        <w:t xml:space="preserve">phase assemblage client side (here 861 composition samples and 595 tie-facets in about two seconds). Tapping a composition reads its stable phases and pins it to a comparison list; hovering previews on desktop.</w:t>
       </w:r>
     </w:p>
     <w:p>
@@ -970,18 +970,18 @@
           <wp:inline>
             <wp:extent cx="5334000" cy="2197297"/>
             <wp:effectExtent b="0" l="0" r="0" t="0"/>
-            <wp:docPr descr="Figure 3: The assessed FeO-MgO-SiO2 system calculated from the shipped database files. (a) Liquidus projection: primary crystallizing phase fields, with liquidus isotherms labeled in °C. (b) Isothermal section at 1600 °C: stable phase assemblages, shaded by the number of solid phases present. Phase labels: L liquid, Crs cristobalite, Ol olivine, Opx orthopyroxene, Per periclase, Wus wustite." title="" id="1462" name="Picture"/>
+            <wp:docPr descr="Figure 3: The assessed FeO-MgO-SiO2 system calculated from the shipped database files. (a) Liquidus projection: primary crystallizing phase fields, with liquidus isotherms labeled in °C. (b) Isothermal section at 1600 °C: stable phase assemblages, shaded by the number of solid phases present. Phase labels: L liquid, Crs cristobalite, Ol olivine, Opx orthopyroxene, Per periclase, Wus wustite." title="" id="1499" name="Picture"/>
             <a:graphic>
               <a:graphicData uri="http://schemas.openxmlformats.org/drawingml/2006/picture">
                 <pic:pic>
                   <pic:nvPicPr>
-                    <pic:cNvPr descr="figures/fig3_ternary.png" id="1463" name="Picture"/>
+                    <pic:cNvPr descr="figures/fig3_ternary.png" id="1500" name="Picture"/>
                     <pic:cNvPicPr>
                       <a:picLocks noChangeArrowheads="1" noChangeAspect="1"/>
                     </pic:cNvPicPr>
                   </pic:nvPicPr>
                   <pic:blipFill>
-                    <a:blip r:embed="rId1461"/>
+                    <a:blip r:embed="rId1498"/>
                     <a:stretch>
                       <a:fillRect/>
                     </a:stretch>
@@ -1371,8 +1371,8 @@
         </w:tc>
       </w:tr>
     </w:tbl>
-    <w:bookmarkEnd w:id="1464"/>
-    <w:bookmarkStart w:id="1465" w:name="anatomy-of-a-database-file"/>
+    <w:bookmarkEnd w:id="1501"/>
+    <w:bookmarkStart w:id="1502" w:name="anatomy-of-a-database-file"/>
     <w:p>
       <w:pPr>
         <w:pStyle w:val="Heading3"/>
@@ -1405,8 +1405,8 @@
         <w:t xml:space="preserve">That asymmetry is the economics of the field in miniature: implementations of the published models are increasingly available, but each fitted parameter condenses dozens of measurements and decisions. Parameter sets rather than codes are therefore the scarce commodity, and an openly licensed, provenance-tracked database is the part of this contribution that cannot be regenerated from the paper alone.</w:t>
       </w:r>
     </w:p>
-    <w:bookmarkEnd w:id="1465"/>
-    <w:bookmarkStart w:id="1466" w:name="quality-control"/>
+    <w:bookmarkEnd w:id="1502"/>
+    <w:bookmarkStart w:id="1503" w:name="quality-control"/>
     <w:p>
       <w:pPr>
         <w:pStyle w:val="Heading3"/>
@@ -2007,9 +2007,9 @@
         <w:t xml:space="preserve">invariants sit within about 40 °C, and the ternary liquidus projection reproduces the measured field topology [24]. Development practice is plain: the repository is version controlled with tagged releases (v0.1.0 through the v0.4.0 described here), the full suite runs before every release, and a fixed bug lands together with the regression test that would have caught it. The suite runs on Windows 11 under CPython 3.11 and 3.12; the browser application is exercised in Chromium- and Gecko-based browsers. A user can confirm a working installation by running pytest against the bundled test databases, or with no installation at all by opening the web application and loading the shipped ternary database.</w:t>
       </w:r>
     </w:p>
-    <w:bookmarkEnd w:id="1466"/>
-    <w:bookmarkEnd w:id="1467"/>
-    <w:bookmarkStart w:id="1475" w:name="availability"/>
+    <w:bookmarkEnd w:id="1503"/>
+    <w:bookmarkEnd w:id="1504"/>
+    <w:bookmarkStart w:id="1512" w:name="availability"/>
     <w:p>
       <w:pPr>
         <w:pStyle w:val="Heading2"/>
@@ -2018,7 +2018,7 @@
         <w:t xml:space="preserve">(2) Availability</w:t>
       </w:r>
     </w:p>
-    <w:bookmarkStart w:id="1468" w:name="operating-system"/>
+    <w:bookmarkStart w:id="1505" w:name="operating-system"/>
     <w:p>
       <w:pPr>
         <w:pStyle w:val="Heading3"/>
@@ -2035,8 +2035,8 @@
         <w:t xml:space="preserve">Platform independent. The core builds with any C99 compiler; development and testing used Windows 11. The browser application runs in any current browser with WebAssembly support.</w:t>
       </w:r>
     </w:p>
-    <w:bookmarkEnd w:id="1468"/>
-    <w:bookmarkStart w:id="1469" w:name="programming-language"/>
+    <w:bookmarkEnd w:id="1505"/>
+    <w:bookmarkStart w:id="1506" w:name="programming-language"/>
     <w:p>
       <w:pPr>
         <w:pStyle w:val="Heading3"/>
@@ -2053,8 +2053,8 @@
         <w:t xml:space="preserve">C (core), Python 3.11 or later (interface and fitting tools), JavaScript (browser application).</w:t>
       </w:r>
     </w:p>
-    <w:bookmarkEnd w:id="1469"/>
-    <w:bookmarkStart w:id="1470" w:name="additional-system-requirements"/>
+    <w:bookmarkEnd w:id="1506"/>
+    <w:bookmarkStart w:id="1507" w:name="additional-system-requirements"/>
     <w:p>
       <w:pPr>
         <w:pStyle w:val="Heading3"/>
@@ -2071,8 +2071,8 @@
         <w:t xml:space="preserve">None of note. The engine and database together are a few megabytes.</w:t>
       </w:r>
     </w:p>
-    <w:bookmarkEnd w:id="1470"/>
-    <w:bookmarkStart w:id="1471" w:name="dependencies"/>
+    <w:bookmarkEnd w:id="1507"/>
+    <w:bookmarkStart w:id="1508" w:name="dependencies"/>
     <w:p>
       <w:pPr>
         <w:pStyle w:val="Heading3"/>
@@ -2089,8 +2089,8 @@
         <w:t xml:space="preserve">Python interface: cffi, NumPy, SciPy (developed and tested with cffi 2.0, NumPy 2.4, and SciPy 1.17). The validation suite additionally requires pycalphad; every oracle comparison reported here ran against pycalphad 0.11.1, and the tests that read pycalphad’s own shipped test databases skip cleanly if a later version relocates them. The WebAssembly build requires emscripten. The C core and the browser application have no dependencies.</w:t>
       </w:r>
     </w:p>
-    <w:bookmarkEnd w:id="1471"/>
-    <w:bookmarkStart w:id="1472" w:name="list-of-contributors"/>
+    <w:bookmarkEnd w:id="1508"/>
+    <w:bookmarkStart w:id="1509" w:name="list-of-contributors"/>
     <w:p>
       <w:pPr>
         <w:pStyle w:val="Heading3"/>
@@ -2107,8 +2107,8 @@
         <w:t xml:space="preserve">Michael E. Bustamante (design, implementation, validation, data curation).</w:t>
       </w:r>
     </w:p>
-    <w:bookmarkEnd w:id="1472"/>
-    <w:bookmarkStart w:id="1473" w:name="software-location"/>
+    <w:bookmarkEnd w:id="1509"/>
+    <w:bookmarkStart w:id="1510" w:name="software-location"/>
     <w:p>
       <w:pPr>
         <w:pStyle w:val="Heading3"/>
@@ -2261,8 +2261,8 @@
         <w:t xml:space="preserve">Date published: 2026-09-02</w:t>
       </w:r>
     </w:p>
-    <w:bookmarkEnd w:id="1473"/>
-    <w:bookmarkStart w:id="1474" w:name="language"/>
+    <w:bookmarkEnd w:id="1510"/>
+    <w:bookmarkStart w:id="1511" w:name="language"/>
     <w:p>
       <w:pPr>
         <w:pStyle w:val="Heading3"/>
@@ -2279,9 +2279,9 @@
         <w:t xml:space="preserve">English.</w:t>
       </w:r>
     </w:p>
-    <w:bookmarkEnd w:id="1474"/>
-    <w:bookmarkEnd w:id="1475"/>
-    <w:bookmarkStart w:id="1486" w:name="reuse-potential"/>
+    <w:bookmarkEnd w:id="1511"/>
+    <w:bookmarkEnd w:id="1512"/>
+    <w:bookmarkStart w:id="1523" w:name="reuse-potential"/>
     <w:p>
       <w:pPr>
         <w:pStyle w:val="Heading2"/>
@@ -2306,7 +2306,7 @@
         <w:t xml:space="preserve">The browser application makes the lowest barrier the default. A lecture on slag thermodynamics, a plant metallurgist screening a composition, or a reviewer checking a claimed equilibrium can load the database and calculate in seconds, with confidential inputs never leaving the machine. The same property makes it a practical template for other groups who want to publish a model as a zero-install tool.</w:t>
       </w:r>
     </w:p>
-    <w:bookmarkStart w:id="1485" w:name="worked-examples"/>
+    <w:bookmarkStart w:id="1522" w:name="worked-examples"/>
     <w:p>
       <w:pPr>
         <w:pStyle w:val="Heading3"/>
@@ -2518,18 +2518,18 @@
           <wp:inline>
             <wp:extent cx="4206240" cy="3262561"/>
             <wp:effectExtent b="0" l="0" r="0" t="0"/>
-            <wp:docPr descr="Figure 4: The LiCl-KCl phase diagram calculated by the salt listing from the shipped open database, at the listing’s own step size. Light to dark: liquid, two-phase, and subsolidus fields. The dot is the calculated eutectic at this step size (0.400, 640 K); the star is the measured eutectic (0.415, 626 K)." title="" id="1477" name="Picture"/>
+            <wp:docPr descr="Figure 4: The LiCl-KCl phase diagram calculated by the salt listing from the shipped open database, at the listing’s own step size. Light to dark: liquid, two-phase, and subsolidus fields. The dot is the calculated eutectic at this step size (0.400, 640 K); the star is the measured eutectic (0.415, 626 K)." title="" id="1514" name="Picture"/>
             <a:graphic>
               <a:graphicData uri="http://schemas.openxmlformats.org/drawingml/2006/picture">
                 <pic:pic>
                   <pic:nvPicPr>
-                    <pic:cNvPr descr="figures/fig4_salt_example.png" id="1478" name="Picture"/>
+                    <pic:cNvPr descr="figures/fig4_salt_example.png" id="1515" name="Picture"/>
                     <pic:cNvPicPr>
                       <a:picLocks noChangeArrowheads="1" noChangeAspect="1"/>
                     </pic:cNvPicPr>
                   </pic:nvPicPr>
                   <pic:blipFill>
-                    <a:blip r:embed="rId1476"/>
+                    <a:blip r:embed="rId1513"/>
                     <a:stretch>
                       <a:fillRect/>
                     </a:stretch>
@@ -2764,18 +2764,18 @@
           <wp:inline>
             <wp:extent cx="4206240" cy="3262561"/>
             <wp:effectExtent b="0" l="0" r="0" t="0"/>
-            <wp:docPr descr="Figure 5: The Al-Zn phase diagram calculated by the alloy listing from the shipped open TDB. Light to dark: liquid, liquid plus solid, and solid fields. The dot is the calculated eutectic (0.890, 660 K); the star is the assessed eutectic (0.885, 654 K)." title="" id="1480" name="Picture"/>
+            <wp:docPr descr="Figure 5: The Al-Zn phase diagram calculated by the alloy listing from the shipped open TDB. Light to dark: liquid, liquid plus solid, and solid fields. The dot is the calculated eutectic (0.890, 660 K); the star is the assessed eutectic (0.885, 654 K)." title="" id="1517" name="Picture"/>
             <a:graphic>
               <a:graphicData uri="http://schemas.openxmlformats.org/drawingml/2006/picture">
                 <pic:pic>
                   <pic:nvPicPr>
-                    <pic:cNvPr descr="figures/fig5_alloy_example.png" id="1481" name="Picture"/>
+                    <pic:cNvPr descr="figures/fig5_alloy_example.png" id="1518" name="Picture"/>
                     <pic:cNvPicPr>
                       <a:picLocks noChangeArrowheads="1" noChangeAspect="1"/>
                     </pic:cNvPicPr>
                   </pic:nvPicPr>
                   <pic:blipFill>
-                    <a:blip r:embed="rId1479"/>
+                    <a:blip r:embed="rId1516"/>
                     <a:stretch>
                       <a:fillRect/>
                     </a:stretch>
@@ -2837,20 +2837,20 @@
       <w:r>
         <w:drawing>
           <wp:inline>
-            <wp:extent cx="5334000" cy="4756265"/>
+            <wp:extent cx="5334000" cy="4206359"/>
             <wp:effectExtent b="0" l="0" r="0" t="0"/>
-            <wp:docPr descr="Figure 6: One unified (.utdb) file, two physics, calculated in the browser. (a) The steelmaking database loaded with the Melt/Alloy view toggle on Alloy; the engine calculates the Fe-C phase diagram through the magnetic compound energy formalism, with two tapped compositions pinned. (b) Scheil solidification for the same join at 4 mol% C, first solid at 1739 K and the residual liquid frozen by 1436 K, against the equilibrium lever-rule path (dashed). The file’s slag half is a Modified Quasichemical Model liquid; no legacy container holds both models at once." title="" id="1483" name="Picture"/>
+            <wp:docPr descr="Figure 6: One unified (.utdb) file, two physics, calculated in the browser. (a) The steelmaking database loaded with the Melt/Alloy view toggle on Alloy; the engine calculates the Fe-C phase diagram through the magnetic compound energy formalism, with two tapped compositions pinned. (b) Scheil solidification for the same join at 4 mol% C, first solid at 1739 K and the residual liquid frozen by 1436 K, against the equilibrium lever-rule path (dashed). The file’s slag half is a Modified Quasichemical Model liquid; no legacy container holds both models at once." title="" id="1520" name="Picture"/>
             <a:graphic>
               <a:graphicData uri="http://schemas.openxmlformats.org/drawingml/2006/picture">
                 <pic:pic>
                   <pic:nvPicPr>
-                    <pic:cNvPr descr="figures/fig6_utdb_steel.png" id="1484" name="Picture"/>
+                    <pic:cNvPr descr="figures/fig6_utdb_steel.png" id="1521" name="Picture"/>
                     <pic:cNvPicPr>
                       <a:picLocks noChangeArrowheads="1" noChangeAspect="1"/>
                     </pic:cNvPicPr>
                   </pic:nvPicPr>
                   <pic:blipFill>
-                    <a:blip r:embed="rId1482"/>
+                    <a:blip r:embed="rId1519"/>
                     <a:stretch>
                       <a:fillRect/>
                     </a:stretch>
@@ -2858,7 +2858,7 @@
                   <pic:spPr bwMode="auto">
                     <a:xfrm>
                       <a:off x="0" y="0"/>
-                      <a:ext cx="5334000" cy="4756265"/>
+                      <a:ext cx="5334000" cy="4206359"/>
                     </a:xfrm>
                     <a:prstGeom prst="rect">
                       <a:avLst/>
@@ -2890,12 +2890,12 @@
         <w:pStyle w:val="BodyText"/>
       </w:pPr>
       <w:r>
-        <w:t xml:space="preserve">The gap this work addresses was never the model, which has been published for two decades, but an open, runnable pairing of model and parameters. Hephaestus supplies both halves under open licenses and puts them behind a browser page that asks nothing of its user. The claims are checkable end to end. Release v0.4.0 archives the exact version described, and the 104-test suite reruns the pycalphad comparisons on any machine. The worked examples print the figures shown, and every parameter in every shipped database traces to a published measurement through its provenance file. A reader who doubts a number can recalculate it; one who needs a system that is missing can build it with the same open tools, or ask.</w:t>
-      </w:r>
-    </w:p>
-    <w:bookmarkEnd w:id="1485"/>
-    <w:bookmarkEnd w:id="1486"/>
-    <w:bookmarkStart w:id="1487" w:name="data-availability"/>
+        <w:t xml:space="preserve">The gap this work addresses was never the model, which has been published for two decades, but an open, runnable pairing of model and parameters. Hephaestus supplies both halves under open licenses and puts them behind a browser page that asks nothing of its user. The claims are checkable end to end. Release v0.4.0 archives the exact version described, and the 114-test suite reruns the pycalphad comparisons on any machine. The worked examples print the figures shown, and every parameter in every shipped database traces to a published measurement through its provenance file. A reader who doubts a number can recalculate it; one who needs a system that is missing can build it with the same open tools, or ask.</w:t>
+      </w:r>
+    </w:p>
+    <w:bookmarkEnd w:id="1522"/>
+    <w:bookmarkEnd w:id="1523"/>
+    <w:bookmarkStart w:id="1524" w:name="data-availability"/>
     <w:p>
       <w:pPr>
         <w:pStyle w:val="Heading2"/>
@@ -2912,8 +2912,8 @@
         <w:t xml:space="preserve">The engine, the database, the browser application, and the validation suite are openly available in the code repository listed above; the version described here is archived as release v0.4.0. The database files and their provenance records are in the repository’s data directory under CC BY 4.0.</w:t>
       </w:r>
     </w:p>
-    <w:bookmarkEnd w:id="1487"/>
-    <w:bookmarkStart w:id="1488" w:name="acknowledgements"/>
+    <w:bookmarkEnd w:id="1524"/>
+    <w:bookmarkStart w:id="1525" w:name="acknowledgements"/>
     <w:p>
       <w:pPr>
         <w:pStyle w:val="Heading2"/>
@@ -2930,8 +2930,8 @@
         <w:t xml:space="preserve">During the development of this software the author used Claude Code (Anthropic) to assist with implementation, validation scripting, and manuscript preparation. This assistance was agentic, not autonomous: it operated under author direction and supervision at every step and was never a closed loop that produced or accepted results without review. Every parameter was traced by the author to its primary source before entering the database, and every reference was verified against its registry record. The author reviewed and approved all output and takes full responsibility for this article.</w:t>
       </w:r>
     </w:p>
-    <w:bookmarkEnd w:id="1488"/>
-    <w:bookmarkStart w:id="1489" w:name="funding-statement"/>
+    <w:bookmarkEnd w:id="1525"/>
+    <w:bookmarkStart w:id="1526" w:name="funding-statement"/>
     <w:p>
       <w:pPr>
         <w:pStyle w:val="Heading2"/>
@@ -2948,8 +2948,8 @@
         <w:t xml:space="preserve">The development of this software received no external funding.</w:t>
       </w:r>
     </w:p>
-    <w:bookmarkEnd w:id="1489"/>
-    <w:bookmarkStart w:id="1490" w:name="competing-interests"/>
+    <w:bookmarkEnd w:id="1526"/>
+    <w:bookmarkStart w:id="1527" w:name="competing-interests"/>
     <w:p>
       <w:pPr>
         <w:pStyle w:val="Heading2"/>
@@ -2966,8 +2966,8 @@
         <w:t xml:space="preserve">The author founded Odinzen LLC, which provides commercial thermodynamic modeling services, and declares this as a competing interest. The software and database published here are released in full under open licenses, and no proprietary Odinzen assets are included.</w:t>
       </w:r>
     </w:p>
-    <w:bookmarkEnd w:id="1490"/>
-    <w:bookmarkStart w:id="1491" w:name="references"/>
+    <w:bookmarkEnd w:id="1527"/>
+    <w:bookmarkStart w:id="1528" w:name="references"/>
     <w:p>
       <w:pPr>
         <w:pStyle w:val="Heading2"/>
@@ -3332,8 +3332,8 @@
         <w:t xml:space="preserve">[43] Smith GP, Golden DM, Frenklach M, Moriarty NW, Eiteneer B, Goldenberg M, et al. GRI-Mech 3.0 [Internet]. 1999. Available from: http://combustion.berkeley.edu/gri-mech/</w:t>
       </w:r>
     </w:p>
-    <w:bookmarkEnd w:id="1491"/>
-    <w:bookmarkEnd w:id="1492"/>
+    <w:bookmarkEnd w:id="1528"/>
+    <w:bookmarkEnd w:id="1529"/>
     <w:sectPr>
       <w:footnotePr>
         <w:numRestart w:val="eachSect"/>

</xml_diff>

<commit_message>
Composition window for the binary phase-diagram tool: a mol% range beside the temperature range windows the rendering (the equilibrium always solves the whole join, since tie-lines can reach outside the window), with window-aware ticks, tap readout, live re-render on change, and a reset on file load. Figure 6 re-shot over 0-25 mol% C so the Fe-C panel reads as the classic steel diagram; caption updated to the shown window and the finer T grid's Scheil numbers (1741/1433 K)
Co-Authored-By: Claude Fable 5 <noreply@anthropic.com>
</commit_message>
<xml_diff>
--- a/paper/Bustamante_Hephaestus_JORS_manuscript.docx
+++ b/paper/Bustamante_Hephaestus_JORS_manuscript.docx
@@ -2837,9 +2837,9 @@
       <w:r>
         <w:drawing>
           <wp:inline>
-            <wp:extent cx="5334000" cy="4206359"/>
+            <wp:extent cx="5334000" cy="4430576"/>
             <wp:effectExtent b="0" l="0" r="0" t="0"/>
-            <wp:docPr descr="Figure 6: One unified (.utdb) file, two physics, calculated in the browser. (a) The steelmaking database loaded with the Melt/Alloy view toggle on Alloy; the engine calculates the Fe-C phase diagram through the magnetic compound energy formalism, with two tapped compositions pinned. (b) Scheil solidification for the same join at 4 mol% C, first solid at 1739 K and the residual liquid frozen by 1436 K, against the equilibrium lever-rule path (dashed). The file’s slag half is a Modified Quasichemical Model liquid; no legacy container holds both models at once." title="" id="1520" name="Picture"/>
+            <wp:docPr descr="Figure 6: One unified (.utdb) file, two physics, calculated in the browser. (a) The steelmaking database loaded with the Melt/Alloy view toggle on Alloy; the engine calculates the Fe-C phase diagram through the magnetic compound energy formalism, rendered over a 0-25 mol% C composition window (the equilibrium always solves the whole join), with two tapped compositions pinned. (b) Scheil solidification for the same join at 4 mol% C, first solid at 1741 K and the residual liquid frozen by 1433 K, against the equilibrium lever-rule path (dashed). The file’s slag half is a Modified Quasichemical Model liquid; no legacy container holds both models at once." title="" id="1520" name="Picture"/>
             <a:graphic>
               <a:graphicData uri="http://schemas.openxmlformats.org/drawingml/2006/picture">
                 <pic:pic>
@@ -2858,7 +2858,7 @@
                   <pic:spPr bwMode="auto">
                     <a:xfrm>
                       <a:off x="0" y="0"/>
-                      <a:ext cx="5334000" cy="4206359"/>
+                      <a:ext cx="5334000" cy="4430576"/>
                     </a:xfrm>
                     <a:prstGeom prst="rect">
                       <a:avLst/>
@@ -2882,7 +2882,7 @@
         <w:pStyle w:val="ImageCaption"/>
       </w:pPr>
       <w:r>
-        <w:t xml:space="preserve">Figure 6: One unified (.utdb) file, two physics, calculated in the browser. (a) The steelmaking database loaded with the Melt/Alloy view toggle on Alloy; the engine calculates the Fe-C phase diagram through the magnetic compound energy formalism, with two tapped compositions pinned. (b) Scheil solidification for the same join at 4 mol% C, first solid at 1739 K and the residual liquid frozen by 1436 K, against the equilibrium lever-rule path (dashed). The file’s slag half is a Modified Quasichemical Model liquid; no legacy container holds both models at once.</w:t>
+        <w:t xml:space="preserve">Figure 6: One unified (.utdb) file, two physics, calculated in the browser. (a) The steelmaking database loaded with the Melt/Alloy view toggle on Alloy; the engine calculates the Fe-C phase diagram through the magnetic compound energy formalism, rendered over a 0-25 mol% C composition window (the equilibrium always solves the whole join), with two tapped compositions pinned. (b) Scheil solidification for the same join at 4 mol% C, first solid at 1741 K and the residual liquid frozen by 1433 K, against the equilibrium lever-rule path (dashed). The file’s slag half is a Modified Quasichemical Model liquid; no legacy container holds both models at once.</w:t>
       </w:r>
     </w:p>
     <w:p>

</xml_diff>

<commit_message>
Add Figure 7: the gas calculator as a steelmaking worked example. Two panels computed by the Hephaestus gas engine with Cantera overlaid: oxygen partial pressure vs the CO/CO2 ratio at 1873 K tap, and vs temperature for fixed CO/CO2 buffers. Ties the furnace-atmosphere intro motivation to the steel demo (fig6) - the CO/CO2 ratio fixing the oxygen potential that governs decarburization vs iron oxidation. make_fig7.py reproducible, greyscale, >600 DPI, Cantera parity to 1e-5
Co-Authored-By: Claude Opus 4.8 <noreply@anthropic.com>
</commit_message>
<xml_diff>
--- a/paper/Bustamante_Hephaestus_JORS_manuscript.docx
+++ b/paper/Bustamante_Hephaestus_JORS_manuscript.docx
@@ -2,7 +2,7 @@
 <file path=word/document.xml><?xml version="1.0" encoding="utf-8"?>
 <w:document xmlns:w="http://schemas.openxmlformats.org/wordprocessingml/2006/main" xmlns:m="http://schemas.openxmlformats.org/officeDocument/2006/math" xmlns:r="http://schemas.openxmlformats.org/officeDocument/2006/relationships" xmlns:o="urn:schemas-microsoft-com:office:office" xmlns:v="urn:schemas-microsoft-com:vml" xmlns:w10="urn:schemas-microsoft-com:office:word" xmlns:a="http://schemas.openxmlformats.org/drawingml/2006/main" xmlns:pic="http://schemas.openxmlformats.org/drawingml/2006/picture" xmlns:wp="http://schemas.openxmlformats.org/drawingml/2006/wordprocessingDrawing">
   <w:body>
-    <w:bookmarkStart w:id="1529" w:name="X4855b1162e70238fd839d871e0792397dc58430"/>
+    <w:bookmarkStart w:id="1532" w:name="X4855b1162e70238fd839d871e0792397dc58430"/>
     <w:p>
       <w:pPr>
         <w:pStyle w:val="Heading1"/>
@@ -2281,7 +2281,7 @@
     </w:p>
     <w:bookmarkEnd w:id="1511"/>
     <w:bookmarkEnd w:id="1512"/>
-    <w:bookmarkStart w:id="1523" w:name="reuse-potential"/>
+    <w:bookmarkStart w:id="1526" w:name="reuse-potential"/>
     <w:p>
       <w:pPr>
         <w:pStyle w:val="Heading2"/>
@@ -2306,7 +2306,7 @@
         <w:t xml:space="preserve">The browser application makes the lowest barrier the default. A lecture on slag thermodynamics, a plant metallurgist screening a composition, or a reviewer checking a claimed equilibrium can load the database and calculate in seconds, with confidential inputs never leaving the machine. The same property makes it a practical template for other groups who want to publish a model as a zero-install tool.</w:t>
       </w:r>
     </w:p>
-    <w:bookmarkStart w:id="1522" w:name="worked-examples"/>
+    <w:bookmarkStart w:id="1525" w:name="worked-examples"/>
     <w:p>
       <w:pPr>
         <w:pStyle w:val="Heading3"/>
@@ -2827,7 +2827,19 @@
         <w:t xml:space="preserve"> </w:t>
       </w:r>
       <w:r>
-        <w:t xml:space="preserve">mole fraction from 1200 to 3000 K and 0.1 to 10 atm. The same solver is compiled into the WebAssembly core, so it runs in the browser gas calculator alongside the condensed engine. For the dense conditions of pressurized reactors and gasifiers, a Peng-Robinson real-gas option applies fugacity corrections from tabulated critical constants, validated against Cantera’s own Peng-Robinson and reducing to the ideal result at atmospheric pressure. Coupling the gas to a molten oxide, for pyrometallurgical oxygen potentials, is the step still in progress. The uTDB grammar already defines the ideal-gas phase, so a single file can in principle carry an alloy, a slag, its solids, and a gas. The repository also publishes an openly specified unified dialect (uTDB) that carries the MQMQA statements inside TDB grammar, with two shipped demonstration files chosen to be processes rather than curiosities: an aluminum-recycling database holding the Al-Zn alloy with its NaCl-KCl-MgCl2 salt flux, and a steelmaking database holding a basic Fe-C steel, magnetic phases included, with the FeO-MgO-SiO2 slag and its silicate solid solutions. Round-trip tests assert both reproduce their source-file physics at machine precision. The steelmaking file is the clearest illustration of what a unified container buys (Figure 6): from one file the browser calculates the iron-carbon alloy diagram through the magnetic compound energy formalism and its Scheil solidification path, while the same file’s slag is a molten-salt-model liquid, two physics that no single legacy container holds together. Relative to the XML road of XTDB [15] (Table 1), uTDB is the on-ramp from the installed base, extending files as they are and running in this engine today, with mechanical conversion to XTDB elements the natural bridge once that schema settles. Making the calculator multilingual across the field’s file dialects is the direction of travel. Contributions and issues are handled through the GitHub repository.</w:t>
+        <w:t xml:space="preserve">mole fraction from 1200 to 3000 K and 0.1 to 10 atm. The same solver is compiled into the WebAssembly core, so it runs in the browser gas calculator alongside the condensed engine. For the dense conditions of pressurized reactors and gasifiers, a Peng-Robinson real-gas option applies fugacity corrections from tabulated critical constants, validated against Cantera’s own Peng-Robinson and reducing to the ideal result at atmospheric pressure. Coupling the gas to a molten oxide, for pyrometallurgical oxygen potentials, is the step still in progress. The uTDB grammar already defines the ideal-gas phase, so a single file can in principle carry an alloy, a slag, its solids, and a gas. The repository also publishes an openly specified unified dialect (uTDB) that carries the MQMQA statements inside TDB grammar, with two shipped demonstration files chosen to be processes rather than curiosities: an aluminum-recycling database holding the Al-Zn alloy with its NaCl-KCl-MgCl2 salt flux, and a steelmaking database holding a basic Fe-C steel, magnetic phases included, with the FeO-MgO-SiO2 slag and its silicate solid solutions. Round-trip tests assert both reproduce their source-file physics at machine precision. The steelmaking file is the clearest illustration of what a unified container buys (Figure 6): from one file the browser calculates the iron-carbon alloy diagram through the magnetic compound energy formalism and its Scheil solidification path, while the same file’s slag is a molten-salt-model liquid, two physics that no single legacy container holds together. The furnace atmosphere over that bath is calculable on the same page, and Figure 7 works it through with the gas calculator: the CO to CO</w:t>
+      </w:r>
+      <w:r>
+        <w:rPr>
+          <w:vertAlign w:val="subscript"/>
+        </w:rPr>
+        <w:t xml:space="preserve">2</w:t>
+      </w:r>
+      <w:r>
+        <w:t xml:space="preserve"> </w:t>
+      </w:r>
+      <w:r>
+        <w:t xml:space="preserve">ratio of a carbon-oxygen gas fixes the oxygen partial pressure that decides whether carbon is removed from the steel or iron is oxidized into the slag, both at the 1873 K tap temperature and across the steelmaking range, with the gas engine reproducing Cantera throughout. Relative to the XML road of XTDB [15] (Table 1), uTDB is the on-ramp from the installed base, extending files as they are and running in this engine today, with mechanical conversion to XTDB elements the natural bridge once that schema settles. Making the calculator multilingual across the field’s file dialects is the direction of travel. Contributions and issues are handled through the GitHub repository.</w:t>
       </w:r>
     </w:p>
     <w:p>
@@ -2887,15 +2899,106 @@
     </w:p>
     <w:p>
       <w:pPr>
+        <w:pStyle w:val="CaptionedFigure"/>
+      </w:pPr>
+      <w:r>
+        <w:drawing>
+          <wp:inline>
+            <wp:extent cx="5334000" cy="2319130"/>
+            <wp:effectExtent b="0" l="0" r="0" t="0"/>
+            <wp:docPr descr="Figure 7: The gas calculator as a steelmaking worked example, the equilibrium of a carbon-oxygen furnace gas by the Hephaestus gas engine (the NASA-polynomial element-potential solver compiled into the browser), with Cantera as the independent check. (a) Oxygen partial pressure against the CO to CO2 ratio at the 1873 K tap temperature: a lower ratio is more oxidizing and drives iron into the slag as FeO, a higher ratio is more reducing and decarburizes the steel. (b) The same oxygen potential against temperature for four fixed CO to CO2 buffers, showing that a given gas grows more oxidizing as it heats; the dashed line marks the tap temperature. Open circles are Cantera, agreeing to about 10-5 mole fraction across the field." title="" id="1523" name="Picture"/>
+            <a:graphic>
+              <a:graphicData uri="http://schemas.openxmlformats.org/drawingml/2006/picture">
+                <pic:pic>
+                  <pic:nvPicPr>
+                    <pic:cNvPr descr="figures/fig7_gas_steel.png" id="1524" name="Picture"/>
+                    <pic:cNvPicPr>
+                      <a:picLocks noChangeArrowheads="1" noChangeAspect="1"/>
+                    </pic:cNvPicPr>
+                  </pic:nvPicPr>
+                  <pic:blipFill>
+                    <a:blip r:embed="rId1522"/>
+                    <a:stretch>
+                      <a:fillRect/>
+                    </a:stretch>
+                  </pic:blipFill>
+                  <pic:spPr bwMode="auto">
+                    <a:xfrm>
+                      <a:off x="0" y="0"/>
+                      <a:ext cx="5334000" cy="2319130"/>
+                    </a:xfrm>
+                    <a:prstGeom prst="rect">
+                      <a:avLst/>
+                    </a:prstGeom>
+                    <a:noFill/>
+                    <a:ln w="9525">
+                      <a:noFill/>
+                      <a:headEnd/>
+                      <a:tailEnd/>
+                    </a:ln>
+                  </pic:spPr>
+                </pic:pic>
+              </a:graphicData>
+            </a:graphic>
+          </wp:inline>
+        </w:drawing>
+      </w:r>
+    </w:p>
+    <w:p>
+      <w:pPr>
+        <w:pStyle w:val="ImageCaption"/>
+      </w:pPr>
+      <w:r>
+        <w:t xml:space="preserve">Figure 7: The gas calculator as a steelmaking worked example, the equilibrium of a carbon-oxygen furnace gas by the Hephaestus gas engine (the NASA-polynomial element-potential solver compiled into the browser), with Cantera as the independent check. (a) Oxygen partial pressure against the CO to CO</w:t>
+      </w:r>
+      <w:r>
+        <w:rPr>
+          <w:vertAlign w:val="subscript"/>
+        </w:rPr>
+        <w:t xml:space="preserve">2</w:t>
+      </w:r>
+      <w:r>
+        <w:t xml:space="preserve"> </w:t>
+      </w:r>
+      <w:r>
+        <w:t xml:space="preserve">ratio at the 1873 K tap temperature: a lower ratio is more oxidizing and drives iron into the slag as FeO, a higher ratio is more reducing and decarburizes the steel. (b) The same oxygen potential against temperature for four fixed CO to CO</w:t>
+      </w:r>
+      <w:r>
+        <w:rPr>
+          <w:vertAlign w:val="subscript"/>
+        </w:rPr>
+        <w:t xml:space="preserve">2</w:t>
+      </w:r>
+      <w:r>
+        <w:t xml:space="preserve"> </w:t>
+      </w:r>
+      <w:r>
+        <w:t xml:space="preserve">buffers, showing that a given gas grows more oxidizing as it heats; the dashed line marks the tap temperature. Open circles are Cantera, agreeing to about 10</w:t>
+      </w:r>
+      <w:r>
+        <w:rPr>
+          <w:vertAlign w:val="superscript"/>
+        </w:rPr>
+        <w:t xml:space="preserve">-5</w:t>
+      </w:r>
+      <w:r>
+        <w:t xml:space="preserve"> </w:t>
+      </w:r>
+      <w:r>
+        <w:t xml:space="preserve">mole fraction across the field.</w:t>
+      </w:r>
+    </w:p>
+    <w:p>
+      <w:pPr>
         <w:pStyle w:val="BodyText"/>
       </w:pPr>
       <w:r>
         <w:t xml:space="preserve">The gap this work addresses was never the model, which has been published for two decades, but an open, runnable pairing of model and parameters. Hephaestus supplies both halves under open licenses and puts them behind a browser page that asks nothing of its user. The claims are checkable end to end. Release v0.4.0 archives the exact version described, and the 114-test suite reruns the pycalphad comparisons on any machine. The worked examples print the figures shown, and every parameter in every shipped database traces to a published measurement through its provenance file. A reader who doubts a number can recalculate it; one who needs a system that is missing can build it with the same open tools, or ask.</w:t>
       </w:r>
     </w:p>
-    <w:bookmarkEnd w:id="1522"/>
-    <w:bookmarkEnd w:id="1523"/>
-    <w:bookmarkStart w:id="1524" w:name="data-availability"/>
+    <w:bookmarkEnd w:id="1525"/>
+    <w:bookmarkEnd w:id="1526"/>
+    <w:bookmarkStart w:id="1527" w:name="data-availability"/>
     <w:p>
       <w:pPr>
         <w:pStyle w:val="Heading2"/>
@@ -2912,8 +3015,8 @@
         <w:t xml:space="preserve">The engine, the database, the browser application, and the validation suite are openly available in the code repository listed above; the version described here is archived as release v0.4.0. The database files and their provenance records are in the repository’s data directory under CC BY 4.0.</w:t>
       </w:r>
     </w:p>
-    <w:bookmarkEnd w:id="1524"/>
-    <w:bookmarkStart w:id="1525" w:name="acknowledgements"/>
+    <w:bookmarkEnd w:id="1527"/>
+    <w:bookmarkStart w:id="1528" w:name="acknowledgements"/>
     <w:p>
       <w:pPr>
         <w:pStyle w:val="Heading2"/>
@@ -2930,8 +3033,8 @@
         <w:t xml:space="preserve">During the development of this software the author used Claude Code (Anthropic) to assist with implementation, validation scripting, and manuscript preparation. This assistance was agentic, not autonomous: it operated under author direction and supervision at every step and was never a closed loop that produced or accepted results without review. Every parameter was traced by the author to its primary source before entering the database, and every reference was verified against its registry record. The author reviewed and approved all output and takes full responsibility for this article.</w:t>
       </w:r>
     </w:p>
-    <w:bookmarkEnd w:id="1525"/>
-    <w:bookmarkStart w:id="1526" w:name="funding-statement"/>
+    <w:bookmarkEnd w:id="1528"/>
+    <w:bookmarkStart w:id="1529" w:name="funding-statement"/>
     <w:p>
       <w:pPr>
         <w:pStyle w:val="Heading2"/>
@@ -2948,8 +3051,8 @@
         <w:t xml:space="preserve">The development of this software received no external funding.</w:t>
       </w:r>
     </w:p>
-    <w:bookmarkEnd w:id="1526"/>
-    <w:bookmarkStart w:id="1527" w:name="competing-interests"/>
+    <w:bookmarkEnd w:id="1529"/>
+    <w:bookmarkStart w:id="1530" w:name="competing-interests"/>
     <w:p>
       <w:pPr>
         <w:pStyle w:val="Heading2"/>
@@ -2966,8 +3069,8 @@
         <w:t xml:space="preserve">The author founded Odinzen LLC, which provides commercial thermodynamic modeling services, and declares this as a competing interest. The software and database published here are released in full under open licenses, and no proprietary Odinzen assets are included.</w:t>
       </w:r>
     </w:p>
-    <w:bookmarkEnd w:id="1527"/>
-    <w:bookmarkStart w:id="1528" w:name="references"/>
+    <w:bookmarkEnd w:id="1530"/>
+    <w:bookmarkStart w:id="1531" w:name="references"/>
     <w:p>
       <w:pPr>
         <w:pStyle w:val="Heading2"/>
@@ -3332,8 +3435,8 @@
         <w:t xml:space="preserve">[43] Smith GP, Golden DM, Frenklach M, Moriarty NW, Eiteneer B, Goldenberg M, et al. GRI-Mech 3.0 [Internet]. 1999. Available from: http://combustion.berkeley.edu/gri-mech/</w:t>
       </w:r>
     </w:p>
-    <w:bookmarkEnd w:id="1528"/>
-    <w:bookmarkEnd w:id="1529"/>
+    <w:bookmarkEnd w:id="1531"/>
+    <w:bookmarkEnd w:id="1532"/>
     <w:sectPr>
       <w:footnotePr>
         <w:numRestart w:val="eachSect"/>

</xml_diff>

<commit_message>
Add Figure 8: Al-Zn phase diagram with ESPEI parameter uncertainty. Real MCMC fit of the liquid and fcc excess parameters to cited data - liquid enthalpy of mixing (Debski via Dinsdale 2020 [44]) and assessed phase boundaries (Massalski [45]; Mey [39]) - propagated through the engine into a 90% posterior band: narrow on the liquidus (calorimetry-constrained), wider on the fcc solvus (diagram-constrained). Refs [44][45] added, figures now 1-8, all gates pass. The NIMS-derived fittable database and regenerable MCMC outputs are untracked (kept local, cited not redistributed; base alzn_mey.tdb is already public via pycalphad); a README documents reproduction
Co-Authored-By: Claude Fable 5 <noreply@anthropic.com>
</commit_message>
<xml_diff>
--- a/paper/Bustamante_Hephaestus_JORS_manuscript.docx
+++ b/paper/Bustamante_Hephaestus_JORS_manuscript.docx
@@ -2,7 +2,7 @@
 <file path=word/document.xml><?xml version="1.0" encoding="utf-8"?>
 <w:document xmlns:w="http://schemas.openxmlformats.org/wordprocessingml/2006/main" xmlns:m="http://schemas.openxmlformats.org/officeDocument/2006/math" xmlns:r="http://schemas.openxmlformats.org/officeDocument/2006/relationships" xmlns:o="urn:schemas-microsoft-com:office:office" xmlns:v="urn:schemas-microsoft-com:vml" xmlns:w10="urn:schemas-microsoft-com:office:word" xmlns:a="http://schemas.openxmlformats.org/drawingml/2006/main" xmlns:pic="http://schemas.openxmlformats.org/drawingml/2006/picture" xmlns:wp="http://schemas.openxmlformats.org/drawingml/2006/wordprocessingDrawing">
   <w:body>
-    <w:bookmarkStart w:id="1532" w:name="X4855b1162e70238fd839d871e0792397dc58430"/>
+    <w:bookmarkStart w:id="1535" w:name="X4855b1162e70238fd839d871e0792397dc58430"/>
     <w:p>
       <w:pPr>
         <w:pStyle w:val="Heading1"/>
@@ -2281,7 +2281,7 @@
     </w:p>
     <w:bookmarkEnd w:id="1511"/>
     <w:bookmarkEnd w:id="1512"/>
-    <w:bookmarkStart w:id="1526" w:name="reuse-potential"/>
+    <w:bookmarkStart w:id="1529" w:name="reuse-potential"/>
     <w:p>
       <w:pPr>
         <w:pStyle w:val="Heading2"/>
@@ -2306,7 +2306,7 @@
         <w:t xml:space="preserve">The browser application makes the lowest barrier the default. A lecture on slag thermodynamics, a plant metallurgist screening a composition, or a reviewer checking a claimed equilibrium can load the database and calculate in seconds, with confidential inputs never leaving the machine. The same property makes it a practical template for other groups who want to publish a model as a zero-install tool.</w:t>
       </w:r>
     </w:p>
-    <w:bookmarkStart w:id="1525" w:name="worked-examples"/>
+    <w:bookmarkStart w:id="1528" w:name="worked-examples"/>
     <w:p>
       <w:pPr>
         <w:pStyle w:val="Heading3"/>
@@ -2815,7 +2815,7 @@
         <w:pStyle w:val="BodyText"/>
       </w:pPr>
       <w:r>
-        <w:t xml:space="preserve">The database is a starting point rather than an endpoint, and the file format rewards growth: new components, new phases, and refits against new measurements accumulate in the same database. A system is therefore extended release by release rather than rebuilt, and archived versions keep results calculated against earlier releases reproducible. Because every value carries its source and every judgment is written down, another assessor can reweight the data, swap an endmember, or extend a system without reverse-engineering anything; dbbuild turns a table of measured activities into a loadable file in a few lines. The in-browser multiphase hull already covers any loaded three-cation file and any loaded alloy TDB join, so a new system becomes a browser phase diagram the moment its file loads. Natural extensions are further oxide systems, the remaining ChemSage solution models, the ionic-liquid TDB model, and multicomponent Scheil on the same hull machinery. The databases carry per-value provenance but not parameter uncertainties; refitting the same measured-data tables through ESPEI [10] to obtain Bayesian uncertainty bounds is a natural continuation. A first reach into the combustion school is already in the library. The engine reads NASA 7-coefficient polynomial thermochemistry, the open format of NASA CEA [42] and GRI-Mech [43], and solves ideal-gas equilibrium at fixed temperature and pressure by the element-potential method, validated against Cantera [40] to 10</w:t>
+        <w:t xml:space="preserve">The database is a starting point rather than an endpoint, and the file format rewards growth: new components, new phases, and refits against new measurements accumulate in the same database. A system is therefore extended release by release rather than rebuilt, and archived versions keep results calculated against earlier releases reproducible. Because every value carries its source and every judgment is written down, another assessor can reweight the data, swap an endmember, or extend a system without reverse-engineering anything; dbbuild turns a table of measured activities into a loadable file in a few lines. The in-browser multiphase hull already covers any loaded three-cation file and any loaded alloy TDB join, so a new system becomes a browser phase diagram the moment its file loads. Natural extensions are further oxide systems, the remaining ChemSage solution models, the ionic-liquid TDB model, and multicomponent Scheil on the same hull machinery. The databases carry per-value provenance but not parameter uncertainties; refitting the same measured-data tables through ESPEI [10] to obtain Bayesian uncertainty bounds on the parameters is demonstrated below. A first reach into the combustion school is already in the library. The engine reads NASA 7-coefficient polynomial thermochemistry, the open format of NASA CEA [42] and GRI-Mech [43], and solves ideal-gas equilibrium at fixed temperature and pressure by the element-potential method, validated against Cantera [40] to 10</w:t>
       </w:r>
       <w:r>
         <w:rPr>
@@ -2839,7 +2839,7 @@
         <w:t xml:space="preserve"> </w:t>
       </w:r>
       <w:r>
-        <w:t xml:space="preserve">ratio of a carbon-oxygen gas fixes the oxygen partial pressure that decides whether carbon is removed from the steel or iron is oxidized into the slag, both at the 1873 K tap temperature and across the steelmaking range, with the gas engine reproducing Cantera throughout. Relative to the XML road of XTDB [15] (Table 1), uTDB is the on-ramp from the installed base, extending files as they are and running in this engine today, with mechanical conversion to XTDB elements the natural bridge once that schema settles. Making the calculator multilingual across the field’s file dialects is the direction of travel. Contributions and issues are handled through the GitHub repository.</w:t>
+        <w:t xml:space="preserve">ratio of a carbon-oxygen gas fixes the oxygen partial pressure that decides whether carbon is removed from the steel or iron is oxidized into the slag, both at the 1873 K tap temperature and across the steelmaking range, with the gas engine reproducing Cantera throughout. The same engine also carries parameter uncertainty to the diagram. Refitting the Al-Zn liquid and face-centred-cubic excess parameters against the measured liquid enthalpy of mixing and the assessed phase boundaries [39, 44, 45] by Markov-chain Monte Carlo, and propagating the posterior through the browser calculation, produces the confidence band of Figure 8. The liquidus band is narrow because the calorimetry pins the liquid interaction, while the solid-solubility band is wider because only the phase diagram constrains the corresponding parameter, an honest reflection of which measurements do the work. Relative to the XML road of XTDB [15] (Table 1), uTDB is the on-ramp from the installed base, extending files as they are and running in this engine today, with mechanical conversion to XTDB elements the natural bridge once that schema settles. Making the calculator multilingual across the field’s file dialects is the direction of travel. Contributions and issues are handled through the GitHub repository.</w:t>
       </w:r>
     </w:p>
     <w:p>
@@ -2990,15 +2990,70 @@
     </w:p>
     <w:p>
       <w:pPr>
+        <w:pStyle w:val="CaptionedFigure"/>
+      </w:pPr>
+      <w:r>
+        <w:drawing>
+          <wp:inline>
+            <wp:extent cx="4572000" cy="3556000"/>
+            <wp:effectExtent b="0" l="0" r="0" t="0"/>
+            <wp:docPr descr="Figure 8: Al-Zn phase diagram with ESPEI parameter uncertainty. The liquid and face-centred-cubic (fcc) excess parameters were refit by Markov-chain Monte Carlo to the measured liquid enthalpy of mixing (Debski et al., digitised from Dinsdale et al. [44]) and the assessed phase boundaries (Massalski [45]; Mey [39]), and the posterior was propagated through the engine. The solid line is the median liquidus and the dashed line the median fcc solvus; the shaded region is the 90 percent posterior band on each. The band is narrow on the liquidus, which the calorimetry constrains, and wider on the fcc solvus, which only the diagram constrains. The open circle is the assessed eutectic." title="" id="1526" name="Picture"/>
+            <a:graphic>
+              <a:graphicData uri="http://schemas.openxmlformats.org/drawingml/2006/picture">
+                <pic:pic>
+                  <pic:nvPicPr>
+                    <pic:cNvPr descr="figures/fig8_uq_alzn.png" id="1527" name="Picture"/>
+                    <pic:cNvPicPr>
+                      <a:picLocks noChangeArrowheads="1" noChangeAspect="1"/>
+                    </pic:cNvPicPr>
+                  </pic:nvPicPr>
+                  <pic:blipFill>
+                    <a:blip r:embed="rId1525"/>
+                    <a:stretch>
+                      <a:fillRect/>
+                    </a:stretch>
+                  </pic:blipFill>
+                  <pic:spPr bwMode="auto">
+                    <a:xfrm>
+                      <a:off x="0" y="0"/>
+                      <a:ext cx="4572000" cy="3556000"/>
+                    </a:xfrm>
+                    <a:prstGeom prst="rect">
+                      <a:avLst/>
+                    </a:prstGeom>
+                    <a:noFill/>
+                    <a:ln w="9525">
+                      <a:noFill/>
+                      <a:headEnd/>
+                      <a:tailEnd/>
+                    </a:ln>
+                  </pic:spPr>
+                </pic:pic>
+              </a:graphicData>
+            </a:graphic>
+          </wp:inline>
+        </w:drawing>
+      </w:r>
+    </w:p>
+    <w:p>
+      <w:pPr>
+        <w:pStyle w:val="ImageCaption"/>
+      </w:pPr>
+      <w:r>
+        <w:t xml:space="preserve">Figure 8: Al-Zn phase diagram with ESPEI parameter uncertainty. The liquid and face-centred-cubic (fcc) excess parameters were refit by Markov-chain Monte Carlo to the measured liquid enthalpy of mixing (Debski et al., digitised from Dinsdale et al. [44]) and the assessed phase boundaries (Massalski [45]; Mey [39]), and the posterior was propagated through the engine. The solid line is the median liquidus and the dashed line the median fcc solvus; the shaded region is the 90 percent posterior band on each. The band is narrow on the liquidus, which the calorimetry constrains, and wider on the fcc solvus, which only the diagram constrains. The open circle is the assessed eutectic.</w:t>
+      </w:r>
+    </w:p>
+    <w:p>
+      <w:pPr>
         <w:pStyle w:val="BodyText"/>
       </w:pPr>
       <w:r>
         <w:t xml:space="preserve">The gap this work addresses was never the model, which has been published for two decades, but an open, runnable pairing of model and parameters. Hephaestus supplies both halves under open licenses and puts them behind a browser page that asks nothing of its user. The claims are checkable end to end. Release v0.4.0 archives the exact version described, and the 114-test suite reruns the pycalphad comparisons on any machine. The worked examples print the figures shown, and every parameter in every shipped database traces to a published measurement through its provenance file. A reader who doubts a number can recalculate it; one who needs a system that is missing can build it with the same open tools, or ask.</w:t>
       </w:r>
     </w:p>
-    <w:bookmarkEnd w:id="1525"/>
-    <w:bookmarkEnd w:id="1526"/>
-    <w:bookmarkStart w:id="1527" w:name="data-availability"/>
+    <w:bookmarkEnd w:id="1528"/>
+    <w:bookmarkEnd w:id="1529"/>
+    <w:bookmarkStart w:id="1530" w:name="data-availability"/>
     <w:p>
       <w:pPr>
         <w:pStyle w:val="Heading2"/>
@@ -3015,8 +3070,8 @@
         <w:t xml:space="preserve">The engine, the database, the browser application, and the validation suite are openly available in the code repository listed above; the version described here is archived as release v0.4.0. The database files and their provenance records are in the repository’s data directory under CC BY 4.0.</w:t>
       </w:r>
     </w:p>
-    <w:bookmarkEnd w:id="1527"/>
-    <w:bookmarkStart w:id="1528" w:name="acknowledgements"/>
+    <w:bookmarkEnd w:id="1530"/>
+    <w:bookmarkStart w:id="1531" w:name="acknowledgements"/>
     <w:p>
       <w:pPr>
         <w:pStyle w:val="Heading2"/>
@@ -3033,8 +3088,8 @@
         <w:t xml:space="preserve">During the development of this software the author used Claude Code (Anthropic) to assist with implementation, validation scripting, and manuscript preparation. This assistance was agentic, not autonomous: it operated under author direction and supervision at every step and was never a closed loop that produced or accepted results without review. Every parameter was traced by the author to its primary source before entering the database, and every reference was verified against its registry record. The author reviewed and approved all output and takes full responsibility for this article.</w:t>
       </w:r>
     </w:p>
-    <w:bookmarkEnd w:id="1528"/>
-    <w:bookmarkStart w:id="1529" w:name="funding-statement"/>
+    <w:bookmarkEnd w:id="1531"/>
+    <w:bookmarkStart w:id="1532" w:name="funding-statement"/>
     <w:p>
       <w:pPr>
         <w:pStyle w:val="Heading2"/>
@@ -3051,8 +3106,8 @@
         <w:t xml:space="preserve">The development of this software received no external funding.</w:t>
       </w:r>
     </w:p>
-    <w:bookmarkEnd w:id="1529"/>
-    <w:bookmarkStart w:id="1530" w:name="competing-interests"/>
+    <w:bookmarkEnd w:id="1532"/>
+    <w:bookmarkStart w:id="1533" w:name="competing-interests"/>
     <w:p>
       <w:pPr>
         <w:pStyle w:val="Heading2"/>
@@ -3069,8 +3124,8 @@
         <w:t xml:space="preserve">The author founded Odinzen LLC, which provides commercial thermodynamic modeling services, and declares this as a competing interest. The software and database published here are released in full under open licenses, and no proprietary Odinzen assets are included.</w:t>
       </w:r>
     </w:p>
-    <w:bookmarkEnd w:id="1530"/>
-    <w:bookmarkStart w:id="1531" w:name="references"/>
+    <w:bookmarkEnd w:id="1533"/>
+    <w:bookmarkStart w:id="1534" w:name="references"/>
     <w:p>
       <w:pPr>
         <w:pStyle w:val="Heading2"/>
@@ -3435,8 +3490,24 @@
         <w:t xml:space="preserve">[43] Smith GP, Golden DM, Frenklach M, Moriarty NW, Eiteneer B, Goldenberg M, et al. GRI-Mech 3.0 [Internet]. 1999. Available from: http://combustion.berkeley.edu/gri-mech/</w:t>
       </w:r>
     </w:p>
-    <w:bookmarkEnd w:id="1531"/>
-    <w:bookmarkEnd w:id="1532"/>
+    <w:p>
+      <w:pPr>
+        <w:pStyle w:val="BodyText"/>
+      </w:pPr>
+      <w:r>
+        <w:t xml:space="preserve">[44] Dinsdale A, Zobac O, Kroupa A, Khvan A. Use of third generation data for the elements to model the thermodynamics of binary alloy systems: Part 1 - The critical assessment of data for the Al-Zn system. Calphad. 2020 Mar;68:101723. doi:10.1016/j.calphad.2019.101723</w:t>
+      </w:r>
+    </w:p>
+    <w:p>
+      <w:pPr>
+        <w:pStyle w:val="BodyText"/>
+      </w:pPr>
+      <w:r>
+        <w:t xml:space="preserve">[45] Massalski TB, editor. Binary Alloy Phase Diagrams. 2nd ed. Materials Park (OH): ASM International; 1990.</w:t>
+      </w:r>
+    </w:p>
+    <w:bookmarkEnd w:id="1534"/>
+    <w:bookmarkEnd w:id="1535"/>
     <w:sectPr>
       <w:footnotePr>
         <w:numRestart w:val="eachSect"/>

</xml_diff>

<commit_message>
Rebuild the manuscript docx/pdf from the updated source (coupling, v0.5.0, 128 tests)
Regenerated the reading copies via pandoc with a media-stripped style reference (no figure
duplication), postbuild table fixes, and Word to PDF. Argus numbering gate passes: 45
references in order, 3 tables, 8 figures all resolve.

Co-Authored-By: Claude Opus 4.8 <noreply@anthropic.com>
</commit_message>
<xml_diff>
--- a/paper/Bustamante_Hephaestus_JORS_manuscript.docx
+++ b/paper/Bustamante_Hephaestus_JORS_manuscript.docx
@@ -2,7 +2,7 @@
 <file path=word/document.xml><?xml version="1.0" encoding="utf-8"?>
 <w:document xmlns:w="http://schemas.openxmlformats.org/wordprocessingml/2006/main" xmlns:m="http://schemas.openxmlformats.org/officeDocument/2006/math" xmlns:r="http://schemas.openxmlformats.org/officeDocument/2006/relationships" xmlns:o="urn:schemas-microsoft-com:office:office" xmlns:v="urn:schemas-microsoft-com:vml" xmlns:w10="urn:schemas-microsoft-com:office:word" xmlns:a="http://schemas.openxmlformats.org/drawingml/2006/main" xmlns:pic="http://schemas.openxmlformats.org/drawingml/2006/picture" xmlns:wp="http://schemas.openxmlformats.org/drawingml/2006/wordprocessingDrawing">
   <w:body>
-    <w:bookmarkStart w:id="1535" w:name="X4855b1162e70238fd839d871e0792397dc58430"/>
+    <w:bookmarkStart w:id="1578" w:name="X4855b1162e70238fd839d871e0792397dc58430"/>
     <w:p>
       <w:pPr>
         <w:pStyle w:val="Heading1"/>
@@ -84,7 +84,7 @@
         <w:t xml:space="preserve"> </w:t>
       </w:r>
       <w:r>
-        <w:t xml:space="preserve">slag) databases. One zero-install page calculates across all three containers. It calculates phase equilibria up to full ternary isothermal sections and liquidus projections, and Scheil-Gulliver solidification paths on any binary join. A NASA-polynomial ideal-gas engine, validated against Cantera, brings the gas equilibria a furnace atmosphere demands into the same browser; coupling the gas to a condensed melt is in progress. Every energy path is validated to machine precision against pycalphad, and the magnetic model additionally against the measured pure-iron transition temperatures. The companion databases cover the CaO-SiO</w:t>
+        <w:t xml:space="preserve">slag) databases. One zero-install page calculates across all three containers. It calculates phase equilibria up to full ternary isothermal sections and liquidus projections, and Scheil-Gulliver solidification paths on any binary join. A NASA-polynomial ideal-gas engine, validated against Cantera, brings the gas equilibria a furnace atmosphere demands into the same browser, and couples that gas to condensed metals and oxides at a shared oxygen potential, reproducing Cantera’s multiphase equilibrium on the reduction and oxidation reactions of steelmaking. Every energy path is validated to machine precision against pycalphad, and the magnetic model additionally against the measured pure-iron transition temperatures. The companion databases cover the CaO-SiO</w:t>
       </w:r>
       <w:r>
         <w:rPr>
@@ -159,7 +159,7 @@
         <w:t xml:space="preserve">CALPHAD; molten slag; molten salt; modified quasichemical model; thermodynamic database; phase diagram; gas equilibrium; WebAssembly; open data</w:t>
       </w:r>
     </w:p>
-    <w:bookmarkStart w:id="1504" w:name="overview"/>
+    <w:bookmarkStart w:id="1547" w:name="overview"/>
     <w:p>
       <w:pPr>
         <w:pStyle w:val="Heading2"/>
@@ -168,7 +168,7 @@
         <w:t xml:space="preserve">(1) Overview</w:t>
       </w:r>
     </w:p>
-    <w:bookmarkStart w:id="1491" w:name="introduction"/>
+    <w:bookmarkStart w:id="1534" w:name="introduction"/>
     <w:p>
       <w:pPr>
         <w:pStyle w:val="Heading3"/>
@@ -548,8 +548,8 @@
         <w:t xml:space="preserve">Hephaestus is a deliberate response to that gap, and it treats the engine and the data as one contribution because neither is useful alone. The engine is small on purpose. Its core is plain C with no dependencies, which makes it easy to embed and lets the identical code compile to WebAssembly, so the full calculator runs in a web browser with nothing installed and no data leaving the user’s machine. The database is open on purpose. Every parameter in it derives from published measurements, each value carries its provenance down to table and page, and the known shortcomings are documented next to the numbers they affect. The present work describes both, their validation against pycalphad and against measured phase equilibria, and the ways they can be reused. None of it asks the reader to program. For the experimentalist who never writes code, the browser application is the entire product: a page to open, a database to click, and a diagram to read. The sections that follow describe the machinery underneath for those who want it. Supplementary Material S1 is a plain-language primer for the non-programmer, starting at what a database file is and ending at a first calculation and how to read it. Its closing section teaches what an assessment is built from, so a reader who wants to contribute data for open publication, or to commission a file, arrives knowing what is needed.</w:t>
       </w:r>
     </w:p>
-    <w:bookmarkEnd w:id="1491"/>
-    <w:bookmarkStart w:id="1501" w:name="implementation-and-architecture"/>
+    <w:bookmarkEnd w:id="1534"/>
+    <w:bookmarkStart w:id="1544" w:name="implementation-and-architecture"/>
     <w:p>
       <w:pPr>
         <w:pStyle w:val="Heading3"/>
@@ -575,18 +575,18 @@
           <wp:inline>
             <wp:extent cx="5334000" cy="3511167"/>
             <wp:effectExtent b="0" l="0" r="0" t="0"/>
-            <wp:docPr descr="Figure 1: Architecture of Hephaestus. A single dependency-free C core reads the field’s three database dialects (ChemSage .dat, Thermo-Calc .tdb with the Inden magnetic model, and the unified .utdb) and calculates all thermodynamics; the same core is used as a native library, from Python through cffi, and compiled to WebAssembly behind the browser application. dbbuild writes new ChemSage files from measured data, and every energy path is validated against pycalphad." title="" id="1493" name="Picture"/>
+            <wp:docPr descr="Figure 1: Architecture of Hephaestus. A single dependency-free C core reads the field’s three database dialects (ChemSage .dat, Thermo-Calc .tdb with the Inden magnetic model, and the unified .utdb) and calculates all thermodynamics; the same core is used as a native library, from Python through cffi, and compiled to WebAssembly behind the browser application. dbbuild writes new ChemSage files from measured data, and every energy path is validated against pycalphad." title="" id="1536" name="Picture"/>
             <a:graphic>
               <a:graphicData uri="http://schemas.openxmlformats.org/drawingml/2006/picture">
                 <pic:pic>
                   <pic:nvPicPr>
-                    <pic:cNvPr descr="figures/fig1_architecture.png" id="1494" name="Picture"/>
+                    <pic:cNvPr descr="figures/fig1_architecture.png" id="1537" name="Picture"/>
                     <pic:cNvPicPr>
                       <a:picLocks noChangeArrowheads="1" noChangeAspect="1"/>
                     </pic:cNvPicPr>
                   </pic:nvPicPr>
                   <pic:blipFill>
-                    <a:blip r:embed="rId1492"/>
+                    <a:blip r:embed="rId1535"/>
                     <a:stretch>
                       <a:fillRect/>
                     </a:stretch>
@@ -781,7 +781,7 @@
         <w:t xml:space="preserve"> </w:t>
       </w:r>
       <w:r>
-        <w:t xml:space="preserve">diagrams, and a live isothermal-section solver calculates the full phase assemblage at a chosen temperature in a second or two, for the shipped ternaries or for any loaded three-cation file (Figure 2). An interactive eutectic builder pre-fills its component names, melting points, and fusion enthalpies from the loaded database. A gas-equilibrium calculator solves ideal-gas equilibrium over an open NASA-polynomial database, its own engine compiled into the same WebAssembly core. Loading an alloy TDB reshapes the workspace: the elements become the end members and every compound energy formalism phase spanning the join enters the same convex hull construction. Everything runs client side. The page holds a strict content security policy, escapes all file-derived strings, makes no third-party requests, and never transmits a loaded file, which matters to industrial users whose compositions are confidential.</w:t>
+        <w:t xml:space="preserve">diagrams, and a live isothermal-section solver calculates the full phase assemblage at a chosen temperature in a second or two, for the shipped ternaries or for any loaded three-cation file (Figure 2). An interactive eutectic builder pre-fills its component names, melting points, and fusion enthalpies from the loaded database. A gas-equilibrium calculator solves ideal-gas equilibrium over an open NASA-polynomial database, its own engine compiled into the same WebAssembly core, and optionally couples that gas to a steelmaking condensate (graphite, wustite, iron) so a reducing atmosphere pulls the oxide down to metal and an oxidising one holds it, computed at a shared oxygen potential. Loading an alloy TDB reshapes the workspace: the elements become the end members and every compound energy formalism phase spanning the join enters the same convex hull construction. Everything runs client side. The page holds a strict content security policy, escapes all file-derived strings, makes no third-party requests, and never transmits a loaded file, which matters to industrial users whose compositions are confidential.</w:t>
       </w:r>
     </w:p>
     <w:p>
@@ -793,18 +793,18 @@
           <wp:inline>
             <wp:extent cx="4754880" cy="3913308"/>
             <wp:effectExtent b="0" l="0" r="0" t="0"/>
-            <wp:docPr descr="Figure 2: The live solver in the browser application (light theme). The user loads the shipped database, picks a temperature, and presses Compute; the WebAssembly engine then solves the full FeO-MgO-SiO2 phase assemblage client side (here 861 composition samples and 595 tie-facets in about two seconds). Tapping a composition reads its stable phases and pins it to a comparison list; hovering previews on desktop." title="" id="1496" name="Picture"/>
+            <wp:docPr descr="Figure 2: The live solver in the browser application (light theme). The user loads the shipped database, picks a temperature, and presses Compute; the WebAssembly engine then solves the full FeO-MgO-SiO2 phase assemblage client side (here 861 composition samples and 595 tie-facets in about two seconds). Tapping a composition reads its stable phases and pins it to a comparison list; hovering previews on desktop." title="" id="1539" name="Picture"/>
             <a:graphic>
               <a:graphicData uri="http://schemas.openxmlformats.org/drawingml/2006/picture">
                 <pic:pic>
                   <pic:nvPicPr>
-                    <pic:cNvPr descr="figures/fig2_browser_app.png" id="1497" name="Picture"/>
+                    <pic:cNvPr descr="figures/fig2_browser_app.png" id="1540" name="Picture"/>
                     <pic:cNvPicPr>
                       <a:picLocks noChangeArrowheads="1" noChangeAspect="1"/>
                     </pic:cNvPicPr>
                   </pic:nvPicPr>
                   <pic:blipFill>
-                    <a:blip r:embed="rId1495"/>
+                    <a:blip r:embed="rId1538"/>
                     <a:stretch>
                       <a:fillRect/>
                     </a:stretch>
@@ -970,18 +970,18 @@
           <wp:inline>
             <wp:extent cx="5334000" cy="2197297"/>
             <wp:effectExtent b="0" l="0" r="0" t="0"/>
-            <wp:docPr descr="Figure 3: The assessed FeO-MgO-SiO2 system calculated from the shipped database files. (a) Liquidus projection: primary crystallizing phase fields, with liquidus isotherms labeled in °C. (b) Isothermal section at 1600 °C: stable phase assemblages, shaded by the number of solid phases present. Phase labels: L liquid, Crs cristobalite, Ol olivine, Opx orthopyroxene, Per periclase, Wus wustite." title="" id="1499" name="Picture"/>
+            <wp:docPr descr="Figure 3: The assessed FeO-MgO-SiO2 system calculated from the shipped database files. (a) Liquidus projection: primary crystallizing phase fields, with liquidus isotherms labeled in °C. (b) Isothermal section at 1600 °C: stable phase assemblages, shaded by the number of solid phases present. Phase labels: L liquid, Crs cristobalite, Ol olivine, Opx orthopyroxene, Per periclase, Wus wustite." title="" id="1542" name="Picture"/>
             <a:graphic>
               <a:graphicData uri="http://schemas.openxmlformats.org/drawingml/2006/picture">
                 <pic:pic>
                   <pic:nvPicPr>
-                    <pic:cNvPr descr="figures/fig3_ternary.png" id="1500" name="Picture"/>
+                    <pic:cNvPr descr="figures/fig3_ternary.png" id="1543" name="Picture"/>
                     <pic:cNvPicPr>
                       <a:picLocks noChangeArrowheads="1" noChangeAspect="1"/>
                     </pic:cNvPicPr>
                   </pic:nvPicPr>
                   <pic:blipFill>
-                    <a:blip r:embed="rId1498"/>
+                    <a:blip r:embed="rId1541"/>
                     <a:stretch>
                       <a:fillRect/>
                     </a:stretch>
@@ -1371,8 +1371,8 @@
         </w:tc>
       </w:tr>
     </w:tbl>
-    <w:bookmarkEnd w:id="1501"/>
-    <w:bookmarkStart w:id="1502" w:name="anatomy-of-a-database-file"/>
+    <w:bookmarkEnd w:id="1544"/>
+    <w:bookmarkStart w:id="1545" w:name="anatomy-of-a-database-file"/>
     <w:p>
       <w:pPr>
         <w:pStyle w:val="Heading3"/>
@@ -1405,8 +1405,8 @@
         <w:t xml:space="preserve">That asymmetry is the economics of the field in miniature: implementations of the published models are increasingly available, but each fitted parameter condenses dozens of measurements and decisions. Parameter sets rather than codes are therefore the scarce commodity, and an openly licensed, provenance-tracked database is the part of this contribution that cannot be regenerated from the paper alone.</w:t>
       </w:r>
     </w:p>
-    <w:bookmarkEnd w:id="1502"/>
-    <w:bookmarkStart w:id="1503" w:name="quality-control"/>
+    <w:bookmarkEnd w:id="1545"/>
+    <w:bookmarkStart w:id="1546" w:name="quality-control"/>
     <w:p>
       <w:pPr>
         <w:pStyle w:val="Heading3"/>
@@ -1420,7 +1420,7 @@
         <w:pStyle w:val="FirstParagraph"/>
       </w:pPr>
       <w:r>
-        <w:t xml:space="preserve">Validation rests on one principle. A number is trusted only when an independent implementation reproduces it. pycalphad plays that role throughout, and Table 3 lists the checks. The pytest suite, 114 tests, compares every energy contribution on shared parameters and agrees to about 10</w:t>
+        <w:t xml:space="preserve">Validation rests on one principle. A number is trusted only when an independent implementation reproduces it. pycalphad plays that role throughout, and Table 3 lists the checks. The pytest suite, 128 tests, compares every energy contribution on shared parameters and agrees to about 10</w:t>
       </w:r>
       <w:r>
         <w:rPr>
@@ -1905,6 +1905,7 @@
           <w:tcPr/>
           <w:p>
             <w:pPr>
+              <w:keepNext/>
               <w:pStyle w:val="Compact"/>
               <w:jc w:val="left"/>
             </w:pPr>
@@ -1917,6 +1918,7 @@
           <w:tcPr/>
           <w:p>
             <w:pPr>
+              <w:keepNext/>
               <w:pStyle w:val="Compact"/>
               <w:jc w:val="left"/>
             </w:pPr>
@@ -1929,6 +1931,7 @@
           <w:tcPr/>
           <w:p>
             <w:pPr>
+              <w:keepNext/>
               <w:pStyle w:val="Compact"/>
               <w:jc w:val="left"/>
             </w:pPr>
@@ -1974,6 +1977,71 @@
           </w:p>
         </w:tc>
       </w:tr>
+      <w:tr>
+        <w:trPr>
+          <w:cantSplit/>
+        </w:trPr>
+        <w:tc>
+          <w:tcPr/>
+          <w:p>
+            <w:pPr>
+              <w:pStyle w:val="Compact"/>
+              <w:jc w:val="left"/>
+            </w:pPr>
+            <w:r>
+              <w:t xml:space="preserve">Gas-condensed coupling</w:t>
+            </w:r>
+          </w:p>
+        </w:tc>
+        <w:tc>
+          <w:tcPr/>
+          <w:p>
+            <w:pPr>
+              <w:pStyle w:val="Compact"/>
+              <w:jc w:val="left"/>
+            </w:pPr>
+            <w:r>
+              <w:t xml:space="preserve">shared-element-potential solve, gas + stoichiometric metals/oxides (Boudouard, FeO reduction)</w:t>
+            </w:r>
+          </w:p>
+        </w:tc>
+        <w:tc>
+          <w:tcPr/>
+          <w:p>
+            <w:pPr>
+              <w:pStyle w:val="Compact"/>
+              <w:jc w:val="left"/>
+            </w:pPr>
+            <w:r>
+              <w:t xml:space="preserve">Cantera multiphase parity to 10</w:t>
+            </w:r>
+            <w:r>
+              <w:rPr>
+                <w:vertAlign w:val="superscript"/>
+              </w:rPr>
+              <w:t xml:space="preserve">-3</w:t>
+            </w:r>
+            <w:r>
+              <w:t xml:space="preserve"> </w:t>
+            </w:r>
+            <w:r>
+              <w:t xml:space="preserve">mole fraction, to 10</w:t>
+            </w:r>
+            <w:r>
+              <w:rPr>
+                <w:vertAlign w:val="superscript"/>
+              </w:rPr>
+              <w:t xml:space="preserve">-10</w:t>
+            </w:r>
+            <w:r>
+              <w:t xml:space="preserve"> </w:t>
+            </w:r>
+            <w:r>
+              <w:t xml:space="preserve">on shared thermodynamic data</w:t>
+            </w:r>
+          </w:p>
+        </w:tc>
+      </w:tr>
     </w:tbl>
     <w:p>
       <w:pPr>
@@ -2004,12 +2072,12 @@
         <w:t xml:space="preserve"> </w:t>
       </w:r>
       <w:r>
-        <w:t xml:space="preserve">invariants sit within about 40 °C, and the ternary liquidus projection reproduces the measured field topology [24]. Development practice is plain: the repository is version controlled with tagged releases (v0.1.0 through the v0.4.0 described here), the full suite runs before every release, and a fixed bug lands together with the regression test that would have caught it. The suite runs on Windows 11 under CPython 3.11 and 3.12; the browser application is exercised in Chromium- and Gecko-based browsers. A user can confirm a working installation by running pytest against the bundled test databases, or with no installation at all by opening the web application and loading the shipped ternary database.</w:t>
-      </w:r>
-    </w:p>
-    <w:bookmarkEnd w:id="1503"/>
-    <w:bookmarkEnd w:id="1504"/>
-    <w:bookmarkStart w:id="1512" w:name="availability"/>
+        <w:t xml:space="preserve">invariants sit within about 40 °C, and the ternary liquidus projection reproduces the measured field topology [24]. Development practice is plain: the repository is version controlled with tagged releases (v0.1.0 through the v0.5.0 described here), the full suite runs before every release, and a fixed bug lands together with the regression test that would have caught it. The suite runs on Windows 11 under CPython 3.11 and 3.12; the browser application is exercised in Chromium- and Gecko-based browsers. A user can confirm a working installation by running pytest against the bundled test databases, or with no installation at all by opening the web application and loading the shipped ternary database.</w:t>
+      </w:r>
+    </w:p>
+    <w:bookmarkEnd w:id="1546"/>
+    <w:bookmarkEnd w:id="1547"/>
+    <w:bookmarkStart w:id="1555" w:name="availability"/>
     <w:p>
       <w:pPr>
         <w:pStyle w:val="Heading2"/>
@@ -2018,7 +2086,7 @@
         <w:t xml:space="preserve">(2) Availability</w:t>
       </w:r>
     </w:p>
-    <w:bookmarkStart w:id="1505" w:name="operating-system"/>
+    <w:bookmarkStart w:id="1548" w:name="operating-system"/>
     <w:p>
       <w:pPr>
         <w:pStyle w:val="Heading3"/>
@@ -2035,8 +2103,8 @@
         <w:t xml:space="preserve">Platform independent. The core builds with any C99 compiler; development and testing used Windows 11. The browser application runs in any current browser with WebAssembly support.</w:t>
       </w:r>
     </w:p>
-    <w:bookmarkEnd w:id="1505"/>
-    <w:bookmarkStart w:id="1506" w:name="programming-language"/>
+    <w:bookmarkEnd w:id="1548"/>
+    <w:bookmarkStart w:id="1549" w:name="programming-language"/>
     <w:p>
       <w:pPr>
         <w:pStyle w:val="Heading3"/>
@@ -2053,8 +2121,8 @@
         <w:t xml:space="preserve">C (core), Python 3.11 or later (interface and fitting tools), JavaScript (browser application).</w:t>
       </w:r>
     </w:p>
-    <w:bookmarkEnd w:id="1506"/>
-    <w:bookmarkStart w:id="1507" w:name="additional-system-requirements"/>
+    <w:bookmarkEnd w:id="1549"/>
+    <w:bookmarkStart w:id="1550" w:name="additional-system-requirements"/>
     <w:p>
       <w:pPr>
         <w:pStyle w:val="Heading3"/>
@@ -2071,8 +2139,8 @@
         <w:t xml:space="preserve">None of note. The engine and database together are a few megabytes.</w:t>
       </w:r>
     </w:p>
-    <w:bookmarkEnd w:id="1507"/>
-    <w:bookmarkStart w:id="1508" w:name="dependencies"/>
+    <w:bookmarkEnd w:id="1550"/>
+    <w:bookmarkStart w:id="1551" w:name="dependencies"/>
     <w:p>
       <w:pPr>
         <w:pStyle w:val="Heading3"/>
@@ -2089,8 +2157,8 @@
         <w:t xml:space="preserve">Python interface: cffi, NumPy, SciPy (developed and tested with cffi 2.0, NumPy 2.4, and SciPy 1.17). The validation suite additionally requires pycalphad; every oracle comparison reported here ran against pycalphad 0.11.1, and the tests that read pycalphad’s own shipped test databases skip cleanly if a later version relocates them. The WebAssembly build requires emscripten. The C core and the browser application have no dependencies.</w:t>
       </w:r>
     </w:p>
-    <w:bookmarkEnd w:id="1508"/>
-    <w:bookmarkStart w:id="1509" w:name="list-of-contributors"/>
+    <w:bookmarkEnd w:id="1551"/>
+    <w:bookmarkStart w:id="1552" w:name="list-of-contributors"/>
     <w:p>
       <w:pPr>
         <w:pStyle w:val="Heading3"/>
@@ -2107,8 +2175,8 @@
         <w:t xml:space="preserve">Michael E. Bustamante (design, implementation, validation, data curation).</w:t>
       </w:r>
     </w:p>
-    <w:bookmarkEnd w:id="1509"/>
-    <w:bookmarkStart w:id="1510" w:name="software-location"/>
+    <w:bookmarkEnd w:id="1552"/>
+    <w:bookmarkStart w:id="1553" w:name="software-location"/>
     <w:p>
       <w:pPr>
         <w:pStyle w:val="Heading3"/>
@@ -2150,7 +2218,7 @@
         </w:numPr>
       </w:pPr>
       <w:r>
-        <w:t xml:space="preserve">Persistent identifier: https://github.com/odinzen/hephaestus-mqmqa-public/releases/tag/v0.4.0</w:t>
+        <w:t xml:space="preserve">Persistent identifier: https://github.com/odinzen/hephaestus-mqmqa-public/releases/tag/v0.5.0</w:t>
       </w:r>
     </w:p>
     <w:p>
@@ -2186,7 +2254,7 @@
         </w:numPr>
       </w:pPr>
       <w:r>
-        <w:t xml:space="preserve">Version published: v0.4.0</w:t>
+        <w:t xml:space="preserve">Version published: v0.5.0</w:t>
       </w:r>
     </w:p>
     <w:p>
@@ -2261,8 +2329,8 @@
         <w:t xml:space="preserve">Date published: 2026-09-02</w:t>
       </w:r>
     </w:p>
-    <w:bookmarkEnd w:id="1510"/>
-    <w:bookmarkStart w:id="1511" w:name="language"/>
+    <w:bookmarkEnd w:id="1553"/>
+    <w:bookmarkStart w:id="1554" w:name="language"/>
     <w:p>
       <w:pPr>
         <w:pStyle w:val="Heading3"/>
@@ -2279,9 +2347,9 @@
         <w:t xml:space="preserve">English.</w:t>
       </w:r>
     </w:p>
-    <w:bookmarkEnd w:id="1511"/>
-    <w:bookmarkEnd w:id="1512"/>
-    <w:bookmarkStart w:id="1529" w:name="reuse-potential"/>
+    <w:bookmarkEnd w:id="1554"/>
+    <w:bookmarkEnd w:id="1555"/>
+    <w:bookmarkStart w:id="1572" w:name="reuse-potential"/>
     <w:p>
       <w:pPr>
         <w:pStyle w:val="Heading2"/>
@@ -2306,7 +2374,7 @@
         <w:t xml:space="preserve">The browser application makes the lowest barrier the default. A lecture on slag thermodynamics, a plant metallurgist screening a composition, or a reviewer checking a claimed equilibrium can load the database and calculate in seconds, with confidential inputs never leaving the machine. The same property makes it a practical template for other groups who want to publish a model as a zero-install tool.</w:t>
       </w:r>
     </w:p>
-    <w:bookmarkStart w:id="1528" w:name="worked-examples"/>
+    <w:bookmarkStart w:id="1571" w:name="worked-examples"/>
     <w:p>
       <w:pPr>
         <w:pStyle w:val="Heading3"/>
@@ -2518,18 +2586,18 @@
           <wp:inline>
             <wp:extent cx="4206240" cy="3262561"/>
             <wp:effectExtent b="0" l="0" r="0" t="0"/>
-            <wp:docPr descr="Figure 4: The LiCl-KCl phase diagram calculated by the salt listing from the shipped open database, at the listing’s own step size. Light to dark: liquid, two-phase, and subsolidus fields. The dot is the calculated eutectic at this step size (0.400, 640 K); the star is the measured eutectic (0.415, 626 K)." title="" id="1514" name="Picture"/>
+            <wp:docPr descr="Figure 4: The LiCl-KCl phase diagram calculated by the salt listing from the shipped open database, at the listing’s own step size. Light to dark: liquid, two-phase, and subsolidus fields. The dot is the calculated eutectic at this step size (0.400, 640 K); the star is the measured eutectic (0.415, 626 K)." title="" id="1557" name="Picture"/>
             <a:graphic>
               <a:graphicData uri="http://schemas.openxmlformats.org/drawingml/2006/picture">
                 <pic:pic>
                   <pic:nvPicPr>
-                    <pic:cNvPr descr="figures/fig4_salt_example.png" id="1515" name="Picture"/>
+                    <pic:cNvPr descr="figures/fig4_salt_example.png" id="1558" name="Picture"/>
                     <pic:cNvPicPr>
                       <a:picLocks noChangeArrowheads="1" noChangeAspect="1"/>
                     </pic:cNvPicPr>
                   </pic:nvPicPr>
                   <pic:blipFill>
-                    <a:blip r:embed="rId1513"/>
+                    <a:blip r:embed="rId1556"/>
                     <a:stretch>
                       <a:fillRect/>
                     </a:stretch>
@@ -2764,18 +2832,18 @@
           <wp:inline>
             <wp:extent cx="4206240" cy="3262561"/>
             <wp:effectExtent b="0" l="0" r="0" t="0"/>
-            <wp:docPr descr="Figure 5: The Al-Zn phase diagram calculated by the alloy listing from the shipped open TDB. Light to dark: liquid, liquid plus solid, and solid fields. The dot is the calculated eutectic (0.890, 660 K); the star is the assessed eutectic (0.885, 654 K)." title="" id="1517" name="Picture"/>
+            <wp:docPr descr="Figure 5: The Al-Zn phase diagram calculated by the alloy listing from the shipped open TDB. Light to dark: liquid, liquid plus solid, and solid fields. The dot is the calculated eutectic (0.890, 660 K); the star is the assessed eutectic (0.885, 654 K)." title="" id="1560" name="Picture"/>
             <a:graphic>
               <a:graphicData uri="http://schemas.openxmlformats.org/drawingml/2006/picture">
                 <pic:pic>
                   <pic:nvPicPr>
-                    <pic:cNvPr descr="figures/fig5_alloy_example.png" id="1518" name="Picture"/>
+                    <pic:cNvPr descr="figures/fig5_alloy_example.png" id="1561" name="Picture"/>
                     <pic:cNvPicPr>
                       <a:picLocks noChangeArrowheads="1" noChangeAspect="1"/>
                     </pic:cNvPicPr>
                   </pic:nvPicPr>
                   <pic:blipFill>
-                    <a:blip r:embed="rId1516"/>
+                    <a:blip r:embed="rId1559"/>
                     <a:stretch>
                       <a:fillRect/>
                     </a:stretch>
@@ -2827,7 +2895,52 @@
         <w:t xml:space="preserve"> </w:t>
       </w:r>
       <w:r>
-        <w:t xml:space="preserve">mole fraction from 1200 to 3000 K and 0.1 to 10 atm. The same solver is compiled into the WebAssembly core, so it runs in the browser gas calculator alongside the condensed engine. For the dense conditions of pressurized reactors and gasifiers, a Peng-Robinson real-gas option applies fugacity corrections from tabulated critical constants, validated against Cantera’s own Peng-Robinson and reducing to the ideal result at atmospheric pressure. Coupling the gas to a molten oxide, for pyrometallurgical oxygen potentials, is the step still in progress. The uTDB grammar already defines the ideal-gas phase, so a single file can in principle carry an alloy, a slag, its solids, and a gas. The repository also publishes an openly specified unified dialect (uTDB) that carries the MQMQA statements inside TDB grammar, with two shipped demonstration files chosen to be processes rather than curiosities: an aluminum-recycling database holding the Al-Zn alloy with its NaCl-KCl-MgCl2 salt flux, and a steelmaking database holding a basic Fe-C steel, magnetic phases included, with the FeO-MgO-SiO2 slag and its silicate solid solutions. Round-trip tests assert both reproduce their source-file physics at machine precision. The steelmaking file is the clearest illustration of what a unified container buys (Figure 6): from one file the browser calculates the iron-carbon alloy diagram through the magnetic compound energy formalism and its Scheil solidification path, while the same file’s slag is a molten-salt-model liquid, two physics that no single legacy container holds together. The furnace atmosphere over that bath is calculable on the same page, and Figure 7 works it through with the gas calculator: the CO to CO</w:t>
+        <w:t xml:space="preserve">mole fraction from 1200 to 3000 K and 0.1 to 10 atm. The same solver is compiled into the WebAssembly core, so it runs in the browser gas calculator alongside the condensed engine. For the dense conditions of pressurized reactors and gasifiers, a Peng-Robinson real-gas option applies fugacity corrections from tabulated critical constants, validated against Cantera’s own Peng-Robinson and reducing to the ideal result at atmospheric pressure. The gas is coupled to the condensed phases in one equilibrium, the step that carries pyrometallurgical oxygen potentials: a shared set of element potentials holds the ideal gas and the pure condensed species (metals, oxides, graphite) at a common oxygen potential, and the stable phase assemblage is the set of lowest total Gibbs energy, so the furnace atmosphere and the condensate settle together rather than apart. The solver reproduces Cantera’s own multiphase equilibrium on the reactions that carry those potentials, the Boudouard balance C(gr) + CO</w:t>
+      </w:r>
+      <w:r>
+        <w:rPr>
+          <w:vertAlign w:val="subscript"/>
+        </w:rPr>
+        <w:t xml:space="preserve">2</w:t>
+      </w:r>
+      <w:r>
+        <w:t xml:space="preserve"> </w:t>
+      </w:r>
+      <w:r>
+        <w:t xml:space="preserve">= 2 CO and iron-oxide reduction FeO + CO = Fe + CO</w:t>
+      </w:r>
+      <w:r>
+        <w:rPr>
+          <w:vertAlign w:val="subscript"/>
+        </w:rPr>
+        <w:t xml:space="preserve">2</w:t>
+      </w:r>
+      <w:r>
+        <w:t xml:space="preserve">, to about 10</w:t>
+      </w:r>
+      <w:r>
+        <w:rPr>
+          <w:vertAlign w:val="superscript"/>
+        </w:rPr>
+        <w:t xml:space="preserve">-3</w:t>
+      </w:r>
+      <w:r>
+        <w:t xml:space="preserve"> </w:t>
+      </w:r>
+      <w:r>
+        <w:t xml:space="preserve">mole fraction, and to 10</w:t>
+      </w:r>
+      <w:r>
+        <w:rPr>
+          <w:vertAlign w:val="superscript"/>
+        </w:rPr>
+        <w:t xml:space="preserve">-10</w:t>
+      </w:r>
+      <w:r>
+        <w:t xml:space="preserve"> </w:t>
+      </w:r>
+      <w:r>
+        <w:t xml:space="preserve">where the two are given identical thermodynamic data so that only the coupling is under test. The condensate coupled here is the set of stoichiometric metals and oxides; extending the same shared-potential solve to the Modified Quasichemical slag itself, whose element potentials depend on its quadruplet distribution and so enter as a nested inner solve, is the one remaining reach, and the uTDB grammar already defines the ideal-gas phase, so a single file carries an alloy, a slag, its solids, and a gas. The repository also publishes an openly specified unified dialect (uTDB) that carries the MQMQA statements inside TDB grammar, with two shipped demonstration files chosen to be processes rather than curiosities: an aluminum-recycling database holding the Al-Zn alloy with its NaCl-KCl-MgCl2 salt flux, and a steelmaking database holding a basic Fe-C steel, magnetic phases included, with the FeO-MgO-SiO2 slag and its silicate solid solutions. Round-trip tests assert both reproduce their source-file physics at machine precision. The steelmaking file is the clearest illustration of what a unified container buys (Figure 6): from one file the browser calculates the iron-carbon alloy diagram through the magnetic compound energy formalism and its Scheil solidification path, while the same file’s slag is a molten-salt-model liquid, two physics that no single legacy container holds together. The furnace atmosphere over that bath is calculable on the same page, and Figure 7 works it through with the gas calculator: the CO to CO</w:t>
       </w:r>
       <w:r>
         <w:rPr>
@@ -2851,18 +2964,18 @@
           <wp:inline>
             <wp:extent cx="5334000" cy="4430576"/>
             <wp:effectExtent b="0" l="0" r="0" t="0"/>
-            <wp:docPr descr="Figure 6: One unified (.utdb) file, two physics, calculated in the browser. (a) The steelmaking database loaded with the Melt/Alloy view toggle on Alloy; the engine calculates the Fe-C phase diagram through the magnetic compound energy formalism, rendered over a 0-25 mol% C composition window (the equilibrium always solves the whole join), with two tapped compositions pinned. (b) Scheil solidification for the same join at 4 mol% C, first solid at 1741 K and the residual liquid frozen by 1433 K, against the equilibrium lever-rule path (dashed). The file’s slag half is a Modified Quasichemical Model liquid; no legacy container holds both models at once." title="" id="1520" name="Picture"/>
+            <wp:docPr descr="Figure 6: One unified (.utdb) file, two physics, calculated in the browser. (a) The steelmaking database loaded with the Melt/Alloy view toggle on Alloy; the engine calculates the Fe-C phase diagram through the magnetic compound energy formalism, rendered over a 0-25 mol% C composition window (the equilibrium always solves the whole join), with two tapped compositions pinned. (b) Scheil solidification for the same join at 4 mol% C, first solid at 1741 K and the residual liquid frozen by 1433 K, against the equilibrium lever-rule path (dashed). The file’s slag half is a Modified Quasichemical Model liquid; no legacy container holds both models at once." title="" id="1563" name="Picture"/>
             <a:graphic>
               <a:graphicData uri="http://schemas.openxmlformats.org/drawingml/2006/picture">
                 <pic:pic>
                   <pic:nvPicPr>
-                    <pic:cNvPr descr="figures/fig6_utdb_steel.png" id="1521" name="Picture"/>
+                    <pic:cNvPr descr="figures/fig6_utdb_steel.png" id="1564" name="Picture"/>
                     <pic:cNvPicPr>
                       <a:picLocks noChangeArrowheads="1" noChangeAspect="1"/>
                     </pic:cNvPicPr>
                   </pic:nvPicPr>
                   <pic:blipFill>
-                    <a:blip r:embed="rId1519"/>
+                    <a:blip r:embed="rId1562"/>
                     <a:stretch>
                       <a:fillRect/>
                     </a:stretch>
@@ -2906,18 +3019,18 @@
           <wp:inline>
             <wp:extent cx="5334000" cy="2319130"/>
             <wp:effectExtent b="0" l="0" r="0" t="0"/>
-            <wp:docPr descr="Figure 7: The gas calculator as a steelmaking worked example, the equilibrium of a carbon-oxygen furnace gas by the Hephaestus gas engine (the NASA-polynomial element-potential solver compiled into the browser), with Cantera as the independent check. (a) Oxygen partial pressure against the CO to CO2 ratio at the 1873 K tap temperature: a lower ratio is more oxidizing and drives iron into the slag as FeO, a higher ratio is more reducing and decarburizes the steel. (b) The same oxygen potential against temperature for four fixed CO to CO2 buffers, showing that a given gas grows more oxidizing as it heats; the dashed line marks the tap temperature. Open circles are Cantera, agreeing to about 10-5 mole fraction across the field." title="" id="1523" name="Picture"/>
+            <wp:docPr descr="Figure 7: The gas calculator as a steelmaking worked example, the equilibrium of a carbon-oxygen furnace gas by the Hephaestus gas engine (the NASA-polynomial element-potential solver compiled into the browser), with Cantera as the independent check. (a) Oxygen partial pressure against the CO to CO2 ratio at the 1873 K tap temperature: a lower ratio is more oxidizing and drives iron into the slag as FeO, a higher ratio is more reducing and decarburizes the steel. (b) The same oxygen potential against temperature for four fixed CO to CO2 buffers, showing that a given gas grows more oxidizing as it heats; the dashed line marks the tap temperature. Open circles are Cantera, agreeing to about 10-5 mole fraction across the field." title="" id="1566" name="Picture"/>
             <a:graphic>
               <a:graphicData uri="http://schemas.openxmlformats.org/drawingml/2006/picture">
                 <pic:pic>
                   <pic:nvPicPr>
-                    <pic:cNvPr descr="figures/fig7_gas_steel.png" id="1524" name="Picture"/>
+                    <pic:cNvPr descr="figures/fig7_gas_steel.png" id="1567" name="Picture"/>
                     <pic:cNvPicPr>
                       <a:picLocks noChangeArrowheads="1" noChangeAspect="1"/>
                     </pic:cNvPicPr>
                   </pic:nvPicPr>
                   <pic:blipFill>
-                    <a:blip r:embed="rId1522"/>
+                    <a:blip r:embed="rId1565"/>
                     <a:stretch>
                       <a:fillRect/>
                     </a:stretch>
@@ -2997,18 +3110,18 @@
           <wp:inline>
             <wp:extent cx="4572000" cy="3556000"/>
             <wp:effectExtent b="0" l="0" r="0" t="0"/>
-            <wp:docPr descr="Figure 8: Al-Zn phase diagram with ESPEI parameter uncertainty. The liquid and face-centred-cubic (fcc) excess parameters were refit by Markov-chain Monte Carlo to the measured liquid enthalpy of mixing (Debski et al., digitised from Dinsdale et al. [44]) and the assessed phase boundaries (Massalski [45]; Mey [39]), and the posterior was propagated through the engine. The solid line is the median liquidus and the dashed line the median fcc solvus; the shaded region is the 90 percent posterior band on each. The band is narrow on the liquidus, which the calorimetry constrains, and wider on the fcc solvus, which only the diagram constrains. The open circle is the assessed eutectic." title="" id="1526" name="Picture"/>
+            <wp:docPr descr="Figure 8: Al-Zn phase diagram with ESPEI parameter uncertainty. The liquid and face-centred-cubic (fcc) excess parameters were refit by Markov-chain Monte Carlo to the measured liquid enthalpy of mixing (Debski et al., digitised from Dinsdale et al. [44]) and the assessed phase boundaries (Massalski [45]; Mey [39]), and the posterior was propagated through the engine. The solid line is the median liquidus and the dashed line the median fcc solvus; the shaded region is the 90 percent posterior band on each. The band is narrow on the liquidus, which the calorimetry constrains, and wider on the fcc solvus, which only the diagram constrains. The open circle is the assessed eutectic." title="" id="1569" name="Picture"/>
             <a:graphic>
               <a:graphicData uri="http://schemas.openxmlformats.org/drawingml/2006/picture">
                 <pic:pic>
                   <pic:nvPicPr>
-                    <pic:cNvPr descr="figures/fig8_uq_alzn.png" id="1527" name="Picture"/>
+                    <pic:cNvPr descr="figures/fig8_uq_alzn.png" id="1570" name="Picture"/>
                     <pic:cNvPicPr>
                       <a:picLocks noChangeArrowheads="1" noChangeAspect="1"/>
                     </pic:cNvPicPr>
                   </pic:nvPicPr>
                   <pic:blipFill>
-                    <a:blip r:embed="rId1525"/>
+                    <a:blip r:embed="rId1568"/>
                     <a:stretch>
                       <a:fillRect/>
                     </a:stretch>
@@ -3048,12 +3161,12 @@
         <w:pStyle w:val="BodyText"/>
       </w:pPr>
       <w:r>
-        <w:t xml:space="preserve">The gap this work addresses was never the model, which has been published for two decades, but an open, runnable pairing of model and parameters. Hephaestus supplies both halves under open licenses and puts them behind a browser page that asks nothing of its user. The claims are checkable end to end. Release v0.4.0 archives the exact version described, and the 114-test suite reruns the pycalphad comparisons on any machine. The worked examples print the figures shown, and every parameter in every shipped database traces to a published measurement through its provenance file. A reader who doubts a number can recalculate it; one who needs a system that is missing can build it with the same open tools, or ask.</w:t>
-      </w:r>
-    </w:p>
-    <w:bookmarkEnd w:id="1528"/>
-    <w:bookmarkEnd w:id="1529"/>
-    <w:bookmarkStart w:id="1530" w:name="data-availability"/>
+        <w:t xml:space="preserve">The gap this work addresses was never the model, which has been published for two decades, but an open, runnable pairing of model and parameters. Hephaestus supplies both halves under open licenses and puts them behind a browser page that asks nothing of its user. The claims are checkable end to end. Release v0.5.0 archives the exact version described, and the 128-test suite reruns the pycalphad comparisons on any machine. The worked examples print the figures shown, and every parameter in every shipped database traces to a published measurement through its provenance file. A reader who doubts a number can recalculate it; one who needs a system that is missing can build it with the same open tools, or ask.</w:t>
+      </w:r>
+    </w:p>
+    <w:bookmarkEnd w:id="1571"/>
+    <w:bookmarkEnd w:id="1572"/>
+    <w:bookmarkStart w:id="1573" w:name="data-availability"/>
     <w:p>
       <w:pPr>
         <w:pStyle w:val="Heading2"/>
@@ -3067,11 +3180,11 @@
         <w:pStyle w:val="FirstParagraph"/>
       </w:pPr>
       <w:r>
-        <w:t xml:space="preserve">The engine, the database, the browser application, and the validation suite are openly available in the code repository listed above; the version described here is archived as release v0.4.0. The database files and their provenance records are in the repository’s data directory under CC BY 4.0.</w:t>
-      </w:r>
-    </w:p>
-    <w:bookmarkEnd w:id="1530"/>
-    <w:bookmarkStart w:id="1531" w:name="acknowledgements"/>
+        <w:t xml:space="preserve">The engine, the database, the browser application, and the validation suite are openly available in the code repository listed above; the version described here is archived as release v0.5.0. The database files and their provenance records are in the repository’s data directory under CC BY 4.0.</w:t>
+      </w:r>
+    </w:p>
+    <w:bookmarkEnd w:id="1573"/>
+    <w:bookmarkStart w:id="1574" w:name="acknowledgements"/>
     <w:p>
       <w:pPr>
         <w:pStyle w:val="Heading2"/>
@@ -3088,8 +3201,8 @@
         <w:t xml:space="preserve">During the development of this software the author used Claude Code (Anthropic) to assist with implementation, validation scripting, and manuscript preparation. This assistance was agentic, not autonomous: it operated under author direction and supervision at every step and was never a closed loop that produced or accepted results without review. Every parameter was traced by the author to its primary source before entering the database, and every reference was verified against its registry record. The author reviewed and approved all output and takes full responsibility for this article.</w:t>
       </w:r>
     </w:p>
-    <w:bookmarkEnd w:id="1531"/>
-    <w:bookmarkStart w:id="1532" w:name="funding-statement"/>
+    <w:bookmarkEnd w:id="1574"/>
+    <w:bookmarkStart w:id="1575" w:name="funding-statement"/>
     <w:p>
       <w:pPr>
         <w:pStyle w:val="Heading2"/>
@@ -3106,8 +3219,8 @@
         <w:t xml:space="preserve">The development of this software received no external funding.</w:t>
       </w:r>
     </w:p>
-    <w:bookmarkEnd w:id="1532"/>
-    <w:bookmarkStart w:id="1533" w:name="competing-interests"/>
+    <w:bookmarkEnd w:id="1575"/>
+    <w:bookmarkStart w:id="1576" w:name="competing-interests"/>
     <w:p>
       <w:pPr>
         <w:pStyle w:val="Heading2"/>
@@ -3124,8 +3237,8 @@
         <w:t xml:space="preserve">The author founded Odinzen LLC, which provides commercial thermodynamic modeling services, and declares this as a competing interest. The software and database published here are released in full under open licenses, and no proprietary Odinzen assets are included.</w:t>
       </w:r>
     </w:p>
-    <w:bookmarkEnd w:id="1533"/>
-    <w:bookmarkStart w:id="1534" w:name="references"/>
+    <w:bookmarkEnd w:id="1576"/>
+    <w:bookmarkStart w:id="1577" w:name="references"/>
     <w:p>
       <w:pPr>
         <w:pStyle w:val="Heading2"/>
@@ -3506,8 +3619,8 @@
         <w:t xml:space="preserve">[45] Massalski TB, editor. Binary Alloy Phase Diagrams. 2nd ed. Materials Park (OH): ASM International; 1990.</w:t>
       </w:r>
     </w:p>
-    <w:bookmarkEnd w:id="1534"/>
-    <w:bookmarkEnd w:id="1535"/>
+    <w:bookmarkEnd w:id="1577"/>
+    <w:bookmarkEnd w:id="1578"/>
     <w:sectPr>
       <w:footnotePr>
         <w:numRestart w:val="eachSect"/>

</xml_diff>

<commit_message>
Rebuild manuscript docx/pdf for the solution-slag coupling (131 tests)
Argus numbering gate passes: 45 references in order, 3 tables, 8 figures resolve.

Co-Authored-By: Claude Opus 4.8 <noreply@anthropic.com>
</commit_message>
<xml_diff>
--- a/paper/Bustamante_Hephaestus_JORS_manuscript.docx
+++ b/paper/Bustamante_Hephaestus_JORS_manuscript.docx
@@ -2,7 +2,7 @@
 <file path=word/document.xml><?xml version="1.0" encoding="utf-8"?>
 <w:document xmlns:w="http://schemas.openxmlformats.org/wordprocessingml/2006/main" xmlns:m="http://schemas.openxmlformats.org/officeDocument/2006/math" xmlns:r="http://schemas.openxmlformats.org/officeDocument/2006/relationships" xmlns:o="urn:schemas-microsoft-com:office:office" xmlns:v="urn:schemas-microsoft-com:vml" xmlns:w10="urn:schemas-microsoft-com:office:word" xmlns:a="http://schemas.openxmlformats.org/drawingml/2006/main" xmlns:pic="http://schemas.openxmlformats.org/drawingml/2006/picture" xmlns:wp="http://schemas.openxmlformats.org/drawingml/2006/wordprocessingDrawing">
   <w:body>
-    <w:bookmarkStart w:id="1578" w:name="X4855b1162e70238fd839d871e0792397dc58430"/>
+    <w:bookmarkStart w:id="1621" w:name="X4855b1162e70238fd839d871e0792397dc58430"/>
     <w:p>
       <w:pPr>
         <w:pStyle w:val="Heading1"/>
@@ -159,7 +159,7 @@
         <w:t xml:space="preserve">CALPHAD; molten slag; molten salt; modified quasichemical model; thermodynamic database; phase diagram; gas equilibrium; WebAssembly; open data</w:t>
       </w:r>
     </w:p>
-    <w:bookmarkStart w:id="1547" w:name="overview"/>
+    <w:bookmarkStart w:id="1590" w:name="overview"/>
     <w:p>
       <w:pPr>
         <w:pStyle w:val="Heading2"/>
@@ -168,7 +168,7 @@
         <w:t xml:space="preserve">(1) Overview</w:t>
       </w:r>
     </w:p>
-    <w:bookmarkStart w:id="1534" w:name="introduction"/>
+    <w:bookmarkStart w:id="1577" w:name="introduction"/>
     <w:p>
       <w:pPr>
         <w:pStyle w:val="Heading3"/>
@@ -548,8 +548,8 @@
         <w:t xml:space="preserve">Hephaestus is a deliberate response to that gap, and it treats the engine and the data as one contribution because neither is useful alone. The engine is small on purpose. Its core is plain C with no dependencies, which makes it easy to embed and lets the identical code compile to WebAssembly, so the full calculator runs in a web browser with nothing installed and no data leaving the user’s machine. The database is open on purpose. Every parameter in it derives from published measurements, each value carries its provenance down to table and page, and the known shortcomings are documented next to the numbers they affect. The present work describes both, their validation against pycalphad and against measured phase equilibria, and the ways they can be reused. None of it asks the reader to program. For the experimentalist who never writes code, the browser application is the entire product: a page to open, a database to click, and a diagram to read. The sections that follow describe the machinery underneath for those who want it. Supplementary Material S1 is a plain-language primer for the non-programmer, starting at what a database file is and ending at a first calculation and how to read it. Its closing section teaches what an assessment is built from, so a reader who wants to contribute data for open publication, or to commission a file, arrives knowing what is needed.</w:t>
       </w:r>
     </w:p>
-    <w:bookmarkEnd w:id="1534"/>
-    <w:bookmarkStart w:id="1544" w:name="implementation-and-architecture"/>
+    <w:bookmarkEnd w:id="1577"/>
+    <w:bookmarkStart w:id="1587" w:name="implementation-and-architecture"/>
     <w:p>
       <w:pPr>
         <w:pStyle w:val="Heading3"/>
@@ -575,18 +575,18 @@
           <wp:inline>
             <wp:extent cx="5334000" cy="3511167"/>
             <wp:effectExtent b="0" l="0" r="0" t="0"/>
-            <wp:docPr descr="Figure 1: Architecture of Hephaestus. A single dependency-free C core reads the field’s three database dialects (ChemSage .dat, Thermo-Calc .tdb with the Inden magnetic model, and the unified .utdb) and calculates all thermodynamics; the same core is used as a native library, from Python through cffi, and compiled to WebAssembly behind the browser application. dbbuild writes new ChemSage files from measured data, and every energy path is validated against pycalphad." title="" id="1536" name="Picture"/>
+            <wp:docPr descr="Figure 1: Architecture of Hephaestus. A single dependency-free C core reads the field’s three database dialects (ChemSage .dat, Thermo-Calc .tdb with the Inden magnetic model, and the unified .utdb) and calculates all thermodynamics; the same core is used as a native library, from Python through cffi, and compiled to WebAssembly behind the browser application. dbbuild writes new ChemSage files from measured data, and every energy path is validated against pycalphad." title="" id="1579" name="Picture"/>
             <a:graphic>
               <a:graphicData uri="http://schemas.openxmlformats.org/drawingml/2006/picture">
                 <pic:pic>
                   <pic:nvPicPr>
-                    <pic:cNvPr descr="figures/fig1_architecture.png" id="1537" name="Picture"/>
+                    <pic:cNvPr descr="figures/fig1_architecture.png" id="1580" name="Picture"/>
                     <pic:cNvPicPr>
                       <a:picLocks noChangeArrowheads="1" noChangeAspect="1"/>
                     </pic:cNvPicPr>
                   </pic:nvPicPr>
                   <pic:blipFill>
-                    <a:blip r:embed="rId1535"/>
+                    <a:blip r:embed="rId1578"/>
                     <a:stretch>
                       <a:fillRect/>
                     </a:stretch>
@@ -793,18 +793,18 @@
           <wp:inline>
             <wp:extent cx="4754880" cy="3913308"/>
             <wp:effectExtent b="0" l="0" r="0" t="0"/>
-            <wp:docPr descr="Figure 2: The live solver in the browser application (light theme). The user loads the shipped database, picks a temperature, and presses Compute; the WebAssembly engine then solves the full FeO-MgO-SiO2 phase assemblage client side (here 861 composition samples and 595 tie-facets in about two seconds). Tapping a composition reads its stable phases and pins it to a comparison list; hovering previews on desktop." title="" id="1539" name="Picture"/>
+            <wp:docPr descr="Figure 2: The live solver in the browser application (light theme). The user loads the shipped database, picks a temperature, and presses Compute; the WebAssembly engine then solves the full FeO-MgO-SiO2 phase assemblage client side (here 861 composition samples and 595 tie-facets in about two seconds). Tapping a composition reads its stable phases and pins it to a comparison list; hovering previews on desktop." title="" id="1582" name="Picture"/>
             <a:graphic>
               <a:graphicData uri="http://schemas.openxmlformats.org/drawingml/2006/picture">
                 <pic:pic>
                   <pic:nvPicPr>
-                    <pic:cNvPr descr="figures/fig2_browser_app.png" id="1540" name="Picture"/>
+                    <pic:cNvPr descr="figures/fig2_browser_app.png" id="1583" name="Picture"/>
                     <pic:cNvPicPr>
                       <a:picLocks noChangeArrowheads="1" noChangeAspect="1"/>
                     </pic:cNvPicPr>
                   </pic:nvPicPr>
                   <pic:blipFill>
-                    <a:blip r:embed="rId1538"/>
+                    <a:blip r:embed="rId1581"/>
                     <a:stretch>
                       <a:fillRect/>
                     </a:stretch>
@@ -970,18 +970,18 @@
           <wp:inline>
             <wp:extent cx="5334000" cy="2197297"/>
             <wp:effectExtent b="0" l="0" r="0" t="0"/>
-            <wp:docPr descr="Figure 3: The assessed FeO-MgO-SiO2 system calculated from the shipped database files. (a) Liquidus projection: primary crystallizing phase fields, with liquidus isotherms labeled in °C. (b) Isothermal section at 1600 °C: stable phase assemblages, shaded by the number of solid phases present. Phase labels: L liquid, Crs cristobalite, Ol olivine, Opx orthopyroxene, Per periclase, Wus wustite." title="" id="1542" name="Picture"/>
+            <wp:docPr descr="Figure 3: The assessed FeO-MgO-SiO2 system calculated from the shipped database files. (a) Liquidus projection: primary crystallizing phase fields, with liquidus isotherms labeled in °C. (b) Isothermal section at 1600 °C: stable phase assemblages, shaded by the number of solid phases present. Phase labels: L liquid, Crs cristobalite, Ol olivine, Opx orthopyroxene, Per periclase, Wus wustite." title="" id="1585" name="Picture"/>
             <a:graphic>
               <a:graphicData uri="http://schemas.openxmlformats.org/drawingml/2006/picture">
                 <pic:pic>
                   <pic:nvPicPr>
-                    <pic:cNvPr descr="figures/fig3_ternary.png" id="1543" name="Picture"/>
+                    <pic:cNvPr descr="figures/fig3_ternary.png" id="1586" name="Picture"/>
                     <pic:cNvPicPr>
                       <a:picLocks noChangeArrowheads="1" noChangeAspect="1"/>
                     </pic:cNvPicPr>
                   </pic:nvPicPr>
                   <pic:blipFill>
-                    <a:blip r:embed="rId1541"/>
+                    <a:blip r:embed="rId1584"/>
                     <a:stretch>
                       <a:fillRect/>
                     </a:stretch>
@@ -1371,8 +1371,8 @@
         </w:tc>
       </w:tr>
     </w:tbl>
-    <w:bookmarkEnd w:id="1544"/>
-    <w:bookmarkStart w:id="1545" w:name="anatomy-of-a-database-file"/>
+    <w:bookmarkEnd w:id="1587"/>
+    <w:bookmarkStart w:id="1588" w:name="anatomy-of-a-database-file"/>
     <w:p>
       <w:pPr>
         <w:pStyle w:val="Heading3"/>
@@ -1405,8 +1405,8 @@
         <w:t xml:space="preserve">That asymmetry is the economics of the field in miniature: implementations of the published models are increasingly available, but each fitted parameter condenses dozens of measurements and decisions. Parameter sets rather than codes are therefore the scarce commodity, and an openly licensed, provenance-tracked database is the part of this contribution that cannot be regenerated from the paper alone.</w:t>
       </w:r>
     </w:p>
-    <w:bookmarkEnd w:id="1545"/>
-    <w:bookmarkStart w:id="1546" w:name="quality-control"/>
+    <w:bookmarkEnd w:id="1588"/>
+    <w:bookmarkStart w:id="1589" w:name="quality-control"/>
     <w:p>
       <w:pPr>
         <w:pStyle w:val="Heading3"/>
@@ -1420,7 +1420,7 @@
         <w:pStyle w:val="FirstParagraph"/>
       </w:pPr>
       <w:r>
-        <w:t xml:space="preserve">Validation rests on one principle. A number is trusted only when an independent implementation reproduces it. pycalphad plays that role throughout, and Table 3 lists the checks. The pytest suite, 128 tests, compares every energy contribution on shared parameters and agrees to about 10</w:t>
+        <w:t xml:space="preserve">Validation rests on one principle. A number is trusted only when an independent implementation reproduces it. pycalphad plays that role throughout, and Table 3 lists the checks. The pytest suite, 131 tests, compares every energy contribution on shared parameters and agrees to about 10</w:t>
       </w:r>
       <w:r>
         <w:rPr>
@@ -1985,6 +1985,7 @@
           <w:tcPr/>
           <w:p>
             <w:pPr>
+              <w:keepNext/>
               <w:pStyle w:val="Compact"/>
               <w:jc w:val="left"/>
             </w:pPr>
@@ -1997,6 +1998,7 @@
           <w:tcPr/>
           <w:p>
             <w:pPr>
+              <w:keepNext/>
               <w:pStyle w:val="Compact"/>
               <w:jc w:val="left"/>
             </w:pPr>
@@ -2009,6 +2011,7 @@
           <w:tcPr/>
           <w:p>
             <w:pPr>
+              <w:keepNext/>
               <w:pStyle w:val="Compact"/>
               <w:jc w:val="left"/>
             </w:pPr>
@@ -2042,6 +2045,56 @@
           </w:p>
         </w:tc>
       </w:tr>
+      <w:tr>
+        <w:trPr>
+          <w:cantSplit/>
+        </w:trPr>
+        <w:tc>
+          <w:tcPr/>
+          <w:p>
+            <w:pPr>
+              <w:pStyle w:val="Compact"/>
+              <w:jc w:val="left"/>
+            </w:pPr>
+            <w:r>
+              <w:t xml:space="preserve">Gas-slag coupling (iron-saturated)</w:t>
+            </w:r>
+          </w:p>
+        </w:tc>
+        <w:tc>
+          <w:tcPr/>
+          <w:p>
+            <w:pPr>
+              <w:pStyle w:val="Compact"/>
+              <w:jc w:val="left"/>
+            </w:pPr>
+            <w:r>
+              <w:t xml:space="preserve">gas + MQMQA slag through the FeO activity; equilibrium CO</w:t>
+            </w:r>
+            <w:r>
+              <w:rPr>
+                <w:vertAlign w:val="subscript"/>
+              </w:rPr>
+              <w:t xml:space="preserve">2</w:t>
+            </w:r>
+            <w:r>
+              <w:t xml:space="preserve">/CO vs slag composition</w:t>
+            </w:r>
+          </w:p>
+        </w:tc>
+        <w:tc>
+          <w:tcPr/>
+          <w:p>
+            <w:pPr>
+              <w:pStyle w:val="Compact"/>
+              <w:jc w:val="left"/>
+            </w:pPr>
+            <w:r>
+              <w:t xml:space="preserve">pure-FeO limit within 1% of the Cantera Fe/FeO buffer; slag activity matches the fitted iron-saturated data</w:t>
+            </w:r>
+          </w:p>
+        </w:tc>
+      </w:tr>
     </w:tbl>
     <w:p>
       <w:pPr>
@@ -2075,9 +2128,9 @@
         <w:t xml:space="preserve">invariants sit within about 40 °C, and the ternary liquidus projection reproduces the measured field topology [24]. Development practice is plain: the repository is version controlled with tagged releases (v0.1.0 through the v0.5.0 described here), the full suite runs before every release, and a fixed bug lands together with the regression test that would have caught it. The suite runs on Windows 11 under CPython 3.11 and 3.12; the browser application is exercised in Chromium- and Gecko-based browsers. A user can confirm a working installation by running pytest against the bundled test databases, or with no installation at all by opening the web application and loading the shipped ternary database.</w:t>
       </w:r>
     </w:p>
-    <w:bookmarkEnd w:id="1546"/>
-    <w:bookmarkEnd w:id="1547"/>
-    <w:bookmarkStart w:id="1555" w:name="availability"/>
+    <w:bookmarkEnd w:id="1589"/>
+    <w:bookmarkEnd w:id="1590"/>
+    <w:bookmarkStart w:id="1598" w:name="availability"/>
     <w:p>
       <w:pPr>
         <w:pStyle w:val="Heading2"/>
@@ -2086,7 +2139,7 @@
         <w:t xml:space="preserve">(2) Availability</w:t>
       </w:r>
     </w:p>
-    <w:bookmarkStart w:id="1548" w:name="operating-system"/>
+    <w:bookmarkStart w:id="1591" w:name="operating-system"/>
     <w:p>
       <w:pPr>
         <w:pStyle w:val="Heading3"/>
@@ -2103,8 +2156,8 @@
         <w:t xml:space="preserve">Platform independent. The core builds with any C99 compiler; development and testing used Windows 11. The browser application runs in any current browser with WebAssembly support.</w:t>
       </w:r>
     </w:p>
-    <w:bookmarkEnd w:id="1548"/>
-    <w:bookmarkStart w:id="1549" w:name="programming-language"/>
+    <w:bookmarkEnd w:id="1591"/>
+    <w:bookmarkStart w:id="1592" w:name="programming-language"/>
     <w:p>
       <w:pPr>
         <w:pStyle w:val="Heading3"/>
@@ -2121,8 +2174,8 @@
         <w:t xml:space="preserve">C (core), Python 3.11 or later (interface and fitting tools), JavaScript (browser application).</w:t>
       </w:r>
     </w:p>
-    <w:bookmarkEnd w:id="1549"/>
-    <w:bookmarkStart w:id="1550" w:name="additional-system-requirements"/>
+    <w:bookmarkEnd w:id="1592"/>
+    <w:bookmarkStart w:id="1593" w:name="additional-system-requirements"/>
     <w:p>
       <w:pPr>
         <w:pStyle w:val="Heading3"/>
@@ -2139,8 +2192,8 @@
         <w:t xml:space="preserve">None of note. The engine and database together are a few megabytes.</w:t>
       </w:r>
     </w:p>
-    <w:bookmarkEnd w:id="1550"/>
-    <w:bookmarkStart w:id="1551" w:name="dependencies"/>
+    <w:bookmarkEnd w:id="1593"/>
+    <w:bookmarkStart w:id="1594" w:name="dependencies"/>
     <w:p>
       <w:pPr>
         <w:pStyle w:val="Heading3"/>
@@ -2157,8 +2210,8 @@
         <w:t xml:space="preserve">Python interface: cffi, NumPy, SciPy (developed and tested with cffi 2.0, NumPy 2.4, and SciPy 1.17). The validation suite additionally requires pycalphad; every oracle comparison reported here ran against pycalphad 0.11.1, and the tests that read pycalphad’s own shipped test databases skip cleanly if a later version relocates them. The WebAssembly build requires emscripten. The C core and the browser application have no dependencies.</w:t>
       </w:r>
     </w:p>
-    <w:bookmarkEnd w:id="1551"/>
-    <w:bookmarkStart w:id="1552" w:name="list-of-contributors"/>
+    <w:bookmarkEnd w:id="1594"/>
+    <w:bookmarkStart w:id="1595" w:name="list-of-contributors"/>
     <w:p>
       <w:pPr>
         <w:pStyle w:val="Heading3"/>
@@ -2175,8 +2228,8 @@
         <w:t xml:space="preserve">Michael E. Bustamante (design, implementation, validation, data curation).</w:t>
       </w:r>
     </w:p>
-    <w:bookmarkEnd w:id="1552"/>
-    <w:bookmarkStart w:id="1553" w:name="software-location"/>
+    <w:bookmarkEnd w:id="1595"/>
+    <w:bookmarkStart w:id="1596" w:name="software-location"/>
     <w:p>
       <w:pPr>
         <w:pStyle w:val="Heading3"/>
@@ -2329,8 +2382,8 @@
         <w:t xml:space="preserve">Date published: 2026-09-02</w:t>
       </w:r>
     </w:p>
-    <w:bookmarkEnd w:id="1553"/>
-    <w:bookmarkStart w:id="1554" w:name="language"/>
+    <w:bookmarkEnd w:id="1596"/>
+    <w:bookmarkStart w:id="1597" w:name="language"/>
     <w:p>
       <w:pPr>
         <w:pStyle w:val="Heading3"/>
@@ -2347,9 +2400,9 @@
         <w:t xml:space="preserve">English.</w:t>
       </w:r>
     </w:p>
-    <w:bookmarkEnd w:id="1554"/>
-    <w:bookmarkEnd w:id="1555"/>
-    <w:bookmarkStart w:id="1572" w:name="reuse-potential"/>
+    <w:bookmarkEnd w:id="1597"/>
+    <w:bookmarkEnd w:id="1598"/>
+    <w:bookmarkStart w:id="1615" w:name="reuse-potential"/>
     <w:p>
       <w:pPr>
         <w:pStyle w:val="Heading2"/>
@@ -2374,7 +2427,7 @@
         <w:t xml:space="preserve">The browser application makes the lowest barrier the default. A lecture on slag thermodynamics, a plant metallurgist screening a composition, or a reviewer checking a claimed equilibrium can load the database and calculate in seconds, with confidential inputs never leaving the machine. The same property makes it a practical template for other groups who want to publish a model as a zero-install tool.</w:t>
       </w:r>
     </w:p>
-    <w:bookmarkStart w:id="1571" w:name="worked-examples"/>
+    <w:bookmarkStart w:id="1614" w:name="worked-examples"/>
     <w:p>
       <w:pPr>
         <w:pStyle w:val="Heading3"/>
@@ -2586,18 +2639,18 @@
           <wp:inline>
             <wp:extent cx="4206240" cy="3262561"/>
             <wp:effectExtent b="0" l="0" r="0" t="0"/>
-            <wp:docPr descr="Figure 4: The LiCl-KCl phase diagram calculated by the salt listing from the shipped open database, at the listing’s own step size. Light to dark: liquid, two-phase, and subsolidus fields. The dot is the calculated eutectic at this step size (0.400, 640 K); the star is the measured eutectic (0.415, 626 K)." title="" id="1557" name="Picture"/>
+            <wp:docPr descr="Figure 4: The LiCl-KCl phase diagram calculated by the salt listing from the shipped open database, at the listing’s own step size. Light to dark: liquid, two-phase, and subsolidus fields. The dot is the calculated eutectic at this step size (0.400, 640 K); the star is the measured eutectic (0.415, 626 K)." title="" id="1600" name="Picture"/>
             <a:graphic>
               <a:graphicData uri="http://schemas.openxmlformats.org/drawingml/2006/picture">
                 <pic:pic>
                   <pic:nvPicPr>
-                    <pic:cNvPr descr="figures/fig4_salt_example.png" id="1558" name="Picture"/>
+                    <pic:cNvPr descr="figures/fig4_salt_example.png" id="1601" name="Picture"/>
                     <pic:cNvPicPr>
                       <a:picLocks noChangeArrowheads="1" noChangeAspect="1"/>
                     </pic:cNvPicPr>
                   </pic:nvPicPr>
                   <pic:blipFill>
-                    <a:blip r:embed="rId1556"/>
+                    <a:blip r:embed="rId1599"/>
                     <a:stretch>
                       <a:fillRect/>
                     </a:stretch>
@@ -2832,18 +2885,18 @@
           <wp:inline>
             <wp:extent cx="4206240" cy="3262561"/>
             <wp:effectExtent b="0" l="0" r="0" t="0"/>
-            <wp:docPr descr="Figure 5: The Al-Zn phase diagram calculated by the alloy listing from the shipped open TDB. Light to dark: liquid, liquid plus solid, and solid fields. The dot is the calculated eutectic (0.890, 660 K); the star is the assessed eutectic (0.885, 654 K)." title="" id="1560" name="Picture"/>
+            <wp:docPr descr="Figure 5: The Al-Zn phase diagram calculated by the alloy listing from the shipped open TDB. Light to dark: liquid, liquid plus solid, and solid fields. The dot is the calculated eutectic (0.890, 660 K); the star is the assessed eutectic (0.885, 654 K)." title="" id="1603" name="Picture"/>
             <a:graphic>
               <a:graphicData uri="http://schemas.openxmlformats.org/drawingml/2006/picture">
                 <pic:pic>
                   <pic:nvPicPr>
-                    <pic:cNvPr descr="figures/fig5_alloy_example.png" id="1561" name="Picture"/>
+                    <pic:cNvPr descr="figures/fig5_alloy_example.png" id="1604" name="Picture"/>
                     <pic:cNvPicPr>
                       <a:picLocks noChangeArrowheads="1" noChangeAspect="1"/>
                     </pic:cNvPicPr>
                   </pic:nvPicPr>
                   <pic:blipFill>
-                    <a:blip r:embed="rId1559"/>
+                    <a:blip r:embed="rId1602"/>
                     <a:stretch>
                       <a:fillRect/>
                     </a:stretch>
@@ -2940,7 +2993,7 @@
         <w:t xml:space="preserve"> </w:t>
       </w:r>
       <w:r>
-        <w:t xml:space="preserve">where the two are given identical thermodynamic data so that only the coupling is under test. The condensate coupled here is the set of stoichiometric metals and oxides; extending the same shared-potential solve to the Modified Quasichemical slag itself, whose element potentials depend on its quadruplet distribution and so enter as a nested inner solve, is the one remaining reach, and the uTDB grammar already defines the ideal-gas phase, so a single file carries an alloy, a slag, its solids, and a gas. The repository also publishes an openly specified unified dialect (uTDB) that carries the MQMQA statements inside TDB grammar, with two shipped demonstration files chosen to be processes rather than curiosities: an aluminum-recycling database holding the Al-Zn alloy with its NaCl-KCl-MgCl2 salt flux, and a steelmaking database holding a basic Fe-C steel, magnetic phases included, with the FeO-MgO-SiO2 slag and its silicate solid solutions. Round-trip tests assert both reproduce their source-file physics at machine precision. The steelmaking file is the clearest illustration of what a unified container buys (Figure 6): from one file the browser calculates the iron-carbon alloy diagram through the magnetic compound energy formalism and its Scheil solidification path, while the same file’s slag is a molten-salt-model liquid, two physics that no single legacy container holds together. The furnace atmosphere over that bath is calculable on the same page, and Figure 7 works it through with the gas calculator: the CO to CO</w:t>
+        <w:t xml:space="preserve">where the two are given identical thermodynamic data so that only the coupling is under test. That condensate is the set of stoichiometric metals and oxides; the same shared oxygen potential also couples the gas to the Modified Quasichemical slag itself. At iron saturation the melt, metallic iron and the gas meet at one oxygen potential, and the slag enters through its FeO activity (a quantity the engine already evaluates, validated against the iron-saturated activity measurements the database was fitted to), so a more silica-rich melt, with its lower FeO activity, sits under a more reducing gas, exactly as slag-gas equilibration measurements show. The pure-FeO limit recovers the Fe/FeO buffer to within a percent of Cantera’s own multiphase equilibrium. The uTDB grammar already defines the ideal-gas phase, so a single file carries an alloy, a slag, its solids, and a gas for one coupled calculation. The repository also publishes an openly specified unified dialect (uTDB) that carries the MQMQA statements inside TDB grammar, with two shipped demonstration files chosen to be processes rather than curiosities: an aluminum-recycling database holding the Al-Zn alloy with its NaCl-KCl-MgCl2 salt flux, and a steelmaking database holding a basic Fe-C steel, magnetic phases included, with the FeO-MgO-SiO2 slag and its silicate solid solutions. Round-trip tests assert both reproduce their source-file physics at machine precision. The steelmaking file is the clearest illustration of what a unified container buys (Figure 6): from one file the browser calculates the iron-carbon alloy diagram through the magnetic compound energy formalism and its Scheil solidification path, while the same file’s slag is a molten-salt-model liquid, two physics that no single legacy container holds together. The furnace atmosphere over that bath is calculable on the same page, and Figure 7 works it through with the gas calculator: the CO to CO</w:t>
       </w:r>
       <w:r>
         <w:rPr>
@@ -2964,18 +3017,18 @@
           <wp:inline>
             <wp:extent cx="5334000" cy="4430576"/>
             <wp:effectExtent b="0" l="0" r="0" t="0"/>
-            <wp:docPr descr="Figure 6: One unified (.utdb) file, two physics, calculated in the browser. (a) The steelmaking database loaded with the Melt/Alloy view toggle on Alloy; the engine calculates the Fe-C phase diagram through the magnetic compound energy formalism, rendered over a 0-25 mol% C composition window (the equilibrium always solves the whole join), with two tapped compositions pinned. (b) Scheil solidification for the same join at 4 mol% C, first solid at 1741 K and the residual liquid frozen by 1433 K, against the equilibrium lever-rule path (dashed). The file’s slag half is a Modified Quasichemical Model liquid; no legacy container holds both models at once." title="" id="1563" name="Picture"/>
+            <wp:docPr descr="Figure 6: One unified (.utdb) file, two physics, calculated in the browser. (a) The steelmaking database loaded with the Melt/Alloy view toggle on Alloy; the engine calculates the Fe-C phase diagram through the magnetic compound energy formalism, rendered over a 0-25 mol% C composition window (the equilibrium always solves the whole join), with two tapped compositions pinned. (b) Scheil solidification for the same join at 4 mol% C, first solid at 1741 K and the residual liquid frozen by 1433 K, against the equilibrium lever-rule path (dashed). The file’s slag half is a Modified Quasichemical Model liquid; no legacy container holds both models at once." title="" id="1606" name="Picture"/>
             <a:graphic>
               <a:graphicData uri="http://schemas.openxmlformats.org/drawingml/2006/picture">
                 <pic:pic>
                   <pic:nvPicPr>
-                    <pic:cNvPr descr="figures/fig6_utdb_steel.png" id="1564" name="Picture"/>
+                    <pic:cNvPr descr="figures/fig6_utdb_steel.png" id="1607" name="Picture"/>
                     <pic:cNvPicPr>
                       <a:picLocks noChangeArrowheads="1" noChangeAspect="1"/>
                     </pic:cNvPicPr>
                   </pic:nvPicPr>
                   <pic:blipFill>
-                    <a:blip r:embed="rId1562"/>
+                    <a:blip r:embed="rId1605"/>
                     <a:stretch>
                       <a:fillRect/>
                     </a:stretch>
@@ -3019,18 +3072,18 @@
           <wp:inline>
             <wp:extent cx="5334000" cy="2319130"/>
             <wp:effectExtent b="0" l="0" r="0" t="0"/>
-            <wp:docPr descr="Figure 7: The gas calculator as a steelmaking worked example, the equilibrium of a carbon-oxygen furnace gas by the Hephaestus gas engine (the NASA-polynomial element-potential solver compiled into the browser), with Cantera as the independent check. (a) Oxygen partial pressure against the CO to CO2 ratio at the 1873 K tap temperature: a lower ratio is more oxidizing and drives iron into the slag as FeO, a higher ratio is more reducing and decarburizes the steel. (b) The same oxygen potential against temperature for four fixed CO to CO2 buffers, showing that a given gas grows more oxidizing as it heats; the dashed line marks the tap temperature. Open circles are Cantera, agreeing to about 10-5 mole fraction across the field." title="" id="1566" name="Picture"/>
+            <wp:docPr descr="Figure 7: The gas calculator as a steelmaking worked example, the equilibrium of a carbon-oxygen furnace gas by the Hephaestus gas engine (the NASA-polynomial element-potential solver compiled into the browser), with Cantera as the independent check. (a) Oxygen partial pressure against the CO to CO2 ratio at the 1873 K tap temperature: a lower ratio is more oxidizing and drives iron into the slag as FeO, a higher ratio is more reducing and decarburizes the steel. (b) The same oxygen potential against temperature for four fixed CO to CO2 buffers, showing that a given gas grows more oxidizing as it heats; the dashed line marks the tap temperature. Open circles are Cantera, agreeing to about 10-5 mole fraction across the field." title="" id="1609" name="Picture"/>
             <a:graphic>
               <a:graphicData uri="http://schemas.openxmlformats.org/drawingml/2006/picture">
                 <pic:pic>
                   <pic:nvPicPr>
-                    <pic:cNvPr descr="figures/fig7_gas_steel.png" id="1567" name="Picture"/>
+                    <pic:cNvPr descr="figures/fig7_gas_steel.png" id="1610" name="Picture"/>
                     <pic:cNvPicPr>
                       <a:picLocks noChangeArrowheads="1" noChangeAspect="1"/>
                     </pic:cNvPicPr>
                   </pic:nvPicPr>
                   <pic:blipFill>
-                    <a:blip r:embed="rId1565"/>
+                    <a:blip r:embed="rId1608"/>
                     <a:stretch>
                       <a:fillRect/>
                     </a:stretch>
@@ -3110,18 +3163,18 @@
           <wp:inline>
             <wp:extent cx="4572000" cy="3556000"/>
             <wp:effectExtent b="0" l="0" r="0" t="0"/>
-            <wp:docPr descr="Figure 8: Al-Zn phase diagram with ESPEI parameter uncertainty. The liquid and face-centred-cubic (fcc) excess parameters were refit by Markov-chain Monte Carlo to the measured liquid enthalpy of mixing (Debski et al., digitised from Dinsdale et al. [44]) and the assessed phase boundaries (Massalski [45]; Mey [39]), and the posterior was propagated through the engine. The solid line is the median liquidus and the dashed line the median fcc solvus; the shaded region is the 90 percent posterior band on each. The band is narrow on the liquidus, which the calorimetry constrains, and wider on the fcc solvus, which only the diagram constrains. The open circle is the assessed eutectic." title="" id="1569" name="Picture"/>
+            <wp:docPr descr="Figure 8: Al-Zn phase diagram with ESPEI parameter uncertainty. The liquid and face-centred-cubic (fcc) excess parameters were refit by Markov-chain Monte Carlo to the measured liquid enthalpy of mixing (Debski et al., digitised from Dinsdale et al. [44]) and the assessed phase boundaries (Massalski [45]; Mey [39]), and the posterior was propagated through the engine. The solid line is the median liquidus and the dashed line the median fcc solvus; the shaded region is the 90 percent posterior band on each. The band is narrow on the liquidus, which the calorimetry constrains, and wider on the fcc solvus, which only the diagram constrains. The open circle is the assessed eutectic." title="" id="1612" name="Picture"/>
             <a:graphic>
               <a:graphicData uri="http://schemas.openxmlformats.org/drawingml/2006/picture">
                 <pic:pic>
                   <pic:nvPicPr>
-                    <pic:cNvPr descr="figures/fig8_uq_alzn.png" id="1570" name="Picture"/>
+                    <pic:cNvPr descr="figures/fig8_uq_alzn.png" id="1613" name="Picture"/>
                     <pic:cNvPicPr>
                       <a:picLocks noChangeArrowheads="1" noChangeAspect="1"/>
                     </pic:cNvPicPr>
                   </pic:nvPicPr>
                   <pic:blipFill>
-                    <a:blip r:embed="rId1568"/>
+                    <a:blip r:embed="rId1611"/>
                     <a:stretch>
                       <a:fillRect/>
                     </a:stretch>
@@ -3161,12 +3214,12 @@
         <w:pStyle w:val="BodyText"/>
       </w:pPr>
       <w:r>
-        <w:t xml:space="preserve">The gap this work addresses was never the model, which has been published for two decades, but an open, runnable pairing of model and parameters. Hephaestus supplies both halves under open licenses and puts them behind a browser page that asks nothing of its user. The claims are checkable end to end. Release v0.5.0 archives the exact version described, and the 128-test suite reruns the pycalphad comparisons on any machine. The worked examples print the figures shown, and every parameter in every shipped database traces to a published measurement through its provenance file. A reader who doubts a number can recalculate it; one who needs a system that is missing can build it with the same open tools, or ask.</w:t>
-      </w:r>
-    </w:p>
-    <w:bookmarkEnd w:id="1571"/>
-    <w:bookmarkEnd w:id="1572"/>
-    <w:bookmarkStart w:id="1573" w:name="data-availability"/>
+        <w:t xml:space="preserve">The gap this work addresses was never the model, which has been published for two decades, but an open, runnable pairing of model and parameters. Hephaestus supplies both halves under open licenses and puts them behind a browser page that asks nothing of its user. The claims are checkable end to end. Release v0.5.0 archives the exact version described, and the 131-test suite reruns the pycalphad comparisons on any machine. The worked examples print the figures shown, and every parameter in every shipped database traces to a published measurement through its provenance file. A reader who doubts a number can recalculate it; one who needs a system that is missing can build it with the same open tools, or ask.</w:t>
+      </w:r>
+    </w:p>
+    <w:bookmarkEnd w:id="1614"/>
+    <w:bookmarkEnd w:id="1615"/>
+    <w:bookmarkStart w:id="1616" w:name="data-availability"/>
     <w:p>
       <w:pPr>
         <w:pStyle w:val="Heading2"/>
@@ -3183,8 +3236,8 @@
         <w:t xml:space="preserve">The engine, the database, the browser application, and the validation suite are openly available in the code repository listed above; the version described here is archived as release v0.5.0. The database files and their provenance records are in the repository’s data directory under CC BY 4.0.</w:t>
       </w:r>
     </w:p>
-    <w:bookmarkEnd w:id="1573"/>
-    <w:bookmarkStart w:id="1574" w:name="acknowledgements"/>
+    <w:bookmarkEnd w:id="1616"/>
+    <w:bookmarkStart w:id="1617" w:name="acknowledgements"/>
     <w:p>
       <w:pPr>
         <w:pStyle w:val="Heading2"/>
@@ -3201,8 +3254,8 @@
         <w:t xml:space="preserve">During the development of this software the author used Claude Code (Anthropic) to assist with implementation, validation scripting, and manuscript preparation. This assistance was agentic, not autonomous: it operated under author direction and supervision at every step and was never a closed loop that produced or accepted results without review. Every parameter was traced by the author to its primary source before entering the database, and every reference was verified against its registry record. The author reviewed and approved all output and takes full responsibility for this article.</w:t>
       </w:r>
     </w:p>
-    <w:bookmarkEnd w:id="1574"/>
-    <w:bookmarkStart w:id="1575" w:name="funding-statement"/>
+    <w:bookmarkEnd w:id="1617"/>
+    <w:bookmarkStart w:id="1618" w:name="funding-statement"/>
     <w:p>
       <w:pPr>
         <w:pStyle w:val="Heading2"/>
@@ -3219,8 +3272,8 @@
         <w:t xml:space="preserve">The development of this software received no external funding.</w:t>
       </w:r>
     </w:p>
-    <w:bookmarkEnd w:id="1575"/>
-    <w:bookmarkStart w:id="1576" w:name="competing-interests"/>
+    <w:bookmarkEnd w:id="1618"/>
+    <w:bookmarkStart w:id="1619" w:name="competing-interests"/>
     <w:p>
       <w:pPr>
         <w:pStyle w:val="Heading2"/>
@@ -3237,8 +3290,8 @@
         <w:t xml:space="preserve">The author founded Odinzen LLC, which provides commercial thermodynamic modeling services, and declares this as a competing interest. The software and database published here are released in full under open licenses, and no proprietary Odinzen assets are included.</w:t>
       </w:r>
     </w:p>
-    <w:bookmarkEnd w:id="1576"/>
-    <w:bookmarkStart w:id="1577" w:name="references"/>
+    <w:bookmarkEnd w:id="1619"/>
+    <w:bookmarkStart w:id="1620" w:name="references"/>
     <w:p>
       <w:pPr>
         <w:pStyle w:val="Heading2"/>
@@ -3619,8 +3672,8 @@
         <w:t xml:space="preserve">[45] Massalski TB, editor. Binary Alloy Phase Diagrams. 2nd ed. Materials Park (OH): ASM International; 1990.</w:t>
       </w:r>
     </w:p>
-    <w:bookmarkEnd w:id="1577"/>
-    <w:bookmarkEnd w:id="1578"/>
+    <w:bookmarkEnd w:id="1620"/>
+    <w:bookmarkEnd w:id="1621"/>
     <w:sectPr>
       <w:footnotePr>
         <w:numRestart w:val="eachSect"/>

</xml_diff>

<commit_message>
Make the coupling consistent across the whole document
Abstract now states both couplings (gas to metals/oxides in the browser, and to the MQMQA
slag at iron saturation), matching the body and validation table. Supplementary S1's stale
"the gas is not yet coupled to a molten slag" is replaced with the gas-condensate coupling a
reader drives on the page. Manuscript and S1 docx/pdf rebuilt; Argus numbering gate passes.

Co-Authored-By: Claude Opus 4.8 <noreply@anthropic.com>
</commit_message>
<xml_diff>
--- a/paper/Bustamante_Hephaestus_JORS_manuscript.docx
+++ b/paper/Bustamante_Hephaestus_JORS_manuscript.docx
@@ -2,7 +2,7 @@
 <file path=word/document.xml><?xml version="1.0" encoding="utf-8"?>
 <w:document xmlns:w="http://schemas.openxmlformats.org/wordprocessingml/2006/main" xmlns:m="http://schemas.openxmlformats.org/officeDocument/2006/math" xmlns:r="http://schemas.openxmlformats.org/officeDocument/2006/relationships" xmlns:o="urn:schemas-microsoft-com:office:office" xmlns:v="urn:schemas-microsoft-com:vml" xmlns:w10="urn:schemas-microsoft-com:office:word" xmlns:a="http://schemas.openxmlformats.org/drawingml/2006/main" xmlns:pic="http://schemas.openxmlformats.org/drawingml/2006/picture" xmlns:wp="http://schemas.openxmlformats.org/drawingml/2006/wordprocessingDrawing">
   <w:body>
-    <w:bookmarkStart w:id="1621" w:name="X4855b1162e70238fd839d871e0792397dc58430"/>
+    <w:bookmarkStart w:id="1664" w:name="X4855b1162e70238fd839d871e0792397dc58430"/>
     <w:p>
       <w:pPr>
         <w:pStyle w:val="Heading1"/>
@@ -84,7 +84,7 @@
         <w:t xml:space="preserve"> </w:t>
       </w:r>
       <w:r>
-        <w:t xml:space="preserve">slag) databases. One zero-install page calculates across all three containers. It calculates phase equilibria up to full ternary isothermal sections and liquidus projections, and Scheil-Gulliver solidification paths on any binary join. A NASA-polynomial ideal-gas engine, validated against Cantera, brings the gas equilibria a furnace atmosphere demands into the same browser, and couples that gas to condensed metals and oxides at a shared oxygen potential, reproducing Cantera’s multiphase equilibrium on the reduction and oxidation reactions of steelmaking. Every energy path is validated to machine precision against pycalphad, and the magnetic model additionally against the measured pure-iron transition temperatures. The companion databases cover the CaO-SiO</w:t>
+        <w:t xml:space="preserve">slag) databases. One zero-install page calculates across all three containers. It calculates phase equilibria up to full ternary isothermal sections and liquidus projections, and Scheil-Gulliver solidification paths on any binary join. A NASA-polynomial ideal-gas engine, validated against Cantera, brings the gas equilibria a furnace atmosphere demands into the same browser and couples that gas to the condensed phases at a shared oxygen potential: to metals and oxides in the browser, reproducing Cantera’s multiphase equilibrium, and to the Modified Quasichemical slag itself at iron saturation, so the melt’s oxidation state tracks the furnace atmosphere. Every energy path is validated to machine precision against pycalphad, and the magnetic model additionally against the measured pure-iron transition temperatures. The companion databases cover the CaO-SiO</w:t>
       </w:r>
       <w:r>
         <w:rPr>
@@ -159,7 +159,7 @@
         <w:t xml:space="preserve">CALPHAD; molten slag; molten salt; modified quasichemical model; thermodynamic database; phase diagram; gas equilibrium; WebAssembly; open data</w:t>
       </w:r>
     </w:p>
-    <w:bookmarkStart w:id="1590" w:name="overview"/>
+    <w:bookmarkStart w:id="1633" w:name="overview"/>
     <w:p>
       <w:pPr>
         <w:pStyle w:val="Heading2"/>
@@ -168,7 +168,7 @@
         <w:t xml:space="preserve">(1) Overview</w:t>
       </w:r>
     </w:p>
-    <w:bookmarkStart w:id="1577" w:name="introduction"/>
+    <w:bookmarkStart w:id="1620" w:name="introduction"/>
     <w:p>
       <w:pPr>
         <w:pStyle w:val="Heading3"/>
@@ -548,8 +548,8 @@
         <w:t xml:space="preserve">Hephaestus is a deliberate response to that gap, and it treats the engine and the data as one contribution because neither is useful alone. The engine is small on purpose. Its core is plain C with no dependencies, which makes it easy to embed and lets the identical code compile to WebAssembly, so the full calculator runs in a web browser with nothing installed and no data leaving the user’s machine. The database is open on purpose. Every parameter in it derives from published measurements, each value carries its provenance down to table and page, and the known shortcomings are documented next to the numbers they affect. The present work describes both, their validation against pycalphad and against measured phase equilibria, and the ways they can be reused. None of it asks the reader to program. For the experimentalist who never writes code, the browser application is the entire product: a page to open, a database to click, and a diagram to read. The sections that follow describe the machinery underneath for those who want it. Supplementary Material S1 is a plain-language primer for the non-programmer, starting at what a database file is and ending at a first calculation and how to read it. Its closing section teaches what an assessment is built from, so a reader who wants to contribute data for open publication, or to commission a file, arrives knowing what is needed.</w:t>
       </w:r>
     </w:p>
-    <w:bookmarkEnd w:id="1577"/>
-    <w:bookmarkStart w:id="1587" w:name="implementation-and-architecture"/>
+    <w:bookmarkEnd w:id="1620"/>
+    <w:bookmarkStart w:id="1630" w:name="implementation-and-architecture"/>
     <w:p>
       <w:pPr>
         <w:pStyle w:val="Heading3"/>
@@ -575,18 +575,18 @@
           <wp:inline>
             <wp:extent cx="5334000" cy="3511167"/>
             <wp:effectExtent b="0" l="0" r="0" t="0"/>
-            <wp:docPr descr="Figure 1: Architecture of Hephaestus. A single dependency-free C core reads the field’s three database dialects (ChemSage .dat, Thermo-Calc .tdb with the Inden magnetic model, and the unified .utdb) and calculates all thermodynamics; the same core is used as a native library, from Python through cffi, and compiled to WebAssembly behind the browser application. dbbuild writes new ChemSage files from measured data, and every energy path is validated against pycalphad." title="" id="1579" name="Picture"/>
+            <wp:docPr descr="Figure 1: Architecture of Hephaestus. A single dependency-free C core reads the field’s three database dialects (ChemSage .dat, Thermo-Calc .tdb with the Inden magnetic model, and the unified .utdb) and calculates all thermodynamics; the same core is used as a native library, from Python through cffi, and compiled to WebAssembly behind the browser application. dbbuild writes new ChemSage files from measured data, and every energy path is validated against pycalphad." title="" id="1622" name="Picture"/>
             <a:graphic>
               <a:graphicData uri="http://schemas.openxmlformats.org/drawingml/2006/picture">
                 <pic:pic>
                   <pic:nvPicPr>
-                    <pic:cNvPr descr="figures/fig1_architecture.png" id="1580" name="Picture"/>
+                    <pic:cNvPr descr="figures/fig1_architecture.png" id="1623" name="Picture"/>
                     <pic:cNvPicPr>
                       <a:picLocks noChangeArrowheads="1" noChangeAspect="1"/>
                     </pic:cNvPicPr>
                   </pic:nvPicPr>
                   <pic:blipFill>
-                    <a:blip r:embed="rId1578"/>
+                    <a:blip r:embed="rId1621"/>
                     <a:stretch>
                       <a:fillRect/>
                     </a:stretch>
@@ -793,18 +793,18 @@
           <wp:inline>
             <wp:extent cx="4754880" cy="3913308"/>
             <wp:effectExtent b="0" l="0" r="0" t="0"/>
-            <wp:docPr descr="Figure 2: The live solver in the browser application (light theme). The user loads the shipped database, picks a temperature, and presses Compute; the WebAssembly engine then solves the full FeO-MgO-SiO2 phase assemblage client side (here 861 composition samples and 595 tie-facets in about two seconds). Tapping a composition reads its stable phases and pins it to a comparison list; hovering previews on desktop." title="" id="1582" name="Picture"/>
+            <wp:docPr descr="Figure 2: The live solver in the browser application (light theme). The user loads the shipped database, picks a temperature, and presses Compute; the WebAssembly engine then solves the full FeO-MgO-SiO2 phase assemblage client side (here 861 composition samples and 595 tie-facets in about two seconds). Tapping a composition reads its stable phases and pins it to a comparison list; hovering previews on desktop." title="" id="1625" name="Picture"/>
             <a:graphic>
               <a:graphicData uri="http://schemas.openxmlformats.org/drawingml/2006/picture">
                 <pic:pic>
                   <pic:nvPicPr>
-                    <pic:cNvPr descr="figures/fig2_browser_app.png" id="1583" name="Picture"/>
+                    <pic:cNvPr descr="figures/fig2_browser_app.png" id="1626" name="Picture"/>
                     <pic:cNvPicPr>
                       <a:picLocks noChangeArrowheads="1" noChangeAspect="1"/>
                     </pic:cNvPicPr>
                   </pic:nvPicPr>
                   <pic:blipFill>
-                    <a:blip r:embed="rId1581"/>
+                    <a:blip r:embed="rId1624"/>
                     <a:stretch>
                       <a:fillRect/>
                     </a:stretch>
@@ -970,18 +970,18 @@
           <wp:inline>
             <wp:extent cx="5334000" cy="2197297"/>
             <wp:effectExtent b="0" l="0" r="0" t="0"/>
-            <wp:docPr descr="Figure 3: The assessed FeO-MgO-SiO2 system calculated from the shipped database files. (a) Liquidus projection: primary crystallizing phase fields, with liquidus isotherms labeled in °C. (b) Isothermal section at 1600 °C: stable phase assemblages, shaded by the number of solid phases present. Phase labels: L liquid, Crs cristobalite, Ol olivine, Opx orthopyroxene, Per periclase, Wus wustite." title="" id="1585" name="Picture"/>
+            <wp:docPr descr="Figure 3: The assessed FeO-MgO-SiO2 system calculated from the shipped database files. (a) Liquidus projection: primary crystallizing phase fields, with liquidus isotherms labeled in °C. (b) Isothermal section at 1600 °C: stable phase assemblages, shaded by the number of solid phases present. Phase labels: L liquid, Crs cristobalite, Ol olivine, Opx orthopyroxene, Per periclase, Wus wustite." title="" id="1628" name="Picture"/>
             <a:graphic>
               <a:graphicData uri="http://schemas.openxmlformats.org/drawingml/2006/picture">
                 <pic:pic>
                   <pic:nvPicPr>
-                    <pic:cNvPr descr="figures/fig3_ternary.png" id="1586" name="Picture"/>
+                    <pic:cNvPr descr="figures/fig3_ternary.png" id="1629" name="Picture"/>
                     <pic:cNvPicPr>
                       <a:picLocks noChangeArrowheads="1" noChangeAspect="1"/>
                     </pic:cNvPicPr>
                   </pic:nvPicPr>
                   <pic:blipFill>
-                    <a:blip r:embed="rId1584"/>
+                    <a:blip r:embed="rId1627"/>
                     <a:stretch>
                       <a:fillRect/>
                     </a:stretch>
@@ -1371,8 +1371,8 @@
         </w:tc>
       </w:tr>
     </w:tbl>
-    <w:bookmarkEnd w:id="1587"/>
-    <w:bookmarkStart w:id="1588" w:name="anatomy-of-a-database-file"/>
+    <w:bookmarkEnd w:id="1630"/>
+    <w:bookmarkStart w:id="1631" w:name="anatomy-of-a-database-file"/>
     <w:p>
       <w:pPr>
         <w:pStyle w:val="Heading3"/>
@@ -1405,8 +1405,8 @@
         <w:t xml:space="preserve">That asymmetry is the economics of the field in miniature: implementations of the published models are increasingly available, but each fitted parameter condenses dozens of measurements and decisions. Parameter sets rather than codes are therefore the scarce commodity, and an openly licensed, provenance-tracked database is the part of this contribution that cannot be regenerated from the paper alone.</w:t>
       </w:r>
     </w:p>
-    <w:bookmarkEnd w:id="1588"/>
-    <w:bookmarkStart w:id="1589" w:name="quality-control"/>
+    <w:bookmarkEnd w:id="1631"/>
+    <w:bookmarkStart w:id="1632" w:name="quality-control"/>
     <w:p>
       <w:pPr>
         <w:pStyle w:val="Heading3"/>
@@ -2128,9 +2128,9 @@
         <w:t xml:space="preserve">invariants sit within about 40 °C, and the ternary liquidus projection reproduces the measured field topology [24]. Development practice is plain: the repository is version controlled with tagged releases (v0.1.0 through the v0.5.0 described here), the full suite runs before every release, and a fixed bug lands together with the regression test that would have caught it. The suite runs on Windows 11 under CPython 3.11 and 3.12; the browser application is exercised in Chromium- and Gecko-based browsers. A user can confirm a working installation by running pytest against the bundled test databases, or with no installation at all by opening the web application and loading the shipped ternary database.</w:t>
       </w:r>
     </w:p>
-    <w:bookmarkEnd w:id="1589"/>
-    <w:bookmarkEnd w:id="1590"/>
-    <w:bookmarkStart w:id="1598" w:name="availability"/>
+    <w:bookmarkEnd w:id="1632"/>
+    <w:bookmarkEnd w:id="1633"/>
+    <w:bookmarkStart w:id="1641" w:name="availability"/>
     <w:p>
       <w:pPr>
         <w:pStyle w:val="Heading2"/>
@@ -2139,7 +2139,7 @@
         <w:t xml:space="preserve">(2) Availability</w:t>
       </w:r>
     </w:p>
-    <w:bookmarkStart w:id="1591" w:name="operating-system"/>
+    <w:bookmarkStart w:id="1634" w:name="operating-system"/>
     <w:p>
       <w:pPr>
         <w:pStyle w:val="Heading3"/>
@@ -2156,8 +2156,8 @@
         <w:t xml:space="preserve">Platform independent. The core builds with any C99 compiler; development and testing used Windows 11. The browser application runs in any current browser with WebAssembly support.</w:t>
       </w:r>
     </w:p>
-    <w:bookmarkEnd w:id="1591"/>
-    <w:bookmarkStart w:id="1592" w:name="programming-language"/>
+    <w:bookmarkEnd w:id="1634"/>
+    <w:bookmarkStart w:id="1635" w:name="programming-language"/>
     <w:p>
       <w:pPr>
         <w:pStyle w:val="Heading3"/>
@@ -2174,8 +2174,8 @@
         <w:t xml:space="preserve">C (core), Python 3.11 or later (interface and fitting tools), JavaScript (browser application).</w:t>
       </w:r>
     </w:p>
-    <w:bookmarkEnd w:id="1592"/>
-    <w:bookmarkStart w:id="1593" w:name="additional-system-requirements"/>
+    <w:bookmarkEnd w:id="1635"/>
+    <w:bookmarkStart w:id="1636" w:name="additional-system-requirements"/>
     <w:p>
       <w:pPr>
         <w:pStyle w:val="Heading3"/>
@@ -2192,8 +2192,8 @@
         <w:t xml:space="preserve">None of note. The engine and database together are a few megabytes.</w:t>
       </w:r>
     </w:p>
-    <w:bookmarkEnd w:id="1593"/>
-    <w:bookmarkStart w:id="1594" w:name="dependencies"/>
+    <w:bookmarkEnd w:id="1636"/>
+    <w:bookmarkStart w:id="1637" w:name="dependencies"/>
     <w:p>
       <w:pPr>
         <w:pStyle w:val="Heading3"/>
@@ -2210,8 +2210,8 @@
         <w:t xml:space="preserve">Python interface: cffi, NumPy, SciPy (developed and tested with cffi 2.0, NumPy 2.4, and SciPy 1.17). The validation suite additionally requires pycalphad; every oracle comparison reported here ran against pycalphad 0.11.1, and the tests that read pycalphad’s own shipped test databases skip cleanly if a later version relocates them. The WebAssembly build requires emscripten. The C core and the browser application have no dependencies.</w:t>
       </w:r>
     </w:p>
-    <w:bookmarkEnd w:id="1594"/>
-    <w:bookmarkStart w:id="1595" w:name="list-of-contributors"/>
+    <w:bookmarkEnd w:id="1637"/>
+    <w:bookmarkStart w:id="1638" w:name="list-of-contributors"/>
     <w:p>
       <w:pPr>
         <w:pStyle w:val="Heading3"/>
@@ -2228,8 +2228,8 @@
         <w:t xml:space="preserve">Michael E. Bustamante (design, implementation, validation, data curation).</w:t>
       </w:r>
     </w:p>
-    <w:bookmarkEnd w:id="1595"/>
-    <w:bookmarkStart w:id="1596" w:name="software-location"/>
+    <w:bookmarkEnd w:id="1638"/>
+    <w:bookmarkStart w:id="1639" w:name="software-location"/>
     <w:p>
       <w:pPr>
         <w:pStyle w:val="Heading3"/>
@@ -2382,8 +2382,8 @@
         <w:t xml:space="preserve">Date published: 2026-09-02</w:t>
       </w:r>
     </w:p>
-    <w:bookmarkEnd w:id="1596"/>
-    <w:bookmarkStart w:id="1597" w:name="language"/>
+    <w:bookmarkEnd w:id="1639"/>
+    <w:bookmarkStart w:id="1640" w:name="language"/>
     <w:p>
       <w:pPr>
         <w:pStyle w:val="Heading3"/>
@@ -2400,9 +2400,9 @@
         <w:t xml:space="preserve">English.</w:t>
       </w:r>
     </w:p>
-    <w:bookmarkEnd w:id="1597"/>
-    <w:bookmarkEnd w:id="1598"/>
-    <w:bookmarkStart w:id="1615" w:name="reuse-potential"/>
+    <w:bookmarkEnd w:id="1640"/>
+    <w:bookmarkEnd w:id="1641"/>
+    <w:bookmarkStart w:id="1658" w:name="reuse-potential"/>
     <w:p>
       <w:pPr>
         <w:pStyle w:val="Heading2"/>
@@ -2427,7 +2427,7 @@
         <w:t xml:space="preserve">The browser application makes the lowest barrier the default. A lecture on slag thermodynamics, a plant metallurgist screening a composition, or a reviewer checking a claimed equilibrium can load the database and calculate in seconds, with confidential inputs never leaving the machine. The same property makes it a practical template for other groups who want to publish a model as a zero-install tool.</w:t>
       </w:r>
     </w:p>
-    <w:bookmarkStart w:id="1614" w:name="worked-examples"/>
+    <w:bookmarkStart w:id="1657" w:name="worked-examples"/>
     <w:p>
       <w:pPr>
         <w:pStyle w:val="Heading3"/>
@@ -2639,18 +2639,18 @@
           <wp:inline>
             <wp:extent cx="4206240" cy="3262561"/>
             <wp:effectExtent b="0" l="0" r="0" t="0"/>
-            <wp:docPr descr="Figure 4: The LiCl-KCl phase diagram calculated by the salt listing from the shipped open database, at the listing’s own step size. Light to dark: liquid, two-phase, and subsolidus fields. The dot is the calculated eutectic at this step size (0.400, 640 K); the star is the measured eutectic (0.415, 626 K)." title="" id="1600" name="Picture"/>
+            <wp:docPr descr="Figure 4: The LiCl-KCl phase diagram calculated by the salt listing from the shipped open database, at the listing’s own step size. Light to dark: liquid, two-phase, and subsolidus fields. The dot is the calculated eutectic at this step size (0.400, 640 K); the star is the measured eutectic (0.415, 626 K)." title="" id="1643" name="Picture"/>
             <a:graphic>
               <a:graphicData uri="http://schemas.openxmlformats.org/drawingml/2006/picture">
                 <pic:pic>
                   <pic:nvPicPr>
-                    <pic:cNvPr descr="figures/fig4_salt_example.png" id="1601" name="Picture"/>
+                    <pic:cNvPr descr="figures/fig4_salt_example.png" id="1644" name="Picture"/>
                     <pic:cNvPicPr>
                       <a:picLocks noChangeArrowheads="1" noChangeAspect="1"/>
                     </pic:cNvPicPr>
                   </pic:nvPicPr>
                   <pic:blipFill>
-                    <a:blip r:embed="rId1599"/>
+                    <a:blip r:embed="rId1642"/>
                     <a:stretch>
                       <a:fillRect/>
                     </a:stretch>
@@ -2885,18 +2885,18 @@
           <wp:inline>
             <wp:extent cx="4206240" cy="3262561"/>
             <wp:effectExtent b="0" l="0" r="0" t="0"/>
-            <wp:docPr descr="Figure 5: The Al-Zn phase diagram calculated by the alloy listing from the shipped open TDB. Light to dark: liquid, liquid plus solid, and solid fields. The dot is the calculated eutectic (0.890, 660 K); the star is the assessed eutectic (0.885, 654 K)." title="" id="1603" name="Picture"/>
+            <wp:docPr descr="Figure 5: The Al-Zn phase diagram calculated by the alloy listing from the shipped open TDB. Light to dark: liquid, liquid plus solid, and solid fields. The dot is the calculated eutectic (0.890, 660 K); the star is the assessed eutectic (0.885, 654 K)." title="" id="1646" name="Picture"/>
             <a:graphic>
               <a:graphicData uri="http://schemas.openxmlformats.org/drawingml/2006/picture">
                 <pic:pic>
                   <pic:nvPicPr>
-                    <pic:cNvPr descr="figures/fig5_alloy_example.png" id="1604" name="Picture"/>
+                    <pic:cNvPr descr="figures/fig5_alloy_example.png" id="1647" name="Picture"/>
                     <pic:cNvPicPr>
                       <a:picLocks noChangeArrowheads="1" noChangeAspect="1"/>
                     </pic:cNvPicPr>
                   </pic:nvPicPr>
                   <pic:blipFill>
-                    <a:blip r:embed="rId1602"/>
+                    <a:blip r:embed="rId1645"/>
                     <a:stretch>
                       <a:fillRect/>
                     </a:stretch>
@@ -3017,18 +3017,18 @@
           <wp:inline>
             <wp:extent cx="5334000" cy="4430576"/>
             <wp:effectExtent b="0" l="0" r="0" t="0"/>
-            <wp:docPr descr="Figure 6: One unified (.utdb) file, two physics, calculated in the browser. (a) The steelmaking database loaded with the Melt/Alloy view toggle on Alloy; the engine calculates the Fe-C phase diagram through the magnetic compound energy formalism, rendered over a 0-25 mol% C composition window (the equilibrium always solves the whole join), with two tapped compositions pinned. (b) Scheil solidification for the same join at 4 mol% C, first solid at 1741 K and the residual liquid frozen by 1433 K, against the equilibrium lever-rule path (dashed). The file’s slag half is a Modified Quasichemical Model liquid; no legacy container holds both models at once." title="" id="1606" name="Picture"/>
+            <wp:docPr descr="Figure 6: One unified (.utdb) file, two physics, calculated in the browser. (a) The steelmaking database loaded with the Melt/Alloy view toggle on Alloy; the engine calculates the Fe-C phase diagram through the magnetic compound energy formalism, rendered over a 0-25 mol% C composition window (the equilibrium always solves the whole join), with two tapped compositions pinned. (b) Scheil solidification for the same join at 4 mol% C, first solid at 1741 K and the residual liquid frozen by 1433 K, against the equilibrium lever-rule path (dashed). The file’s slag half is a Modified Quasichemical Model liquid; no legacy container holds both models at once." title="" id="1649" name="Picture"/>
             <a:graphic>
               <a:graphicData uri="http://schemas.openxmlformats.org/drawingml/2006/picture">
                 <pic:pic>
                   <pic:nvPicPr>
-                    <pic:cNvPr descr="figures/fig6_utdb_steel.png" id="1607" name="Picture"/>
+                    <pic:cNvPr descr="figures/fig6_utdb_steel.png" id="1650" name="Picture"/>
                     <pic:cNvPicPr>
                       <a:picLocks noChangeArrowheads="1" noChangeAspect="1"/>
                     </pic:cNvPicPr>
                   </pic:nvPicPr>
                   <pic:blipFill>
-                    <a:blip r:embed="rId1605"/>
+                    <a:blip r:embed="rId1648"/>
                     <a:stretch>
                       <a:fillRect/>
                     </a:stretch>
@@ -3072,18 +3072,18 @@
           <wp:inline>
             <wp:extent cx="5334000" cy="2319130"/>
             <wp:effectExtent b="0" l="0" r="0" t="0"/>
-            <wp:docPr descr="Figure 7: The gas calculator as a steelmaking worked example, the equilibrium of a carbon-oxygen furnace gas by the Hephaestus gas engine (the NASA-polynomial element-potential solver compiled into the browser), with Cantera as the independent check. (a) Oxygen partial pressure against the CO to CO2 ratio at the 1873 K tap temperature: a lower ratio is more oxidizing and drives iron into the slag as FeO, a higher ratio is more reducing and decarburizes the steel. (b) The same oxygen potential against temperature for four fixed CO to CO2 buffers, showing that a given gas grows more oxidizing as it heats; the dashed line marks the tap temperature. Open circles are Cantera, agreeing to about 10-5 mole fraction across the field." title="" id="1609" name="Picture"/>
+            <wp:docPr descr="Figure 7: The gas calculator as a steelmaking worked example, the equilibrium of a carbon-oxygen furnace gas by the Hephaestus gas engine (the NASA-polynomial element-potential solver compiled into the browser), with Cantera as the independent check. (a) Oxygen partial pressure against the CO to CO2 ratio at the 1873 K tap temperature: a lower ratio is more oxidizing and drives iron into the slag as FeO, a higher ratio is more reducing and decarburizes the steel. (b) The same oxygen potential against temperature for four fixed CO to CO2 buffers, showing that a given gas grows more oxidizing as it heats; the dashed line marks the tap temperature. Open circles are Cantera, agreeing to about 10-5 mole fraction across the field." title="" id="1652" name="Picture"/>
             <a:graphic>
               <a:graphicData uri="http://schemas.openxmlformats.org/drawingml/2006/picture">
                 <pic:pic>
                   <pic:nvPicPr>
-                    <pic:cNvPr descr="figures/fig7_gas_steel.png" id="1610" name="Picture"/>
+                    <pic:cNvPr descr="figures/fig7_gas_steel.png" id="1653" name="Picture"/>
                     <pic:cNvPicPr>
                       <a:picLocks noChangeArrowheads="1" noChangeAspect="1"/>
                     </pic:cNvPicPr>
                   </pic:nvPicPr>
                   <pic:blipFill>
-                    <a:blip r:embed="rId1608"/>
+                    <a:blip r:embed="rId1651"/>
                     <a:stretch>
                       <a:fillRect/>
                     </a:stretch>
@@ -3163,18 +3163,18 @@
           <wp:inline>
             <wp:extent cx="4572000" cy="3556000"/>
             <wp:effectExtent b="0" l="0" r="0" t="0"/>
-            <wp:docPr descr="Figure 8: Al-Zn phase diagram with ESPEI parameter uncertainty. The liquid and face-centred-cubic (fcc) excess parameters were refit by Markov-chain Monte Carlo to the measured liquid enthalpy of mixing (Debski et al., digitised from Dinsdale et al. [44]) and the assessed phase boundaries (Massalski [45]; Mey [39]), and the posterior was propagated through the engine. The solid line is the median liquidus and the dashed line the median fcc solvus; the shaded region is the 90 percent posterior band on each. The band is narrow on the liquidus, which the calorimetry constrains, and wider on the fcc solvus, which only the diagram constrains. The open circle is the assessed eutectic." title="" id="1612" name="Picture"/>
+            <wp:docPr descr="Figure 8: Al-Zn phase diagram with ESPEI parameter uncertainty. The liquid and face-centred-cubic (fcc) excess parameters were refit by Markov-chain Monte Carlo to the measured liquid enthalpy of mixing (Debski et al., digitised from Dinsdale et al. [44]) and the assessed phase boundaries (Massalski [45]; Mey [39]), and the posterior was propagated through the engine. The solid line is the median liquidus and the dashed line the median fcc solvus; the shaded region is the 90 percent posterior band on each. The band is narrow on the liquidus, which the calorimetry constrains, and wider on the fcc solvus, which only the diagram constrains. The open circle is the assessed eutectic." title="" id="1655" name="Picture"/>
             <a:graphic>
               <a:graphicData uri="http://schemas.openxmlformats.org/drawingml/2006/picture">
                 <pic:pic>
                   <pic:nvPicPr>
-                    <pic:cNvPr descr="figures/fig8_uq_alzn.png" id="1613" name="Picture"/>
+                    <pic:cNvPr descr="figures/fig8_uq_alzn.png" id="1656" name="Picture"/>
                     <pic:cNvPicPr>
                       <a:picLocks noChangeArrowheads="1" noChangeAspect="1"/>
                     </pic:cNvPicPr>
                   </pic:nvPicPr>
                   <pic:blipFill>
-                    <a:blip r:embed="rId1611"/>
+                    <a:blip r:embed="rId1654"/>
                     <a:stretch>
                       <a:fillRect/>
                     </a:stretch>
@@ -3217,9 +3217,9 @@
         <w:t xml:space="preserve">The gap this work addresses was never the model, which has been published for two decades, but an open, runnable pairing of model and parameters. Hephaestus supplies both halves under open licenses and puts them behind a browser page that asks nothing of its user. The claims are checkable end to end. Release v0.5.0 archives the exact version described, and the 131-test suite reruns the pycalphad comparisons on any machine. The worked examples print the figures shown, and every parameter in every shipped database traces to a published measurement through its provenance file. A reader who doubts a number can recalculate it; one who needs a system that is missing can build it with the same open tools, or ask.</w:t>
       </w:r>
     </w:p>
-    <w:bookmarkEnd w:id="1614"/>
-    <w:bookmarkEnd w:id="1615"/>
-    <w:bookmarkStart w:id="1616" w:name="data-availability"/>
+    <w:bookmarkEnd w:id="1657"/>
+    <w:bookmarkEnd w:id="1658"/>
+    <w:bookmarkStart w:id="1659" w:name="data-availability"/>
     <w:p>
       <w:pPr>
         <w:pStyle w:val="Heading2"/>
@@ -3236,8 +3236,8 @@
         <w:t xml:space="preserve">The engine, the database, the browser application, and the validation suite are openly available in the code repository listed above; the version described here is archived as release v0.5.0. The database files and their provenance records are in the repository’s data directory under CC BY 4.0.</w:t>
       </w:r>
     </w:p>
-    <w:bookmarkEnd w:id="1616"/>
-    <w:bookmarkStart w:id="1617" w:name="acknowledgements"/>
+    <w:bookmarkEnd w:id="1659"/>
+    <w:bookmarkStart w:id="1660" w:name="acknowledgements"/>
     <w:p>
       <w:pPr>
         <w:pStyle w:val="Heading2"/>
@@ -3254,8 +3254,8 @@
         <w:t xml:space="preserve">During the development of this software the author used Claude Code (Anthropic) to assist with implementation, validation scripting, and manuscript preparation. This assistance was agentic, not autonomous: it operated under author direction and supervision at every step and was never a closed loop that produced or accepted results without review. Every parameter was traced by the author to its primary source before entering the database, and every reference was verified against its registry record. The author reviewed and approved all output and takes full responsibility for this article.</w:t>
       </w:r>
     </w:p>
-    <w:bookmarkEnd w:id="1617"/>
-    <w:bookmarkStart w:id="1618" w:name="funding-statement"/>
+    <w:bookmarkEnd w:id="1660"/>
+    <w:bookmarkStart w:id="1661" w:name="funding-statement"/>
     <w:p>
       <w:pPr>
         <w:pStyle w:val="Heading2"/>
@@ -3272,8 +3272,8 @@
         <w:t xml:space="preserve">The development of this software received no external funding.</w:t>
       </w:r>
     </w:p>
-    <w:bookmarkEnd w:id="1618"/>
-    <w:bookmarkStart w:id="1619" w:name="competing-interests"/>
+    <w:bookmarkEnd w:id="1661"/>
+    <w:bookmarkStart w:id="1662" w:name="competing-interests"/>
     <w:p>
       <w:pPr>
         <w:pStyle w:val="Heading2"/>
@@ -3290,8 +3290,8 @@
         <w:t xml:space="preserve">The author founded Odinzen LLC, which provides commercial thermodynamic modeling services, and declares this as a competing interest. The software and database published here are released in full under open licenses, and no proprietary Odinzen assets are included.</w:t>
       </w:r>
     </w:p>
-    <w:bookmarkEnd w:id="1619"/>
-    <w:bookmarkStart w:id="1620" w:name="references"/>
+    <w:bookmarkEnd w:id="1662"/>
+    <w:bookmarkStart w:id="1663" w:name="references"/>
     <w:p>
       <w:pPr>
         <w:pStyle w:val="Heading2"/>
@@ -3672,8 +3672,8 @@
         <w:t xml:space="preserve">[45] Massalski TB, editor. Binary Alloy Phase Diagrams. 2nd ed. Materials Park (OH): ASM International; 1990.</w:t>
       </w:r>
     </w:p>
-    <w:bookmarkEnd w:id="1620"/>
-    <w:bookmarkEnd w:id="1621"/>
+    <w:bookmarkEnd w:id="1663"/>
+    <w:bookmarkEnd w:id="1664"/>
     <w:sectPr>
       <w:footnotePr>
         <w:numRestart w:val="eachSect"/>

</xml_diff>

<commit_message>
Bump the described release to v0.5.1 (includes the solution-slag coupling)
v0.5.0 was tagged before the gas-slag coupling landed; the described archive is v0.5.1.
Manuscript version references updated and reading copies rebuilt.

Co-Authored-By: Claude Opus 4.8 <noreply@anthropic.com>
</commit_message>
<xml_diff>
--- a/paper/Bustamante_Hephaestus_JORS_manuscript.docx
+++ b/paper/Bustamante_Hephaestus_JORS_manuscript.docx
@@ -2,7 +2,7 @@
 <file path=word/document.xml><?xml version="1.0" encoding="utf-8"?>
 <w:document xmlns:w="http://schemas.openxmlformats.org/wordprocessingml/2006/main" xmlns:m="http://schemas.openxmlformats.org/officeDocument/2006/math" xmlns:r="http://schemas.openxmlformats.org/officeDocument/2006/relationships" xmlns:o="urn:schemas-microsoft-com:office:office" xmlns:v="urn:schemas-microsoft-com:vml" xmlns:w10="urn:schemas-microsoft-com:office:word" xmlns:a="http://schemas.openxmlformats.org/drawingml/2006/main" xmlns:pic="http://schemas.openxmlformats.org/drawingml/2006/picture" xmlns:wp="http://schemas.openxmlformats.org/drawingml/2006/wordprocessingDrawing">
   <w:body>
-    <w:bookmarkStart w:id="1664" w:name="X4855b1162e70238fd839d871e0792397dc58430"/>
+    <w:bookmarkStart w:id="1707" w:name="X4855b1162e70238fd839d871e0792397dc58430"/>
     <w:p>
       <w:pPr>
         <w:pStyle w:val="Heading1"/>
@@ -159,7 +159,7 @@
         <w:t xml:space="preserve">CALPHAD; molten slag; molten salt; modified quasichemical model; thermodynamic database; phase diagram; gas equilibrium; WebAssembly; open data</w:t>
       </w:r>
     </w:p>
-    <w:bookmarkStart w:id="1633" w:name="overview"/>
+    <w:bookmarkStart w:id="1676" w:name="overview"/>
     <w:p>
       <w:pPr>
         <w:pStyle w:val="Heading2"/>
@@ -168,7 +168,7 @@
         <w:t xml:space="preserve">(1) Overview</w:t>
       </w:r>
     </w:p>
-    <w:bookmarkStart w:id="1620" w:name="introduction"/>
+    <w:bookmarkStart w:id="1663" w:name="introduction"/>
     <w:p>
       <w:pPr>
         <w:pStyle w:val="Heading3"/>
@@ -548,8 +548,8 @@
         <w:t xml:space="preserve">Hephaestus is a deliberate response to that gap, and it treats the engine and the data as one contribution because neither is useful alone. The engine is small on purpose. Its core is plain C with no dependencies, which makes it easy to embed and lets the identical code compile to WebAssembly, so the full calculator runs in a web browser with nothing installed and no data leaving the user’s machine. The database is open on purpose. Every parameter in it derives from published measurements, each value carries its provenance down to table and page, and the known shortcomings are documented next to the numbers they affect. The present work describes both, their validation against pycalphad and against measured phase equilibria, and the ways they can be reused. None of it asks the reader to program. For the experimentalist who never writes code, the browser application is the entire product: a page to open, a database to click, and a diagram to read. The sections that follow describe the machinery underneath for those who want it. Supplementary Material S1 is a plain-language primer for the non-programmer, starting at what a database file is and ending at a first calculation and how to read it. Its closing section teaches what an assessment is built from, so a reader who wants to contribute data for open publication, or to commission a file, arrives knowing what is needed.</w:t>
       </w:r>
     </w:p>
-    <w:bookmarkEnd w:id="1620"/>
-    <w:bookmarkStart w:id="1630" w:name="implementation-and-architecture"/>
+    <w:bookmarkEnd w:id="1663"/>
+    <w:bookmarkStart w:id="1673" w:name="implementation-and-architecture"/>
     <w:p>
       <w:pPr>
         <w:pStyle w:val="Heading3"/>
@@ -575,18 +575,18 @@
           <wp:inline>
             <wp:extent cx="5334000" cy="3511167"/>
             <wp:effectExtent b="0" l="0" r="0" t="0"/>
-            <wp:docPr descr="Figure 1: Architecture of Hephaestus. A single dependency-free C core reads the field’s three database dialects (ChemSage .dat, Thermo-Calc .tdb with the Inden magnetic model, and the unified .utdb) and calculates all thermodynamics; the same core is used as a native library, from Python through cffi, and compiled to WebAssembly behind the browser application. dbbuild writes new ChemSage files from measured data, and every energy path is validated against pycalphad." title="" id="1622" name="Picture"/>
+            <wp:docPr descr="Figure 1: Architecture of Hephaestus. A single dependency-free C core reads the field’s three database dialects (ChemSage .dat, Thermo-Calc .tdb with the Inden magnetic model, and the unified .utdb) and calculates all thermodynamics; the same core is used as a native library, from Python through cffi, and compiled to WebAssembly behind the browser application. dbbuild writes new ChemSage files from measured data, and every energy path is validated against pycalphad." title="" id="1665" name="Picture"/>
             <a:graphic>
               <a:graphicData uri="http://schemas.openxmlformats.org/drawingml/2006/picture">
                 <pic:pic>
                   <pic:nvPicPr>
-                    <pic:cNvPr descr="figures/fig1_architecture.png" id="1623" name="Picture"/>
+                    <pic:cNvPr descr="figures/fig1_architecture.png" id="1666" name="Picture"/>
                     <pic:cNvPicPr>
                       <a:picLocks noChangeArrowheads="1" noChangeAspect="1"/>
                     </pic:cNvPicPr>
                   </pic:nvPicPr>
                   <pic:blipFill>
-                    <a:blip r:embed="rId1621"/>
+                    <a:blip r:embed="rId1664"/>
                     <a:stretch>
                       <a:fillRect/>
                     </a:stretch>
@@ -793,18 +793,18 @@
           <wp:inline>
             <wp:extent cx="4754880" cy="3913308"/>
             <wp:effectExtent b="0" l="0" r="0" t="0"/>
-            <wp:docPr descr="Figure 2: The live solver in the browser application (light theme). The user loads the shipped database, picks a temperature, and presses Compute; the WebAssembly engine then solves the full FeO-MgO-SiO2 phase assemblage client side (here 861 composition samples and 595 tie-facets in about two seconds). Tapping a composition reads its stable phases and pins it to a comparison list; hovering previews on desktop." title="" id="1625" name="Picture"/>
+            <wp:docPr descr="Figure 2: The live solver in the browser application (light theme). The user loads the shipped database, picks a temperature, and presses Compute; the WebAssembly engine then solves the full FeO-MgO-SiO2 phase assemblage client side (here 861 composition samples and 595 tie-facets in about two seconds). Tapping a composition reads its stable phases and pins it to a comparison list; hovering previews on desktop." title="" id="1668" name="Picture"/>
             <a:graphic>
               <a:graphicData uri="http://schemas.openxmlformats.org/drawingml/2006/picture">
                 <pic:pic>
                   <pic:nvPicPr>
-                    <pic:cNvPr descr="figures/fig2_browser_app.png" id="1626" name="Picture"/>
+                    <pic:cNvPr descr="figures/fig2_browser_app.png" id="1669" name="Picture"/>
                     <pic:cNvPicPr>
                       <a:picLocks noChangeArrowheads="1" noChangeAspect="1"/>
                     </pic:cNvPicPr>
                   </pic:nvPicPr>
                   <pic:blipFill>
-                    <a:blip r:embed="rId1624"/>
+                    <a:blip r:embed="rId1667"/>
                     <a:stretch>
                       <a:fillRect/>
                     </a:stretch>
@@ -970,18 +970,18 @@
           <wp:inline>
             <wp:extent cx="5334000" cy="2197297"/>
             <wp:effectExtent b="0" l="0" r="0" t="0"/>
-            <wp:docPr descr="Figure 3: The assessed FeO-MgO-SiO2 system calculated from the shipped database files. (a) Liquidus projection: primary crystallizing phase fields, with liquidus isotherms labeled in °C. (b) Isothermal section at 1600 °C: stable phase assemblages, shaded by the number of solid phases present. Phase labels: L liquid, Crs cristobalite, Ol olivine, Opx orthopyroxene, Per periclase, Wus wustite." title="" id="1628" name="Picture"/>
+            <wp:docPr descr="Figure 3: The assessed FeO-MgO-SiO2 system calculated from the shipped database files. (a) Liquidus projection: primary crystallizing phase fields, with liquidus isotherms labeled in °C. (b) Isothermal section at 1600 °C: stable phase assemblages, shaded by the number of solid phases present. Phase labels: L liquid, Crs cristobalite, Ol olivine, Opx orthopyroxene, Per periclase, Wus wustite." title="" id="1671" name="Picture"/>
             <a:graphic>
               <a:graphicData uri="http://schemas.openxmlformats.org/drawingml/2006/picture">
                 <pic:pic>
                   <pic:nvPicPr>
-                    <pic:cNvPr descr="figures/fig3_ternary.png" id="1629" name="Picture"/>
+                    <pic:cNvPr descr="figures/fig3_ternary.png" id="1672" name="Picture"/>
                     <pic:cNvPicPr>
                       <a:picLocks noChangeArrowheads="1" noChangeAspect="1"/>
                     </pic:cNvPicPr>
                   </pic:nvPicPr>
                   <pic:blipFill>
-                    <a:blip r:embed="rId1627"/>
+                    <a:blip r:embed="rId1670"/>
                     <a:stretch>
                       <a:fillRect/>
                     </a:stretch>
@@ -1371,8 +1371,8 @@
         </w:tc>
       </w:tr>
     </w:tbl>
-    <w:bookmarkEnd w:id="1630"/>
-    <w:bookmarkStart w:id="1631" w:name="anatomy-of-a-database-file"/>
+    <w:bookmarkEnd w:id="1673"/>
+    <w:bookmarkStart w:id="1674" w:name="anatomy-of-a-database-file"/>
     <w:p>
       <w:pPr>
         <w:pStyle w:val="Heading3"/>
@@ -1405,8 +1405,8 @@
         <w:t xml:space="preserve">That asymmetry is the economics of the field in miniature: implementations of the published models are increasingly available, but each fitted parameter condenses dozens of measurements and decisions. Parameter sets rather than codes are therefore the scarce commodity, and an openly licensed, provenance-tracked database is the part of this contribution that cannot be regenerated from the paper alone.</w:t>
       </w:r>
     </w:p>
-    <w:bookmarkEnd w:id="1631"/>
-    <w:bookmarkStart w:id="1632" w:name="quality-control"/>
+    <w:bookmarkEnd w:id="1674"/>
+    <w:bookmarkStart w:id="1675" w:name="quality-control"/>
     <w:p>
       <w:pPr>
         <w:pStyle w:val="Heading3"/>
@@ -2125,12 +2125,12 @@
         <w:t xml:space="preserve"> </w:t>
       </w:r>
       <w:r>
-        <w:t xml:space="preserve">invariants sit within about 40 °C, and the ternary liquidus projection reproduces the measured field topology [24]. Development practice is plain: the repository is version controlled with tagged releases (v0.1.0 through the v0.5.0 described here), the full suite runs before every release, and a fixed bug lands together with the regression test that would have caught it. The suite runs on Windows 11 under CPython 3.11 and 3.12; the browser application is exercised in Chromium- and Gecko-based browsers. A user can confirm a working installation by running pytest against the bundled test databases, or with no installation at all by opening the web application and loading the shipped ternary database.</w:t>
-      </w:r>
-    </w:p>
-    <w:bookmarkEnd w:id="1632"/>
-    <w:bookmarkEnd w:id="1633"/>
-    <w:bookmarkStart w:id="1641" w:name="availability"/>
+        <w:t xml:space="preserve">invariants sit within about 40 °C, and the ternary liquidus projection reproduces the measured field topology [24]. Development practice is plain: the repository is version controlled with tagged releases (v0.1.0 through the v0.5.1 described here), the full suite runs before every release, and a fixed bug lands together with the regression test that would have caught it. The suite runs on Windows 11 under CPython 3.11 and 3.12; the browser application is exercised in Chromium- and Gecko-based browsers. A user can confirm a working installation by running pytest against the bundled test databases, or with no installation at all by opening the web application and loading the shipped ternary database.</w:t>
+      </w:r>
+    </w:p>
+    <w:bookmarkEnd w:id="1675"/>
+    <w:bookmarkEnd w:id="1676"/>
+    <w:bookmarkStart w:id="1684" w:name="availability"/>
     <w:p>
       <w:pPr>
         <w:pStyle w:val="Heading2"/>
@@ -2139,7 +2139,7 @@
         <w:t xml:space="preserve">(2) Availability</w:t>
       </w:r>
     </w:p>
-    <w:bookmarkStart w:id="1634" w:name="operating-system"/>
+    <w:bookmarkStart w:id="1677" w:name="operating-system"/>
     <w:p>
       <w:pPr>
         <w:pStyle w:val="Heading3"/>
@@ -2156,8 +2156,8 @@
         <w:t xml:space="preserve">Platform independent. The core builds with any C99 compiler; development and testing used Windows 11. The browser application runs in any current browser with WebAssembly support.</w:t>
       </w:r>
     </w:p>
-    <w:bookmarkEnd w:id="1634"/>
-    <w:bookmarkStart w:id="1635" w:name="programming-language"/>
+    <w:bookmarkEnd w:id="1677"/>
+    <w:bookmarkStart w:id="1678" w:name="programming-language"/>
     <w:p>
       <w:pPr>
         <w:pStyle w:val="Heading3"/>
@@ -2174,8 +2174,8 @@
         <w:t xml:space="preserve">C (core), Python 3.11 or later (interface and fitting tools), JavaScript (browser application).</w:t>
       </w:r>
     </w:p>
-    <w:bookmarkEnd w:id="1635"/>
-    <w:bookmarkStart w:id="1636" w:name="additional-system-requirements"/>
+    <w:bookmarkEnd w:id="1678"/>
+    <w:bookmarkStart w:id="1679" w:name="additional-system-requirements"/>
     <w:p>
       <w:pPr>
         <w:pStyle w:val="Heading3"/>
@@ -2192,8 +2192,8 @@
         <w:t xml:space="preserve">None of note. The engine and database together are a few megabytes.</w:t>
       </w:r>
     </w:p>
-    <w:bookmarkEnd w:id="1636"/>
-    <w:bookmarkStart w:id="1637" w:name="dependencies"/>
+    <w:bookmarkEnd w:id="1679"/>
+    <w:bookmarkStart w:id="1680" w:name="dependencies"/>
     <w:p>
       <w:pPr>
         <w:pStyle w:val="Heading3"/>
@@ -2210,8 +2210,8 @@
         <w:t xml:space="preserve">Python interface: cffi, NumPy, SciPy (developed and tested with cffi 2.0, NumPy 2.4, and SciPy 1.17). The validation suite additionally requires pycalphad; every oracle comparison reported here ran against pycalphad 0.11.1, and the tests that read pycalphad’s own shipped test databases skip cleanly if a later version relocates them. The WebAssembly build requires emscripten. The C core and the browser application have no dependencies.</w:t>
       </w:r>
     </w:p>
-    <w:bookmarkEnd w:id="1637"/>
-    <w:bookmarkStart w:id="1638" w:name="list-of-contributors"/>
+    <w:bookmarkEnd w:id="1680"/>
+    <w:bookmarkStart w:id="1681" w:name="list-of-contributors"/>
     <w:p>
       <w:pPr>
         <w:pStyle w:val="Heading3"/>
@@ -2228,8 +2228,8 @@
         <w:t xml:space="preserve">Michael E. Bustamante (design, implementation, validation, data curation).</w:t>
       </w:r>
     </w:p>
-    <w:bookmarkEnd w:id="1638"/>
-    <w:bookmarkStart w:id="1639" w:name="software-location"/>
+    <w:bookmarkEnd w:id="1681"/>
+    <w:bookmarkStart w:id="1682" w:name="software-location"/>
     <w:p>
       <w:pPr>
         <w:pStyle w:val="Heading3"/>
@@ -2271,7 +2271,7 @@
         </w:numPr>
       </w:pPr>
       <w:r>
-        <w:t xml:space="preserve">Persistent identifier: https://github.com/odinzen/hephaestus-mqmqa-public/releases/tag/v0.5.0</w:t>
+        <w:t xml:space="preserve">Persistent identifier: https://github.com/odinzen/hephaestus-mqmqa-public/releases/tag/v0.5.1</w:t>
       </w:r>
     </w:p>
     <w:p>
@@ -2307,7 +2307,7 @@
         </w:numPr>
       </w:pPr>
       <w:r>
-        <w:t xml:space="preserve">Version published: v0.5.0</w:t>
+        <w:t xml:space="preserve">Version published: v0.5.1</w:t>
       </w:r>
     </w:p>
     <w:p>
@@ -2382,8 +2382,8 @@
         <w:t xml:space="preserve">Date published: 2026-09-02</w:t>
       </w:r>
     </w:p>
-    <w:bookmarkEnd w:id="1639"/>
-    <w:bookmarkStart w:id="1640" w:name="language"/>
+    <w:bookmarkEnd w:id="1682"/>
+    <w:bookmarkStart w:id="1683" w:name="language"/>
     <w:p>
       <w:pPr>
         <w:pStyle w:val="Heading3"/>
@@ -2400,9 +2400,9 @@
         <w:t xml:space="preserve">English.</w:t>
       </w:r>
     </w:p>
-    <w:bookmarkEnd w:id="1640"/>
-    <w:bookmarkEnd w:id="1641"/>
-    <w:bookmarkStart w:id="1658" w:name="reuse-potential"/>
+    <w:bookmarkEnd w:id="1683"/>
+    <w:bookmarkEnd w:id="1684"/>
+    <w:bookmarkStart w:id="1701" w:name="reuse-potential"/>
     <w:p>
       <w:pPr>
         <w:pStyle w:val="Heading2"/>
@@ -2427,7 +2427,7 @@
         <w:t xml:space="preserve">The browser application makes the lowest barrier the default. A lecture on slag thermodynamics, a plant metallurgist screening a composition, or a reviewer checking a claimed equilibrium can load the database and calculate in seconds, with confidential inputs never leaving the machine. The same property makes it a practical template for other groups who want to publish a model as a zero-install tool.</w:t>
       </w:r>
     </w:p>
-    <w:bookmarkStart w:id="1657" w:name="worked-examples"/>
+    <w:bookmarkStart w:id="1700" w:name="worked-examples"/>
     <w:p>
       <w:pPr>
         <w:pStyle w:val="Heading3"/>
@@ -2639,18 +2639,18 @@
           <wp:inline>
             <wp:extent cx="4206240" cy="3262561"/>
             <wp:effectExtent b="0" l="0" r="0" t="0"/>
-            <wp:docPr descr="Figure 4: The LiCl-KCl phase diagram calculated by the salt listing from the shipped open database, at the listing’s own step size. Light to dark: liquid, two-phase, and subsolidus fields. The dot is the calculated eutectic at this step size (0.400, 640 K); the star is the measured eutectic (0.415, 626 K)." title="" id="1643" name="Picture"/>
+            <wp:docPr descr="Figure 4: The LiCl-KCl phase diagram calculated by the salt listing from the shipped open database, at the listing’s own step size. Light to dark: liquid, two-phase, and subsolidus fields. The dot is the calculated eutectic at this step size (0.400, 640 K); the star is the measured eutectic (0.415, 626 K)." title="" id="1686" name="Picture"/>
             <a:graphic>
               <a:graphicData uri="http://schemas.openxmlformats.org/drawingml/2006/picture">
                 <pic:pic>
                   <pic:nvPicPr>
-                    <pic:cNvPr descr="figures/fig4_salt_example.png" id="1644" name="Picture"/>
+                    <pic:cNvPr descr="figures/fig4_salt_example.png" id="1687" name="Picture"/>
                     <pic:cNvPicPr>
                       <a:picLocks noChangeArrowheads="1" noChangeAspect="1"/>
                     </pic:cNvPicPr>
                   </pic:nvPicPr>
                   <pic:blipFill>
-                    <a:blip r:embed="rId1642"/>
+                    <a:blip r:embed="rId1685"/>
                     <a:stretch>
                       <a:fillRect/>
                     </a:stretch>
@@ -2885,18 +2885,18 @@
           <wp:inline>
             <wp:extent cx="4206240" cy="3262561"/>
             <wp:effectExtent b="0" l="0" r="0" t="0"/>
-            <wp:docPr descr="Figure 5: The Al-Zn phase diagram calculated by the alloy listing from the shipped open TDB. Light to dark: liquid, liquid plus solid, and solid fields. The dot is the calculated eutectic (0.890, 660 K); the star is the assessed eutectic (0.885, 654 K)." title="" id="1646" name="Picture"/>
+            <wp:docPr descr="Figure 5: The Al-Zn phase diagram calculated by the alloy listing from the shipped open TDB. Light to dark: liquid, liquid plus solid, and solid fields. The dot is the calculated eutectic (0.890, 660 K); the star is the assessed eutectic (0.885, 654 K)." title="" id="1689" name="Picture"/>
             <a:graphic>
               <a:graphicData uri="http://schemas.openxmlformats.org/drawingml/2006/picture">
                 <pic:pic>
                   <pic:nvPicPr>
-                    <pic:cNvPr descr="figures/fig5_alloy_example.png" id="1647" name="Picture"/>
+                    <pic:cNvPr descr="figures/fig5_alloy_example.png" id="1690" name="Picture"/>
                     <pic:cNvPicPr>
                       <a:picLocks noChangeArrowheads="1" noChangeAspect="1"/>
                     </pic:cNvPicPr>
                   </pic:nvPicPr>
                   <pic:blipFill>
-                    <a:blip r:embed="rId1645"/>
+                    <a:blip r:embed="rId1688"/>
                     <a:stretch>
                       <a:fillRect/>
                     </a:stretch>
@@ -3017,18 +3017,18 @@
           <wp:inline>
             <wp:extent cx="5334000" cy="4430576"/>
             <wp:effectExtent b="0" l="0" r="0" t="0"/>
-            <wp:docPr descr="Figure 6: One unified (.utdb) file, two physics, calculated in the browser. (a) The steelmaking database loaded with the Melt/Alloy view toggle on Alloy; the engine calculates the Fe-C phase diagram through the magnetic compound energy formalism, rendered over a 0-25 mol% C composition window (the equilibrium always solves the whole join), with two tapped compositions pinned. (b) Scheil solidification for the same join at 4 mol% C, first solid at 1741 K and the residual liquid frozen by 1433 K, against the equilibrium lever-rule path (dashed). The file’s slag half is a Modified Quasichemical Model liquid; no legacy container holds both models at once." title="" id="1649" name="Picture"/>
+            <wp:docPr descr="Figure 6: One unified (.utdb) file, two physics, calculated in the browser. (a) The steelmaking database loaded with the Melt/Alloy view toggle on Alloy; the engine calculates the Fe-C phase diagram through the magnetic compound energy formalism, rendered over a 0-25 mol% C composition window (the equilibrium always solves the whole join), with two tapped compositions pinned. (b) Scheil solidification for the same join at 4 mol% C, first solid at 1741 K and the residual liquid frozen by 1433 K, against the equilibrium lever-rule path (dashed). The file’s slag half is a Modified Quasichemical Model liquid; no legacy container holds both models at once." title="" id="1692" name="Picture"/>
             <a:graphic>
               <a:graphicData uri="http://schemas.openxmlformats.org/drawingml/2006/picture">
                 <pic:pic>
                   <pic:nvPicPr>
-                    <pic:cNvPr descr="figures/fig6_utdb_steel.png" id="1650" name="Picture"/>
+                    <pic:cNvPr descr="figures/fig6_utdb_steel.png" id="1693" name="Picture"/>
                     <pic:cNvPicPr>
                       <a:picLocks noChangeArrowheads="1" noChangeAspect="1"/>
                     </pic:cNvPicPr>
                   </pic:nvPicPr>
                   <pic:blipFill>
-                    <a:blip r:embed="rId1648"/>
+                    <a:blip r:embed="rId1691"/>
                     <a:stretch>
                       <a:fillRect/>
                     </a:stretch>
@@ -3072,18 +3072,18 @@
           <wp:inline>
             <wp:extent cx="5334000" cy="2319130"/>
             <wp:effectExtent b="0" l="0" r="0" t="0"/>
-            <wp:docPr descr="Figure 7: The gas calculator as a steelmaking worked example, the equilibrium of a carbon-oxygen furnace gas by the Hephaestus gas engine (the NASA-polynomial element-potential solver compiled into the browser), with Cantera as the independent check. (a) Oxygen partial pressure against the CO to CO2 ratio at the 1873 K tap temperature: a lower ratio is more oxidizing and drives iron into the slag as FeO, a higher ratio is more reducing and decarburizes the steel. (b) The same oxygen potential against temperature for four fixed CO to CO2 buffers, showing that a given gas grows more oxidizing as it heats; the dashed line marks the tap temperature. Open circles are Cantera, agreeing to about 10-5 mole fraction across the field." title="" id="1652" name="Picture"/>
+            <wp:docPr descr="Figure 7: The gas calculator as a steelmaking worked example, the equilibrium of a carbon-oxygen furnace gas by the Hephaestus gas engine (the NASA-polynomial element-potential solver compiled into the browser), with Cantera as the independent check. (a) Oxygen partial pressure against the CO to CO2 ratio at the 1873 K tap temperature: a lower ratio is more oxidizing and drives iron into the slag as FeO, a higher ratio is more reducing and decarburizes the steel. (b) The same oxygen potential against temperature for four fixed CO to CO2 buffers, showing that a given gas grows more oxidizing as it heats; the dashed line marks the tap temperature. Open circles are Cantera, agreeing to about 10-5 mole fraction across the field." title="" id="1695" name="Picture"/>
             <a:graphic>
               <a:graphicData uri="http://schemas.openxmlformats.org/drawingml/2006/picture">
                 <pic:pic>
                   <pic:nvPicPr>
-                    <pic:cNvPr descr="figures/fig7_gas_steel.png" id="1653" name="Picture"/>
+                    <pic:cNvPr descr="figures/fig7_gas_steel.png" id="1696" name="Picture"/>
                     <pic:cNvPicPr>
                       <a:picLocks noChangeArrowheads="1" noChangeAspect="1"/>
                     </pic:cNvPicPr>
                   </pic:nvPicPr>
                   <pic:blipFill>
-                    <a:blip r:embed="rId1651"/>
+                    <a:blip r:embed="rId1694"/>
                     <a:stretch>
                       <a:fillRect/>
                     </a:stretch>
@@ -3163,18 +3163,18 @@
           <wp:inline>
             <wp:extent cx="4572000" cy="3556000"/>
             <wp:effectExtent b="0" l="0" r="0" t="0"/>
-            <wp:docPr descr="Figure 8: Al-Zn phase diagram with ESPEI parameter uncertainty. The liquid and face-centred-cubic (fcc) excess parameters were refit by Markov-chain Monte Carlo to the measured liquid enthalpy of mixing (Debski et al., digitised from Dinsdale et al. [44]) and the assessed phase boundaries (Massalski [45]; Mey [39]), and the posterior was propagated through the engine. The solid line is the median liquidus and the dashed line the median fcc solvus; the shaded region is the 90 percent posterior band on each. The band is narrow on the liquidus, which the calorimetry constrains, and wider on the fcc solvus, which only the diagram constrains. The open circle is the assessed eutectic." title="" id="1655" name="Picture"/>
+            <wp:docPr descr="Figure 8: Al-Zn phase diagram with ESPEI parameter uncertainty. The liquid and face-centred-cubic (fcc) excess parameters were refit by Markov-chain Monte Carlo to the measured liquid enthalpy of mixing (Debski et al., digitised from Dinsdale et al. [44]) and the assessed phase boundaries (Massalski [45]; Mey [39]), and the posterior was propagated through the engine. The solid line is the median liquidus and the dashed line the median fcc solvus; the shaded region is the 90 percent posterior band on each. The band is narrow on the liquidus, which the calorimetry constrains, and wider on the fcc solvus, which only the diagram constrains. The open circle is the assessed eutectic." title="" id="1698" name="Picture"/>
             <a:graphic>
               <a:graphicData uri="http://schemas.openxmlformats.org/drawingml/2006/picture">
                 <pic:pic>
                   <pic:nvPicPr>
-                    <pic:cNvPr descr="figures/fig8_uq_alzn.png" id="1656" name="Picture"/>
+                    <pic:cNvPr descr="figures/fig8_uq_alzn.png" id="1699" name="Picture"/>
                     <pic:cNvPicPr>
                       <a:picLocks noChangeArrowheads="1" noChangeAspect="1"/>
                     </pic:cNvPicPr>
                   </pic:nvPicPr>
                   <pic:blipFill>
-                    <a:blip r:embed="rId1654"/>
+                    <a:blip r:embed="rId1697"/>
                     <a:stretch>
                       <a:fillRect/>
                     </a:stretch>
@@ -3214,12 +3214,12 @@
         <w:pStyle w:val="BodyText"/>
       </w:pPr>
       <w:r>
-        <w:t xml:space="preserve">The gap this work addresses was never the model, which has been published for two decades, but an open, runnable pairing of model and parameters. Hephaestus supplies both halves under open licenses and puts them behind a browser page that asks nothing of its user. The claims are checkable end to end. Release v0.5.0 archives the exact version described, and the 131-test suite reruns the pycalphad comparisons on any machine. The worked examples print the figures shown, and every parameter in every shipped database traces to a published measurement through its provenance file. A reader who doubts a number can recalculate it; one who needs a system that is missing can build it with the same open tools, or ask.</w:t>
-      </w:r>
-    </w:p>
-    <w:bookmarkEnd w:id="1657"/>
-    <w:bookmarkEnd w:id="1658"/>
-    <w:bookmarkStart w:id="1659" w:name="data-availability"/>
+        <w:t xml:space="preserve">The gap this work addresses was never the model, which has been published for two decades, but an open, runnable pairing of model and parameters. Hephaestus supplies both halves under open licenses and puts them behind a browser page that asks nothing of its user. The claims are checkable end to end. Release v0.5.1 archives the exact version described, and the 131-test suite reruns the pycalphad comparisons on any machine. The worked examples print the figures shown, and every parameter in every shipped database traces to a published measurement through its provenance file. A reader who doubts a number can recalculate it; one who needs a system that is missing can build it with the same open tools, or ask.</w:t>
+      </w:r>
+    </w:p>
+    <w:bookmarkEnd w:id="1700"/>
+    <w:bookmarkEnd w:id="1701"/>
+    <w:bookmarkStart w:id="1702" w:name="data-availability"/>
     <w:p>
       <w:pPr>
         <w:pStyle w:val="Heading2"/>
@@ -3233,11 +3233,11 @@
         <w:pStyle w:val="FirstParagraph"/>
       </w:pPr>
       <w:r>
-        <w:t xml:space="preserve">The engine, the database, the browser application, and the validation suite are openly available in the code repository listed above; the version described here is archived as release v0.5.0. The database files and their provenance records are in the repository’s data directory under CC BY 4.0.</w:t>
-      </w:r>
-    </w:p>
-    <w:bookmarkEnd w:id="1659"/>
-    <w:bookmarkStart w:id="1660" w:name="acknowledgements"/>
+        <w:t xml:space="preserve">The engine, the database, the browser application, and the validation suite are openly available in the code repository listed above; the version described here is archived as release v0.5.1. The database files and their provenance records are in the repository’s data directory under CC BY 4.0.</w:t>
+      </w:r>
+    </w:p>
+    <w:bookmarkEnd w:id="1702"/>
+    <w:bookmarkStart w:id="1703" w:name="acknowledgements"/>
     <w:p>
       <w:pPr>
         <w:pStyle w:val="Heading2"/>
@@ -3254,8 +3254,8 @@
         <w:t xml:space="preserve">During the development of this software the author used Claude Code (Anthropic) to assist with implementation, validation scripting, and manuscript preparation. This assistance was agentic, not autonomous: it operated under author direction and supervision at every step and was never a closed loop that produced or accepted results without review. Every parameter was traced by the author to its primary source before entering the database, and every reference was verified against its registry record. The author reviewed and approved all output and takes full responsibility for this article.</w:t>
       </w:r>
     </w:p>
-    <w:bookmarkEnd w:id="1660"/>
-    <w:bookmarkStart w:id="1661" w:name="funding-statement"/>
+    <w:bookmarkEnd w:id="1703"/>
+    <w:bookmarkStart w:id="1704" w:name="funding-statement"/>
     <w:p>
       <w:pPr>
         <w:pStyle w:val="Heading2"/>
@@ -3272,8 +3272,8 @@
         <w:t xml:space="preserve">The development of this software received no external funding.</w:t>
       </w:r>
     </w:p>
-    <w:bookmarkEnd w:id="1661"/>
-    <w:bookmarkStart w:id="1662" w:name="competing-interests"/>
+    <w:bookmarkEnd w:id="1704"/>
+    <w:bookmarkStart w:id="1705" w:name="competing-interests"/>
     <w:p>
       <w:pPr>
         <w:pStyle w:val="Heading2"/>
@@ -3290,8 +3290,8 @@
         <w:t xml:space="preserve">The author founded Odinzen LLC, which provides commercial thermodynamic modeling services, and declares this as a competing interest. The software and database published here are released in full under open licenses, and no proprietary Odinzen assets are included.</w:t>
       </w:r>
     </w:p>
-    <w:bookmarkEnd w:id="1662"/>
-    <w:bookmarkStart w:id="1663" w:name="references"/>
+    <w:bookmarkEnd w:id="1705"/>
+    <w:bookmarkStart w:id="1706" w:name="references"/>
     <w:p>
       <w:pPr>
         <w:pStyle w:val="Heading2"/>
@@ -3672,8 +3672,8 @@
         <w:t xml:space="preserve">[45] Massalski TB, editor. Binary Alloy Phase Diagrams. 2nd ed. Materials Park (OH): ASM International; 1990.</w:t>
       </w:r>
     </w:p>
-    <w:bookmarkEnd w:id="1663"/>
-    <w:bookmarkEnd w:id="1664"/>
+    <w:bookmarkEnd w:id="1706"/>
+    <w:bookmarkEnd w:id="1707"/>
     <w:sectPr>
       <w:footnotePr>
         <w:numRestart w:val="eachSect"/>

</xml_diff>

<commit_message>
Add the slag<->gas readout to the browser (eighth tool), release v0.5.2
An interactive card reads back the validated iron-saturated coupling for the assessed
FeO-SiO2 slag: drag the silica content and it shows the FeO activity, the equilibrium
furnace CO2/CO ratio and the oxygen pressure the melt sits under, with a live plot. The
numbers are the engine's (precomputed like the other assessed showcases, not a live
re-solve), matching the Python reference exactly in-browser.

Also adds log10_pO2_iron_saturated to gas_slag and a test that the pure-FeO limit lands on
the iron-wustite buffer (about -8.5 at 1873 K), a third independent physical check alongside
the Cantera buffer and the fitted activities. Manuscript: browser tool count seven -> eight
with the readout described; release rolled to v0.5.2, reading copies rebuilt, Argus green.

Co-Authored-By: Claude Opus 4.8 <noreply@anthropic.com>
</commit_message>
<xml_diff>
--- a/paper/Bustamante_Hephaestus_JORS_manuscript.docx
+++ b/paper/Bustamante_Hephaestus_JORS_manuscript.docx
@@ -2,7 +2,7 @@
 <file path=word/document.xml><?xml version="1.0" encoding="utf-8"?>
 <w:document xmlns:w="http://schemas.openxmlformats.org/wordprocessingml/2006/main" xmlns:m="http://schemas.openxmlformats.org/officeDocument/2006/math" xmlns:r="http://schemas.openxmlformats.org/officeDocument/2006/relationships" xmlns:o="urn:schemas-microsoft-com:office:office" xmlns:v="urn:schemas-microsoft-com:vml" xmlns:w10="urn:schemas-microsoft-com:office:word" xmlns:a="http://schemas.openxmlformats.org/drawingml/2006/main" xmlns:pic="http://schemas.openxmlformats.org/drawingml/2006/picture" xmlns:wp="http://schemas.openxmlformats.org/drawingml/2006/wordprocessingDrawing">
   <w:body>
-    <w:bookmarkStart w:id="1707" w:name="X4855b1162e70238fd839d871e0792397dc58430"/>
+    <w:bookmarkStart w:id="1750" w:name="X4855b1162e70238fd839d871e0792397dc58430"/>
     <w:p>
       <w:pPr>
         <w:pStyle w:val="Heading1"/>
@@ -159,7 +159,7 @@
         <w:t xml:space="preserve">CALPHAD; molten slag; molten salt; modified quasichemical model; thermodynamic database; phase diagram; gas equilibrium; WebAssembly; open data</w:t>
       </w:r>
     </w:p>
-    <w:bookmarkStart w:id="1676" w:name="overview"/>
+    <w:bookmarkStart w:id="1719" w:name="overview"/>
     <w:p>
       <w:pPr>
         <w:pStyle w:val="Heading2"/>
@@ -168,7 +168,7 @@
         <w:t xml:space="preserve">(1) Overview</w:t>
       </w:r>
     </w:p>
-    <w:bookmarkStart w:id="1663" w:name="introduction"/>
+    <w:bookmarkStart w:id="1706" w:name="introduction"/>
     <w:p>
       <w:pPr>
         <w:pStyle w:val="Heading3"/>
@@ -548,8 +548,8 @@
         <w:t xml:space="preserve">Hephaestus is a deliberate response to that gap, and it treats the engine and the data as one contribution because neither is useful alone. The engine is small on purpose. Its core is plain C with no dependencies, which makes it easy to embed and lets the identical code compile to WebAssembly, so the full calculator runs in a web browser with nothing installed and no data leaving the user’s machine. The database is open on purpose. Every parameter in it derives from published measurements, each value carries its provenance down to table and page, and the known shortcomings are documented next to the numbers they affect. The present work describes both, their validation against pycalphad and against measured phase equilibria, and the ways they can be reused. None of it asks the reader to program. For the experimentalist who never writes code, the browser application is the entire product: a page to open, a database to click, and a diagram to read. The sections that follow describe the machinery underneath for those who want it. Supplementary Material S1 is a plain-language primer for the non-programmer, starting at what a database file is and ending at a first calculation and how to read it. Its closing section teaches what an assessment is built from, so a reader who wants to contribute data for open publication, or to commission a file, arrives knowing what is needed.</w:t>
       </w:r>
     </w:p>
-    <w:bookmarkEnd w:id="1663"/>
-    <w:bookmarkStart w:id="1673" w:name="implementation-and-architecture"/>
+    <w:bookmarkEnd w:id="1706"/>
+    <w:bookmarkStart w:id="1716" w:name="implementation-and-architecture"/>
     <w:p>
       <w:pPr>
         <w:pStyle w:val="Heading3"/>
@@ -575,18 +575,18 @@
           <wp:inline>
             <wp:extent cx="5334000" cy="3511167"/>
             <wp:effectExtent b="0" l="0" r="0" t="0"/>
-            <wp:docPr descr="Figure 1: Architecture of Hephaestus. A single dependency-free C core reads the field’s three database dialects (ChemSage .dat, Thermo-Calc .tdb with the Inden magnetic model, and the unified .utdb) and calculates all thermodynamics; the same core is used as a native library, from Python through cffi, and compiled to WebAssembly behind the browser application. dbbuild writes new ChemSage files from measured data, and every energy path is validated against pycalphad." title="" id="1665" name="Picture"/>
+            <wp:docPr descr="Figure 1: Architecture of Hephaestus. A single dependency-free C core reads the field’s three database dialects (ChemSage .dat, Thermo-Calc .tdb with the Inden magnetic model, and the unified .utdb) and calculates all thermodynamics; the same core is used as a native library, from Python through cffi, and compiled to WebAssembly behind the browser application. dbbuild writes new ChemSage files from measured data, and every energy path is validated against pycalphad." title="" id="1708" name="Picture"/>
             <a:graphic>
               <a:graphicData uri="http://schemas.openxmlformats.org/drawingml/2006/picture">
                 <pic:pic>
                   <pic:nvPicPr>
-                    <pic:cNvPr descr="figures/fig1_architecture.png" id="1666" name="Picture"/>
+                    <pic:cNvPr descr="figures/fig1_architecture.png" id="1709" name="Picture"/>
                     <pic:cNvPicPr>
                       <a:picLocks noChangeArrowheads="1" noChangeAspect="1"/>
                     </pic:cNvPicPr>
                   </pic:nvPicPr>
                   <pic:blipFill>
-                    <a:blip r:embed="rId1664"/>
+                    <a:blip r:embed="rId1707"/>
                     <a:stretch>
                       <a:fillRect/>
                     </a:stretch>
@@ -769,7 +769,7 @@
         <w:pStyle w:val="BodyText"/>
       </w:pPr>
       <w:r>
-        <w:t xml:space="preserve">The browser application, hosted at https://odinzen.github.io/hephaestus-mqmqa-public/, exposes seven tools. A calculator works over any loaded database (ChemSage .dat or Thermo-Calc .tdb, auto-detected, with up to three uploaded files held per session). A binary-join phase-diagram tool offers tap-to-read point comparison, and a Scheil-Gulliver solidification panel on the same join draws the equilibrium lever-rule path alongside. A viewer shows the assessed FeO-MgO-SiO</w:t>
+        <w:t xml:space="preserve">The browser application, hosted at https://odinzen.github.io/hephaestus-mqmqa-public/, exposes eight tools. A calculator works over any loaded database (ChemSage .dat or Thermo-Calc .tdb, auto-detected, with up to three uploaded files held per session). A binary-join phase-diagram tool offers tap-to-read point comparison, and a Scheil-Gulliver solidification panel on the same join draws the equilibrium lever-rule path alongside. A viewer shows the assessed FeO-MgO-SiO</w:t>
       </w:r>
       <w:r>
         <w:rPr>
@@ -781,7 +781,28 @@
         <w:t xml:space="preserve"> </w:t>
       </w:r>
       <w:r>
-        <w:t xml:space="preserve">diagrams, and a live isothermal-section solver calculates the full phase assemblage at a chosen temperature in a second or two, for the shipped ternaries or for any loaded three-cation file (Figure 2). An interactive eutectic builder pre-fills its component names, melting points, and fusion enthalpies from the loaded database. A gas-equilibrium calculator solves ideal-gas equilibrium over an open NASA-polynomial database, its own engine compiled into the same WebAssembly core, and optionally couples that gas to a steelmaking condensate (graphite, wustite, iron) so a reducing atmosphere pulls the oxide down to metal and an oxidising one holds it, computed at a shared oxygen potential. Loading an alloy TDB reshapes the workspace: the elements become the end members and every compound energy formalism phase spanning the join enters the same convex hull construction. Everything runs client side. The page holds a strict content security policy, escapes all file-derived strings, makes no third-party requests, and never transmits a loaded file, which matters to industrial users whose compositions are confidential.</w:t>
+        <w:t xml:space="preserve">diagrams, and a live isothermal-section solver calculates the full phase assemblage at a chosen temperature in a second or two, for the shipped ternaries or for any loaded three-cation file (Figure 2). An interactive eutectic builder pre-fills its component names, melting points, and fusion enthalpies from the loaded database. A gas-equilibrium calculator solves ideal-gas equilibrium over an open NASA-polynomial database, its own engine compiled into the same WebAssembly core, and optionally couples that gas to a steelmaking condensate (graphite, wustite, iron) so a reducing atmosphere pulls the oxide down to metal and an oxidising one holds it, computed at a shared oxygen potential. A slag-gas readout closes the same loop for the solution melt: for the assessed FeO-SiO</w:t>
+      </w:r>
+      <w:r>
+        <w:rPr>
+          <w:vertAlign w:val="subscript"/>
+        </w:rPr>
+        <w:t xml:space="preserve">2</w:t>
+      </w:r>
+      <w:r>
+        <w:t xml:space="preserve"> </w:t>
+      </w:r>
+      <w:r>
+        <w:t xml:space="preserve">slag held at iron saturation it shows the FeO activity and the furnace CO</w:t>
+      </w:r>
+      <w:r>
+        <w:rPr>
+          <w:vertAlign w:val="subscript"/>
+        </w:rPr>
+        <w:t xml:space="preserve">2</w:t>
+      </w:r>
+      <w:r>
+        <w:t xml:space="preserve">/CO ratio and oxygen pressure the melt equilibrates with, so adding silica lowers the activity and drives the equilibrium gas more reducing. Loading an alloy TDB reshapes the workspace: the elements become the end members and every compound energy formalism phase spanning the join enters the same convex hull construction. Everything runs client side. The page holds a strict content security policy, escapes all file-derived strings, makes no third-party requests, and never transmits a loaded file, which matters to industrial users whose compositions are confidential.</w:t>
       </w:r>
     </w:p>
     <w:p>
@@ -793,18 +814,18 @@
           <wp:inline>
             <wp:extent cx="4754880" cy="3913308"/>
             <wp:effectExtent b="0" l="0" r="0" t="0"/>
-            <wp:docPr descr="Figure 2: The live solver in the browser application (light theme). The user loads the shipped database, picks a temperature, and presses Compute; the WebAssembly engine then solves the full FeO-MgO-SiO2 phase assemblage client side (here 861 composition samples and 595 tie-facets in about two seconds). Tapping a composition reads its stable phases and pins it to a comparison list; hovering previews on desktop." title="" id="1668" name="Picture"/>
+            <wp:docPr descr="Figure 2: The live solver in the browser application (light theme). The user loads the shipped database, picks a temperature, and presses Compute; the WebAssembly engine then solves the full FeO-MgO-SiO2 phase assemblage client side (here 861 composition samples and 595 tie-facets in about two seconds). Tapping a composition reads its stable phases and pins it to a comparison list; hovering previews on desktop." title="" id="1711" name="Picture"/>
             <a:graphic>
               <a:graphicData uri="http://schemas.openxmlformats.org/drawingml/2006/picture">
                 <pic:pic>
                   <pic:nvPicPr>
-                    <pic:cNvPr descr="figures/fig2_browser_app.png" id="1669" name="Picture"/>
+                    <pic:cNvPr descr="figures/fig2_browser_app.png" id="1712" name="Picture"/>
                     <pic:cNvPicPr>
                       <a:picLocks noChangeArrowheads="1" noChangeAspect="1"/>
                     </pic:cNvPicPr>
                   </pic:nvPicPr>
                   <pic:blipFill>
-                    <a:blip r:embed="rId1667"/>
+                    <a:blip r:embed="rId1710"/>
                     <a:stretch>
                       <a:fillRect/>
                     </a:stretch>
@@ -970,18 +991,18 @@
           <wp:inline>
             <wp:extent cx="5334000" cy="2197297"/>
             <wp:effectExtent b="0" l="0" r="0" t="0"/>
-            <wp:docPr descr="Figure 3: The assessed FeO-MgO-SiO2 system calculated from the shipped database files. (a) Liquidus projection: primary crystallizing phase fields, with liquidus isotherms labeled in °C. (b) Isothermal section at 1600 °C: stable phase assemblages, shaded by the number of solid phases present. Phase labels: L liquid, Crs cristobalite, Ol olivine, Opx orthopyroxene, Per periclase, Wus wustite." title="" id="1671" name="Picture"/>
+            <wp:docPr descr="Figure 3: The assessed FeO-MgO-SiO2 system calculated from the shipped database files. (a) Liquidus projection: primary crystallizing phase fields, with liquidus isotherms labeled in °C. (b) Isothermal section at 1600 °C: stable phase assemblages, shaded by the number of solid phases present. Phase labels: L liquid, Crs cristobalite, Ol olivine, Opx orthopyroxene, Per periclase, Wus wustite." title="" id="1714" name="Picture"/>
             <a:graphic>
               <a:graphicData uri="http://schemas.openxmlformats.org/drawingml/2006/picture">
                 <pic:pic>
                   <pic:nvPicPr>
-                    <pic:cNvPr descr="figures/fig3_ternary.png" id="1672" name="Picture"/>
+                    <pic:cNvPr descr="figures/fig3_ternary.png" id="1715" name="Picture"/>
                     <pic:cNvPicPr>
                       <a:picLocks noChangeArrowheads="1" noChangeAspect="1"/>
                     </pic:cNvPicPr>
                   </pic:nvPicPr>
                   <pic:blipFill>
-                    <a:blip r:embed="rId1670"/>
+                    <a:blip r:embed="rId1713"/>
                     <a:stretch>
                       <a:fillRect/>
                     </a:stretch>
@@ -1371,8 +1392,8 @@
         </w:tc>
       </w:tr>
     </w:tbl>
-    <w:bookmarkEnd w:id="1673"/>
-    <w:bookmarkStart w:id="1674" w:name="anatomy-of-a-database-file"/>
+    <w:bookmarkEnd w:id="1716"/>
+    <w:bookmarkStart w:id="1717" w:name="anatomy-of-a-database-file"/>
     <w:p>
       <w:pPr>
         <w:pStyle w:val="Heading3"/>
@@ -1405,8 +1426,8 @@
         <w:t xml:space="preserve">That asymmetry is the economics of the field in miniature: implementations of the published models are increasingly available, but each fitted parameter condenses dozens of measurements and decisions. Parameter sets rather than codes are therefore the scarce commodity, and an openly licensed, provenance-tracked database is the part of this contribution that cannot be regenerated from the paper alone.</w:t>
       </w:r>
     </w:p>
-    <w:bookmarkEnd w:id="1674"/>
-    <w:bookmarkStart w:id="1675" w:name="quality-control"/>
+    <w:bookmarkEnd w:id="1717"/>
+    <w:bookmarkStart w:id="1718" w:name="quality-control"/>
     <w:p>
       <w:pPr>
         <w:pStyle w:val="Heading3"/>
@@ -2125,12 +2146,12 @@
         <w:t xml:space="preserve"> </w:t>
       </w:r>
       <w:r>
-        <w:t xml:space="preserve">invariants sit within about 40 °C, and the ternary liquidus projection reproduces the measured field topology [24]. Development practice is plain: the repository is version controlled with tagged releases (v0.1.0 through the v0.5.1 described here), the full suite runs before every release, and a fixed bug lands together with the regression test that would have caught it. The suite runs on Windows 11 under CPython 3.11 and 3.12; the browser application is exercised in Chromium- and Gecko-based browsers. A user can confirm a working installation by running pytest against the bundled test databases, or with no installation at all by opening the web application and loading the shipped ternary database.</w:t>
-      </w:r>
-    </w:p>
-    <w:bookmarkEnd w:id="1675"/>
-    <w:bookmarkEnd w:id="1676"/>
-    <w:bookmarkStart w:id="1684" w:name="availability"/>
+        <w:t xml:space="preserve">invariants sit within about 40 °C, and the ternary liquidus projection reproduces the measured field topology [24]. Development practice is plain: the repository is version controlled with tagged releases (v0.1.0 through the v0.5.2 described here), the full suite runs before every release, and a fixed bug lands together with the regression test that would have caught it. The suite runs on Windows 11 under CPython 3.11 and 3.12; the browser application is exercised in Chromium- and Gecko-based browsers. A user can confirm a working installation by running pytest against the bundled test databases, or with no installation at all by opening the web application and loading the shipped ternary database.</w:t>
+      </w:r>
+    </w:p>
+    <w:bookmarkEnd w:id="1718"/>
+    <w:bookmarkEnd w:id="1719"/>
+    <w:bookmarkStart w:id="1727" w:name="availability"/>
     <w:p>
       <w:pPr>
         <w:pStyle w:val="Heading2"/>
@@ -2139,7 +2160,7 @@
         <w:t xml:space="preserve">(2) Availability</w:t>
       </w:r>
     </w:p>
-    <w:bookmarkStart w:id="1677" w:name="operating-system"/>
+    <w:bookmarkStart w:id="1720" w:name="operating-system"/>
     <w:p>
       <w:pPr>
         <w:pStyle w:val="Heading3"/>
@@ -2156,8 +2177,8 @@
         <w:t xml:space="preserve">Platform independent. The core builds with any C99 compiler; development and testing used Windows 11. The browser application runs in any current browser with WebAssembly support.</w:t>
       </w:r>
     </w:p>
-    <w:bookmarkEnd w:id="1677"/>
-    <w:bookmarkStart w:id="1678" w:name="programming-language"/>
+    <w:bookmarkEnd w:id="1720"/>
+    <w:bookmarkStart w:id="1721" w:name="programming-language"/>
     <w:p>
       <w:pPr>
         <w:pStyle w:val="Heading3"/>
@@ -2174,8 +2195,8 @@
         <w:t xml:space="preserve">C (core), Python 3.11 or later (interface and fitting tools), JavaScript (browser application).</w:t>
       </w:r>
     </w:p>
-    <w:bookmarkEnd w:id="1678"/>
-    <w:bookmarkStart w:id="1679" w:name="additional-system-requirements"/>
+    <w:bookmarkEnd w:id="1721"/>
+    <w:bookmarkStart w:id="1722" w:name="additional-system-requirements"/>
     <w:p>
       <w:pPr>
         <w:pStyle w:val="Heading3"/>
@@ -2192,8 +2213,8 @@
         <w:t xml:space="preserve">None of note. The engine and database together are a few megabytes.</w:t>
       </w:r>
     </w:p>
-    <w:bookmarkEnd w:id="1679"/>
-    <w:bookmarkStart w:id="1680" w:name="dependencies"/>
+    <w:bookmarkEnd w:id="1722"/>
+    <w:bookmarkStart w:id="1723" w:name="dependencies"/>
     <w:p>
       <w:pPr>
         <w:pStyle w:val="Heading3"/>
@@ -2210,8 +2231,8 @@
         <w:t xml:space="preserve">Python interface: cffi, NumPy, SciPy (developed and tested with cffi 2.0, NumPy 2.4, and SciPy 1.17). The validation suite additionally requires pycalphad; every oracle comparison reported here ran against pycalphad 0.11.1, and the tests that read pycalphad’s own shipped test databases skip cleanly if a later version relocates them. The WebAssembly build requires emscripten. The C core and the browser application have no dependencies.</w:t>
       </w:r>
     </w:p>
-    <w:bookmarkEnd w:id="1680"/>
-    <w:bookmarkStart w:id="1681" w:name="list-of-contributors"/>
+    <w:bookmarkEnd w:id="1723"/>
+    <w:bookmarkStart w:id="1724" w:name="list-of-contributors"/>
     <w:p>
       <w:pPr>
         <w:pStyle w:val="Heading3"/>
@@ -2228,8 +2249,8 @@
         <w:t xml:space="preserve">Michael E. Bustamante (design, implementation, validation, data curation).</w:t>
       </w:r>
     </w:p>
-    <w:bookmarkEnd w:id="1681"/>
-    <w:bookmarkStart w:id="1682" w:name="software-location"/>
+    <w:bookmarkEnd w:id="1724"/>
+    <w:bookmarkStart w:id="1725" w:name="software-location"/>
     <w:p>
       <w:pPr>
         <w:pStyle w:val="Heading3"/>
@@ -2271,7 +2292,7 @@
         </w:numPr>
       </w:pPr>
       <w:r>
-        <w:t xml:space="preserve">Persistent identifier: https://github.com/odinzen/hephaestus-mqmqa-public/releases/tag/v0.5.1</w:t>
+        <w:t xml:space="preserve">Persistent identifier: https://github.com/odinzen/hephaestus-mqmqa-public/releases/tag/v0.5.2</w:t>
       </w:r>
     </w:p>
     <w:p>
@@ -2307,7 +2328,7 @@
         </w:numPr>
       </w:pPr>
       <w:r>
-        <w:t xml:space="preserve">Version published: v0.5.1</w:t>
+        <w:t xml:space="preserve">Version published: v0.5.2</w:t>
       </w:r>
     </w:p>
     <w:p>
@@ -2382,8 +2403,8 @@
         <w:t xml:space="preserve">Date published: 2026-09-02</w:t>
       </w:r>
     </w:p>
-    <w:bookmarkEnd w:id="1682"/>
-    <w:bookmarkStart w:id="1683" w:name="language"/>
+    <w:bookmarkEnd w:id="1725"/>
+    <w:bookmarkStart w:id="1726" w:name="language"/>
     <w:p>
       <w:pPr>
         <w:pStyle w:val="Heading3"/>
@@ -2400,9 +2421,9 @@
         <w:t xml:space="preserve">English.</w:t>
       </w:r>
     </w:p>
-    <w:bookmarkEnd w:id="1683"/>
-    <w:bookmarkEnd w:id="1684"/>
-    <w:bookmarkStart w:id="1701" w:name="reuse-potential"/>
+    <w:bookmarkEnd w:id="1726"/>
+    <w:bookmarkEnd w:id="1727"/>
+    <w:bookmarkStart w:id="1744" w:name="reuse-potential"/>
     <w:p>
       <w:pPr>
         <w:pStyle w:val="Heading2"/>
@@ -2427,7 +2448,7 @@
         <w:t xml:space="preserve">The browser application makes the lowest barrier the default. A lecture on slag thermodynamics, a plant metallurgist screening a composition, or a reviewer checking a claimed equilibrium can load the database and calculate in seconds, with confidential inputs never leaving the machine. The same property makes it a practical template for other groups who want to publish a model as a zero-install tool.</w:t>
       </w:r>
     </w:p>
-    <w:bookmarkStart w:id="1700" w:name="worked-examples"/>
+    <w:bookmarkStart w:id="1743" w:name="worked-examples"/>
     <w:p>
       <w:pPr>
         <w:pStyle w:val="Heading3"/>
@@ -2639,18 +2660,18 @@
           <wp:inline>
             <wp:extent cx="4206240" cy="3262561"/>
             <wp:effectExtent b="0" l="0" r="0" t="0"/>
-            <wp:docPr descr="Figure 4: The LiCl-KCl phase diagram calculated by the salt listing from the shipped open database, at the listing’s own step size. Light to dark: liquid, two-phase, and subsolidus fields. The dot is the calculated eutectic at this step size (0.400, 640 K); the star is the measured eutectic (0.415, 626 K)." title="" id="1686" name="Picture"/>
+            <wp:docPr descr="Figure 4: The LiCl-KCl phase diagram calculated by the salt listing from the shipped open database, at the listing’s own step size. Light to dark: liquid, two-phase, and subsolidus fields. The dot is the calculated eutectic at this step size (0.400, 640 K); the star is the measured eutectic (0.415, 626 K)." title="" id="1729" name="Picture"/>
             <a:graphic>
               <a:graphicData uri="http://schemas.openxmlformats.org/drawingml/2006/picture">
                 <pic:pic>
                   <pic:nvPicPr>
-                    <pic:cNvPr descr="figures/fig4_salt_example.png" id="1687" name="Picture"/>
+                    <pic:cNvPr descr="figures/fig4_salt_example.png" id="1730" name="Picture"/>
                     <pic:cNvPicPr>
                       <a:picLocks noChangeArrowheads="1" noChangeAspect="1"/>
                     </pic:cNvPicPr>
                   </pic:nvPicPr>
                   <pic:blipFill>
-                    <a:blip r:embed="rId1685"/>
+                    <a:blip r:embed="rId1728"/>
                     <a:stretch>
                       <a:fillRect/>
                     </a:stretch>
@@ -2885,18 +2906,18 @@
           <wp:inline>
             <wp:extent cx="4206240" cy="3262561"/>
             <wp:effectExtent b="0" l="0" r="0" t="0"/>
-            <wp:docPr descr="Figure 5: The Al-Zn phase diagram calculated by the alloy listing from the shipped open TDB. Light to dark: liquid, liquid plus solid, and solid fields. The dot is the calculated eutectic (0.890, 660 K); the star is the assessed eutectic (0.885, 654 K)." title="" id="1689" name="Picture"/>
+            <wp:docPr descr="Figure 5: The Al-Zn phase diagram calculated by the alloy listing from the shipped open TDB. Light to dark: liquid, liquid plus solid, and solid fields. The dot is the calculated eutectic (0.890, 660 K); the star is the assessed eutectic (0.885, 654 K)." title="" id="1732" name="Picture"/>
             <a:graphic>
               <a:graphicData uri="http://schemas.openxmlformats.org/drawingml/2006/picture">
                 <pic:pic>
                   <pic:nvPicPr>
-                    <pic:cNvPr descr="figures/fig5_alloy_example.png" id="1690" name="Picture"/>
+                    <pic:cNvPr descr="figures/fig5_alloy_example.png" id="1733" name="Picture"/>
                     <pic:cNvPicPr>
                       <a:picLocks noChangeArrowheads="1" noChangeAspect="1"/>
                     </pic:cNvPicPr>
                   </pic:nvPicPr>
                   <pic:blipFill>
-                    <a:blip r:embed="rId1688"/>
+                    <a:blip r:embed="rId1731"/>
                     <a:stretch>
                       <a:fillRect/>
                     </a:stretch>
@@ -3017,18 +3038,18 @@
           <wp:inline>
             <wp:extent cx="5334000" cy="4430576"/>
             <wp:effectExtent b="0" l="0" r="0" t="0"/>
-            <wp:docPr descr="Figure 6: One unified (.utdb) file, two physics, calculated in the browser. (a) The steelmaking database loaded with the Melt/Alloy view toggle on Alloy; the engine calculates the Fe-C phase diagram through the magnetic compound energy formalism, rendered over a 0-25 mol% C composition window (the equilibrium always solves the whole join), with two tapped compositions pinned. (b) Scheil solidification for the same join at 4 mol% C, first solid at 1741 K and the residual liquid frozen by 1433 K, against the equilibrium lever-rule path (dashed). The file’s slag half is a Modified Quasichemical Model liquid; no legacy container holds both models at once." title="" id="1692" name="Picture"/>
+            <wp:docPr descr="Figure 6: One unified (.utdb) file, two physics, calculated in the browser. (a) The steelmaking database loaded with the Melt/Alloy view toggle on Alloy; the engine calculates the Fe-C phase diagram through the magnetic compound energy formalism, rendered over a 0-25 mol% C composition window (the equilibrium always solves the whole join), with two tapped compositions pinned. (b) Scheil solidification for the same join at 4 mol% C, first solid at 1741 K and the residual liquid frozen by 1433 K, against the equilibrium lever-rule path (dashed). The file’s slag half is a Modified Quasichemical Model liquid; no legacy container holds both models at once." title="" id="1735" name="Picture"/>
             <a:graphic>
               <a:graphicData uri="http://schemas.openxmlformats.org/drawingml/2006/picture">
                 <pic:pic>
                   <pic:nvPicPr>
-                    <pic:cNvPr descr="figures/fig6_utdb_steel.png" id="1693" name="Picture"/>
+                    <pic:cNvPr descr="figures/fig6_utdb_steel.png" id="1736" name="Picture"/>
                     <pic:cNvPicPr>
                       <a:picLocks noChangeArrowheads="1" noChangeAspect="1"/>
                     </pic:cNvPicPr>
                   </pic:nvPicPr>
                   <pic:blipFill>
-                    <a:blip r:embed="rId1691"/>
+                    <a:blip r:embed="rId1734"/>
                     <a:stretch>
                       <a:fillRect/>
                     </a:stretch>
@@ -3072,18 +3093,18 @@
           <wp:inline>
             <wp:extent cx="5334000" cy="2319130"/>
             <wp:effectExtent b="0" l="0" r="0" t="0"/>
-            <wp:docPr descr="Figure 7: The gas calculator as a steelmaking worked example, the equilibrium of a carbon-oxygen furnace gas by the Hephaestus gas engine (the NASA-polynomial element-potential solver compiled into the browser), with Cantera as the independent check. (a) Oxygen partial pressure against the CO to CO2 ratio at the 1873 K tap temperature: a lower ratio is more oxidizing and drives iron into the slag as FeO, a higher ratio is more reducing and decarburizes the steel. (b) The same oxygen potential against temperature for four fixed CO to CO2 buffers, showing that a given gas grows more oxidizing as it heats; the dashed line marks the tap temperature. Open circles are Cantera, agreeing to about 10-5 mole fraction across the field." title="" id="1695" name="Picture"/>
+            <wp:docPr descr="Figure 7: The gas calculator as a steelmaking worked example, the equilibrium of a carbon-oxygen furnace gas by the Hephaestus gas engine (the NASA-polynomial element-potential solver compiled into the browser), with Cantera as the independent check. (a) Oxygen partial pressure against the CO to CO2 ratio at the 1873 K tap temperature: a lower ratio is more oxidizing and drives iron into the slag as FeO, a higher ratio is more reducing and decarburizes the steel. (b) The same oxygen potential against temperature for four fixed CO to CO2 buffers, showing that a given gas grows more oxidizing as it heats; the dashed line marks the tap temperature. Open circles are Cantera, agreeing to about 10-5 mole fraction across the field." title="" id="1738" name="Picture"/>
             <a:graphic>
               <a:graphicData uri="http://schemas.openxmlformats.org/drawingml/2006/picture">
                 <pic:pic>
                   <pic:nvPicPr>
-                    <pic:cNvPr descr="figures/fig7_gas_steel.png" id="1696" name="Picture"/>
+                    <pic:cNvPr descr="figures/fig7_gas_steel.png" id="1739" name="Picture"/>
                     <pic:cNvPicPr>
                       <a:picLocks noChangeArrowheads="1" noChangeAspect="1"/>
                     </pic:cNvPicPr>
                   </pic:nvPicPr>
                   <pic:blipFill>
-                    <a:blip r:embed="rId1694"/>
+                    <a:blip r:embed="rId1737"/>
                     <a:stretch>
                       <a:fillRect/>
                     </a:stretch>
@@ -3163,18 +3184,18 @@
           <wp:inline>
             <wp:extent cx="4572000" cy="3556000"/>
             <wp:effectExtent b="0" l="0" r="0" t="0"/>
-            <wp:docPr descr="Figure 8: Al-Zn phase diagram with ESPEI parameter uncertainty. The liquid and face-centred-cubic (fcc) excess parameters were refit by Markov-chain Monte Carlo to the measured liquid enthalpy of mixing (Debski et al., digitised from Dinsdale et al. [44]) and the assessed phase boundaries (Massalski [45]; Mey [39]), and the posterior was propagated through the engine. The solid line is the median liquidus and the dashed line the median fcc solvus; the shaded region is the 90 percent posterior band on each. The band is narrow on the liquidus, which the calorimetry constrains, and wider on the fcc solvus, which only the diagram constrains. The open circle is the assessed eutectic." title="" id="1698" name="Picture"/>
+            <wp:docPr descr="Figure 8: Al-Zn phase diagram with ESPEI parameter uncertainty. The liquid and face-centred-cubic (fcc) excess parameters were refit by Markov-chain Monte Carlo to the measured liquid enthalpy of mixing (Debski et al., digitised from Dinsdale et al. [44]) and the assessed phase boundaries (Massalski [45]; Mey [39]), and the posterior was propagated through the engine. The solid line is the median liquidus and the dashed line the median fcc solvus; the shaded region is the 90 percent posterior band on each. The band is narrow on the liquidus, which the calorimetry constrains, and wider on the fcc solvus, which only the diagram constrains. The open circle is the assessed eutectic." title="" id="1741" name="Picture"/>
             <a:graphic>
               <a:graphicData uri="http://schemas.openxmlformats.org/drawingml/2006/picture">
                 <pic:pic>
                   <pic:nvPicPr>
-                    <pic:cNvPr descr="figures/fig8_uq_alzn.png" id="1699" name="Picture"/>
+                    <pic:cNvPr descr="figures/fig8_uq_alzn.png" id="1742" name="Picture"/>
                     <pic:cNvPicPr>
                       <a:picLocks noChangeArrowheads="1" noChangeAspect="1"/>
                     </pic:cNvPicPr>
                   </pic:nvPicPr>
                   <pic:blipFill>
-                    <a:blip r:embed="rId1697"/>
+                    <a:blip r:embed="rId1740"/>
                     <a:stretch>
                       <a:fillRect/>
                     </a:stretch>
@@ -3214,12 +3235,12 @@
         <w:pStyle w:val="BodyText"/>
       </w:pPr>
       <w:r>
-        <w:t xml:space="preserve">The gap this work addresses was never the model, which has been published for two decades, but an open, runnable pairing of model and parameters. Hephaestus supplies both halves under open licenses and puts them behind a browser page that asks nothing of its user. The claims are checkable end to end. Release v0.5.1 archives the exact version described, and the 131-test suite reruns the pycalphad comparisons on any machine. The worked examples print the figures shown, and every parameter in every shipped database traces to a published measurement through its provenance file. A reader who doubts a number can recalculate it; one who needs a system that is missing can build it with the same open tools, or ask.</w:t>
-      </w:r>
-    </w:p>
-    <w:bookmarkEnd w:id="1700"/>
-    <w:bookmarkEnd w:id="1701"/>
-    <w:bookmarkStart w:id="1702" w:name="data-availability"/>
+        <w:t xml:space="preserve">The gap this work addresses was never the model, which has been published for two decades, but an open, runnable pairing of model and parameters. Hephaestus supplies both halves under open licenses and puts them behind a browser page that asks nothing of its user. The claims are checkable end to end. Release v0.5.2 archives the exact version described, and the 131-test suite reruns the pycalphad comparisons on any machine. The worked examples print the figures shown, and every parameter in every shipped database traces to a published measurement through its provenance file. A reader who doubts a number can recalculate it; one who needs a system that is missing can build it with the same open tools, or ask.</w:t>
+      </w:r>
+    </w:p>
+    <w:bookmarkEnd w:id="1743"/>
+    <w:bookmarkEnd w:id="1744"/>
+    <w:bookmarkStart w:id="1745" w:name="data-availability"/>
     <w:p>
       <w:pPr>
         <w:pStyle w:val="Heading2"/>
@@ -3233,11 +3254,11 @@
         <w:pStyle w:val="FirstParagraph"/>
       </w:pPr>
       <w:r>
-        <w:t xml:space="preserve">The engine, the database, the browser application, and the validation suite are openly available in the code repository listed above; the version described here is archived as release v0.5.1. The database files and their provenance records are in the repository’s data directory under CC BY 4.0.</w:t>
-      </w:r>
-    </w:p>
-    <w:bookmarkEnd w:id="1702"/>
-    <w:bookmarkStart w:id="1703" w:name="acknowledgements"/>
+        <w:t xml:space="preserve">The engine, the database, the browser application, and the validation suite are openly available in the code repository listed above; the version described here is archived as release v0.5.2. The database files and their provenance records are in the repository’s data directory under CC BY 4.0.</w:t>
+      </w:r>
+    </w:p>
+    <w:bookmarkEnd w:id="1745"/>
+    <w:bookmarkStart w:id="1746" w:name="acknowledgements"/>
     <w:p>
       <w:pPr>
         <w:pStyle w:val="Heading2"/>
@@ -3254,8 +3275,8 @@
         <w:t xml:space="preserve">During the development of this software the author used Claude Code (Anthropic) to assist with implementation, validation scripting, and manuscript preparation. This assistance was agentic, not autonomous: it operated under author direction and supervision at every step and was never a closed loop that produced or accepted results without review. Every parameter was traced by the author to its primary source before entering the database, and every reference was verified against its registry record. The author reviewed and approved all output and takes full responsibility for this article.</w:t>
       </w:r>
     </w:p>
-    <w:bookmarkEnd w:id="1703"/>
-    <w:bookmarkStart w:id="1704" w:name="funding-statement"/>
+    <w:bookmarkEnd w:id="1746"/>
+    <w:bookmarkStart w:id="1747" w:name="funding-statement"/>
     <w:p>
       <w:pPr>
         <w:pStyle w:val="Heading2"/>
@@ -3272,8 +3293,8 @@
         <w:t xml:space="preserve">The development of this software received no external funding.</w:t>
       </w:r>
     </w:p>
-    <w:bookmarkEnd w:id="1704"/>
-    <w:bookmarkStart w:id="1705" w:name="competing-interests"/>
+    <w:bookmarkEnd w:id="1747"/>
+    <w:bookmarkStart w:id="1748" w:name="competing-interests"/>
     <w:p>
       <w:pPr>
         <w:pStyle w:val="Heading2"/>
@@ -3290,8 +3311,8 @@
         <w:t xml:space="preserve">The author founded Odinzen LLC, which provides commercial thermodynamic modeling services, and declares this as a competing interest. The software and database published here are released in full under open licenses, and no proprietary Odinzen assets are included.</w:t>
       </w:r>
     </w:p>
-    <w:bookmarkEnd w:id="1705"/>
-    <w:bookmarkStart w:id="1706" w:name="references"/>
+    <w:bookmarkEnd w:id="1748"/>
+    <w:bookmarkStart w:id="1749" w:name="references"/>
     <w:p>
       <w:pPr>
         <w:pStyle w:val="Heading2"/>
@@ -3672,8 +3693,8 @@
         <w:t xml:space="preserve">[45] Massalski TB, editor. Binary Alloy Phase Diagrams. 2nd ed. Materials Park (OH): ASM International; 1990.</w:t>
       </w:r>
     </w:p>
-    <w:bookmarkEnd w:id="1706"/>
-    <w:bookmarkEnd w:id="1707"/>
+    <w:bookmarkEnd w:id="1749"/>
+    <w:bookmarkEnd w:id="1750"/>
     <w:sectPr>
       <w:footnotePr>
         <w:numRestart w:val="eachSect"/>

</xml_diff>

<commit_message>
Single release: describe v0.5.0 (the whole 0.5 line as one tag), 132 tests
Consolidates the three intermediate 0.5.x tags into one v0.5.0 on the final commit; the
manuscript version references and test count (132) match.

Co-Authored-By: Claude Opus 4.8 <noreply@anthropic.com>
</commit_message>
<xml_diff>
--- a/paper/Bustamante_Hephaestus_JORS_manuscript.docx
+++ b/paper/Bustamante_Hephaestus_JORS_manuscript.docx
@@ -2,7 +2,7 @@
 <file path=word/document.xml><?xml version="1.0" encoding="utf-8"?>
 <w:document xmlns:w="http://schemas.openxmlformats.org/wordprocessingml/2006/main" xmlns:m="http://schemas.openxmlformats.org/officeDocument/2006/math" xmlns:r="http://schemas.openxmlformats.org/officeDocument/2006/relationships" xmlns:o="urn:schemas-microsoft-com:office:office" xmlns:v="urn:schemas-microsoft-com:vml" xmlns:w10="urn:schemas-microsoft-com:office:word" xmlns:a="http://schemas.openxmlformats.org/drawingml/2006/main" xmlns:pic="http://schemas.openxmlformats.org/drawingml/2006/picture" xmlns:wp="http://schemas.openxmlformats.org/drawingml/2006/wordprocessingDrawing">
   <w:body>
-    <w:bookmarkStart w:id="1750" w:name="X4855b1162e70238fd839d871e0792397dc58430"/>
+    <w:bookmarkStart w:id="1836" w:name="X4855b1162e70238fd839d871e0792397dc58430"/>
     <w:p>
       <w:pPr>
         <w:pStyle w:val="Heading1"/>
@@ -159,7 +159,7 @@
         <w:t xml:space="preserve">CALPHAD; molten slag; molten salt; modified quasichemical model; thermodynamic database; phase diagram; gas equilibrium; WebAssembly; open data</w:t>
       </w:r>
     </w:p>
-    <w:bookmarkStart w:id="1719" w:name="overview"/>
+    <w:bookmarkStart w:id="1805" w:name="overview"/>
     <w:p>
       <w:pPr>
         <w:pStyle w:val="Heading2"/>
@@ -168,7 +168,7 @@
         <w:t xml:space="preserve">(1) Overview</w:t>
       </w:r>
     </w:p>
-    <w:bookmarkStart w:id="1706" w:name="introduction"/>
+    <w:bookmarkStart w:id="1792" w:name="introduction"/>
     <w:p>
       <w:pPr>
         <w:pStyle w:val="Heading3"/>
@@ -548,8 +548,8 @@
         <w:t xml:space="preserve">Hephaestus is a deliberate response to that gap, and it treats the engine and the data as one contribution because neither is useful alone. The engine is small on purpose. Its core is plain C with no dependencies, which makes it easy to embed and lets the identical code compile to WebAssembly, so the full calculator runs in a web browser with nothing installed and no data leaving the user’s machine. The database is open on purpose. Every parameter in it derives from published measurements, each value carries its provenance down to table and page, and the known shortcomings are documented next to the numbers they affect. The present work describes both, their validation against pycalphad and against measured phase equilibria, and the ways they can be reused. None of it asks the reader to program. For the experimentalist who never writes code, the browser application is the entire product: a page to open, a database to click, and a diagram to read. The sections that follow describe the machinery underneath for those who want it. Supplementary Material S1 is a plain-language primer for the non-programmer, starting at what a database file is and ending at a first calculation and how to read it. Its closing section teaches what an assessment is built from, so a reader who wants to contribute data for open publication, or to commission a file, arrives knowing what is needed.</w:t>
       </w:r>
     </w:p>
-    <w:bookmarkEnd w:id="1706"/>
-    <w:bookmarkStart w:id="1716" w:name="implementation-and-architecture"/>
+    <w:bookmarkEnd w:id="1792"/>
+    <w:bookmarkStart w:id="1802" w:name="implementation-and-architecture"/>
     <w:p>
       <w:pPr>
         <w:pStyle w:val="Heading3"/>
@@ -575,18 +575,18 @@
           <wp:inline>
             <wp:extent cx="5334000" cy="3511167"/>
             <wp:effectExtent b="0" l="0" r="0" t="0"/>
-            <wp:docPr descr="Figure 1: Architecture of Hephaestus. A single dependency-free C core reads the field’s three database dialects (ChemSage .dat, Thermo-Calc .tdb with the Inden magnetic model, and the unified .utdb) and calculates all thermodynamics; the same core is used as a native library, from Python through cffi, and compiled to WebAssembly behind the browser application. dbbuild writes new ChemSage files from measured data, and every energy path is validated against pycalphad." title="" id="1708" name="Picture"/>
+            <wp:docPr descr="Figure 1: Architecture of Hephaestus. A single dependency-free C core reads the field’s three database dialects (ChemSage .dat, Thermo-Calc .tdb with the Inden magnetic model, and the unified .utdb) and calculates all thermodynamics; the same core is used as a native library, from Python through cffi, and compiled to WebAssembly behind the browser application. dbbuild writes new ChemSage files from measured data, and every energy path is validated against pycalphad." title="" id="1794" name="Picture"/>
             <a:graphic>
               <a:graphicData uri="http://schemas.openxmlformats.org/drawingml/2006/picture">
                 <pic:pic>
                   <pic:nvPicPr>
-                    <pic:cNvPr descr="figures/fig1_architecture.png" id="1709" name="Picture"/>
+                    <pic:cNvPr descr="figures/fig1_architecture.png" id="1795" name="Picture"/>
                     <pic:cNvPicPr>
                       <a:picLocks noChangeArrowheads="1" noChangeAspect="1"/>
                     </pic:cNvPicPr>
                   </pic:nvPicPr>
                   <pic:blipFill>
-                    <a:blip r:embed="rId1707"/>
+                    <a:blip r:embed="rId1793"/>
                     <a:stretch>
                       <a:fillRect/>
                     </a:stretch>
@@ -814,18 +814,18 @@
           <wp:inline>
             <wp:extent cx="4754880" cy="3913308"/>
             <wp:effectExtent b="0" l="0" r="0" t="0"/>
-            <wp:docPr descr="Figure 2: The live solver in the browser application (light theme). The user loads the shipped database, picks a temperature, and presses Compute; the WebAssembly engine then solves the full FeO-MgO-SiO2 phase assemblage client side (here 861 composition samples and 595 tie-facets in about two seconds). Tapping a composition reads its stable phases and pins it to a comparison list; hovering previews on desktop." title="" id="1711" name="Picture"/>
+            <wp:docPr descr="Figure 2: The live solver in the browser application (light theme). The user loads the shipped database, picks a temperature, and presses Compute; the WebAssembly engine then solves the full FeO-MgO-SiO2 phase assemblage client side (here 861 composition samples and 595 tie-facets in about two seconds). Tapping a composition reads its stable phases and pins it to a comparison list; hovering previews on desktop." title="" id="1797" name="Picture"/>
             <a:graphic>
               <a:graphicData uri="http://schemas.openxmlformats.org/drawingml/2006/picture">
                 <pic:pic>
                   <pic:nvPicPr>
-                    <pic:cNvPr descr="figures/fig2_browser_app.png" id="1712" name="Picture"/>
+                    <pic:cNvPr descr="figures/fig2_browser_app.png" id="1798" name="Picture"/>
                     <pic:cNvPicPr>
                       <a:picLocks noChangeArrowheads="1" noChangeAspect="1"/>
                     </pic:cNvPicPr>
                   </pic:nvPicPr>
                   <pic:blipFill>
-                    <a:blip r:embed="rId1710"/>
+                    <a:blip r:embed="rId1796"/>
                     <a:stretch>
                       <a:fillRect/>
                     </a:stretch>
@@ -991,18 +991,18 @@
           <wp:inline>
             <wp:extent cx="5334000" cy="2197297"/>
             <wp:effectExtent b="0" l="0" r="0" t="0"/>
-            <wp:docPr descr="Figure 3: The assessed FeO-MgO-SiO2 system calculated from the shipped database files. (a) Liquidus projection: primary crystallizing phase fields, with liquidus isotherms labeled in °C. (b) Isothermal section at 1600 °C: stable phase assemblages, shaded by the number of solid phases present. Phase labels: L liquid, Crs cristobalite, Ol olivine, Opx orthopyroxene, Per periclase, Wus wustite." title="" id="1714" name="Picture"/>
+            <wp:docPr descr="Figure 3: The assessed FeO-MgO-SiO2 system calculated from the shipped database files. (a) Liquidus projection: primary crystallizing phase fields, with liquidus isotherms labeled in °C. (b) Isothermal section at 1600 °C: stable phase assemblages, shaded by the number of solid phases present. Phase labels: L liquid, Crs cristobalite, Ol olivine, Opx orthopyroxene, Per periclase, Wus wustite." title="" id="1800" name="Picture"/>
             <a:graphic>
               <a:graphicData uri="http://schemas.openxmlformats.org/drawingml/2006/picture">
                 <pic:pic>
                   <pic:nvPicPr>
-                    <pic:cNvPr descr="figures/fig3_ternary.png" id="1715" name="Picture"/>
+                    <pic:cNvPr descr="figures/fig3_ternary.png" id="1801" name="Picture"/>
                     <pic:cNvPicPr>
                       <a:picLocks noChangeArrowheads="1" noChangeAspect="1"/>
                     </pic:cNvPicPr>
                   </pic:nvPicPr>
                   <pic:blipFill>
-                    <a:blip r:embed="rId1713"/>
+                    <a:blip r:embed="rId1799"/>
                     <a:stretch>
                       <a:fillRect/>
                     </a:stretch>
@@ -1392,8 +1392,8 @@
         </w:tc>
       </w:tr>
     </w:tbl>
-    <w:bookmarkEnd w:id="1716"/>
-    <w:bookmarkStart w:id="1717" w:name="anatomy-of-a-database-file"/>
+    <w:bookmarkEnd w:id="1802"/>
+    <w:bookmarkStart w:id="1803" w:name="anatomy-of-a-database-file"/>
     <w:p>
       <w:pPr>
         <w:pStyle w:val="Heading3"/>
@@ -1426,8 +1426,8 @@
         <w:t xml:space="preserve">That asymmetry is the economics of the field in miniature: implementations of the published models are increasingly available, but each fitted parameter condenses dozens of measurements and decisions. Parameter sets rather than codes are therefore the scarce commodity, and an openly licensed, provenance-tracked database is the part of this contribution that cannot be regenerated from the paper alone.</w:t>
       </w:r>
     </w:p>
-    <w:bookmarkEnd w:id="1717"/>
-    <w:bookmarkStart w:id="1718" w:name="quality-control"/>
+    <w:bookmarkEnd w:id="1803"/>
+    <w:bookmarkStart w:id="1804" w:name="quality-control"/>
     <w:p>
       <w:pPr>
         <w:pStyle w:val="Heading3"/>
@@ -1441,7 +1441,7 @@
         <w:pStyle w:val="FirstParagraph"/>
       </w:pPr>
       <w:r>
-        <w:t xml:space="preserve">Validation rests on one principle. A number is trusted only when an independent implementation reproduces it. pycalphad plays that role throughout, and Table 3 lists the checks. The pytest suite, 131 tests, compares every energy contribution on shared parameters and agrees to about 10</w:t>
+        <w:t xml:space="preserve">Validation rests on one principle. A number is trusted only when an independent implementation reproduces it. pycalphad plays that role throughout, and Table 3 lists the checks. The pytest suite, 132 tests, compares every energy contribution on shared parameters and agrees to about 10</w:t>
       </w:r>
       <w:r>
         <w:rPr>
@@ -2146,12 +2146,12 @@
         <w:t xml:space="preserve"> </w:t>
       </w:r>
       <w:r>
-        <w:t xml:space="preserve">invariants sit within about 40 °C, and the ternary liquidus projection reproduces the measured field topology [24]. Development practice is plain: the repository is version controlled with tagged releases (v0.1.0 through the v0.5.2 described here), the full suite runs before every release, and a fixed bug lands together with the regression test that would have caught it. The suite runs on Windows 11 under CPython 3.11 and 3.12; the browser application is exercised in Chromium- and Gecko-based browsers. A user can confirm a working installation by running pytest against the bundled test databases, or with no installation at all by opening the web application and loading the shipped ternary database.</w:t>
-      </w:r>
-    </w:p>
-    <w:bookmarkEnd w:id="1718"/>
-    <w:bookmarkEnd w:id="1719"/>
-    <w:bookmarkStart w:id="1727" w:name="availability"/>
+        <w:t xml:space="preserve">invariants sit within about 40 °C, and the ternary liquidus projection reproduces the measured field topology [24]. Development practice is plain: the repository is version controlled with tagged releases (v0.1.0 through the v0.5.0 described here), the full suite runs before every release, and a fixed bug lands together with the regression test that would have caught it. The suite runs on Windows 11 under CPython 3.11 and 3.12; the browser application is exercised in Chromium- and Gecko-based browsers. A user can confirm a working installation by running pytest against the bundled test databases, or with no installation at all by opening the web application and loading the shipped ternary database.</w:t>
+      </w:r>
+    </w:p>
+    <w:bookmarkEnd w:id="1804"/>
+    <w:bookmarkEnd w:id="1805"/>
+    <w:bookmarkStart w:id="1813" w:name="availability"/>
     <w:p>
       <w:pPr>
         <w:pStyle w:val="Heading2"/>
@@ -2160,7 +2160,7 @@
         <w:t xml:space="preserve">(2) Availability</w:t>
       </w:r>
     </w:p>
-    <w:bookmarkStart w:id="1720" w:name="operating-system"/>
+    <w:bookmarkStart w:id="1806" w:name="operating-system"/>
     <w:p>
       <w:pPr>
         <w:pStyle w:val="Heading3"/>
@@ -2177,8 +2177,8 @@
         <w:t xml:space="preserve">Platform independent. The core builds with any C99 compiler; development and testing used Windows 11. The browser application runs in any current browser with WebAssembly support.</w:t>
       </w:r>
     </w:p>
-    <w:bookmarkEnd w:id="1720"/>
-    <w:bookmarkStart w:id="1721" w:name="programming-language"/>
+    <w:bookmarkEnd w:id="1806"/>
+    <w:bookmarkStart w:id="1807" w:name="programming-language"/>
     <w:p>
       <w:pPr>
         <w:pStyle w:val="Heading3"/>
@@ -2195,8 +2195,8 @@
         <w:t xml:space="preserve">C (core), Python 3.11 or later (interface and fitting tools), JavaScript (browser application).</w:t>
       </w:r>
     </w:p>
-    <w:bookmarkEnd w:id="1721"/>
-    <w:bookmarkStart w:id="1722" w:name="additional-system-requirements"/>
+    <w:bookmarkEnd w:id="1807"/>
+    <w:bookmarkStart w:id="1808" w:name="additional-system-requirements"/>
     <w:p>
       <w:pPr>
         <w:pStyle w:val="Heading3"/>
@@ -2213,8 +2213,8 @@
         <w:t xml:space="preserve">None of note. The engine and database together are a few megabytes.</w:t>
       </w:r>
     </w:p>
-    <w:bookmarkEnd w:id="1722"/>
-    <w:bookmarkStart w:id="1723" w:name="dependencies"/>
+    <w:bookmarkEnd w:id="1808"/>
+    <w:bookmarkStart w:id="1809" w:name="dependencies"/>
     <w:p>
       <w:pPr>
         <w:pStyle w:val="Heading3"/>
@@ -2231,8 +2231,8 @@
         <w:t xml:space="preserve">Python interface: cffi, NumPy, SciPy (developed and tested with cffi 2.0, NumPy 2.4, and SciPy 1.17). The validation suite additionally requires pycalphad; every oracle comparison reported here ran against pycalphad 0.11.1, and the tests that read pycalphad’s own shipped test databases skip cleanly if a later version relocates them. The WebAssembly build requires emscripten. The C core and the browser application have no dependencies.</w:t>
       </w:r>
     </w:p>
-    <w:bookmarkEnd w:id="1723"/>
-    <w:bookmarkStart w:id="1724" w:name="list-of-contributors"/>
+    <w:bookmarkEnd w:id="1809"/>
+    <w:bookmarkStart w:id="1810" w:name="list-of-contributors"/>
     <w:p>
       <w:pPr>
         <w:pStyle w:val="Heading3"/>
@@ -2249,8 +2249,8 @@
         <w:t xml:space="preserve">Michael E. Bustamante (design, implementation, validation, data curation).</w:t>
       </w:r>
     </w:p>
-    <w:bookmarkEnd w:id="1724"/>
-    <w:bookmarkStart w:id="1725" w:name="software-location"/>
+    <w:bookmarkEnd w:id="1810"/>
+    <w:bookmarkStart w:id="1811" w:name="software-location"/>
     <w:p>
       <w:pPr>
         <w:pStyle w:val="Heading3"/>
@@ -2292,7 +2292,7 @@
         </w:numPr>
       </w:pPr>
       <w:r>
-        <w:t xml:space="preserve">Persistent identifier: https://github.com/odinzen/hephaestus-mqmqa-public/releases/tag/v0.5.2</w:t>
+        <w:t xml:space="preserve">Persistent identifier: https://github.com/odinzen/hephaestus-mqmqa-public/releases/tag/v0.5.0</w:t>
       </w:r>
     </w:p>
     <w:p>
@@ -2328,7 +2328,7 @@
         </w:numPr>
       </w:pPr>
       <w:r>
-        <w:t xml:space="preserve">Version published: v0.5.2</w:t>
+        <w:t xml:space="preserve">Version published: v0.5.0</w:t>
       </w:r>
     </w:p>
     <w:p>
@@ -2403,8 +2403,8 @@
         <w:t xml:space="preserve">Date published: 2026-09-02</w:t>
       </w:r>
     </w:p>
-    <w:bookmarkEnd w:id="1725"/>
-    <w:bookmarkStart w:id="1726" w:name="language"/>
+    <w:bookmarkEnd w:id="1811"/>
+    <w:bookmarkStart w:id="1812" w:name="language"/>
     <w:p>
       <w:pPr>
         <w:pStyle w:val="Heading3"/>
@@ -2421,9 +2421,9 @@
         <w:t xml:space="preserve">English.</w:t>
       </w:r>
     </w:p>
-    <w:bookmarkEnd w:id="1726"/>
-    <w:bookmarkEnd w:id="1727"/>
-    <w:bookmarkStart w:id="1744" w:name="reuse-potential"/>
+    <w:bookmarkEnd w:id="1812"/>
+    <w:bookmarkEnd w:id="1813"/>
+    <w:bookmarkStart w:id="1830" w:name="reuse-potential"/>
     <w:p>
       <w:pPr>
         <w:pStyle w:val="Heading2"/>
@@ -2448,7 +2448,7 @@
         <w:t xml:space="preserve">The browser application makes the lowest barrier the default. A lecture on slag thermodynamics, a plant metallurgist screening a composition, or a reviewer checking a claimed equilibrium can load the database and calculate in seconds, with confidential inputs never leaving the machine. The same property makes it a practical template for other groups who want to publish a model as a zero-install tool.</w:t>
       </w:r>
     </w:p>
-    <w:bookmarkStart w:id="1743" w:name="worked-examples"/>
+    <w:bookmarkStart w:id="1829" w:name="worked-examples"/>
     <w:p>
       <w:pPr>
         <w:pStyle w:val="Heading3"/>
@@ -2660,18 +2660,18 @@
           <wp:inline>
             <wp:extent cx="4206240" cy="3262561"/>
             <wp:effectExtent b="0" l="0" r="0" t="0"/>
-            <wp:docPr descr="Figure 4: The LiCl-KCl phase diagram calculated by the salt listing from the shipped open database, at the listing’s own step size. Light to dark: liquid, two-phase, and subsolidus fields. The dot is the calculated eutectic at this step size (0.400, 640 K); the star is the measured eutectic (0.415, 626 K)." title="" id="1729" name="Picture"/>
+            <wp:docPr descr="Figure 4: The LiCl-KCl phase diagram calculated by the salt listing from the shipped open database, at the listing’s own step size. Light to dark: liquid, two-phase, and subsolidus fields. The dot is the calculated eutectic at this step size (0.400, 640 K); the star is the measured eutectic (0.415, 626 K)." title="" id="1815" name="Picture"/>
             <a:graphic>
               <a:graphicData uri="http://schemas.openxmlformats.org/drawingml/2006/picture">
                 <pic:pic>
                   <pic:nvPicPr>
-                    <pic:cNvPr descr="figures/fig4_salt_example.png" id="1730" name="Picture"/>
+                    <pic:cNvPr descr="figures/fig4_salt_example.png" id="1816" name="Picture"/>
                     <pic:cNvPicPr>
                       <a:picLocks noChangeArrowheads="1" noChangeAspect="1"/>
                     </pic:cNvPicPr>
                   </pic:nvPicPr>
                   <pic:blipFill>
-                    <a:blip r:embed="rId1728"/>
+                    <a:blip r:embed="rId1814"/>
                     <a:stretch>
                       <a:fillRect/>
                     </a:stretch>
@@ -2906,18 +2906,18 @@
           <wp:inline>
             <wp:extent cx="4206240" cy="3262561"/>
             <wp:effectExtent b="0" l="0" r="0" t="0"/>
-            <wp:docPr descr="Figure 5: The Al-Zn phase diagram calculated by the alloy listing from the shipped open TDB. Light to dark: liquid, liquid plus solid, and solid fields. The dot is the calculated eutectic (0.890, 660 K); the star is the assessed eutectic (0.885, 654 K)." title="" id="1732" name="Picture"/>
+            <wp:docPr descr="Figure 5: The Al-Zn phase diagram calculated by the alloy listing from the shipped open TDB. Light to dark: liquid, liquid plus solid, and solid fields. The dot is the calculated eutectic (0.890, 660 K); the star is the assessed eutectic (0.885, 654 K)." title="" id="1818" name="Picture"/>
             <a:graphic>
               <a:graphicData uri="http://schemas.openxmlformats.org/drawingml/2006/picture">
                 <pic:pic>
                   <pic:nvPicPr>
-                    <pic:cNvPr descr="figures/fig5_alloy_example.png" id="1733" name="Picture"/>
+                    <pic:cNvPr descr="figures/fig5_alloy_example.png" id="1819" name="Picture"/>
                     <pic:cNvPicPr>
                       <a:picLocks noChangeArrowheads="1" noChangeAspect="1"/>
                     </pic:cNvPicPr>
                   </pic:nvPicPr>
                   <pic:blipFill>
-                    <a:blip r:embed="rId1731"/>
+                    <a:blip r:embed="rId1817"/>
                     <a:stretch>
                       <a:fillRect/>
                     </a:stretch>
@@ -3038,18 +3038,18 @@
           <wp:inline>
             <wp:extent cx="5334000" cy="4430576"/>
             <wp:effectExtent b="0" l="0" r="0" t="0"/>
-            <wp:docPr descr="Figure 6: One unified (.utdb) file, two physics, calculated in the browser. (a) The steelmaking database loaded with the Melt/Alloy view toggle on Alloy; the engine calculates the Fe-C phase diagram through the magnetic compound energy formalism, rendered over a 0-25 mol% C composition window (the equilibrium always solves the whole join), with two tapped compositions pinned. (b) Scheil solidification for the same join at 4 mol% C, first solid at 1741 K and the residual liquid frozen by 1433 K, against the equilibrium lever-rule path (dashed). The file’s slag half is a Modified Quasichemical Model liquid; no legacy container holds both models at once." title="" id="1735" name="Picture"/>
+            <wp:docPr descr="Figure 6: One unified (.utdb) file, two physics, calculated in the browser. (a) The steelmaking database loaded with the Melt/Alloy view toggle on Alloy; the engine calculates the Fe-C phase diagram through the magnetic compound energy formalism, rendered over a 0-25 mol% C composition window (the equilibrium always solves the whole join), with two tapped compositions pinned. (b) Scheil solidification for the same join at 4 mol% C, first solid at 1741 K and the residual liquid frozen by 1433 K, against the equilibrium lever-rule path (dashed). The file’s slag half is a Modified Quasichemical Model liquid; no legacy container holds both models at once." title="" id="1821" name="Picture"/>
             <a:graphic>
               <a:graphicData uri="http://schemas.openxmlformats.org/drawingml/2006/picture">
                 <pic:pic>
                   <pic:nvPicPr>
-                    <pic:cNvPr descr="figures/fig6_utdb_steel.png" id="1736" name="Picture"/>
+                    <pic:cNvPr descr="figures/fig6_utdb_steel.png" id="1822" name="Picture"/>
                     <pic:cNvPicPr>
                       <a:picLocks noChangeArrowheads="1" noChangeAspect="1"/>
                     </pic:cNvPicPr>
                   </pic:nvPicPr>
                   <pic:blipFill>
-                    <a:blip r:embed="rId1734"/>
+                    <a:blip r:embed="rId1820"/>
                     <a:stretch>
                       <a:fillRect/>
                     </a:stretch>
@@ -3093,18 +3093,18 @@
           <wp:inline>
             <wp:extent cx="5334000" cy="2319130"/>
             <wp:effectExtent b="0" l="0" r="0" t="0"/>
-            <wp:docPr descr="Figure 7: The gas calculator as a steelmaking worked example, the equilibrium of a carbon-oxygen furnace gas by the Hephaestus gas engine (the NASA-polynomial element-potential solver compiled into the browser), with Cantera as the independent check. (a) Oxygen partial pressure against the CO to CO2 ratio at the 1873 K tap temperature: a lower ratio is more oxidizing and drives iron into the slag as FeO, a higher ratio is more reducing and decarburizes the steel. (b) The same oxygen potential against temperature for four fixed CO to CO2 buffers, showing that a given gas grows more oxidizing as it heats; the dashed line marks the tap temperature. Open circles are Cantera, agreeing to about 10-5 mole fraction across the field." title="" id="1738" name="Picture"/>
+            <wp:docPr descr="Figure 7: The gas calculator as a steelmaking worked example, the equilibrium of a carbon-oxygen furnace gas by the Hephaestus gas engine (the NASA-polynomial element-potential solver compiled into the browser), with Cantera as the independent check. (a) Oxygen partial pressure against the CO to CO2 ratio at the 1873 K tap temperature: a lower ratio is more oxidizing and drives iron into the slag as FeO, a higher ratio is more reducing and decarburizes the steel. (b) The same oxygen potential against temperature for four fixed CO to CO2 buffers, showing that a given gas grows more oxidizing as it heats; the dashed line marks the tap temperature. Open circles are Cantera, agreeing to about 10-5 mole fraction across the field." title="" id="1824" name="Picture"/>
             <a:graphic>
               <a:graphicData uri="http://schemas.openxmlformats.org/drawingml/2006/picture">
                 <pic:pic>
                   <pic:nvPicPr>
-                    <pic:cNvPr descr="figures/fig7_gas_steel.png" id="1739" name="Picture"/>
+                    <pic:cNvPr descr="figures/fig7_gas_steel.png" id="1825" name="Picture"/>
                     <pic:cNvPicPr>
                       <a:picLocks noChangeArrowheads="1" noChangeAspect="1"/>
                     </pic:cNvPicPr>
                   </pic:nvPicPr>
                   <pic:blipFill>
-                    <a:blip r:embed="rId1737"/>
+                    <a:blip r:embed="rId1823"/>
                     <a:stretch>
                       <a:fillRect/>
                     </a:stretch>
@@ -3184,18 +3184,18 @@
           <wp:inline>
             <wp:extent cx="4572000" cy="3556000"/>
             <wp:effectExtent b="0" l="0" r="0" t="0"/>
-            <wp:docPr descr="Figure 8: Al-Zn phase diagram with ESPEI parameter uncertainty. The liquid and face-centred-cubic (fcc) excess parameters were refit by Markov-chain Monte Carlo to the measured liquid enthalpy of mixing (Debski et al., digitised from Dinsdale et al. [44]) and the assessed phase boundaries (Massalski [45]; Mey [39]), and the posterior was propagated through the engine. The solid line is the median liquidus and the dashed line the median fcc solvus; the shaded region is the 90 percent posterior band on each. The band is narrow on the liquidus, which the calorimetry constrains, and wider on the fcc solvus, which only the diagram constrains. The open circle is the assessed eutectic." title="" id="1741" name="Picture"/>
+            <wp:docPr descr="Figure 8: Al-Zn phase diagram with ESPEI parameter uncertainty. The liquid and face-centred-cubic (fcc) excess parameters were refit by Markov-chain Monte Carlo to the measured liquid enthalpy of mixing (Debski et al., digitised from Dinsdale et al. [44]) and the assessed phase boundaries (Massalski [45]; Mey [39]), and the posterior was propagated through the engine. The solid line is the median liquidus and the dashed line the median fcc solvus; the shaded region is the 90 percent posterior band on each. The band is narrow on the liquidus, which the calorimetry constrains, and wider on the fcc solvus, which only the diagram constrains. The open circle is the assessed eutectic." title="" id="1827" name="Picture"/>
             <a:graphic>
               <a:graphicData uri="http://schemas.openxmlformats.org/drawingml/2006/picture">
                 <pic:pic>
                   <pic:nvPicPr>
-                    <pic:cNvPr descr="figures/fig8_uq_alzn.png" id="1742" name="Picture"/>
+                    <pic:cNvPr descr="figures/fig8_uq_alzn.png" id="1828" name="Picture"/>
                     <pic:cNvPicPr>
                       <a:picLocks noChangeArrowheads="1" noChangeAspect="1"/>
                     </pic:cNvPicPr>
                   </pic:nvPicPr>
                   <pic:blipFill>
-                    <a:blip r:embed="rId1740"/>
+                    <a:blip r:embed="rId1826"/>
                     <a:stretch>
                       <a:fillRect/>
                     </a:stretch>
@@ -3235,12 +3235,12 @@
         <w:pStyle w:val="BodyText"/>
       </w:pPr>
       <w:r>
-        <w:t xml:space="preserve">The gap this work addresses was never the model, which has been published for two decades, but an open, runnable pairing of model and parameters. Hephaestus supplies both halves under open licenses and puts them behind a browser page that asks nothing of its user. The claims are checkable end to end. Release v0.5.2 archives the exact version described, and the 131-test suite reruns the pycalphad comparisons on any machine. The worked examples print the figures shown, and every parameter in every shipped database traces to a published measurement through its provenance file. A reader who doubts a number can recalculate it; one who needs a system that is missing can build it with the same open tools, or ask.</w:t>
-      </w:r>
-    </w:p>
-    <w:bookmarkEnd w:id="1743"/>
-    <w:bookmarkEnd w:id="1744"/>
-    <w:bookmarkStart w:id="1745" w:name="data-availability"/>
+        <w:t xml:space="preserve">The gap this work addresses was never the model, which has been published for two decades, but an open, runnable pairing of model and parameters. Hephaestus supplies both halves under open licenses and puts them behind a browser page that asks nothing of its user. The claims are checkable end to end. Release v0.5.0 archives the exact version described, and the 132-test suite reruns the pycalphad comparisons on any machine. The worked examples print the figures shown, and every parameter in every shipped database traces to a published measurement through its provenance file. A reader who doubts a number can recalculate it; one who needs a system that is missing can build it with the same open tools, or ask.</w:t>
+      </w:r>
+    </w:p>
+    <w:bookmarkEnd w:id="1829"/>
+    <w:bookmarkEnd w:id="1830"/>
+    <w:bookmarkStart w:id="1831" w:name="data-availability"/>
     <w:p>
       <w:pPr>
         <w:pStyle w:val="Heading2"/>
@@ -3254,11 +3254,11 @@
         <w:pStyle w:val="FirstParagraph"/>
       </w:pPr>
       <w:r>
-        <w:t xml:space="preserve">The engine, the database, the browser application, and the validation suite are openly available in the code repository listed above; the version described here is archived as release v0.5.2. The database files and their provenance records are in the repository’s data directory under CC BY 4.0.</w:t>
-      </w:r>
-    </w:p>
-    <w:bookmarkEnd w:id="1745"/>
-    <w:bookmarkStart w:id="1746" w:name="acknowledgements"/>
+        <w:t xml:space="preserve">The engine, the database, the browser application, and the validation suite are openly available in the code repository listed above; the version described here is archived as release v0.5.0. The database files and their provenance records are in the repository’s data directory under CC BY 4.0.</w:t>
+      </w:r>
+    </w:p>
+    <w:bookmarkEnd w:id="1831"/>
+    <w:bookmarkStart w:id="1832" w:name="acknowledgements"/>
     <w:p>
       <w:pPr>
         <w:pStyle w:val="Heading2"/>
@@ -3275,8 +3275,8 @@
         <w:t xml:space="preserve">During the development of this software the author used Claude Code (Anthropic) to assist with implementation, validation scripting, and manuscript preparation. This assistance was agentic, not autonomous: it operated under author direction and supervision at every step and was never a closed loop that produced or accepted results without review. Every parameter was traced by the author to its primary source before entering the database, and every reference was verified against its registry record. The author reviewed and approved all output and takes full responsibility for this article.</w:t>
       </w:r>
     </w:p>
-    <w:bookmarkEnd w:id="1746"/>
-    <w:bookmarkStart w:id="1747" w:name="funding-statement"/>
+    <w:bookmarkEnd w:id="1832"/>
+    <w:bookmarkStart w:id="1833" w:name="funding-statement"/>
     <w:p>
       <w:pPr>
         <w:pStyle w:val="Heading2"/>
@@ -3293,8 +3293,8 @@
         <w:t xml:space="preserve">The development of this software received no external funding.</w:t>
       </w:r>
     </w:p>
-    <w:bookmarkEnd w:id="1747"/>
-    <w:bookmarkStart w:id="1748" w:name="competing-interests"/>
+    <w:bookmarkEnd w:id="1833"/>
+    <w:bookmarkStart w:id="1834" w:name="competing-interests"/>
     <w:p>
       <w:pPr>
         <w:pStyle w:val="Heading2"/>
@@ -3311,8 +3311,8 @@
         <w:t xml:space="preserve">The author founded Odinzen LLC, which provides commercial thermodynamic modeling services, and declares this as a competing interest. The software and database published here are released in full under open licenses, and no proprietary Odinzen assets are included.</w:t>
       </w:r>
     </w:p>
-    <w:bookmarkEnd w:id="1748"/>
-    <w:bookmarkStart w:id="1749" w:name="references"/>
+    <w:bookmarkEnd w:id="1834"/>
+    <w:bookmarkStart w:id="1835" w:name="references"/>
     <w:p>
       <w:pPr>
         <w:pStyle w:val="Heading2"/>
@@ -3693,8 +3693,8 @@
         <w:t xml:space="preserve">[45] Massalski TB, editor. Binary Alloy Phase Diagrams. 2nd ed. Materials Park (OH): ASM International; 1990.</w:t>
       </w:r>
     </w:p>
-    <w:bookmarkEnd w:id="1749"/>
-    <w:bookmarkEnd w:id="1750"/>
+    <w:bookmarkEnd w:id="1835"/>
+    <w:bookmarkEnd w:id="1836"/>
     <w:sectPr>
       <w:footnotePr>
         <w:numRestart w:val="eachSect"/>

</xml_diff>

<commit_message>
Converged ESPEI chain and regenerated Figure 8
Reran the Al-Zn MCMC as a wider, longer ensemble (18 walkers x 1500 steps) so the posterior
is properly converged: Gelman-Rubin R-hat at most 1.04 on all three parameters, effective
sample size of order 400 (was ~100), 13500 posterior samples. The reported diagnostics are
updated accordingly; the posterior is close to before (liquid L0 ~10.4 kJ/mol, fcc L0 ~6.1
kJ/mol), so the band's character is unchanged.

Regenerated Figure 8 from the converged trace and, in the same pass, brought it in line with
the Kelvin-throughout decision and Kristina's no-in-figure-title rule: the axis is now in K
and the baked "Al-Zn diagram..." title is removed (the caption carries it).

Reading copies rebuilt, Argus gate green.

Co-Authored-By: Claude Opus 4.8 <noreply@anthropic.com>
</commit_message>
<xml_diff>
--- a/paper/Bustamante_Hephaestus_JORS_manuscript.docx
+++ b/paper/Bustamante_Hephaestus_JORS_manuscript.docx
@@ -2,7 +2,7 @@
 <file path=word/document.xml><?xml version="1.0" encoding="utf-8"?>
 <w:document xmlns:w="http://schemas.openxmlformats.org/wordprocessingml/2006/main" xmlns:m="http://schemas.openxmlformats.org/officeDocument/2006/math" xmlns:r="http://schemas.openxmlformats.org/officeDocument/2006/relationships" xmlns:o="urn:schemas-microsoft-com:office:office" xmlns:v="urn:schemas-microsoft-com:vml" xmlns:w10="urn:schemas-microsoft-com:office:word" xmlns:a="http://schemas.openxmlformats.org/drawingml/2006/main" xmlns:pic="http://schemas.openxmlformats.org/drawingml/2006/picture" xmlns:wp="http://schemas.openxmlformats.org/drawingml/2006/wordprocessingDrawing">
   <w:body>
-    <w:bookmarkStart w:id="1922" w:name="X4855b1162e70238fd839d871e0792397dc58430"/>
+    <w:bookmarkStart w:id="1965" w:name="X4855b1162e70238fd839d871e0792397dc58430"/>
     <w:p>
       <w:pPr>
         <w:pStyle w:val="Heading1"/>
@@ -159,7 +159,7 @@
         <w:t xml:space="preserve">CALPHAD; molten slag; molten salt; modified quasichemical model; thermodynamic database; phase diagram; gas equilibrium; WebAssembly; open data</w:t>
       </w:r>
     </w:p>
-    <w:bookmarkStart w:id="1891" w:name="overview"/>
+    <w:bookmarkStart w:id="1934" w:name="overview"/>
     <w:p>
       <w:pPr>
         <w:pStyle w:val="Heading2"/>
@@ -168,7 +168,7 @@
         <w:t xml:space="preserve">(1) Overview</w:t>
       </w:r>
     </w:p>
-    <w:bookmarkStart w:id="1878" w:name="introduction"/>
+    <w:bookmarkStart w:id="1921" w:name="introduction"/>
     <w:p>
       <w:pPr>
         <w:pStyle w:val="Heading3"/>
@@ -548,8 +548,8 @@
         <w:t xml:space="preserve">Hephaestus is a deliberate response to that gap, and it treats the engine and the data as one contribution because neither is useful alone. The engine is small on purpose. Its core is plain C with no dependencies, which makes it easy to embed and lets the identical code compile to WebAssembly, so the full calculator runs in a web browser with nothing installed and no data leaving the user’s machine. The database is open on purpose. Every parameter in it derives from published measurements, each value carries its provenance down to table and page, and the known shortcomings are documented next to the numbers they affect. The present work describes both, their validation against pycalphad and against measured phase equilibria, and the ways they can be reused. None of it asks the reader to program. For the experimentalist who never writes code, the browser application is the entire product: a page to open, a database to click, and a diagram to read. The sections that follow describe the machinery underneath for those who want it. Supplementary Material S1 is a plain-language primer for the non-programmer, starting at what a database file is and ending at a first calculation and how to read it. Its closing section teaches what an assessment is built from, so a reader who wants to contribute data for open publication, or to commission a file, arrives knowing what is needed.</w:t>
       </w:r>
     </w:p>
-    <w:bookmarkEnd w:id="1878"/>
-    <w:bookmarkStart w:id="1888" w:name="implementation-and-architecture"/>
+    <w:bookmarkEnd w:id="1921"/>
+    <w:bookmarkStart w:id="1931" w:name="implementation-and-architecture"/>
     <w:p>
       <w:pPr>
         <w:pStyle w:val="Heading3"/>
@@ -575,18 +575,18 @@
           <wp:inline>
             <wp:extent cx="5334000" cy="3511167"/>
             <wp:effectExtent b="0" l="0" r="0" t="0"/>
-            <wp:docPr descr="Figure 1: Architecture of Hephaestus. A single dependency-free C core reads the field’s three database dialects (ChemSage .dat, Thermo-Calc .tdb with the Inden magnetic model, and the unified .utdb) and calculates all thermodynamics; the same core is used as a native library, from Python through cffi, and compiled to WebAssembly behind the browser application. dbbuild writes new ChemSage files from measured data, and every energy path is validated against pycalphad." title="" id="1880" name="Picture"/>
+            <wp:docPr descr="Figure 1: Architecture of Hephaestus. A single dependency-free C core reads the field’s three database dialects (ChemSage .dat, Thermo-Calc .tdb with the Inden magnetic model, and the unified .utdb) and calculates all thermodynamics; the same core is used as a native library, from Python through cffi, and compiled to WebAssembly behind the browser application. dbbuild writes new ChemSage files from measured data, and every energy path is validated against pycalphad." title="" id="1923" name="Picture"/>
             <a:graphic>
               <a:graphicData uri="http://schemas.openxmlformats.org/drawingml/2006/picture">
                 <pic:pic>
                   <pic:nvPicPr>
-                    <pic:cNvPr descr="figures/fig1_architecture.png" id="1881" name="Picture"/>
+                    <pic:cNvPr descr="figures/fig1_architecture.png" id="1924" name="Picture"/>
                     <pic:cNvPicPr>
                       <a:picLocks noChangeArrowheads="1" noChangeAspect="1"/>
                     </pic:cNvPicPr>
                   </pic:nvPicPr>
                   <pic:blipFill>
-                    <a:blip r:embed="rId1879"/>
+                    <a:blip r:embed="rId1922"/>
                     <a:stretch>
                       <a:fillRect/>
                     </a:stretch>
@@ -814,18 +814,18 @@
           <wp:inline>
             <wp:extent cx="4754880" cy="3913308"/>
             <wp:effectExtent b="0" l="0" r="0" t="0"/>
-            <wp:docPr descr="Figure 2: The live solver in the browser application (light theme). The user loads the shipped database, picks a temperature, and presses Compute; the WebAssembly engine then solves the full FeO-MgO-SiO2 phase assemblage client side (here 861 composition samples and 595 tie-facets in about two seconds). Tapping a composition reads its stable phases and pins it to a comparison list; hovering previews on desktop." title="" id="1883" name="Picture"/>
+            <wp:docPr descr="Figure 2: The live solver in the browser application (light theme). The user loads the shipped database, picks a temperature, and presses Compute; the WebAssembly engine then solves the full FeO-MgO-SiO2 phase assemblage client side (here 861 composition samples and 595 tie-facets in about two seconds). Tapping a composition reads its stable phases and pins it to a comparison list; hovering previews on desktop." title="" id="1926" name="Picture"/>
             <a:graphic>
               <a:graphicData uri="http://schemas.openxmlformats.org/drawingml/2006/picture">
                 <pic:pic>
                   <pic:nvPicPr>
-                    <pic:cNvPr descr="figures/fig2_browser_app.png" id="1884" name="Picture"/>
+                    <pic:cNvPr descr="figures/fig2_browser_app.png" id="1927" name="Picture"/>
                     <pic:cNvPicPr>
                       <a:picLocks noChangeArrowheads="1" noChangeAspect="1"/>
                     </pic:cNvPicPr>
                   </pic:nvPicPr>
                   <pic:blipFill>
-                    <a:blip r:embed="rId1882"/>
+                    <a:blip r:embed="rId1925"/>
                     <a:stretch>
                       <a:fillRect/>
                     </a:stretch>
@@ -991,18 +991,18 @@
           <wp:inline>
             <wp:extent cx="5334000" cy="2197297"/>
             <wp:effectExtent b="0" l="0" r="0" t="0"/>
-            <wp:docPr descr="Figure 3: The assessed FeO-MgO-SiO2 system calculated from the shipped database files. (a) Liquidus projection: primary crystallizing phase fields, with liquidus isotherms labeled in K. (b) Isothermal section at 1873 K: stable phase assemblages, shaded by the number of solid phases present. Phase labels: L liquid, Crs cristobalite, Ol olivine, Opx orthopyroxene, Per periclase, Wus wustite." title="" id="1886" name="Picture"/>
+            <wp:docPr descr="Figure 3: The assessed FeO-MgO-SiO2 system calculated from the shipped database files. (a) Liquidus projection: primary crystallizing phase fields, with liquidus isotherms labeled in K. (b) Isothermal section at 1873 K: stable phase assemblages, shaded by the number of solid phases present. Phase labels: L liquid, Crs cristobalite, Ol olivine, Opx orthopyroxene, Per periclase, Wus wustite." title="" id="1929" name="Picture"/>
             <a:graphic>
               <a:graphicData uri="http://schemas.openxmlformats.org/drawingml/2006/picture">
                 <pic:pic>
                   <pic:nvPicPr>
-                    <pic:cNvPr descr="figures/fig3_ternary.png" id="1887" name="Picture"/>
+                    <pic:cNvPr descr="figures/fig3_ternary.png" id="1930" name="Picture"/>
                     <pic:cNvPicPr>
                       <a:picLocks noChangeArrowheads="1" noChangeAspect="1"/>
                     </pic:cNvPicPr>
                   </pic:nvPicPr>
                   <pic:blipFill>
-                    <a:blip r:embed="rId1885"/>
+                    <a:blip r:embed="rId1928"/>
                     <a:stretch>
                       <a:fillRect/>
                     </a:stretch>
@@ -1392,8 +1392,8 @@
         </w:tc>
       </w:tr>
     </w:tbl>
-    <w:bookmarkEnd w:id="1888"/>
-    <w:bookmarkStart w:id="1889" w:name="anatomy-of-a-database-file"/>
+    <w:bookmarkEnd w:id="1931"/>
+    <w:bookmarkStart w:id="1932" w:name="anatomy-of-a-database-file"/>
     <w:p>
       <w:pPr>
         <w:pStyle w:val="Heading3"/>
@@ -1426,8 +1426,8 @@
         <w:t xml:space="preserve">That asymmetry is the economics of the field in miniature: implementations of the published models are increasingly available, but each fitted parameter condenses dozens of measurements and decisions. Parameter sets rather than codes are therefore the scarce commodity, and an openly licensed, provenance-tracked database is the part of this contribution that cannot be regenerated from the paper alone.</w:t>
       </w:r>
     </w:p>
-    <w:bookmarkEnd w:id="1889"/>
-    <w:bookmarkStart w:id="1890" w:name="quality-control"/>
+    <w:bookmarkEnd w:id="1932"/>
+    <w:bookmarkStart w:id="1933" w:name="quality-control"/>
     <w:p>
       <w:pPr>
         <w:pStyle w:val="Heading3"/>
@@ -2149,9 +2149,9 @@
         <w:t xml:space="preserve">invariants sit within about 40 K, and the ternary liquidus projection reproduces the measured field topology [24]. Development practice is plain: the repository is version controlled with tagged releases (v0.1.0 through the v0.5.0 described here), the full suite runs before every release, and a fixed bug lands together with the regression test that would have caught it. The suite runs on Windows 11 under CPython 3.11 and 3.12; the browser application is exercised in Chromium- and Gecko-based browsers. A user can confirm a working installation by running pytest against the bundled test databases, or with no installation at all by opening the web application and loading the shipped ternary database.</w:t>
       </w:r>
     </w:p>
-    <w:bookmarkEnd w:id="1890"/>
-    <w:bookmarkEnd w:id="1891"/>
-    <w:bookmarkStart w:id="1899" w:name="availability"/>
+    <w:bookmarkEnd w:id="1933"/>
+    <w:bookmarkEnd w:id="1934"/>
+    <w:bookmarkStart w:id="1942" w:name="availability"/>
     <w:p>
       <w:pPr>
         <w:pStyle w:val="Heading2"/>
@@ -2160,7 +2160,7 @@
         <w:t xml:space="preserve">(2) Availability</w:t>
       </w:r>
     </w:p>
-    <w:bookmarkStart w:id="1892" w:name="operating-system"/>
+    <w:bookmarkStart w:id="1935" w:name="operating-system"/>
     <w:p>
       <w:pPr>
         <w:pStyle w:val="Heading3"/>
@@ -2177,8 +2177,8 @@
         <w:t xml:space="preserve">Platform independent. The core builds with any C99 compiler; development and testing used Windows 11. The browser application runs in any current browser with WebAssembly support.</w:t>
       </w:r>
     </w:p>
-    <w:bookmarkEnd w:id="1892"/>
-    <w:bookmarkStart w:id="1893" w:name="programming-language"/>
+    <w:bookmarkEnd w:id="1935"/>
+    <w:bookmarkStart w:id="1936" w:name="programming-language"/>
     <w:p>
       <w:pPr>
         <w:pStyle w:val="Heading3"/>
@@ -2195,8 +2195,8 @@
         <w:t xml:space="preserve">C (core), Python 3.11 or later (interface and fitting tools), JavaScript (browser application).</w:t>
       </w:r>
     </w:p>
-    <w:bookmarkEnd w:id="1893"/>
-    <w:bookmarkStart w:id="1894" w:name="additional-system-requirements"/>
+    <w:bookmarkEnd w:id="1936"/>
+    <w:bookmarkStart w:id="1937" w:name="additional-system-requirements"/>
     <w:p>
       <w:pPr>
         <w:pStyle w:val="Heading3"/>
@@ -2213,8 +2213,8 @@
         <w:t xml:space="preserve">None of note. The engine and database together are a few megabytes.</w:t>
       </w:r>
     </w:p>
-    <w:bookmarkEnd w:id="1894"/>
-    <w:bookmarkStart w:id="1895" w:name="dependencies"/>
+    <w:bookmarkEnd w:id="1937"/>
+    <w:bookmarkStart w:id="1938" w:name="dependencies"/>
     <w:p>
       <w:pPr>
         <w:pStyle w:val="Heading3"/>
@@ -2231,8 +2231,8 @@
         <w:t xml:space="preserve">Python interface: cffi, NumPy, SciPy (developed and tested with cffi 2.0, NumPy 2.4, and SciPy 1.17). The validation suite additionally requires pycalphad; every oracle comparison reported here ran against pycalphad 0.11.1, and the tests that read pycalphad’s own shipped test databases skip cleanly if a later version relocates them. The WebAssembly build requires emscripten. The C core and the browser application have no dependencies.</w:t>
       </w:r>
     </w:p>
-    <w:bookmarkEnd w:id="1895"/>
-    <w:bookmarkStart w:id="1896" w:name="list-of-contributors"/>
+    <w:bookmarkEnd w:id="1938"/>
+    <w:bookmarkStart w:id="1939" w:name="list-of-contributors"/>
     <w:p>
       <w:pPr>
         <w:pStyle w:val="Heading3"/>
@@ -2249,8 +2249,8 @@
         <w:t xml:space="preserve">Michael E. Bustamante (design, implementation, validation, data curation).</w:t>
       </w:r>
     </w:p>
-    <w:bookmarkEnd w:id="1896"/>
-    <w:bookmarkStart w:id="1897" w:name="software-location"/>
+    <w:bookmarkEnd w:id="1939"/>
+    <w:bookmarkStart w:id="1940" w:name="software-location"/>
     <w:p>
       <w:pPr>
         <w:pStyle w:val="Heading3"/>
@@ -2403,8 +2403,8 @@
         <w:t xml:space="preserve">Date published: 2026-09-02</w:t>
       </w:r>
     </w:p>
-    <w:bookmarkEnd w:id="1897"/>
-    <w:bookmarkStart w:id="1898" w:name="language"/>
+    <w:bookmarkEnd w:id="1940"/>
+    <w:bookmarkStart w:id="1941" w:name="language"/>
     <w:p>
       <w:pPr>
         <w:pStyle w:val="Heading3"/>
@@ -2421,9 +2421,9 @@
         <w:t xml:space="preserve">English.</w:t>
       </w:r>
     </w:p>
-    <w:bookmarkEnd w:id="1898"/>
-    <w:bookmarkEnd w:id="1899"/>
-    <w:bookmarkStart w:id="1916" w:name="reuse-potential"/>
+    <w:bookmarkEnd w:id="1941"/>
+    <w:bookmarkEnd w:id="1942"/>
+    <w:bookmarkStart w:id="1959" w:name="reuse-potential"/>
     <w:p>
       <w:pPr>
         <w:pStyle w:val="Heading2"/>
@@ -2448,7 +2448,7 @@
         <w:t xml:space="preserve">The browser application makes the lowest barrier the default. A lecture on slag thermodynamics, a plant metallurgist screening a composition, or a reviewer checking a claimed equilibrium can load the database and calculate in seconds, with confidential inputs never leaving the machine. The same property makes it a practical template for other groups who want to publish a model as a zero-install tool.</w:t>
       </w:r>
     </w:p>
-    <w:bookmarkStart w:id="1915" w:name="worked-examples"/>
+    <w:bookmarkStart w:id="1958" w:name="worked-examples"/>
     <w:p>
       <w:pPr>
         <w:pStyle w:val="Heading3"/>
@@ -2660,18 +2660,18 @@
           <wp:inline>
             <wp:extent cx="4206240" cy="3262561"/>
             <wp:effectExtent b="0" l="0" r="0" t="0"/>
-            <wp:docPr descr="Figure 4: The LiCl-KCl phase diagram calculated by the salt listing from the shipped open database, at the listing’s own step size. Light to dark: liquid, two-phase, and subsolidus fields. The dot is the calculated eutectic at this step size (0.400, 640 K); the star is the measured eutectic (0.415, 626 K)." title="" id="1901" name="Picture"/>
+            <wp:docPr descr="Figure 4: The LiCl-KCl phase diagram calculated by the salt listing from the shipped open database, at the listing’s own step size. Light to dark: liquid, two-phase, and subsolidus fields. The dot is the calculated eutectic at this step size (0.400, 640 K); the star is the measured eutectic (0.415, 626 K)." title="" id="1944" name="Picture"/>
             <a:graphic>
               <a:graphicData uri="http://schemas.openxmlformats.org/drawingml/2006/picture">
                 <pic:pic>
                   <pic:nvPicPr>
-                    <pic:cNvPr descr="figures/fig4_salt_example.png" id="1902" name="Picture"/>
+                    <pic:cNvPr descr="figures/fig4_salt_example.png" id="1945" name="Picture"/>
                     <pic:cNvPicPr>
                       <a:picLocks noChangeArrowheads="1" noChangeAspect="1"/>
                     </pic:cNvPicPr>
                   </pic:nvPicPr>
                   <pic:blipFill>
-                    <a:blip r:embed="rId1900"/>
+                    <a:blip r:embed="rId1943"/>
                     <a:stretch>
                       <a:fillRect/>
                     </a:stretch>
@@ -2906,18 +2906,18 @@
           <wp:inline>
             <wp:extent cx="4206240" cy="3262561"/>
             <wp:effectExtent b="0" l="0" r="0" t="0"/>
-            <wp:docPr descr="Figure 5: The Al-Zn phase diagram calculated by the alloy listing from the shipped open TDB. Light to dark: liquid, liquid plus solid, and solid fields. The dot is the calculated eutectic (0.890, 660 K); the star is the assessed eutectic (0.885, 654 K)." title="" id="1904" name="Picture"/>
+            <wp:docPr descr="Figure 5: The Al-Zn phase diagram calculated by the alloy listing from the shipped open TDB. Light to dark: liquid, liquid plus solid, and solid fields. The dot is the calculated eutectic (0.890, 660 K); the star is the assessed eutectic (0.885, 654 K)." title="" id="1947" name="Picture"/>
             <a:graphic>
               <a:graphicData uri="http://schemas.openxmlformats.org/drawingml/2006/picture">
                 <pic:pic>
                   <pic:nvPicPr>
-                    <pic:cNvPr descr="figures/fig5_alloy_example.png" id="1905" name="Picture"/>
+                    <pic:cNvPr descr="figures/fig5_alloy_example.png" id="1948" name="Picture"/>
                     <pic:cNvPicPr>
                       <a:picLocks noChangeArrowheads="1" noChangeAspect="1"/>
                     </pic:cNvPicPr>
                   </pic:nvPicPr>
                   <pic:blipFill>
-                    <a:blip r:embed="rId1903"/>
+                    <a:blip r:embed="rId1946"/>
                     <a:stretch>
                       <a:fillRect/>
                     </a:stretch>
@@ -3026,7 +3026,7 @@
         <w:t xml:space="preserve"> </w:t>
       </w:r>
       <w:r>
-        <w:t xml:space="preserve">ratio of a carbon-oxygen gas fixes the oxygen partial pressure that decides whether carbon is removed from the steel or iron is oxidized into the slag, both at the 1873 K tap temperature and across the steelmaking range, with the gas engine reproducing Cantera throughout. The same engine also carries parameter uncertainty to the diagram. Refitting the Al-Zn liquid and face-centred-cubic excess parameters against the measured liquid enthalpy of mixing and the assessed phase boundaries [39, 44, 45] by Markov-chain Monte Carlo, and propagating the posterior through the browser calculation, produces the confidence band of Figure 8. Three excess coefficients were sampled, the liquid enthalpy and its temperature term and the face-centred-cubic enthalpy, by an ensemble of six walkers over 1500 steps under ESPEI’s default equal dataset weighting, discarding the first half as burn-in; the walker-mean chains are stationary, their between- and within-chain variances agree to within ten percent (Gelman-Rubin R-hat at most 1.1), the effective sample size is of order 100, and no pair of parameters correlates above about 0.6. Because only these three excess terms are varied while the SGTE unary functions and the phases not being refitted are held at their assessed values, the band is the parametric posterior within the adopted model, not a total thermodynamic uncertainty. Read that way it is still informative: the liquidus band is narrow because the calorimetry pins the liquid interaction, while the solid-solubility band is wider because only the phase diagram constrains the corresponding parameter, an honest reflection of which measurements do the work. Relative to the XML road of XTDB [15] (Table 1), uTDB is the on-ramp from the installed base, extending files as they are and running in this engine today, with mechanical conversion to XTDB elements the natural bridge once that schema settles. Making the calculator multilingual across the field’s file dialects is the direction of travel. Contributions and issues are handled through the GitHub repository.</w:t>
+        <w:t xml:space="preserve">ratio of a carbon-oxygen gas fixes the oxygen partial pressure that decides whether carbon is removed from the steel or iron is oxidized into the slag, both at the 1873 K tap temperature and across the steelmaking range, with the gas engine reproducing Cantera throughout. The same engine also carries parameter uncertainty to the diagram. Refitting the Al-Zn liquid and face-centred-cubic excess parameters against the measured liquid enthalpy of mixing and the assessed phase boundaries [39, 44, 45] by Markov-chain Monte Carlo, and propagating the posterior through the browser calculation, produces the confidence band of Figure 8. Three excess coefficients were sampled, the liquid enthalpy and its temperature term and the face-centred-cubic enthalpy, by an ensemble of eighteen walkers over 1500 steps under ESPEI’s default equal dataset weighting, discarding the first half as burn-in; the walker-mean chains are stationary and well mixed (Gelman-Rubin R-hat at most 1.04), the effective sample size is of order 400, and no pair of parameters correlates above about 0.65. Because only these three excess terms are varied while the SGTE unary functions and the phases not being refitted are held at their assessed values, the band is the parametric posterior within the adopted model, not a total thermodynamic uncertainty. Read that way it is still informative: the liquidus band is narrow because the calorimetry pins the liquid interaction, while the solid-solubility band is wider because only the phase diagram constrains the corresponding parameter, an honest reflection of which measurements do the work. Relative to the XML road of XTDB [15] (Table 1), uTDB is the on-ramp from the installed base, extending files as they are and running in this engine today, with mechanical conversion to XTDB elements the natural bridge once that schema settles. Making the calculator multilingual across the field’s file dialects is the direction of travel. Contributions and issues are handled through the GitHub repository.</w:t>
       </w:r>
     </w:p>
     <w:p>
@@ -3038,18 +3038,18 @@
           <wp:inline>
             <wp:extent cx="5334000" cy="4430576"/>
             <wp:effectExtent b="0" l="0" r="0" t="0"/>
-            <wp:docPr descr="Figure 6: One unified (.utdb) file, two physics, calculated in the browser. (a) The steelmaking database loaded with the Melt/Alloy view toggle on Alloy; the engine calculates the Fe-C phase diagram through the magnetic compound energy formalism, rendered over a 0-25 mol% C composition window (the equilibrium always solves the whole join), with two tapped compositions pinned. (b) Scheil solidification for the same join at 4 mol% C, first solid at 1741 K and the residual liquid frozen by 1433 K, against the equilibrium lever-rule path (dashed). The file’s slag half is a Modified Quasichemical Model liquid; no legacy container holds both models at once." title="" id="1907" name="Picture"/>
+            <wp:docPr descr="Figure 6: One unified (.utdb) file, two physics, calculated in the browser. (a) The steelmaking database loaded with the Melt/Alloy view toggle on Alloy; the engine calculates the Fe-C phase diagram through the magnetic compound energy formalism, rendered over a 0-25 mol% C composition window (the equilibrium always solves the whole join), with two tapped compositions pinned. (b) Scheil solidification for the same join at 4 mol% C, first solid at 1741 K and the residual liquid frozen by 1433 K, against the equilibrium lever-rule path (dashed). The file’s slag half is a Modified Quasichemical Model liquid; no legacy container holds both models at once." title="" id="1950" name="Picture"/>
             <a:graphic>
               <a:graphicData uri="http://schemas.openxmlformats.org/drawingml/2006/picture">
                 <pic:pic>
                   <pic:nvPicPr>
-                    <pic:cNvPr descr="figures/fig6_utdb_steel.png" id="1908" name="Picture"/>
+                    <pic:cNvPr descr="figures/fig6_utdb_steel.png" id="1951" name="Picture"/>
                     <pic:cNvPicPr>
                       <a:picLocks noChangeArrowheads="1" noChangeAspect="1"/>
                     </pic:cNvPicPr>
                   </pic:nvPicPr>
                   <pic:blipFill>
-                    <a:blip r:embed="rId1906"/>
+                    <a:blip r:embed="rId1949"/>
                     <a:stretch>
                       <a:fillRect/>
                     </a:stretch>
@@ -3093,18 +3093,18 @@
           <wp:inline>
             <wp:extent cx="5334000" cy="2319130"/>
             <wp:effectExtent b="0" l="0" r="0" t="0"/>
-            <wp:docPr descr="Figure 7: The gas calculator as a steelmaking worked example, the equilibrium of a carbon-oxygen furnace gas by the Hephaestus gas engine (the NASA-polynomial element-potential solver compiled into the browser), with Cantera as the independent check. (a) Oxygen partial pressure against the CO to CO2 ratio at the 1873 K tap temperature: a lower ratio is more oxidizing and drives iron into the slag as FeO, a higher ratio is more reducing and decarburizes the steel. (b) The same oxygen potential against temperature for four fixed CO to CO2 buffers, showing that a given gas grows more oxidizing as it heats; the dashed line marks the tap temperature. Open circles are Cantera, agreeing to about 10-5 mole fraction across the field." title="" id="1910" name="Picture"/>
+            <wp:docPr descr="Figure 7: The gas calculator as a steelmaking worked example, the equilibrium of a carbon-oxygen furnace gas by the Hephaestus gas engine (the NASA-polynomial element-potential solver compiled into the browser), with Cantera as the independent check. (a) Oxygen partial pressure against the CO to CO2 ratio at the 1873 K tap temperature: a lower ratio is more oxidizing and drives iron into the slag as FeO, a higher ratio is more reducing and decarburizes the steel. (b) The same oxygen potential against temperature for four fixed CO to CO2 buffers, showing that a given gas grows more oxidizing as it heats; the dashed line marks the tap temperature. Open circles are Cantera, agreeing to about 10-5 mole fraction across the field." title="" id="1953" name="Picture"/>
             <a:graphic>
               <a:graphicData uri="http://schemas.openxmlformats.org/drawingml/2006/picture">
                 <pic:pic>
                   <pic:nvPicPr>
-                    <pic:cNvPr descr="figures/fig7_gas_steel.png" id="1911" name="Picture"/>
+                    <pic:cNvPr descr="figures/fig7_gas_steel.png" id="1954" name="Picture"/>
                     <pic:cNvPicPr>
                       <a:picLocks noChangeArrowheads="1" noChangeAspect="1"/>
                     </pic:cNvPicPr>
                   </pic:nvPicPr>
                   <pic:blipFill>
-                    <a:blip r:embed="rId1909"/>
+                    <a:blip r:embed="rId1952"/>
                     <a:stretch>
                       <a:fillRect/>
                     </a:stretch>
@@ -3184,18 +3184,18 @@
           <wp:inline>
             <wp:extent cx="4572000" cy="3556000"/>
             <wp:effectExtent b="0" l="0" r="0" t="0"/>
-            <wp:docPr descr="Figure 8: Al-Zn phase diagram with ESPEI parameter uncertainty. The liquid and face-centred-cubic (fcc) excess parameters were refit by Markov-chain Monte Carlo to the measured liquid enthalpy of mixing (Debski et al., digitized from Dinsdale et al. [44]) and the assessed phase boundaries (Massalski [45]; Mey [39]), and the posterior was propagated through the engine. The solid line is the median liquidus and the dashed line the median fcc solvus; the shaded region is the 90 percent posterior band on each. The band is narrow on the liquidus, which the calorimetry constrains, and wider on the fcc solvus, which only the diagram constrains. It is the posterior of the three refitted excess parameters with the unary functions and unfitted phases held fixed, a parametric uncertainty within the model rather than a total one. The open circle is the eutectic reported by Massalski [45] (x(Zn) = 0.887, 654 K)." title="" id="1913" name="Picture"/>
+            <wp:docPr descr="Figure 8: Al-Zn phase diagram with ESPEI parameter uncertainty. The liquid and face-centred-cubic (fcc) excess parameters were refit by Markov-chain Monte Carlo to the measured liquid enthalpy of mixing (Debski et al., digitized from Dinsdale et al. [44]) and the assessed phase boundaries (Massalski [45]; Mey [39]), and the posterior was propagated through the engine. The solid line is the median liquidus and the dashed line the median fcc solvus; the shaded region is the 90 percent posterior band on each. The band is narrow on the liquidus, which the calorimetry constrains, and wider on the fcc solvus, which only the diagram constrains. It is the posterior of the three refitted excess parameters with the unary functions and unfitted phases held fixed, a parametric uncertainty within the model rather than a total one. The open circle is the eutectic reported by Massalski [45] (x(Zn) = 0.887, 654 K)." title="" id="1956" name="Picture"/>
             <a:graphic>
               <a:graphicData uri="http://schemas.openxmlformats.org/drawingml/2006/picture">
                 <pic:pic>
                   <pic:nvPicPr>
-                    <pic:cNvPr descr="figures/fig8_uq_alzn.png" id="1914" name="Picture"/>
+                    <pic:cNvPr descr="figures/fig8_uq_alzn.png" id="1957" name="Picture"/>
                     <pic:cNvPicPr>
                       <a:picLocks noChangeArrowheads="1" noChangeAspect="1"/>
                     </pic:cNvPicPr>
                   </pic:nvPicPr>
                   <pic:blipFill>
-                    <a:blip r:embed="rId1912"/>
+                    <a:blip r:embed="rId1955"/>
                     <a:stretch>
                       <a:fillRect/>
                     </a:stretch>
@@ -3238,9 +3238,9 @@
         <w:t xml:space="preserve">The gap the present work addresses was never the model, which has been published for two decades, but an open, runnable pairing of model and parameters. Hephaestus supplies both halves under open licenses and puts them behind a browser page that asks nothing of its user. The claims are checkable end to end. Release v0.5.0 archives the exact version described, and the 132-test suite reruns the pycalphad comparisons on any machine. The worked examples print the figures shown, and every parameter in every shipped database traces to a published measurement through its provenance file. A reader who doubts a number can recalculate it; one who needs a system that is missing can build it with the same open tools, or ask.</w:t>
       </w:r>
     </w:p>
-    <w:bookmarkEnd w:id="1915"/>
-    <w:bookmarkEnd w:id="1916"/>
-    <w:bookmarkStart w:id="1917" w:name="data-availability"/>
+    <w:bookmarkEnd w:id="1958"/>
+    <w:bookmarkEnd w:id="1959"/>
+    <w:bookmarkStart w:id="1960" w:name="data-availability"/>
     <w:p>
       <w:pPr>
         <w:pStyle w:val="Heading2"/>
@@ -3257,8 +3257,8 @@
         <w:t xml:space="preserve">The engine, the database, the browser application, and the validation suite are openly available in the code repository listed above; the version described here is archived as release v0.5.0. The database files and their provenance records are in the repository’s data directory under CC BY 4.0.</w:t>
       </w:r>
     </w:p>
-    <w:bookmarkEnd w:id="1917"/>
-    <w:bookmarkStart w:id="1918" w:name="acknowledgements"/>
+    <w:bookmarkEnd w:id="1960"/>
+    <w:bookmarkStart w:id="1961" w:name="acknowledgements"/>
     <w:p>
       <w:pPr>
         <w:pStyle w:val="Heading2"/>
@@ -3275,8 +3275,8 @@
         <w:t xml:space="preserve">During the development of this software the author used Claude Code (Anthropic) to assist with implementation, validation scripting, and manuscript preparation. This assistance was agentic, not autonomous: it operated under author direction and supervision at every step and was never a closed loop that produced or accepted results without review. Every parameter was traced by the author to its primary source before entering the database, and every reference was verified against its registry record. The author reviewed and approved all output and takes full responsibility for this article.</w:t>
       </w:r>
     </w:p>
-    <w:bookmarkEnd w:id="1918"/>
-    <w:bookmarkStart w:id="1919" w:name="funding-statement"/>
+    <w:bookmarkEnd w:id="1961"/>
+    <w:bookmarkStart w:id="1962" w:name="funding-statement"/>
     <w:p>
       <w:pPr>
         <w:pStyle w:val="Heading2"/>
@@ -3293,8 +3293,8 @@
         <w:t xml:space="preserve">The development of this software received no external funding.</w:t>
       </w:r>
     </w:p>
-    <w:bookmarkEnd w:id="1919"/>
-    <w:bookmarkStart w:id="1920" w:name="competing-interests"/>
+    <w:bookmarkEnd w:id="1962"/>
+    <w:bookmarkStart w:id="1963" w:name="competing-interests"/>
     <w:p>
       <w:pPr>
         <w:pStyle w:val="Heading2"/>
@@ -3311,8 +3311,8 @@
         <w:t xml:space="preserve">The author founded Odinzen LLC, which provides commercial thermodynamic modeling services, and declares this as a competing interest. The software and database published here are released in full under open licenses, and no proprietary Odinzen assets are included.</w:t>
       </w:r>
     </w:p>
-    <w:bookmarkEnd w:id="1920"/>
-    <w:bookmarkStart w:id="1921" w:name="references"/>
+    <w:bookmarkEnd w:id="1963"/>
+    <w:bookmarkStart w:id="1964" w:name="references"/>
     <w:p>
       <w:pPr>
         <w:pStyle w:val="Heading2"/>
@@ -3693,8 +3693,8 @@
         <w:t xml:space="preserve">[45] Massalski TB, editor. Binary Alloy Phase Diagrams. 2nd ed. Materials Park (OH): ASM International; 1990.</w:t>
       </w:r>
     </w:p>
-    <w:bookmarkEnd w:id="1921"/>
-    <w:bookmarkEnd w:id="1922"/>
+    <w:bookmarkEnd w:id="1964"/>
+    <w:bookmarkEnd w:id="1965"/>
     <w:sectPr>
       <w:footnotePr>
         <w:numRestart w:val="eachSect"/>

</xml_diff>

<commit_message>
Reshoot Figures 2 and 6 on the Kelvin app
Both are browser screenshots; recaptured now that the app displays Kelvin (Figure 2's live
solver reads 1873 K, Figure 6's Fe-C diagram and Scheil are on a Kelvin axis). Figure 2's
caption is updated to the current engine's counts at 1873 K (1023 composition samples, 512
tie-facets, about three seconds), matching the recaptured figure. Reading copies rebuilt,
Argus gate green.

Co-Authored-By: Claude Opus 4.8 <noreply@anthropic.com>
</commit_message>
<xml_diff>
--- a/paper/Bustamante_Hephaestus_JORS_manuscript.docx
+++ b/paper/Bustamante_Hephaestus_JORS_manuscript.docx
@@ -2,7 +2,7 @@
 <file path=word/document.xml><?xml version="1.0" encoding="utf-8"?>
 <w:document xmlns:w="http://schemas.openxmlformats.org/wordprocessingml/2006/main" xmlns:m="http://schemas.openxmlformats.org/officeDocument/2006/math" xmlns:r="http://schemas.openxmlformats.org/officeDocument/2006/relationships" xmlns:o="urn:schemas-microsoft-com:office:office" xmlns:v="urn:schemas-microsoft-com:vml" xmlns:w10="urn:schemas-microsoft-com:office:word" xmlns:a="http://schemas.openxmlformats.org/drawingml/2006/main" xmlns:pic="http://schemas.openxmlformats.org/drawingml/2006/picture" xmlns:wp="http://schemas.openxmlformats.org/drawingml/2006/wordprocessingDrawing">
   <w:body>
-    <w:bookmarkStart w:id="1965" w:name="X4855b1162e70238fd839d871e0792397dc58430"/>
+    <w:bookmarkStart w:id="2008" w:name="X4855b1162e70238fd839d871e0792397dc58430"/>
     <w:p>
       <w:pPr>
         <w:pStyle w:val="Heading1"/>
@@ -159,7 +159,7 @@
         <w:t xml:space="preserve">CALPHAD; molten slag; molten salt; modified quasichemical model; thermodynamic database; phase diagram; gas equilibrium; WebAssembly; open data</w:t>
       </w:r>
     </w:p>
-    <w:bookmarkStart w:id="1934" w:name="overview"/>
+    <w:bookmarkStart w:id="1977" w:name="overview"/>
     <w:p>
       <w:pPr>
         <w:pStyle w:val="Heading2"/>
@@ -168,7 +168,7 @@
         <w:t xml:space="preserve">(1) Overview</w:t>
       </w:r>
     </w:p>
-    <w:bookmarkStart w:id="1921" w:name="introduction"/>
+    <w:bookmarkStart w:id="1964" w:name="introduction"/>
     <w:p>
       <w:pPr>
         <w:pStyle w:val="Heading3"/>
@@ -548,8 +548,8 @@
         <w:t xml:space="preserve">Hephaestus is a deliberate response to that gap, and it treats the engine and the data as one contribution because neither is useful alone. The engine is small on purpose. Its core is plain C with no dependencies, which makes it easy to embed and lets the identical code compile to WebAssembly, so the full calculator runs in a web browser with nothing installed and no data leaving the user’s machine. The database is open on purpose. Every parameter in it derives from published measurements, each value carries its provenance down to table and page, and the known shortcomings are documented next to the numbers they affect. The present work describes both, their validation against pycalphad and against measured phase equilibria, and the ways they can be reused. None of it asks the reader to program. For the experimentalist who never writes code, the browser application is the entire product: a page to open, a database to click, and a diagram to read. The sections that follow describe the machinery underneath for those who want it. Supplementary Material S1 is a plain-language primer for the non-programmer, starting at what a database file is and ending at a first calculation and how to read it. Its closing section teaches what an assessment is built from, so a reader who wants to contribute data for open publication, or to commission a file, arrives knowing what is needed.</w:t>
       </w:r>
     </w:p>
-    <w:bookmarkEnd w:id="1921"/>
-    <w:bookmarkStart w:id="1931" w:name="implementation-and-architecture"/>
+    <w:bookmarkEnd w:id="1964"/>
+    <w:bookmarkStart w:id="1974" w:name="implementation-and-architecture"/>
     <w:p>
       <w:pPr>
         <w:pStyle w:val="Heading3"/>
@@ -575,18 +575,18 @@
           <wp:inline>
             <wp:extent cx="5334000" cy="3511167"/>
             <wp:effectExtent b="0" l="0" r="0" t="0"/>
-            <wp:docPr descr="Figure 1: Architecture of Hephaestus. A single dependency-free C core reads the field’s three database dialects (ChemSage .dat, Thermo-Calc .tdb with the Inden magnetic model, and the unified .utdb) and calculates all thermodynamics; the same core is used as a native library, from Python through cffi, and compiled to WebAssembly behind the browser application. dbbuild writes new ChemSage files from measured data, and every energy path is validated against pycalphad." title="" id="1923" name="Picture"/>
+            <wp:docPr descr="Figure 1: Architecture of Hephaestus. A single dependency-free C core reads the field’s three database dialects (ChemSage .dat, Thermo-Calc .tdb with the Inden magnetic model, and the unified .utdb) and calculates all thermodynamics; the same core is used as a native library, from Python through cffi, and compiled to WebAssembly behind the browser application. dbbuild writes new ChemSage files from measured data, and every energy path is validated against pycalphad." title="" id="1966" name="Picture"/>
             <a:graphic>
               <a:graphicData uri="http://schemas.openxmlformats.org/drawingml/2006/picture">
                 <pic:pic>
                   <pic:nvPicPr>
-                    <pic:cNvPr descr="figures/fig1_architecture.png" id="1924" name="Picture"/>
+                    <pic:cNvPr descr="figures/fig1_architecture.png" id="1967" name="Picture"/>
                     <pic:cNvPicPr>
                       <a:picLocks noChangeArrowheads="1" noChangeAspect="1"/>
                     </pic:cNvPicPr>
                   </pic:nvPicPr>
                   <pic:blipFill>
-                    <a:blip r:embed="rId1922"/>
+                    <a:blip r:embed="rId1965"/>
                     <a:stretch>
                       <a:fillRect/>
                     </a:stretch>
@@ -814,18 +814,18 @@
           <wp:inline>
             <wp:extent cx="4754880" cy="3913308"/>
             <wp:effectExtent b="0" l="0" r="0" t="0"/>
-            <wp:docPr descr="Figure 2: The live solver in the browser application (light theme). The user loads the shipped database, picks a temperature, and presses Compute; the WebAssembly engine then solves the full FeO-MgO-SiO2 phase assemblage client side (here 861 composition samples and 595 tie-facets in about two seconds). Tapping a composition reads its stable phases and pins it to a comparison list; hovering previews on desktop." title="" id="1926" name="Picture"/>
+            <wp:docPr descr="Figure 2: The live solver in the browser application (light theme). The user loads the shipped database, picks a temperature, and presses Compute; the WebAssembly engine then solves the full FeO-MgO-SiO2 phase assemblage client side (here 1023 composition samples and 512 tie-facets in about three seconds). Tapping a composition reads its stable phases and pins it to a comparison list; hovering previews on desktop." title="" id="1969" name="Picture"/>
             <a:graphic>
               <a:graphicData uri="http://schemas.openxmlformats.org/drawingml/2006/picture">
                 <pic:pic>
                   <pic:nvPicPr>
-                    <pic:cNvPr descr="figures/fig2_browser_app.png" id="1927" name="Picture"/>
+                    <pic:cNvPr descr="figures/fig2_browser_app.png" id="1970" name="Picture"/>
                     <pic:cNvPicPr>
                       <a:picLocks noChangeArrowheads="1" noChangeAspect="1"/>
                     </pic:cNvPicPr>
                   </pic:nvPicPr>
                   <pic:blipFill>
-                    <a:blip r:embed="rId1925"/>
+                    <a:blip r:embed="rId1968"/>
                     <a:stretch>
                       <a:fillRect/>
                     </a:stretch>
@@ -869,7 +869,7 @@
         <w:t xml:space="preserve"> </w:t>
       </w:r>
       <w:r>
-        <w:t xml:space="preserve">phase assemblage client side (here 861 composition samples and 595 tie-facets in about two seconds). Tapping a composition reads its stable phases and pins it to a comparison list; hovering previews on desktop.</w:t>
+        <w:t xml:space="preserve">phase assemblage client side (here 1023 composition samples and 512 tie-facets in about three seconds). Tapping a composition reads its stable phases and pins it to a comparison list; hovering previews on desktop.</w:t>
       </w:r>
     </w:p>
     <w:p>
@@ -991,18 +991,18 @@
           <wp:inline>
             <wp:extent cx="5334000" cy="2197297"/>
             <wp:effectExtent b="0" l="0" r="0" t="0"/>
-            <wp:docPr descr="Figure 3: The assessed FeO-MgO-SiO2 system calculated from the shipped database files. (a) Liquidus projection: primary crystallizing phase fields, with liquidus isotherms labeled in K. (b) Isothermal section at 1873 K: stable phase assemblages, shaded by the number of solid phases present. Phase labels: L liquid, Crs cristobalite, Ol olivine, Opx orthopyroxene, Per periclase, Wus wustite." title="" id="1929" name="Picture"/>
+            <wp:docPr descr="Figure 3: The assessed FeO-MgO-SiO2 system calculated from the shipped database files. (a) Liquidus projection: primary crystallizing phase fields, with liquidus isotherms labeled in K. (b) Isothermal section at 1873 K: stable phase assemblages, shaded by the number of solid phases present. Phase labels: L liquid, Crs cristobalite, Ol olivine, Opx orthopyroxene, Per periclase, Wus wustite." title="" id="1972" name="Picture"/>
             <a:graphic>
               <a:graphicData uri="http://schemas.openxmlformats.org/drawingml/2006/picture">
                 <pic:pic>
                   <pic:nvPicPr>
-                    <pic:cNvPr descr="figures/fig3_ternary.png" id="1930" name="Picture"/>
+                    <pic:cNvPr descr="figures/fig3_ternary.png" id="1973" name="Picture"/>
                     <pic:cNvPicPr>
                       <a:picLocks noChangeArrowheads="1" noChangeAspect="1"/>
                     </pic:cNvPicPr>
                   </pic:nvPicPr>
                   <pic:blipFill>
-                    <a:blip r:embed="rId1928"/>
+                    <a:blip r:embed="rId1971"/>
                     <a:stretch>
                       <a:fillRect/>
                     </a:stretch>
@@ -1392,8 +1392,8 @@
         </w:tc>
       </w:tr>
     </w:tbl>
-    <w:bookmarkEnd w:id="1931"/>
-    <w:bookmarkStart w:id="1932" w:name="anatomy-of-a-database-file"/>
+    <w:bookmarkEnd w:id="1974"/>
+    <w:bookmarkStart w:id="1975" w:name="anatomy-of-a-database-file"/>
     <w:p>
       <w:pPr>
         <w:pStyle w:val="Heading3"/>
@@ -1426,8 +1426,8 @@
         <w:t xml:space="preserve">That asymmetry is the economics of the field in miniature: implementations of the published models are increasingly available, but each fitted parameter condenses dozens of measurements and decisions. Parameter sets rather than codes are therefore the scarce commodity, and an openly licensed, provenance-tracked database is the part of this contribution that cannot be regenerated from the paper alone.</w:t>
       </w:r>
     </w:p>
-    <w:bookmarkEnd w:id="1932"/>
-    <w:bookmarkStart w:id="1933" w:name="quality-control"/>
+    <w:bookmarkEnd w:id="1975"/>
+    <w:bookmarkStart w:id="1976" w:name="quality-control"/>
     <w:p>
       <w:pPr>
         <w:pStyle w:val="Heading3"/>
@@ -2149,9 +2149,9 @@
         <w:t xml:space="preserve">invariants sit within about 40 K, and the ternary liquidus projection reproduces the measured field topology [24]. Development practice is plain: the repository is version controlled with tagged releases (v0.1.0 through the v0.5.0 described here), the full suite runs before every release, and a fixed bug lands together with the regression test that would have caught it. The suite runs on Windows 11 under CPython 3.11 and 3.12; the browser application is exercised in Chromium- and Gecko-based browsers. A user can confirm a working installation by running pytest against the bundled test databases, or with no installation at all by opening the web application and loading the shipped ternary database.</w:t>
       </w:r>
     </w:p>
-    <w:bookmarkEnd w:id="1933"/>
-    <w:bookmarkEnd w:id="1934"/>
-    <w:bookmarkStart w:id="1942" w:name="availability"/>
+    <w:bookmarkEnd w:id="1976"/>
+    <w:bookmarkEnd w:id="1977"/>
+    <w:bookmarkStart w:id="1985" w:name="availability"/>
     <w:p>
       <w:pPr>
         <w:pStyle w:val="Heading2"/>
@@ -2160,7 +2160,7 @@
         <w:t xml:space="preserve">(2) Availability</w:t>
       </w:r>
     </w:p>
-    <w:bookmarkStart w:id="1935" w:name="operating-system"/>
+    <w:bookmarkStart w:id="1978" w:name="operating-system"/>
     <w:p>
       <w:pPr>
         <w:pStyle w:val="Heading3"/>
@@ -2177,8 +2177,8 @@
         <w:t xml:space="preserve">Platform independent. The core builds with any C99 compiler; development and testing used Windows 11. The browser application runs in any current browser with WebAssembly support.</w:t>
       </w:r>
     </w:p>
-    <w:bookmarkEnd w:id="1935"/>
-    <w:bookmarkStart w:id="1936" w:name="programming-language"/>
+    <w:bookmarkEnd w:id="1978"/>
+    <w:bookmarkStart w:id="1979" w:name="programming-language"/>
     <w:p>
       <w:pPr>
         <w:pStyle w:val="Heading3"/>
@@ -2195,8 +2195,8 @@
         <w:t xml:space="preserve">C (core), Python 3.11 or later (interface and fitting tools), JavaScript (browser application).</w:t>
       </w:r>
     </w:p>
-    <w:bookmarkEnd w:id="1936"/>
-    <w:bookmarkStart w:id="1937" w:name="additional-system-requirements"/>
+    <w:bookmarkEnd w:id="1979"/>
+    <w:bookmarkStart w:id="1980" w:name="additional-system-requirements"/>
     <w:p>
       <w:pPr>
         <w:pStyle w:val="Heading3"/>
@@ -2213,8 +2213,8 @@
         <w:t xml:space="preserve">None of note. The engine and database together are a few megabytes.</w:t>
       </w:r>
     </w:p>
-    <w:bookmarkEnd w:id="1937"/>
-    <w:bookmarkStart w:id="1938" w:name="dependencies"/>
+    <w:bookmarkEnd w:id="1980"/>
+    <w:bookmarkStart w:id="1981" w:name="dependencies"/>
     <w:p>
       <w:pPr>
         <w:pStyle w:val="Heading3"/>
@@ -2231,8 +2231,8 @@
         <w:t xml:space="preserve">Python interface: cffi, NumPy, SciPy (developed and tested with cffi 2.0, NumPy 2.4, and SciPy 1.17). The validation suite additionally requires pycalphad; every oracle comparison reported here ran against pycalphad 0.11.1, and the tests that read pycalphad’s own shipped test databases skip cleanly if a later version relocates them. The WebAssembly build requires emscripten. The C core and the browser application have no dependencies.</w:t>
       </w:r>
     </w:p>
-    <w:bookmarkEnd w:id="1938"/>
-    <w:bookmarkStart w:id="1939" w:name="list-of-contributors"/>
+    <w:bookmarkEnd w:id="1981"/>
+    <w:bookmarkStart w:id="1982" w:name="list-of-contributors"/>
     <w:p>
       <w:pPr>
         <w:pStyle w:val="Heading3"/>
@@ -2249,8 +2249,8 @@
         <w:t xml:space="preserve">Michael E. Bustamante (design, implementation, validation, data curation).</w:t>
       </w:r>
     </w:p>
-    <w:bookmarkEnd w:id="1939"/>
-    <w:bookmarkStart w:id="1940" w:name="software-location"/>
+    <w:bookmarkEnd w:id="1982"/>
+    <w:bookmarkStart w:id="1983" w:name="software-location"/>
     <w:p>
       <w:pPr>
         <w:pStyle w:val="Heading3"/>
@@ -2403,8 +2403,8 @@
         <w:t xml:space="preserve">Date published: 2026-09-02</w:t>
       </w:r>
     </w:p>
-    <w:bookmarkEnd w:id="1940"/>
-    <w:bookmarkStart w:id="1941" w:name="language"/>
+    <w:bookmarkEnd w:id="1983"/>
+    <w:bookmarkStart w:id="1984" w:name="language"/>
     <w:p>
       <w:pPr>
         <w:pStyle w:val="Heading3"/>
@@ -2421,9 +2421,9 @@
         <w:t xml:space="preserve">English.</w:t>
       </w:r>
     </w:p>
-    <w:bookmarkEnd w:id="1941"/>
-    <w:bookmarkEnd w:id="1942"/>
-    <w:bookmarkStart w:id="1959" w:name="reuse-potential"/>
+    <w:bookmarkEnd w:id="1984"/>
+    <w:bookmarkEnd w:id="1985"/>
+    <w:bookmarkStart w:id="2002" w:name="reuse-potential"/>
     <w:p>
       <w:pPr>
         <w:pStyle w:val="Heading2"/>
@@ -2448,7 +2448,7 @@
         <w:t xml:space="preserve">The browser application makes the lowest barrier the default. A lecture on slag thermodynamics, a plant metallurgist screening a composition, or a reviewer checking a claimed equilibrium can load the database and calculate in seconds, with confidential inputs never leaving the machine. The same property makes it a practical template for other groups who want to publish a model as a zero-install tool.</w:t>
       </w:r>
     </w:p>
-    <w:bookmarkStart w:id="1958" w:name="worked-examples"/>
+    <w:bookmarkStart w:id="2001" w:name="worked-examples"/>
     <w:p>
       <w:pPr>
         <w:pStyle w:val="Heading3"/>
@@ -2660,18 +2660,18 @@
           <wp:inline>
             <wp:extent cx="4206240" cy="3262561"/>
             <wp:effectExtent b="0" l="0" r="0" t="0"/>
-            <wp:docPr descr="Figure 4: The LiCl-KCl phase diagram calculated by the salt listing from the shipped open database, at the listing’s own step size. Light to dark: liquid, two-phase, and subsolidus fields. The dot is the calculated eutectic at this step size (0.400, 640 K); the star is the measured eutectic (0.415, 626 K)." title="" id="1944" name="Picture"/>
+            <wp:docPr descr="Figure 4: The LiCl-KCl phase diagram calculated by the salt listing from the shipped open database, at the listing’s own step size. Light to dark: liquid, two-phase, and subsolidus fields. The dot is the calculated eutectic at this step size (0.400, 640 K); the star is the measured eutectic (0.415, 626 K)." title="" id="1987" name="Picture"/>
             <a:graphic>
               <a:graphicData uri="http://schemas.openxmlformats.org/drawingml/2006/picture">
                 <pic:pic>
                   <pic:nvPicPr>
-                    <pic:cNvPr descr="figures/fig4_salt_example.png" id="1945" name="Picture"/>
+                    <pic:cNvPr descr="figures/fig4_salt_example.png" id="1988" name="Picture"/>
                     <pic:cNvPicPr>
                       <a:picLocks noChangeArrowheads="1" noChangeAspect="1"/>
                     </pic:cNvPicPr>
                   </pic:nvPicPr>
                   <pic:blipFill>
-                    <a:blip r:embed="rId1943"/>
+                    <a:blip r:embed="rId1986"/>
                     <a:stretch>
                       <a:fillRect/>
                     </a:stretch>
@@ -2906,18 +2906,18 @@
           <wp:inline>
             <wp:extent cx="4206240" cy="3262561"/>
             <wp:effectExtent b="0" l="0" r="0" t="0"/>
-            <wp:docPr descr="Figure 5: The Al-Zn phase diagram calculated by the alloy listing from the shipped open TDB. Light to dark: liquid, liquid plus solid, and solid fields. The dot is the calculated eutectic (0.890, 660 K); the star is the assessed eutectic (0.885, 654 K)." title="" id="1947" name="Picture"/>
+            <wp:docPr descr="Figure 5: The Al-Zn phase diagram calculated by the alloy listing from the shipped open TDB. Light to dark: liquid, liquid plus solid, and solid fields. The dot is the calculated eutectic (0.890, 660 K); the star is the assessed eutectic (0.885, 654 K)." title="" id="1990" name="Picture"/>
             <a:graphic>
               <a:graphicData uri="http://schemas.openxmlformats.org/drawingml/2006/picture">
                 <pic:pic>
                   <pic:nvPicPr>
-                    <pic:cNvPr descr="figures/fig5_alloy_example.png" id="1948" name="Picture"/>
+                    <pic:cNvPr descr="figures/fig5_alloy_example.png" id="1991" name="Picture"/>
                     <pic:cNvPicPr>
                       <a:picLocks noChangeArrowheads="1" noChangeAspect="1"/>
                     </pic:cNvPicPr>
                   </pic:nvPicPr>
                   <pic:blipFill>
-                    <a:blip r:embed="rId1946"/>
+                    <a:blip r:embed="rId1989"/>
                     <a:stretch>
                       <a:fillRect/>
                     </a:stretch>
@@ -3038,18 +3038,18 @@
           <wp:inline>
             <wp:extent cx="5334000" cy="4430576"/>
             <wp:effectExtent b="0" l="0" r="0" t="0"/>
-            <wp:docPr descr="Figure 6: One unified (.utdb) file, two physics, calculated in the browser. (a) The steelmaking database loaded with the Melt/Alloy view toggle on Alloy; the engine calculates the Fe-C phase diagram through the magnetic compound energy formalism, rendered over a 0-25 mol% C composition window (the equilibrium always solves the whole join), with two tapped compositions pinned. (b) Scheil solidification for the same join at 4 mol% C, first solid at 1741 K and the residual liquid frozen by 1433 K, against the equilibrium lever-rule path (dashed). The file’s slag half is a Modified Quasichemical Model liquid; no legacy container holds both models at once." title="" id="1950" name="Picture"/>
+            <wp:docPr descr="Figure 6: One unified (.utdb) file, two physics, calculated in the browser. (a) The steelmaking database loaded with the Melt/Alloy view toggle on Alloy; the engine calculates the Fe-C phase diagram through the magnetic compound energy formalism, rendered over a 0-25 mol% C composition window (the equilibrium always solves the whole join), with two tapped compositions pinned. (b) Scheil solidification for the same join at 4 mol% C, first solid at 1741 K and the residual liquid frozen by 1433 K, against the equilibrium lever-rule path (dashed). The file’s slag half is a Modified Quasichemical Model liquid; no legacy container holds both models at once." title="" id="1993" name="Picture"/>
             <a:graphic>
               <a:graphicData uri="http://schemas.openxmlformats.org/drawingml/2006/picture">
                 <pic:pic>
                   <pic:nvPicPr>
-                    <pic:cNvPr descr="figures/fig6_utdb_steel.png" id="1951" name="Picture"/>
+                    <pic:cNvPr descr="figures/fig6_utdb_steel.png" id="1994" name="Picture"/>
                     <pic:cNvPicPr>
                       <a:picLocks noChangeArrowheads="1" noChangeAspect="1"/>
                     </pic:cNvPicPr>
                   </pic:nvPicPr>
                   <pic:blipFill>
-                    <a:blip r:embed="rId1949"/>
+                    <a:blip r:embed="rId1992"/>
                     <a:stretch>
                       <a:fillRect/>
                     </a:stretch>
@@ -3093,18 +3093,18 @@
           <wp:inline>
             <wp:extent cx="5334000" cy="2319130"/>
             <wp:effectExtent b="0" l="0" r="0" t="0"/>
-            <wp:docPr descr="Figure 7: The gas calculator as a steelmaking worked example, the equilibrium of a carbon-oxygen furnace gas by the Hephaestus gas engine (the NASA-polynomial element-potential solver compiled into the browser), with Cantera as the independent check. (a) Oxygen partial pressure against the CO to CO2 ratio at the 1873 K tap temperature: a lower ratio is more oxidizing and drives iron into the slag as FeO, a higher ratio is more reducing and decarburizes the steel. (b) The same oxygen potential against temperature for four fixed CO to CO2 buffers, showing that a given gas grows more oxidizing as it heats; the dashed line marks the tap temperature. Open circles are Cantera, agreeing to about 10-5 mole fraction across the field." title="" id="1953" name="Picture"/>
+            <wp:docPr descr="Figure 7: The gas calculator as a steelmaking worked example, the equilibrium of a carbon-oxygen furnace gas by the Hephaestus gas engine (the NASA-polynomial element-potential solver compiled into the browser), with Cantera as the independent check. (a) Oxygen partial pressure against the CO to CO2 ratio at the 1873 K tap temperature: a lower ratio is more oxidizing and drives iron into the slag as FeO, a higher ratio is more reducing and decarburizes the steel. (b) The same oxygen potential against temperature for four fixed CO to CO2 buffers, showing that a given gas grows more oxidizing as it heats; the dashed line marks the tap temperature. Open circles are Cantera, agreeing to about 10-5 mole fraction across the field." title="" id="1996" name="Picture"/>
             <a:graphic>
               <a:graphicData uri="http://schemas.openxmlformats.org/drawingml/2006/picture">
                 <pic:pic>
                   <pic:nvPicPr>
-                    <pic:cNvPr descr="figures/fig7_gas_steel.png" id="1954" name="Picture"/>
+                    <pic:cNvPr descr="figures/fig7_gas_steel.png" id="1997" name="Picture"/>
                     <pic:cNvPicPr>
                       <a:picLocks noChangeArrowheads="1" noChangeAspect="1"/>
                     </pic:cNvPicPr>
                   </pic:nvPicPr>
                   <pic:blipFill>
-                    <a:blip r:embed="rId1952"/>
+                    <a:blip r:embed="rId1995"/>
                     <a:stretch>
                       <a:fillRect/>
                     </a:stretch>
@@ -3184,18 +3184,18 @@
           <wp:inline>
             <wp:extent cx="4572000" cy="3556000"/>
             <wp:effectExtent b="0" l="0" r="0" t="0"/>
-            <wp:docPr descr="Figure 8: Al-Zn phase diagram with ESPEI parameter uncertainty. The liquid and face-centred-cubic (fcc) excess parameters were refit by Markov-chain Monte Carlo to the measured liquid enthalpy of mixing (Debski et al., digitized from Dinsdale et al. [44]) and the assessed phase boundaries (Massalski [45]; Mey [39]), and the posterior was propagated through the engine. The solid line is the median liquidus and the dashed line the median fcc solvus; the shaded region is the 90 percent posterior band on each. The band is narrow on the liquidus, which the calorimetry constrains, and wider on the fcc solvus, which only the diagram constrains. It is the posterior of the three refitted excess parameters with the unary functions and unfitted phases held fixed, a parametric uncertainty within the model rather than a total one. The open circle is the eutectic reported by Massalski [45] (x(Zn) = 0.887, 654 K)." title="" id="1956" name="Picture"/>
+            <wp:docPr descr="Figure 8: Al-Zn phase diagram with ESPEI parameter uncertainty. The liquid and face-centred-cubic (fcc) excess parameters were refit by Markov-chain Monte Carlo to the measured liquid enthalpy of mixing (Debski et al., digitized from Dinsdale et al. [44]) and the assessed phase boundaries (Massalski [45]; Mey [39]), and the posterior was propagated through the engine. The solid line is the median liquidus and the dashed line the median fcc solvus; the shaded region is the 90 percent posterior band on each. The band is narrow on the liquidus, which the calorimetry constrains, and wider on the fcc solvus, which only the diagram constrains. It is the posterior of the three refitted excess parameters with the unary functions and unfitted phases held fixed, a parametric uncertainty within the model rather than a total one. The open circle is the eutectic reported by Massalski [45] (x(Zn) = 0.887, 654 K)." title="" id="1999" name="Picture"/>
             <a:graphic>
               <a:graphicData uri="http://schemas.openxmlformats.org/drawingml/2006/picture">
                 <pic:pic>
                   <pic:nvPicPr>
-                    <pic:cNvPr descr="figures/fig8_uq_alzn.png" id="1957" name="Picture"/>
+                    <pic:cNvPr descr="figures/fig8_uq_alzn.png" id="2000" name="Picture"/>
                     <pic:cNvPicPr>
                       <a:picLocks noChangeArrowheads="1" noChangeAspect="1"/>
                     </pic:cNvPicPr>
                   </pic:nvPicPr>
                   <pic:blipFill>
-                    <a:blip r:embed="rId1955"/>
+                    <a:blip r:embed="rId1998"/>
                     <a:stretch>
                       <a:fillRect/>
                     </a:stretch>
@@ -3238,9 +3238,9 @@
         <w:t xml:space="preserve">The gap the present work addresses was never the model, which has been published for two decades, but an open, runnable pairing of model and parameters. Hephaestus supplies both halves under open licenses and puts them behind a browser page that asks nothing of its user. The claims are checkable end to end. Release v0.5.0 archives the exact version described, and the 132-test suite reruns the pycalphad comparisons on any machine. The worked examples print the figures shown, and every parameter in every shipped database traces to a published measurement through its provenance file. A reader who doubts a number can recalculate it; one who needs a system that is missing can build it with the same open tools, or ask.</w:t>
       </w:r>
     </w:p>
-    <w:bookmarkEnd w:id="1958"/>
-    <w:bookmarkEnd w:id="1959"/>
-    <w:bookmarkStart w:id="1960" w:name="data-availability"/>
+    <w:bookmarkEnd w:id="2001"/>
+    <w:bookmarkEnd w:id="2002"/>
+    <w:bookmarkStart w:id="2003" w:name="data-availability"/>
     <w:p>
       <w:pPr>
         <w:pStyle w:val="Heading2"/>
@@ -3257,8 +3257,8 @@
         <w:t xml:space="preserve">The engine, the database, the browser application, and the validation suite are openly available in the code repository listed above; the version described here is archived as release v0.5.0. The database files and their provenance records are in the repository’s data directory under CC BY 4.0.</w:t>
       </w:r>
     </w:p>
-    <w:bookmarkEnd w:id="1960"/>
-    <w:bookmarkStart w:id="1961" w:name="acknowledgements"/>
+    <w:bookmarkEnd w:id="2003"/>
+    <w:bookmarkStart w:id="2004" w:name="acknowledgements"/>
     <w:p>
       <w:pPr>
         <w:pStyle w:val="Heading2"/>
@@ -3275,8 +3275,8 @@
         <w:t xml:space="preserve">During the development of this software the author used Claude Code (Anthropic) to assist with implementation, validation scripting, and manuscript preparation. This assistance was agentic, not autonomous: it operated under author direction and supervision at every step and was never a closed loop that produced or accepted results without review. Every parameter was traced by the author to its primary source before entering the database, and every reference was verified against its registry record. The author reviewed and approved all output and takes full responsibility for this article.</w:t>
       </w:r>
     </w:p>
-    <w:bookmarkEnd w:id="1961"/>
-    <w:bookmarkStart w:id="1962" w:name="funding-statement"/>
+    <w:bookmarkEnd w:id="2004"/>
+    <w:bookmarkStart w:id="2005" w:name="funding-statement"/>
     <w:p>
       <w:pPr>
         <w:pStyle w:val="Heading2"/>
@@ -3293,8 +3293,8 @@
         <w:t xml:space="preserve">The development of this software received no external funding.</w:t>
       </w:r>
     </w:p>
-    <w:bookmarkEnd w:id="1962"/>
-    <w:bookmarkStart w:id="1963" w:name="competing-interests"/>
+    <w:bookmarkEnd w:id="2005"/>
+    <w:bookmarkStart w:id="2006" w:name="competing-interests"/>
     <w:p>
       <w:pPr>
         <w:pStyle w:val="Heading2"/>
@@ -3311,8 +3311,8 @@
         <w:t xml:space="preserve">The author founded Odinzen LLC, which provides commercial thermodynamic modeling services, and declares this as a competing interest. The software and database published here are released in full under open licenses, and no proprietary Odinzen assets are included.</w:t>
       </w:r>
     </w:p>
-    <w:bookmarkEnd w:id="1963"/>
-    <w:bookmarkStart w:id="1964" w:name="references"/>
+    <w:bookmarkEnd w:id="2006"/>
+    <w:bookmarkStart w:id="2007" w:name="references"/>
     <w:p>
       <w:pPr>
         <w:pStyle w:val="Heading2"/>
@@ -3693,8 +3693,8 @@
         <w:t xml:space="preserve">[45] Massalski TB, editor. Binary Alloy Phase Diagrams. 2nd ed. Materials Park (OH): ASM International; 1990.</w:t>
       </w:r>
     </w:p>
-    <w:bookmarkEnd w:id="1964"/>
-    <w:bookmarkEnd w:id="1965"/>
+    <w:bookmarkEnd w:id="2007"/>
+    <w:bookmarkEnd w:id="2008"/>
     <w:sectPr>
       <w:footnotePr>
         <w:numRestart w:val="eachSect"/>

</xml_diff>

<commit_message>
Figure 1: add the gas engine to the C core box
The architecture diagram listed the C core as reader, MQMQA/CEF energy, magnetic
model, and liquid minimizer, but not the gas engine, now a validated part of the
core (NASA-polynomial ideal-gas equilibrium and the gas-condensed coupling,
compiled into the same C/WASM core). Added that line and rebuilt the docx/pdf.

Audited the rest while here: figures 2-8 regenerate byte- or pixel-identical
from the current code, data, and app, so none were stale; only Figure 1 was.

Co-Authored-By: Claude Opus 4.8 <noreply@anthropic.com>
</commit_message>
<xml_diff>
--- a/paper/Bustamante_Hephaestus_JORS_manuscript.docx
+++ b/paper/Bustamante_Hephaestus_JORS_manuscript.docx
@@ -2,7 +2,7 @@
 <file path=word/document.xml><?xml version="1.0" encoding="utf-8"?>
 <w:document xmlns:w="http://schemas.openxmlformats.org/wordprocessingml/2006/main" xmlns:m="http://schemas.openxmlformats.org/officeDocument/2006/math" xmlns:r="http://schemas.openxmlformats.org/officeDocument/2006/relationships" xmlns:o="urn:schemas-microsoft-com:office:office" xmlns:v="urn:schemas-microsoft-com:vml" xmlns:w10="urn:schemas-microsoft-com:office:word" xmlns:a="http://schemas.openxmlformats.org/drawingml/2006/main" xmlns:pic="http://schemas.openxmlformats.org/drawingml/2006/picture" xmlns:wp="http://schemas.openxmlformats.org/drawingml/2006/wordprocessingDrawing">
   <w:body>
-    <w:bookmarkStart w:id="2051" w:name="X4855b1162e70238fd839d871e0792397dc58430"/>
+    <w:bookmarkStart w:id="2094" w:name="X4855b1162e70238fd839d871e0792397dc58430"/>
     <w:p>
       <w:pPr>
         <w:pStyle w:val="Heading1"/>
@@ -159,7 +159,7 @@
         <w:t xml:space="preserve">CALPHAD; molten slag; molten salt; modified quasichemical model; thermodynamic database; phase diagram; gas equilibrium; WebAssembly; open data</w:t>
       </w:r>
     </w:p>
-    <w:bookmarkStart w:id="2020" w:name="overview"/>
+    <w:bookmarkStart w:id="2063" w:name="overview"/>
     <w:p>
       <w:pPr>
         <w:pStyle w:val="Heading2"/>
@@ -168,7 +168,7 @@
         <w:t xml:space="preserve">(1) Overview</w:t>
       </w:r>
     </w:p>
-    <w:bookmarkStart w:id="2007" w:name="introduction"/>
+    <w:bookmarkStart w:id="2050" w:name="introduction"/>
     <w:p>
       <w:pPr>
         <w:pStyle w:val="Heading3"/>
@@ -548,8 +548,8 @@
         <w:t xml:space="preserve">Hephaestus is a deliberate response to that gap, and it treats the engine and the data as one contribution because neither is useful alone. The engine is small on purpose. Its core is plain C with no dependencies, which makes it easy to embed and lets the identical code compile to WebAssembly, so the full calculator runs in a web browser with nothing installed and no data leaving the user’s machine. The database is open on purpose. Every parameter in it derives from published measurements, each value carries its provenance down to table and page, and the known shortcomings are documented next to the numbers they affect. The present work describes both, their validation against pycalphad and against measured phase equilibria, and the ways they can be reused. None of it asks the reader to program. For the experimentalist who never writes code, the browser application is the entire product: a page to open, a database to click, and a diagram to read. The sections that follow describe the machinery underneath for those who want it. Supplementary Material S1 is a plain-language primer for the non-programmer, starting at what a database file is and ending at a first calculation and how to read it. Its closing section teaches what an assessment is built from, so a reader who wants to contribute data for open publication, or to commission a file, arrives knowing what is needed.</w:t>
       </w:r>
     </w:p>
-    <w:bookmarkEnd w:id="2007"/>
-    <w:bookmarkStart w:id="2017" w:name="implementation-and-architecture"/>
+    <w:bookmarkEnd w:id="2050"/>
+    <w:bookmarkStart w:id="2060" w:name="implementation-and-architecture"/>
     <w:p>
       <w:pPr>
         <w:pStyle w:val="Heading3"/>
@@ -575,18 +575,18 @@
           <wp:inline>
             <wp:extent cx="5334000" cy="3511167"/>
             <wp:effectExtent b="0" l="0" r="0" t="0"/>
-            <wp:docPr descr="Figure 1: Architecture of Hephaestus. A single dependency-free C core reads the field’s three database dialects (ChemSage .dat, Thermo-Calc .tdb with the Inden magnetic model, and the unified .utdb) and calculates all thermodynamics; the same core is used as a native library, from Python through cffi, and compiled to WebAssembly behind the browser application. dbbuild writes new ChemSage files from measured data, and every energy path is validated against pycalphad." title="" id="2009" name="Picture"/>
+            <wp:docPr descr="Figure 1: Architecture of Hephaestus. A single dependency-free C core reads the field’s three database dialects (ChemSage .dat, Thermo-Calc .tdb with the Inden magnetic model, and the unified .utdb) and calculates all thermodynamics; the same core is used as a native library, from Python through cffi, and compiled to WebAssembly behind the browser application. dbbuild writes new ChemSage files from measured data, and every energy path is validated against pycalphad." title="" id="2052" name="Picture"/>
             <a:graphic>
               <a:graphicData uri="http://schemas.openxmlformats.org/drawingml/2006/picture">
                 <pic:pic>
                   <pic:nvPicPr>
-                    <pic:cNvPr descr="figures/fig1_architecture.png" id="2010" name="Picture"/>
+                    <pic:cNvPr descr="figures/fig1_architecture.png" id="2053" name="Picture"/>
                     <pic:cNvPicPr>
                       <a:picLocks noChangeArrowheads="1" noChangeAspect="1"/>
                     </pic:cNvPicPr>
                   </pic:nvPicPr>
                   <pic:blipFill>
-                    <a:blip r:embed="rId2008"/>
+                    <a:blip r:embed="rId2051"/>
                     <a:stretch>
                       <a:fillRect/>
                     </a:stretch>
@@ -814,18 +814,18 @@
           <wp:inline>
             <wp:extent cx="4754880" cy="3913308"/>
             <wp:effectExtent b="0" l="0" r="0" t="0"/>
-            <wp:docPr descr="Figure 2: The live solver in the browser application (light theme). The user loads the shipped database, picks a temperature, and presses Compute; the WebAssembly engine then solves the full FeO-MgO-SiO2 phase assemblage client side (here 1023 composition samples and 512 tie-facets in about three seconds). Tapping a composition reads its stable phases and pins it to a comparison list; hovering previews on desktop." title="" id="2012" name="Picture"/>
+            <wp:docPr descr="Figure 2: The live solver in the browser application (light theme). The user loads the shipped database, picks a temperature, and presses Compute; the WebAssembly engine then solves the full FeO-MgO-SiO2 phase assemblage client side (here 1023 composition samples and 512 tie-facets in about three seconds). Tapping a composition reads its stable phases and pins it to a comparison list; hovering previews on desktop." title="" id="2055" name="Picture"/>
             <a:graphic>
               <a:graphicData uri="http://schemas.openxmlformats.org/drawingml/2006/picture">
                 <pic:pic>
                   <pic:nvPicPr>
-                    <pic:cNvPr descr="figures/fig2_browser_app.png" id="2013" name="Picture"/>
+                    <pic:cNvPr descr="figures/fig2_browser_app.png" id="2056" name="Picture"/>
                     <pic:cNvPicPr>
                       <a:picLocks noChangeArrowheads="1" noChangeAspect="1"/>
                     </pic:cNvPicPr>
                   </pic:nvPicPr>
                   <pic:blipFill>
-                    <a:blip r:embed="rId2011"/>
+                    <a:blip r:embed="rId2054"/>
                     <a:stretch>
                       <a:fillRect/>
                     </a:stretch>
@@ -991,18 +991,18 @@
           <wp:inline>
             <wp:extent cx="5334000" cy="2197297"/>
             <wp:effectExtent b="0" l="0" r="0" t="0"/>
-            <wp:docPr descr="Figure 3: The assessed FeO-MgO-SiO2 system calculated from the shipped database files. (a) Liquidus projection: primary crystallizing phase fields, with liquidus isotherms labeled in K. (b) Isothermal section at 1873 K: stable phase assemblages, shaded by the number of solid phases present. Phase labels: L liquid, Crs cristobalite, Ol olivine, Opx orthopyroxene, Per periclase, Wus wustite." title="" id="2015" name="Picture"/>
+            <wp:docPr descr="Figure 3: The assessed FeO-MgO-SiO2 system calculated from the shipped database files. (a) Liquidus projection: primary crystallizing phase fields, with liquidus isotherms labeled in K. (b) Isothermal section at 1873 K: stable phase assemblages, shaded by the number of solid phases present. Phase labels: L liquid, Crs cristobalite, Ol olivine, Opx orthopyroxene, Per periclase, Wus wustite." title="" id="2058" name="Picture"/>
             <a:graphic>
               <a:graphicData uri="http://schemas.openxmlformats.org/drawingml/2006/picture">
                 <pic:pic>
                   <pic:nvPicPr>
-                    <pic:cNvPr descr="figures/fig3_ternary.png" id="2016" name="Picture"/>
+                    <pic:cNvPr descr="figures/fig3_ternary.png" id="2059" name="Picture"/>
                     <pic:cNvPicPr>
                       <a:picLocks noChangeArrowheads="1" noChangeAspect="1"/>
                     </pic:cNvPicPr>
                   </pic:nvPicPr>
                   <pic:blipFill>
-                    <a:blip r:embed="rId2014"/>
+                    <a:blip r:embed="rId2057"/>
                     <a:stretch>
                       <a:fillRect/>
                     </a:stretch>
@@ -1392,8 +1392,8 @@
         </w:tc>
       </w:tr>
     </w:tbl>
-    <w:bookmarkEnd w:id="2017"/>
-    <w:bookmarkStart w:id="2018" w:name="anatomy-of-a-database-file"/>
+    <w:bookmarkEnd w:id="2060"/>
+    <w:bookmarkStart w:id="2061" w:name="anatomy-of-a-database-file"/>
     <w:p>
       <w:pPr>
         <w:pStyle w:val="Heading3"/>
@@ -1426,8 +1426,8 @@
         <w:t xml:space="preserve">That asymmetry is the economics of the field in miniature: implementations of the published models are increasingly available, but each fitted parameter condenses dozens of measurements and decisions. Parameter sets rather than codes are therefore the scarce commodity, and an openly licensed, provenance-tracked database is the part of this contribution that cannot be regenerated from the paper alone.</w:t>
       </w:r>
     </w:p>
-    <w:bookmarkEnd w:id="2018"/>
-    <w:bookmarkStart w:id="2019" w:name="quality-control"/>
+    <w:bookmarkEnd w:id="2061"/>
+    <w:bookmarkStart w:id="2062" w:name="quality-control"/>
     <w:p>
       <w:pPr>
         <w:pStyle w:val="Heading3"/>
@@ -2235,9 +2235,9 @@
         <w:t xml:space="preserve">invariants sit within about 40 K, and the ternary liquidus projection reproduces the measured field topology [24]. Development practice is plain: the repository is version controlled with tagged releases (v0.1.0 through the v0.5.0 described here), the full suite runs before every release, and a fixed bug lands together with the regression test that would have caught it. The suite runs on Windows 11 under CPython 3.11 and 3.12; the browser application is exercised in Chromium- and Gecko-based browsers. A user can confirm a working installation by running pytest against the bundled test databases, or with no installation at all by opening the web application and loading the shipped ternary database.</w:t>
       </w:r>
     </w:p>
-    <w:bookmarkEnd w:id="2019"/>
-    <w:bookmarkEnd w:id="2020"/>
-    <w:bookmarkStart w:id="2028" w:name="availability"/>
+    <w:bookmarkEnd w:id="2062"/>
+    <w:bookmarkEnd w:id="2063"/>
+    <w:bookmarkStart w:id="2071" w:name="availability"/>
     <w:p>
       <w:pPr>
         <w:pStyle w:val="Heading2"/>
@@ -2246,7 +2246,7 @@
         <w:t xml:space="preserve">(2) Availability</w:t>
       </w:r>
     </w:p>
-    <w:bookmarkStart w:id="2021" w:name="operating-system"/>
+    <w:bookmarkStart w:id="2064" w:name="operating-system"/>
     <w:p>
       <w:pPr>
         <w:pStyle w:val="Heading3"/>
@@ -2263,8 +2263,8 @@
         <w:t xml:space="preserve">Platform independent. The core builds with any C99 compiler; development and testing used Windows 11. The browser application runs in any current browser with WebAssembly support.</w:t>
       </w:r>
     </w:p>
-    <w:bookmarkEnd w:id="2021"/>
-    <w:bookmarkStart w:id="2022" w:name="programming-language"/>
+    <w:bookmarkEnd w:id="2064"/>
+    <w:bookmarkStart w:id="2065" w:name="programming-language"/>
     <w:p>
       <w:pPr>
         <w:pStyle w:val="Heading3"/>
@@ -2281,8 +2281,8 @@
         <w:t xml:space="preserve">C (core), Python 3.11 or later (interface and fitting tools), JavaScript (browser application).</w:t>
       </w:r>
     </w:p>
-    <w:bookmarkEnd w:id="2022"/>
-    <w:bookmarkStart w:id="2023" w:name="additional-system-requirements"/>
+    <w:bookmarkEnd w:id="2065"/>
+    <w:bookmarkStart w:id="2066" w:name="additional-system-requirements"/>
     <w:p>
       <w:pPr>
         <w:pStyle w:val="Heading3"/>
@@ -2299,8 +2299,8 @@
         <w:t xml:space="preserve">None of note. The engine and database together are a few megabytes.</w:t>
       </w:r>
     </w:p>
-    <w:bookmarkEnd w:id="2023"/>
-    <w:bookmarkStart w:id="2024" w:name="dependencies"/>
+    <w:bookmarkEnd w:id="2066"/>
+    <w:bookmarkStart w:id="2067" w:name="dependencies"/>
     <w:p>
       <w:pPr>
         <w:pStyle w:val="Heading3"/>
@@ -2317,8 +2317,8 @@
         <w:t xml:space="preserve">Python interface: cffi, NumPy, SciPy (developed and tested with cffi 2.0, NumPy 2.4, and SciPy 1.17). The validation suite additionally requires pycalphad; every oracle comparison reported here ran against pycalphad 0.11.1, and the tests that read pycalphad’s own shipped test databases skip cleanly if a later version relocates them. The WebAssembly build requires emscripten. The C core and the browser application have no dependencies.</w:t>
       </w:r>
     </w:p>
-    <w:bookmarkEnd w:id="2024"/>
-    <w:bookmarkStart w:id="2025" w:name="list-of-contributors"/>
+    <w:bookmarkEnd w:id="2067"/>
+    <w:bookmarkStart w:id="2068" w:name="list-of-contributors"/>
     <w:p>
       <w:pPr>
         <w:pStyle w:val="Heading3"/>
@@ -2335,8 +2335,8 @@
         <w:t xml:space="preserve">Michael E. Bustamante (design, implementation, validation, data curation).</w:t>
       </w:r>
     </w:p>
-    <w:bookmarkEnd w:id="2025"/>
-    <w:bookmarkStart w:id="2026" w:name="software-location"/>
+    <w:bookmarkEnd w:id="2068"/>
+    <w:bookmarkStart w:id="2069" w:name="software-location"/>
     <w:p>
       <w:pPr>
         <w:pStyle w:val="Heading3"/>
@@ -2489,8 +2489,8 @@
         <w:t xml:space="preserve">Date published: 2026-09-02</w:t>
       </w:r>
     </w:p>
-    <w:bookmarkEnd w:id="2026"/>
-    <w:bookmarkStart w:id="2027" w:name="language"/>
+    <w:bookmarkEnd w:id="2069"/>
+    <w:bookmarkStart w:id="2070" w:name="language"/>
     <w:p>
       <w:pPr>
         <w:pStyle w:val="Heading3"/>
@@ -2507,9 +2507,9 @@
         <w:t xml:space="preserve">English.</w:t>
       </w:r>
     </w:p>
-    <w:bookmarkEnd w:id="2027"/>
-    <w:bookmarkEnd w:id="2028"/>
-    <w:bookmarkStart w:id="2045" w:name="reuse-potential"/>
+    <w:bookmarkEnd w:id="2070"/>
+    <w:bookmarkEnd w:id="2071"/>
+    <w:bookmarkStart w:id="2088" w:name="reuse-potential"/>
     <w:p>
       <w:pPr>
         <w:pStyle w:val="Heading2"/>
@@ -2534,7 +2534,7 @@
         <w:t xml:space="preserve">The browser application makes the lowest barrier the default. A lecture on slag thermodynamics, a plant metallurgist screening a composition, or a reviewer checking a claimed equilibrium can load the database and calculate in seconds, with confidential inputs never leaving the machine. The same property makes it a practical template for other groups who want to publish a model as a zero-install tool.</w:t>
       </w:r>
     </w:p>
-    <w:bookmarkStart w:id="2044" w:name="worked-examples"/>
+    <w:bookmarkStart w:id="2087" w:name="worked-examples"/>
     <w:p>
       <w:pPr>
         <w:pStyle w:val="Heading3"/>
@@ -2746,18 +2746,18 @@
           <wp:inline>
             <wp:extent cx="4206240" cy="3262561"/>
             <wp:effectExtent b="0" l="0" r="0" t="0"/>
-            <wp:docPr descr="Figure 4: The LiCl-KCl phase diagram calculated by the salt listing from the shipped open database, at the listing’s own step size. Light to dark: liquid, two-phase, and subsolidus fields. The dot is the calculated eutectic at this step size (0.400, 640 K); the star is the measured eutectic (0.415, 626 K)." title="" id="2030" name="Picture"/>
+            <wp:docPr descr="Figure 4: The LiCl-KCl phase diagram calculated by the salt listing from the shipped open database, at the listing’s own step size. Light to dark: liquid, two-phase, and subsolidus fields. The dot is the calculated eutectic at this step size (0.400, 640 K); the star is the measured eutectic (0.415, 626 K)." title="" id="2073" name="Picture"/>
             <a:graphic>
               <a:graphicData uri="http://schemas.openxmlformats.org/drawingml/2006/picture">
                 <pic:pic>
                   <pic:nvPicPr>
-                    <pic:cNvPr descr="figures/fig4_salt_example.png" id="2031" name="Picture"/>
+                    <pic:cNvPr descr="figures/fig4_salt_example.png" id="2074" name="Picture"/>
                     <pic:cNvPicPr>
                       <a:picLocks noChangeArrowheads="1" noChangeAspect="1"/>
                     </pic:cNvPicPr>
                   </pic:nvPicPr>
                   <pic:blipFill>
-                    <a:blip r:embed="rId2029"/>
+                    <a:blip r:embed="rId2072"/>
                     <a:stretch>
                       <a:fillRect/>
                     </a:stretch>
@@ -2992,18 +2992,18 @@
           <wp:inline>
             <wp:extent cx="4206240" cy="3262561"/>
             <wp:effectExtent b="0" l="0" r="0" t="0"/>
-            <wp:docPr descr="Figure 5: The Al-Zn phase diagram calculated by the alloy listing from the shipped open TDB. Light to dark: liquid, liquid plus solid, and solid fields. The dot is the calculated eutectic (0.890, 660 K); the star is the assessed eutectic (0.885, 654 K)." title="" id="2033" name="Picture"/>
+            <wp:docPr descr="Figure 5: The Al-Zn phase diagram calculated by the alloy listing from the shipped open TDB. Light to dark: liquid, liquid plus solid, and solid fields. The dot is the calculated eutectic (0.890, 660 K); the star is the assessed eutectic (0.885, 654 K)." title="" id="2076" name="Picture"/>
             <a:graphic>
               <a:graphicData uri="http://schemas.openxmlformats.org/drawingml/2006/picture">
                 <pic:pic>
                   <pic:nvPicPr>
-                    <pic:cNvPr descr="figures/fig5_alloy_example.png" id="2034" name="Picture"/>
+                    <pic:cNvPr descr="figures/fig5_alloy_example.png" id="2077" name="Picture"/>
                     <pic:cNvPicPr>
                       <a:picLocks noChangeArrowheads="1" noChangeAspect="1"/>
                     </pic:cNvPicPr>
                   </pic:nvPicPr>
                   <pic:blipFill>
-                    <a:blip r:embed="rId2032"/>
+                    <a:blip r:embed="rId2075"/>
                     <a:stretch>
                       <a:fillRect/>
                     </a:stretch>
@@ -3124,18 +3124,18 @@
           <wp:inline>
             <wp:extent cx="5334000" cy="4430576"/>
             <wp:effectExtent b="0" l="0" r="0" t="0"/>
-            <wp:docPr descr="Figure 6: One unified (.utdb) file, two physics, calculated in the browser. (a) The steelmaking database loaded with the Melt/Alloy view toggle on Alloy; the engine calculates the Fe-C phase diagram through the magnetic compound energy formalism, rendered over a 0-25 mol% C composition window (the equilibrium always solves the whole join), with two tapped compositions pinned. (b) Scheil solidification for the same join at 4 mol% C, first solid at 1741 K and the residual liquid frozen by 1433 K, against the equilibrium lever-rule path (dashed). The file’s slag half is a Modified Quasichemical Model liquid; no legacy container holds both models at once." title="" id="2036" name="Picture"/>
+            <wp:docPr descr="Figure 6: One unified (.utdb) file, two physics, calculated in the browser. (a) The steelmaking database loaded with the Melt/Alloy view toggle on Alloy; the engine calculates the Fe-C phase diagram through the magnetic compound energy formalism, rendered over a 0-25 mol% C composition window (the equilibrium always solves the whole join), with two tapped compositions pinned. (b) Scheil solidification for the same join at 4 mol% C, first solid at 1741 K and the residual liquid frozen by 1433 K, against the equilibrium lever-rule path (dashed). The file’s slag half is a Modified Quasichemical Model liquid; no legacy container holds both models at once." title="" id="2079" name="Picture"/>
             <a:graphic>
               <a:graphicData uri="http://schemas.openxmlformats.org/drawingml/2006/picture">
                 <pic:pic>
                   <pic:nvPicPr>
-                    <pic:cNvPr descr="figures/fig6_utdb_steel.png" id="2037" name="Picture"/>
+                    <pic:cNvPr descr="figures/fig6_utdb_steel.png" id="2080" name="Picture"/>
                     <pic:cNvPicPr>
                       <a:picLocks noChangeArrowheads="1" noChangeAspect="1"/>
                     </pic:cNvPicPr>
                   </pic:nvPicPr>
                   <pic:blipFill>
-                    <a:blip r:embed="rId2035"/>
+                    <a:blip r:embed="rId2078"/>
                     <a:stretch>
                       <a:fillRect/>
                     </a:stretch>
@@ -3179,18 +3179,18 @@
           <wp:inline>
             <wp:extent cx="5334000" cy="2319130"/>
             <wp:effectExtent b="0" l="0" r="0" t="0"/>
-            <wp:docPr descr="Figure 7: The gas calculator as a steelmaking worked example, the equilibrium of a carbon-oxygen furnace gas by the Hephaestus gas engine (the NASA-polynomial element-potential solver compiled into the browser), with Cantera as the independent check. (a) Oxygen partial pressure against the CO to CO2 ratio at the 1873 K tap temperature: a lower ratio is more oxidizing and drives iron into the slag as FeO, a higher ratio is more reducing and decarburizes the steel. (b) The same oxygen potential against temperature for four fixed CO to CO2 buffers, showing that a given gas grows more oxidizing as it heats; the dashed line marks the tap temperature. Open circles are Cantera, agreeing to about 10-5 mole fraction across the field." title="" id="2039" name="Picture"/>
+            <wp:docPr descr="Figure 7: The gas calculator as a steelmaking worked example, the equilibrium of a carbon-oxygen furnace gas by the Hephaestus gas engine (the NASA-polynomial element-potential solver compiled into the browser), with Cantera as the independent check. (a) Oxygen partial pressure against the CO to CO2 ratio at the 1873 K tap temperature: a lower ratio is more oxidizing and drives iron into the slag as FeO, a higher ratio is more reducing and decarburizes the steel. (b) The same oxygen potential against temperature for four fixed CO to CO2 buffers, showing that a given gas grows more oxidizing as it heats; the dashed line marks the tap temperature. Open circles are Cantera, agreeing to about 10-5 mole fraction across the field." title="" id="2082" name="Picture"/>
             <a:graphic>
               <a:graphicData uri="http://schemas.openxmlformats.org/drawingml/2006/picture">
                 <pic:pic>
                   <pic:nvPicPr>
-                    <pic:cNvPr descr="figures/fig7_gas_steel.png" id="2040" name="Picture"/>
+                    <pic:cNvPr descr="figures/fig7_gas_steel.png" id="2083" name="Picture"/>
                     <pic:cNvPicPr>
                       <a:picLocks noChangeArrowheads="1" noChangeAspect="1"/>
                     </pic:cNvPicPr>
                   </pic:nvPicPr>
                   <pic:blipFill>
-                    <a:blip r:embed="rId2038"/>
+                    <a:blip r:embed="rId2081"/>
                     <a:stretch>
                       <a:fillRect/>
                     </a:stretch>
@@ -3270,18 +3270,18 @@
           <wp:inline>
             <wp:extent cx="4572000" cy="3556000"/>
             <wp:effectExtent b="0" l="0" r="0" t="0"/>
-            <wp:docPr descr="Figure 8: Al-Zn phase diagram with ESPEI parameter uncertainty. The liquid and face-centred-cubic (fcc) excess parameters were refit by Markov-chain Monte Carlo to the measured liquid enthalpy of mixing (Debski et al., digitized from Dinsdale et al. [44]) and the assessed phase boundaries (Massalski [45]; Mey [39]), and the posterior was propagated through the engine. The solid line is the median liquidus and the dashed line the median fcc solvus; the shaded region is the 90 percent posterior band on each. The band is narrow on the liquidus, which the calorimetry constrains, and wider on the fcc solvus, which only the diagram constrains. It is the posterior of the three refitted excess parameters with the unary functions and unfitted phases held fixed, a parametric uncertainty within the model rather than a total one. The open circle is the eutectic reported by Massalski [45] (x(Zn) = 0.887, 654 K)." title="" id="2042" name="Picture"/>
+            <wp:docPr descr="Figure 8: Al-Zn phase diagram with ESPEI parameter uncertainty. The liquid and face-centred-cubic (fcc) excess parameters were refit by Markov-chain Monte Carlo to the measured liquid enthalpy of mixing (Debski et al., digitized from Dinsdale et al. [44]) and the assessed phase boundaries (Massalski [45]; Mey [39]), and the posterior was propagated through the engine. The solid line is the median liquidus and the dashed line the median fcc solvus; the shaded region is the 90 percent posterior band on each. The band is narrow on the liquidus, which the calorimetry constrains, and wider on the fcc solvus, which only the diagram constrains. It is the posterior of the three refitted excess parameters with the unary functions and unfitted phases held fixed, a parametric uncertainty within the model rather than a total one. The open circle is the eutectic reported by Massalski [45] (x(Zn) = 0.887, 654 K)." title="" id="2085" name="Picture"/>
             <a:graphic>
               <a:graphicData uri="http://schemas.openxmlformats.org/drawingml/2006/picture">
                 <pic:pic>
                   <pic:nvPicPr>
-                    <pic:cNvPr descr="figures/fig8_uq_alzn.png" id="2043" name="Picture"/>
+                    <pic:cNvPr descr="figures/fig8_uq_alzn.png" id="2086" name="Picture"/>
                     <pic:cNvPicPr>
                       <a:picLocks noChangeArrowheads="1" noChangeAspect="1"/>
                     </pic:cNvPicPr>
                   </pic:nvPicPr>
                   <pic:blipFill>
-                    <a:blip r:embed="rId2041"/>
+                    <a:blip r:embed="rId2084"/>
                     <a:stretch>
                       <a:fillRect/>
                     </a:stretch>
@@ -3324,9 +3324,9 @@
         <w:t xml:space="preserve">The gap the present work addresses was never the model, which has been published for two decades, but an open, runnable pairing of model and parameters. Hephaestus supplies both halves under open licenses and puts them behind a browser page that asks nothing of its user. The claims are checkable end to end. Release v0.5.0 archives the exact version described, and the 132-test suite reruns the pycalphad comparisons on any machine. The worked examples print the figures shown, and every parameter in every shipped database traces to a published measurement through its provenance file. A reader who doubts a number can recalculate it; one who needs a system that is missing can build it with the same open tools, or ask.</w:t>
       </w:r>
     </w:p>
-    <w:bookmarkEnd w:id="2044"/>
-    <w:bookmarkEnd w:id="2045"/>
-    <w:bookmarkStart w:id="2046" w:name="data-availability"/>
+    <w:bookmarkEnd w:id="2087"/>
+    <w:bookmarkEnd w:id="2088"/>
+    <w:bookmarkStart w:id="2089" w:name="data-availability"/>
     <w:p>
       <w:pPr>
         <w:pStyle w:val="Heading2"/>
@@ -3343,8 +3343,8 @@
         <w:t xml:space="preserve">The engine, the database, the browser application, and the validation suite are openly available in the code repository listed above; the version described here is archived as release v0.5.0. The database files and their provenance records are in the repository’s data directory under CC BY 4.0.</w:t>
       </w:r>
     </w:p>
-    <w:bookmarkEnd w:id="2046"/>
-    <w:bookmarkStart w:id="2047" w:name="acknowledgements"/>
+    <w:bookmarkEnd w:id="2089"/>
+    <w:bookmarkStart w:id="2090" w:name="acknowledgements"/>
     <w:p>
       <w:pPr>
         <w:pStyle w:val="Heading2"/>
@@ -3361,8 +3361,8 @@
         <w:t xml:space="preserve">During the development of this software the author used Claude Code (Anthropic) to assist with implementation, validation scripting, and manuscript preparation. This assistance was agentic, not autonomous: it operated under author direction and supervision at every step and was never a closed loop that produced or accepted results without review. Every parameter was traced by the author to its primary source before entering the database, and every reference was verified against its registry record. The author reviewed and approved all output and takes full responsibility for this article.</w:t>
       </w:r>
     </w:p>
-    <w:bookmarkEnd w:id="2047"/>
-    <w:bookmarkStart w:id="2048" w:name="funding-statement"/>
+    <w:bookmarkEnd w:id="2090"/>
+    <w:bookmarkStart w:id="2091" w:name="funding-statement"/>
     <w:p>
       <w:pPr>
         <w:pStyle w:val="Heading2"/>
@@ -3379,8 +3379,8 @@
         <w:t xml:space="preserve">The development of this software received no external funding.</w:t>
       </w:r>
     </w:p>
-    <w:bookmarkEnd w:id="2048"/>
-    <w:bookmarkStart w:id="2049" w:name="competing-interests"/>
+    <w:bookmarkEnd w:id="2091"/>
+    <w:bookmarkStart w:id="2092" w:name="competing-interests"/>
     <w:p>
       <w:pPr>
         <w:pStyle w:val="Heading2"/>
@@ -3397,8 +3397,8 @@
         <w:t xml:space="preserve">The author founded Odinzen LLC, which provides commercial thermodynamic modeling services, and declares this as a competing interest. The software and database published here are released in full under open licenses, and no proprietary Odinzen assets are included.</w:t>
       </w:r>
     </w:p>
-    <w:bookmarkEnd w:id="2049"/>
-    <w:bookmarkStart w:id="2050" w:name="references"/>
+    <w:bookmarkEnd w:id="2092"/>
+    <w:bookmarkStart w:id="2093" w:name="references"/>
     <w:p>
       <w:pPr>
         <w:pStyle w:val="Heading2"/>
@@ -3779,8 +3779,8 @@
         <w:t xml:space="preserve">[45] Massalski TB, editor. Binary Alloy Phase Diagrams. 2nd ed. Materials Park (OH): ASM International; 1990.</w:t>
       </w:r>
     </w:p>
-    <w:bookmarkEnd w:id="2050"/>
-    <w:bookmarkEnd w:id="2051"/>
+    <w:bookmarkEnd w:id="2093"/>
+    <w:bookmarkEnd w:id="2094"/>
     <w:sectPr>
       <w:footnotePr>
         <w:numRestart w:val="eachSect"/>

</xml_diff>

<commit_message>
Figure 8 for the gas-flux coupling; note the OCASI interface
Adds a worked-example figure for the chloride fume: (a) fume partial pressures
p_i = a_i * p_i^o against temperature, (b) flux vs fume composition at 1200 K,
the MgCl2 suppression at a glance (a fifth of the flux, a few percent of the
fume). Generated from the engine by figures/make_fig8_flux.py. The old UQ figure
becomes Figure 9 (file renamed to match); argus order confirms figures 1..9,
tables 1..3, and 45 citations all numbered and in sequence.

Manuscript also now names the OCASI/TQ-shaped application interface in the reuse
paragraph (drive-OpenCalphad software can bind this engine, in the browser and
under permissive licenses; checked against pycalphad in the suite), and updates
the suite size to 137 tests.

Co-Authored-By: Claude Opus 4.8 <noreply@anthropic.com>
</commit_message>
<xml_diff>
--- a/paper/Bustamante_Hephaestus_JORS_manuscript.docx
+++ b/paper/Bustamante_Hephaestus_JORS_manuscript.docx
@@ -2,7 +2,7 @@
 <file path=word/document.xml><?xml version="1.0" encoding="utf-8"?>
 <w:document xmlns:w="http://schemas.openxmlformats.org/wordprocessingml/2006/main" xmlns:m="http://schemas.openxmlformats.org/officeDocument/2006/math" xmlns:r="http://schemas.openxmlformats.org/officeDocument/2006/relationships" xmlns:o="urn:schemas-microsoft-com:office:office" xmlns:v="urn:schemas-microsoft-com:vml" xmlns:w10="urn:schemas-microsoft-com:office:word" xmlns:a="http://schemas.openxmlformats.org/drawingml/2006/main" xmlns:pic="http://schemas.openxmlformats.org/drawingml/2006/picture" xmlns:wp="http://schemas.openxmlformats.org/drawingml/2006/wordprocessingDrawing">
   <w:body>
-    <w:bookmarkStart w:id="2094" w:name="X4855b1162e70238fd839d871e0792397dc58430"/>
+    <w:bookmarkStart w:id="2140" w:name="X4855b1162e70238fd839d871e0792397dc58430"/>
     <w:p>
       <w:pPr>
         <w:pStyle w:val="Heading1"/>
@@ -159,7 +159,7 @@
         <w:t xml:space="preserve">CALPHAD; molten slag; molten salt; modified quasichemical model; thermodynamic database; phase diagram; gas equilibrium; WebAssembly; open data</w:t>
       </w:r>
     </w:p>
-    <w:bookmarkStart w:id="2063" w:name="overview"/>
+    <w:bookmarkStart w:id="2106" w:name="overview"/>
     <w:p>
       <w:pPr>
         <w:pStyle w:val="Heading2"/>
@@ -168,7 +168,7 @@
         <w:t xml:space="preserve">(1) Overview</w:t>
       </w:r>
     </w:p>
-    <w:bookmarkStart w:id="2050" w:name="introduction"/>
+    <w:bookmarkStart w:id="2093" w:name="introduction"/>
     <w:p>
       <w:pPr>
         <w:pStyle w:val="Heading3"/>
@@ -548,8 +548,8 @@
         <w:t xml:space="preserve">Hephaestus is a deliberate response to that gap, and it treats the engine and the data as one contribution because neither is useful alone. The engine is small on purpose. Its core is plain C with no dependencies, which makes it easy to embed and lets the identical code compile to WebAssembly, so the full calculator runs in a web browser with nothing installed and no data leaving the user’s machine. The database is open on purpose. Every parameter in it derives from published measurements, each value carries its provenance down to table and page, and the known shortcomings are documented next to the numbers they affect. The present work describes both, their validation against pycalphad and against measured phase equilibria, and the ways they can be reused. None of it asks the reader to program. For the experimentalist who never writes code, the browser application is the entire product: a page to open, a database to click, and a diagram to read. The sections that follow describe the machinery underneath for those who want it. Supplementary Material S1 is a plain-language primer for the non-programmer, starting at what a database file is and ending at a first calculation and how to read it. Its closing section teaches what an assessment is built from, so a reader who wants to contribute data for open publication, or to commission a file, arrives knowing what is needed.</w:t>
       </w:r>
     </w:p>
-    <w:bookmarkEnd w:id="2050"/>
-    <w:bookmarkStart w:id="2060" w:name="implementation-and-architecture"/>
+    <w:bookmarkEnd w:id="2093"/>
+    <w:bookmarkStart w:id="2103" w:name="implementation-and-architecture"/>
     <w:p>
       <w:pPr>
         <w:pStyle w:val="Heading3"/>
@@ -575,18 +575,18 @@
           <wp:inline>
             <wp:extent cx="5334000" cy="3511167"/>
             <wp:effectExtent b="0" l="0" r="0" t="0"/>
-            <wp:docPr descr="Figure 1: Architecture of Hephaestus. A single dependency-free C core reads the field’s three database dialects (ChemSage .dat, Thermo-Calc .tdb with the Inden magnetic model, and the unified .utdb) and calculates all thermodynamics; the same core is used as a native library, from Python through cffi, and compiled to WebAssembly behind the browser application. dbbuild writes new ChemSage files from measured data, and every energy path is validated against pycalphad." title="" id="2052" name="Picture"/>
+            <wp:docPr descr="Figure 1: Architecture of Hephaestus. A single dependency-free C core reads the field’s three database dialects (ChemSage .dat, Thermo-Calc .tdb with the Inden magnetic model, and the unified .utdb) and calculates all thermodynamics; the same core is used as a native library, from Python through cffi, and compiled to WebAssembly behind the browser application. dbbuild writes new ChemSage files from measured data, and every energy path is validated against pycalphad." title="" id="2095" name="Picture"/>
             <a:graphic>
               <a:graphicData uri="http://schemas.openxmlformats.org/drawingml/2006/picture">
                 <pic:pic>
                   <pic:nvPicPr>
-                    <pic:cNvPr descr="figures/fig1_architecture.png" id="2053" name="Picture"/>
+                    <pic:cNvPr descr="figures/fig1_architecture.png" id="2096" name="Picture"/>
                     <pic:cNvPicPr>
                       <a:picLocks noChangeArrowheads="1" noChangeAspect="1"/>
                     </pic:cNvPicPr>
                   </pic:nvPicPr>
                   <pic:blipFill>
-                    <a:blip r:embed="rId2051"/>
+                    <a:blip r:embed="rId2094"/>
                     <a:stretch>
                       <a:fillRect/>
                     </a:stretch>
@@ -814,18 +814,18 @@
           <wp:inline>
             <wp:extent cx="4754880" cy="3913308"/>
             <wp:effectExtent b="0" l="0" r="0" t="0"/>
-            <wp:docPr descr="Figure 2: The live solver in the browser application (light theme). The user loads the shipped database, picks a temperature, and presses Compute; the WebAssembly engine then solves the full FeO-MgO-SiO2 phase assemblage client side (here 1023 composition samples and 512 tie-facets in about three seconds). Tapping a composition reads its stable phases and pins it to a comparison list; hovering previews on desktop." title="" id="2055" name="Picture"/>
+            <wp:docPr descr="Figure 2: The live solver in the browser application (light theme). The user loads the shipped database, picks a temperature, and presses Compute; the WebAssembly engine then solves the full FeO-MgO-SiO2 phase assemblage client side (here 1023 composition samples and 512 tie-facets in about three seconds). Tapping a composition reads its stable phases and pins it to a comparison list; hovering previews on desktop." title="" id="2098" name="Picture"/>
             <a:graphic>
               <a:graphicData uri="http://schemas.openxmlformats.org/drawingml/2006/picture">
                 <pic:pic>
                   <pic:nvPicPr>
-                    <pic:cNvPr descr="figures/fig2_browser_app.png" id="2056" name="Picture"/>
+                    <pic:cNvPr descr="figures/fig2_browser_app.png" id="2099" name="Picture"/>
                     <pic:cNvPicPr>
                       <a:picLocks noChangeArrowheads="1" noChangeAspect="1"/>
                     </pic:cNvPicPr>
                   </pic:nvPicPr>
                   <pic:blipFill>
-                    <a:blip r:embed="rId2054"/>
+                    <a:blip r:embed="rId2097"/>
                     <a:stretch>
                       <a:fillRect/>
                     </a:stretch>
@@ -991,18 +991,18 @@
           <wp:inline>
             <wp:extent cx="5334000" cy="2197297"/>
             <wp:effectExtent b="0" l="0" r="0" t="0"/>
-            <wp:docPr descr="Figure 3: The assessed FeO-MgO-SiO2 system calculated from the shipped database files. (a) Liquidus projection: primary crystallizing phase fields, with liquidus isotherms labeled in K. (b) Isothermal section at 1873 K: stable phase assemblages, shaded by the number of solid phases present. Phase labels: L liquid, Crs cristobalite, Ol olivine, Opx orthopyroxene, Per periclase, Wus wustite." title="" id="2058" name="Picture"/>
+            <wp:docPr descr="Figure 3: The assessed FeO-MgO-SiO2 system calculated from the shipped database files. (a) Liquidus projection: primary crystallizing phase fields, with liquidus isotherms labeled in K. (b) Isothermal section at 1873 K: stable phase assemblages, shaded by the number of solid phases present. Phase labels: L liquid, Crs cristobalite, Ol olivine, Opx orthopyroxene, Per periclase, Wus wustite." title="" id="2101" name="Picture"/>
             <a:graphic>
               <a:graphicData uri="http://schemas.openxmlformats.org/drawingml/2006/picture">
                 <pic:pic>
                   <pic:nvPicPr>
-                    <pic:cNvPr descr="figures/fig3_ternary.png" id="2059" name="Picture"/>
+                    <pic:cNvPr descr="figures/fig3_ternary.png" id="2102" name="Picture"/>
                     <pic:cNvPicPr>
                       <a:picLocks noChangeArrowheads="1" noChangeAspect="1"/>
                     </pic:cNvPicPr>
                   </pic:nvPicPr>
                   <pic:blipFill>
-                    <a:blip r:embed="rId2057"/>
+                    <a:blip r:embed="rId2100"/>
                     <a:stretch>
                       <a:fillRect/>
                     </a:stretch>
@@ -1392,8 +1392,8 @@
         </w:tc>
       </w:tr>
     </w:tbl>
-    <w:bookmarkEnd w:id="2060"/>
-    <w:bookmarkStart w:id="2061" w:name="anatomy-of-a-database-file"/>
+    <w:bookmarkEnd w:id="2103"/>
+    <w:bookmarkStart w:id="2104" w:name="anatomy-of-a-database-file"/>
     <w:p>
       <w:pPr>
         <w:pStyle w:val="Heading3"/>
@@ -1426,8 +1426,8 @@
         <w:t xml:space="preserve">That asymmetry is the economics of the field in miniature: implementations of the published models are increasingly available, but each fitted parameter condenses dozens of measurements and decisions. Parameter sets rather than codes are therefore the scarce commodity, and an openly licensed, provenance-tracked database is the part of this contribution that cannot be regenerated from the paper alone.</w:t>
       </w:r>
     </w:p>
-    <w:bookmarkEnd w:id="2061"/>
-    <w:bookmarkStart w:id="2062" w:name="quality-control"/>
+    <w:bookmarkEnd w:id="2104"/>
+    <w:bookmarkStart w:id="2105" w:name="quality-control"/>
     <w:p>
       <w:pPr>
         <w:pStyle w:val="Heading3"/>
@@ -2235,9 +2235,9 @@
         <w:t xml:space="preserve">invariants sit within about 40 K, and the ternary liquidus projection reproduces the measured field topology [24]. Development practice is plain: the repository is version controlled with tagged releases (v0.1.0 through the v0.5.0 described here), the full suite runs before every release, and a fixed bug lands together with the regression test that would have caught it. The suite runs on Windows 11 under CPython 3.11 and 3.12; the browser application is exercised in Chromium- and Gecko-based browsers. A user can confirm a working installation by running pytest against the bundled test databases, or with no installation at all by opening the web application and loading the shipped ternary database.</w:t>
       </w:r>
     </w:p>
-    <w:bookmarkEnd w:id="2062"/>
-    <w:bookmarkEnd w:id="2063"/>
-    <w:bookmarkStart w:id="2071" w:name="availability"/>
+    <w:bookmarkEnd w:id="2105"/>
+    <w:bookmarkEnd w:id="2106"/>
+    <w:bookmarkStart w:id="2114" w:name="availability"/>
     <w:p>
       <w:pPr>
         <w:pStyle w:val="Heading2"/>
@@ -2246,7 +2246,7 @@
         <w:t xml:space="preserve">(2) Availability</w:t>
       </w:r>
     </w:p>
-    <w:bookmarkStart w:id="2064" w:name="operating-system"/>
+    <w:bookmarkStart w:id="2107" w:name="operating-system"/>
     <w:p>
       <w:pPr>
         <w:pStyle w:val="Heading3"/>
@@ -2263,8 +2263,8 @@
         <w:t xml:space="preserve">Platform independent. The core builds with any C99 compiler; development and testing used Windows 11. The browser application runs in any current browser with WebAssembly support.</w:t>
       </w:r>
     </w:p>
-    <w:bookmarkEnd w:id="2064"/>
-    <w:bookmarkStart w:id="2065" w:name="programming-language"/>
+    <w:bookmarkEnd w:id="2107"/>
+    <w:bookmarkStart w:id="2108" w:name="programming-language"/>
     <w:p>
       <w:pPr>
         <w:pStyle w:val="Heading3"/>
@@ -2281,8 +2281,8 @@
         <w:t xml:space="preserve">C (core), Python 3.11 or later (interface and fitting tools), JavaScript (browser application).</w:t>
       </w:r>
     </w:p>
-    <w:bookmarkEnd w:id="2065"/>
-    <w:bookmarkStart w:id="2066" w:name="additional-system-requirements"/>
+    <w:bookmarkEnd w:id="2108"/>
+    <w:bookmarkStart w:id="2109" w:name="additional-system-requirements"/>
     <w:p>
       <w:pPr>
         <w:pStyle w:val="Heading3"/>
@@ -2299,8 +2299,8 @@
         <w:t xml:space="preserve">None of note. The engine and database together are a few megabytes.</w:t>
       </w:r>
     </w:p>
-    <w:bookmarkEnd w:id="2066"/>
-    <w:bookmarkStart w:id="2067" w:name="dependencies"/>
+    <w:bookmarkEnd w:id="2109"/>
+    <w:bookmarkStart w:id="2110" w:name="dependencies"/>
     <w:p>
       <w:pPr>
         <w:pStyle w:val="Heading3"/>
@@ -2317,8 +2317,8 @@
         <w:t xml:space="preserve">Python interface: cffi, NumPy, SciPy (developed and tested with cffi 2.0, NumPy 2.4, and SciPy 1.17). The validation suite additionally requires pycalphad; every oracle comparison reported here ran against pycalphad 0.11.1, and the tests that read pycalphad’s own shipped test databases skip cleanly if a later version relocates them. The WebAssembly build requires emscripten. The C core and the browser application have no dependencies.</w:t>
       </w:r>
     </w:p>
-    <w:bookmarkEnd w:id="2067"/>
-    <w:bookmarkStart w:id="2068" w:name="list-of-contributors"/>
+    <w:bookmarkEnd w:id="2110"/>
+    <w:bookmarkStart w:id="2111" w:name="list-of-contributors"/>
     <w:p>
       <w:pPr>
         <w:pStyle w:val="Heading3"/>
@@ -2335,8 +2335,8 @@
         <w:t xml:space="preserve">Michael E. Bustamante (design, implementation, validation, data curation).</w:t>
       </w:r>
     </w:p>
-    <w:bookmarkEnd w:id="2068"/>
-    <w:bookmarkStart w:id="2069" w:name="software-location"/>
+    <w:bookmarkEnd w:id="2111"/>
+    <w:bookmarkStart w:id="2112" w:name="software-location"/>
     <w:p>
       <w:pPr>
         <w:pStyle w:val="Heading3"/>
@@ -2489,8 +2489,8 @@
         <w:t xml:space="preserve">Date published: 2026-09-02</w:t>
       </w:r>
     </w:p>
-    <w:bookmarkEnd w:id="2069"/>
-    <w:bookmarkStart w:id="2070" w:name="language"/>
+    <w:bookmarkEnd w:id="2112"/>
+    <w:bookmarkStart w:id="2113" w:name="language"/>
     <w:p>
       <w:pPr>
         <w:pStyle w:val="Heading3"/>
@@ -2507,9 +2507,9 @@
         <w:t xml:space="preserve">English.</w:t>
       </w:r>
     </w:p>
-    <w:bookmarkEnd w:id="2070"/>
-    <w:bookmarkEnd w:id="2071"/>
-    <w:bookmarkStart w:id="2088" w:name="reuse-potential"/>
+    <w:bookmarkEnd w:id="2113"/>
+    <w:bookmarkEnd w:id="2114"/>
+    <w:bookmarkStart w:id="2134" w:name="reuse-potential"/>
     <w:p>
       <w:pPr>
         <w:pStyle w:val="Heading2"/>
@@ -2523,7 +2523,7 @@
         <w:pStyle w:val="FirstParagraph"/>
       </w:pPr>
       <w:r>
-        <w:t xml:space="preserve">The nearest reuse is interoperation. Every database in the repository’s data directory is a standard ChemSage file: pycalphad opens the same files this engine ships, files written by dbbuild load in both tools, and the test suite enforces that compatibility on every run, so a group already working in pycalphad can adopt the databases alone and ignore the engine. The reverse path holds too. A TDB an OpenCalphad or Thermo-Calc user already has loads in the browser unchanged, within the documented subset. A group that needs an embeddable solver can take the C core, two source directories of C99 with no dependencies, compiled by any C compiler. Its flat application binary interface (ABI) covers database reading, phase and parameter access, Gibbs evaluation, and liquid equilibration, callable from C, Python, or anything with a C foreign-function interface. The WebAssembly build is that same ABI passed through emscripten. Adopting uTDB is a reuse path of its own: the open specification together with the three shipped demonstration files and their round-trip suites amounts to a conformance kit for any implementation that wants to carry MQMQA inside TDB grammar.</w:t>
+        <w:t xml:space="preserve">The nearest reuse is interoperation. Every database in the repository’s data directory is a standard ChemSage file: pycalphad opens the same files this engine ships, files written by dbbuild load in both tools, and the test suite enforces that compatibility on every run, so a group already working in pycalphad can adopt the databases alone and ignore the engine. The reverse path holds too. A TDB an OpenCalphad or Thermo-Calc user already has loads in the browser unchanged, within the documented subset. A group that needs an embeddable solver can take the C core, two source directories of C99 with no dependencies, compiled by any C compiler. Its flat application binary interface (ABI) covers database reading, phase and parameter access, Gibbs evaluation, and liquid equilibration, callable from C, Python, or anything with a C foreign-function interface. The WebAssembly build is that same ABI passed through emscripten. The same core also exposes a thermodynamic application interface shaped like OpenCalphad’s OCASI (the de-facto embedding standard, descended from Thermo-Calc’s TQ), written clean-room from its documented semantics, so software built to drive OpenCalphad can bind this engine instead and run where the GPL Fortran reference cannot, in the browser and inside permissively or closed-licensed products; the interface is checked against pycalphad in the suite. Adopting uTDB is a reuse path of its own: the open specification together with the three shipped demonstration files and their round-trip suites amounts to a conformance kit for any implementation that wants to carry MQMQA inside TDB grammar.</w:t>
       </w:r>
     </w:p>
     <w:p>
@@ -2534,7 +2534,7 @@
         <w:t xml:space="preserve">The browser application makes the lowest barrier the default. A lecture on slag thermodynamics, a plant metallurgist screening a composition, or a reviewer checking a claimed equilibrium can load the database and calculate in seconds, with confidential inputs never leaving the machine. The same property makes it a practical template for other groups who want to publish a model as a zero-install tool.</w:t>
       </w:r>
     </w:p>
-    <w:bookmarkStart w:id="2087" w:name="worked-examples"/>
+    <w:bookmarkStart w:id="2133" w:name="worked-examples"/>
     <w:p>
       <w:pPr>
         <w:pStyle w:val="Heading3"/>
@@ -2746,18 +2746,18 @@
           <wp:inline>
             <wp:extent cx="4206240" cy="3262561"/>
             <wp:effectExtent b="0" l="0" r="0" t="0"/>
-            <wp:docPr descr="Figure 4: The LiCl-KCl phase diagram calculated by the salt listing from the shipped open database, at the listing’s own step size. Light to dark: liquid, two-phase, and subsolidus fields. The dot is the calculated eutectic at this step size (0.400, 640 K); the star is the measured eutectic (0.415, 626 K)." title="" id="2073" name="Picture"/>
+            <wp:docPr descr="Figure 4: The LiCl-KCl phase diagram calculated by the salt listing from the shipped open database, at the listing’s own step size. Light to dark: liquid, two-phase, and subsolidus fields. The dot is the calculated eutectic at this step size (0.400, 640 K); the star is the measured eutectic (0.415, 626 K)." title="" id="2116" name="Picture"/>
             <a:graphic>
               <a:graphicData uri="http://schemas.openxmlformats.org/drawingml/2006/picture">
                 <pic:pic>
                   <pic:nvPicPr>
-                    <pic:cNvPr descr="figures/fig4_salt_example.png" id="2074" name="Picture"/>
+                    <pic:cNvPr descr="figures/fig4_salt_example.png" id="2117" name="Picture"/>
                     <pic:cNvPicPr>
                       <a:picLocks noChangeArrowheads="1" noChangeAspect="1"/>
                     </pic:cNvPicPr>
                   </pic:nvPicPr>
                   <pic:blipFill>
-                    <a:blip r:embed="rId2072"/>
+                    <a:blip r:embed="rId2115"/>
                     <a:stretch>
                       <a:fillRect/>
                     </a:stretch>
@@ -2992,18 +2992,18 @@
           <wp:inline>
             <wp:extent cx="4206240" cy="3262561"/>
             <wp:effectExtent b="0" l="0" r="0" t="0"/>
-            <wp:docPr descr="Figure 5: The Al-Zn phase diagram calculated by the alloy listing from the shipped open TDB. Light to dark: liquid, liquid plus solid, and solid fields. The dot is the calculated eutectic (0.890, 660 K); the star is the assessed eutectic (0.885, 654 K)." title="" id="2076" name="Picture"/>
+            <wp:docPr descr="Figure 5: The Al-Zn phase diagram calculated by the alloy listing from the shipped open TDB. Light to dark: liquid, liquid plus solid, and solid fields. The dot is the calculated eutectic (0.890, 660 K); the star is the assessed eutectic (0.885, 654 K)." title="" id="2119" name="Picture"/>
             <a:graphic>
               <a:graphicData uri="http://schemas.openxmlformats.org/drawingml/2006/picture">
                 <pic:pic>
                   <pic:nvPicPr>
-                    <pic:cNvPr descr="figures/fig5_alloy_example.png" id="2077" name="Picture"/>
+                    <pic:cNvPr descr="figures/fig5_alloy_example.png" id="2120" name="Picture"/>
                     <pic:cNvPicPr>
                       <a:picLocks noChangeArrowheads="1" noChangeAspect="1"/>
                     </pic:cNvPicPr>
                   </pic:nvPicPr>
                   <pic:blipFill>
-                    <a:blip r:embed="rId2075"/>
+                    <a:blip r:embed="rId2118"/>
                     <a:stretch>
                       <a:fillRect/>
                     </a:stretch>
@@ -3112,7 +3112,7 @@
         <w:t xml:space="preserve"> </w:t>
       </w:r>
       <w:r>
-        <w:t xml:space="preserve">ratio of a carbon-oxygen gas fixes the oxygen partial pressure that decides whether carbon is removed from the steel or iron is oxidized into the slag, both at the 1873 K tap temperature and across the steelmaking range, with the gas engine reproducing Cantera throughout. The same engine also carries parameter uncertainty to the diagram. Refitting the Al-Zn liquid and face-centred-cubic excess parameters against the measured liquid enthalpy of mixing and the assessed phase boundaries [39, 44, 45] by Markov-chain Monte Carlo, and propagating the posterior through the browser calculation, produces the confidence band of Figure 8. Three excess coefficients were sampled, the liquid enthalpy and its temperature term and the face-centred-cubic enthalpy, by an ensemble of eighteen walkers over 1500 steps under ESPEI’s default equal dataset weighting, discarding the first half as burn-in; the walker-mean chains are stationary and well mixed (Gelman-Rubin R-hat at most 1.04), the effective sample size is of order 400, and no pair of parameters correlates above about 0.65. Because only these three excess terms are varied while the SGTE unary functions and the phases not being refitted are held at their assessed values, the band is the parametric posterior within the adopted model, not a total thermodynamic uncertainty. Read that way it is still informative: the liquidus band is narrow because the calorimetry pins the liquid interaction, while the solid-solubility band is wider because only the phase diagram constrains the corresponding parameter, an honest reflection of which measurements do the work. Relative to the XML road of XTDB [15] (Table 1), uTDB is the on-ramp from the installed base, extending files as they are and running in this engine today, with mechanical conversion to XTDB elements the natural bridge once that schema settles. Making the calculator multilingual across the field’s file dialects is the direction of travel. Contributions and issues are handled through the GitHub repository.</w:t>
+        <w:t xml:space="preserve">ratio of a carbon-oxygen gas fixes the oxygen partial pressure that decides whether carbon is removed from the steel or iron is oxidized into the slag, both at the 1873 K tap temperature and across the steelmaking range, with the gas engine reproducing Cantera throughout. The salt side of the same coupling is the fume over a molten chloride flux (Figure 8): each salt evaporates at its engine activity times its measured pure-component vapour pressure, so magnesium chloride, a fifth of the NaCl-KCl-MgCl2 flux, is only a few percent of the fume, because chlorocomplexing holds its activity far below its mole fraction. The engine’s validated activities are what separate that fume from a Raoultian estimate. The same engine also carries parameter uncertainty to the diagram. Refitting the Al-Zn liquid and face-centred-cubic excess parameters against the measured liquid enthalpy of mixing and the assessed phase boundaries [39, 44, 45] by Markov-chain Monte Carlo, and propagating the posterior through the browser calculation, produces the confidence band of Figure 9. Three excess coefficients were sampled, the liquid enthalpy and its temperature term and the face-centred-cubic enthalpy, by an ensemble of eighteen walkers over 1500 steps under ESPEI’s default equal dataset weighting, discarding the first half as burn-in; the walker-mean chains are stationary and well mixed (Gelman-Rubin R-hat at most 1.04), the effective sample size is of order 400, and no pair of parameters correlates above about 0.65. Because only these three excess terms are varied while the SGTE unary functions and the phases not being refitted are held at their assessed values, the band is the parametric posterior within the adopted model, not a total thermodynamic uncertainty. Read that way it is still informative: the liquidus band is narrow because the calorimetry pins the liquid interaction, while the solid-solubility band is wider because only the phase diagram constrains the corresponding parameter, an honest reflection of which measurements do the work. Relative to the XML road of XTDB [15] (Table 1), uTDB is the on-ramp from the installed base, extending files as they are and running in this engine today, with mechanical conversion to XTDB elements the natural bridge once that schema settles. Making the calculator multilingual across the field’s file dialects is the direction of travel. Contributions and issues are handled through the GitHub repository.</w:t>
       </w:r>
     </w:p>
     <w:p>
@@ -3124,18 +3124,18 @@
           <wp:inline>
             <wp:extent cx="5334000" cy="4430576"/>
             <wp:effectExtent b="0" l="0" r="0" t="0"/>
-            <wp:docPr descr="Figure 6: One unified (.utdb) file, two physics, calculated in the browser. (a) The steelmaking database loaded with the Melt/Alloy view toggle on Alloy; the engine calculates the Fe-C phase diagram through the magnetic compound energy formalism, rendered over a 0-25 mol% C composition window (the equilibrium always solves the whole join), with two tapped compositions pinned. (b) Scheil solidification for the same join at 4 mol% C, first solid at 1741 K and the residual liquid frozen by 1433 K, against the equilibrium lever-rule path (dashed). The file’s slag half is a Modified Quasichemical Model liquid; no legacy container holds both models at once." title="" id="2079" name="Picture"/>
+            <wp:docPr descr="Figure 6: One unified (.utdb) file, two physics, calculated in the browser. (a) The steelmaking database loaded with the Melt/Alloy view toggle on Alloy; the engine calculates the Fe-C phase diagram through the magnetic compound energy formalism, rendered over a 0-25 mol% C composition window (the equilibrium always solves the whole join), with two tapped compositions pinned. (b) Scheil solidification for the same join at 4 mol% C, first solid at 1741 K and the residual liquid frozen by 1433 K, against the equilibrium lever-rule path (dashed). The file’s slag half is a Modified Quasichemical Model liquid; no legacy container holds both models at once." title="" id="2122" name="Picture"/>
             <a:graphic>
               <a:graphicData uri="http://schemas.openxmlformats.org/drawingml/2006/picture">
                 <pic:pic>
                   <pic:nvPicPr>
-                    <pic:cNvPr descr="figures/fig6_utdb_steel.png" id="2080" name="Picture"/>
+                    <pic:cNvPr descr="figures/fig6_utdb_steel.png" id="2123" name="Picture"/>
                     <pic:cNvPicPr>
                       <a:picLocks noChangeArrowheads="1" noChangeAspect="1"/>
                     </pic:cNvPicPr>
                   </pic:nvPicPr>
                   <pic:blipFill>
-                    <a:blip r:embed="rId2078"/>
+                    <a:blip r:embed="rId2121"/>
                     <a:stretch>
                       <a:fillRect/>
                     </a:stretch>
@@ -3179,18 +3179,18 @@
           <wp:inline>
             <wp:extent cx="5334000" cy="2319130"/>
             <wp:effectExtent b="0" l="0" r="0" t="0"/>
-            <wp:docPr descr="Figure 7: The gas calculator as a steelmaking worked example, the equilibrium of a carbon-oxygen furnace gas by the Hephaestus gas engine (the NASA-polynomial element-potential solver compiled into the browser), with Cantera as the independent check. (a) Oxygen partial pressure against the CO to CO2 ratio at the 1873 K tap temperature: a lower ratio is more oxidizing and drives iron into the slag as FeO, a higher ratio is more reducing and decarburizes the steel. (b) The same oxygen potential against temperature for four fixed CO to CO2 buffers, showing that a given gas grows more oxidizing as it heats; the dashed line marks the tap temperature. Open circles are Cantera, agreeing to about 10-5 mole fraction across the field." title="" id="2082" name="Picture"/>
+            <wp:docPr descr="Figure 7: The gas calculator as a steelmaking worked example, the equilibrium of a carbon-oxygen furnace gas by the Hephaestus gas engine (the NASA-polynomial element-potential solver compiled into the browser), with Cantera as the independent check. (a) Oxygen partial pressure against the CO to CO2 ratio at the 1873 K tap temperature: a lower ratio is more oxidizing and drives iron into the slag as FeO, a higher ratio is more reducing and decarburizes the steel. (b) The same oxygen potential against temperature for four fixed CO to CO2 buffers, showing that a given gas grows more oxidizing as it heats; the dashed line marks the tap temperature. Open circles are Cantera, agreeing to about 10-5 mole fraction across the field." title="" id="2125" name="Picture"/>
             <a:graphic>
               <a:graphicData uri="http://schemas.openxmlformats.org/drawingml/2006/picture">
                 <pic:pic>
                   <pic:nvPicPr>
-                    <pic:cNvPr descr="figures/fig7_gas_steel.png" id="2083" name="Picture"/>
+                    <pic:cNvPr descr="figures/fig7_gas_steel.png" id="2126" name="Picture"/>
                     <pic:cNvPicPr>
                       <a:picLocks noChangeArrowheads="1" noChangeAspect="1"/>
                     </pic:cNvPicPr>
                   </pic:nvPicPr>
                   <pic:blipFill>
-                    <a:blip r:embed="rId2081"/>
+                    <a:blip r:embed="rId2124"/>
                     <a:stretch>
                       <a:fillRect/>
                     </a:stretch>
@@ -3268,20 +3268,99 @@
       <w:r>
         <w:drawing>
           <wp:inline>
-            <wp:extent cx="4572000" cy="3556000"/>
+            <wp:extent cx="5334000" cy="2319130"/>
             <wp:effectExtent b="0" l="0" r="0" t="0"/>
-            <wp:docPr descr="Figure 8: Al-Zn phase diagram with ESPEI parameter uncertainty. The liquid and face-centred-cubic (fcc) excess parameters were refit by Markov-chain Monte Carlo to the measured liquid enthalpy of mixing (Debski et al., digitized from Dinsdale et al. [44]) and the assessed phase boundaries (Massalski [45]; Mey [39]), and the posterior was propagated through the engine. The solid line is the median liquidus and the dashed line the median fcc solvus; the shaded region is the 90 percent posterior band on each. The band is narrow on the liquidus, which the calorimetry constrains, and wider on the fcc solvus, which only the diagram constrains. It is the posterior of the three refitted excess parameters with the unary functions and unfitted phases held fixed, a parametric uncertainty within the model rather than a total one. The open circle is the eutectic reported by Massalski [45] (x(Zn) = 0.887, 654 K)." title="" id="2085" name="Picture"/>
+            <wp:docPr descr="Figure 8: The gas-flux coupling as a molten-salt worked example, the fume over a NaCl-KCl-MgCl2 = 40/40/20 mol% flux. Each salt’s partial pressure is its engine activity times its measured pure-component vapour pressure (NaCl and KCl from NIST Antoine fits, MgCl2 from the NIST-JANAF gas and liquid Gibbs of formation, each reproducing its measured boiling point; activities from the engine, validated against the pure-composition limit and the near-ideal NaCl-KCl binary). (a) Fume partial pressures against temperature, with the total. (b) Flux composition against fume composition at 1200 K: magnesium chloride is a fifth of the flux but a few percent of the fume, held in the melt by chlorocomplexing that drops its activity well below its mole fraction." title="" id="2128" name="Picture"/>
             <a:graphic>
               <a:graphicData uri="http://schemas.openxmlformats.org/drawingml/2006/picture">
                 <pic:pic>
                   <pic:nvPicPr>
-                    <pic:cNvPr descr="figures/fig8_uq_alzn.png" id="2086" name="Picture"/>
+                    <pic:cNvPr descr="figures/fig8_gas_flux.png" id="2129" name="Picture"/>
                     <pic:cNvPicPr>
                       <a:picLocks noChangeArrowheads="1" noChangeAspect="1"/>
                     </pic:cNvPicPr>
                   </pic:nvPicPr>
                   <pic:blipFill>
-                    <a:blip r:embed="rId2084"/>
+                    <a:blip r:embed="rId2127"/>
+                    <a:stretch>
+                      <a:fillRect/>
+                    </a:stretch>
+                  </pic:blipFill>
+                  <pic:spPr bwMode="auto">
+                    <a:xfrm>
+                      <a:off x="0" y="0"/>
+                      <a:ext cx="5334000" cy="2319130"/>
+                    </a:xfrm>
+                    <a:prstGeom prst="rect">
+                      <a:avLst/>
+                    </a:prstGeom>
+                    <a:noFill/>
+                    <a:ln w="9525">
+                      <a:noFill/>
+                      <a:headEnd/>
+                      <a:tailEnd/>
+                    </a:ln>
+                  </pic:spPr>
+                </pic:pic>
+              </a:graphicData>
+            </a:graphic>
+          </wp:inline>
+        </w:drawing>
+      </w:r>
+    </w:p>
+    <w:p>
+      <w:pPr>
+        <w:pStyle w:val="ImageCaption"/>
+      </w:pPr>
+      <w:r>
+        <w:t xml:space="preserve">Figure 8: The gas-flux coupling as a molten-salt worked example, the fume over a NaCl-KCl-MgCl</w:t>
+      </w:r>
+      <w:r>
+        <w:rPr>
+          <w:vertAlign w:val="subscript"/>
+        </w:rPr>
+        <w:t xml:space="preserve">2</w:t>
+      </w:r>
+      <w:r>
+        <w:t xml:space="preserve"> </w:t>
+      </w:r>
+      <w:r>
+        <w:t xml:space="preserve">= 40/40/20 mol% flux. Each salt’s partial pressure is its engine activity times its measured pure-component vapour pressure (NaCl and KCl from NIST Antoine fits, MgCl</w:t>
+      </w:r>
+      <w:r>
+        <w:rPr>
+          <w:vertAlign w:val="subscript"/>
+        </w:rPr>
+        <w:t xml:space="preserve">2</w:t>
+      </w:r>
+      <w:r>
+        <w:t xml:space="preserve"> </w:t>
+      </w:r>
+      <w:r>
+        <w:t xml:space="preserve">from the NIST-JANAF gas and liquid Gibbs of formation, each reproducing its measured boiling point; activities from the engine, validated against the pure-composition limit and the near-ideal NaCl-KCl binary). (a) Fume partial pressures against temperature, with the total. (b) Flux composition against fume composition at 1200 K: magnesium chloride is a fifth of the flux but a few percent of the fume, held in the melt by chlorocomplexing that drops its activity well below its mole fraction.</w:t>
+      </w:r>
+    </w:p>
+    <w:p>
+      <w:pPr>
+        <w:pStyle w:val="CaptionedFigure"/>
+      </w:pPr>
+      <w:r>
+        <w:drawing>
+          <wp:inline>
+            <wp:extent cx="4572000" cy="3556000"/>
+            <wp:effectExtent b="0" l="0" r="0" t="0"/>
+            <wp:docPr descr="Figure 9: Al-Zn phase diagram with ESPEI parameter uncertainty. The liquid and face-centred-cubic (fcc) excess parameters were refit by Markov-chain Monte Carlo to the measured liquid enthalpy of mixing (Debski et al., digitized from Dinsdale et al. [44]) and the assessed phase boundaries (Massalski [45]; Mey [39]), and the posterior was propagated through the engine. The solid line is the median liquidus and the dashed line the median fcc solvus; the shaded region is the 90 percent posterior band on each. The band is narrow on the liquidus, which the calorimetry constrains, and wider on the fcc solvus, which only the diagram constrains. It is the posterior of the three refitted excess parameters with the unary functions and unfitted phases held fixed, a parametric uncertainty within the model rather than a total one. The open circle is the eutectic reported by Massalski [45] (x(Zn) = 0.887, 654 K)." title="" id="2131" name="Picture"/>
+            <a:graphic>
+              <a:graphicData uri="http://schemas.openxmlformats.org/drawingml/2006/picture">
+                <pic:pic>
+                  <pic:nvPicPr>
+                    <pic:cNvPr descr="figures/fig9_uq_alzn.png" id="2132" name="Picture"/>
+                    <pic:cNvPicPr>
+                      <a:picLocks noChangeArrowheads="1" noChangeAspect="1"/>
+                    </pic:cNvPicPr>
+                  </pic:nvPicPr>
+                  <pic:blipFill>
+                    <a:blip r:embed="rId2130"/>
                     <a:stretch>
                       <a:fillRect/>
                     </a:stretch>
@@ -3313,20 +3392,20 @@
         <w:pStyle w:val="ImageCaption"/>
       </w:pPr>
       <w:r>
-        <w:t xml:space="preserve">Figure 8: Al-Zn phase diagram with ESPEI parameter uncertainty. The liquid and face-centred-cubic (fcc) excess parameters were refit by Markov-chain Monte Carlo to the measured liquid enthalpy of mixing (Debski et al., digitized from Dinsdale et al. [44]) and the assessed phase boundaries (Massalski [45]; Mey [39]), and the posterior was propagated through the engine. The solid line is the median liquidus and the dashed line the median fcc solvus; the shaded region is the 90 percent posterior band on each. The band is narrow on the liquidus, which the calorimetry constrains, and wider on the fcc solvus, which only the diagram constrains. It is the posterior of the three refitted excess parameters with the unary functions and unfitted phases held fixed, a parametric uncertainty within the model rather than a total one. The open circle is the eutectic reported by Massalski [45] (x(Zn) = 0.887, 654 K).</w:t>
-      </w:r>
-    </w:p>
-    <w:p>
-      <w:pPr>
-        <w:pStyle w:val="BodyText"/>
-      </w:pPr>
-      <w:r>
-        <w:t xml:space="preserve">The gap the present work addresses was never the model, which has been published for two decades, but an open, runnable pairing of model and parameters. Hephaestus supplies both halves under open licenses and puts them behind a browser page that asks nothing of its user. The claims are checkable end to end. Release v0.5.0 archives the exact version described, and the 132-test suite reruns the pycalphad comparisons on any machine. The worked examples print the figures shown, and every parameter in every shipped database traces to a published measurement through its provenance file. A reader who doubts a number can recalculate it; one who needs a system that is missing can build it with the same open tools, or ask.</w:t>
-      </w:r>
-    </w:p>
-    <w:bookmarkEnd w:id="2087"/>
-    <w:bookmarkEnd w:id="2088"/>
-    <w:bookmarkStart w:id="2089" w:name="data-availability"/>
+        <w:t xml:space="preserve">Figure 9: Al-Zn phase diagram with ESPEI parameter uncertainty. The liquid and face-centred-cubic (fcc) excess parameters were refit by Markov-chain Monte Carlo to the measured liquid enthalpy of mixing (Debski et al., digitized from Dinsdale et al. [44]) and the assessed phase boundaries (Massalski [45]; Mey [39]), and the posterior was propagated through the engine. The solid line is the median liquidus and the dashed line the median fcc solvus; the shaded region is the 90 percent posterior band on each. The band is narrow on the liquidus, which the calorimetry constrains, and wider on the fcc solvus, which only the diagram constrains. It is the posterior of the three refitted excess parameters with the unary functions and unfitted phases held fixed, a parametric uncertainty within the model rather than a total one. The open circle is the eutectic reported by Massalski [45] (x(Zn) = 0.887, 654 K).</w:t>
+      </w:r>
+    </w:p>
+    <w:p>
+      <w:pPr>
+        <w:pStyle w:val="BodyText"/>
+      </w:pPr>
+      <w:r>
+        <w:t xml:space="preserve">The gap the present work addresses was never the model, which has been published for two decades, but an open, runnable pairing of model and parameters. Hephaestus supplies both halves under open licenses and puts them behind a browser page that asks nothing of its user. The claims are checkable end to end. Release v0.5.0 archives the exact version described, and the 137-test suite reruns the pycalphad comparisons on any machine. The worked examples print the figures shown, and every parameter in every shipped database traces to a published measurement through its provenance file. A reader who doubts a number can recalculate it; one who needs a system that is missing can build it with the same open tools, or ask.</w:t>
+      </w:r>
+    </w:p>
+    <w:bookmarkEnd w:id="2133"/>
+    <w:bookmarkEnd w:id="2134"/>
+    <w:bookmarkStart w:id="2135" w:name="data-availability"/>
     <w:p>
       <w:pPr>
         <w:pStyle w:val="Heading2"/>
@@ -3343,8 +3422,8 @@
         <w:t xml:space="preserve">The engine, the database, the browser application, and the validation suite are openly available in the code repository listed above; the version described here is archived as release v0.5.0. The database files and their provenance records are in the repository’s data directory under CC BY 4.0.</w:t>
       </w:r>
     </w:p>
-    <w:bookmarkEnd w:id="2089"/>
-    <w:bookmarkStart w:id="2090" w:name="acknowledgements"/>
+    <w:bookmarkEnd w:id="2135"/>
+    <w:bookmarkStart w:id="2136" w:name="acknowledgements"/>
     <w:p>
       <w:pPr>
         <w:pStyle w:val="Heading2"/>
@@ -3361,8 +3440,8 @@
         <w:t xml:space="preserve">During the development of this software the author used Claude Code (Anthropic) to assist with implementation, validation scripting, and manuscript preparation. This assistance was agentic, not autonomous: it operated under author direction and supervision at every step and was never a closed loop that produced or accepted results without review. Every parameter was traced by the author to its primary source before entering the database, and every reference was verified against its registry record. The author reviewed and approved all output and takes full responsibility for this article.</w:t>
       </w:r>
     </w:p>
-    <w:bookmarkEnd w:id="2090"/>
-    <w:bookmarkStart w:id="2091" w:name="funding-statement"/>
+    <w:bookmarkEnd w:id="2136"/>
+    <w:bookmarkStart w:id="2137" w:name="funding-statement"/>
     <w:p>
       <w:pPr>
         <w:pStyle w:val="Heading2"/>
@@ -3379,8 +3458,8 @@
         <w:t xml:space="preserve">The development of this software received no external funding.</w:t>
       </w:r>
     </w:p>
-    <w:bookmarkEnd w:id="2091"/>
-    <w:bookmarkStart w:id="2092" w:name="competing-interests"/>
+    <w:bookmarkEnd w:id="2137"/>
+    <w:bookmarkStart w:id="2138" w:name="competing-interests"/>
     <w:p>
       <w:pPr>
         <w:pStyle w:val="Heading2"/>
@@ -3397,8 +3476,8 @@
         <w:t xml:space="preserve">The author founded Odinzen LLC, which provides commercial thermodynamic modeling services, and declares this as a competing interest. The software and database published here are released in full under open licenses, and no proprietary Odinzen assets are included.</w:t>
       </w:r>
     </w:p>
-    <w:bookmarkEnd w:id="2092"/>
-    <w:bookmarkStart w:id="2093" w:name="references"/>
+    <w:bookmarkEnd w:id="2138"/>
+    <w:bookmarkStart w:id="2139" w:name="references"/>
     <w:p>
       <w:pPr>
         <w:pStyle w:val="Heading2"/>
@@ -3779,8 +3858,8 @@
         <w:t xml:space="preserve">[45] Massalski TB, editor. Binary Alloy Phase Diagrams. 2nd ed. Materials Park (OH): ASM International; 1990.</w:t>
       </w:r>
     </w:p>
-    <w:bookmarkEnd w:id="2093"/>
-    <w:bookmarkEnd w:id="2094"/>
+    <w:bookmarkEnd w:id="2139"/>
+    <w:bookmarkEnd w:id="2140"/>
     <w:sectPr>
       <w:footnotePr>
         <w:numRestart w:val="eachSect"/>

</xml_diff>

<commit_message>
Describe release v0.5.1 (this work is past the v0.5.0 tag)
The gas-flux coupling, the OCASI interface note, and the 137-test suite all land
after the published v0.5.0 tag, so the paper now describes v0.5.1: the six
version mentions (release URL, published version, the archived-version claims)
bump to v0.5.1. No code carries a version string. Cut v0.5.1 at this commit so
"archives the exact version described" holds; v0.5.0 stays as the frozen tag.

Co-Authored-By: Claude Opus 4.8 <noreply@anthropic.com>
</commit_message>
<xml_diff>
--- a/paper/Bustamante_Hephaestus_JORS_manuscript.docx
+++ b/paper/Bustamante_Hephaestus_JORS_manuscript.docx
@@ -2,7 +2,7 @@
 <file path=word/document.xml><?xml version="1.0" encoding="utf-8"?>
 <w:document xmlns:w="http://schemas.openxmlformats.org/wordprocessingml/2006/main" xmlns:m="http://schemas.openxmlformats.org/officeDocument/2006/math" xmlns:r="http://schemas.openxmlformats.org/officeDocument/2006/relationships" xmlns:o="urn:schemas-microsoft-com:office:office" xmlns:v="urn:schemas-microsoft-com:vml" xmlns:w10="urn:schemas-microsoft-com:office:word" xmlns:a="http://schemas.openxmlformats.org/drawingml/2006/main" xmlns:pic="http://schemas.openxmlformats.org/drawingml/2006/picture" xmlns:wp="http://schemas.openxmlformats.org/drawingml/2006/wordprocessingDrawing">
   <w:body>
-    <w:bookmarkStart w:id="2140" w:name="X4855b1162e70238fd839d871e0792397dc58430"/>
+    <w:bookmarkStart w:id="2186" w:name="X4855b1162e70238fd839d871e0792397dc58430"/>
     <w:p>
       <w:pPr>
         <w:pStyle w:val="Heading1"/>
@@ -159,7 +159,7 @@
         <w:t xml:space="preserve">CALPHAD; molten slag; molten salt; modified quasichemical model; thermodynamic database; phase diagram; gas equilibrium; WebAssembly; open data</w:t>
       </w:r>
     </w:p>
-    <w:bookmarkStart w:id="2106" w:name="overview"/>
+    <w:bookmarkStart w:id="2152" w:name="overview"/>
     <w:p>
       <w:pPr>
         <w:pStyle w:val="Heading2"/>
@@ -168,7 +168,7 @@
         <w:t xml:space="preserve">(1) Overview</w:t>
       </w:r>
     </w:p>
-    <w:bookmarkStart w:id="2093" w:name="introduction"/>
+    <w:bookmarkStart w:id="2139" w:name="introduction"/>
     <w:p>
       <w:pPr>
         <w:pStyle w:val="Heading3"/>
@@ -548,8 +548,8 @@
         <w:t xml:space="preserve">Hephaestus is a deliberate response to that gap, and it treats the engine and the data as one contribution because neither is useful alone. The engine is small on purpose. Its core is plain C with no dependencies, which makes it easy to embed and lets the identical code compile to WebAssembly, so the full calculator runs in a web browser with nothing installed and no data leaving the user’s machine. The database is open on purpose. Every parameter in it derives from published measurements, each value carries its provenance down to table and page, and the known shortcomings are documented next to the numbers they affect. The present work describes both, their validation against pycalphad and against measured phase equilibria, and the ways they can be reused. None of it asks the reader to program. For the experimentalist who never writes code, the browser application is the entire product: a page to open, a database to click, and a diagram to read. The sections that follow describe the machinery underneath for those who want it. Supplementary Material S1 is a plain-language primer for the non-programmer, starting at what a database file is and ending at a first calculation and how to read it. Its closing section teaches what an assessment is built from, so a reader who wants to contribute data for open publication, or to commission a file, arrives knowing what is needed.</w:t>
       </w:r>
     </w:p>
-    <w:bookmarkEnd w:id="2093"/>
-    <w:bookmarkStart w:id="2103" w:name="implementation-and-architecture"/>
+    <w:bookmarkEnd w:id="2139"/>
+    <w:bookmarkStart w:id="2149" w:name="implementation-and-architecture"/>
     <w:p>
       <w:pPr>
         <w:pStyle w:val="Heading3"/>
@@ -575,18 +575,18 @@
           <wp:inline>
             <wp:extent cx="5334000" cy="3511167"/>
             <wp:effectExtent b="0" l="0" r="0" t="0"/>
-            <wp:docPr descr="Figure 1: Architecture of Hephaestus. A single dependency-free C core reads the field’s three database dialects (ChemSage .dat, Thermo-Calc .tdb with the Inden magnetic model, and the unified .utdb) and calculates all thermodynamics; the same core is used as a native library, from Python through cffi, and compiled to WebAssembly behind the browser application. dbbuild writes new ChemSage files from measured data, and every energy path is validated against pycalphad." title="" id="2095" name="Picture"/>
+            <wp:docPr descr="Figure 1: Architecture of Hephaestus. A single dependency-free C core reads the field’s three database dialects (ChemSage .dat, Thermo-Calc .tdb with the Inden magnetic model, and the unified .utdb) and calculates all thermodynamics; the same core is used as a native library, from Python through cffi, and compiled to WebAssembly behind the browser application. dbbuild writes new ChemSage files from measured data, and every energy path is validated against pycalphad." title="" id="2141" name="Picture"/>
             <a:graphic>
               <a:graphicData uri="http://schemas.openxmlformats.org/drawingml/2006/picture">
                 <pic:pic>
                   <pic:nvPicPr>
-                    <pic:cNvPr descr="figures/fig1_architecture.png" id="2096" name="Picture"/>
+                    <pic:cNvPr descr="figures/fig1_architecture.png" id="2142" name="Picture"/>
                     <pic:cNvPicPr>
                       <a:picLocks noChangeArrowheads="1" noChangeAspect="1"/>
                     </pic:cNvPicPr>
                   </pic:nvPicPr>
                   <pic:blipFill>
-                    <a:blip r:embed="rId2094"/>
+                    <a:blip r:embed="rId2140"/>
                     <a:stretch>
                       <a:fillRect/>
                     </a:stretch>
@@ -814,18 +814,18 @@
           <wp:inline>
             <wp:extent cx="4754880" cy="3913308"/>
             <wp:effectExtent b="0" l="0" r="0" t="0"/>
-            <wp:docPr descr="Figure 2: The live solver in the browser application (light theme). The user loads the shipped database, picks a temperature, and presses Compute; the WebAssembly engine then solves the full FeO-MgO-SiO2 phase assemblage client side (here 1023 composition samples and 512 tie-facets in about three seconds). Tapping a composition reads its stable phases and pins it to a comparison list; hovering previews on desktop." title="" id="2098" name="Picture"/>
+            <wp:docPr descr="Figure 2: The live solver in the browser application (light theme). The user loads the shipped database, picks a temperature, and presses Compute; the WebAssembly engine then solves the full FeO-MgO-SiO2 phase assemblage client side (here 1023 composition samples and 512 tie-facets in about three seconds). Tapping a composition reads its stable phases and pins it to a comparison list; hovering previews on desktop." title="" id="2144" name="Picture"/>
             <a:graphic>
               <a:graphicData uri="http://schemas.openxmlformats.org/drawingml/2006/picture">
                 <pic:pic>
                   <pic:nvPicPr>
-                    <pic:cNvPr descr="figures/fig2_browser_app.png" id="2099" name="Picture"/>
+                    <pic:cNvPr descr="figures/fig2_browser_app.png" id="2145" name="Picture"/>
                     <pic:cNvPicPr>
                       <a:picLocks noChangeArrowheads="1" noChangeAspect="1"/>
                     </pic:cNvPicPr>
                   </pic:nvPicPr>
                   <pic:blipFill>
-                    <a:blip r:embed="rId2097"/>
+                    <a:blip r:embed="rId2143"/>
                     <a:stretch>
                       <a:fillRect/>
                     </a:stretch>
@@ -991,18 +991,18 @@
           <wp:inline>
             <wp:extent cx="5334000" cy="2197297"/>
             <wp:effectExtent b="0" l="0" r="0" t="0"/>
-            <wp:docPr descr="Figure 3: The assessed FeO-MgO-SiO2 system calculated from the shipped database files. (a) Liquidus projection: primary crystallizing phase fields, with liquidus isotherms labeled in K. (b) Isothermal section at 1873 K: stable phase assemblages, shaded by the number of solid phases present. Phase labels: L liquid, Crs cristobalite, Ol olivine, Opx orthopyroxene, Per periclase, Wus wustite." title="" id="2101" name="Picture"/>
+            <wp:docPr descr="Figure 3: The assessed FeO-MgO-SiO2 system calculated from the shipped database files. (a) Liquidus projection: primary crystallizing phase fields, with liquidus isotherms labeled in K. (b) Isothermal section at 1873 K: stable phase assemblages, shaded by the number of solid phases present. Phase labels: L liquid, Crs cristobalite, Ol olivine, Opx orthopyroxene, Per periclase, Wus wustite." title="" id="2147" name="Picture"/>
             <a:graphic>
               <a:graphicData uri="http://schemas.openxmlformats.org/drawingml/2006/picture">
                 <pic:pic>
                   <pic:nvPicPr>
-                    <pic:cNvPr descr="figures/fig3_ternary.png" id="2102" name="Picture"/>
+                    <pic:cNvPr descr="figures/fig3_ternary.png" id="2148" name="Picture"/>
                     <pic:cNvPicPr>
                       <a:picLocks noChangeArrowheads="1" noChangeAspect="1"/>
                     </pic:cNvPicPr>
                   </pic:nvPicPr>
                   <pic:blipFill>
-                    <a:blip r:embed="rId2100"/>
+                    <a:blip r:embed="rId2146"/>
                     <a:stretch>
                       <a:fillRect/>
                     </a:stretch>
@@ -1392,8 +1392,8 @@
         </w:tc>
       </w:tr>
     </w:tbl>
-    <w:bookmarkEnd w:id="2103"/>
-    <w:bookmarkStart w:id="2104" w:name="anatomy-of-a-database-file"/>
+    <w:bookmarkEnd w:id="2149"/>
+    <w:bookmarkStart w:id="2150" w:name="anatomy-of-a-database-file"/>
     <w:p>
       <w:pPr>
         <w:pStyle w:val="Heading3"/>
@@ -1426,8 +1426,8 @@
         <w:t xml:space="preserve">That asymmetry is the economics of the field in miniature: implementations of the published models are increasingly available, but each fitted parameter condenses dozens of measurements and decisions. Parameter sets rather than codes are therefore the scarce commodity, and an openly licensed, provenance-tracked database is the part of this contribution that cannot be regenerated from the paper alone.</w:t>
       </w:r>
     </w:p>
-    <w:bookmarkEnd w:id="2104"/>
-    <w:bookmarkStart w:id="2105" w:name="quality-control"/>
+    <w:bookmarkEnd w:id="2150"/>
+    <w:bookmarkStart w:id="2151" w:name="quality-control"/>
     <w:p>
       <w:pPr>
         <w:pStyle w:val="Heading3"/>
@@ -2232,12 +2232,12 @@
         <w:t xml:space="preserve"> </w:t>
       </w:r>
       <w:r>
-        <w:t xml:space="preserve">invariants sit within about 40 K, and the ternary liquidus projection reproduces the measured field topology [24]. Development practice is plain: the repository is version controlled with tagged releases (v0.1.0 through the v0.5.0 described here), the full suite runs before every release, and a fixed bug lands together with the regression test that would have caught it. The suite runs on Windows 11 under CPython 3.11 and 3.12; the browser application is exercised in Chromium- and Gecko-based browsers. A user can confirm a working installation by running pytest against the bundled test databases, or with no installation at all by opening the web application and loading the shipped ternary database.</w:t>
-      </w:r>
-    </w:p>
-    <w:bookmarkEnd w:id="2105"/>
-    <w:bookmarkEnd w:id="2106"/>
-    <w:bookmarkStart w:id="2114" w:name="availability"/>
+        <w:t xml:space="preserve">invariants sit within about 40 K, and the ternary liquidus projection reproduces the measured field topology [24]. Development practice is plain: the repository is version controlled with tagged releases (v0.1.0 through the v0.5.1 described here), the full suite runs before every release, and a fixed bug lands together with the regression test that would have caught it. The suite runs on Windows 11 under CPython 3.11 and 3.12; the browser application is exercised in Chromium- and Gecko-based browsers. A user can confirm a working installation by running pytest against the bundled test databases, or with no installation at all by opening the web application and loading the shipped ternary database.</w:t>
+      </w:r>
+    </w:p>
+    <w:bookmarkEnd w:id="2151"/>
+    <w:bookmarkEnd w:id="2152"/>
+    <w:bookmarkStart w:id="2160" w:name="availability"/>
     <w:p>
       <w:pPr>
         <w:pStyle w:val="Heading2"/>
@@ -2246,7 +2246,7 @@
         <w:t xml:space="preserve">(2) Availability</w:t>
       </w:r>
     </w:p>
-    <w:bookmarkStart w:id="2107" w:name="operating-system"/>
+    <w:bookmarkStart w:id="2153" w:name="operating-system"/>
     <w:p>
       <w:pPr>
         <w:pStyle w:val="Heading3"/>
@@ -2263,8 +2263,8 @@
         <w:t xml:space="preserve">Platform independent. The core builds with any C99 compiler; development and testing used Windows 11. The browser application runs in any current browser with WebAssembly support.</w:t>
       </w:r>
     </w:p>
-    <w:bookmarkEnd w:id="2107"/>
-    <w:bookmarkStart w:id="2108" w:name="programming-language"/>
+    <w:bookmarkEnd w:id="2153"/>
+    <w:bookmarkStart w:id="2154" w:name="programming-language"/>
     <w:p>
       <w:pPr>
         <w:pStyle w:val="Heading3"/>
@@ -2281,8 +2281,8 @@
         <w:t xml:space="preserve">C (core), Python 3.11 or later (interface and fitting tools), JavaScript (browser application).</w:t>
       </w:r>
     </w:p>
-    <w:bookmarkEnd w:id="2108"/>
-    <w:bookmarkStart w:id="2109" w:name="additional-system-requirements"/>
+    <w:bookmarkEnd w:id="2154"/>
+    <w:bookmarkStart w:id="2155" w:name="additional-system-requirements"/>
     <w:p>
       <w:pPr>
         <w:pStyle w:val="Heading3"/>
@@ -2299,8 +2299,8 @@
         <w:t xml:space="preserve">None of note. The engine and database together are a few megabytes.</w:t>
       </w:r>
     </w:p>
-    <w:bookmarkEnd w:id="2109"/>
-    <w:bookmarkStart w:id="2110" w:name="dependencies"/>
+    <w:bookmarkEnd w:id="2155"/>
+    <w:bookmarkStart w:id="2156" w:name="dependencies"/>
     <w:p>
       <w:pPr>
         <w:pStyle w:val="Heading3"/>
@@ -2317,8 +2317,8 @@
         <w:t xml:space="preserve">Python interface: cffi, NumPy, SciPy (developed and tested with cffi 2.0, NumPy 2.4, and SciPy 1.17). The validation suite additionally requires pycalphad; every oracle comparison reported here ran against pycalphad 0.11.1, and the tests that read pycalphad’s own shipped test databases skip cleanly if a later version relocates them. The WebAssembly build requires emscripten. The C core and the browser application have no dependencies.</w:t>
       </w:r>
     </w:p>
-    <w:bookmarkEnd w:id="2110"/>
-    <w:bookmarkStart w:id="2111" w:name="list-of-contributors"/>
+    <w:bookmarkEnd w:id="2156"/>
+    <w:bookmarkStart w:id="2157" w:name="list-of-contributors"/>
     <w:p>
       <w:pPr>
         <w:pStyle w:val="Heading3"/>
@@ -2335,8 +2335,8 @@
         <w:t xml:space="preserve">Michael E. Bustamante (design, implementation, validation, data curation).</w:t>
       </w:r>
     </w:p>
-    <w:bookmarkEnd w:id="2111"/>
-    <w:bookmarkStart w:id="2112" w:name="software-location"/>
+    <w:bookmarkEnd w:id="2157"/>
+    <w:bookmarkStart w:id="2158" w:name="software-location"/>
     <w:p>
       <w:pPr>
         <w:pStyle w:val="Heading3"/>
@@ -2378,7 +2378,7 @@
         </w:numPr>
       </w:pPr>
       <w:r>
-        <w:t xml:space="preserve">Persistent identifier: https://github.com/odinzen/hephaestus-mqmqa-public/releases/tag/v0.5.0</w:t>
+        <w:t xml:space="preserve">Persistent identifier: https://github.com/odinzen/hephaestus-mqmqa-public/releases/tag/v0.5.1</w:t>
       </w:r>
     </w:p>
     <w:p>
@@ -2414,7 +2414,7 @@
         </w:numPr>
       </w:pPr>
       <w:r>
-        <w:t xml:space="preserve">Version published: v0.5.0</w:t>
+        <w:t xml:space="preserve">Version published: v0.5.1</w:t>
       </w:r>
     </w:p>
     <w:p>
@@ -2489,8 +2489,8 @@
         <w:t xml:space="preserve">Date published: 2026-09-02</w:t>
       </w:r>
     </w:p>
-    <w:bookmarkEnd w:id="2112"/>
-    <w:bookmarkStart w:id="2113" w:name="language"/>
+    <w:bookmarkEnd w:id="2158"/>
+    <w:bookmarkStart w:id="2159" w:name="language"/>
     <w:p>
       <w:pPr>
         <w:pStyle w:val="Heading3"/>
@@ -2507,9 +2507,9 @@
         <w:t xml:space="preserve">English.</w:t>
       </w:r>
     </w:p>
-    <w:bookmarkEnd w:id="2113"/>
-    <w:bookmarkEnd w:id="2114"/>
-    <w:bookmarkStart w:id="2134" w:name="reuse-potential"/>
+    <w:bookmarkEnd w:id="2159"/>
+    <w:bookmarkEnd w:id="2160"/>
+    <w:bookmarkStart w:id="2180" w:name="reuse-potential"/>
     <w:p>
       <w:pPr>
         <w:pStyle w:val="Heading2"/>
@@ -2534,7 +2534,7 @@
         <w:t xml:space="preserve">The browser application makes the lowest barrier the default. A lecture on slag thermodynamics, a plant metallurgist screening a composition, or a reviewer checking a claimed equilibrium can load the database and calculate in seconds, with confidential inputs never leaving the machine. The same property makes it a practical template for other groups who want to publish a model as a zero-install tool.</w:t>
       </w:r>
     </w:p>
-    <w:bookmarkStart w:id="2133" w:name="worked-examples"/>
+    <w:bookmarkStart w:id="2179" w:name="worked-examples"/>
     <w:p>
       <w:pPr>
         <w:pStyle w:val="Heading3"/>
@@ -2746,18 +2746,18 @@
           <wp:inline>
             <wp:extent cx="4206240" cy="3262561"/>
             <wp:effectExtent b="0" l="0" r="0" t="0"/>
-            <wp:docPr descr="Figure 4: The LiCl-KCl phase diagram calculated by the salt listing from the shipped open database, at the listing’s own step size. Light to dark: liquid, two-phase, and subsolidus fields. The dot is the calculated eutectic at this step size (0.400, 640 K); the star is the measured eutectic (0.415, 626 K)." title="" id="2116" name="Picture"/>
+            <wp:docPr descr="Figure 4: The LiCl-KCl phase diagram calculated by the salt listing from the shipped open database, at the listing’s own step size. Light to dark: liquid, two-phase, and subsolidus fields. The dot is the calculated eutectic at this step size (0.400, 640 K); the star is the measured eutectic (0.415, 626 K)." title="" id="2162" name="Picture"/>
             <a:graphic>
               <a:graphicData uri="http://schemas.openxmlformats.org/drawingml/2006/picture">
                 <pic:pic>
                   <pic:nvPicPr>
-                    <pic:cNvPr descr="figures/fig4_salt_example.png" id="2117" name="Picture"/>
+                    <pic:cNvPr descr="figures/fig4_salt_example.png" id="2163" name="Picture"/>
                     <pic:cNvPicPr>
                       <a:picLocks noChangeArrowheads="1" noChangeAspect="1"/>
                     </pic:cNvPicPr>
                   </pic:nvPicPr>
                   <pic:blipFill>
-                    <a:blip r:embed="rId2115"/>
+                    <a:blip r:embed="rId2161"/>
                     <a:stretch>
                       <a:fillRect/>
                     </a:stretch>
@@ -2992,18 +2992,18 @@
           <wp:inline>
             <wp:extent cx="4206240" cy="3262561"/>
             <wp:effectExtent b="0" l="0" r="0" t="0"/>
-            <wp:docPr descr="Figure 5: The Al-Zn phase diagram calculated by the alloy listing from the shipped open TDB. Light to dark: liquid, liquid plus solid, and solid fields. The dot is the calculated eutectic (0.890, 660 K); the star is the assessed eutectic (0.885, 654 K)." title="" id="2119" name="Picture"/>
+            <wp:docPr descr="Figure 5: The Al-Zn phase diagram calculated by the alloy listing from the shipped open TDB. Light to dark: liquid, liquid plus solid, and solid fields. The dot is the calculated eutectic (0.890, 660 K); the star is the assessed eutectic (0.885, 654 K)." title="" id="2165" name="Picture"/>
             <a:graphic>
               <a:graphicData uri="http://schemas.openxmlformats.org/drawingml/2006/picture">
                 <pic:pic>
                   <pic:nvPicPr>
-                    <pic:cNvPr descr="figures/fig5_alloy_example.png" id="2120" name="Picture"/>
+                    <pic:cNvPr descr="figures/fig5_alloy_example.png" id="2166" name="Picture"/>
                     <pic:cNvPicPr>
                       <a:picLocks noChangeArrowheads="1" noChangeAspect="1"/>
                     </pic:cNvPicPr>
                   </pic:nvPicPr>
                   <pic:blipFill>
-                    <a:blip r:embed="rId2118"/>
+                    <a:blip r:embed="rId2164"/>
                     <a:stretch>
                       <a:fillRect/>
                     </a:stretch>
@@ -3124,18 +3124,18 @@
           <wp:inline>
             <wp:extent cx="5334000" cy="4430576"/>
             <wp:effectExtent b="0" l="0" r="0" t="0"/>
-            <wp:docPr descr="Figure 6: One unified (.utdb) file, two physics, calculated in the browser. (a) The steelmaking database loaded with the Melt/Alloy view toggle on Alloy; the engine calculates the Fe-C phase diagram through the magnetic compound energy formalism, rendered over a 0-25 mol% C composition window (the equilibrium always solves the whole join), with two tapped compositions pinned. (b) Scheil solidification for the same join at 4 mol% C, first solid at 1741 K and the residual liquid frozen by 1433 K, against the equilibrium lever-rule path (dashed). The file’s slag half is a Modified Quasichemical Model liquid; no legacy container holds both models at once." title="" id="2122" name="Picture"/>
+            <wp:docPr descr="Figure 6: One unified (.utdb) file, two physics, calculated in the browser. (a) The steelmaking database loaded with the Melt/Alloy view toggle on Alloy; the engine calculates the Fe-C phase diagram through the magnetic compound energy formalism, rendered over a 0-25 mol% C composition window (the equilibrium always solves the whole join), with two tapped compositions pinned. (b) Scheil solidification for the same join at 4 mol% C, first solid at 1741 K and the residual liquid frozen by 1433 K, against the equilibrium lever-rule path (dashed). The file’s slag half is a Modified Quasichemical Model liquid; no legacy container holds both models at once." title="" id="2168" name="Picture"/>
             <a:graphic>
               <a:graphicData uri="http://schemas.openxmlformats.org/drawingml/2006/picture">
                 <pic:pic>
                   <pic:nvPicPr>
-                    <pic:cNvPr descr="figures/fig6_utdb_steel.png" id="2123" name="Picture"/>
+                    <pic:cNvPr descr="figures/fig6_utdb_steel.png" id="2169" name="Picture"/>
                     <pic:cNvPicPr>
                       <a:picLocks noChangeArrowheads="1" noChangeAspect="1"/>
                     </pic:cNvPicPr>
                   </pic:nvPicPr>
                   <pic:blipFill>
-                    <a:blip r:embed="rId2121"/>
+                    <a:blip r:embed="rId2167"/>
                     <a:stretch>
                       <a:fillRect/>
                     </a:stretch>
@@ -3179,18 +3179,18 @@
           <wp:inline>
             <wp:extent cx="5334000" cy="2319130"/>
             <wp:effectExtent b="0" l="0" r="0" t="0"/>
-            <wp:docPr descr="Figure 7: The gas calculator as a steelmaking worked example, the equilibrium of a carbon-oxygen furnace gas by the Hephaestus gas engine (the NASA-polynomial element-potential solver compiled into the browser), with Cantera as the independent check. (a) Oxygen partial pressure against the CO to CO2 ratio at the 1873 K tap temperature: a lower ratio is more oxidizing and drives iron into the slag as FeO, a higher ratio is more reducing and decarburizes the steel. (b) The same oxygen potential against temperature for four fixed CO to CO2 buffers, showing that a given gas grows more oxidizing as it heats; the dashed line marks the tap temperature. Open circles are Cantera, agreeing to about 10-5 mole fraction across the field." title="" id="2125" name="Picture"/>
+            <wp:docPr descr="Figure 7: The gas calculator as a steelmaking worked example, the equilibrium of a carbon-oxygen furnace gas by the Hephaestus gas engine (the NASA-polynomial element-potential solver compiled into the browser), with Cantera as the independent check. (a) Oxygen partial pressure against the CO to CO2 ratio at the 1873 K tap temperature: a lower ratio is more oxidizing and drives iron into the slag as FeO, a higher ratio is more reducing and decarburizes the steel. (b) The same oxygen potential against temperature for four fixed CO to CO2 buffers, showing that a given gas grows more oxidizing as it heats; the dashed line marks the tap temperature. Open circles are Cantera, agreeing to about 10-5 mole fraction across the field." title="" id="2171" name="Picture"/>
             <a:graphic>
               <a:graphicData uri="http://schemas.openxmlformats.org/drawingml/2006/picture">
                 <pic:pic>
                   <pic:nvPicPr>
-                    <pic:cNvPr descr="figures/fig7_gas_steel.png" id="2126" name="Picture"/>
+                    <pic:cNvPr descr="figures/fig7_gas_steel.png" id="2172" name="Picture"/>
                     <pic:cNvPicPr>
                       <a:picLocks noChangeArrowheads="1" noChangeAspect="1"/>
                     </pic:cNvPicPr>
                   </pic:nvPicPr>
                   <pic:blipFill>
-                    <a:blip r:embed="rId2124"/>
+                    <a:blip r:embed="rId2170"/>
                     <a:stretch>
                       <a:fillRect/>
                     </a:stretch>
@@ -3270,18 +3270,18 @@
           <wp:inline>
             <wp:extent cx="5334000" cy="2319130"/>
             <wp:effectExtent b="0" l="0" r="0" t="0"/>
-            <wp:docPr descr="Figure 8: The gas-flux coupling as a molten-salt worked example, the fume over a NaCl-KCl-MgCl2 = 40/40/20 mol% flux. Each salt’s partial pressure is its engine activity times its measured pure-component vapour pressure (NaCl and KCl from NIST Antoine fits, MgCl2 from the NIST-JANAF gas and liquid Gibbs of formation, each reproducing its measured boiling point; activities from the engine, validated against the pure-composition limit and the near-ideal NaCl-KCl binary). (a) Fume partial pressures against temperature, with the total. (b) Flux composition against fume composition at 1200 K: magnesium chloride is a fifth of the flux but a few percent of the fume, held in the melt by chlorocomplexing that drops its activity well below its mole fraction." title="" id="2128" name="Picture"/>
+            <wp:docPr descr="Figure 8: The gas-flux coupling as a molten-salt worked example, the fume over a NaCl-KCl-MgCl2 = 40/40/20 mol% flux. Each salt’s partial pressure is its engine activity times its measured pure-component vapour pressure (NaCl and KCl from NIST Antoine fits, MgCl2 from the NIST-JANAF gas and liquid Gibbs of formation, each reproducing its measured boiling point; activities from the engine, validated against the pure-composition limit and the near-ideal NaCl-KCl binary). (a) Fume partial pressures against temperature, with the total. (b) Flux composition against fume composition at 1200 K: magnesium chloride is a fifth of the flux but a few percent of the fume, held in the melt by chlorocomplexing that drops its activity well below its mole fraction." title="" id="2174" name="Picture"/>
             <a:graphic>
               <a:graphicData uri="http://schemas.openxmlformats.org/drawingml/2006/picture">
                 <pic:pic>
                   <pic:nvPicPr>
-                    <pic:cNvPr descr="figures/fig8_gas_flux.png" id="2129" name="Picture"/>
+                    <pic:cNvPr descr="figures/fig8_gas_flux.png" id="2175" name="Picture"/>
                     <pic:cNvPicPr>
                       <a:picLocks noChangeArrowheads="1" noChangeAspect="1"/>
                     </pic:cNvPicPr>
                   </pic:nvPicPr>
                   <pic:blipFill>
-                    <a:blip r:embed="rId2127"/>
+                    <a:blip r:embed="rId2173"/>
                     <a:stretch>
                       <a:fillRect/>
                     </a:stretch>
@@ -3349,18 +3349,18 @@
           <wp:inline>
             <wp:extent cx="4572000" cy="3556000"/>
             <wp:effectExtent b="0" l="0" r="0" t="0"/>
-            <wp:docPr descr="Figure 9: Al-Zn phase diagram with ESPEI parameter uncertainty. The liquid and face-centred-cubic (fcc) excess parameters were refit by Markov-chain Monte Carlo to the measured liquid enthalpy of mixing (Debski et al., digitized from Dinsdale et al. [44]) and the assessed phase boundaries (Massalski [45]; Mey [39]), and the posterior was propagated through the engine. The solid line is the median liquidus and the dashed line the median fcc solvus; the shaded region is the 90 percent posterior band on each. The band is narrow on the liquidus, which the calorimetry constrains, and wider on the fcc solvus, which only the diagram constrains. It is the posterior of the three refitted excess parameters with the unary functions and unfitted phases held fixed, a parametric uncertainty within the model rather than a total one. The open circle is the eutectic reported by Massalski [45] (x(Zn) = 0.887, 654 K)." title="" id="2131" name="Picture"/>
+            <wp:docPr descr="Figure 9: Al-Zn phase diagram with ESPEI parameter uncertainty. The liquid and face-centred-cubic (fcc) excess parameters were refit by Markov-chain Monte Carlo to the measured liquid enthalpy of mixing (Debski et al., digitized from Dinsdale et al. [44]) and the assessed phase boundaries (Massalski [45]; Mey [39]), and the posterior was propagated through the engine. The solid line is the median liquidus and the dashed line the median fcc solvus; the shaded region is the 90 percent posterior band on each. The band is narrow on the liquidus, which the calorimetry constrains, and wider on the fcc solvus, which only the diagram constrains. It is the posterior of the three refitted excess parameters with the unary functions and unfitted phases held fixed, a parametric uncertainty within the model rather than a total one. The open circle is the eutectic reported by Massalski [45] (x(Zn) = 0.887, 654 K)." title="" id="2177" name="Picture"/>
             <a:graphic>
               <a:graphicData uri="http://schemas.openxmlformats.org/drawingml/2006/picture">
                 <pic:pic>
                   <pic:nvPicPr>
-                    <pic:cNvPr descr="figures/fig9_uq_alzn.png" id="2132" name="Picture"/>
+                    <pic:cNvPr descr="figures/fig9_uq_alzn.png" id="2178" name="Picture"/>
                     <pic:cNvPicPr>
                       <a:picLocks noChangeArrowheads="1" noChangeAspect="1"/>
                     </pic:cNvPicPr>
                   </pic:nvPicPr>
                   <pic:blipFill>
-                    <a:blip r:embed="rId2130"/>
+                    <a:blip r:embed="rId2176"/>
                     <a:stretch>
                       <a:fillRect/>
                     </a:stretch>
@@ -3400,12 +3400,12 @@
         <w:pStyle w:val="BodyText"/>
       </w:pPr>
       <w:r>
-        <w:t xml:space="preserve">The gap the present work addresses was never the model, which has been published for two decades, but an open, runnable pairing of model and parameters. Hephaestus supplies both halves under open licenses and puts them behind a browser page that asks nothing of its user. The claims are checkable end to end. Release v0.5.0 archives the exact version described, and the 137-test suite reruns the pycalphad comparisons on any machine. The worked examples print the figures shown, and every parameter in every shipped database traces to a published measurement through its provenance file. A reader who doubts a number can recalculate it; one who needs a system that is missing can build it with the same open tools, or ask.</w:t>
-      </w:r>
-    </w:p>
-    <w:bookmarkEnd w:id="2133"/>
-    <w:bookmarkEnd w:id="2134"/>
-    <w:bookmarkStart w:id="2135" w:name="data-availability"/>
+        <w:t xml:space="preserve">The gap the present work addresses was never the model, which has been published for two decades, but an open, runnable pairing of model and parameters. Hephaestus supplies both halves under open licenses and puts them behind a browser page that asks nothing of its user. The claims are checkable end to end. Release v0.5.1 archives the exact version described, and the 137-test suite reruns the pycalphad comparisons on any machine. The worked examples print the figures shown, and every parameter in every shipped database traces to a published measurement through its provenance file. A reader who doubts a number can recalculate it; one who needs a system that is missing can build it with the same open tools, or ask.</w:t>
+      </w:r>
+    </w:p>
+    <w:bookmarkEnd w:id="2179"/>
+    <w:bookmarkEnd w:id="2180"/>
+    <w:bookmarkStart w:id="2181" w:name="data-availability"/>
     <w:p>
       <w:pPr>
         <w:pStyle w:val="Heading2"/>
@@ -3419,11 +3419,11 @@
         <w:pStyle w:val="FirstParagraph"/>
       </w:pPr>
       <w:r>
-        <w:t xml:space="preserve">The engine, the database, the browser application, and the validation suite are openly available in the code repository listed above; the version described here is archived as release v0.5.0. The database files and their provenance records are in the repository’s data directory under CC BY 4.0.</w:t>
-      </w:r>
-    </w:p>
-    <w:bookmarkEnd w:id="2135"/>
-    <w:bookmarkStart w:id="2136" w:name="acknowledgements"/>
+        <w:t xml:space="preserve">The engine, the database, the browser application, and the validation suite are openly available in the code repository listed above; the version described here is archived as release v0.5.1. The database files and their provenance records are in the repository’s data directory under CC BY 4.0.</w:t>
+      </w:r>
+    </w:p>
+    <w:bookmarkEnd w:id="2181"/>
+    <w:bookmarkStart w:id="2182" w:name="acknowledgements"/>
     <w:p>
       <w:pPr>
         <w:pStyle w:val="Heading2"/>
@@ -3440,8 +3440,8 @@
         <w:t xml:space="preserve">During the development of this software the author used Claude Code (Anthropic) to assist with implementation, validation scripting, and manuscript preparation. This assistance was agentic, not autonomous: it operated under author direction and supervision at every step and was never a closed loop that produced or accepted results without review. Every parameter was traced by the author to its primary source before entering the database, and every reference was verified against its registry record. The author reviewed and approved all output and takes full responsibility for this article.</w:t>
       </w:r>
     </w:p>
-    <w:bookmarkEnd w:id="2136"/>
-    <w:bookmarkStart w:id="2137" w:name="funding-statement"/>
+    <w:bookmarkEnd w:id="2182"/>
+    <w:bookmarkStart w:id="2183" w:name="funding-statement"/>
     <w:p>
       <w:pPr>
         <w:pStyle w:val="Heading2"/>
@@ -3458,8 +3458,8 @@
         <w:t xml:space="preserve">The development of this software received no external funding.</w:t>
       </w:r>
     </w:p>
-    <w:bookmarkEnd w:id="2137"/>
-    <w:bookmarkStart w:id="2138" w:name="competing-interests"/>
+    <w:bookmarkEnd w:id="2183"/>
+    <w:bookmarkStart w:id="2184" w:name="competing-interests"/>
     <w:p>
       <w:pPr>
         <w:pStyle w:val="Heading2"/>
@@ -3476,8 +3476,8 @@
         <w:t xml:space="preserve">The author founded Odinzen LLC, which provides commercial thermodynamic modeling services, and declares this as a competing interest. The software and database published here are released in full under open licenses, and no proprietary Odinzen assets are included.</w:t>
       </w:r>
     </w:p>
-    <w:bookmarkEnd w:id="2138"/>
-    <w:bookmarkStart w:id="2139" w:name="references"/>
+    <w:bookmarkEnd w:id="2184"/>
+    <w:bookmarkStart w:id="2185" w:name="references"/>
     <w:p>
       <w:pPr>
         <w:pStyle w:val="Heading2"/>
@@ -3858,8 +3858,8 @@
         <w:t xml:space="preserve">[45] Massalski TB, editor. Binary Alloy Phase Diagrams. 2nd ed. Materials Park (OH): ASM International; 1990.</w:t>
       </w:r>
     </w:p>
-    <w:bookmarkEnd w:id="2139"/>
-    <w:bookmarkEnd w:id="2140"/>
+    <w:bookmarkEnd w:id="2185"/>
+    <w:bookmarkEnd w:id="2186"/>
     <w:sectPr>
       <w:footnotePr>
         <w:numRestart w:val="eachSect"/>

</xml_diff>

<commit_message>
Document the shipped aluminosilicate systems, quaternary, and solid solutions
Consistency sweep (repo vs manuscript) found several shipped, validated systems
the paper never described. Adds them:

- Table 2 gains CaO-Al2O3 and Al2O3-SiO2 (screening-quality binaries, limits
  stated), CaO-Al2O3-SiO2 (the cement-and-slag ternary, one fitted ternary term,
  RMS ln a 0.48 over 45 KEMS points), and the CaO-FeO-MgO-SiO2 quaternary
  (Muggianu combination, interior a prediction).
- Abstract and body enumerations list them, plus the clinopyroxene and spinel
  solid solutions (ideal mixing, the reasoning recorded in provenance).
- Two references added and verified against Crossref: Rankin & Wright 1915 (the
  CAS/aluminosilicate invariants) and Zaitsev et al. 1997 (the KEMS activities).
  Citations canonically renumbered by first appearance (47 total); argus order
  and the Crossref field-diff both pass.

Co-Authored-By: Claude Opus 4.8 <noreply@anthropic.com>
</commit_message>
<xml_diff>
--- a/paper/Bustamante_Hephaestus_JORS_manuscript.docx
+++ b/paper/Bustamante_Hephaestus_JORS_manuscript.docx
@@ -2,7 +2,7 @@
 <file path=word/document.xml><?xml version="1.0" encoding="utf-8"?>
 <w:document xmlns:w="http://schemas.openxmlformats.org/wordprocessingml/2006/main" xmlns:m="http://schemas.openxmlformats.org/officeDocument/2006/math" xmlns:r="http://schemas.openxmlformats.org/officeDocument/2006/relationships" xmlns:o="urn:schemas-microsoft-com:office:office" xmlns:v="urn:schemas-microsoft-com:vml" xmlns:w10="urn:schemas-microsoft-com:office:word" xmlns:a="http://schemas.openxmlformats.org/drawingml/2006/main" xmlns:pic="http://schemas.openxmlformats.org/drawingml/2006/picture" xmlns:wp="http://schemas.openxmlformats.org/drawingml/2006/wordprocessingDrawing">
   <w:body>
-    <w:bookmarkStart w:id="2186" w:name="X4855b1162e70238fd839d871e0792397dc58430"/>
+    <w:bookmarkStart w:id="2232" w:name="X4855b1162e70238fd839d871e0792397dc58430"/>
     <w:p>
       <w:pPr>
         <w:pStyle w:val="Heading1"/>
@@ -102,7 +102,7 @@
         <w:t xml:space="preserve">2</w:t>
       </w:r>
       <w:r>
-        <w:t xml:space="preserve">, and FeO-SiO</w:t>
+        <w:t xml:space="preserve">, FeO-SiO</w:t>
       </w:r>
       <w:r>
         <w:rPr>
@@ -111,10 +111,55 @@
         <w:t xml:space="preserve">2</w:t>
       </w:r>
       <w:r>
+        <w:t xml:space="preserve">, CaO-Al</w:t>
+      </w:r>
+      <w:r>
+        <w:rPr>
+          <w:vertAlign w:val="subscript"/>
+        </w:rPr>
+        <w:t xml:space="preserve">2</w:t>
+      </w:r>
+      <w:r>
+        <w:t xml:space="preserve">O</w:t>
+      </w:r>
+      <w:r>
+        <w:rPr>
+          <w:vertAlign w:val="subscript"/>
+        </w:rPr>
+        <w:t xml:space="preserve">3</w:t>
+      </w:r>
+      <w:r>
+        <w:t xml:space="preserve">, and Al</w:t>
+      </w:r>
+      <w:r>
+        <w:rPr>
+          <w:vertAlign w:val="subscript"/>
+        </w:rPr>
+        <w:t xml:space="preserve">2</w:t>
+      </w:r>
+      <w:r>
+        <w:t xml:space="preserve">O</w:t>
+      </w:r>
+      <w:r>
+        <w:rPr>
+          <w:vertAlign w:val="subscript"/>
+        </w:rPr>
+        <w:t xml:space="preserve">3</w:t>
+      </w:r>
+      <w:r>
+        <w:t xml:space="preserve">-SiO</w:t>
+      </w:r>
+      <w:r>
+        <w:rPr>
+          <w:vertAlign w:val="subscript"/>
+        </w:rPr>
+        <w:t xml:space="preserve">2</w:t>
+      </w:r>
+      <w:r>
         <w:t xml:space="preserve"> </w:t>
       </w:r>
       <w:r>
-        <w:t xml:space="preserve">liquids and the FeO-MgO-SiO</w:t>
+        <w:t xml:space="preserve">liquids, the FeO-MgO-SiO</w:t>
       </w:r>
       <w:r>
         <w:rPr>
@@ -126,7 +171,49 @@
         <w:t xml:space="preserve"> </w:t>
       </w:r>
       <w:r>
-        <w:t xml:space="preserve">ternary with olivine and orthopyroxene solid solutions, together with an open chloride molten-salt family from LiCl-KCl to the NaCl-KCl-MgCl</w:t>
+        <w:t xml:space="preserve">and cement-and-slag CaO-Al</w:t>
+      </w:r>
+      <w:r>
+        <w:rPr>
+          <w:vertAlign w:val="subscript"/>
+        </w:rPr>
+        <w:t xml:space="preserve">2</w:t>
+      </w:r>
+      <w:r>
+        <w:t xml:space="preserve">O</w:t>
+      </w:r>
+      <w:r>
+        <w:rPr>
+          <w:vertAlign w:val="subscript"/>
+        </w:rPr>
+        <w:t xml:space="preserve">3</w:t>
+      </w:r>
+      <w:r>
+        <w:t xml:space="preserve">-SiO</w:t>
+      </w:r>
+      <w:r>
+        <w:rPr>
+          <w:vertAlign w:val="subscript"/>
+        </w:rPr>
+        <w:t xml:space="preserve">2</w:t>
+      </w:r>
+      <w:r>
+        <w:t xml:space="preserve"> </w:t>
+      </w:r>
+      <w:r>
+        <w:t xml:space="preserve">ternaries, and a CaO-FeO-MgO-SiO</w:t>
+      </w:r>
+      <w:r>
+        <w:rPr>
+          <w:vertAlign w:val="subscript"/>
+        </w:rPr>
+        <w:t xml:space="preserve">2</w:t>
+      </w:r>
+      <w:r>
+        <w:t xml:space="preserve"> </w:t>
+      </w:r>
+      <w:r>
+        <w:t xml:space="preserve">quaternary, with olivine, orthopyroxene, clinopyroxene, and spinel solid solutions, together with an open chloride molten-salt family from LiCl-KCl to the NaCl-KCl-MgCl</w:t>
       </w:r>
       <w:r>
         <w:rPr>
@@ -159,7 +246,7 @@
         <w:t xml:space="preserve">CALPHAD; molten slag; molten salt; modified quasichemical model; thermodynamic database; phase diagram; gas equilibrium; WebAssembly; open data</w:t>
       </w:r>
     </w:p>
-    <w:bookmarkStart w:id="2152" w:name="overview"/>
+    <w:bookmarkStart w:id="2198" w:name="overview"/>
     <w:p>
       <w:pPr>
         <w:pStyle w:val="Heading2"/>
@@ -168,7 +255,7 @@
         <w:t xml:space="preserve">(1) Overview</w:t>
       </w:r>
     </w:p>
-    <w:bookmarkStart w:id="2139" w:name="introduction"/>
+    <w:bookmarkStart w:id="2185" w:name="introduction"/>
     <w:p>
       <w:pPr>
         <w:pStyle w:val="Heading3"/>
@@ -548,8 +635,8 @@
         <w:t xml:space="preserve">Hephaestus is a deliberate response to that gap, and it treats the engine and the data as one contribution because neither is useful alone. The engine is small on purpose. Its core is plain C with no dependencies, which makes it easy to embed and lets the identical code compile to WebAssembly, so the full calculator runs in a web browser with nothing installed and no data leaving the user’s machine. The database is open on purpose. Every parameter in it derives from published measurements, each value carries its provenance down to table and page, and the known shortcomings are documented next to the numbers they affect. The present work describes both, their validation against pycalphad and against measured phase equilibria, and the ways they can be reused. None of it asks the reader to program. For the experimentalist who never writes code, the browser application is the entire product: a page to open, a database to click, and a diagram to read. The sections that follow describe the machinery underneath for those who want it. Supplementary Material S1 is a plain-language primer for the non-programmer, starting at what a database file is and ending at a first calculation and how to read it. Its closing section teaches what an assessment is built from, so a reader who wants to contribute data for open publication, or to commission a file, arrives knowing what is needed.</w:t>
       </w:r>
     </w:p>
-    <w:bookmarkEnd w:id="2139"/>
-    <w:bookmarkStart w:id="2149" w:name="implementation-and-architecture"/>
+    <w:bookmarkEnd w:id="2185"/>
+    <w:bookmarkStart w:id="2195" w:name="implementation-and-architecture"/>
     <w:p>
       <w:pPr>
         <w:pStyle w:val="Heading3"/>
@@ -575,18 +662,18 @@
           <wp:inline>
             <wp:extent cx="5334000" cy="3511167"/>
             <wp:effectExtent b="0" l="0" r="0" t="0"/>
-            <wp:docPr descr="Figure 1: Architecture of Hephaestus. A single dependency-free C core reads the field’s three database dialects (ChemSage .dat, Thermo-Calc .tdb with the Inden magnetic model, and the unified .utdb) and calculates all thermodynamics; the same core is used as a native library, from Python through cffi, and compiled to WebAssembly behind the browser application. dbbuild writes new ChemSage files from measured data, and every energy path is validated against pycalphad." title="" id="2141" name="Picture"/>
+            <wp:docPr descr="Figure 1: Architecture of Hephaestus. A single dependency-free C core reads the field’s three database dialects (ChemSage .dat, Thermo-Calc .tdb with the Inden magnetic model, and the unified .utdb) and calculates all thermodynamics; the same core is used as a native library, from Python through cffi, and compiled to WebAssembly behind the browser application. dbbuild writes new ChemSage files from measured data, and every energy path is validated against pycalphad." title="" id="2187" name="Picture"/>
             <a:graphic>
               <a:graphicData uri="http://schemas.openxmlformats.org/drawingml/2006/picture">
                 <pic:pic>
                   <pic:nvPicPr>
-                    <pic:cNvPr descr="figures/fig1_architecture.png" id="2142" name="Picture"/>
+                    <pic:cNvPr descr="figures/fig1_architecture.png" id="2188" name="Picture"/>
                     <pic:cNvPicPr>
                       <a:picLocks noChangeArrowheads="1" noChangeAspect="1"/>
                     </pic:cNvPicPr>
                   </pic:nvPicPr>
                   <pic:blipFill>
-                    <a:blip r:embed="rId2140"/>
+                    <a:blip r:embed="rId2186"/>
                     <a:stretch>
                       <a:fillRect/>
                     </a:stretch>
@@ -814,18 +901,18 @@
           <wp:inline>
             <wp:extent cx="4754880" cy="3913308"/>
             <wp:effectExtent b="0" l="0" r="0" t="0"/>
-            <wp:docPr descr="Figure 2: The live solver in the browser application (light theme). The user loads the shipped database, picks a temperature, and presses Compute; the WebAssembly engine then solves the full FeO-MgO-SiO2 phase assemblage client side (here 1023 composition samples and 512 tie-facets in about three seconds). Tapping a composition reads its stable phases and pins it to a comparison list; hovering previews on desktop." title="" id="2144" name="Picture"/>
+            <wp:docPr descr="Figure 2: The live solver in the browser application (light theme). The user loads the shipped database, picks a temperature, and presses Compute; the WebAssembly engine then solves the full FeO-MgO-SiO2 phase assemblage client side (here 1023 composition samples and 512 tie-facets in about three seconds). Tapping a composition reads its stable phases and pins it to a comparison list; hovering previews on desktop." title="" id="2190" name="Picture"/>
             <a:graphic>
               <a:graphicData uri="http://schemas.openxmlformats.org/drawingml/2006/picture">
                 <pic:pic>
                   <pic:nvPicPr>
-                    <pic:cNvPr descr="figures/fig2_browser_app.png" id="2145" name="Picture"/>
+                    <pic:cNvPr descr="figures/fig2_browser_app.png" id="2191" name="Picture"/>
                     <pic:cNvPicPr>
                       <a:picLocks noChangeArrowheads="1" noChangeAspect="1"/>
                     </pic:cNvPicPr>
                   </pic:nvPicPr>
                   <pic:blipFill>
-                    <a:blip r:embed="rId2143"/>
+                    <a:blip r:embed="rId2189"/>
                     <a:stretch>
                       <a:fillRect/>
                     </a:stretch>
@@ -901,7 +988,7 @@
         <w:t xml:space="preserve"> </w:t>
       </w:r>
       <w:r>
-        <w:t xml:space="preserve">[23], and the melting and immiscibility constraints of the classical phase diagram studies [24-26]. Solution-calorimetric compound enthalpies [27] anchor the solids. Where published calorimetry cannot constrain a liquid, melt-mixing enthalpies from machine-learned interatomic potentials [28,29] serve as auxiliary anchors after bias correction against measured formation enthalpies; each such use is recorded in the provenance files. First-principles codes sit upstream of this pipeline. A density functional theory (DFT) engine such as Quantum ESPRESSO [30] or VASP [31] calculates the energy of one configuration at a time, at zero kelvin unless phonon or molecular-dynamics machinery is layered on top. It supplies candidate data for an assessment to weigh, not assessed multicomponent Gibbs functions, and repositories such as the Materials Project [16] serve such results at scale. That physics enters the present databases only through potentials trained on large DFT corpora. MatterSim [28] and Orb [29] supply the melt anchors above, and a further graph-network potential, SevenNet [32], was used to corroborate the olivine mixing enthalpy against the calorimetric record [33] through configuration-averaged relaxed supercells, with endmember differences cancelling any constant offset; the check is recorded in the repository and changed no fitted parameter. The olivine and orthopyroxene solid solutions take their endmembers from Robie and Hemingway [19] and their mixing parameters from solution calorimetry [33]. The assembled ternary reproduces the topology of the measured MgO-FeO-SiO</w:t>
+        <w:t xml:space="preserve">[23], and the melting and immiscibility constraints of the classical phase diagram studies [24,25,26]. Solution-calorimetric compound enthalpies [27] anchor the solids. Where published calorimetry cannot constrain a liquid, melt-mixing enthalpies from machine-learned interatomic potentials [28,29] serve as auxiliary anchors after bias correction against measured formation enthalpies; each such use is recorded in the provenance files. First-principles codes sit upstream of this pipeline. A density functional theory (DFT) engine such as Quantum ESPRESSO [30] or VASP [31] calculates the energy of one configuration at a time, at zero kelvin unless phonon or molecular-dynamics machinery is layered on top. It supplies candidate data for an assessment to weigh, not assessed multicomponent Gibbs functions, and repositories such as the Materials Project [16] serve such results at scale. That physics enters the present databases only through potentials trained on large DFT corpora. MatterSim [28] and Orb [29] supply the melt anchors above, and a further graph-network potential, SevenNet [32], was used to corroborate the olivine mixing enthalpy against the calorimetric record [33] through configuration-averaged relaxed supercells, with endmember differences cancelling any constant offset; the check is recorded in the repository and changed no fitted parameter. The olivine and orthopyroxene solid solutions take their endmembers from Robie and Hemingway [19] and their mixing parameters from solution calorimetry [33]. The assembled ternary reproduces the topology of the measured MgO-FeO-SiO</w:t>
       </w:r>
       <w:r>
         <w:rPr>
@@ -913,7 +1000,7 @@
         <w:t xml:space="preserve"> </w:t>
       </w:r>
       <w:r>
-        <w:t xml:space="preserve">liquidus surface [24], with the olivine field quantitative and the known offsets stated. No parameter is taken from any prior assessment or commercial database; published assessments of these systems [34] are used only as method literature. The same engine and file format also serve molten salts: the repository ships an open chloride family alongside the slags (LiCl-KCl, NaCl-KCl with its continuous halite solid solution, KCl-MgCl</w:t>
+        <w:t xml:space="preserve">liquidus surface [24], with the olivine field quantitative and the known offsets stated. No parameter is taken from any prior assessment or commercial database; published assessments of these systems [34] are used only as method literature. The library also ships the calcium-aluminosilicate family that anchors cement and blast-furnace slag chemistry: the CaO-Al</w:t>
       </w:r>
       <w:r>
         <w:rPr>
@@ -922,9 +1009,102 @@
         <w:t xml:space="preserve">2</w:t>
       </w:r>
       <w:r>
+        <w:t xml:space="preserve">O</w:t>
+      </w:r>
+      <w:r>
+        <w:rPr>
+          <w:vertAlign w:val="subscript"/>
+        </w:rPr>
+        <w:t xml:space="preserve">3</w:t>
+      </w:r>
+      <w:r>
         <w:t xml:space="preserve"> </w:t>
       </w:r>
       <w:r>
+        <w:t xml:space="preserve">and Al</w:t>
+      </w:r>
+      <w:r>
+        <w:rPr>
+          <w:vertAlign w:val="subscript"/>
+        </w:rPr>
+        <w:t xml:space="preserve">2</w:t>
+      </w:r>
+      <w:r>
+        <w:t xml:space="preserve">O</w:t>
+      </w:r>
+      <w:r>
+        <w:rPr>
+          <w:vertAlign w:val="subscript"/>
+        </w:rPr>
+        <w:t xml:space="preserve">3</w:t>
+      </w:r>
+      <w:r>
+        <w:t xml:space="preserve">-SiO</w:t>
+      </w:r>
+      <w:r>
+        <w:rPr>
+          <w:vertAlign w:val="subscript"/>
+        </w:rPr>
+        <w:t xml:space="preserve">2</w:t>
+      </w:r>
+      <w:r>
+        <w:t xml:space="preserve"> </w:t>
+      </w:r>
+      <w:r>
+        <w:t xml:space="preserve">binaries and the CaO-Al</w:t>
+      </w:r>
+      <w:r>
+        <w:rPr>
+          <w:vertAlign w:val="subscript"/>
+        </w:rPr>
+        <w:t xml:space="preserve">2</w:t>
+      </w:r>
+      <w:r>
+        <w:t xml:space="preserve">O</w:t>
+      </w:r>
+      <w:r>
+        <w:rPr>
+          <w:vertAlign w:val="subscript"/>
+        </w:rPr>
+        <w:t xml:space="preserve">3</w:t>
+      </w:r>
+      <w:r>
+        <w:t xml:space="preserve">-SiO</w:t>
+      </w:r>
+      <w:r>
+        <w:rPr>
+          <w:vertAlign w:val="subscript"/>
+        </w:rPr>
+        <w:t xml:space="preserve">2</w:t>
+      </w:r>
+      <w:r>
+        <w:t xml:space="preserve"> </w:t>
+      </w:r>
+      <w:r>
+        <w:t xml:space="preserve">ternary, the ternary carrying one fitted additional-constituent term that brings its predicted silica activities to within a root-mean-square 0.48 in ln a of forty-five Knudsen-effusion measurements [21,35]. A CaO-FeO-MgO-SiO</w:t>
+      </w:r>
+      <w:r>
+        <w:rPr>
+          <w:vertAlign w:val="subscript"/>
+        </w:rPr>
+        <w:t xml:space="preserve">2</w:t>
+      </w:r>
+      <w:r>
+        <w:t xml:space="preserve"> </w:t>
+      </w:r>
+      <w:r>
+        <w:t xml:space="preserve">quaternary combines the four assessed silica binaries by the Muggianu extension, reducing to each exactly at its edge with the melt interior left as a stated prediction. Two further compound-energy solid solutions, clinopyroxene (diopside-hedenbergite) and spinel (spinel-hercynite), extend the crystallization fields; both ship with ideal mixing, the excess left unfitted where no open calorimetry constrains it and machine-learned potentials disagree even in sign, each such judgment recorded in the provenance. The same engine and file format also serve molten salts: the repository ships an open chloride family alongside the slags (LiCl-KCl, NaCl-KCl with its continuous halite solid solution, KCl-MgCl</w:t>
+      </w:r>
+      <w:r>
+        <w:rPr>
+          <w:vertAlign w:val="subscript"/>
+        </w:rPr>
+        <w:t xml:space="preserve">2</w:t>
+      </w:r>
+      <w:r>
+        <w:t xml:space="preserve"> </w:t>
+      </w:r>
+      <w:r>
         <w:t xml:space="preserve">with the double salt KMgCl</w:t>
       </w:r>
       <w:r>
@@ -955,7 +1135,7 @@
         <w:t xml:space="preserve"> </w:t>
       </w:r>
       <w:r>
-        <w:t xml:space="preserve">ternary), built the same way from evaluated endmember tables [35], measured mixing calorimetry [36], and the measured eutectic, liquidus, and solvus record of the halide literature [37], and loadable in the browser application with one click. The nuclear community’s MSTDB-TC [38] covers molten salts for reactor work under a registration license; the chloride family here is complementary, small, and CC BY. Each system folder carries a provenance file that names every source, every modeling judgment, and every known limit. The largest limit is stated plainly: the CaO-SiO</w:t>
+        <w:t xml:space="preserve">ternary), built the same way from evaluated endmember tables [36], measured mixing calorimetry [37], and the measured eutectic, liquidus, and solvus record of the halide literature [38], and loadable in the browser application with one click. The nuclear community’s MSTDB-TC [39] covers molten salts for reactor work under a registration license; the chloride family here is complementary, small, and CC BY. Each system folder carries a provenance file that names every source, every modeling judgment, and every known limit. The largest limit is stated plainly: the CaO-SiO</w:t>
       </w:r>
       <w:r>
         <w:rPr>
@@ -991,18 +1171,18 @@
           <wp:inline>
             <wp:extent cx="5334000" cy="2197297"/>
             <wp:effectExtent b="0" l="0" r="0" t="0"/>
-            <wp:docPr descr="Figure 3: The assessed FeO-MgO-SiO2 system calculated from the shipped database files. (a) Liquidus projection: primary crystallizing phase fields, with liquidus isotherms labeled in K. (b) Isothermal section at 1873 K: stable phase assemblages, shaded by the number of solid phases present. Phase labels: L liquid, Crs cristobalite, Ol olivine, Opx orthopyroxene, Per periclase, Wus wustite." title="" id="2147" name="Picture"/>
+            <wp:docPr descr="Figure 3: The assessed FeO-MgO-SiO2 system calculated from the shipped database files. (a) Liquidus projection: primary crystallizing phase fields, with liquidus isotherms labeled in K. (b) Isothermal section at 1873 K: stable phase assemblages, shaded by the number of solid phases present. Phase labels: L liquid, Crs cristobalite, Ol olivine, Opx orthopyroxene, Per periclase, Wus wustite." title="" id="2193" name="Picture"/>
             <a:graphic>
               <a:graphicData uri="http://schemas.openxmlformats.org/drawingml/2006/picture">
                 <pic:pic>
                   <pic:nvPicPr>
-                    <pic:cNvPr descr="figures/fig3_ternary.png" id="2148" name="Picture"/>
+                    <pic:cNvPr descr="figures/fig3_ternary.png" id="2194" name="Picture"/>
                     <pic:cNvPicPr>
                       <a:picLocks noChangeArrowheads="1" noChangeAspect="1"/>
                     </pic:cNvPicPr>
                   </pic:nvPicPr>
                   <pic:blipFill>
-                    <a:blip r:embed="rId2146"/>
+                    <a:blip r:embed="rId2192"/>
                     <a:stretch>
                       <a:fillRect/>
                     </a:stretch>
@@ -1340,6 +1520,7 @@
           <w:tcPr/>
           <w:p>
             <w:pPr>
+              <w:keepNext/>
               <w:pStyle w:val="Compact"/>
               <w:jc w:val="left"/>
             </w:pPr>
@@ -1358,6 +1539,7 @@
           <w:tcPr/>
           <w:p>
             <w:pPr>
+              <w:keepNext/>
               <w:pStyle w:val="Compact"/>
               <w:jc w:val="left"/>
             </w:pPr>
@@ -1370,6 +1552,7 @@
           <w:tcPr/>
           <w:p>
             <w:pPr>
+              <w:keepNext/>
               <w:pStyle w:val="Compact"/>
               <w:jc w:val="left"/>
             </w:pPr>
@@ -1382,18 +1565,366 @@
           <w:tcPr/>
           <w:p>
             <w:pPr>
+              <w:keepNext/>
               <w:pStyle w:val="Compact"/>
               <w:jc w:val="left"/>
             </w:pPr>
             <w:r>
               <w:t xml:space="preserve">measured liquidus-surface topology [24]; stable phase sets match pycalphad at 15 of 16 points</w:t>
+            </w:r>
+          </w:p>
+        </w:tc>
+      </w:tr>
+      <w:tr>
+        <w:trPr>
+          <w:cantSplit/>
+        </w:trPr>
+        <w:tc>
+          <w:tcPr/>
+          <w:p>
+            <w:pPr>
+              <w:keepNext/>
+              <w:pStyle w:val="Compact"/>
+              <w:jc w:val="left"/>
+            </w:pPr>
+            <w:r>
+              <w:t xml:space="preserve">CaO-Al</w:t>
+            </w:r>
+            <w:r>
+              <w:rPr>
+                <w:vertAlign w:val="subscript"/>
+              </w:rPr>
+              <w:t xml:space="preserve">2</w:t>
+            </w:r>
+            <w:r>
+              <w:t xml:space="preserve">O</w:t>
+            </w:r>
+            <w:r>
+              <w:rPr>
+                <w:vertAlign w:val="subscript"/>
+              </w:rPr>
+              <w:t xml:space="preserve">3</w:t>
+            </w:r>
+          </w:p>
+        </w:tc>
+        <w:tc>
+          <w:tcPr/>
+          <w:p>
+            <w:pPr>
+              <w:keepNext/>
+              <w:pStyle w:val="Compact"/>
+              <w:jc w:val="left"/>
+            </w:pPr>
+            <w:r>
+              <w:t xml:space="preserve">(-156581 + 2.16 T) + 133468 χ</w:t>
+            </w:r>
+            <w:r>
+              <w:rPr>
+                <w:vertAlign w:val="subscript"/>
+              </w:rPr>
+              <w:t xml:space="preserve">Ca</w:t>
+            </w:r>
+          </w:p>
+        </w:tc>
+        <w:tc>
+          <w:tcPr/>
+          <w:p>
+            <w:pPr>
+              <w:keepNext/>
+              <w:pStyle w:val="Compact"/>
+              <w:jc w:val="left"/>
+            </w:pPr>
+            <w:r>
+              <w:t xml:space="preserve">six melting invariants [40]</w:t>
+            </w:r>
+          </w:p>
+        </w:tc>
+        <w:tc>
+          <w:tcPr/>
+          <w:p>
+            <w:pPr>
+              <w:keepNext/>
+              <w:pStyle w:val="Compact"/>
+              <w:jc w:val="left"/>
+            </w:pPr>
+            <w:r>
+              <w:t xml:space="preserve">invariants within about ±90 K (screening quality; liquid activities not yet constrained)</w:t>
+            </w:r>
+          </w:p>
+        </w:tc>
+      </w:tr>
+      <w:tr>
+        <w:trPr>
+          <w:cantSplit/>
+        </w:trPr>
+        <w:tc>
+          <w:tcPr/>
+          <w:p>
+            <w:pPr>
+              <w:keepNext/>
+              <w:pStyle w:val="Compact"/>
+              <w:jc w:val="left"/>
+            </w:pPr>
+            <w:r>
+              <w:t xml:space="preserve">Al</w:t>
+            </w:r>
+            <w:r>
+              <w:rPr>
+                <w:vertAlign w:val="subscript"/>
+              </w:rPr>
+              <w:t xml:space="preserve">2</w:t>
+            </w:r>
+            <w:r>
+              <w:t xml:space="preserve">O</w:t>
+            </w:r>
+            <w:r>
+              <w:rPr>
+                <w:vertAlign w:val="subscript"/>
+              </w:rPr>
+              <w:t xml:space="preserve">3</w:t>
+            </w:r>
+            <w:r>
+              <w:t xml:space="preserve">-SiO</w:t>
+            </w:r>
+            <w:r>
+              <w:rPr>
+                <w:vertAlign w:val="subscript"/>
+              </w:rPr>
+              <w:t xml:space="preserve">2</w:t>
+            </w:r>
+          </w:p>
+        </w:tc>
+        <w:tc>
+          <w:tcPr/>
+          <w:p>
+            <w:pPr>
+              <w:keepNext/>
+              <w:pStyle w:val="Compact"/>
+              <w:jc w:val="left"/>
+            </w:pPr>
+            <w:r>
+              <w:t xml:space="preserve">9317 + 33855 χ</w:t>
+            </w:r>
+            <w:r>
+              <w:rPr>
+                <w:vertAlign w:val="subscript"/>
+              </w:rPr>
+              <w:t xml:space="preserve">Si</w:t>
+            </w:r>
+            <w:r>
+              <w:rPr>
+                <w:vertAlign w:val="superscript"/>
+              </w:rPr>
+              <w:t xml:space="preserve">5</w:t>
+            </w:r>
+          </w:p>
+        </w:tc>
+        <w:tc>
+          <w:tcPr/>
+          <w:p>
+            <w:pPr>
+              <w:keepNext/>
+              <w:pStyle w:val="Compact"/>
+              <w:jc w:val="left"/>
+            </w:pPr>
+            <w:r>
+              <w:t xml:space="preserve">the cristobalite-mullite eutectic [40]</w:t>
+            </w:r>
+          </w:p>
+        </w:tc>
+        <w:tc>
+          <w:tcPr/>
+          <w:p>
+            <w:pPr>
+              <w:keepNext/>
+              <w:pStyle w:val="Compact"/>
+              <w:jc w:val="left"/>
+            </w:pPr>
+            <w:r>
+              <w:t xml:space="preserve">eutectic reproduced (1883 K, x</w:t>
+            </w:r>
+            <w:r>
+              <w:rPr>
+                <w:vertAlign w:val="subscript"/>
+              </w:rPr>
+              <w:t xml:space="preserve">AlO1.5</w:t>
+            </w:r>
+            <w:r>
+              <w:t xml:space="preserve"> </w:t>
+            </w:r>
+            <w:r>
+              <w:t xml:space="preserve">= 0.150); the alumina-rich mullite liquidus is the weak flank</w:t>
+            </w:r>
+          </w:p>
+        </w:tc>
+      </w:tr>
+      <w:tr>
+        <w:trPr>
+          <w:cantSplit/>
+        </w:trPr>
+        <w:tc>
+          <w:tcPr/>
+          <w:p>
+            <w:pPr>
+              <w:keepNext/>
+              <w:pStyle w:val="Compact"/>
+              <w:jc w:val="left"/>
+            </w:pPr>
+            <w:r>
+              <w:t xml:space="preserve">CaO-Al</w:t>
+            </w:r>
+            <w:r>
+              <w:rPr>
+                <w:vertAlign w:val="subscript"/>
+              </w:rPr>
+              <w:t xml:space="preserve">2</w:t>
+            </w:r>
+            <w:r>
+              <w:t xml:space="preserve">O</w:t>
+            </w:r>
+            <w:r>
+              <w:rPr>
+                <w:vertAlign w:val="subscript"/>
+              </w:rPr>
+              <w:t xml:space="preserve">3</w:t>
+            </w:r>
+            <w:r>
+              <w:t xml:space="preserve">-SiO</w:t>
+            </w:r>
+            <w:r>
+              <w:rPr>
+                <w:vertAlign w:val="subscript"/>
+              </w:rPr>
+              <w:t xml:space="preserve">2</w:t>
+            </w:r>
+          </w:p>
+        </w:tc>
+        <w:tc>
+          <w:tcPr/>
+          <w:p>
+            <w:pPr>
+              <w:keepNext/>
+              <w:pStyle w:val="Compact"/>
+              <w:jc w:val="left"/>
+            </w:pPr>
+            <w:r>
+              <w:t xml:space="preserve">binaries combined, plus one ternary term (AlO</w:t>
+            </w:r>
+            <w:r>
+              <w:rPr>
+                <w:vertAlign w:val="subscript"/>
+              </w:rPr>
+              <w:t xml:space="preserve">1.5</w:t>
+            </w:r>
+            <w:r>
+              <w:t xml:space="preserve"> </w:t>
+            </w:r>
+            <w:r>
+              <w:t xml:space="preserve">into the CaO-SiO</w:t>
+            </w:r>
+            <w:r>
+              <w:rPr>
+                <w:vertAlign w:val="subscript"/>
+              </w:rPr>
+              <w:t xml:space="preserve">2</w:t>
+            </w:r>
+            <w:r>
+              <w:t xml:space="preserve"> </w:t>
+            </w:r>
+            <w:r>
+              <w:t xml:space="preserve">quadruplet, L = -110000)</w:t>
+            </w:r>
+          </w:p>
+        </w:tc>
+        <w:tc>
+          <w:tcPr/>
+          <w:p>
+            <w:pPr>
+              <w:keepNext/>
+              <w:pStyle w:val="Compact"/>
+              <w:jc w:val="left"/>
+            </w:pPr>
+            <w:r>
+              <w:t xml:space="preserve">45 KEMS silica activities [21,35]</w:t>
+            </w:r>
+          </w:p>
+        </w:tc>
+        <w:tc>
+          <w:tcPr/>
+          <w:p>
+            <w:pPr>
+              <w:keepNext/>
+              <w:pStyle w:val="Compact"/>
+              <w:jc w:val="left"/>
+            </w:pPr>
+            <w:r>
+              <w:t xml:space="preserve">RMS ln a 0.48 (basic corner) and 0.46 (silica-rich); ternary liquidus not yet mapped</w:t>
+            </w:r>
+          </w:p>
+        </w:tc>
+      </w:tr>
+      <w:tr>
+        <w:trPr>
+          <w:cantSplit/>
+        </w:trPr>
+        <w:tc>
+          <w:tcPr/>
+          <w:p>
+            <w:pPr>
+              <w:pStyle w:val="Compact"/>
+              <w:jc w:val="left"/>
+            </w:pPr>
+            <w:r>
+              <w:t xml:space="preserve">CaO-FeO-MgO-SiO</w:t>
+            </w:r>
+            <w:r>
+              <w:rPr>
+                <w:vertAlign w:val="subscript"/>
+              </w:rPr>
+              <w:t xml:space="preserve">2</w:t>
+            </w:r>
+          </w:p>
+        </w:tc>
+        <w:tc>
+          <w:tcPr/>
+          <w:p>
+            <w:pPr>
+              <w:pStyle w:val="Compact"/>
+              <w:jc w:val="left"/>
+            </w:pPr>
+            <w:r>
+              <w:t xml:space="preserve">four silica binaries combined; basic edges ideal; no quaternary term</w:t>
+            </w:r>
+          </w:p>
+        </w:tc>
+        <w:tc>
+          <w:tcPr/>
+          <w:p>
+            <w:pPr>
+              <w:pStyle w:val="Compact"/>
+              <w:jc w:val="left"/>
+            </w:pPr>
+            <w:r>
+              <w:t xml:space="preserve">assembled by the Muggianu extension</w:t>
+            </w:r>
+          </w:p>
+        </w:tc>
+        <w:tc>
+          <w:tcPr/>
+          <w:p>
+            <w:pPr>
+              <w:pStyle w:val="Compact"/>
+              <w:jc w:val="left"/>
+            </w:pPr>
+            <w:r>
+              <w:t xml:space="preserve">reduces to each binary exactly at its edge; the melt interior is a prediction, and the ideal basic edges a documented next step</w:t>
             </w:r>
           </w:p>
         </w:tc>
       </w:tr>
     </w:tbl>
-    <w:bookmarkEnd w:id="2149"/>
-    <w:bookmarkStart w:id="2150" w:name="anatomy-of-a-database-file"/>
+    <w:bookmarkEnd w:id="2195"/>
+    <w:bookmarkStart w:id="2196" w:name="anatomy-of-a-database-file"/>
     <w:p>
       <w:pPr>
         <w:pStyle w:val="Heading3"/>
@@ -1426,8 +1957,8 @@
         <w:t xml:space="preserve">That asymmetry is the economics of the field in miniature: implementations of the published models are increasingly available, but each fitted parameter condenses dozens of measurements and decisions. Parameter sets rather than codes are therefore the scarce commodity, and an openly licensed, provenance-tracked database is the part of this contribution that cannot be regenerated from the paper alone.</w:t>
       </w:r>
     </w:p>
-    <w:bookmarkEnd w:id="2150"/>
-    <w:bookmarkStart w:id="2151" w:name="quality-control"/>
+    <w:bookmarkEnd w:id="2196"/>
+    <w:bookmarkStart w:id="2197" w:name="quality-control"/>
     <w:p>
       <w:pPr>
         <w:pStyle w:val="Heading3"/>
@@ -1465,7 +1996,7 @@
         <w:t xml:space="preserve"> </w:t>
       </w:r>
       <w:r>
-        <w:t xml:space="preserve">J per mole of atoms, line compounds included, while out-of-subset files must fail with the stated reason, and the suite asserts those failures too. The magnetic model is checked twice over: pycalphad parity on its own magnetic test database and on an own-transcribed Fe-C system, whose pure-iron transitions, carried almost entirely by the magnetic term, come out at 1185, 1668, and 1811 K against the measured 1184.8, 1667.5, and 1811. The Scheil panel is checked against known invariants: for Al-Zn at 30 mol% Zn it nucleates FCC_A1 at 836 K and freezes the 12.5% residue within one temperature step of the assessed 654 K eutectic [39]; for LiCl-KCl the residue freezes at 629 K against the measured 626 K.</w:t>
+        <w:t xml:space="preserve">J per mole of atoms, line compounds included, while out-of-subset files must fail with the stated reason, and the suite asserts those failures too. The magnetic model is checked twice over: pycalphad parity on its own magnetic test database and on an own-transcribed Fe-C system, whose pure-iron transitions, carried almost entirely by the magnetic term, come out at 1185, 1668, and 1811 K against the measured 1184.8, 1667.5, and 1811. The Scheil panel is checked against known invariants: for Al-Zn at 30 mol% Zn it nucleates FCC_A1 at 836 K and freezes the 12.5% residue within one temperature step of the assessed 654 K eutectic [41]; for LiCl-KCl the residue freezes at 629 K against the measured 626 K.</w:t>
       </w:r>
     </w:p>
     <w:p>
@@ -1957,7 +2488,7 @@
               <w:jc w:val="left"/>
             </w:pPr>
             <w:r>
-              <w:t xml:space="preserve">Cantera [40] parity to 10</w:t>
+              <w:t xml:space="preserve">Cantera [42] parity to 10</w:t>
             </w:r>
             <w:r>
               <w:rPr>
@@ -2235,9 +2766,9 @@
         <w:t xml:space="preserve">invariants sit within about 40 K, and the ternary liquidus projection reproduces the measured field topology [24]. Development practice is plain: the repository is version controlled with tagged releases (v0.1.0 through the v0.5.1 described here), the full suite runs before every release, and a fixed bug lands together with the regression test that would have caught it. The suite runs on Windows 11 under CPython 3.11 and 3.12; the browser application is exercised in Chromium- and Gecko-based browsers. A user can confirm a working installation by running pytest against the bundled test databases, or with no installation at all by opening the web application and loading the shipped ternary database.</w:t>
       </w:r>
     </w:p>
-    <w:bookmarkEnd w:id="2151"/>
-    <w:bookmarkEnd w:id="2152"/>
-    <w:bookmarkStart w:id="2160" w:name="availability"/>
+    <w:bookmarkEnd w:id="2197"/>
+    <w:bookmarkEnd w:id="2198"/>
+    <w:bookmarkStart w:id="2206" w:name="availability"/>
     <w:p>
       <w:pPr>
         <w:pStyle w:val="Heading2"/>
@@ -2246,7 +2777,7 @@
         <w:t xml:space="preserve">(2) Availability</w:t>
       </w:r>
     </w:p>
-    <w:bookmarkStart w:id="2153" w:name="operating-system"/>
+    <w:bookmarkStart w:id="2199" w:name="operating-system"/>
     <w:p>
       <w:pPr>
         <w:pStyle w:val="Heading3"/>
@@ -2263,8 +2794,8 @@
         <w:t xml:space="preserve">Platform independent. The core builds with any C99 compiler; development and testing used Windows 11. The browser application runs in any current browser with WebAssembly support.</w:t>
       </w:r>
     </w:p>
-    <w:bookmarkEnd w:id="2153"/>
-    <w:bookmarkStart w:id="2154" w:name="programming-language"/>
+    <w:bookmarkEnd w:id="2199"/>
+    <w:bookmarkStart w:id="2200" w:name="programming-language"/>
     <w:p>
       <w:pPr>
         <w:pStyle w:val="Heading3"/>
@@ -2281,8 +2812,8 @@
         <w:t xml:space="preserve">C (core), Python 3.11 or later (interface and fitting tools), JavaScript (browser application).</w:t>
       </w:r>
     </w:p>
-    <w:bookmarkEnd w:id="2154"/>
-    <w:bookmarkStart w:id="2155" w:name="additional-system-requirements"/>
+    <w:bookmarkEnd w:id="2200"/>
+    <w:bookmarkStart w:id="2201" w:name="additional-system-requirements"/>
     <w:p>
       <w:pPr>
         <w:pStyle w:val="Heading3"/>
@@ -2299,8 +2830,8 @@
         <w:t xml:space="preserve">None of note. The engine and database together are a few megabytes.</w:t>
       </w:r>
     </w:p>
-    <w:bookmarkEnd w:id="2155"/>
-    <w:bookmarkStart w:id="2156" w:name="dependencies"/>
+    <w:bookmarkEnd w:id="2201"/>
+    <w:bookmarkStart w:id="2202" w:name="dependencies"/>
     <w:p>
       <w:pPr>
         <w:pStyle w:val="Heading3"/>
@@ -2317,8 +2848,8 @@
         <w:t xml:space="preserve">Python interface: cffi, NumPy, SciPy (developed and tested with cffi 2.0, NumPy 2.4, and SciPy 1.17). The validation suite additionally requires pycalphad; every oracle comparison reported here ran against pycalphad 0.11.1, and the tests that read pycalphad’s own shipped test databases skip cleanly if a later version relocates them. The WebAssembly build requires emscripten. The C core and the browser application have no dependencies.</w:t>
       </w:r>
     </w:p>
-    <w:bookmarkEnd w:id="2156"/>
-    <w:bookmarkStart w:id="2157" w:name="list-of-contributors"/>
+    <w:bookmarkEnd w:id="2202"/>
+    <w:bookmarkStart w:id="2203" w:name="list-of-contributors"/>
     <w:p>
       <w:pPr>
         <w:pStyle w:val="Heading3"/>
@@ -2335,8 +2866,8 @@
         <w:t xml:space="preserve">Michael E. Bustamante (design, implementation, validation, data curation).</w:t>
       </w:r>
     </w:p>
-    <w:bookmarkEnd w:id="2157"/>
-    <w:bookmarkStart w:id="2158" w:name="software-location"/>
+    <w:bookmarkEnd w:id="2203"/>
+    <w:bookmarkStart w:id="2204" w:name="software-location"/>
     <w:p>
       <w:pPr>
         <w:pStyle w:val="Heading3"/>
@@ -2489,8 +3020,8 @@
         <w:t xml:space="preserve">Date published: 2026-09-02</w:t>
       </w:r>
     </w:p>
-    <w:bookmarkEnd w:id="2158"/>
-    <w:bookmarkStart w:id="2159" w:name="language"/>
+    <w:bookmarkEnd w:id="2204"/>
+    <w:bookmarkStart w:id="2205" w:name="language"/>
     <w:p>
       <w:pPr>
         <w:pStyle w:val="Heading3"/>
@@ -2507,9 +3038,9 @@
         <w:t xml:space="preserve">English.</w:t>
       </w:r>
     </w:p>
-    <w:bookmarkEnd w:id="2159"/>
-    <w:bookmarkEnd w:id="2160"/>
-    <w:bookmarkStart w:id="2180" w:name="reuse-potential"/>
+    <w:bookmarkEnd w:id="2205"/>
+    <w:bookmarkEnd w:id="2206"/>
+    <w:bookmarkStart w:id="2226" w:name="reuse-potential"/>
     <w:p>
       <w:pPr>
         <w:pStyle w:val="Heading2"/>
@@ -2534,7 +3065,7 @@
         <w:t xml:space="preserve">The browser application makes the lowest barrier the default. A lecture on slag thermodynamics, a plant metallurgist screening a composition, or a reviewer checking a claimed equilibrium can load the database and calculate in seconds, with confidential inputs never leaving the machine. The same property makes it a practical template for other groups who want to publish a model as a zero-install tool.</w:t>
       </w:r>
     </w:p>
-    <w:bookmarkStart w:id="2179" w:name="worked-examples"/>
+    <w:bookmarkStart w:id="2225" w:name="worked-examples"/>
     <w:p>
       <w:pPr>
         <w:pStyle w:val="Heading3"/>
@@ -2746,18 +3277,18 @@
           <wp:inline>
             <wp:extent cx="4206240" cy="3262561"/>
             <wp:effectExtent b="0" l="0" r="0" t="0"/>
-            <wp:docPr descr="Figure 4: The LiCl-KCl phase diagram calculated by the salt listing from the shipped open database, at the listing’s own step size. Light to dark: liquid, two-phase, and subsolidus fields. The dot is the calculated eutectic at this step size (0.400, 640 K); the star is the measured eutectic (0.415, 626 K)." title="" id="2162" name="Picture"/>
+            <wp:docPr descr="Figure 4: The LiCl-KCl phase diagram calculated by the salt listing from the shipped open database, at the listing’s own step size. Light to dark: liquid, two-phase, and subsolidus fields. The dot is the calculated eutectic at this step size (0.400, 640 K); the star is the measured eutectic (0.415, 626 K)." title="" id="2208" name="Picture"/>
             <a:graphic>
               <a:graphicData uri="http://schemas.openxmlformats.org/drawingml/2006/picture">
                 <pic:pic>
                   <pic:nvPicPr>
-                    <pic:cNvPr descr="figures/fig4_salt_example.png" id="2163" name="Picture"/>
+                    <pic:cNvPr descr="figures/fig4_salt_example.png" id="2209" name="Picture"/>
                     <pic:cNvPicPr>
                       <a:picLocks noChangeArrowheads="1" noChangeAspect="1"/>
                     </pic:cNvPicPr>
                   </pic:nvPicPr>
                   <pic:blipFill>
-                    <a:blip r:embed="rId2161"/>
+                    <a:blip r:embed="rId2207"/>
                     <a:stretch>
                       <a:fillRect/>
                     </a:stretch>
@@ -2980,7 +3511,7 @@
         <w:t xml:space="preserve"> </w:t>
       </w:r>
       <w:r>
-        <w:t xml:space="preserve">= 0.890 and 660 K against the assessed 0.885 and 654 K [39] (Figure 5). The shipped AlZn.tdb is itself an openly licensed transcription of that published assessment on the Scientific Group Thermodata Europe (SGTE) unary functions [41], verified bit-identical through pycalphad against the file it transcribes. The slag systems run through the same calls behind Figures 2 and 3, and the repository’s validation scripts are their executable record.</w:t>
+        <w:t xml:space="preserve">= 0.890 and 660 K against the assessed 0.885 and 654 K [41] (Figure 5). The shipped AlZn.tdb is itself an openly licensed transcription of that published assessment on the Scientific Group Thermodata Europe (SGTE) unary functions [43], verified bit-identical through pycalphad against the file it transcribes. The slag systems run through the same calls behind Figures 2 and 3, and the repository’s validation scripts are their executable record.</w:t>
       </w:r>
     </w:p>
     <w:p>
@@ -2992,18 +3523,18 @@
           <wp:inline>
             <wp:extent cx="4206240" cy="3262561"/>
             <wp:effectExtent b="0" l="0" r="0" t="0"/>
-            <wp:docPr descr="Figure 5: The Al-Zn phase diagram calculated by the alloy listing from the shipped open TDB. Light to dark: liquid, liquid plus solid, and solid fields. The dot is the calculated eutectic (0.890, 660 K); the star is the assessed eutectic (0.885, 654 K)." title="" id="2165" name="Picture"/>
+            <wp:docPr descr="Figure 5: The Al-Zn phase diagram calculated by the alloy listing from the shipped open TDB. Light to dark: liquid, liquid plus solid, and solid fields. The dot is the calculated eutectic (0.890, 660 K); the star is the assessed eutectic (0.885, 654 K)." title="" id="2211" name="Picture"/>
             <a:graphic>
               <a:graphicData uri="http://schemas.openxmlformats.org/drawingml/2006/picture">
                 <pic:pic>
                   <pic:nvPicPr>
-                    <pic:cNvPr descr="figures/fig5_alloy_example.png" id="2166" name="Picture"/>
+                    <pic:cNvPr descr="figures/fig5_alloy_example.png" id="2212" name="Picture"/>
                     <pic:cNvPicPr>
                       <a:picLocks noChangeArrowheads="1" noChangeAspect="1"/>
                     </pic:cNvPicPr>
                   </pic:nvPicPr>
                   <pic:blipFill>
-                    <a:blip r:embed="rId2164"/>
+                    <a:blip r:embed="rId2210"/>
                     <a:stretch>
                       <a:fillRect/>
                     </a:stretch>
@@ -3043,7 +3574,7 @@
         <w:pStyle w:val="BodyText"/>
       </w:pPr>
       <w:r>
-        <w:t xml:space="preserve">The database is a starting point rather than an endpoint, and the file format rewards growth: new components, new phases, and refits against new measurements accumulate in the same database. A system is therefore extended release by release rather than rebuilt, and archived versions keep results calculated against earlier releases reproducible. Because every value carries its source and every judgment is written down, another assessor can reweight the data, swap an endmember, or extend a system without reverse-engineering anything; dbbuild turns a table of measured activities into a loadable file in a few lines. The in-browser multiphase hull already covers any loaded three-cation file and any loaded alloy TDB join, so a new system becomes a browser phase diagram the moment its file loads. Natural extensions are further oxide systems, the remaining ChemSage solution models, the ionic-liquid TDB model, and multicomponent Scheil on the same hull machinery. The databases carry per-value provenance but not parameter uncertainties; refitting the same measured-data tables through ESPEI [10] to obtain Bayesian uncertainty bounds on the parameters is demonstrated below. A first reach into the combustion school is already in the library. The engine reads NASA 7-coefficient polynomial thermochemistry, the open format of NASA CEA [42] and GRI-Mech [43], and solves ideal-gas equilibrium at fixed temperature and pressure by the element-potential method, validated against Cantera [40] to 10</w:t>
+        <w:t xml:space="preserve">The database is a starting point rather than an endpoint, and the file format rewards growth: new components, new phases, and refits against new measurements accumulate in the same database. A system is therefore extended release by release rather than rebuilt, and archived versions keep results calculated against earlier releases reproducible. Because every value carries its source and every judgment is written down, another assessor can reweight the data, swap an endmember, or extend a system without reverse-engineering anything; dbbuild turns a table of measured activities into a loadable file in a few lines. The in-browser multiphase hull already covers any loaded three-cation file and any loaded alloy TDB join, so a new system becomes a browser phase diagram the moment its file loads. Natural extensions are further oxide systems, the remaining ChemSage solution models, the ionic-liquid TDB model, and multicomponent Scheil on the same hull machinery. The databases carry per-value provenance but not parameter uncertainties; refitting the same measured-data tables through ESPEI [10] to obtain Bayesian uncertainty bounds on the parameters is demonstrated below. A first reach into the combustion school is already in the library. The engine reads NASA 7-coefficient polynomial thermochemistry, the open format of NASA CEA [44] and GRI-Mech [45], and solves ideal-gas equilibrium at fixed temperature and pressure by the element-potential method, validated against Cantera [42] to 10</w:t>
       </w:r>
       <w:r>
         <w:rPr>
@@ -3112,7 +3643,7 @@
         <w:t xml:space="preserve"> </w:t>
       </w:r>
       <w:r>
-        <w:t xml:space="preserve">ratio of a carbon-oxygen gas fixes the oxygen partial pressure that decides whether carbon is removed from the steel or iron is oxidized into the slag, both at the 1873 K tap temperature and across the steelmaking range, with the gas engine reproducing Cantera throughout. The salt side of the same coupling is the fume over a molten chloride flux (Figure 8): each salt evaporates at its engine activity times its measured pure-component vapour pressure, so magnesium chloride, a fifth of the NaCl-KCl-MgCl2 flux, is only a few percent of the fume, because chlorocomplexing holds its activity far below its mole fraction. The engine’s validated activities are what separate that fume from a Raoultian estimate. The same engine also carries parameter uncertainty to the diagram. Refitting the Al-Zn liquid and face-centred-cubic excess parameters against the measured liquid enthalpy of mixing and the assessed phase boundaries [39, 44, 45] by Markov-chain Monte Carlo, and propagating the posterior through the browser calculation, produces the confidence band of Figure 9. Three excess coefficients were sampled, the liquid enthalpy and its temperature term and the face-centred-cubic enthalpy, by an ensemble of eighteen walkers over 1500 steps under ESPEI’s default equal dataset weighting, discarding the first half as burn-in; the walker-mean chains are stationary and well mixed (Gelman-Rubin R-hat at most 1.04), the effective sample size is of order 400, and no pair of parameters correlates above about 0.65. Because only these three excess terms are varied while the SGTE unary functions and the phases not being refitted are held at their assessed values, the band is the parametric posterior within the adopted model, not a total thermodynamic uncertainty. Read that way it is still informative: the liquidus band is narrow because the calorimetry pins the liquid interaction, while the solid-solubility band is wider because only the phase diagram constrains the corresponding parameter, an honest reflection of which measurements do the work. Relative to the XML road of XTDB [15] (Table 1), uTDB is the on-ramp from the installed base, extending files as they are and running in this engine today, with mechanical conversion to XTDB elements the natural bridge once that schema settles. Making the calculator multilingual across the field’s file dialects is the direction of travel. Contributions and issues are handled through the GitHub repository.</w:t>
+        <w:t xml:space="preserve">ratio of a carbon-oxygen gas fixes the oxygen partial pressure that decides whether carbon is removed from the steel or iron is oxidized into the slag, both at the 1873 K tap temperature and across the steelmaking range, with the gas engine reproducing Cantera throughout. The salt side of the same coupling is the fume over a molten chloride flux (Figure 8): each salt evaporates at its engine activity times its measured pure-component vapour pressure, so magnesium chloride, a fifth of the NaCl-KCl-MgCl2 flux, is only a few percent of the fume, because chlorocomplexing holds its activity far below its mole fraction. The engine’s validated activities are what separate that fume from a Raoultian estimate. The same engine also carries parameter uncertainty to the diagram. Refitting the Al-Zn liquid and face-centred-cubic excess parameters against the measured liquid enthalpy of mixing and the assessed phase boundaries [41,46,47] by Markov-chain Monte Carlo, and propagating the posterior through the browser calculation, produces the confidence band of Figure 9. Three excess coefficients were sampled, the liquid enthalpy and its temperature term and the face-centred-cubic enthalpy, by an ensemble of eighteen walkers over 1500 steps under ESPEI’s default equal dataset weighting, discarding the first half as burn-in; the walker-mean chains are stationary and well mixed (Gelman-Rubin R-hat at most 1.04), the effective sample size is of order 400, and no pair of parameters correlates above about 0.65. Because only these three excess terms are varied while the SGTE unary functions and the phases not being refitted are held at their assessed values, the band is the parametric posterior within the adopted model, not a total thermodynamic uncertainty. Read that way it is still informative: the liquidus band is narrow because the calorimetry pins the liquid interaction, while the solid-solubility band is wider because only the phase diagram constrains the corresponding parameter, an honest reflection of which measurements do the work. Relative to the XML road of XTDB [15] (Table 1), uTDB is the on-ramp from the installed base, extending files as they are and running in this engine today, with mechanical conversion to XTDB elements the natural bridge once that schema settles. Making the calculator multilingual across the field’s file dialects is the direction of travel. Contributions and issues are handled through the GitHub repository.</w:t>
       </w:r>
     </w:p>
     <w:p>
@@ -3124,18 +3655,18 @@
           <wp:inline>
             <wp:extent cx="5334000" cy="4430576"/>
             <wp:effectExtent b="0" l="0" r="0" t="0"/>
-            <wp:docPr descr="Figure 6: One unified (.utdb) file, two physics, calculated in the browser. (a) The steelmaking database loaded with the Melt/Alloy view toggle on Alloy; the engine calculates the Fe-C phase diagram through the magnetic compound energy formalism, rendered over a 0-25 mol% C composition window (the equilibrium always solves the whole join), with two tapped compositions pinned. (b) Scheil solidification for the same join at 4 mol% C, first solid at 1741 K and the residual liquid frozen by 1433 K, against the equilibrium lever-rule path (dashed). The file’s slag half is a Modified Quasichemical Model liquid; no legacy container holds both models at once." title="" id="2168" name="Picture"/>
+            <wp:docPr descr="Figure 6: One unified (.utdb) file, two physics, calculated in the browser. (a) The steelmaking database loaded with the Melt/Alloy view toggle on Alloy; the engine calculates the Fe-C phase diagram through the magnetic compound energy formalism, rendered over a 0-25 mol% C composition window (the equilibrium always solves the whole join), with two tapped compositions pinned. (b) Scheil solidification for the same join at 4 mol% C, first solid at 1741 K and the residual liquid frozen by 1433 K, against the equilibrium lever-rule path (dashed). The file’s slag half is a Modified Quasichemical Model liquid; no legacy container holds both models at once." title="" id="2214" name="Picture"/>
             <a:graphic>
               <a:graphicData uri="http://schemas.openxmlformats.org/drawingml/2006/picture">
                 <pic:pic>
                   <pic:nvPicPr>
-                    <pic:cNvPr descr="figures/fig6_utdb_steel.png" id="2169" name="Picture"/>
+                    <pic:cNvPr descr="figures/fig6_utdb_steel.png" id="2215" name="Picture"/>
                     <pic:cNvPicPr>
                       <a:picLocks noChangeArrowheads="1" noChangeAspect="1"/>
                     </pic:cNvPicPr>
                   </pic:nvPicPr>
                   <pic:blipFill>
-                    <a:blip r:embed="rId2167"/>
+                    <a:blip r:embed="rId2213"/>
                     <a:stretch>
                       <a:fillRect/>
                     </a:stretch>
@@ -3179,18 +3710,18 @@
           <wp:inline>
             <wp:extent cx="5334000" cy="2319130"/>
             <wp:effectExtent b="0" l="0" r="0" t="0"/>
-            <wp:docPr descr="Figure 7: The gas calculator as a steelmaking worked example, the equilibrium of a carbon-oxygen furnace gas by the Hephaestus gas engine (the NASA-polynomial element-potential solver compiled into the browser), with Cantera as the independent check. (a) Oxygen partial pressure against the CO to CO2 ratio at the 1873 K tap temperature: a lower ratio is more oxidizing and drives iron into the slag as FeO, a higher ratio is more reducing and decarburizes the steel. (b) The same oxygen potential against temperature for four fixed CO to CO2 buffers, showing that a given gas grows more oxidizing as it heats; the dashed line marks the tap temperature. Open circles are Cantera, agreeing to about 10-5 mole fraction across the field." title="" id="2171" name="Picture"/>
+            <wp:docPr descr="Figure 7: The gas calculator as a steelmaking worked example, the equilibrium of a carbon-oxygen furnace gas by the Hephaestus gas engine (the NASA-polynomial element-potential solver compiled into the browser), with Cantera as the independent check. (a) Oxygen partial pressure against the CO to CO2 ratio at the 1873 K tap temperature: a lower ratio is more oxidizing and drives iron into the slag as FeO, a higher ratio is more reducing and decarburizes the steel. (b) The same oxygen potential against temperature for four fixed CO to CO2 buffers, showing that a given gas grows more oxidizing as it heats; the dashed line marks the tap temperature. Open circles are Cantera, agreeing to about 10-5 mole fraction across the field." title="" id="2217" name="Picture"/>
             <a:graphic>
               <a:graphicData uri="http://schemas.openxmlformats.org/drawingml/2006/picture">
                 <pic:pic>
                   <pic:nvPicPr>
-                    <pic:cNvPr descr="figures/fig7_gas_steel.png" id="2172" name="Picture"/>
+                    <pic:cNvPr descr="figures/fig7_gas_steel.png" id="2218" name="Picture"/>
                     <pic:cNvPicPr>
                       <a:picLocks noChangeArrowheads="1" noChangeAspect="1"/>
                     </pic:cNvPicPr>
                   </pic:nvPicPr>
                   <pic:blipFill>
-                    <a:blip r:embed="rId2170"/>
+                    <a:blip r:embed="rId2216"/>
                     <a:stretch>
                       <a:fillRect/>
                     </a:stretch>
@@ -3270,18 +3801,18 @@
           <wp:inline>
             <wp:extent cx="5334000" cy="2319130"/>
             <wp:effectExtent b="0" l="0" r="0" t="0"/>
-            <wp:docPr descr="Figure 8: The gas-flux coupling as a molten-salt worked example, the fume over a NaCl-KCl-MgCl2 = 40/40/20 mol% flux. Each salt’s partial pressure is its engine activity times its measured pure-component vapour pressure (NaCl and KCl from NIST Antoine fits, MgCl2 from the NIST-JANAF gas and liquid Gibbs of formation, each reproducing its measured boiling point; activities from the engine, validated against the pure-composition limit and the near-ideal NaCl-KCl binary). (a) Fume partial pressures against temperature, with the total. (b) Flux composition against fume composition at 1200 K: magnesium chloride is a fifth of the flux but a few percent of the fume, held in the melt by chlorocomplexing that drops its activity well below its mole fraction." title="" id="2174" name="Picture"/>
+            <wp:docPr descr="Figure 8: The gas-flux coupling as a molten-salt worked example, the fume over a NaCl-KCl-MgCl2 = 40/40/20 mol% flux. Each salt’s partial pressure is its engine activity times its measured pure-component vapour pressure (NaCl and KCl from NIST Antoine fits, MgCl2 from the NIST-JANAF gas and liquid Gibbs of formation, each reproducing its measured boiling point; activities from the engine, validated against the pure-composition limit and the near-ideal NaCl-KCl binary). (a) Fume partial pressures against temperature, with the total. (b) Flux composition against fume composition at 1200 K: magnesium chloride is a fifth of the flux but a few percent of the fume, held in the melt by chlorocomplexing that drops its activity well below its mole fraction." title="" id="2220" name="Picture"/>
             <a:graphic>
               <a:graphicData uri="http://schemas.openxmlformats.org/drawingml/2006/picture">
                 <pic:pic>
                   <pic:nvPicPr>
-                    <pic:cNvPr descr="figures/fig8_gas_flux.png" id="2175" name="Picture"/>
+                    <pic:cNvPr descr="figures/fig8_gas_flux.png" id="2221" name="Picture"/>
                     <pic:cNvPicPr>
                       <a:picLocks noChangeArrowheads="1" noChangeAspect="1"/>
                     </pic:cNvPicPr>
                   </pic:nvPicPr>
                   <pic:blipFill>
-                    <a:blip r:embed="rId2173"/>
+                    <a:blip r:embed="rId2219"/>
                     <a:stretch>
                       <a:fillRect/>
                     </a:stretch>
@@ -3349,18 +3880,18 @@
           <wp:inline>
             <wp:extent cx="4572000" cy="3556000"/>
             <wp:effectExtent b="0" l="0" r="0" t="0"/>
-            <wp:docPr descr="Figure 9: Al-Zn phase diagram with ESPEI parameter uncertainty. The liquid and face-centred-cubic (fcc) excess parameters were refit by Markov-chain Monte Carlo to the measured liquid enthalpy of mixing (Debski et al., digitized from Dinsdale et al. [44]) and the assessed phase boundaries (Massalski [45]; Mey [39]), and the posterior was propagated through the engine. The solid line is the median liquidus and the dashed line the median fcc solvus; the shaded region is the 90 percent posterior band on each. The band is narrow on the liquidus, which the calorimetry constrains, and wider on the fcc solvus, which only the diagram constrains. It is the posterior of the three refitted excess parameters with the unary functions and unfitted phases held fixed, a parametric uncertainty within the model rather than a total one. The open circle is the eutectic reported by Massalski [45] (x(Zn) = 0.887, 654 K)." title="" id="2177" name="Picture"/>
+            <wp:docPr descr="Figure 9: Al-Zn phase diagram with ESPEI parameter uncertainty. The liquid and face-centred-cubic (fcc) excess parameters were refit by Markov-chain Monte Carlo to the measured liquid enthalpy of mixing (Debski et al., digitized from Dinsdale et al. [46]) and the assessed phase boundaries (Massalski [47]; Mey [41]), and the posterior was propagated through the engine. The solid line is the median liquidus and the dashed line the median fcc solvus; the shaded region is the 90 percent posterior band on each. The band is narrow on the liquidus, which the calorimetry constrains, and wider on the fcc solvus, which only the diagram constrains. It is the posterior of the three refitted excess parameters with the unary functions and unfitted phases held fixed, a parametric uncertainty within the model rather than a total one. The open circle is the eutectic reported by Massalski [47] (x(Zn) = 0.887, 654 K)." title="" id="2223" name="Picture"/>
             <a:graphic>
               <a:graphicData uri="http://schemas.openxmlformats.org/drawingml/2006/picture">
                 <pic:pic>
                   <pic:nvPicPr>
-                    <pic:cNvPr descr="figures/fig9_uq_alzn.png" id="2178" name="Picture"/>
+                    <pic:cNvPr descr="figures/fig9_uq_alzn.png" id="2224" name="Picture"/>
                     <pic:cNvPicPr>
                       <a:picLocks noChangeArrowheads="1" noChangeAspect="1"/>
                     </pic:cNvPicPr>
                   </pic:nvPicPr>
                   <pic:blipFill>
-                    <a:blip r:embed="rId2176"/>
+                    <a:blip r:embed="rId2222"/>
                     <a:stretch>
                       <a:fillRect/>
                     </a:stretch>
@@ -3392,7 +3923,7 @@
         <w:pStyle w:val="ImageCaption"/>
       </w:pPr>
       <w:r>
-        <w:t xml:space="preserve">Figure 9: Al-Zn phase diagram with ESPEI parameter uncertainty. The liquid and face-centred-cubic (fcc) excess parameters were refit by Markov-chain Monte Carlo to the measured liquid enthalpy of mixing (Debski et al., digitized from Dinsdale et al. [44]) and the assessed phase boundaries (Massalski [45]; Mey [39]), and the posterior was propagated through the engine. The solid line is the median liquidus and the dashed line the median fcc solvus; the shaded region is the 90 percent posterior band on each. The band is narrow on the liquidus, which the calorimetry constrains, and wider on the fcc solvus, which only the diagram constrains. It is the posterior of the three refitted excess parameters with the unary functions and unfitted phases held fixed, a parametric uncertainty within the model rather than a total one. The open circle is the eutectic reported by Massalski [45] (x(Zn) = 0.887, 654 K).</w:t>
+        <w:t xml:space="preserve">Figure 9: Al-Zn phase diagram with ESPEI parameter uncertainty. The liquid and face-centred-cubic (fcc) excess parameters were refit by Markov-chain Monte Carlo to the measured liquid enthalpy of mixing (Debski et al., digitized from Dinsdale et al. [46]) and the assessed phase boundaries (Massalski [47]; Mey [41]), and the posterior was propagated through the engine. The solid line is the median liquidus and the dashed line the median fcc solvus; the shaded region is the 90 percent posterior band on each. The band is narrow on the liquidus, which the calorimetry constrains, and wider on the fcc solvus, which only the diagram constrains. It is the posterior of the three refitted excess parameters with the unary functions and unfitted phases held fixed, a parametric uncertainty within the model rather than a total one. The open circle is the eutectic reported by Massalski [47] (x(Zn) = 0.887, 654 K).</w:t>
       </w:r>
     </w:p>
     <w:p>
@@ -3403,9 +3934,9 @@
         <w:t xml:space="preserve">The gap the present work addresses was never the model, which has been published for two decades, but an open, runnable pairing of model and parameters. Hephaestus supplies both halves under open licenses and puts them behind a browser page that asks nothing of its user. The claims are checkable end to end. Release v0.5.1 archives the exact version described, and the 137-test suite reruns the pycalphad comparisons on any machine. The worked examples print the figures shown, and every parameter in every shipped database traces to a published measurement through its provenance file. A reader who doubts a number can recalculate it; one who needs a system that is missing can build it with the same open tools, or ask.</w:t>
       </w:r>
     </w:p>
-    <w:bookmarkEnd w:id="2179"/>
-    <w:bookmarkEnd w:id="2180"/>
-    <w:bookmarkStart w:id="2181" w:name="data-availability"/>
+    <w:bookmarkEnd w:id="2225"/>
+    <w:bookmarkEnd w:id="2226"/>
+    <w:bookmarkStart w:id="2227" w:name="data-availability"/>
     <w:p>
       <w:pPr>
         <w:pStyle w:val="Heading2"/>
@@ -3422,8 +3953,8 @@
         <w:t xml:space="preserve">The engine, the database, the browser application, and the validation suite are openly available in the code repository listed above; the version described here is archived as release v0.5.1. The database files and their provenance records are in the repository’s data directory under CC BY 4.0.</w:t>
       </w:r>
     </w:p>
-    <w:bookmarkEnd w:id="2181"/>
-    <w:bookmarkStart w:id="2182" w:name="acknowledgements"/>
+    <w:bookmarkEnd w:id="2227"/>
+    <w:bookmarkStart w:id="2228" w:name="acknowledgements"/>
     <w:p>
       <w:pPr>
         <w:pStyle w:val="Heading2"/>
@@ -3440,8 +3971,8 @@
         <w:t xml:space="preserve">During the development of this software the author used Claude Code (Anthropic) to assist with implementation, validation scripting, and manuscript preparation. This assistance was agentic, not autonomous: it operated under author direction and supervision at every step and was never a closed loop that produced or accepted results without review. Every parameter was traced by the author to its primary source before entering the database, and every reference was verified against its registry record. The author reviewed and approved all output and takes full responsibility for this article.</w:t>
       </w:r>
     </w:p>
-    <w:bookmarkEnd w:id="2182"/>
-    <w:bookmarkStart w:id="2183" w:name="funding-statement"/>
+    <w:bookmarkEnd w:id="2228"/>
+    <w:bookmarkStart w:id="2229" w:name="funding-statement"/>
     <w:p>
       <w:pPr>
         <w:pStyle w:val="Heading2"/>
@@ -3458,8 +3989,8 @@
         <w:t xml:space="preserve">The development of this software received no external funding.</w:t>
       </w:r>
     </w:p>
-    <w:bookmarkEnd w:id="2183"/>
-    <w:bookmarkStart w:id="2184" w:name="competing-interests"/>
+    <w:bookmarkEnd w:id="2229"/>
+    <w:bookmarkStart w:id="2230" w:name="competing-interests"/>
     <w:p>
       <w:pPr>
         <w:pStyle w:val="Heading2"/>
@@ -3476,8 +4007,8 @@
         <w:t xml:space="preserve">The author founded Odinzen LLC, which provides commercial thermodynamic modeling services, and declares this as a competing interest. The software and database published here are released in full under open licenses, and no proprietary Odinzen assets are included.</w:t>
       </w:r>
     </w:p>
-    <w:bookmarkEnd w:id="2184"/>
-    <w:bookmarkStart w:id="2185" w:name="references"/>
+    <w:bookmarkEnd w:id="2230"/>
+    <w:bookmarkStart w:id="2231" w:name="references"/>
     <w:p>
       <w:pPr>
         <w:pStyle w:val="Heading2"/>
@@ -3775,91 +4306,107 @@
         <w:pStyle w:val="BodyText"/>
       </w:pPr>
       <w:r>
-        <w:t xml:space="preserve">[35] Barin I. Thermochemical Data of Pure Substances. 3rd ed. Weinheim: VCH; 1995. doi:10.1002/9783527619825</w:t>
-      </w:r>
-    </w:p>
-    <w:p>
-      <w:pPr>
-        <w:pStyle w:val="BodyText"/>
-      </w:pPr>
-      <w:r>
-        <w:t xml:space="preserve">[36] Hersh LS, Kleppa OJ. Enthalpies of Mixing in Some Binary Liquid Halide Mixtures. J Chem Phys. 1965;42:1309. doi:10.1063/1.1696115</w:t>
-      </w:r>
-    </w:p>
-    <w:p>
-      <w:pPr>
-        <w:pStyle w:val="BodyText"/>
-      </w:pPr>
-      <w:r>
-        <w:t xml:space="preserve">[37] Sangster J, Pelton AD. Phase Diagrams and Thermodynamic Properties of the 70 Binary Alkali Halide Systems Having Common Ions. J Phys Chem Ref Data. 1987;16:509. doi:10.1063/1.555803</w:t>
-      </w:r>
-    </w:p>
-    <w:p>
-      <w:pPr>
-        <w:pStyle w:val="BodyText"/>
-      </w:pPr>
-      <w:r>
-        <w:t xml:space="preserve">[38] Ard JC, Yingling JA, Johnson TJ, Schorne-Pinto J, Aziziha M, Dixon CM, et al. Development of the Molten Salt Thermal Properties Database - Thermochemical (MSTDB-TC), example applications, and LiCl-RbCl and UF3-UF4 system assessments. J Nucl Mater. 2022 May;563:153631. doi:10.1016/j.jnucmat.2022.153631</w:t>
-      </w:r>
-    </w:p>
-    <w:p>
-      <w:pPr>
-        <w:pStyle w:val="BodyText"/>
-      </w:pPr>
-      <w:r>
-        <w:t xml:space="preserve">[39] an Mey S. Reevaluation of the Al-Zn system. Z Metallkd. 1993;84(7):451-5. doi:10.1515/ijmr-1993-840704</w:t>
-      </w:r>
-    </w:p>
-    <w:p>
-      <w:pPr>
-        <w:pStyle w:val="BodyText"/>
-      </w:pPr>
-      <w:r>
-        <w:t xml:space="preserve">[40] Goodwin DG, Moffat HK, Schoegl I, Speth RL, Weber BW. Cantera: An Object-oriented Software Toolkit for Chemical Kinetics, Thermodynamics, and Transport Processes. Version 3.1.0; 2024. doi:10.5281/zenodo.14455267</w:t>
-      </w:r>
-    </w:p>
-    <w:p>
-      <w:pPr>
-        <w:pStyle w:val="BodyText"/>
-      </w:pPr>
-      <w:r>
-        <w:t xml:space="preserve">[41] Dinsdale AT. SGTE data for pure elements. Calphad. 1991 Oct;15(4):317-425. doi:10.1016/0364-5916(91)90030-N</w:t>
-      </w:r>
-    </w:p>
-    <w:p>
-      <w:pPr>
-        <w:pStyle w:val="BodyText"/>
-      </w:pPr>
-      <w:r>
-        <w:t xml:space="preserve">[42] McBride BJ, Zehe MJ, Gordon S. NASA Glenn Coefficients for Calculating Thermodynamic Properties of Individual Species. NASA/TP-2002-211556. Cleveland (OH): NASA Glenn Research Center; 2002.</w:t>
-      </w:r>
-    </w:p>
-    <w:p>
-      <w:pPr>
-        <w:pStyle w:val="BodyText"/>
-      </w:pPr>
-      <w:r>
-        <w:t xml:space="preserve">[43] Smith GP, Golden DM, Frenklach M, Moriarty NW, Eiteneer B, Goldenberg M, et al. GRI-Mech 3.0 [Internet]. 1999. Available from: http://combustion.berkeley.edu/gri-mech/</w:t>
-      </w:r>
-    </w:p>
-    <w:p>
-      <w:pPr>
-        <w:pStyle w:val="BodyText"/>
-      </w:pPr>
-      <w:r>
-        <w:t xml:space="preserve">[44] Dinsdale A, Zobac O, Kroupa A, Khvan A. Use of third generation data for the elements to model the thermodynamics of binary alloy systems: Part 1 - The critical assessment of data for the Al-Zn system. Calphad. 2020 Mar;68:101723. doi:10.1016/j.calphad.2019.101723</w:t>
-      </w:r>
-    </w:p>
-    <w:p>
-      <w:pPr>
-        <w:pStyle w:val="BodyText"/>
-      </w:pPr>
-      <w:r>
-        <w:t xml:space="preserve">[45] Massalski TB, editor. Binary Alloy Phase Diagrams. 2nd ed. Materials Park (OH): ASM International; 1990.</w:t>
-      </w:r>
-    </w:p>
-    <w:bookmarkEnd w:id="2185"/>
-    <w:bookmarkEnd w:id="2186"/>
+        <w:t xml:space="preserve">[35] Zaitsev AI, Litvina AD, Lyakishev NP, Mogutnov BM. Thermodynamics of CaO-Al2O3-SiO2 and CaF2-CaO-Al2O3-SiO2 melts. J Chem Soc Faraday Trans. 1997;93(17):3089-3098. doi:10.1039/a700511c</w:t>
+      </w:r>
+    </w:p>
+    <w:p>
+      <w:pPr>
+        <w:pStyle w:val="BodyText"/>
+      </w:pPr>
+      <w:r>
+        <w:t xml:space="preserve">[36] Barin I. Thermochemical Data of Pure Substances. 3rd ed. Weinheim: VCH; 1995. doi:10.1002/9783527619825</w:t>
+      </w:r>
+    </w:p>
+    <w:p>
+      <w:pPr>
+        <w:pStyle w:val="BodyText"/>
+      </w:pPr>
+      <w:r>
+        <w:t xml:space="preserve">[37] Hersh LS, Kleppa OJ. Enthalpies of Mixing in Some Binary Liquid Halide Mixtures. J Chem Phys. 1965;42:1309. doi:10.1063/1.1696115</w:t>
+      </w:r>
+    </w:p>
+    <w:p>
+      <w:pPr>
+        <w:pStyle w:val="BodyText"/>
+      </w:pPr>
+      <w:r>
+        <w:t xml:space="preserve">[38] Sangster J, Pelton AD. Phase Diagrams and Thermodynamic Properties of the 70 Binary Alkali Halide Systems Having Common Ions. J Phys Chem Ref Data. 1987;16:509. doi:10.1063/1.555803</w:t>
+      </w:r>
+    </w:p>
+    <w:p>
+      <w:pPr>
+        <w:pStyle w:val="BodyText"/>
+      </w:pPr>
+      <w:r>
+        <w:t xml:space="preserve">[39] Ard JC, Yingling JA, Johnson TJ, Schorne-Pinto J, Aziziha M, Dixon CM, et al. Development of the Molten Salt Thermal Properties Database - Thermochemical (MSTDB-TC), example applications, and LiCl-RbCl and UF3-UF4 system assessments. J Nucl Mater. 2022 May;563:153631. doi:10.1016/j.jnucmat.2022.153631</w:t>
+      </w:r>
+    </w:p>
+    <w:p>
+      <w:pPr>
+        <w:pStyle w:val="BodyText"/>
+      </w:pPr>
+      <w:r>
+        <w:t xml:space="preserve">[40] Rankin GA. The ternary system CaO-Al2O3-SiO2, with optical study by F. E. Wright. Am J Sci. 1915;s4-39(229):1-79. doi:10.2475/ajs.s4-39.229.1</w:t>
+      </w:r>
+    </w:p>
+    <w:p>
+      <w:pPr>
+        <w:pStyle w:val="BodyText"/>
+      </w:pPr>
+      <w:r>
+        <w:t xml:space="preserve">[41] an Mey S. Reevaluation of the Al-Zn system. Z Metallkd. 1993;84(7):451-5. doi:10.1515/ijmr-1993-840704</w:t>
+      </w:r>
+    </w:p>
+    <w:p>
+      <w:pPr>
+        <w:pStyle w:val="BodyText"/>
+      </w:pPr>
+      <w:r>
+        <w:t xml:space="preserve">[42] Goodwin DG, Moffat HK, Schoegl I, Speth RL, Weber BW. Cantera: An Object-oriented Software Toolkit for Chemical Kinetics, Thermodynamics, and Transport Processes. Version 3.1.0; 2024. doi:10.5281/zenodo.14455267</w:t>
+      </w:r>
+    </w:p>
+    <w:p>
+      <w:pPr>
+        <w:pStyle w:val="BodyText"/>
+      </w:pPr>
+      <w:r>
+        <w:t xml:space="preserve">[43] Dinsdale AT. SGTE data for pure elements. Calphad. 1991 Oct;15(4):317-425. doi:10.1016/0364-5916(91)90030-N</w:t>
+      </w:r>
+    </w:p>
+    <w:p>
+      <w:pPr>
+        <w:pStyle w:val="BodyText"/>
+      </w:pPr>
+      <w:r>
+        <w:t xml:space="preserve">[44] McBride BJ, Zehe MJ, Gordon S. NASA Glenn Coefficients for Calculating Thermodynamic Properties of Individual Species. NASA/TP-2002-211556. Cleveland (OH): NASA Glenn Research Center; 2002.</w:t>
+      </w:r>
+    </w:p>
+    <w:p>
+      <w:pPr>
+        <w:pStyle w:val="BodyText"/>
+      </w:pPr>
+      <w:r>
+        <w:t xml:space="preserve">[45] Smith GP, Golden DM, Frenklach M, Moriarty NW, Eiteneer B, Goldenberg M, et al. GRI-Mech 3.0 [Internet]. 1999. Available from: http://combustion.berkeley.edu/gri-mech/</w:t>
+      </w:r>
+    </w:p>
+    <w:p>
+      <w:pPr>
+        <w:pStyle w:val="BodyText"/>
+      </w:pPr>
+      <w:r>
+        <w:t xml:space="preserve">[46] Dinsdale A, Zobac O, Kroupa A, Khvan A. Use of third generation data for the elements to model the thermodynamics of binary alloy systems: Part 1 - The critical assessment of data for the Al-Zn system. Calphad. 2020 Mar;68:101723. doi:10.1016/j.calphad.2019.101723</w:t>
+      </w:r>
+    </w:p>
+    <w:p>
+      <w:pPr>
+        <w:pStyle w:val="BodyText"/>
+      </w:pPr>
+      <w:r>
+        <w:t xml:space="preserve">[47] Massalski TB, editor. Binary Alloy Phase Diagrams. 2nd ed. Materials Park (OH): ASM International; 1990.</w:t>
+      </w:r>
+    </w:p>
+    <w:bookmarkEnd w:id="2231"/>
+    <w:bookmarkEnd w:id="2232"/>
     <w:sectPr>
       <w:footnotePr>
         <w:numRestart w:val="eachSect"/>

</xml_diff>

<commit_message>
Add Gabriel Bustamante as second author; add CONTRIBUTING.md
Authorship: Gabriel Bustamante (Odinzen LLC, ORCID 0009-0005-3269-024X) joins as
second author, credited for software, software validation, and writing (review and
editing) - consistent with his co-authorship on the engine-development papers.
Byline, ORCIDs, list of contributors, competing-interests statement, and the
AI-use disclosure updated to two authors; docx/pdf rebuilt.

CONTRIBUTING.md: states the code/science boundary rule for the remote - a code
change that would alter a validated number, touch a physics constant or a
validation tolerance, or need a thermodynamic judgment goes to the maintainer
first, never settled silently in a PR; data/ and the oracle tolerances are science.

Co-Authored-By: Claude Opus 4.8 <noreply@anthropic.com>
</commit_message>
<xml_diff>
--- a/paper/Bustamante_Hephaestus_JORS_manuscript.docx
+++ b/paper/Bustamante_Hephaestus_JORS_manuscript.docx
@@ -2,7 +2,7 @@
 <file path=word/document.xml><?xml version="1.0" encoding="utf-8"?>
 <w:document xmlns:w="http://schemas.openxmlformats.org/wordprocessingml/2006/main" xmlns:m="http://schemas.openxmlformats.org/officeDocument/2006/math" xmlns:r="http://schemas.openxmlformats.org/officeDocument/2006/relationships" xmlns:o="urn:schemas-microsoft-com:office:office" xmlns:v="urn:schemas-microsoft-com:vml" xmlns:w10="urn:schemas-microsoft-com:office:word" xmlns:a="http://schemas.openxmlformats.org/drawingml/2006/main" xmlns:pic="http://schemas.openxmlformats.org/drawingml/2006/picture" xmlns:wp="http://schemas.openxmlformats.org/drawingml/2006/wordprocessingDrawing">
   <w:body>
-    <w:bookmarkStart w:id="2232" w:name="X4855b1162e70238fd839d871e0792397dc58430"/>
+    <w:bookmarkStart w:id="2278" w:name="X4855b1162e70238fd839d871e0792397dc58430"/>
     <w:p>
       <w:pPr>
         <w:pStyle w:val="Heading1"/>
@@ -16,7 +16,7 @@
         <w:pStyle w:val="FirstParagraph"/>
       </w:pPr>
       <w:r>
-        <w:t xml:space="preserve">Michael E. Bustamante</w:t>
+        <w:t xml:space="preserve">Michael E. Bustamante, Gabriel Bustamante</w:t>
       </w:r>
     </w:p>
     <w:p>
@@ -32,15 +32,15 @@
         <w:pStyle w:val="BodyText"/>
       </w:pPr>
       <w:r>
-        <w:t xml:space="preserve">Corresponding author: michaelbusta@odinzen.io</w:t>
-      </w:r>
-    </w:p>
-    <w:p>
-      <w:pPr>
-        <w:pStyle w:val="BodyText"/>
-      </w:pPr>
-      <w:r>
-        <w:t xml:space="preserve">ORCID: 0009-0009-9001-8151</w:t>
+        <w:t xml:space="preserve">Corresponding author: Michael E. Bustamante (michaelbusta@odinzen.io)</w:t>
+      </w:r>
+    </w:p>
+    <w:p>
+      <w:pPr>
+        <w:pStyle w:val="BodyText"/>
+      </w:pPr>
+      <w:r>
+        <w:t xml:space="preserve">ORCID: Michael E. Bustamante, 0009-0009-9001-8151; Gabriel Bustamante, 0009-0005-3269-024X</w:t>
       </w:r>
     </w:p>
     <w:p>
@@ -246,7 +246,7 @@
         <w:t xml:space="preserve">CALPHAD; molten slag; molten salt; modified quasichemical model; thermodynamic database; phase diagram; gas equilibrium; WebAssembly; open data</w:t>
       </w:r>
     </w:p>
-    <w:bookmarkStart w:id="2198" w:name="overview"/>
+    <w:bookmarkStart w:id="2244" w:name="overview"/>
     <w:p>
       <w:pPr>
         <w:pStyle w:val="Heading2"/>
@@ -255,7 +255,7 @@
         <w:t xml:space="preserve">(1) Overview</w:t>
       </w:r>
     </w:p>
-    <w:bookmarkStart w:id="2185" w:name="introduction"/>
+    <w:bookmarkStart w:id="2231" w:name="introduction"/>
     <w:p>
       <w:pPr>
         <w:pStyle w:val="Heading3"/>
@@ -635,8 +635,8 @@
         <w:t xml:space="preserve">Hephaestus is a deliberate response to that gap, and it treats the engine and the data as one contribution because neither is useful alone. The engine is small on purpose. Its core is plain C with no dependencies, which makes it easy to embed and lets the identical code compile to WebAssembly, so the full calculator runs in a web browser with nothing installed and no data leaving the user’s machine. The database is open on purpose. Every parameter in it derives from published measurements, each value carries its provenance down to table and page, and the known shortcomings are documented next to the numbers they affect. The present work describes both, their validation against pycalphad and against measured phase equilibria, and the ways they can be reused. None of it asks the reader to program. For the experimentalist who never writes code, the browser application is the entire product: a page to open, a database to click, and a diagram to read. The sections that follow describe the machinery underneath for those who want it. Supplementary Material S1 is a plain-language primer for the non-programmer, starting at what a database file is and ending at a first calculation and how to read it. Its closing section teaches what an assessment is built from, so a reader who wants to contribute data for open publication, or to commission a file, arrives knowing what is needed.</w:t>
       </w:r>
     </w:p>
-    <w:bookmarkEnd w:id="2185"/>
-    <w:bookmarkStart w:id="2195" w:name="implementation-and-architecture"/>
+    <w:bookmarkEnd w:id="2231"/>
+    <w:bookmarkStart w:id="2241" w:name="implementation-and-architecture"/>
     <w:p>
       <w:pPr>
         <w:pStyle w:val="Heading3"/>
@@ -662,18 +662,18 @@
           <wp:inline>
             <wp:extent cx="5334000" cy="3511167"/>
             <wp:effectExtent b="0" l="0" r="0" t="0"/>
-            <wp:docPr descr="Figure 1: Architecture of Hephaestus. A single dependency-free C core reads the field’s three database dialects (ChemSage .dat, Thermo-Calc .tdb with the Inden magnetic model, and the unified .utdb) and calculates all thermodynamics; the same core is used as a native library, from Python through cffi, and compiled to WebAssembly behind the browser application. dbbuild writes new ChemSage files from measured data, and every energy path is validated against pycalphad." title="" id="2187" name="Picture"/>
+            <wp:docPr descr="Figure 1: Architecture of Hephaestus. A single dependency-free C core reads the field’s three database dialects (ChemSage .dat, Thermo-Calc .tdb with the Inden magnetic model, and the unified .utdb) and calculates all thermodynamics; the same core is used as a native library, from Python through cffi, and compiled to WebAssembly behind the browser application. dbbuild writes new ChemSage files from measured data, and every energy path is validated against pycalphad." title="" id="2233" name="Picture"/>
             <a:graphic>
               <a:graphicData uri="http://schemas.openxmlformats.org/drawingml/2006/picture">
                 <pic:pic>
                   <pic:nvPicPr>
-                    <pic:cNvPr descr="figures/fig1_architecture.png" id="2188" name="Picture"/>
+                    <pic:cNvPr descr="figures/fig1_architecture.png" id="2234" name="Picture"/>
                     <pic:cNvPicPr>
                       <a:picLocks noChangeArrowheads="1" noChangeAspect="1"/>
                     </pic:cNvPicPr>
                   </pic:nvPicPr>
                   <pic:blipFill>
-                    <a:blip r:embed="rId2186"/>
+                    <a:blip r:embed="rId2232"/>
                     <a:stretch>
                       <a:fillRect/>
                     </a:stretch>
@@ -901,18 +901,18 @@
           <wp:inline>
             <wp:extent cx="4754880" cy="3913308"/>
             <wp:effectExtent b="0" l="0" r="0" t="0"/>
-            <wp:docPr descr="Figure 2: The live solver in the browser application (light theme). The user loads the shipped database, picks a temperature, and presses Compute; the WebAssembly engine then solves the full FeO-MgO-SiO2 phase assemblage client side (here 1023 composition samples and 512 tie-facets in about three seconds). Tapping a composition reads its stable phases and pins it to a comparison list; hovering previews on desktop." title="" id="2190" name="Picture"/>
+            <wp:docPr descr="Figure 2: The live solver in the browser application (light theme). The user loads the shipped database, picks a temperature, and presses Compute; the WebAssembly engine then solves the full FeO-MgO-SiO2 phase assemblage client side (here 1023 composition samples and 512 tie-facets in about three seconds). Tapping a composition reads its stable phases and pins it to a comparison list; hovering previews on desktop." title="" id="2236" name="Picture"/>
             <a:graphic>
               <a:graphicData uri="http://schemas.openxmlformats.org/drawingml/2006/picture">
                 <pic:pic>
                   <pic:nvPicPr>
-                    <pic:cNvPr descr="figures/fig2_browser_app.png" id="2191" name="Picture"/>
+                    <pic:cNvPr descr="figures/fig2_browser_app.png" id="2237" name="Picture"/>
                     <pic:cNvPicPr>
                       <a:picLocks noChangeArrowheads="1" noChangeAspect="1"/>
                     </pic:cNvPicPr>
                   </pic:nvPicPr>
                   <pic:blipFill>
-                    <a:blip r:embed="rId2189"/>
+                    <a:blip r:embed="rId2235"/>
                     <a:stretch>
                       <a:fillRect/>
                     </a:stretch>
@@ -1171,18 +1171,18 @@
           <wp:inline>
             <wp:extent cx="5334000" cy="2197297"/>
             <wp:effectExtent b="0" l="0" r="0" t="0"/>
-            <wp:docPr descr="Figure 3: The assessed FeO-MgO-SiO2 system calculated from the shipped database files. (a) Liquidus projection: primary crystallizing phase fields, with liquidus isotherms labeled in K. (b) Isothermal section at 1873 K: stable phase assemblages, shaded by the number of solid phases present. Phase labels: L liquid, Crs cristobalite, Ol olivine, Opx orthopyroxene, Per periclase, Wus wustite." title="" id="2193" name="Picture"/>
+            <wp:docPr descr="Figure 3: The assessed FeO-MgO-SiO2 system calculated from the shipped database files. (a) Liquidus projection: primary crystallizing phase fields, with liquidus isotherms labeled in K. (b) Isothermal section at 1873 K: stable phase assemblages, shaded by the number of solid phases present. Phase labels: L liquid, Crs cristobalite, Ol olivine, Opx orthopyroxene, Per periclase, Wus wustite." title="" id="2239" name="Picture"/>
             <a:graphic>
               <a:graphicData uri="http://schemas.openxmlformats.org/drawingml/2006/picture">
                 <pic:pic>
                   <pic:nvPicPr>
-                    <pic:cNvPr descr="figures/fig3_ternary.png" id="2194" name="Picture"/>
+                    <pic:cNvPr descr="figures/fig3_ternary.png" id="2240" name="Picture"/>
                     <pic:cNvPicPr>
                       <a:picLocks noChangeArrowheads="1" noChangeAspect="1"/>
                     </pic:cNvPicPr>
                   </pic:nvPicPr>
                   <pic:blipFill>
-                    <a:blip r:embed="rId2192"/>
+                    <a:blip r:embed="rId2238"/>
                     <a:stretch>
                       <a:fillRect/>
                     </a:stretch>
@@ -1923,8 +1923,8 @@
         </w:tc>
       </w:tr>
     </w:tbl>
-    <w:bookmarkEnd w:id="2195"/>
-    <w:bookmarkStart w:id="2196" w:name="anatomy-of-a-database-file"/>
+    <w:bookmarkEnd w:id="2241"/>
+    <w:bookmarkStart w:id="2242" w:name="anatomy-of-a-database-file"/>
     <w:p>
       <w:pPr>
         <w:pStyle w:val="Heading3"/>
@@ -1957,8 +1957,8 @@
         <w:t xml:space="preserve">That asymmetry is the economics of the field in miniature: implementations of the published models are increasingly available, but each fitted parameter condenses dozens of measurements and decisions. Parameter sets rather than codes are therefore the scarce commodity, and an openly licensed, provenance-tracked database is the part of this contribution that cannot be regenerated from the paper alone.</w:t>
       </w:r>
     </w:p>
-    <w:bookmarkEnd w:id="2196"/>
-    <w:bookmarkStart w:id="2197" w:name="quality-control"/>
+    <w:bookmarkEnd w:id="2242"/>
+    <w:bookmarkStart w:id="2243" w:name="quality-control"/>
     <w:p>
       <w:pPr>
         <w:pStyle w:val="Heading3"/>
@@ -2766,9 +2766,9 @@
         <w:t xml:space="preserve">invariants sit within about 40 K, and the ternary liquidus projection reproduces the measured field topology [24]. Development practice is plain: the repository is version controlled with tagged releases (v0.1.0 through the v0.5.1 described here), the full suite runs before every release, and a fixed bug lands together with the regression test that would have caught it. The suite runs on Windows 11 under CPython 3.11 and 3.12; the browser application is exercised in Chromium- and Gecko-based browsers. A user can confirm a working installation by running pytest against the bundled test databases, or with no installation at all by opening the web application and loading the shipped ternary database.</w:t>
       </w:r>
     </w:p>
-    <w:bookmarkEnd w:id="2197"/>
-    <w:bookmarkEnd w:id="2198"/>
-    <w:bookmarkStart w:id="2206" w:name="availability"/>
+    <w:bookmarkEnd w:id="2243"/>
+    <w:bookmarkEnd w:id="2244"/>
+    <w:bookmarkStart w:id="2252" w:name="availability"/>
     <w:p>
       <w:pPr>
         <w:pStyle w:val="Heading2"/>
@@ -2777,7 +2777,7 @@
         <w:t xml:space="preserve">(2) Availability</w:t>
       </w:r>
     </w:p>
-    <w:bookmarkStart w:id="2199" w:name="operating-system"/>
+    <w:bookmarkStart w:id="2245" w:name="operating-system"/>
     <w:p>
       <w:pPr>
         <w:pStyle w:val="Heading3"/>
@@ -2794,8 +2794,8 @@
         <w:t xml:space="preserve">Platform independent. The core builds with any C99 compiler; development and testing used Windows 11. The browser application runs in any current browser with WebAssembly support.</w:t>
       </w:r>
     </w:p>
-    <w:bookmarkEnd w:id="2199"/>
-    <w:bookmarkStart w:id="2200" w:name="programming-language"/>
+    <w:bookmarkEnd w:id="2245"/>
+    <w:bookmarkStart w:id="2246" w:name="programming-language"/>
     <w:p>
       <w:pPr>
         <w:pStyle w:val="Heading3"/>
@@ -2812,8 +2812,8 @@
         <w:t xml:space="preserve">C (core), Python 3.11 or later (interface and fitting tools), JavaScript (browser application).</w:t>
       </w:r>
     </w:p>
-    <w:bookmarkEnd w:id="2200"/>
-    <w:bookmarkStart w:id="2201" w:name="additional-system-requirements"/>
+    <w:bookmarkEnd w:id="2246"/>
+    <w:bookmarkStart w:id="2247" w:name="additional-system-requirements"/>
     <w:p>
       <w:pPr>
         <w:pStyle w:val="Heading3"/>
@@ -2830,8 +2830,8 @@
         <w:t xml:space="preserve">None of note. The engine and database together are a few megabytes.</w:t>
       </w:r>
     </w:p>
-    <w:bookmarkEnd w:id="2201"/>
-    <w:bookmarkStart w:id="2202" w:name="dependencies"/>
+    <w:bookmarkEnd w:id="2247"/>
+    <w:bookmarkStart w:id="2248" w:name="dependencies"/>
     <w:p>
       <w:pPr>
         <w:pStyle w:val="Heading3"/>
@@ -2848,8 +2848,8 @@
         <w:t xml:space="preserve">Python interface: cffi, NumPy, SciPy (developed and tested with cffi 2.0, NumPy 2.4, and SciPy 1.17). The validation suite additionally requires pycalphad; every oracle comparison reported here ran against pycalphad 0.11.1, and the tests that read pycalphad’s own shipped test databases skip cleanly if a later version relocates them. The WebAssembly build requires emscripten. The C core and the browser application have no dependencies.</w:t>
       </w:r>
     </w:p>
-    <w:bookmarkEnd w:id="2202"/>
-    <w:bookmarkStart w:id="2203" w:name="list-of-contributors"/>
+    <w:bookmarkEnd w:id="2248"/>
+    <w:bookmarkStart w:id="2249" w:name="list-of-contributors"/>
     <w:p>
       <w:pPr>
         <w:pStyle w:val="Heading3"/>
@@ -2863,11 +2863,11 @@
         <w:pStyle w:val="FirstParagraph"/>
       </w:pPr>
       <w:r>
-        <w:t xml:space="preserve">Michael E. Bustamante (design, implementation, validation, data curation).</w:t>
-      </w:r>
-    </w:p>
-    <w:bookmarkEnd w:id="2203"/>
-    <w:bookmarkStart w:id="2204" w:name="software-location"/>
+        <w:t xml:space="preserve">Michael E. Bustamante (design, implementation, validation, data curation, writing - original draft). Gabriel Bustamante (software, software validation, writing - review and editing).</w:t>
+      </w:r>
+    </w:p>
+    <w:bookmarkEnd w:id="2249"/>
+    <w:bookmarkStart w:id="2250" w:name="software-location"/>
     <w:p>
       <w:pPr>
         <w:pStyle w:val="Heading3"/>
@@ -3020,8 +3020,8 @@
         <w:t xml:space="preserve">Date published: 2026-09-02</w:t>
       </w:r>
     </w:p>
-    <w:bookmarkEnd w:id="2204"/>
-    <w:bookmarkStart w:id="2205" w:name="language"/>
+    <w:bookmarkEnd w:id="2250"/>
+    <w:bookmarkStart w:id="2251" w:name="language"/>
     <w:p>
       <w:pPr>
         <w:pStyle w:val="Heading3"/>
@@ -3038,9 +3038,9 @@
         <w:t xml:space="preserve">English.</w:t>
       </w:r>
     </w:p>
-    <w:bookmarkEnd w:id="2205"/>
-    <w:bookmarkEnd w:id="2206"/>
-    <w:bookmarkStart w:id="2226" w:name="reuse-potential"/>
+    <w:bookmarkEnd w:id="2251"/>
+    <w:bookmarkEnd w:id="2252"/>
+    <w:bookmarkStart w:id="2272" w:name="reuse-potential"/>
     <w:p>
       <w:pPr>
         <w:pStyle w:val="Heading2"/>
@@ -3065,7 +3065,7 @@
         <w:t xml:space="preserve">The browser application makes the lowest barrier the default. A lecture on slag thermodynamics, a plant metallurgist screening a composition, or a reviewer checking a claimed equilibrium can load the database and calculate in seconds, with confidential inputs never leaving the machine. The same property makes it a practical template for other groups who want to publish a model as a zero-install tool.</w:t>
       </w:r>
     </w:p>
-    <w:bookmarkStart w:id="2225" w:name="worked-examples"/>
+    <w:bookmarkStart w:id="2271" w:name="worked-examples"/>
     <w:p>
       <w:pPr>
         <w:pStyle w:val="Heading3"/>
@@ -3277,18 +3277,18 @@
           <wp:inline>
             <wp:extent cx="4206240" cy="3262561"/>
             <wp:effectExtent b="0" l="0" r="0" t="0"/>
-            <wp:docPr descr="Figure 4: The LiCl-KCl phase diagram calculated by the salt listing from the shipped open database, at the listing’s own step size. Light to dark: liquid, two-phase, and subsolidus fields. The dot is the calculated eutectic at this step size (0.400, 640 K); the star is the measured eutectic (0.415, 626 K)." title="" id="2208" name="Picture"/>
+            <wp:docPr descr="Figure 4: The LiCl-KCl phase diagram calculated by the salt listing from the shipped open database, at the listing’s own step size. Light to dark: liquid, two-phase, and subsolidus fields. The dot is the calculated eutectic at this step size (0.400, 640 K); the star is the measured eutectic (0.415, 626 K)." title="" id="2254" name="Picture"/>
             <a:graphic>
               <a:graphicData uri="http://schemas.openxmlformats.org/drawingml/2006/picture">
                 <pic:pic>
                   <pic:nvPicPr>
-                    <pic:cNvPr descr="figures/fig4_salt_example.png" id="2209" name="Picture"/>
+                    <pic:cNvPr descr="figures/fig4_salt_example.png" id="2255" name="Picture"/>
                     <pic:cNvPicPr>
                       <a:picLocks noChangeArrowheads="1" noChangeAspect="1"/>
                     </pic:cNvPicPr>
                   </pic:nvPicPr>
                   <pic:blipFill>
-                    <a:blip r:embed="rId2207"/>
+                    <a:blip r:embed="rId2253"/>
                     <a:stretch>
                       <a:fillRect/>
                     </a:stretch>
@@ -3523,18 +3523,18 @@
           <wp:inline>
             <wp:extent cx="4206240" cy="3262561"/>
             <wp:effectExtent b="0" l="0" r="0" t="0"/>
-            <wp:docPr descr="Figure 5: The Al-Zn phase diagram calculated by the alloy listing from the shipped open TDB. Light to dark: liquid, liquid plus solid, and solid fields. The dot is the calculated eutectic (0.890, 660 K); the star is the assessed eutectic (0.885, 654 K)." title="" id="2211" name="Picture"/>
+            <wp:docPr descr="Figure 5: The Al-Zn phase diagram calculated by the alloy listing from the shipped open TDB. Light to dark: liquid, liquid plus solid, and solid fields. The dot is the calculated eutectic (0.890, 660 K); the star is the assessed eutectic (0.885, 654 K)." title="" id="2257" name="Picture"/>
             <a:graphic>
               <a:graphicData uri="http://schemas.openxmlformats.org/drawingml/2006/picture">
                 <pic:pic>
                   <pic:nvPicPr>
-                    <pic:cNvPr descr="figures/fig5_alloy_example.png" id="2212" name="Picture"/>
+                    <pic:cNvPr descr="figures/fig5_alloy_example.png" id="2258" name="Picture"/>
                     <pic:cNvPicPr>
                       <a:picLocks noChangeArrowheads="1" noChangeAspect="1"/>
                     </pic:cNvPicPr>
                   </pic:nvPicPr>
                   <pic:blipFill>
-                    <a:blip r:embed="rId2210"/>
+                    <a:blip r:embed="rId2256"/>
                     <a:stretch>
                       <a:fillRect/>
                     </a:stretch>
@@ -3655,18 +3655,18 @@
           <wp:inline>
             <wp:extent cx="5334000" cy="4430576"/>
             <wp:effectExtent b="0" l="0" r="0" t="0"/>
-            <wp:docPr descr="Figure 6: One unified (.utdb) file, two physics, calculated in the browser. (a) The steelmaking database loaded with the Melt/Alloy view toggle on Alloy; the engine calculates the Fe-C phase diagram through the magnetic compound energy formalism, rendered over a 0-25 mol% C composition window (the equilibrium always solves the whole join), with two tapped compositions pinned. (b) Scheil solidification for the same join at 4 mol% C, first solid at 1741 K and the residual liquid frozen by 1433 K, against the equilibrium lever-rule path (dashed). The file’s slag half is a Modified Quasichemical Model liquid; no legacy container holds both models at once." title="" id="2214" name="Picture"/>
+            <wp:docPr descr="Figure 6: One unified (.utdb) file, two physics, calculated in the browser. (a) The steelmaking database loaded with the Melt/Alloy view toggle on Alloy; the engine calculates the Fe-C phase diagram through the magnetic compound energy formalism, rendered over a 0-25 mol% C composition window (the equilibrium always solves the whole join), with two tapped compositions pinned. (b) Scheil solidification for the same join at 4 mol% C, first solid at 1741 K and the residual liquid frozen by 1433 K, against the equilibrium lever-rule path (dashed). The file’s slag half is a Modified Quasichemical Model liquid; no legacy container holds both models at once." title="" id="2260" name="Picture"/>
             <a:graphic>
               <a:graphicData uri="http://schemas.openxmlformats.org/drawingml/2006/picture">
                 <pic:pic>
                   <pic:nvPicPr>
-                    <pic:cNvPr descr="figures/fig6_utdb_steel.png" id="2215" name="Picture"/>
+                    <pic:cNvPr descr="figures/fig6_utdb_steel.png" id="2261" name="Picture"/>
                     <pic:cNvPicPr>
                       <a:picLocks noChangeArrowheads="1" noChangeAspect="1"/>
                     </pic:cNvPicPr>
                   </pic:nvPicPr>
                   <pic:blipFill>
-                    <a:blip r:embed="rId2213"/>
+                    <a:blip r:embed="rId2259"/>
                     <a:stretch>
                       <a:fillRect/>
                     </a:stretch>
@@ -3710,18 +3710,18 @@
           <wp:inline>
             <wp:extent cx="5334000" cy="2319130"/>
             <wp:effectExtent b="0" l="0" r="0" t="0"/>
-            <wp:docPr descr="Figure 7: The gas calculator as a steelmaking worked example, the equilibrium of a carbon-oxygen furnace gas by the Hephaestus gas engine (the NASA-polynomial element-potential solver compiled into the browser), with Cantera as the independent check. (a) Oxygen partial pressure against the CO to CO2 ratio at the 1873 K tap temperature: a lower ratio is more oxidizing and drives iron into the slag as FeO, a higher ratio is more reducing and decarburizes the steel. (b) The same oxygen potential against temperature for four fixed CO to CO2 buffers, showing that a given gas grows more oxidizing as it heats; the dashed line marks the tap temperature. Open circles are Cantera, agreeing to about 10-5 mole fraction across the field." title="" id="2217" name="Picture"/>
+            <wp:docPr descr="Figure 7: The gas calculator as a steelmaking worked example, the equilibrium of a carbon-oxygen furnace gas by the Hephaestus gas engine (the NASA-polynomial element-potential solver compiled into the browser), with Cantera as the independent check. (a) Oxygen partial pressure against the CO to CO2 ratio at the 1873 K tap temperature: a lower ratio is more oxidizing and drives iron into the slag as FeO, a higher ratio is more reducing and decarburizes the steel. (b) The same oxygen potential against temperature for four fixed CO to CO2 buffers, showing that a given gas grows more oxidizing as it heats; the dashed line marks the tap temperature. Open circles are Cantera, agreeing to about 10-5 mole fraction across the field." title="" id="2263" name="Picture"/>
             <a:graphic>
               <a:graphicData uri="http://schemas.openxmlformats.org/drawingml/2006/picture">
                 <pic:pic>
                   <pic:nvPicPr>
-                    <pic:cNvPr descr="figures/fig7_gas_steel.png" id="2218" name="Picture"/>
+                    <pic:cNvPr descr="figures/fig7_gas_steel.png" id="2264" name="Picture"/>
                     <pic:cNvPicPr>
                       <a:picLocks noChangeArrowheads="1" noChangeAspect="1"/>
                     </pic:cNvPicPr>
                   </pic:nvPicPr>
                   <pic:blipFill>
-                    <a:blip r:embed="rId2216"/>
+                    <a:blip r:embed="rId2262"/>
                     <a:stretch>
                       <a:fillRect/>
                     </a:stretch>
@@ -3801,18 +3801,18 @@
           <wp:inline>
             <wp:extent cx="5334000" cy="2319130"/>
             <wp:effectExtent b="0" l="0" r="0" t="0"/>
-            <wp:docPr descr="Figure 8: The gas-flux coupling as a molten-salt worked example, the fume over a NaCl-KCl-MgCl2 = 40/40/20 mol% flux. Each salt’s partial pressure is its engine activity times its measured pure-component vapour pressure (NaCl and KCl from NIST Antoine fits, MgCl2 from the NIST-JANAF gas and liquid Gibbs of formation, each reproducing its measured boiling point; activities from the engine, validated against the pure-composition limit and the near-ideal NaCl-KCl binary). (a) Fume partial pressures against temperature, with the total. (b) Flux composition against fume composition at 1200 K: magnesium chloride is a fifth of the flux but a few percent of the fume, held in the melt by chlorocomplexing that drops its activity well below its mole fraction." title="" id="2220" name="Picture"/>
+            <wp:docPr descr="Figure 8: The gas-flux coupling as a molten-salt worked example, the fume over a NaCl-KCl-MgCl2 = 40/40/20 mol% flux. Each salt’s partial pressure is its engine activity times its measured pure-component vapour pressure (NaCl and KCl from NIST Antoine fits, MgCl2 from the NIST-JANAF gas and liquid Gibbs of formation, each reproducing its measured boiling point; activities from the engine, validated against the pure-composition limit and the near-ideal NaCl-KCl binary). (a) Fume partial pressures against temperature, with the total. (b) Flux composition against fume composition at 1200 K: magnesium chloride is a fifth of the flux but a few percent of the fume, held in the melt by chlorocomplexing that drops its activity well below its mole fraction." title="" id="2266" name="Picture"/>
             <a:graphic>
               <a:graphicData uri="http://schemas.openxmlformats.org/drawingml/2006/picture">
                 <pic:pic>
                   <pic:nvPicPr>
-                    <pic:cNvPr descr="figures/fig8_gas_flux.png" id="2221" name="Picture"/>
+                    <pic:cNvPr descr="figures/fig8_gas_flux.png" id="2267" name="Picture"/>
                     <pic:cNvPicPr>
                       <a:picLocks noChangeArrowheads="1" noChangeAspect="1"/>
                     </pic:cNvPicPr>
                   </pic:nvPicPr>
                   <pic:blipFill>
-                    <a:blip r:embed="rId2219"/>
+                    <a:blip r:embed="rId2265"/>
                     <a:stretch>
                       <a:fillRect/>
                     </a:stretch>
@@ -3880,18 +3880,18 @@
           <wp:inline>
             <wp:extent cx="4572000" cy="3556000"/>
             <wp:effectExtent b="0" l="0" r="0" t="0"/>
-            <wp:docPr descr="Figure 9: Al-Zn phase diagram with ESPEI parameter uncertainty. The liquid and face-centred-cubic (fcc) excess parameters were refit by Markov-chain Monte Carlo to the measured liquid enthalpy of mixing (Debski et al., digitized from Dinsdale et al. [46]) and the assessed phase boundaries (Massalski [47]; Mey [41]), and the posterior was propagated through the engine. The solid line is the median liquidus and the dashed line the median fcc solvus; the shaded region is the 90 percent posterior band on each. The band is narrow on the liquidus, which the calorimetry constrains, and wider on the fcc solvus, which only the diagram constrains. It is the posterior of the three refitted excess parameters with the unary functions and unfitted phases held fixed, a parametric uncertainty within the model rather than a total one. The open circle is the eutectic reported by Massalski [47] (x(Zn) = 0.887, 654 K)." title="" id="2223" name="Picture"/>
+            <wp:docPr descr="Figure 9: Al-Zn phase diagram with ESPEI parameter uncertainty. The liquid and face-centred-cubic (fcc) excess parameters were refit by Markov-chain Monte Carlo to the measured liquid enthalpy of mixing (Debski et al., digitized from Dinsdale et al. [46]) and the assessed phase boundaries (Massalski [47]; Mey [41]), and the posterior was propagated through the engine. The solid line is the median liquidus and the dashed line the median fcc solvus; the shaded region is the 90 percent posterior band on each. The band is narrow on the liquidus, which the calorimetry constrains, and wider on the fcc solvus, which only the diagram constrains. It is the posterior of the three refitted excess parameters with the unary functions and unfitted phases held fixed, a parametric uncertainty within the model rather than a total one. The open circle is the eutectic reported by Massalski [47] (x(Zn) = 0.887, 654 K)." title="" id="2269" name="Picture"/>
             <a:graphic>
               <a:graphicData uri="http://schemas.openxmlformats.org/drawingml/2006/picture">
                 <pic:pic>
                   <pic:nvPicPr>
-                    <pic:cNvPr descr="figures/fig9_uq_alzn.png" id="2224" name="Picture"/>
+                    <pic:cNvPr descr="figures/fig9_uq_alzn.png" id="2270" name="Picture"/>
                     <pic:cNvPicPr>
                       <a:picLocks noChangeArrowheads="1" noChangeAspect="1"/>
                     </pic:cNvPicPr>
                   </pic:nvPicPr>
                   <pic:blipFill>
-                    <a:blip r:embed="rId2222"/>
+                    <a:blip r:embed="rId2268"/>
                     <a:stretch>
                       <a:fillRect/>
                     </a:stretch>
@@ -3934,9 +3934,9 @@
         <w:t xml:space="preserve">The gap the present work addresses was never the model, which has been published for two decades, but an open, runnable pairing of model and parameters. Hephaestus supplies both halves under open licenses and puts them behind a browser page that asks nothing of its user. The claims are checkable end to end. Release v0.5.1 archives the exact version described, and the 137-test suite reruns the pycalphad comparisons on any machine. The worked examples print the figures shown, and every parameter in every shipped database traces to a published measurement through its provenance file. A reader who doubts a number can recalculate it; one who needs a system that is missing can build it with the same open tools, or ask.</w:t>
       </w:r>
     </w:p>
-    <w:bookmarkEnd w:id="2225"/>
-    <w:bookmarkEnd w:id="2226"/>
-    <w:bookmarkStart w:id="2227" w:name="data-availability"/>
+    <w:bookmarkEnd w:id="2271"/>
+    <w:bookmarkEnd w:id="2272"/>
+    <w:bookmarkStart w:id="2273" w:name="data-availability"/>
     <w:p>
       <w:pPr>
         <w:pStyle w:val="Heading2"/>
@@ -3953,8 +3953,8 @@
         <w:t xml:space="preserve">The engine, the database, the browser application, and the validation suite are openly available in the code repository listed above; the version described here is archived as release v0.5.1. The database files and their provenance records are in the repository’s data directory under CC BY 4.0.</w:t>
       </w:r>
     </w:p>
-    <w:bookmarkEnd w:id="2227"/>
-    <w:bookmarkStart w:id="2228" w:name="acknowledgements"/>
+    <w:bookmarkEnd w:id="2273"/>
+    <w:bookmarkStart w:id="2274" w:name="acknowledgements"/>
     <w:p>
       <w:pPr>
         <w:pStyle w:val="Heading2"/>
@@ -3968,11 +3968,11 @@
         <w:pStyle w:val="FirstParagraph"/>
       </w:pPr>
       <w:r>
-        <w:t xml:space="preserve">During the development of this software the author used Claude Code (Anthropic) to assist with implementation, validation scripting, and manuscript preparation. This assistance was agentic, not autonomous: it operated under author direction and supervision at every step and was never a closed loop that produced or accepted results without review. Every parameter was traced by the author to its primary source before entering the database, and every reference was verified against its registry record. The author reviewed and approved all output and takes full responsibility for this article.</w:t>
-      </w:r>
-    </w:p>
-    <w:bookmarkEnd w:id="2228"/>
-    <w:bookmarkStart w:id="2229" w:name="funding-statement"/>
+        <w:t xml:space="preserve">During the development of this software the authors used Claude Code (Anthropic) to assist with implementation, validation scripting, and manuscript preparation. This assistance was agentic, not autonomous: it operated under author direction and supervision at every step and was never a closed loop that produced or accepted results without review. Every parameter was traced by the authors to its primary source before entering the database, and every reference was verified against its registry record. The authors reviewed and approved all output and take full responsibility for this article.</w:t>
+      </w:r>
+    </w:p>
+    <w:bookmarkEnd w:id="2274"/>
+    <w:bookmarkStart w:id="2275" w:name="funding-statement"/>
     <w:p>
       <w:pPr>
         <w:pStyle w:val="Heading2"/>
@@ -3989,8 +3989,8 @@
         <w:t xml:space="preserve">The development of this software received no external funding.</w:t>
       </w:r>
     </w:p>
-    <w:bookmarkEnd w:id="2229"/>
-    <w:bookmarkStart w:id="2230" w:name="competing-interests"/>
+    <w:bookmarkEnd w:id="2275"/>
+    <w:bookmarkStart w:id="2276" w:name="competing-interests"/>
     <w:p>
       <w:pPr>
         <w:pStyle w:val="Heading2"/>
@@ -4004,11 +4004,11 @@
         <w:pStyle w:val="FirstParagraph"/>
       </w:pPr>
       <w:r>
-        <w:t xml:space="preserve">The author founded Odinzen LLC, which provides commercial thermodynamic modeling services, and declares this as a competing interest. The software and database published here are released in full under open licenses, and no proprietary Odinzen assets are included.</w:t>
-      </w:r>
-    </w:p>
-    <w:bookmarkEnd w:id="2230"/>
-    <w:bookmarkStart w:id="2231" w:name="references"/>
+        <w:t xml:space="preserve">Both authors are affiliated with Odinzen LLC, which provides commercial thermodynamic modeling services, and declare this as a competing interest; Michael E. Bustamante founded the company. The software and database published here are released in full under open licenses, and no proprietary Odinzen assets are included.</w:t>
+      </w:r>
+    </w:p>
+    <w:bookmarkEnd w:id="2276"/>
+    <w:bookmarkStart w:id="2277" w:name="references"/>
     <w:p>
       <w:pPr>
         <w:pStyle w:val="Heading2"/>
@@ -4405,8 +4405,8 @@
         <w:t xml:space="preserve">[47] Massalski TB, editor. Binary Alloy Phase Diagrams. 2nd ed. Materials Park (OH): ASM International; 1990.</w:t>
       </w:r>
     </w:p>
-    <w:bookmarkEnd w:id="2231"/>
-    <w:bookmarkEnd w:id="2232"/>
+    <w:bookmarkEnd w:id="2277"/>
+    <w:bookmarkEnd w:id="2278"/>
     <w:sectPr>
       <w:footnotePr>
         <w:numRestart w:val="eachSect"/>

</xml_diff>

<commit_message>
Refresh submission package to v0.5.1, dated 2026-09-09
- Manuscript "Date published" -> 2026-09-09 (both the code and data release lines);
  docx/pdf rebuilt (two-author byline, 9 figures).
- SUBMISSION_CHECKLIST: sixth pass, v0.5.1 - records the gas-flux coupling, the full
  documented system set, the second author, the five browser fixes, and the OPEN item
  (cut the v0.5.1 tag). docx rebuilt.
- Cover letter re-dated 9 September 2026 and made two-author ("authors' knowledge"); pdf rebuilt.
- paper/README: two authors, package date 2026-09-09, figure list extended to fig1-9.

Co-Authored-By: Claude Opus 4.8 <noreply@anthropic.com>
</commit_message>
<xml_diff>
--- a/paper/Bustamante_Hephaestus_JORS_manuscript.docx
+++ b/paper/Bustamante_Hephaestus_JORS_manuscript.docx
@@ -2,7 +2,7 @@
 <file path=word/document.xml><?xml version="1.0" encoding="utf-8"?>
 <w:document xmlns:w="http://schemas.openxmlformats.org/wordprocessingml/2006/main" xmlns:m="http://schemas.openxmlformats.org/officeDocument/2006/math" xmlns:r="http://schemas.openxmlformats.org/officeDocument/2006/relationships" xmlns:o="urn:schemas-microsoft-com:office:office" xmlns:v="urn:schemas-microsoft-com:vml" xmlns:w10="urn:schemas-microsoft-com:office:word" xmlns:a="http://schemas.openxmlformats.org/drawingml/2006/main" xmlns:pic="http://schemas.openxmlformats.org/drawingml/2006/picture" xmlns:wp="http://schemas.openxmlformats.org/drawingml/2006/wordprocessingDrawing">
   <w:body>
-    <w:bookmarkStart w:id="2278" w:name="X4855b1162e70238fd839d871e0792397dc58430"/>
+    <w:bookmarkStart w:id="2324" w:name="X4855b1162e70238fd839d871e0792397dc58430"/>
     <w:p>
       <w:pPr>
         <w:pStyle w:val="Heading1"/>
@@ -246,7 +246,7 @@
         <w:t xml:space="preserve">CALPHAD; molten slag; molten salt; modified quasichemical model; thermodynamic database; phase diagram; gas equilibrium; WebAssembly; open data</w:t>
       </w:r>
     </w:p>
-    <w:bookmarkStart w:id="2244" w:name="overview"/>
+    <w:bookmarkStart w:id="2290" w:name="overview"/>
     <w:p>
       <w:pPr>
         <w:pStyle w:val="Heading2"/>
@@ -255,7 +255,7 @@
         <w:t xml:space="preserve">(1) Overview</w:t>
       </w:r>
     </w:p>
-    <w:bookmarkStart w:id="2231" w:name="introduction"/>
+    <w:bookmarkStart w:id="2277" w:name="introduction"/>
     <w:p>
       <w:pPr>
         <w:pStyle w:val="Heading3"/>
@@ -635,8 +635,8 @@
         <w:t xml:space="preserve">Hephaestus is a deliberate response to that gap, and it treats the engine and the data as one contribution because neither is useful alone. The engine is small on purpose. Its core is plain C with no dependencies, which makes it easy to embed and lets the identical code compile to WebAssembly, so the full calculator runs in a web browser with nothing installed and no data leaving the user’s machine. The database is open on purpose. Every parameter in it derives from published measurements, each value carries its provenance down to table and page, and the known shortcomings are documented next to the numbers they affect. The present work describes both, their validation against pycalphad and against measured phase equilibria, and the ways they can be reused. None of it asks the reader to program. For the experimentalist who never writes code, the browser application is the entire product: a page to open, a database to click, and a diagram to read. The sections that follow describe the machinery underneath for those who want it. Supplementary Material S1 is a plain-language primer for the non-programmer, starting at what a database file is and ending at a first calculation and how to read it. Its closing section teaches what an assessment is built from, so a reader who wants to contribute data for open publication, or to commission a file, arrives knowing what is needed.</w:t>
       </w:r>
     </w:p>
-    <w:bookmarkEnd w:id="2231"/>
-    <w:bookmarkStart w:id="2241" w:name="implementation-and-architecture"/>
+    <w:bookmarkEnd w:id="2277"/>
+    <w:bookmarkStart w:id="2287" w:name="implementation-and-architecture"/>
     <w:p>
       <w:pPr>
         <w:pStyle w:val="Heading3"/>
@@ -662,18 +662,18 @@
           <wp:inline>
             <wp:extent cx="5334000" cy="3511167"/>
             <wp:effectExtent b="0" l="0" r="0" t="0"/>
-            <wp:docPr descr="Figure 1: Architecture of Hephaestus. A single dependency-free C core reads the field’s three database dialects (ChemSage .dat, Thermo-Calc .tdb with the Inden magnetic model, and the unified .utdb) and calculates all thermodynamics; the same core is used as a native library, from Python through cffi, and compiled to WebAssembly behind the browser application. dbbuild writes new ChemSage files from measured data, and every energy path is validated against pycalphad." title="" id="2233" name="Picture"/>
+            <wp:docPr descr="Figure 1: Architecture of Hephaestus. A single dependency-free C core reads the field’s three database dialects (ChemSage .dat, Thermo-Calc .tdb with the Inden magnetic model, and the unified .utdb) and calculates all thermodynamics; the same core is used as a native library, from Python through cffi, and compiled to WebAssembly behind the browser application. dbbuild writes new ChemSage files from measured data, and every energy path is validated against pycalphad." title="" id="2279" name="Picture"/>
             <a:graphic>
               <a:graphicData uri="http://schemas.openxmlformats.org/drawingml/2006/picture">
                 <pic:pic>
                   <pic:nvPicPr>
-                    <pic:cNvPr descr="figures/fig1_architecture.png" id="2234" name="Picture"/>
+                    <pic:cNvPr descr="figures/fig1_architecture.png" id="2280" name="Picture"/>
                     <pic:cNvPicPr>
                       <a:picLocks noChangeArrowheads="1" noChangeAspect="1"/>
                     </pic:cNvPicPr>
                   </pic:nvPicPr>
                   <pic:blipFill>
-                    <a:blip r:embed="rId2232"/>
+                    <a:blip r:embed="rId2278"/>
                     <a:stretch>
                       <a:fillRect/>
                     </a:stretch>
@@ -901,18 +901,18 @@
           <wp:inline>
             <wp:extent cx="4754880" cy="3913308"/>
             <wp:effectExtent b="0" l="0" r="0" t="0"/>
-            <wp:docPr descr="Figure 2: The live solver in the browser application (light theme). The user loads the shipped database, picks a temperature, and presses Compute; the WebAssembly engine then solves the full FeO-MgO-SiO2 phase assemblage client side (here 1023 composition samples and 512 tie-facets in about three seconds). Tapping a composition reads its stable phases and pins it to a comparison list; hovering previews on desktop." title="" id="2236" name="Picture"/>
+            <wp:docPr descr="Figure 2: The live solver in the browser application (light theme). The user loads the shipped database, picks a temperature, and presses Compute; the WebAssembly engine then solves the full FeO-MgO-SiO2 phase assemblage client side (here 1023 composition samples and 512 tie-facets in about three seconds). Tapping a composition reads its stable phases and pins it to a comparison list; hovering previews on desktop." title="" id="2282" name="Picture"/>
             <a:graphic>
               <a:graphicData uri="http://schemas.openxmlformats.org/drawingml/2006/picture">
                 <pic:pic>
                   <pic:nvPicPr>
-                    <pic:cNvPr descr="figures/fig2_browser_app.png" id="2237" name="Picture"/>
+                    <pic:cNvPr descr="figures/fig2_browser_app.png" id="2283" name="Picture"/>
                     <pic:cNvPicPr>
                       <a:picLocks noChangeArrowheads="1" noChangeAspect="1"/>
                     </pic:cNvPicPr>
                   </pic:nvPicPr>
                   <pic:blipFill>
-                    <a:blip r:embed="rId2235"/>
+                    <a:blip r:embed="rId2281"/>
                     <a:stretch>
                       <a:fillRect/>
                     </a:stretch>
@@ -1171,18 +1171,18 @@
           <wp:inline>
             <wp:extent cx="5334000" cy="2197297"/>
             <wp:effectExtent b="0" l="0" r="0" t="0"/>
-            <wp:docPr descr="Figure 3: The assessed FeO-MgO-SiO2 system calculated from the shipped database files. (a) Liquidus projection: primary crystallizing phase fields, with liquidus isotherms labeled in K. (b) Isothermal section at 1873 K: stable phase assemblages, shaded by the number of solid phases present. Phase labels: L liquid, Crs cristobalite, Ol olivine, Opx orthopyroxene, Per periclase, Wus wustite." title="" id="2239" name="Picture"/>
+            <wp:docPr descr="Figure 3: The assessed FeO-MgO-SiO2 system calculated from the shipped database files. (a) Liquidus projection: primary crystallizing phase fields, with liquidus isotherms labeled in K. (b) Isothermal section at 1873 K: stable phase assemblages, shaded by the number of solid phases present. Phase labels: L liquid, Crs cristobalite, Ol olivine, Opx orthopyroxene, Per periclase, Wus wustite." title="" id="2285" name="Picture"/>
             <a:graphic>
               <a:graphicData uri="http://schemas.openxmlformats.org/drawingml/2006/picture">
                 <pic:pic>
                   <pic:nvPicPr>
-                    <pic:cNvPr descr="figures/fig3_ternary.png" id="2240" name="Picture"/>
+                    <pic:cNvPr descr="figures/fig3_ternary.png" id="2286" name="Picture"/>
                     <pic:cNvPicPr>
                       <a:picLocks noChangeArrowheads="1" noChangeAspect="1"/>
                     </pic:cNvPicPr>
                   </pic:nvPicPr>
                   <pic:blipFill>
-                    <a:blip r:embed="rId2238"/>
+                    <a:blip r:embed="rId2284"/>
                     <a:stretch>
                       <a:fillRect/>
                     </a:stretch>
@@ -1923,8 +1923,8 @@
         </w:tc>
       </w:tr>
     </w:tbl>
-    <w:bookmarkEnd w:id="2241"/>
-    <w:bookmarkStart w:id="2242" w:name="anatomy-of-a-database-file"/>
+    <w:bookmarkEnd w:id="2287"/>
+    <w:bookmarkStart w:id="2288" w:name="anatomy-of-a-database-file"/>
     <w:p>
       <w:pPr>
         <w:pStyle w:val="Heading3"/>
@@ -1957,8 +1957,8 @@
         <w:t xml:space="preserve">That asymmetry is the economics of the field in miniature: implementations of the published models are increasingly available, but each fitted parameter condenses dozens of measurements and decisions. Parameter sets rather than codes are therefore the scarce commodity, and an openly licensed, provenance-tracked database is the part of this contribution that cannot be regenerated from the paper alone.</w:t>
       </w:r>
     </w:p>
-    <w:bookmarkEnd w:id="2242"/>
-    <w:bookmarkStart w:id="2243" w:name="quality-control"/>
+    <w:bookmarkEnd w:id="2288"/>
+    <w:bookmarkStart w:id="2289" w:name="quality-control"/>
     <w:p>
       <w:pPr>
         <w:pStyle w:val="Heading3"/>
@@ -2766,9 +2766,9 @@
         <w:t xml:space="preserve">invariants sit within about 40 K, and the ternary liquidus projection reproduces the measured field topology [24]. Development practice is plain: the repository is version controlled with tagged releases (v0.1.0 through the v0.5.1 described here), the full suite runs before every release, and a fixed bug lands together with the regression test that would have caught it. The suite runs on Windows 11 under CPython 3.11 and 3.12; the browser application is exercised in Chromium- and Gecko-based browsers. A user can confirm a working installation by running pytest against the bundled test databases, or with no installation at all by opening the web application and loading the shipped ternary database.</w:t>
       </w:r>
     </w:p>
-    <w:bookmarkEnd w:id="2243"/>
-    <w:bookmarkEnd w:id="2244"/>
-    <w:bookmarkStart w:id="2252" w:name="availability"/>
+    <w:bookmarkEnd w:id="2289"/>
+    <w:bookmarkEnd w:id="2290"/>
+    <w:bookmarkStart w:id="2298" w:name="availability"/>
     <w:p>
       <w:pPr>
         <w:pStyle w:val="Heading2"/>
@@ -2777,7 +2777,7 @@
         <w:t xml:space="preserve">(2) Availability</w:t>
       </w:r>
     </w:p>
-    <w:bookmarkStart w:id="2245" w:name="operating-system"/>
+    <w:bookmarkStart w:id="2291" w:name="operating-system"/>
     <w:p>
       <w:pPr>
         <w:pStyle w:val="Heading3"/>
@@ -2794,8 +2794,8 @@
         <w:t xml:space="preserve">Platform independent. The core builds with any C99 compiler; development and testing used Windows 11. The browser application runs in any current browser with WebAssembly support.</w:t>
       </w:r>
     </w:p>
-    <w:bookmarkEnd w:id="2245"/>
-    <w:bookmarkStart w:id="2246" w:name="programming-language"/>
+    <w:bookmarkEnd w:id="2291"/>
+    <w:bookmarkStart w:id="2292" w:name="programming-language"/>
     <w:p>
       <w:pPr>
         <w:pStyle w:val="Heading3"/>
@@ -2812,8 +2812,8 @@
         <w:t xml:space="preserve">C (core), Python 3.11 or later (interface and fitting tools), JavaScript (browser application).</w:t>
       </w:r>
     </w:p>
-    <w:bookmarkEnd w:id="2246"/>
-    <w:bookmarkStart w:id="2247" w:name="additional-system-requirements"/>
+    <w:bookmarkEnd w:id="2292"/>
+    <w:bookmarkStart w:id="2293" w:name="additional-system-requirements"/>
     <w:p>
       <w:pPr>
         <w:pStyle w:val="Heading3"/>
@@ -2830,8 +2830,8 @@
         <w:t xml:space="preserve">None of note. The engine and database together are a few megabytes.</w:t>
       </w:r>
     </w:p>
-    <w:bookmarkEnd w:id="2247"/>
-    <w:bookmarkStart w:id="2248" w:name="dependencies"/>
+    <w:bookmarkEnd w:id="2293"/>
+    <w:bookmarkStart w:id="2294" w:name="dependencies"/>
     <w:p>
       <w:pPr>
         <w:pStyle w:val="Heading3"/>
@@ -2848,8 +2848,8 @@
         <w:t xml:space="preserve">Python interface: cffi, NumPy, SciPy (developed and tested with cffi 2.0, NumPy 2.4, and SciPy 1.17). The validation suite additionally requires pycalphad; every oracle comparison reported here ran against pycalphad 0.11.1, and the tests that read pycalphad’s own shipped test databases skip cleanly if a later version relocates them. The WebAssembly build requires emscripten. The C core and the browser application have no dependencies.</w:t>
       </w:r>
     </w:p>
-    <w:bookmarkEnd w:id="2248"/>
-    <w:bookmarkStart w:id="2249" w:name="list-of-contributors"/>
+    <w:bookmarkEnd w:id="2294"/>
+    <w:bookmarkStart w:id="2295" w:name="list-of-contributors"/>
     <w:p>
       <w:pPr>
         <w:pStyle w:val="Heading3"/>
@@ -2866,8 +2866,8 @@
         <w:t xml:space="preserve">Michael E. Bustamante (design, implementation, validation, data curation, writing - original draft). Gabriel Bustamante (software, software validation, writing - review and editing).</w:t>
       </w:r>
     </w:p>
-    <w:bookmarkEnd w:id="2249"/>
-    <w:bookmarkStart w:id="2250" w:name="software-location"/>
+    <w:bookmarkEnd w:id="2295"/>
+    <w:bookmarkStart w:id="2296" w:name="software-location"/>
     <w:p>
       <w:pPr>
         <w:pStyle w:val="Heading3"/>
@@ -2957,7 +2957,7 @@
         </w:numPr>
       </w:pPr>
       <w:r>
-        <w:t xml:space="preserve">Date published: 2026-09-02</w:t>
+        <w:t xml:space="preserve">Date published: 2026-09-09</w:t>
       </w:r>
     </w:p>
     <w:p>
@@ -3017,11 +3017,11 @@
         </w:numPr>
       </w:pPr>
       <w:r>
-        <w:t xml:space="preserve">Date published: 2026-09-02</w:t>
-      </w:r>
-    </w:p>
-    <w:bookmarkEnd w:id="2250"/>
-    <w:bookmarkStart w:id="2251" w:name="language"/>
+        <w:t xml:space="preserve">Date published: 2026-09-09</w:t>
+      </w:r>
+    </w:p>
+    <w:bookmarkEnd w:id="2296"/>
+    <w:bookmarkStart w:id="2297" w:name="language"/>
     <w:p>
       <w:pPr>
         <w:pStyle w:val="Heading3"/>
@@ -3038,9 +3038,9 @@
         <w:t xml:space="preserve">English.</w:t>
       </w:r>
     </w:p>
-    <w:bookmarkEnd w:id="2251"/>
-    <w:bookmarkEnd w:id="2252"/>
-    <w:bookmarkStart w:id="2272" w:name="reuse-potential"/>
+    <w:bookmarkEnd w:id="2297"/>
+    <w:bookmarkEnd w:id="2298"/>
+    <w:bookmarkStart w:id="2318" w:name="reuse-potential"/>
     <w:p>
       <w:pPr>
         <w:pStyle w:val="Heading2"/>
@@ -3065,7 +3065,7 @@
         <w:t xml:space="preserve">The browser application makes the lowest barrier the default. A lecture on slag thermodynamics, a plant metallurgist screening a composition, or a reviewer checking a claimed equilibrium can load the database and calculate in seconds, with confidential inputs never leaving the machine. The same property makes it a practical template for other groups who want to publish a model as a zero-install tool.</w:t>
       </w:r>
     </w:p>
-    <w:bookmarkStart w:id="2271" w:name="worked-examples"/>
+    <w:bookmarkStart w:id="2317" w:name="worked-examples"/>
     <w:p>
       <w:pPr>
         <w:pStyle w:val="Heading3"/>
@@ -3277,18 +3277,18 @@
           <wp:inline>
             <wp:extent cx="4206240" cy="3262561"/>
             <wp:effectExtent b="0" l="0" r="0" t="0"/>
-            <wp:docPr descr="Figure 4: The LiCl-KCl phase diagram calculated by the salt listing from the shipped open database, at the listing’s own step size. Light to dark: liquid, two-phase, and subsolidus fields. The dot is the calculated eutectic at this step size (0.400, 640 K); the star is the measured eutectic (0.415, 626 K)." title="" id="2254" name="Picture"/>
+            <wp:docPr descr="Figure 4: The LiCl-KCl phase diagram calculated by the salt listing from the shipped open database, at the listing’s own step size. Light to dark: liquid, two-phase, and subsolidus fields. The dot is the calculated eutectic at this step size (0.400, 640 K); the star is the measured eutectic (0.415, 626 K)." title="" id="2300" name="Picture"/>
             <a:graphic>
               <a:graphicData uri="http://schemas.openxmlformats.org/drawingml/2006/picture">
                 <pic:pic>
                   <pic:nvPicPr>
-                    <pic:cNvPr descr="figures/fig4_salt_example.png" id="2255" name="Picture"/>
+                    <pic:cNvPr descr="figures/fig4_salt_example.png" id="2301" name="Picture"/>
                     <pic:cNvPicPr>
                       <a:picLocks noChangeArrowheads="1" noChangeAspect="1"/>
                     </pic:cNvPicPr>
                   </pic:nvPicPr>
                   <pic:blipFill>
-                    <a:blip r:embed="rId2253"/>
+                    <a:blip r:embed="rId2299"/>
                     <a:stretch>
                       <a:fillRect/>
                     </a:stretch>
@@ -3523,18 +3523,18 @@
           <wp:inline>
             <wp:extent cx="4206240" cy="3262561"/>
             <wp:effectExtent b="0" l="0" r="0" t="0"/>
-            <wp:docPr descr="Figure 5: The Al-Zn phase diagram calculated by the alloy listing from the shipped open TDB. Light to dark: liquid, liquid plus solid, and solid fields. The dot is the calculated eutectic (0.890, 660 K); the star is the assessed eutectic (0.885, 654 K)." title="" id="2257" name="Picture"/>
+            <wp:docPr descr="Figure 5: The Al-Zn phase diagram calculated by the alloy listing from the shipped open TDB. Light to dark: liquid, liquid plus solid, and solid fields. The dot is the calculated eutectic (0.890, 660 K); the star is the assessed eutectic (0.885, 654 K)." title="" id="2303" name="Picture"/>
             <a:graphic>
               <a:graphicData uri="http://schemas.openxmlformats.org/drawingml/2006/picture">
                 <pic:pic>
                   <pic:nvPicPr>
-                    <pic:cNvPr descr="figures/fig5_alloy_example.png" id="2258" name="Picture"/>
+                    <pic:cNvPr descr="figures/fig5_alloy_example.png" id="2304" name="Picture"/>
                     <pic:cNvPicPr>
                       <a:picLocks noChangeArrowheads="1" noChangeAspect="1"/>
                     </pic:cNvPicPr>
                   </pic:nvPicPr>
                   <pic:blipFill>
-                    <a:blip r:embed="rId2256"/>
+                    <a:blip r:embed="rId2302"/>
                     <a:stretch>
                       <a:fillRect/>
                     </a:stretch>
@@ -3655,18 +3655,18 @@
           <wp:inline>
             <wp:extent cx="5334000" cy="4430576"/>
             <wp:effectExtent b="0" l="0" r="0" t="0"/>
-            <wp:docPr descr="Figure 6: One unified (.utdb) file, two physics, calculated in the browser. (a) The steelmaking database loaded with the Melt/Alloy view toggle on Alloy; the engine calculates the Fe-C phase diagram through the magnetic compound energy formalism, rendered over a 0-25 mol% C composition window (the equilibrium always solves the whole join), with two tapped compositions pinned. (b) Scheil solidification for the same join at 4 mol% C, first solid at 1741 K and the residual liquid frozen by 1433 K, against the equilibrium lever-rule path (dashed). The file’s slag half is a Modified Quasichemical Model liquid; no legacy container holds both models at once." title="" id="2260" name="Picture"/>
+            <wp:docPr descr="Figure 6: One unified (.utdb) file, two physics, calculated in the browser. (a) The steelmaking database loaded with the Melt/Alloy view toggle on Alloy; the engine calculates the Fe-C phase diagram through the magnetic compound energy formalism, rendered over a 0-25 mol% C composition window (the equilibrium always solves the whole join), with two tapped compositions pinned. (b) Scheil solidification for the same join at 4 mol% C, first solid at 1741 K and the residual liquid frozen by 1433 K, against the equilibrium lever-rule path (dashed). The file’s slag half is a Modified Quasichemical Model liquid; no legacy container holds both models at once." title="" id="2306" name="Picture"/>
             <a:graphic>
               <a:graphicData uri="http://schemas.openxmlformats.org/drawingml/2006/picture">
                 <pic:pic>
                   <pic:nvPicPr>
-                    <pic:cNvPr descr="figures/fig6_utdb_steel.png" id="2261" name="Picture"/>
+                    <pic:cNvPr descr="figures/fig6_utdb_steel.png" id="2307" name="Picture"/>
                     <pic:cNvPicPr>
                       <a:picLocks noChangeArrowheads="1" noChangeAspect="1"/>
                     </pic:cNvPicPr>
                   </pic:nvPicPr>
                   <pic:blipFill>
-                    <a:blip r:embed="rId2259"/>
+                    <a:blip r:embed="rId2305"/>
                     <a:stretch>
                       <a:fillRect/>
                     </a:stretch>
@@ -3710,18 +3710,18 @@
           <wp:inline>
             <wp:extent cx="5334000" cy="2319130"/>
             <wp:effectExtent b="0" l="0" r="0" t="0"/>
-            <wp:docPr descr="Figure 7: The gas calculator as a steelmaking worked example, the equilibrium of a carbon-oxygen furnace gas by the Hephaestus gas engine (the NASA-polynomial element-potential solver compiled into the browser), with Cantera as the independent check. (a) Oxygen partial pressure against the CO to CO2 ratio at the 1873 K tap temperature: a lower ratio is more oxidizing and drives iron into the slag as FeO, a higher ratio is more reducing and decarburizes the steel. (b) The same oxygen potential against temperature for four fixed CO to CO2 buffers, showing that a given gas grows more oxidizing as it heats; the dashed line marks the tap temperature. Open circles are Cantera, agreeing to about 10-5 mole fraction across the field." title="" id="2263" name="Picture"/>
+            <wp:docPr descr="Figure 7: The gas calculator as a steelmaking worked example, the equilibrium of a carbon-oxygen furnace gas by the Hephaestus gas engine (the NASA-polynomial element-potential solver compiled into the browser), with Cantera as the independent check. (a) Oxygen partial pressure against the CO to CO2 ratio at the 1873 K tap temperature: a lower ratio is more oxidizing and drives iron into the slag as FeO, a higher ratio is more reducing and decarburizes the steel. (b) The same oxygen potential against temperature for four fixed CO to CO2 buffers, showing that a given gas grows more oxidizing as it heats; the dashed line marks the tap temperature. Open circles are Cantera, agreeing to about 10-5 mole fraction across the field." title="" id="2309" name="Picture"/>
             <a:graphic>
               <a:graphicData uri="http://schemas.openxmlformats.org/drawingml/2006/picture">
                 <pic:pic>
                   <pic:nvPicPr>
-                    <pic:cNvPr descr="figures/fig7_gas_steel.png" id="2264" name="Picture"/>
+                    <pic:cNvPr descr="figures/fig7_gas_steel.png" id="2310" name="Picture"/>
                     <pic:cNvPicPr>
                       <a:picLocks noChangeArrowheads="1" noChangeAspect="1"/>
                     </pic:cNvPicPr>
                   </pic:nvPicPr>
                   <pic:blipFill>
-                    <a:blip r:embed="rId2262"/>
+                    <a:blip r:embed="rId2308"/>
                     <a:stretch>
                       <a:fillRect/>
                     </a:stretch>
@@ -3801,18 +3801,18 @@
           <wp:inline>
             <wp:extent cx="5334000" cy="2319130"/>
             <wp:effectExtent b="0" l="0" r="0" t="0"/>
-            <wp:docPr descr="Figure 8: The gas-flux coupling as a molten-salt worked example, the fume over a NaCl-KCl-MgCl2 = 40/40/20 mol% flux. Each salt’s partial pressure is its engine activity times its measured pure-component vapour pressure (NaCl and KCl from NIST Antoine fits, MgCl2 from the NIST-JANAF gas and liquid Gibbs of formation, each reproducing its measured boiling point; activities from the engine, validated against the pure-composition limit and the near-ideal NaCl-KCl binary). (a) Fume partial pressures against temperature, with the total. (b) Flux composition against fume composition at 1200 K: magnesium chloride is a fifth of the flux but a few percent of the fume, held in the melt by chlorocomplexing that drops its activity well below its mole fraction." title="" id="2266" name="Picture"/>
+            <wp:docPr descr="Figure 8: The gas-flux coupling as a molten-salt worked example, the fume over a NaCl-KCl-MgCl2 = 40/40/20 mol% flux. Each salt’s partial pressure is its engine activity times its measured pure-component vapour pressure (NaCl and KCl from NIST Antoine fits, MgCl2 from the NIST-JANAF gas and liquid Gibbs of formation, each reproducing its measured boiling point; activities from the engine, validated against the pure-composition limit and the near-ideal NaCl-KCl binary). (a) Fume partial pressures against temperature, with the total. (b) Flux composition against fume composition at 1200 K: magnesium chloride is a fifth of the flux but a few percent of the fume, held in the melt by chlorocomplexing that drops its activity well below its mole fraction." title="" id="2312" name="Picture"/>
             <a:graphic>
               <a:graphicData uri="http://schemas.openxmlformats.org/drawingml/2006/picture">
                 <pic:pic>
                   <pic:nvPicPr>
-                    <pic:cNvPr descr="figures/fig8_gas_flux.png" id="2267" name="Picture"/>
+                    <pic:cNvPr descr="figures/fig8_gas_flux.png" id="2313" name="Picture"/>
                     <pic:cNvPicPr>
                       <a:picLocks noChangeArrowheads="1" noChangeAspect="1"/>
                     </pic:cNvPicPr>
                   </pic:nvPicPr>
                   <pic:blipFill>
-                    <a:blip r:embed="rId2265"/>
+                    <a:blip r:embed="rId2311"/>
                     <a:stretch>
                       <a:fillRect/>
                     </a:stretch>
@@ -3880,18 +3880,18 @@
           <wp:inline>
             <wp:extent cx="4572000" cy="3556000"/>
             <wp:effectExtent b="0" l="0" r="0" t="0"/>
-            <wp:docPr descr="Figure 9: Al-Zn phase diagram with ESPEI parameter uncertainty. The liquid and face-centred-cubic (fcc) excess parameters were refit by Markov-chain Monte Carlo to the measured liquid enthalpy of mixing (Debski et al., digitized from Dinsdale et al. [46]) and the assessed phase boundaries (Massalski [47]; Mey [41]), and the posterior was propagated through the engine. The solid line is the median liquidus and the dashed line the median fcc solvus; the shaded region is the 90 percent posterior band on each. The band is narrow on the liquidus, which the calorimetry constrains, and wider on the fcc solvus, which only the diagram constrains. It is the posterior of the three refitted excess parameters with the unary functions and unfitted phases held fixed, a parametric uncertainty within the model rather than a total one. The open circle is the eutectic reported by Massalski [47] (x(Zn) = 0.887, 654 K)." title="" id="2269" name="Picture"/>
+            <wp:docPr descr="Figure 9: Al-Zn phase diagram with ESPEI parameter uncertainty. The liquid and face-centred-cubic (fcc) excess parameters were refit by Markov-chain Monte Carlo to the measured liquid enthalpy of mixing (Debski et al., digitized from Dinsdale et al. [46]) and the assessed phase boundaries (Massalski [47]; Mey [41]), and the posterior was propagated through the engine. The solid line is the median liquidus and the dashed line the median fcc solvus; the shaded region is the 90 percent posterior band on each. The band is narrow on the liquidus, which the calorimetry constrains, and wider on the fcc solvus, which only the diagram constrains. It is the posterior of the three refitted excess parameters with the unary functions and unfitted phases held fixed, a parametric uncertainty within the model rather than a total one. The open circle is the eutectic reported by Massalski [47] (x(Zn) = 0.887, 654 K)." title="" id="2315" name="Picture"/>
             <a:graphic>
               <a:graphicData uri="http://schemas.openxmlformats.org/drawingml/2006/picture">
                 <pic:pic>
                   <pic:nvPicPr>
-                    <pic:cNvPr descr="figures/fig9_uq_alzn.png" id="2270" name="Picture"/>
+                    <pic:cNvPr descr="figures/fig9_uq_alzn.png" id="2316" name="Picture"/>
                     <pic:cNvPicPr>
                       <a:picLocks noChangeArrowheads="1" noChangeAspect="1"/>
                     </pic:cNvPicPr>
                   </pic:nvPicPr>
                   <pic:blipFill>
-                    <a:blip r:embed="rId2268"/>
+                    <a:blip r:embed="rId2314"/>
                     <a:stretch>
                       <a:fillRect/>
                     </a:stretch>
@@ -3934,9 +3934,9 @@
         <w:t xml:space="preserve">The gap the present work addresses was never the model, which has been published for two decades, but an open, runnable pairing of model and parameters. Hephaestus supplies both halves under open licenses and puts them behind a browser page that asks nothing of its user. The claims are checkable end to end. Release v0.5.1 archives the exact version described, and the 137-test suite reruns the pycalphad comparisons on any machine. The worked examples print the figures shown, and every parameter in every shipped database traces to a published measurement through its provenance file. A reader who doubts a number can recalculate it; one who needs a system that is missing can build it with the same open tools, or ask.</w:t>
       </w:r>
     </w:p>
-    <w:bookmarkEnd w:id="2271"/>
-    <w:bookmarkEnd w:id="2272"/>
-    <w:bookmarkStart w:id="2273" w:name="data-availability"/>
+    <w:bookmarkEnd w:id="2317"/>
+    <w:bookmarkEnd w:id="2318"/>
+    <w:bookmarkStart w:id="2319" w:name="data-availability"/>
     <w:p>
       <w:pPr>
         <w:pStyle w:val="Heading2"/>
@@ -3953,8 +3953,8 @@
         <w:t xml:space="preserve">The engine, the database, the browser application, and the validation suite are openly available in the code repository listed above; the version described here is archived as release v0.5.1. The database files and their provenance records are in the repository’s data directory under CC BY 4.0.</w:t>
       </w:r>
     </w:p>
-    <w:bookmarkEnd w:id="2273"/>
-    <w:bookmarkStart w:id="2274" w:name="acknowledgements"/>
+    <w:bookmarkEnd w:id="2319"/>
+    <w:bookmarkStart w:id="2320" w:name="acknowledgements"/>
     <w:p>
       <w:pPr>
         <w:pStyle w:val="Heading2"/>
@@ -3971,8 +3971,8 @@
         <w:t xml:space="preserve">During the development of this software the authors used Claude Code (Anthropic) to assist with implementation, validation scripting, and manuscript preparation. This assistance was agentic, not autonomous: it operated under author direction and supervision at every step and was never a closed loop that produced or accepted results without review. Every parameter was traced by the authors to its primary source before entering the database, and every reference was verified against its registry record. The authors reviewed and approved all output and take full responsibility for this article.</w:t>
       </w:r>
     </w:p>
-    <w:bookmarkEnd w:id="2274"/>
-    <w:bookmarkStart w:id="2275" w:name="funding-statement"/>
+    <w:bookmarkEnd w:id="2320"/>
+    <w:bookmarkStart w:id="2321" w:name="funding-statement"/>
     <w:p>
       <w:pPr>
         <w:pStyle w:val="Heading2"/>
@@ -3989,8 +3989,8 @@
         <w:t xml:space="preserve">The development of this software received no external funding.</w:t>
       </w:r>
     </w:p>
-    <w:bookmarkEnd w:id="2275"/>
-    <w:bookmarkStart w:id="2276" w:name="competing-interests"/>
+    <w:bookmarkEnd w:id="2321"/>
+    <w:bookmarkStart w:id="2322" w:name="competing-interests"/>
     <w:p>
       <w:pPr>
         <w:pStyle w:val="Heading2"/>
@@ -4007,8 +4007,8 @@
         <w:t xml:space="preserve">Both authors are affiliated with Odinzen LLC, which provides commercial thermodynamic modeling services, and declare this as a competing interest; Michael E. Bustamante founded the company. The software and database published here are released in full under open licenses, and no proprietary Odinzen assets are included.</w:t>
       </w:r>
     </w:p>
-    <w:bookmarkEnd w:id="2276"/>
-    <w:bookmarkStart w:id="2277" w:name="references"/>
+    <w:bookmarkEnd w:id="2322"/>
+    <w:bookmarkStart w:id="2323" w:name="references"/>
     <w:p>
       <w:pPr>
         <w:pStyle w:val="Heading2"/>
@@ -4405,8 +4405,8 @@
         <w:t xml:space="preserve">[47] Massalski TB, editor. Binary Alloy Phase Diagrams. 2nd ed. Materials Park (OH): ASM International; 1990.</w:t>
       </w:r>
     </w:p>
-    <w:bookmarkEnd w:id="2277"/>
-    <w:bookmarkEnd w:id="2278"/>
+    <w:bookmarkEnd w:id="2323"/>
+    <w:bookmarkEnd w:id="2324"/>
     <w:sectPr>
       <w:footnotePr>
         <w:numRestart w:val="eachSect"/>

</xml_diff>

<commit_message>
Add XTDB third-generation reader with in-browser phase diagrams
- src/xtdb.c/.h: self-contained XTDB (XML) reader plus the third-generation models
  (Einstein GEIN heat capacity weighted by atom count, two-state liquid) and a
  lower-hull binary-diagram solver. Compiled into WASM; separate handle/ABI so it
  cannot regress the .dat/.tdb reader.
- web: a dedicated card reads an .xtdb file and computes its diagram live; ships
  data/xtdb/AlC.xtdb (3rd-gen Al-C, He 2021) and web/PbSn.xtdb (classic). Uploaded
  files pin after the built-in examples.
- Validated: C matches the Python reference (data/xtdb-alc/xtdb_ref.py) to <1e-6
  J/mol-atom; Al melting 933.47 K, Al4C3 peritectic 2429 K, Pb-Sn eutectic 456 K.
  Regression test tests/test_xtdb.py (suite now 142 passing).
- paper: Figure 10, abstract/Table 1/reuse updated, refs [48-50] verified,
  version v0.5.1 -> v0.6.0.

Co-Authored-By: Claude Opus 4.8 <noreply@anthropic.com>
</commit_message>
<xml_diff>
--- a/paper/Bustamante_Hephaestus_JORS_manuscript.docx
+++ b/paper/Bustamante_Hephaestus_JORS_manuscript.docx
@@ -2,7 +2,7 @@
 <file path=word/document.xml><?xml version="1.0" encoding="utf-8"?>
 <w:document xmlns:w="http://schemas.openxmlformats.org/wordprocessingml/2006/main" xmlns:m="http://schemas.openxmlformats.org/officeDocument/2006/math" xmlns:r="http://schemas.openxmlformats.org/officeDocument/2006/relationships" xmlns:o="urn:schemas-microsoft-com:office:office" xmlns:v="urn:schemas-microsoft-com:vml" xmlns:w10="urn:schemas-microsoft-com:office:word" xmlns:a="http://schemas.openxmlformats.org/drawingml/2006/main" xmlns:pic="http://schemas.openxmlformats.org/drawingml/2006/picture" xmlns:wp="http://schemas.openxmlformats.org/drawingml/2006/wordprocessingDrawing">
   <w:body>
-    <w:bookmarkStart w:id="2324" w:name="X4855b1162e70238fd839d871e0792397dc58430"/>
+    <w:bookmarkStart w:id="2373" w:name="X4855b1162e70238fd839d871e0792397dc58430"/>
     <w:p>
       <w:pPr>
         <w:pStyle w:val="Heading1"/>
@@ -84,7 +84,7 @@
         <w:t xml:space="preserve"> </w:t>
       </w:r>
       <w:r>
-        <w:t xml:space="preserve">slag) databases. One zero-install page calculates across all three containers. It calculates phase equilibria up to full ternary isothermal sections and liquidus projections, and Scheil-Gulliver solidification paths on any binary join. A NASA-polynomial ideal-gas engine, validated against Cantera, brings the gas equilibria a furnace atmosphere demands into the same browser and couples that gas to the condensed phases at a shared oxygen potential: to metals and oxides in the browser, reproducing Cantera’s multiphase equilibrium, and to the Modified Quasichemical slag itself at iron saturation, so the melt’s oxidation state tracks the furnace atmosphere. The same activity coupling gives the vapour a molten chloride flux fumes off, where complexing holds down the magnesium chloride. Every energy path is validated to machine precision against pycalphad, and the magnetic model additionally against the measured pure-iron transition temperatures. The companion databases cover the CaO-SiO</w:t>
+        <w:t xml:space="preserve">slag) databases. It reads XTDB, the community’s XML successor format, including its third-generation models, an Einstein heat capacity valid to 0 K and a two-state liquid, shown by shipped Al-C and Pb-Sn databases computed in the browser. One zero-install page calculates across all four containers. It calculates phase equilibria up to full ternary isothermal sections and liquidus projections, and Scheil-Gulliver solidification paths on any binary join. A NASA-polynomial ideal-gas engine, validated against Cantera, brings the gas equilibria a furnace atmosphere demands into the same browser and couples that gas to the condensed phases at a shared oxygen potential: to metals and oxides in the browser, reproducing Cantera’s multiphase equilibrium, and to the Modified Quasichemical slag itself at iron saturation, so the melt’s oxidation state tracks the furnace atmosphere. The same activity coupling gives the vapour a molten chloride flux fumes off, where complexing holds down the magnesium chloride. Every energy path is validated to machine precision against pycalphad, and the magnetic model additionally against the measured pure-iron transition temperatures. The companion databases cover the CaO-SiO</w:t>
       </w:r>
       <w:r>
         <w:rPr>
@@ -246,7 +246,7 @@
         <w:t xml:space="preserve">CALPHAD; molten slag; molten salt; modified quasichemical model; thermodynamic database; phase diagram; gas equilibrium; WebAssembly; open data</w:t>
       </w:r>
     </w:p>
-    <w:bookmarkStart w:id="2290" w:name="overview"/>
+    <w:bookmarkStart w:id="2336" w:name="overview"/>
     <w:p>
       <w:pPr>
         <w:pStyle w:val="Heading2"/>
@@ -255,7 +255,7 @@
         <w:t xml:space="preserve">(1) Overview</w:t>
       </w:r>
     </w:p>
-    <w:bookmarkStart w:id="2277" w:name="introduction"/>
+    <w:bookmarkStart w:id="2323" w:name="introduction"/>
     <w:p>
       <w:pPr>
         <w:pStyle w:val="Heading3"/>
@@ -297,7 +297,7 @@
         <w:t xml:space="preserve"> </w:t>
       </w:r>
       <w:r>
-        <w:t xml:space="preserve">[15]: they are engineering for the future toolchain. The present work approaches the same goal from the installed base instead, reading both legacy dialects as they are and publishing a minimal in-place extension, uTDB, for the one model TDB lacks; the two roads are wrappers around one destination, and converting between them is mechanical. Read as a path, the formats run TDB to uTDB to XTDB, the familiar files extended in place today and translated into the XML successor once its tooling arrives.</w:t>
+        <w:t xml:space="preserve">[15]: they are engineering for the future toolchain. The present work approaches the same goal from the installed base instead, reading both legacy dialects as they are and publishing a minimal in-place extension, uTDB, for the one model TDB lacks; the two roads are wrappers around one destination, and converting between them is mechanical. Read as a path, the formats run TDB to uTDB to XTDB. This engine reads all three: it parses XTDB directly, including the third-generation models the format was built to carry, an Einstein heat capacity valid to 0 K in place of the older polynomial and a two-state description of the liquid, so the XML successor is a dialect the calculator already reads rather than a future dependency.</w:t>
       </w:r>
     </w:p>
     <w:p>
@@ -492,7 +492,7 @@
               <w:jc w:val="left"/>
             </w:pPr>
             <w:r>
-              <w:t xml:space="preserve">proposed unified schema, MQMQA included</w:t>
+              <w:t xml:space="preserve">unified XML schema, MQMQA and third-generation models included; read by this engine</w:t>
             </w:r>
           </w:p>
         </w:tc>
@@ -635,8 +635,8 @@
         <w:t xml:space="preserve">Hephaestus is a deliberate response to that gap, and it treats the engine and the data as one contribution because neither is useful alone. The engine is small on purpose. Its core is plain C with no dependencies, which makes it easy to embed and lets the identical code compile to WebAssembly, so the full calculator runs in a web browser with nothing installed and no data leaving the user’s machine. The database is open on purpose. Every parameter in it derives from published measurements, each value carries its provenance down to table and page, and the known shortcomings are documented next to the numbers they affect. The present work describes both, their validation against pycalphad and against measured phase equilibria, and the ways they can be reused. None of it asks the reader to program. For the experimentalist who never writes code, the browser application is the entire product: a page to open, a database to click, and a diagram to read. The sections that follow describe the machinery underneath for those who want it. Supplementary Material S1 is a plain-language primer for the non-programmer, starting at what a database file is and ending at a first calculation and how to read it. Its closing section teaches what an assessment is built from, so a reader who wants to contribute data for open publication, or to commission a file, arrives knowing what is needed.</w:t>
       </w:r>
     </w:p>
-    <w:bookmarkEnd w:id="2277"/>
-    <w:bookmarkStart w:id="2287" w:name="implementation-and-architecture"/>
+    <w:bookmarkEnd w:id="2323"/>
+    <w:bookmarkStart w:id="2333" w:name="implementation-and-architecture"/>
     <w:p>
       <w:pPr>
         <w:pStyle w:val="Heading3"/>
@@ -662,18 +662,18 @@
           <wp:inline>
             <wp:extent cx="5334000" cy="3511167"/>
             <wp:effectExtent b="0" l="0" r="0" t="0"/>
-            <wp:docPr descr="Figure 1: Architecture of Hephaestus. A single dependency-free C core reads the field’s three database dialects (ChemSage .dat, Thermo-Calc .tdb with the Inden magnetic model, and the unified .utdb) and calculates all thermodynamics; the same core is used as a native library, from Python through cffi, and compiled to WebAssembly behind the browser application. dbbuild writes new ChemSage files from measured data, and every energy path is validated against pycalphad." title="" id="2279" name="Picture"/>
+            <wp:docPr descr="Figure 1: Architecture of Hephaestus. A single dependency-free C core reads the field’s three database dialects (ChemSage .dat, Thermo-Calc .tdb with the Inden magnetic model, and the unified .utdb) and calculates all thermodynamics; the same core is used as a native library, from Python through cffi, and compiled to WebAssembly behind the browser application. dbbuild writes new ChemSage files from measured data, and every energy path is validated against pycalphad." title="" id="2325" name="Picture"/>
             <a:graphic>
               <a:graphicData uri="http://schemas.openxmlformats.org/drawingml/2006/picture">
                 <pic:pic>
                   <pic:nvPicPr>
-                    <pic:cNvPr descr="figures/fig1_architecture.png" id="2280" name="Picture"/>
+                    <pic:cNvPr descr="figures/fig1_architecture.png" id="2326" name="Picture"/>
                     <pic:cNvPicPr>
                       <a:picLocks noChangeArrowheads="1" noChangeAspect="1"/>
                     </pic:cNvPicPr>
                   </pic:nvPicPr>
                   <pic:blipFill>
-                    <a:blip r:embed="rId2278"/>
+                    <a:blip r:embed="rId2324"/>
                     <a:stretch>
                       <a:fillRect/>
                     </a:stretch>
@@ -901,18 +901,18 @@
           <wp:inline>
             <wp:extent cx="4754880" cy="3913308"/>
             <wp:effectExtent b="0" l="0" r="0" t="0"/>
-            <wp:docPr descr="Figure 2: The live solver in the browser application (light theme). The user loads the shipped database, picks a temperature, and presses Compute; the WebAssembly engine then solves the full FeO-MgO-SiO2 phase assemblage client side (here 1023 composition samples and 512 tie-facets in about three seconds). Tapping a composition reads its stable phases and pins it to a comparison list; hovering previews on desktop." title="" id="2282" name="Picture"/>
+            <wp:docPr descr="Figure 2: The live solver in the browser application (light theme). The user loads the shipped database, picks a temperature, and presses Compute; the WebAssembly engine then solves the full FeO-MgO-SiO2 phase assemblage client side (here 1023 composition samples and 512 tie-facets in about three seconds). Tapping a composition reads its stable phases and pins it to a comparison list; hovering previews on desktop." title="" id="2328" name="Picture"/>
             <a:graphic>
               <a:graphicData uri="http://schemas.openxmlformats.org/drawingml/2006/picture">
                 <pic:pic>
                   <pic:nvPicPr>
-                    <pic:cNvPr descr="figures/fig2_browser_app.png" id="2283" name="Picture"/>
+                    <pic:cNvPr descr="figures/fig2_browser_app.png" id="2329" name="Picture"/>
                     <pic:cNvPicPr>
                       <a:picLocks noChangeArrowheads="1" noChangeAspect="1"/>
                     </pic:cNvPicPr>
                   </pic:nvPicPr>
                   <pic:blipFill>
-                    <a:blip r:embed="rId2281"/>
+                    <a:blip r:embed="rId2327"/>
                     <a:stretch>
                       <a:fillRect/>
                     </a:stretch>
@@ -1171,18 +1171,18 @@
           <wp:inline>
             <wp:extent cx="5334000" cy="2197297"/>
             <wp:effectExtent b="0" l="0" r="0" t="0"/>
-            <wp:docPr descr="Figure 3: The assessed FeO-MgO-SiO2 system calculated from the shipped database files. (a) Liquidus projection: primary crystallizing phase fields, with liquidus isotherms labeled in K. (b) Isothermal section at 1873 K: stable phase assemblages, shaded by the number of solid phases present. Phase labels: L liquid, Crs cristobalite, Ol olivine, Opx orthopyroxene, Per periclase, Wus wustite." title="" id="2285" name="Picture"/>
+            <wp:docPr descr="Figure 3: The assessed FeO-MgO-SiO2 system calculated from the shipped database files. (a) Liquidus projection: primary crystallizing phase fields, with liquidus isotherms labeled in K. (b) Isothermal section at 1873 K: stable phase assemblages, shaded by the number of solid phases present. Phase labels: L liquid, Crs cristobalite, Ol olivine, Opx orthopyroxene, Per periclase, Wus wustite." title="" id="2331" name="Picture"/>
             <a:graphic>
               <a:graphicData uri="http://schemas.openxmlformats.org/drawingml/2006/picture">
                 <pic:pic>
                   <pic:nvPicPr>
-                    <pic:cNvPr descr="figures/fig3_ternary.png" id="2286" name="Picture"/>
+                    <pic:cNvPr descr="figures/fig3_ternary.png" id="2332" name="Picture"/>
                     <pic:cNvPicPr>
                       <a:picLocks noChangeArrowheads="1" noChangeAspect="1"/>
                     </pic:cNvPicPr>
                   </pic:nvPicPr>
                   <pic:blipFill>
-                    <a:blip r:embed="rId2284"/>
+                    <a:blip r:embed="rId2330"/>
                     <a:stretch>
                       <a:fillRect/>
                     </a:stretch>
@@ -1923,8 +1923,8 @@
         </w:tc>
       </w:tr>
     </w:tbl>
-    <w:bookmarkEnd w:id="2287"/>
-    <w:bookmarkStart w:id="2288" w:name="anatomy-of-a-database-file"/>
+    <w:bookmarkEnd w:id="2333"/>
+    <w:bookmarkStart w:id="2334" w:name="anatomy-of-a-database-file"/>
     <w:p>
       <w:pPr>
         <w:pStyle w:val="Heading3"/>
@@ -1957,8 +1957,8 @@
         <w:t xml:space="preserve">That asymmetry is the economics of the field in miniature: implementations of the published models are increasingly available, but each fitted parameter condenses dozens of measurements and decisions. Parameter sets rather than codes are therefore the scarce commodity, and an openly licensed, provenance-tracked database is the part of this contribution that cannot be regenerated from the paper alone.</w:t>
       </w:r>
     </w:p>
-    <w:bookmarkEnd w:id="2288"/>
-    <w:bookmarkStart w:id="2289" w:name="quality-control"/>
+    <w:bookmarkEnd w:id="2334"/>
+    <w:bookmarkStart w:id="2335" w:name="quality-control"/>
     <w:p>
       <w:pPr>
         <w:pStyle w:val="Heading3"/>
@@ -1972,7 +1972,7 @@
         <w:pStyle w:val="FirstParagraph"/>
       </w:pPr>
       <w:r>
-        <w:t xml:space="preserve">Validation rests on one principle. A number is trusted only when an independent implementation reproduces it. pycalphad plays that role throughout, and Table 3 lists the checks. The pytest suite, 132 tests, compares every energy contribution on shared parameters and agrees to about 10</w:t>
+        <w:t xml:space="preserve">Validation rests on one principle. A number is trusted only when an independent implementation reproduces it. pycalphad plays that role throughout, and Table 3 lists the checks. The pytest suite, 142 tests, compares every energy contribution on shared parameters and agrees to about 10</w:t>
       </w:r>
       <w:r>
         <w:rPr>
@@ -2763,12 +2763,12 @@
         <w:t xml:space="preserve"> </w:t>
       </w:r>
       <w:r>
-        <w:t xml:space="preserve">invariants sit within about 40 K, and the ternary liquidus projection reproduces the measured field topology [24]. Development practice is plain: the repository is version controlled with tagged releases (v0.1.0 through the v0.5.1 described here), the full suite runs before every release, and a fixed bug lands together with the regression test that would have caught it. The suite runs on Windows 11 under CPython 3.11 and 3.12; the browser application is exercised in Chromium- and Gecko-based browsers. A user can confirm a working installation by running pytest against the bundled test databases, or with no installation at all by opening the web application and loading the shipped ternary database.</w:t>
-      </w:r>
-    </w:p>
-    <w:bookmarkEnd w:id="2289"/>
-    <w:bookmarkEnd w:id="2290"/>
-    <w:bookmarkStart w:id="2298" w:name="availability"/>
+        <w:t xml:space="preserve">invariants sit within about 40 K, and the ternary liquidus projection reproduces the measured field topology [24]. Development practice is plain: the repository is version controlled with tagged releases (v0.1.0 through the v0.6.0 described here), the full suite runs before every release, and a fixed bug lands together with the regression test that would have caught it. The suite runs on Windows 11 under CPython 3.11 and 3.12; the browser application is exercised in Chromium- and Gecko-based browsers. A user can confirm a working installation by running pytest against the bundled test databases, or with no installation at all by opening the web application and loading the shipped ternary database.</w:t>
+      </w:r>
+    </w:p>
+    <w:bookmarkEnd w:id="2335"/>
+    <w:bookmarkEnd w:id="2336"/>
+    <w:bookmarkStart w:id="2344" w:name="availability"/>
     <w:p>
       <w:pPr>
         <w:pStyle w:val="Heading2"/>
@@ -2777,7 +2777,7 @@
         <w:t xml:space="preserve">(2) Availability</w:t>
       </w:r>
     </w:p>
-    <w:bookmarkStart w:id="2291" w:name="operating-system"/>
+    <w:bookmarkStart w:id="2337" w:name="operating-system"/>
     <w:p>
       <w:pPr>
         <w:pStyle w:val="Heading3"/>
@@ -2794,8 +2794,8 @@
         <w:t xml:space="preserve">Platform independent. The core builds with any C99 compiler; development and testing used Windows 11. The browser application runs in any current browser with WebAssembly support.</w:t>
       </w:r>
     </w:p>
-    <w:bookmarkEnd w:id="2291"/>
-    <w:bookmarkStart w:id="2292" w:name="programming-language"/>
+    <w:bookmarkEnd w:id="2337"/>
+    <w:bookmarkStart w:id="2338" w:name="programming-language"/>
     <w:p>
       <w:pPr>
         <w:pStyle w:val="Heading3"/>
@@ -2812,8 +2812,8 @@
         <w:t xml:space="preserve">C (core), Python 3.11 or later (interface and fitting tools), JavaScript (browser application).</w:t>
       </w:r>
     </w:p>
-    <w:bookmarkEnd w:id="2292"/>
-    <w:bookmarkStart w:id="2293" w:name="additional-system-requirements"/>
+    <w:bookmarkEnd w:id="2338"/>
+    <w:bookmarkStart w:id="2339" w:name="additional-system-requirements"/>
     <w:p>
       <w:pPr>
         <w:pStyle w:val="Heading3"/>
@@ -2830,8 +2830,8 @@
         <w:t xml:space="preserve">None of note. The engine and database together are a few megabytes.</w:t>
       </w:r>
     </w:p>
-    <w:bookmarkEnd w:id="2293"/>
-    <w:bookmarkStart w:id="2294" w:name="dependencies"/>
+    <w:bookmarkEnd w:id="2339"/>
+    <w:bookmarkStart w:id="2340" w:name="dependencies"/>
     <w:p>
       <w:pPr>
         <w:pStyle w:val="Heading3"/>
@@ -2848,8 +2848,8 @@
         <w:t xml:space="preserve">Python interface: cffi, NumPy, SciPy (developed and tested with cffi 2.0, NumPy 2.4, and SciPy 1.17). The validation suite additionally requires pycalphad; every oracle comparison reported here ran against pycalphad 0.11.1, and the tests that read pycalphad’s own shipped test databases skip cleanly if a later version relocates them. The WebAssembly build requires emscripten. The C core and the browser application have no dependencies.</w:t>
       </w:r>
     </w:p>
-    <w:bookmarkEnd w:id="2294"/>
-    <w:bookmarkStart w:id="2295" w:name="list-of-contributors"/>
+    <w:bookmarkEnd w:id="2340"/>
+    <w:bookmarkStart w:id="2341" w:name="list-of-contributors"/>
     <w:p>
       <w:pPr>
         <w:pStyle w:val="Heading3"/>
@@ -2866,8 +2866,8 @@
         <w:t xml:space="preserve">Michael E. Bustamante (design, implementation, validation, data curation, writing - original draft). Gabriel Bustamante (software, software validation, writing - review and editing).</w:t>
       </w:r>
     </w:p>
-    <w:bookmarkEnd w:id="2295"/>
-    <w:bookmarkStart w:id="2296" w:name="software-location"/>
+    <w:bookmarkEnd w:id="2341"/>
+    <w:bookmarkStart w:id="2342" w:name="software-location"/>
     <w:p>
       <w:pPr>
         <w:pStyle w:val="Heading3"/>
@@ -2909,7 +2909,7 @@
         </w:numPr>
       </w:pPr>
       <w:r>
-        <w:t xml:space="preserve">Persistent identifier: https://github.com/odinzen/hephaestus-mqmqa-public/releases/tag/v0.5.1</w:t>
+        <w:t xml:space="preserve">Persistent identifier: https://github.com/odinzen/hephaestus-mqmqa-public/releases/tag/v0.6.0</w:t>
       </w:r>
     </w:p>
     <w:p>
@@ -2945,7 +2945,7 @@
         </w:numPr>
       </w:pPr>
       <w:r>
-        <w:t xml:space="preserve">Version published: v0.5.1</w:t>
+        <w:t xml:space="preserve">Version published: v0.6.0</w:t>
       </w:r>
     </w:p>
     <w:p>
@@ -3020,8 +3020,8 @@
         <w:t xml:space="preserve">Date published: 2026-09-09</w:t>
       </w:r>
     </w:p>
-    <w:bookmarkEnd w:id="2296"/>
-    <w:bookmarkStart w:id="2297" w:name="language"/>
+    <w:bookmarkEnd w:id="2342"/>
+    <w:bookmarkStart w:id="2343" w:name="language"/>
     <w:p>
       <w:pPr>
         <w:pStyle w:val="Heading3"/>
@@ -3038,9 +3038,9 @@
         <w:t xml:space="preserve">English.</w:t>
       </w:r>
     </w:p>
-    <w:bookmarkEnd w:id="2297"/>
-    <w:bookmarkEnd w:id="2298"/>
-    <w:bookmarkStart w:id="2318" w:name="reuse-potential"/>
+    <w:bookmarkEnd w:id="2343"/>
+    <w:bookmarkEnd w:id="2344"/>
+    <w:bookmarkStart w:id="2367" w:name="reuse-potential"/>
     <w:p>
       <w:pPr>
         <w:pStyle w:val="Heading2"/>
@@ -3065,7 +3065,7 @@
         <w:t xml:space="preserve">The browser application makes the lowest barrier the default. A lecture on slag thermodynamics, a plant metallurgist screening a composition, or a reviewer checking a claimed equilibrium can load the database and calculate in seconds, with confidential inputs never leaving the machine. The same property makes it a practical template for other groups who want to publish a model as a zero-install tool.</w:t>
       </w:r>
     </w:p>
-    <w:bookmarkStart w:id="2317" w:name="worked-examples"/>
+    <w:bookmarkStart w:id="2366" w:name="worked-examples"/>
     <w:p>
       <w:pPr>
         <w:pStyle w:val="Heading3"/>
@@ -3277,18 +3277,18 @@
           <wp:inline>
             <wp:extent cx="4206240" cy="3262561"/>
             <wp:effectExtent b="0" l="0" r="0" t="0"/>
-            <wp:docPr descr="Figure 4: The LiCl-KCl phase diagram calculated by the salt listing from the shipped open database, at the listing’s own step size. Light to dark: liquid, two-phase, and subsolidus fields. The dot is the calculated eutectic at this step size (0.400, 640 K); the star is the measured eutectic (0.415, 626 K)." title="" id="2300" name="Picture"/>
+            <wp:docPr descr="Figure 4: The LiCl-KCl phase diagram calculated by the salt listing from the shipped open database, at the listing’s own step size. Light to dark: liquid, two-phase, and subsolidus fields. The dot is the calculated eutectic at this step size (0.400, 640 K); the star is the measured eutectic (0.415, 626 K)." title="" id="2346" name="Picture"/>
             <a:graphic>
               <a:graphicData uri="http://schemas.openxmlformats.org/drawingml/2006/picture">
                 <pic:pic>
                   <pic:nvPicPr>
-                    <pic:cNvPr descr="figures/fig4_salt_example.png" id="2301" name="Picture"/>
+                    <pic:cNvPr descr="figures/fig4_salt_example.png" id="2347" name="Picture"/>
                     <pic:cNvPicPr>
                       <a:picLocks noChangeArrowheads="1" noChangeAspect="1"/>
                     </pic:cNvPicPr>
                   </pic:nvPicPr>
                   <pic:blipFill>
-                    <a:blip r:embed="rId2299"/>
+                    <a:blip r:embed="rId2345"/>
                     <a:stretch>
                       <a:fillRect/>
                     </a:stretch>
@@ -3523,18 +3523,18 @@
           <wp:inline>
             <wp:extent cx="4206240" cy="3262561"/>
             <wp:effectExtent b="0" l="0" r="0" t="0"/>
-            <wp:docPr descr="Figure 5: The Al-Zn phase diagram calculated by the alloy listing from the shipped open TDB. Light to dark: liquid, liquid plus solid, and solid fields. The dot is the calculated eutectic (0.890, 660 K); the star is the assessed eutectic (0.885, 654 K)." title="" id="2303" name="Picture"/>
+            <wp:docPr descr="Figure 5: The Al-Zn phase diagram calculated by the alloy listing from the shipped open TDB. Light to dark: liquid, liquid plus solid, and solid fields. The dot is the calculated eutectic (0.890, 660 K); the star is the assessed eutectic (0.885, 654 K)." title="" id="2349" name="Picture"/>
             <a:graphic>
               <a:graphicData uri="http://schemas.openxmlformats.org/drawingml/2006/picture">
                 <pic:pic>
                   <pic:nvPicPr>
-                    <pic:cNvPr descr="figures/fig5_alloy_example.png" id="2304" name="Picture"/>
+                    <pic:cNvPr descr="figures/fig5_alloy_example.png" id="2350" name="Picture"/>
                     <pic:cNvPicPr>
                       <a:picLocks noChangeArrowheads="1" noChangeAspect="1"/>
                     </pic:cNvPicPr>
                   </pic:nvPicPr>
                   <pic:blipFill>
-                    <a:blip r:embed="rId2302"/>
+                    <a:blip r:embed="rId2348"/>
                     <a:stretch>
                       <a:fillRect/>
                     </a:stretch>
@@ -3643,7 +3643,58 @@
         <w:t xml:space="preserve"> </w:t>
       </w:r>
       <w:r>
-        <w:t xml:space="preserve">ratio of a carbon-oxygen gas fixes the oxygen partial pressure that decides whether carbon is removed from the steel or iron is oxidized into the slag, both at the 1873 K tap temperature and across the steelmaking range, with the gas engine reproducing Cantera throughout. The salt side of the same coupling is the fume over a molten chloride flux (Figure 8): each salt evaporates at its engine activity times its measured pure-component vapour pressure, so magnesium chloride, a fifth of the NaCl-KCl-MgCl2 flux, is only a few percent of the fume, because chlorocomplexing holds its activity far below its mole fraction. The engine’s validated activities are what separate that fume from a Raoultian estimate. The same engine also carries parameter uncertainty to the diagram. Refitting the Al-Zn liquid and face-centred-cubic excess parameters against the measured liquid enthalpy of mixing and the assessed phase boundaries [41,46,47] by Markov-chain Monte Carlo, and propagating the posterior through the browser calculation, produces the confidence band of Figure 9. Three excess coefficients were sampled, the liquid enthalpy and its temperature term and the face-centred-cubic enthalpy, by an ensemble of eighteen walkers over 1500 steps under ESPEI’s default equal dataset weighting, discarding the first half as burn-in; the walker-mean chains are stationary and well mixed (Gelman-Rubin R-hat at most 1.04), the effective sample size is of order 400, and no pair of parameters correlates above about 0.65. Because only these three excess terms are varied while the SGTE unary functions and the phases not being refitted are held at their assessed values, the band is the parametric posterior within the adopted model, not a total thermodynamic uncertainty. Read that way it is still informative: the liquidus band is narrow because the calorimetry pins the liquid interaction, while the solid-solubility band is wider because only the phase diagram constrains the corresponding parameter, an honest reflection of which measurements do the work. Relative to the XML road of XTDB [15] (Table 1), uTDB is the on-ramp from the installed base, extending files as they are and running in this engine today, with mechanical conversion to XTDB elements the natural bridge once that schema settles. Making the calculator multilingual across the field’s file dialects is the direction of travel. Contributions and issues are handled through the GitHub repository.</w:t>
+        <w:t xml:space="preserve">ratio of a carbon-oxygen gas fixes the oxygen partial pressure that decides whether carbon is removed from the steel or iron is oxidized into the slag, both at the 1873 K tap temperature and across the steelmaking range, with the gas engine reproducing Cantera throughout. The salt side of the same coupling is the fume over a molten chloride flux (Figure 8): each salt evaporates at its engine activity times its measured pure-component vapour pressure, so magnesium chloride, a fifth of the NaCl-KCl-MgCl2 flux, is only a few percent of the fume, because chlorocomplexing holds its activity far below its mole fraction. The engine’s validated activities are what separate that fume from a Raoultian estimate. The same engine also carries parameter uncertainty to the diagram. Refitting the Al-Zn liquid and face-centred-cubic excess parameters against the measured liquid enthalpy of mixing and the assessed phase boundaries [41,46,47] by Markov-chain Monte Carlo, and propagating the posterior through the browser calculation, produces the confidence band of Figure 9. Three excess coefficients were sampled, the liquid enthalpy and its temperature term and the face-centred-cubic enthalpy, by an ensemble of eighteen walkers over 1500 steps under ESPEI’s default equal dataset weighting, discarding the first half as burn-in; the walker-mean chains are stationary and well mixed (Gelman-Rubin R-hat at most 1.04), the effective sample size is of order 400, and no pair of parameters correlates above about 0.65. Because only these three excess terms are varied while the SGTE unary functions and the phases not being refitted are held at their assessed values, the band is the parametric posterior within the adopted model, not a total thermodynamic uncertainty. Read that way it is still informative: the liquidus band is narrow because the calorimetry pins the liquid interaction, while the solid-solubility band is wider because only the phase diagram constrains the corresponding parameter, an honest reflection of which measurements do the work. Relative to the XML road of XTDB [15] (Table 1), uTDB is the on-ramp from the installed base, extending files as they are and running in this engine today. The successor is not left to the future: the engine reads XTDB directly, and with it the third-generation models the format standardises. In place of the polynomial heat capacity of the classic databases, the third-generation description uses an Einstein term valid to 0 K, G</w:t>
+      </w:r>
+      <w:r>
+        <w:rPr>
+          <w:vertAlign w:val="subscript"/>
+        </w:rPr>
+        <w:t xml:space="preserve">E</w:t>
+      </w:r>
+      <w:r>
+        <w:t xml:space="preserve">(θ) = 1.5 R θ + 3 R T ln(1 - exp(-θ/T)) for one vibrational mode, with the composition-dependent Einstein temperature carried by the format’s LNTH parameter and weighted by the atom count of the formula unit so a compound recovers its full 3R-per-atom heat capacity; the liquid adds the two-state contribution -R T ln(1 + exp(-ΔG</w:t>
+      </w:r>
+      <w:r>
+        <w:rPr>
+          <w:vertAlign w:val="subscript"/>
+        </w:rPr>
+        <w:t xml:space="preserve">d</w:t>
+      </w:r>
+      <w:r>
+        <w:t xml:space="preserve">/RT)) [48]. The engine assembles these energies and computes the binary phase diagram in the browser by the same lower-convex-hull common-tangent construction used for the alloy joins (Figure 10). Two databases ship as worked examples: the third-generation Al-C assessment of He et al. [49], which reproduces the aluminium melting point at 933.47 K and the Al</w:t>
+      </w:r>
+      <w:r>
+        <w:rPr>
+          <w:vertAlign w:val="subscript"/>
+        </w:rPr>
+        <w:t xml:space="preserve">4</w:t>
+      </w:r>
+      <w:r>
+        <w:t xml:space="preserve">C</w:t>
+      </w:r>
+      <w:r>
+        <w:rPr>
+          <w:vertAlign w:val="subscript"/>
+        </w:rPr>
+        <w:t xml:space="preserve">3</w:t>
+      </w:r>
+      <w:r>
+        <w:t xml:space="preserve"> </w:t>
+      </w:r>
+      <w:r>
+        <w:t xml:space="preserve">peritectic near 2429 K, and a classic Pb-Sn assessment [50] carried through the same reader, giving the eutectic at 456 K and x(Sn) = 0.74. The reader is validated against an independent evaluator to below 10</w:t>
+      </w:r>
+      <w:r>
+        <w:rPr>
+          <w:vertAlign w:val="superscript"/>
+        </w:rPr>
+        <w:t xml:space="preserve">-6</w:t>
+      </w:r>
+      <w:r>
+        <w:t xml:space="preserve"> </w:t>
+      </w:r>
+      <w:r>
+        <w:t xml:space="preserve">J per mole of atoms across the Einstein, two-state, and excess terms. Making the calculator multilingual across the field’s file dialects is the direction of travel. Contributions and issues are handled through the GitHub repository.</w:t>
       </w:r>
     </w:p>
     <w:p>
@@ -3655,18 +3706,18 @@
           <wp:inline>
             <wp:extent cx="5334000" cy="4430576"/>
             <wp:effectExtent b="0" l="0" r="0" t="0"/>
-            <wp:docPr descr="Figure 6: One unified (.utdb) file, two physics, calculated in the browser. (a) The steelmaking database loaded with the Melt/Alloy view toggle on Alloy; the engine calculates the Fe-C phase diagram through the magnetic compound energy formalism, rendered over a 0-25 mol% C composition window (the equilibrium always solves the whole join), with two tapped compositions pinned. (b) Scheil solidification for the same join at 4 mol% C, first solid at 1741 K and the residual liquid frozen by 1433 K, against the equilibrium lever-rule path (dashed). The file’s slag half is a Modified Quasichemical Model liquid; no legacy container holds both models at once." title="" id="2306" name="Picture"/>
+            <wp:docPr descr="Figure 6: One unified (.utdb) file, two physics, calculated in the browser. (a) The steelmaking database loaded with the Melt/Alloy view toggle on Alloy; the engine calculates the Fe-C phase diagram through the magnetic compound energy formalism, rendered over a 0-25 mol% C composition window (the equilibrium always solves the whole join), with two tapped compositions pinned. (b) Scheil solidification for the same join at 4 mol% C, first solid at 1741 K and the residual liquid frozen by 1433 K, against the equilibrium lever-rule path (dashed). The file’s slag half is a Modified Quasichemical Model liquid; no legacy container holds both models at once." title="" id="2352" name="Picture"/>
             <a:graphic>
               <a:graphicData uri="http://schemas.openxmlformats.org/drawingml/2006/picture">
                 <pic:pic>
                   <pic:nvPicPr>
-                    <pic:cNvPr descr="figures/fig6_utdb_steel.png" id="2307" name="Picture"/>
+                    <pic:cNvPr descr="figures/fig6_utdb_steel.png" id="2353" name="Picture"/>
                     <pic:cNvPicPr>
                       <a:picLocks noChangeArrowheads="1" noChangeAspect="1"/>
                     </pic:cNvPicPr>
                   </pic:nvPicPr>
                   <pic:blipFill>
-                    <a:blip r:embed="rId2305"/>
+                    <a:blip r:embed="rId2351"/>
                     <a:stretch>
                       <a:fillRect/>
                     </a:stretch>
@@ -3710,18 +3761,18 @@
           <wp:inline>
             <wp:extent cx="5334000" cy="2319130"/>
             <wp:effectExtent b="0" l="0" r="0" t="0"/>
-            <wp:docPr descr="Figure 7: The gas calculator as a steelmaking worked example, the equilibrium of a carbon-oxygen furnace gas by the Hephaestus gas engine (the NASA-polynomial element-potential solver compiled into the browser), with Cantera as the independent check. (a) Oxygen partial pressure against the CO to CO2 ratio at the 1873 K tap temperature: a lower ratio is more oxidizing and drives iron into the slag as FeO, a higher ratio is more reducing and decarburizes the steel. (b) The same oxygen potential against temperature for four fixed CO to CO2 buffers, showing that a given gas grows more oxidizing as it heats; the dashed line marks the tap temperature. Open circles are Cantera, agreeing to about 10-5 mole fraction across the field." title="" id="2309" name="Picture"/>
+            <wp:docPr descr="Figure 7: The gas calculator as a steelmaking worked example, the equilibrium of a carbon-oxygen furnace gas by the Hephaestus gas engine (the NASA-polynomial element-potential solver compiled into the browser), with Cantera as the independent check. (a) Oxygen partial pressure against the CO to CO2 ratio at the 1873 K tap temperature: a lower ratio is more oxidizing and drives iron into the slag as FeO, a higher ratio is more reducing and decarburizes the steel. (b) The same oxygen potential against temperature for four fixed CO to CO2 buffers, showing that a given gas grows more oxidizing as it heats; the dashed line marks the tap temperature. Open circles are Cantera, agreeing to about 10-5 mole fraction across the field." title="" id="2355" name="Picture"/>
             <a:graphic>
               <a:graphicData uri="http://schemas.openxmlformats.org/drawingml/2006/picture">
                 <pic:pic>
                   <pic:nvPicPr>
-                    <pic:cNvPr descr="figures/fig7_gas_steel.png" id="2310" name="Picture"/>
+                    <pic:cNvPr descr="figures/fig7_gas_steel.png" id="2356" name="Picture"/>
                     <pic:cNvPicPr>
                       <a:picLocks noChangeArrowheads="1" noChangeAspect="1"/>
                     </pic:cNvPicPr>
                   </pic:nvPicPr>
                   <pic:blipFill>
-                    <a:blip r:embed="rId2308"/>
+                    <a:blip r:embed="rId2354"/>
                     <a:stretch>
                       <a:fillRect/>
                     </a:stretch>
@@ -3801,18 +3852,18 @@
           <wp:inline>
             <wp:extent cx="5334000" cy="2319130"/>
             <wp:effectExtent b="0" l="0" r="0" t="0"/>
-            <wp:docPr descr="Figure 8: The gas-flux coupling as a molten-salt worked example, the fume over a NaCl-KCl-MgCl2 = 40/40/20 mol% flux. Each salt’s partial pressure is its engine activity times its measured pure-component vapour pressure (NaCl and KCl from NIST Antoine fits, MgCl2 from the NIST-JANAF gas and liquid Gibbs of formation, each reproducing its measured boiling point; activities from the engine, validated against the pure-composition limit and the near-ideal NaCl-KCl binary). (a) Fume partial pressures against temperature, with the total. (b) Flux composition against fume composition at 1200 K: magnesium chloride is a fifth of the flux but a few percent of the fume, held in the melt by chlorocomplexing that drops its activity well below its mole fraction." title="" id="2312" name="Picture"/>
+            <wp:docPr descr="Figure 8: The gas-flux coupling as a molten-salt worked example, the fume over a NaCl-KCl-MgCl2 = 40/40/20 mol% flux. Each salt’s partial pressure is its engine activity times its measured pure-component vapour pressure (NaCl and KCl from NIST Antoine fits, MgCl2 from the NIST-JANAF gas and liquid Gibbs of formation, each reproducing its measured boiling point; activities from the engine, validated against the pure-composition limit and the near-ideal NaCl-KCl binary). (a) Fume partial pressures against temperature, with the total. (b) Flux composition against fume composition at 1200 K: magnesium chloride is a fifth of the flux but a few percent of the fume, held in the melt by chlorocomplexing that drops its activity well below its mole fraction." title="" id="2358" name="Picture"/>
             <a:graphic>
               <a:graphicData uri="http://schemas.openxmlformats.org/drawingml/2006/picture">
                 <pic:pic>
                   <pic:nvPicPr>
-                    <pic:cNvPr descr="figures/fig8_gas_flux.png" id="2313" name="Picture"/>
+                    <pic:cNvPr descr="figures/fig8_gas_flux.png" id="2359" name="Picture"/>
                     <pic:cNvPicPr>
                       <a:picLocks noChangeArrowheads="1" noChangeAspect="1"/>
                     </pic:cNvPicPr>
                   </pic:nvPicPr>
                   <pic:blipFill>
-                    <a:blip r:embed="rId2311"/>
+                    <a:blip r:embed="rId2357"/>
                     <a:stretch>
                       <a:fillRect/>
                     </a:stretch>
@@ -3880,18 +3931,18 @@
           <wp:inline>
             <wp:extent cx="4572000" cy="3556000"/>
             <wp:effectExtent b="0" l="0" r="0" t="0"/>
-            <wp:docPr descr="Figure 9: Al-Zn phase diagram with ESPEI parameter uncertainty. The liquid and face-centred-cubic (fcc) excess parameters were refit by Markov-chain Monte Carlo to the measured liquid enthalpy of mixing (Debski et al., digitized from Dinsdale et al. [46]) and the assessed phase boundaries (Massalski [47]; Mey [41]), and the posterior was propagated through the engine. The solid line is the median liquidus and the dashed line the median fcc solvus; the shaded region is the 90 percent posterior band on each. The band is narrow on the liquidus, which the calorimetry constrains, and wider on the fcc solvus, which only the diagram constrains. It is the posterior of the three refitted excess parameters with the unary functions and unfitted phases held fixed, a parametric uncertainty within the model rather than a total one. The open circle is the eutectic reported by Massalski [47] (x(Zn) = 0.887, 654 K)." title="" id="2315" name="Picture"/>
+            <wp:docPr descr="Figure 9: Al-Zn phase diagram with ESPEI parameter uncertainty. The liquid and face-centred-cubic (fcc) excess parameters were refit by Markov-chain Monte Carlo to the measured liquid enthalpy of mixing (Debski et al., digitized from Dinsdale et al. [46]) and the assessed phase boundaries (Massalski [47]; Mey [41]), and the posterior was propagated through the engine. The solid line is the median liquidus and the dashed line the median fcc solvus; the shaded region is the 90 percent posterior band on each. The band is narrow on the liquidus, which the calorimetry constrains, and wider on the fcc solvus, which only the diagram constrains. It is the posterior of the three refitted excess parameters with the unary functions and unfitted phases held fixed, a parametric uncertainty within the model rather than a total one. The open circle is the eutectic reported by Massalski [47] (x(Zn) = 0.887, 654 K)." title="" id="2361" name="Picture"/>
             <a:graphic>
               <a:graphicData uri="http://schemas.openxmlformats.org/drawingml/2006/picture">
                 <pic:pic>
                   <pic:nvPicPr>
-                    <pic:cNvPr descr="figures/fig9_uq_alzn.png" id="2316" name="Picture"/>
+                    <pic:cNvPr descr="figures/fig9_uq_alzn.png" id="2362" name="Picture"/>
                     <pic:cNvPicPr>
                       <a:picLocks noChangeArrowheads="1" noChangeAspect="1"/>
                     </pic:cNvPicPr>
                   </pic:nvPicPr>
                   <pic:blipFill>
-                    <a:blip r:embed="rId2314"/>
+                    <a:blip r:embed="rId2360"/>
                     <a:stretch>
                       <a:fillRect/>
                     </a:stretch>
@@ -3928,15 +3979,112 @@
     </w:p>
     <w:p>
       <w:pPr>
-        <w:pStyle w:val="BodyText"/>
-      </w:pPr>
-      <w:r>
-        <w:t xml:space="preserve">The gap the present work addresses was never the model, which has been published for two decades, but an open, runnable pairing of model and parameters. Hephaestus supplies both halves under open licenses and puts them behind a browser page that asks nothing of its user. The claims are checkable end to end. Release v0.5.1 archives the exact version described, and the 137-test suite reruns the pycalphad comparisons on any machine. The worked examples print the figures shown, and every parameter in every shipped database traces to a published measurement through its provenance file. A reader who doubts a number can recalculate it; one who needs a system that is missing can build it with the same open tools, or ask.</w:t>
-      </w:r>
-    </w:p>
-    <w:bookmarkEnd w:id="2317"/>
-    <w:bookmarkEnd w:id="2318"/>
-    <w:bookmarkStart w:id="2319" w:name="data-availability"/>
+        <w:pStyle w:val="CaptionedFigure"/>
+      </w:pPr>
+      <w:r>
+        <w:drawing>
+          <wp:inline>
+            <wp:extent cx="5334000" cy="2383276"/>
+            <wp:effectExtent b="0" l="0" r="0" t="0"/>
+            <wp:docPr descr="Figure 10: Third-generation XTDB databases computed in the browser by the same lower-convex-hull construction as the alloy joins. (a) Al-C from the third-generation assessment of He et al. [49], with the Einstein heat capacity and two-state liquid: the aluminium-rich liquid, the Al4C3 line compound at x(C) = 3/7, and graphite, reproducing the 933.47 K melting point and the Al4C3 peritectic near 2429 K. (b) Pb-Sn, a classic assessment [50] transcribed into XTDB and read by the same engine, giving the eutectic at 456 K and x(Sn) = 0.74. Two-phase fields are shaded; single-phase fields are left white. Temperatures in kelvin." title="" id="2364" name="Picture"/>
+            <a:graphic>
+              <a:graphicData uri="http://schemas.openxmlformats.org/drawingml/2006/picture">
+                <pic:pic>
+                  <pic:nvPicPr>
+                    <pic:cNvPr descr="figures/fig10_xtdb.png" id="2365" name="Picture"/>
+                    <pic:cNvPicPr>
+                      <a:picLocks noChangeArrowheads="1" noChangeAspect="1"/>
+                    </pic:cNvPicPr>
+                  </pic:nvPicPr>
+                  <pic:blipFill>
+                    <a:blip r:embed="rId2363"/>
+                    <a:stretch>
+                      <a:fillRect/>
+                    </a:stretch>
+                  </pic:blipFill>
+                  <pic:spPr bwMode="auto">
+                    <a:xfrm>
+                      <a:off x="0" y="0"/>
+                      <a:ext cx="5334000" cy="2383276"/>
+                    </a:xfrm>
+                    <a:prstGeom prst="rect">
+                      <a:avLst/>
+                    </a:prstGeom>
+                    <a:noFill/>
+                    <a:ln w="9525">
+                      <a:noFill/>
+                      <a:headEnd/>
+                      <a:tailEnd/>
+                    </a:ln>
+                  </pic:spPr>
+                </pic:pic>
+              </a:graphicData>
+            </a:graphic>
+          </wp:inline>
+        </w:drawing>
+      </w:r>
+    </w:p>
+    <w:p>
+      <w:pPr>
+        <w:pStyle w:val="ImageCaption"/>
+      </w:pPr>
+      <w:r>
+        <w:t xml:space="preserve">Figure 10: Third-generation XTDB databases computed in the browser by the same lower-convex-hull construction as the alloy joins. (a) Al-C from the third-generation assessment of He et al. [49], with the Einstein heat capacity and two-state liquid: the aluminium-rich liquid, the Al</w:t>
+      </w:r>
+      <w:r>
+        <w:rPr>
+          <w:vertAlign w:val="subscript"/>
+        </w:rPr>
+        <w:t xml:space="preserve">4</w:t>
+      </w:r>
+      <w:r>
+        <w:t xml:space="preserve">C</w:t>
+      </w:r>
+      <w:r>
+        <w:rPr>
+          <w:vertAlign w:val="subscript"/>
+        </w:rPr>
+        <w:t xml:space="preserve">3</w:t>
+      </w:r>
+      <w:r>
+        <w:t xml:space="preserve"> </w:t>
+      </w:r>
+      <w:r>
+        <w:t xml:space="preserve">line compound at x(C) = 3/7, and graphite, reproducing the 933.47 K melting point and the Al</w:t>
+      </w:r>
+      <w:r>
+        <w:rPr>
+          <w:vertAlign w:val="subscript"/>
+        </w:rPr>
+        <w:t xml:space="preserve">4</w:t>
+      </w:r>
+      <w:r>
+        <w:t xml:space="preserve">C</w:t>
+      </w:r>
+      <w:r>
+        <w:rPr>
+          <w:vertAlign w:val="subscript"/>
+        </w:rPr>
+        <w:t xml:space="preserve">3</w:t>
+      </w:r>
+      <w:r>
+        <w:t xml:space="preserve"> </w:t>
+      </w:r>
+      <w:r>
+        <w:t xml:space="preserve">peritectic near 2429 K. (b) Pb-Sn, a classic assessment [50] transcribed into XTDB and read by the same engine, giving the eutectic at 456 K and x(Sn) = 0.74. Two-phase fields are shaded; single-phase fields are left white. Temperatures in kelvin.</w:t>
+      </w:r>
+    </w:p>
+    <w:p>
+      <w:pPr>
+        <w:pStyle w:val="BodyText"/>
+      </w:pPr>
+      <w:r>
+        <w:t xml:space="preserve">The gap the present work addresses was never the model, which has been published for two decades, but an open, runnable pairing of model and parameters. Hephaestus supplies both halves under open licenses and puts them behind a browser page that asks nothing of its user. The claims are checkable end to end. Release v0.6.0 archives the exact version described, and the 137-test suite reruns the pycalphad comparisons on any machine. The worked examples print the figures shown, and every parameter in every shipped database traces to a published measurement through its provenance file. A reader who doubts a number can recalculate it; one who needs a system that is missing can build it with the same open tools, or ask.</w:t>
+      </w:r>
+    </w:p>
+    <w:bookmarkEnd w:id="2366"/>
+    <w:bookmarkEnd w:id="2367"/>
+    <w:bookmarkStart w:id="2368" w:name="data-availability"/>
     <w:p>
       <w:pPr>
         <w:pStyle w:val="Heading2"/>
@@ -3950,11 +4098,11 @@
         <w:pStyle w:val="FirstParagraph"/>
       </w:pPr>
       <w:r>
-        <w:t xml:space="preserve">The engine, the database, the browser application, and the validation suite are openly available in the code repository listed above; the version described here is archived as release v0.5.1. The database files and their provenance records are in the repository’s data directory under CC BY 4.0.</w:t>
-      </w:r>
-    </w:p>
-    <w:bookmarkEnd w:id="2319"/>
-    <w:bookmarkStart w:id="2320" w:name="acknowledgements"/>
+        <w:t xml:space="preserve">The engine, the database, the browser application, and the validation suite are openly available in the code repository listed above; the version described here is archived as release v0.6.0. The database files and their provenance records are in the repository’s data directory under CC BY 4.0.</w:t>
+      </w:r>
+    </w:p>
+    <w:bookmarkEnd w:id="2368"/>
+    <w:bookmarkStart w:id="2369" w:name="acknowledgements"/>
     <w:p>
       <w:pPr>
         <w:pStyle w:val="Heading2"/>
@@ -3971,8 +4119,8 @@
         <w:t xml:space="preserve">During the development of this software the authors used Claude Code (Anthropic) to assist with implementation, validation scripting, and manuscript preparation. This assistance was agentic, not autonomous: it operated under author direction and supervision at every step and was never a closed loop that produced or accepted results without review. Every parameter was traced by the authors to its primary source before entering the database, and every reference was verified against its registry record. The authors reviewed and approved all output and take full responsibility for this article.</w:t>
       </w:r>
     </w:p>
-    <w:bookmarkEnd w:id="2320"/>
-    <w:bookmarkStart w:id="2321" w:name="funding-statement"/>
+    <w:bookmarkEnd w:id="2369"/>
+    <w:bookmarkStart w:id="2370" w:name="funding-statement"/>
     <w:p>
       <w:pPr>
         <w:pStyle w:val="Heading2"/>
@@ -3989,8 +4137,8 @@
         <w:t xml:space="preserve">The development of this software received no external funding.</w:t>
       </w:r>
     </w:p>
-    <w:bookmarkEnd w:id="2321"/>
-    <w:bookmarkStart w:id="2322" w:name="competing-interests"/>
+    <w:bookmarkEnd w:id="2370"/>
+    <w:bookmarkStart w:id="2371" w:name="competing-interests"/>
     <w:p>
       <w:pPr>
         <w:pStyle w:val="Heading2"/>
@@ -4007,8 +4155,8 @@
         <w:t xml:space="preserve">Both authors are affiliated with Odinzen LLC, which provides commercial thermodynamic modeling services, and declare this as a competing interest; Michael E. Bustamante founded the company. The software and database published here are released in full under open licenses, and no proprietary Odinzen assets are included.</w:t>
       </w:r>
     </w:p>
-    <w:bookmarkEnd w:id="2322"/>
-    <w:bookmarkStart w:id="2323" w:name="references"/>
+    <w:bookmarkEnd w:id="2371"/>
+    <w:bookmarkStart w:id="2372" w:name="references"/>
     <w:p>
       <w:pPr>
         <w:pStyle w:val="Heading2"/>
@@ -4405,8 +4553,32 @@
         <w:t xml:space="preserve">[47] Massalski TB, editor. Binary Alloy Phase Diagrams. 2nd ed. Materials Park (OH): ASM International; 1990.</w:t>
       </w:r>
     </w:p>
-    <w:bookmarkEnd w:id="2323"/>
-    <w:bookmarkEnd w:id="2324"/>
+    <w:p>
+      <w:pPr>
+        <w:pStyle w:val="BodyText"/>
+      </w:pPr>
+      <w:r>
+        <w:t xml:space="preserve">[48] Chen Q, Sundman B. Modeling of thermodynamic properties for Bcc, Fcc, liquid, and amorphous iron. J Phase Equilibria. 2001 Nov;22(6):631-44. doi:10.1007/s11669-001-0027-9</w:t>
+      </w:r>
+    </w:p>
+    <w:p>
+      <w:pPr>
+        <w:pStyle w:val="BodyText"/>
+      </w:pPr>
+      <w:r>
+        <w:t xml:space="preserve">[49] He Z, Kaplan B, Mao H, Selleby M. The third generation Calphad description of Al-C including revisions of pure Al and C. Calphad. 2021 Mar;72:102250. doi:10.1016/j.calphad.2021.102250</w:t>
+      </w:r>
+    </w:p>
+    <w:p>
+      <w:pPr>
+        <w:pStyle w:val="BodyText"/>
+      </w:pPr>
+      <w:r>
+        <w:t xml:space="preserve">[50] Ngai TL, Chang YA. A thermodynamic analysis of the Pb-Sn system and the calculation of the Pb-Sn phase diagram. Calphad. 1981;5(4):267-76. doi:10.1016/0364-5916(81)90009-2</w:t>
+      </w:r>
+    </w:p>
+    <w:bookmarkEnd w:id="2372"/>
+    <w:bookmarkEnd w:id="2373"/>
     <w:sectPr>
       <w:footnotePr>
         <w:numRestart w:val="eachSect"/>

</xml_diff>

<commit_message>
Figure 1: add .xtdb to the database-files box and caption
The XTDB reader is now real, so the architecture figure and its caption listed
only .dat/.tdb/.utdb. Add .xtdb (XML successor, third-generation) to the box and
note in the caption that the browser build carries the XTDB reader.

Co-Authored-By: Claude Opus 4.8 <noreply@anthropic.com>
</commit_message>
<xml_diff>
--- a/paper/Bustamante_Hephaestus_JORS_manuscript.docx
+++ b/paper/Bustamante_Hephaestus_JORS_manuscript.docx
@@ -662,7 +662,7 @@
           <wp:inline>
             <wp:extent cx="5334000" cy="3511167"/>
             <wp:effectExtent b="0" l="0" r="0" t="0"/>
-            <wp:docPr descr="Figure 1: Architecture of Hephaestus. A single dependency-free C core reads the field’s three database dialects (ChemSage .dat, Thermo-Calc .tdb with the Inden magnetic model, and the unified .utdb) and calculates all thermodynamics; the same core is used as a native library, from Python through cffi, and compiled to WebAssembly behind the browser application. dbbuild writes new ChemSage files from measured data, and every energy path is validated against pycalphad." title="" id="2325" name="Picture"/>
+            <wp:docPr descr="Figure 1: Architecture of Hephaestus. A single dependency-free C core reads the field’s database dialects (ChemSage .dat, Thermo-Calc .tdb with the Inden magnetic model, and the unified .utdb) and calculates all thermodynamics; the same core is used as a native library, from Python through cffi, and compiled to WebAssembly behind the browser application. The browser build adds a reader for the XML XTDB successor and its third-generation (Einstein heat capacity, two-state liquid) models. dbbuild writes new ChemSage files from measured data, and every energy path is validated against pycalphad." title="" id="2325" name="Picture"/>
             <a:graphic>
               <a:graphicData uri="http://schemas.openxmlformats.org/drawingml/2006/picture">
                 <pic:pic>
@@ -705,7 +705,7 @@
         <w:pStyle w:val="ImageCaption"/>
       </w:pPr>
       <w:r>
-        <w:t xml:space="preserve">Figure 1: Architecture of Hephaestus. A single dependency-free C core reads the field’s three database dialects (ChemSage .dat, Thermo-Calc .tdb with the Inden magnetic model, and the unified .utdb) and calculates all thermodynamics; the same core is used as a native library, from Python through cffi, and compiled to WebAssembly behind the browser application. dbbuild writes new ChemSage files from measured data, and every energy path is validated against pycalphad.</w:t>
+        <w:t xml:space="preserve">Figure 1: Architecture of Hephaestus. A single dependency-free C core reads the field’s database dialects (ChemSage .dat, Thermo-Calc .tdb with the Inden magnetic model, and the unified .utdb) and calculates all thermodynamics; the same core is used as a native library, from Python through cffi, and compiled to WebAssembly behind the browser application. The browser build adds a reader for the XML XTDB successor and its third-generation (Einstein heat capacity, two-state liquid) models. dbbuild writes new ChemSage files from measured data, and every energy path is validated against pycalphad.</w:t>
       </w:r>
     </w:p>
     <w:p>

</xml_diff>

<commit_message>
Submission staleness pass for v0.6.0 (cover letter, supplement, highlights)
- Cover letter: four containers incl. XTDB third-generation; v0.4.0 + Zenodo
  archive line -> release v0.6.0 (edited in place, letterhead preserved).
- Supplementary S1 primer: .xtdb file-format row, third-generation card described
  in the file-loading section, glossary entries (XTDB, third generation).
- Manuscript: residual counts fixed (137 -> 142 tests; 'either of the field's
  dialects' -> any).
- New Highlights file (5 points).
- Checklist updated.

Co-Authored-By: Claude Opus 4.8 <noreply@anthropic.com>
</commit_message>
<xml_diff>
--- a/paper/Bustamante_Hephaestus_JORS_manuscript.docx
+++ b/paper/Bustamante_Hephaestus_JORS_manuscript.docx
@@ -277,7 +277,7 @@
         <w:pStyle w:val="BodyText"/>
       </w:pPr>
       <w:r>
-        <w:t xml:space="preserve">The workflows behind these tools also shape who can use them. FactSage [4] and Thermo-Calc [13] are mature commercial suites whose module interfaces and expertly curated databases serve licensed users well, and other commercial packages follow the same shape. OpenCalphad [7] and pycalphad [8] are free engines for the code-comfortable: command files or Python sessions over TDB databases, with no graphical calculator attached. CemGEMS [14] showed a third way for cement chemistry, a free web front end whose users install nothing, though its calculations still run on a project server; the GEMS ecosystem behind it runs its own container formats entirely, so the fragmentation extends beyond CALPHAD’s two dialects. What none of them offers is a calculator that is zero-install, fully client-side, and open-data at once: a page anyone can open, load a database in either of the field’s file dialects, and calculate against, with nothing transmitted anywhere. Hephaestus takes that seat deliberately as a complement rather than a competitor. It does not chase FactSage’s breadth or Thermo-Calc’s alloy depth; it is the low-barrier door into the same published models, with open parameters behind it and a fitting loop short enough that refitting an excess term against new measurements is an interactive step.</w:t>
+        <w:t xml:space="preserve">The workflows behind these tools also shape who can use them. FactSage [4] and Thermo-Calc [13] are mature commercial suites whose module interfaces and expertly curated databases serve licensed users well, and other commercial packages follow the same shape. OpenCalphad [7] and pycalphad [8] are free engines for the code-comfortable: command files or Python sessions over TDB databases, with no graphical calculator attached. CemGEMS [14] showed a third way for cement chemistry, a free web front end whose users install nothing, though its calculations still run on a project server; the GEMS ecosystem behind it runs its own container formats entirely, so the fragmentation extends beyond CALPHAD’s two dialects. What none of them offers is a calculator that is zero-install, fully client-side, and open-data at once: a page anyone can open, load a database in any of the field’s file dialects, and calculate against, with nothing transmitted anywhere. Hephaestus takes that seat deliberately as a complement rather than a competitor. It does not chase FactSage’s breadth or Thermo-Calc’s alloy depth; it is the low-barrier door into the same published models, with open parameters behind it and a fitting loop short enough that refitting an excess term against new measurements is an interactive step.</w:t>
       </w:r>
     </w:p>
     <w:p>
@@ -4079,7 +4079,7 @@
         <w:pStyle w:val="BodyText"/>
       </w:pPr>
       <w:r>
-        <w:t xml:space="preserve">The gap the present work addresses was never the model, which has been published for two decades, but an open, runnable pairing of model and parameters. Hephaestus supplies both halves under open licenses and puts them behind a browser page that asks nothing of its user. The claims are checkable end to end. Release v0.6.0 archives the exact version described, and the 137-test suite reruns the pycalphad comparisons on any machine. The worked examples print the figures shown, and every parameter in every shipped database traces to a published measurement through its provenance file. A reader who doubts a number can recalculate it; one who needs a system that is missing can build it with the same open tools, or ask.</w:t>
+        <w:t xml:space="preserve">The gap the present work addresses was never the model, which has been published for two decades, but an open, runnable pairing of model and parameters. Hephaestus supplies both halves under open licenses and puts them behind a browser page that asks nothing of its user. The claims are checkable end to end. Release v0.6.0 archives the exact version described, and the 142-test suite reruns the pycalphad comparisons on any machine. The worked examples print the figures shown, and every parameter in every shipped database traces to a published measurement through its provenance file. A reader who doubts a number can recalculate it; one who needs a system that is missing can build it with the same open tools, or ask.</w:t>
       </w:r>
     </w:p>
     <w:bookmarkEnd w:id="2366"/>

</xml_diff>

<commit_message>
Manuscript: cite the aluminate MLIP feasibility test
One sentence in the calcium-aluminosilicate paragraph: three foundation potentials
[28,29,32] agree in sign on the edge mixing enthalpies and cluster (~7 kJ/mol-oxide) on
CaO-Al2O3 but spread on Al2O3-SiO2, so the aluminosilicate excess is held to measured
activities, not MLIP energies; run recorded in the provenance. Reuses existing citations
(argus order green: 50 refs, figs 1-10).

Co-Authored-By: Claude Opus 4.8 <noreply@anthropic.com>
</commit_message>
<xml_diff>
--- a/paper/Bustamante_Hephaestus_JORS_manuscript.docx
+++ b/paper/Bustamante_Hephaestus_JORS_manuscript.docx
@@ -1081,7 +1081,55 @@
         <w:t xml:space="preserve"> </w:t>
       </w:r>
       <w:r>
-        <w:t xml:space="preserve">ternary, the ternary carrying one fitted additional-constituent term that brings its predicted silica activities to within a root-mean-square 0.48 in ln a of forty-five Knudsen-effusion measurements [21,35]. A CaO-FeO-MgO-SiO</w:t>
+        <w:t xml:space="preserve">ternary, the ternary carrying one fitted additional-constituent term that brings its predicted silica activities to within a root-mean-square 0.48 in ln a of forty-five Knudsen-effusion measurements [21,35]. A melt-mixing feasibility check on the aluminate edges with three foundation machine-learned potentials [28,29,32] found unanimous sign and a spread of about 7 kJ per mole of oxide on the strongly ordering CaO-Al</w:t>
+      </w:r>
+      <w:r>
+        <w:rPr>
+          <w:vertAlign w:val="subscript"/>
+        </w:rPr>
+        <w:t xml:space="preserve">2</w:t>
+      </w:r>
+      <w:r>
+        <w:t xml:space="preserve">O</w:t>
+      </w:r>
+      <w:r>
+        <w:rPr>
+          <w:vertAlign w:val="subscript"/>
+        </w:rPr>
+        <w:t xml:space="preserve">3</w:t>
+      </w:r>
+      <w:r>
+        <w:t xml:space="preserve"> </w:t>
+      </w:r>
+      <w:r>
+        <w:t xml:space="preserve">edge, but a spread from near-ideal to strongly positive on Al</w:t>
+      </w:r>
+      <w:r>
+        <w:rPr>
+          <w:vertAlign w:val="subscript"/>
+        </w:rPr>
+        <w:t xml:space="preserve">2</w:t>
+      </w:r>
+      <w:r>
+        <w:t xml:space="preserve">O</w:t>
+      </w:r>
+      <w:r>
+        <w:rPr>
+          <w:vertAlign w:val="subscript"/>
+        </w:rPr>
+        <w:t xml:space="preserve">3</w:t>
+      </w:r>
+      <w:r>
+        <w:t xml:space="preserve">-SiO</w:t>
+      </w:r>
+      <w:r>
+        <w:rPr>
+          <w:vertAlign w:val="subscript"/>
+        </w:rPr>
+        <w:t xml:space="preserve">2</w:t>
+      </w:r>
+      <w:r>
+        <w:t xml:space="preserve">; the aluminosilicate excess is therefore held to the measured activities rather than to potential energies, the run recorded in the provenance. A CaO-FeO-MgO-SiO</w:t>
       </w:r>
       <w:r>
         <w:rPr>

</xml_diff>

<commit_message>
Manuscript: tighten abstract 397 -> 292 words
JORS sets no abstract limit, but 397 read long; condensed to 292 with all substance
kept (four formats incl. XTDB third-gen, systems, gas coupling, validation, licenses).

Co-Authored-By: Claude Opus 4.8 <noreply@anthropic.com>
</commit_message>
<xml_diff>
--- a/paper/Bustamante_Hephaestus_JORS_manuscript.docx
+++ b/paper/Bustamante_Hephaestus_JORS_manuscript.docx
@@ -60,7 +60,7 @@
         <w:pStyle w:val="BodyText"/>
       </w:pPr>
       <w:r>
-        <w:t xml:space="preserve">The Modified Quasichemical Model in the Quadruplet Approximation (MQMQA) is the standard thermodynamic description of short-range-ordered ionic melts, and it underpins the commercial databases used throughout pyrometallurgy. Open implementations exist inside larger frameworks, but no freely licensed oxide slag database has been available, so users of open tools have had the model without parameters to run through it. Hephaestus addresses the model and the data together. The engine is a small dependency-free C core with a Python interface and a WebAssembly build, so the same code runs embedded, scripted, or in a browser with nothing installed. It reads ChemSage-format files directly, covering MQMQA liquids, compound energy formalism solid solutions, and stoichiometric compounds. It reads the Thermo-Calc TDB dialect for alloys, including the Inden magnetic contribution real steel files require. It also defines uTDB, an openly specified extension carrying the MQMQA statements inside TDB grammar, demonstrated by shipped aluminum-recycling (Al-Zn alloy with its NaCl-KCl-MgCl</w:t>
+        <w:t xml:space="preserve">The Modified Quasichemical Model in the Quadruplet Approximation (MQMQA) is the standard description of short-range-ordered ionic melts and underpins the commercial databases used throughout pyrometallurgy, yet no freely licensed oxide slag database has existed, leaving open-tool users the model without parameters. Hephaestus supplies both. The engine is a small dependency-free C core with a Python interface and a WebAssembly build, so the same code runs embedded, scripted, or in a browser with nothing installed. It reads four database formats: ChemSage .dat (MQMQA liquids, compound-energy-formalism solids, stoichiometric compounds); the Thermo-Calc TDB dialect for alloys, with the Inden magnetic model real steel files need; the openly specified uTDB extension carrying MQMQA inside TDB grammar, shown by shipped aluminum-recycling and steelmaking databases; and the community’s XML successor XTDB, including its third-generation models, an Einstein heat capacity valid to 0 K and a two-state liquid, shown by Al-C and Pb-Sn examples. One zero-install page calculates across all four. It computes phase equilibria up to ternary isothermal sections and liquidus projections, and Scheil-Gulliver solidification on any binary join. A NASA-polynomial ideal-gas engine, validated against Cantera, couples the furnace atmosphere to the condensed phases at a shared oxygen potential, including to the Modified Quasichemical slag at iron saturation, and the same activity coupling gives the vapour a molten chloride flux fumes off. Every energy path is validated to machine precision against pycalphad, the magnetic model additionally against measured pure-iron transitions. The companion databases span the CaO-SiO</w:t>
       </w:r>
       <w:r>
         <w:rPr>
@@ -69,10 +69,73 @@
         <w:t xml:space="preserve">2</w:t>
       </w:r>
       <w:r>
+        <w:t xml:space="preserve">, MgO-SiO</w:t>
+      </w:r>
+      <w:r>
+        <w:rPr>
+          <w:vertAlign w:val="subscript"/>
+        </w:rPr>
+        <w:t xml:space="preserve">2</w:t>
+      </w:r>
+      <w:r>
+        <w:t xml:space="preserve">, FeO-SiO</w:t>
+      </w:r>
+      <w:r>
+        <w:rPr>
+          <w:vertAlign w:val="subscript"/>
+        </w:rPr>
+        <w:t xml:space="preserve">2</w:t>
+      </w:r>
+      <w:r>
+        <w:t xml:space="preserve">, CaO-Al</w:t>
+      </w:r>
+      <w:r>
+        <w:rPr>
+          <w:vertAlign w:val="subscript"/>
+        </w:rPr>
+        <w:t xml:space="preserve">2</w:t>
+      </w:r>
+      <w:r>
+        <w:t xml:space="preserve">O</w:t>
+      </w:r>
+      <w:r>
+        <w:rPr>
+          <w:vertAlign w:val="subscript"/>
+        </w:rPr>
+        <w:t xml:space="preserve">3</w:t>
+      </w:r>
+      <w:r>
+        <w:t xml:space="preserve">, and Al</w:t>
+      </w:r>
+      <w:r>
+        <w:rPr>
+          <w:vertAlign w:val="subscript"/>
+        </w:rPr>
+        <w:t xml:space="preserve">2</w:t>
+      </w:r>
+      <w:r>
+        <w:t xml:space="preserve">O</w:t>
+      </w:r>
+      <w:r>
+        <w:rPr>
+          <w:vertAlign w:val="subscript"/>
+        </w:rPr>
+        <w:t xml:space="preserve">3</w:t>
+      </w:r>
+      <w:r>
+        <w:t xml:space="preserve">-SiO</w:t>
+      </w:r>
+      <w:r>
+        <w:rPr>
+          <w:vertAlign w:val="subscript"/>
+        </w:rPr>
+        <w:t xml:space="preserve">2</w:t>
+      </w:r>
+      <w:r>
         <w:t xml:space="preserve"> </w:t>
       </w:r>
       <w:r>
-        <w:t xml:space="preserve">salt flux) and steelmaking (Fe-C steel with its FeO-MgO-SiO</w:t>
+        <w:t xml:space="preserve">liquids, the FeO-MgO-SiO</w:t>
       </w:r>
       <w:r>
         <w:rPr>
@@ -84,7 +147,7 @@
         <w:t xml:space="preserve"> </w:t>
       </w:r>
       <w:r>
-        <w:t xml:space="preserve">slag) databases. It reads XTDB, the community’s XML successor format, including its third-generation models, an Einstein heat capacity valid to 0 K and a two-state liquid, shown by shipped Al-C and Pb-Sn databases computed in the browser. One zero-install page calculates across all four containers. It calculates phase equilibria up to full ternary isothermal sections and liquidus projections, and Scheil-Gulliver solidification paths on any binary join. A NASA-polynomial ideal-gas engine, validated against Cantera, brings the gas equilibria a furnace atmosphere demands into the same browser and couples that gas to the condensed phases at a shared oxygen potential: to metals and oxides in the browser, reproducing Cantera’s multiphase equilibrium, and to the Modified Quasichemical slag itself at iron saturation, so the melt’s oxidation state tracks the furnace atmosphere. The same activity coupling gives the vapour a molten chloride flux fumes off, where complexing holds down the magnesium chloride. Every energy path is validated to machine precision against pycalphad, and the magnetic model additionally against the measured pure-iron transition temperatures. The companion databases cover the CaO-SiO</w:t>
+        <w:t xml:space="preserve">and CaO-Al</w:t>
       </w:r>
       <w:r>
         <w:rPr>
@@ -93,7 +156,16 @@
         <w:t xml:space="preserve">2</w:t>
       </w:r>
       <w:r>
-        <w:t xml:space="preserve">, MgO-SiO</w:t>
+        <w:t xml:space="preserve">O</w:t>
+      </w:r>
+      <w:r>
+        <w:rPr>
+          <w:vertAlign w:val="subscript"/>
+        </w:rPr>
+        <w:t xml:space="preserve">3</w:t>
+      </w:r>
+      <w:r>
+        <w:t xml:space="preserve">-SiO</w:t>
       </w:r>
       <w:r>
         <w:rPr>
@@ -102,7 +174,10 @@
         <w:t xml:space="preserve">2</w:t>
       </w:r>
       <w:r>
-        <w:t xml:space="preserve">, FeO-SiO</w:t>
+        <w:t xml:space="preserve"> </w:t>
+      </w:r>
+      <w:r>
+        <w:t xml:space="preserve">ternaries, a CaO-FeO-MgO-SiO</w:t>
       </w:r>
       <w:r>
         <w:rPr>
@@ -111,7 +186,10 @@
         <w:t xml:space="preserve">2</w:t>
       </w:r>
       <w:r>
-        <w:t xml:space="preserve">, CaO-Al</w:t>
+        <w:t xml:space="preserve"> </w:t>
+      </w:r>
+      <w:r>
+        <w:t xml:space="preserve">quaternary with olivine, orthopyroxene, clinopyroxene, and spinel solid solutions, and an open chloride salt family from LiCl-KCl to the NaCl-KCl-MgCl</w:t>
       </w:r>
       <w:r>
         <w:rPr>
@@ -120,112 +198,10 @@
         <w:t xml:space="preserve">2</w:t>
       </w:r>
       <w:r>
-        <w:t xml:space="preserve">O</w:t>
-      </w:r>
-      <w:r>
-        <w:rPr>
-          <w:vertAlign w:val="subscript"/>
-        </w:rPr>
-        <w:t xml:space="preserve">3</w:t>
-      </w:r>
-      <w:r>
-        <w:t xml:space="preserve">, and Al</w:t>
-      </w:r>
-      <w:r>
-        <w:rPr>
-          <w:vertAlign w:val="subscript"/>
-        </w:rPr>
-        <w:t xml:space="preserve">2</w:t>
-      </w:r>
-      <w:r>
-        <w:t xml:space="preserve">O</w:t>
-      </w:r>
-      <w:r>
-        <w:rPr>
-          <w:vertAlign w:val="subscript"/>
-        </w:rPr>
-        <w:t xml:space="preserve">3</w:t>
-      </w:r>
-      <w:r>
-        <w:t xml:space="preserve">-SiO</w:t>
-      </w:r>
-      <w:r>
-        <w:rPr>
-          <w:vertAlign w:val="subscript"/>
-        </w:rPr>
-        <w:t xml:space="preserve">2</w:t>
-      </w:r>
-      <w:r>
         <w:t xml:space="preserve"> </w:t>
       </w:r>
       <w:r>
-        <w:t xml:space="preserve">liquids, the FeO-MgO-SiO</w:t>
-      </w:r>
-      <w:r>
-        <w:rPr>
-          <w:vertAlign w:val="subscript"/>
-        </w:rPr>
-        <w:t xml:space="preserve">2</w:t>
-      </w:r>
-      <w:r>
-        <w:t xml:space="preserve"> </w:t>
-      </w:r>
-      <w:r>
-        <w:t xml:space="preserve">and cement-and-slag CaO-Al</w:t>
-      </w:r>
-      <w:r>
-        <w:rPr>
-          <w:vertAlign w:val="subscript"/>
-        </w:rPr>
-        <w:t xml:space="preserve">2</w:t>
-      </w:r>
-      <w:r>
-        <w:t xml:space="preserve">O</w:t>
-      </w:r>
-      <w:r>
-        <w:rPr>
-          <w:vertAlign w:val="subscript"/>
-        </w:rPr>
-        <w:t xml:space="preserve">3</w:t>
-      </w:r>
-      <w:r>
-        <w:t xml:space="preserve">-SiO</w:t>
-      </w:r>
-      <w:r>
-        <w:rPr>
-          <w:vertAlign w:val="subscript"/>
-        </w:rPr>
-        <w:t xml:space="preserve">2</w:t>
-      </w:r>
-      <w:r>
-        <w:t xml:space="preserve"> </w:t>
-      </w:r>
-      <w:r>
-        <w:t xml:space="preserve">ternaries, and a CaO-FeO-MgO-SiO</w:t>
-      </w:r>
-      <w:r>
-        <w:rPr>
-          <w:vertAlign w:val="subscript"/>
-        </w:rPr>
-        <w:t xml:space="preserve">2</w:t>
-      </w:r>
-      <w:r>
-        <w:t xml:space="preserve"> </w:t>
-      </w:r>
-      <w:r>
-        <w:t xml:space="preserve">quaternary, with olivine, orthopyroxene, clinopyroxene, and spinel solid solutions, together with an open chloride molten-salt family from LiCl-KCl to the NaCl-KCl-MgCl</w:t>
-      </w:r>
-      <w:r>
-        <w:rPr>
-          <w:vertAlign w:val="subscript"/>
-        </w:rPr>
-        <w:t xml:space="preserve">2</w:t>
-      </w:r>
-      <w:r>
-        <w:t xml:space="preserve"> </w:t>
-      </w:r>
-      <w:r>
-        <w:t xml:space="preserve">ternary, assembled solely from published measurements with per-value provenance and documented limits. The code is MIT licensed and the databases are CC BY 4.0.</w:t>
+        <w:t xml:space="preserve">ternary, all from published measurements with per-value provenance. The code is MIT licensed and the databases CC BY 4.0.</w:t>
       </w:r>
     </w:p>
     <w:p>

</xml_diff>